<commit_message>
docs(manual): regenerate docx from the reviewed md (WSL pandoc 3.1.3)
Same pipeline as v1 (pandoc --reference-doc=reference.docx --toc), now
carrying JV's review-round-1 fixes and the UI Scale section. Verified: new
content present in document.xml, the old junk-note text gone, figures
embedded. The md remains the working source until JV starts editing the
docx in Word (he will announce that).

Co-Authored-By: Claude Fable 5 <noreply@anthropic.com>
</commit_message>
<xml_diff>
--- a/docs/manual/ClassBuilder_Manual.docx
+++ b/docs/manual/ClassBuilder_Manual.docx
@@ -7,7 +7,19 @@
         <w:pStyle w:val="Title"/>
       </w:pPr>
       <w:r>
-        <w:t xml:space="preserve">ClassBuilder User Manual</w:t>
+        <w:t xml:space="preserve">ClassBuilder</w:t>
+      </w:r>
+      <w:r>
+        <w:t xml:space="preserve"> </w:t>
+      </w:r>
+      <w:r>
+        <w:t xml:space="preserve">User</w:t>
+      </w:r>
+      <w:r>
+        <w:t xml:space="preserve"> </w:t>
+      </w:r>
+      <w:r>
+        <w:t xml:space="preserve">Manual</w:t>
       </w:r>
     </w:p>
     <w:p>
@@ -70,15 +82,6 @@
         <w:pStyle w:val="Heading1"/>
       </w:pPr>
       <w:r>
-        <w:rPr>
-          <w:rStyle w:val="SectionNumber"/>
-        </w:rPr>
-        <w:t xml:space="preserve">1</w:t>
-      </w:r>
-      <w:r>
-        <w:tab/>
-      </w:r>
-      <w:r>
         <w:t xml:space="preserve">Introduction</w:t>
       </w:r>
     </w:p>
@@ -87,15 +90,6 @@
       <w:pPr>
         <w:pStyle w:val="Heading2"/>
       </w:pPr>
-      <w:r>
-        <w:rPr>
-          <w:rStyle w:val="SectionNumber"/>
-        </w:rPr>
-        <w:t xml:space="preserve">1.1</w:t>
-      </w:r>
-      <w:r>
-        <w:tab/>
-      </w:r>
       <w:r>
         <w:t xml:space="preserve">What ClassBuilder is</w:t>
       </w:r>
@@ -510,15 +504,6 @@
       <w:pPr>
         <w:pStyle w:val="Heading2"/>
       </w:pPr>
-      <w:r>
-        <w:rPr>
-          <w:rStyle w:val="SectionNumber"/>
-        </w:rPr>
-        <w:t xml:space="preserve">1.2</w:t>
-      </w:r>
-      <w:r>
-        <w:tab/>
-      </w:r>
       <w:r>
         <w:t xml:space="preserve">The pieces</w:t>
       </w:r>
@@ -758,15 +743,6 @@
         <w:pStyle w:val="Heading2"/>
       </w:pPr>
       <w:r>
-        <w:rPr>
-          <w:rStyle w:val="SectionNumber"/>
-        </w:rPr>
-        <w:t xml:space="preserve">1.3</w:t>
-      </w:r>
-      <w:r>
-        <w:tab/>
-      </w:r>
-      <w:r>
         <w:t xml:space="preserve">About this manual</w:t>
       </w:r>
     </w:p>
@@ -883,15 +859,6 @@
       <w:pPr>
         <w:pStyle w:val="Heading2"/>
       </w:pPr>
-      <w:r>
-        <w:rPr>
-          <w:rStyle w:val="SectionNumber"/>
-        </w:rPr>
-        <w:t xml:space="preserve">1.4</w:t>
-      </w:r>
-      <w:r>
-        <w:tab/>
-      </w:r>
       <w:r>
         <w:t xml:space="preserve">Notation: keyboard shortcuts per platform</w:t>
       </w:r>
@@ -1374,15 +1341,6 @@
         <w:pStyle w:val="Heading1"/>
       </w:pPr>
       <w:r>
-        <w:rPr>
-          <w:rStyle w:val="SectionNumber"/>
-        </w:rPr>
-        <w:t xml:space="preserve">2</w:t>
-      </w:r>
-      <w:r>
-        <w:tab/>
-      </w:r>
-      <w:r>
         <w:t xml:space="preserve">Concepts and terminology</w:t>
       </w:r>
     </w:p>
@@ -1391,15 +1349,6 @@
       <w:pPr>
         <w:pStyle w:val="Heading2"/>
       </w:pPr>
-      <w:r>
-        <w:rPr>
-          <w:rStyle w:val="SectionNumber"/>
-        </w:rPr>
-        <w:t xml:space="preserve">2.1</w:t>
-      </w:r>
-      <w:r>
-        <w:tab/>
-      </w:r>
       <w:r>
         <w:t xml:space="preserve">The model</w:t>
       </w:r>
@@ -1742,15 +1691,6 @@
         <w:pStyle w:val="Heading2"/>
       </w:pPr>
       <w:r>
-        <w:rPr>
-          <w:rStyle w:val="SectionNumber"/>
-        </w:rPr>
-        <w:t xml:space="preserve">2.2</w:t>
-      </w:r>
-      <w:r>
-        <w:tab/>
-      </w:r>
-      <w:r>
         <w:t xml:space="preserve">Class features</w:t>
       </w:r>
     </w:p>
@@ -2040,15 +1980,6 @@
         <w:pStyle w:val="Heading2"/>
       </w:pPr>
       <w:r>
-        <w:rPr>
-          <w:rStyle w:val="SectionNumber"/>
-        </w:rPr>
-        <w:t xml:space="preserve">2.3</w:t>
-      </w:r>
-      <w:r>
-        <w:tab/>
-      </w:r>
-      <w:r>
         <w:t xml:space="preserve">Phases</w:t>
       </w:r>
     </w:p>
@@ -2098,15 +2029,6 @@
       <w:pPr>
         <w:pStyle w:val="Heading2"/>
       </w:pPr>
-      <w:r>
-        <w:rPr>
-          <w:rStyle w:val="SectionNumber"/>
-        </w:rPr>
-        <w:t xml:space="preserve">2.4</w:t>
-      </w:r>
-      <w:r>
-        <w:tab/>
-      </w:r>
       <w:r>
         <w:t xml:space="preserve">Generated vs. user code</w:t>
       </w:r>
@@ -2248,15 +2170,6 @@
         <w:pStyle w:val="Heading1"/>
       </w:pPr>
       <w:r>
-        <w:rPr>
-          <w:rStyle w:val="SectionNumber"/>
-        </w:rPr>
-        <w:t xml:space="preserve">3</w:t>
-      </w:r>
-      <w:r>
-        <w:tab/>
-      </w:r>
-      <w:r>
         <w:t xml:space="preserve">Installation and project files</w:t>
       </w:r>
     </w:p>
@@ -2265,15 +2178,6 @@
       <w:pPr>
         <w:pStyle w:val="Heading2"/>
       </w:pPr>
-      <w:r>
-        <w:rPr>
-          <w:rStyle w:val="SectionNumber"/>
-        </w:rPr>
-        <w:t xml:space="preserve">3.1</w:t>
-      </w:r>
-      <w:r>
-        <w:tab/>
-      </w:r>
       <w:r>
         <w:t xml:space="preserve">The application</w:t>
       </w:r>
@@ -2316,15 +2220,6 @@
       <w:pPr>
         <w:pStyle w:val="Heading2"/>
       </w:pPr>
-      <w:r>
-        <w:rPr>
-          <w:rStyle w:val="SectionNumber"/>
-        </w:rPr>
-        <w:t xml:space="preserve">3.2</w:t>
-      </w:r>
-      <w:r>
-        <w:tab/>
-      </w:r>
       <w:r>
         <w:t xml:space="preserve">What generated code needs — the runtime headers</w:t>
       </w:r>
@@ -2728,15 +2623,6 @@
         <w:pStyle w:val="Heading2"/>
       </w:pPr>
       <w:r>
-        <w:rPr>
-          <w:rStyle w:val="SectionNumber"/>
-        </w:rPr>
-        <w:t xml:space="preserve">3.3</w:t>
-      </w:r>
-      <w:r>
-        <w:tab/>
-      </w:r>
-      <w:r>
         <w:t xml:space="preserve">StdAfx.h — the one file you write</w:t>
       </w:r>
     </w:p>
@@ -3025,15 +2911,6 @@
       <w:pPr>
         <w:pStyle w:val="Heading2"/>
       </w:pPr>
-      <w:r>
-        <w:rPr>
-          <w:rStyle w:val="SectionNumber"/>
-        </w:rPr>
-        <w:t xml:space="preserve">3.4</w:t>
-      </w:r>
-      <w:r>
-        <w:tab/>
-      </w:r>
       <w:r>
         <w:t xml:space="preserve">Output locations</w:t>
       </w:r>
@@ -3120,15 +2997,6 @@
       <w:pPr>
         <w:pStyle w:val="Heading1"/>
       </w:pPr>
-      <w:r>
-        <w:rPr>
-          <w:rStyle w:val="SectionNumber"/>
-        </w:rPr>
-        <w:t xml:space="preserve">4</w:t>
-      </w:r>
-      <w:r>
-        <w:tab/>
-      </w:r>
       <w:r>
         <w:t xml:space="preserve">Quick start — the Matrix model</w:t>
       </w:r>
@@ -3336,15 +3204,6 @@
         <w:pStyle w:val="Heading2"/>
       </w:pPr>
       <w:r>
-        <w:rPr>
-          <w:rStyle w:val="SectionNumber"/>
-        </w:rPr>
-        <w:t xml:space="preserve">4.1</w:t>
-      </w:r>
-      <w:r>
-        <w:tab/>
-      </w:r>
-      <w:r>
         <w:t xml:space="preserve">Step 1 — create the model</w:t>
       </w:r>
     </w:p>
@@ -3658,15 +3517,6 @@
         <w:pStyle w:val="Heading2"/>
       </w:pPr>
       <w:r>
-        <w:rPr>
-          <w:rStyle w:val="SectionNumber"/>
-        </w:rPr>
-        <w:t xml:space="preserve">4.2</w:t>
-      </w:r>
-      <w:r>
-        <w:tab/>
-      </w:r>
-      <w:r>
         <w:t xml:space="preserve">Step 2 — add the classes</w:t>
       </w:r>
     </w:p>
@@ -3848,15 +3698,6 @@
         <w:pStyle w:val="Heading2"/>
       </w:pPr>
       <w:r>
-        <w:rPr>
-          <w:rStyle w:val="SectionNumber"/>
-        </w:rPr>
-        <w:t xml:space="preserve">4.3</w:t>
-      </w:r>
-      <w:r>
-        <w:tab/>
-      </w:r>
-      <w:r>
         <w:t xml:space="preserve">Step 3 — add members</w:t>
       </w:r>
     </w:p>
@@ -4134,15 +3975,6 @@
       <w:pPr>
         <w:pStyle w:val="Heading2"/>
       </w:pPr>
-      <w:r>
-        <w:rPr>
-          <w:rStyle w:val="SectionNumber"/>
-        </w:rPr>
-        <w:t xml:space="preserve">4.4</w:t>
-      </w:r>
-      <w:r>
-        <w:tab/>
-      </w:r>
       <w:r>
         <w:t xml:space="preserve">Step 4 — add the relations</w:t>
       </w:r>
@@ -4552,15 +4384,6 @@
         <w:pStyle w:val="Heading2"/>
       </w:pPr>
       <w:r>
-        <w:rPr>
-          <w:rStyle w:val="SectionNumber"/>
-        </w:rPr>
-        <w:t xml:space="preserve">4.5</w:t>
-      </w:r>
-      <w:r>
-        <w:tab/>
-      </w:r>
-      <w:r>
         <w:t xml:space="preserve">Step 5 — constructors, with real code in the bodies</w:t>
       </w:r>
     </w:p>
@@ -5419,15 +5242,6 @@
         <w:pStyle w:val="Heading2"/>
       </w:pPr>
       <w:r>
-        <w:rPr>
-          <w:rStyle w:val="SectionNumber"/>
-        </w:rPr>
-        <w:t xml:space="preserve">4.6</w:t>
-      </w:r>
-      <w:r>
-        <w:tab/>
-      </w:r>
-      <w:r>
         <w:t xml:space="preserve">Step 6 — a find method</w:t>
       </w:r>
     </w:p>
@@ -5845,15 +5659,6 @@
         <w:pStyle w:val="Heading2"/>
       </w:pPr>
       <w:r>
-        <w:rPr>
-          <w:rStyle w:val="SectionNumber"/>
-        </w:rPr>
-        <w:t xml:space="preserve">4.7</w:t>
-      </w:r>
-      <w:r>
-        <w:tab/>
-      </w:r>
-      <w:r>
         <w:t xml:space="preserve">Step 7 — a class diagram</w:t>
       </w:r>
     </w:p>
@@ -5924,7 +5729,7 @@
       <w:r>
         <w:drawing>
           <wp:inline>
-            <wp:extent cx="5334000" cy="3771120"/>
+            <wp:extent cx="5334000" cy="3212933"/>
             <wp:effectExtent b="0" l="0" r="0" t="0"/>
             <wp:docPr descr="The Matrix Overview class diagram as exported by ClassBuilder (Export SVG). Diamonds mark owned (aggregation) relations; 1/* are the multiplicities." title="" id="45" name="Picture"/>
             <a:graphic>
@@ -5954,7 +5759,7 @@
                   <pic:spPr bwMode="auto">
                     <a:xfrm>
                       <a:off x="0" y="0"/>
-                      <a:ext cx="5334000" cy="3771120"/>
+                      <a:ext cx="5334000" cy="3212933"/>
                     </a:xfrm>
                     <a:prstGeom prst="rect">
                       <a:avLst/>
@@ -5988,7 +5793,7 @@
       <w:r>
         <w:drawing>
           <wp:inline>
-            <wp:extent cx="5334000" cy="3429000"/>
+            <wp:extent cx="5334000" cy="3757996"/>
             <wp:effectExtent b="0" l="0" r="0" t="0"/>
             <wp:docPr descr="A class-diagram view opens as a dockable window over the shell — dock it, tab it, or float it." title="" id="49" name="Picture"/>
             <a:graphic>
@@ -6009,7 +5814,7 @@
                   <pic:spPr bwMode="auto">
                     <a:xfrm>
                       <a:off x="0" y="0"/>
-                      <a:ext cx="5334000" cy="3429000"/>
+                      <a:ext cx="5334000" cy="3757996"/>
                     </a:xfrm>
                     <a:prstGeom prst="rect">
                       <a:avLst/>
@@ -6043,15 +5848,6 @@
         <w:pStyle w:val="Heading2"/>
       </w:pPr>
       <w:r>
-        <w:rPr>
-          <w:rStyle w:val="SectionNumber"/>
-        </w:rPr>
-        <w:t xml:space="preserve">4.8</w:t>
-      </w:r>
-      <w:r>
-        <w:tab/>
-      </w:r>
-      <w:r>
         <w:t xml:space="preserve">Step 8 — generate the source</w:t>
       </w:r>
     </w:p>
@@ -7059,16 +6855,102 @@
         <w:t xml:space="preserve"> </w:t>
       </w:r>
       <w:r>
-        <w:t xml:space="preserve">contains the constructors/destructor with your bodies, and a protected block (</w:t>
-      </w:r>
-      <w:r>
-        <w:rPr>
-          <w:rStyle w:val="VerbatimChar"/>
-        </w:rPr>
-        <w:t xml:space="preserve">//{{AFX DO NOT EDIT ...</w:t>
-      </w:r>
-      <w:r>
-        <w:t xml:space="preserve">) with the generated relation and serialize machinery.</w:t>
+        <w:t xml:space="preserve">contains the constructors/destructor with your bodies, followed by the generated relation and serialize machinery. That machinery sits between a pair of guard comments:</w:t>
+      </w:r>
+    </w:p>
+    <w:p>
+      <w:pPr>
+        <w:pStyle w:val="SourceCode"/>
+      </w:pPr>
+      <w:r>
+        <w:rPr>
+          <w:rStyle w:val="CommentTok"/>
+        </w:rPr>
+        <w:t xml:space="preserve">//{{AFX DO NOT EDIT CODE BELOW THIS LINE !!!</w:t>
+      </w:r>
+      <w:r>
+        <w:br/>
+      </w:r>
+      <w:r>
+        <w:rPr>
+          <w:rStyle w:val="NormalTok"/>
+        </w:rPr>
+        <w:t xml:space="preserve">    </w:t>
+      </w:r>
+      <w:r>
+        <w:rPr>
+          <w:rStyle w:val="OperatorTok"/>
+        </w:rPr>
+        <w:t xml:space="preserve">...</w:t>
+      </w:r>
+      <w:r>
+        <w:rPr>
+          <w:rStyle w:val="NormalTok"/>
+        </w:rPr>
+        <w:t xml:space="preserve"> generated relation </w:t>
+      </w:r>
+      <w:r>
+        <w:rPr>
+          <w:rStyle w:val="OperatorTok"/>
+        </w:rPr>
+        <w:t xml:space="preserve">/</w:t>
+      </w:r>
+      <w:r>
+        <w:rPr>
+          <w:rStyle w:val="NormalTok"/>
+        </w:rPr>
+        <w:t xml:space="preserve"> serialize implementations </w:t>
+      </w:r>
+      <w:r>
+        <w:rPr>
+          <w:rStyle w:val="OperatorTok"/>
+        </w:rPr>
+        <w:t xml:space="preserve">...</w:t>
+      </w:r>
+      <w:r>
+        <w:br/>
+      </w:r>
+      <w:r>
+        <w:rPr>
+          <w:rStyle w:val="CommentTok"/>
+        </w:rPr>
+        <w:t xml:space="preserve">//}}AFX DO NOT EDIT CODE ABOVE THIS LINE !!!</w:t>
+      </w:r>
+    </w:p>
+    <w:p>
+      <w:pPr>
+        <w:pStyle w:val="FirstParagraph"/>
+      </w:pPr>
+      <w:r>
+        <w:t xml:space="preserve">The guards mean exactly what they say: everything between them is regenerated on every</w:t>
+      </w:r>
+      <w:r>
+        <w:t xml:space="preserve"> </w:t>
+      </w:r>
+      <w:r>
+        <w:rPr>
+          <w:bCs/>
+          <w:b/>
+        </w:rPr>
+        <w:t xml:space="preserve">Write Source</w:t>
+      </w:r>
+      <w:r>
+        <w:t xml:space="preserve">, so a hand edit there is lost — your code belongs in the user sections and</w:t>
+      </w:r>
+      <w:r>
+        <w:t xml:space="preserve"> </w:t>
+      </w:r>
+      <w:r>
+        <w:rPr>
+          <w:rStyle w:val="VerbatimChar"/>
+        </w:rPr>
+        <w:t xml:space="preserve">//@CODE</w:t>
+      </w:r>
+      <w:r>
+        <w:t xml:space="preserve"> </w:t>
+      </w:r>
+      <w:r>
+        <w:t xml:space="preserve">bodies (chapter 11 lists every editable region).</w:t>
       </w:r>
     </w:p>
     <w:bookmarkEnd w:id="52"/>
@@ -7078,15 +6960,6 @@
         <w:pStyle w:val="Heading2"/>
       </w:pPr>
       <w:r>
-        <w:rPr>
-          <w:rStyle w:val="SectionNumber"/>
-        </w:rPr>
-        <w:t xml:space="preserve">4.9</w:t>
-      </w:r>
-      <w:r>
-        <w:tab/>
-      </w:r>
-      <w:r>
         <w:t xml:space="preserve">Step 9 — compile and run</w:t>
       </w:r>
     </w:p>
@@ -7914,7 +7787,7 @@
         <w:rPr>
           <w:rStyle w:val="StringTok"/>
         </w:rPr>
-        <w:t xml:space="preserve">"matrix.cbz"</w:t>
+        <w:t xml:space="preserve">"matrix.dat"</w:t>
       </w:r>
       <w:r>
         <w:rPr>
@@ -8211,7 +8084,7 @@
         <w:rPr>
           <w:rStyle w:val="StringTok"/>
         </w:rPr>
-        <w:t xml:space="preserve">"matrix.cbz"</w:t>
+        <w:t xml:space="preserve">"matrix.dat"</w:t>
       </w:r>
       <w:r>
         <w:rPr>
@@ -8388,6 +8261,38 @@
     <w:p>
       <w:pPr>
         <w:pStyle w:val="FirstParagraph"/>
+      </w:pPr>
+      <w:r>
+        <w:t xml:space="preserve">The data file’s extension is yours to choose (</w:t>
+      </w:r>
+      <w:r>
+        <w:rPr>
+          <w:rStyle w:val="VerbatimChar"/>
+        </w:rPr>
+        <w:t xml:space="preserve">.dat</w:t>
+      </w:r>
+      <w:r>
+        <w:t xml:space="preserve"> </w:t>
+      </w:r>
+      <w:r>
+        <w:t xml:space="preserve">here) — just avoid</w:t>
+      </w:r>
+      <w:r>
+        <w:t xml:space="preserve"> </w:t>
+      </w:r>
+      <w:r>
+        <w:rPr>
+          <w:rStyle w:val="VerbatimChar"/>
+        </w:rPr>
+        <w:t xml:space="preserve">.cbz</w:t>
+      </w:r>
+      <w:r>
+        <w:t xml:space="preserve">, which is the extension of ClassBuilder’s own model files and typically associated with the application.</w:t>
+      </w:r>
+    </w:p>
+    <w:p>
+      <w:pPr>
+        <w:pStyle w:val="BodyText"/>
       </w:pPr>
       <w:r>
         <w:t xml:space="preserve">Compiled with the generated files + runtime headers (here with GCC; MSVC works identically):</w:t>
@@ -8591,15 +8496,6 @@
       <w:pPr>
         <w:pStyle w:val="Heading2"/>
       </w:pPr>
-      <w:r>
-        <w:rPr>
-          <w:rStyle w:val="SectionNumber"/>
-        </w:rPr>
-        <w:t xml:space="preserve">4.10</w:t>
-      </w:r>
-      <w:r>
-        <w:tab/>
-      </w:r>
       <w:r>
         <w:t xml:space="preserve">Step 10 — the round trip</w:t>
       </w:r>
@@ -8676,15 +8572,6 @@
         <w:pStyle w:val="Heading1"/>
       </w:pPr>
       <w:r>
-        <w:rPr>
-          <w:rStyle w:val="SectionNumber"/>
-        </w:rPr>
-        <w:t xml:space="preserve">5</w:t>
-      </w:r>
-      <w:r>
-        <w:tab/>
-      </w:r>
-      <w:r>
         <w:t xml:space="preserve">Reference: the application shell</w:t>
       </w:r>
     </w:p>
@@ -8693,15 +8580,6 @@
       <w:pPr>
         <w:pStyle w:val="Heading2"/>
       </w:pPr>
-      <w:r>
-        <w:rPr>
-          <w:rStyle w:val="SectionNumber"/>
-        </w:rPr>
-        <w:t xml:space="preserve">5.1</w:t>
-      </w:r>
-      <w:r>
-        <w:tab/>
-      </w:r>
       <w:r>
         <w:t xml:space="preserve">Menus</w:t>
       </w:r>
@@ -8933,7 +8811,7 @@
               <w:t xml:space="preserve">Ctrl+-</w:t>
             </w:r>
             <w:r>
-              <w:t xml:space="preserve">) · Zoom Full</w:t>
+              <w:t xml:space="preserve">) · Zoom Full · UI Scale ▸ 100% / 125% / 150% / 175% / 200%</w:t>
             </w:r>
           </w:p>
         </w:tc>
@@ -9003,21 +8881,30 @@
         <w:t xml:space="preserve">opens a second full tree of the active model. The zoom items act on the active diagram view.</w:t>
       </w:r>
     </w:p>
+    <w:p>
+      <w:pPr>
+        <w:pStyle w:val="BodyText"/>
+      </w:pPr>
+      <w:r>
+        <w:rPr>
+          <w:bCs/>
+          <w:b/>
+        </w:rPr>
+        <w:t xml:space="preserve">UI Scale</w:t>
+      </w:r>
+      <w:r>
+        <w:t xml:space="preserve"> </w:t>
+      </w:r>
+      <w:r>
+        <w:t xml:space="preserve">enlarges the whole application — text, icons, dialogs — independently of the operating system’s display scaling: useful on a monitor whose system scaling you don’t want to change, or when ClassBuilder alone should be bigger. It is a per-machine setting (stored per user, not in the model) and takes effect after a restart — picking a scale offers to restart ClassBuilder right away. Not to be confused with the Zoom items, which magnify only the active diagram canvas.</w:t>
+      </w:r>
+    </w:p>
     <w:bookmarkEnd w:id="56"/>
     <w:bookmarkStart w:id="57" w:name="the-main-toolbar"/>
     <w:p>
       <w:pPr>
         <w:pStyle w:val="Heading2"/>
       </w:pPr>
-      <w:r>
-        <w:rPr>
-          <w:rStyle w:val="SectionNumber"/>
-        </w:rPr>
-        <w:t xml:space="preserve">5.2</w:t>
-      </w:r>
-      <w:r>
-        <w:tab/>
-      </w:r>
       <w:r>
         <w:t xml:space="preserve">The main toolbar</w:t>
       </w:r>
@@ -9347,15 +9234,6 @@
         <w:pStyle w:val="Heading2"/>
       </w:pPr>
       <w:r>
-        <w:rPr>
-          <w:rStyle w:val="SectionNumber"/>
-        </w:rPr>
-        <w:t xml:space="preserve">5.3</w:t>
-      </w:r>
-      <w:r>
-        <w:tab/>
-      </w:r>
-      <w:r>
         <w:t xml:space="preserve">Docking</w:t>
       </w:r>
     </w:p>
@@ -9376,7 +9254,23 @@
         <w:pStyle w:val="Compact"/>
       </w:pPr>
       <w:r>
-        <w:t xml:space="preserve">Views of one model</w:t>
+        <w:t xml:space="preserve">A model’s</w:t>
+      </w:r>
+      <w:r>
+        <w:t xml:space="preserve"> </w:t>
+      </w:r>
+      <w:r>
+        <w:rPr>
+          <w:bCs/>
+          <w:b/>
+        </w:rPr>
+        <w:t xml:space="preserve">tree</w:t>
+      </w:r>
+      <w:r>
+        <w:t xml:space="preserve"> </w:t>
+      </w:r>
+      <w:r>
+        <w:t xml:space="preserve">opens docked in the main window; each further model becomes a</w:t>
       </w:r>
       <w:r>
         <w:t xml:space="preserve"> </w:t>
@@ -9392,7 +9286,7 @@
         <w:t xml:space="preserve"> </w:t>
       </w:r>
       <w:r>
-        <w:t xml:space="preserve">together by default; the tab is the drag handle.</w:t>
+        <w:t xml:space="preserve">next to it (the tab is its drag handle).</w:t>
       </w:r>
     </w:p>
     <w:p>
@@ -9404,23 +9298,55 @@
         <w:pStyle w:val="Compact"/>
       </w:pPr>
       <w:r>
-        <w:t xml:space="preserve">Drag a tab off its row to</w:t>
-      </w:r>
-      <w:r>
-        <w:t xml:space="preserve"> </w:t>
-      </w:r>
-      <w:r>
-        <w:rPr>
-          <w:bCs/>
-          <w:b/>
-        </w:rPr>
-        <w:t xml:space="preserve">float</w:t>
-      </w:r>
-      <w:r>
-        <w:t xml:space="preserve"> </w:t>
-      </w:r>
-      <w:r>
-        <w:t xml:space="preserve">the view as its own window; drag it back to re-dock (drop indicators show split vs. tab targets).</w:t>
+        <w:t xml:space="preserve">A</w:t>
+      </w:r>
+      <w:r>
+        <w:t xml:space="preserve"> </w:t>
+      </w:r>
+      <w:r>
+        <w:rPr>
+          <w:bCs/>
+          <w:b/>
+        </w:rPr>
+        <w:t xml:space="preserve">diagram</w:t>
+      </w:r>
+      <w:r>
+        <w:t xml:space="preserve"> </w:t>
+      </w:r>
+      <w:r>
+        <w:t xml:space="preserve">view opens</w:t>
+      </w:r>
+      <w:r>
+        <w:t xml:space="preserve"> </w:t>
+      </w:r>
+      <w:r>
+        <w:rPr>
+          <w:bCs/>
+          <w:b/>
+        </w:rPr>
+        <w:t xml:space="preserve">floating</w:t>
+      </w:r>
+      <w:r>
+        <w:t xml:space="preserve"> </w:t>
+      </w:r>
+      <w:r>
+        <w:t xml:space="preserve">by default. From there, drag it wherever you want it: drop it on another pane’s tab row to form a tabbed group, on a pane edge to</w:t>
+      </w:r>
+      <w:r>
+        <w:t xml:space="preserve"> </w:t>
+      </w:r>
+      <w:r>
+        <w:rPr>
+          <w:bCs/>
+          <w:b/>
+        </w:rPr>
+        <w:t xml:space="preserve">split</w:t>
+      </w:r>
+      <w:r>
+        <w:t xml:space="preserve"> </w:t>
+      </w:r>
+      <w:r>
+        <w:t xml:space="preserve">(side by side with the tree or another diagram), or leave it floating (drop indicators show split vs. tab targets while dragging).</w:t>
       </w:r>
     </w:p>
     <w:p>
@@ -9432,23 +9358,7 @@
         <w:pStyle w:val="Compact"/>
       </w:pPr>
       <w:r>
-        <w:t xml:space="preserve">Any pane can be</w:t>
-      </w:r>
-      <w:r>
-        <w:t xml:space="preserve"> </w:t>
-      </w:r>
-      <w:r>
-        <w:rPr>
-          <w:bCs/>
-          <w:b/>
-        </w:rPr>
-        <w:t xml:space="preserve">split</w:t>
-      </w:r>
-      <w:r>
-        <w:t xml:space="preserve"> </w:t>
-      </w:r>
-      <w:r>
-        <w:t xml:space="preserve">horizontally/vertically by dropping a view on a pane edge.</w:t>
+        <w:t xml:space="preserve">The same drags work in reverse: any docked pane can be dragged out to float again.</w:t>
       </w:r>
     </w:p>
     <w:p>
@@ -9470,15 +9380,6 @@
         <w:pStyle w:val="Heading2"/>
       </w:pPr>
       <w:r>
-        <w:rPr>
-          <w:rStyle w:val="SectionNumber"/>
-        </w:rPr>
-        <w:t xml:space="preserve">5.4</w:t>
-      </w:r>
-      <w:r>
-        <w:tab/>
-      </w:r>
-      <w:r>
         <w:t xml:space="preserve">Platforms and keys</w:t>
       </w:r>
     </w:p>
@@ -9620,15 +9521,6 @@
         <w:pStyle w:val="Heading1"/>
       </w:pPr>
       <w:r>
-        <w:rPr>
-          <w:rStyle w:val="SectionNumber"/>
-        </w:rPr>
-        <w:t xml:space="preserve">6</w:t>
-      </w:r>
-      <w:r>
-        <w:tab/>
-      </w:r>
-      <w:r>
         <w:t xml:space="preserve">Reference: the main tree view</w:t>
       </w:r>
     </w:p>
@@ -9637,7 +9529,7 @@
         <w:pStyle w:val="FirstParagraph"/>
       </w:pPr>
       <w:r>
-        <w:t xml:space="preserve">The tree is the master view of a model: every element, in its structure. Multiple models open side by side as tabs; trees and diagram views dock, tab, split and float freely.</w:t>
+        <w:t xml:space="preserve">The tree is the master view of a model: every element of the model, shown in its structure. Several models can be open at the same time — each model’s tree gets its own tab in the main window — and like every other view it can also be split off or floated (chapter 5.3).</w:t>
       </w:r>
     </w:p>
     <w:bookmarkStart w:id="61" w:name="what-the-tree-shows"/>
@@ -9645,15 +9537,6 @@
       <w:pPr>
         <w:pStyle w:val="Heading2"/>
       </w:pPr>
-      <w:r>
-        <w:rPr>
-          <w:rStyle w:val="SectionNumber"/>
-        </w:rPr>
-        <w:t xml:space="preserve">6.1</w:t>
-      </w:r>
-      <w:r>
-        <w:tab/>
-      </w:r>
       <w:r>
         <w:t xml:space="preserve">What the tree shows</w:t>
       </w:r>
@@ -9730,15 +9613,6 @@
       <w:pPr>
         <w:pStyle w:val="Heading2"/>
       </w:pPr>
-      <w:r>
-        <w:rPr>
-          <w:rStyle w:val="SectionNumber"/>
-        </w:rPr>
-        <w:t xml:space="preserve">6.2</w:t>
-      </w:r>
-      <w:r>
-        <w:tab/>
-      </w:r>
       <w:r>
         <w:t xml:space="preserve">The tree toolbar</w:t>
       </w:r>
@@ -10678,15 +10552,6 @@
         <w:pStyle w:val="Heading2"/>
       </w:pPr>
       <w:r>
-        <w:rPr>
-          <w:rStyle w:val="SectionNumber"/>
-        </w:rPr>
-        <w:t xml:space="preserve">6.3</w:t>
-      </w:r>
-      <w:r>
-        <w:tab/>
-      </w:r>
-      <w:r>
         <w:t xml:space="preserve">The context menu</w:t>
       </w:r>
     </w:p>
@@ -11169,15 +11034,6 @@
         <w:pStyle w:val="Heading2"/>
       </w:pPr>
       <w:r>
-        <w:rPr>
-          <w:rStyle w:val="SectionNumber"/>
-        </w:rPr>
-        <w:t xml:space="preserve">6.4</w:t>
-      </w:r>
-      <w:r>
-        <w:tab/>
-      </w:r>
-      <w:r>
         <w:t xml:space="preserve">Filters</w:t>
       </w:r>
     </w:p>
@@ -11272,15 +11128,6 @@
         <w:pStyle w:val="Heading2"/>
       </w:pPr>
       <w:r>
-        <w:rPr>
-          <w:rStyle w:val="SectionNumber"/>
-        </w:rPr>
-        <w:t xml:space="preserve">6.5</w:t>
-      </w:r>
-      <w:r>
-        <w:tab/>
-      </w:r>
-      <w:r>
         <w:t xml:space="preserve">Delete Multiple</w:t>
       </w:r>
     </w:p>
@@ -11370,15 +11217,6 @@
       <w:pPr>
         <w:pStyle w:val="Heading2"/>
       </w:pPr>
-      <w:r>
-        <w:rPr>
-          <w:rStyle w:val="SectionNumber"/>
-        </w:rPr>
-        <w:t xml:space="preserve">6.6</w:t>
-      </w:r>
-      <w:r>
-        <w:tab/>
-      </w:r>
       <w:r>
         <w:t xml:space="preserve">Drag, and copy-drag</w:t>
       </w:r>
@@ -11666,15 +11504,6 @@
         <w:pStyle w:val="Heading1"/>
       </w:pPr>
       <w:r>
-        <w:rPr>
-          <w:rStyle w:val="SectionNumber"/>
-        </w:rPr>
-        <w:t xml:space="preserve">7</w:t>
-      </w:r>
-      <w:r>
-        <w:tab/>
-      </w:r>
-      <w:r>
         <w:t xml:space="preserve">Reference: class diagrams</w:t>
       </w:r>
     </w:p>
@@ -11741,15 +11570,6 @@
       <w:pPr>
         <w:pStyle w:val="Heading2"/>
       </w:pPr>
-      <w:r>
-        <w:rPr>
-          <w:rStyle w:val="SectionNumber"/>
-        </w:rPr>
-        <w:t xml:space="preserve">7.1</w:t>
-      </w:r>
-      <w:r>
-        <w:tab/>
-      </w:r>
       <w:r>
         <w:t xml:space="preserve">Reading the diagram</w:t>
       </w:r>
@@ -11979,15 +11799,6 @@
         <w:pStyle w:val="Heading2"/>
       </w:pPr>
       <w:r>
-        <w:rPr>
-          <w:rStyle w:val="SectionNumber"/>
-        </w:rPr>
-        <w:t xml:space="preserve">7.2</w:t>
-      </w:r>
-      <w:r>
-        <w:tab/>
-      </w:r>
-      <w:r>
         <w:t xml:space="preserve">Selection</w:t>
       </w:r>
     </w:p>
@@ -12226,15 +12037,6 @@
         <w:pStyle w:val="Heading2"/>
       </w:pPr>
       <w:r>
-        <w:rPr>
-          <w:rStyle w:val="SectionNumber"/>
-        </w:rPr>
-        <w:t xml:space="preserve">7.3</w:t>
-      </w:r>
-      <w:r>
-        <w:tab/>
-      </w:r>
-      <w:r>
         <w:t xml:space="preserve">Moving and resizing</w:t>
       </w:r>
     </w:p>
@@ -12315,15 +12117,6 @@
         <w:pStyle w:val="Heading2"/>
       </w:pPr>
       <w:r>
-        <w:rPr>
-          <w:rStyle w:val="SectionNumber"/>
-        </w:rPr>
-        <w:t xml:space="preserve">7.4</w:t>
-      </w:r>
-      <w:r>
-        <w:tab/>
-      </w:r>
-      <w:r>
         <w:t xml:space="preserve">Editing connection routing</w:t>
       </w:r>
     </w:p>
@@ -12500,15 +12293,6 @@
         <w:pStyle w:val="Heading2"/>
       </w:pPr>
       <w:r>
-        <w:rPr>
-          <w:rStyle w:val="SectionNumber"/>
-        </w:rPr>
-        <w:t xml:space="preserve">7.5</w:t>
-      </w:r>
-      <w:r>
-        <w:tab/>
-      </w:r>
-      <w:r>
         <w:t xml:space="preserve">Members and methods inside the box</w:t>
       </w:r>
     </w:p>
@@ -12578,15 +12362,6 @@
         <w:pStyle w:val="Heading2"/>
       </w:pPr>
       <w:r>
-        <w:rPr>
-          <w:rStyle w:val="SectionNumber"/>
-        </w:rPr>
-        <w:t xml:space="preserve">7.6</w:t>
-      </w:r>
-      <w:r>
-        <w:tab/>
-      </w:r>
-      <w:r>
         <w:t xml:space="preserve">Notes and their connection points</w:t>
       </w:r>
     </w:p>
@@ -12689,15 +12464,6 @@
         <w:pStyle w:val="Heading2"/>
       </w:pPr>
       <w:r>
-        <w:rPr>
-          <w:rStyle w:val="SectionNumber"/>
-        </w:rPr>
-        <w:t xml:space="preserve">7.7</w:t>
-      </w:r>
-      <w:r>
-        <w:tab/>
-      </w:r>
-      <w:r>
         <w:t xml:space="preserve">Creating elements on the canvas</w:t>
       </w:r>
     </w:p>
@@ -13120,15 +12886,6 @@
         <w:pStyle w:val="Heading2"/>
       </w:pPr>
       <w:r>
-        <w:rPr>
-          <w:rStyle w:val="SectionNumber"/>
-        </w:rPr>
-        <w:t xml:space="preserve">7.8</w:t>
-      </w:r>
-      <w:r>
-        <w:tab/>
-      </w:r>
-      <w:r>
         <w:t xml:space="preserve">Align</w:t>
       </w:r>
     </w:p>
@@ -13224,15 +12981,6 @@
       <w:pPr>
         <w:pStyle w:val="Heading2"/>
       </w:pPr>
-      <w:r>
-        <w:rPr>
-          <w:rStyle w:val="SectionNumber"/>
-        </w:rPr>
-        <w:t xml:space="preserve">7.9</w:t>
-      </w:r>
-      <w:r>
-        <w:tab/>
-      </w:r>
       <w:r>
         <w:t xml:space="preserve">Hiding, per-shape toggles, colors</w:t>
       </w:r>
@@ -13392,15 +13140,6 @@
       <w:pPr>
         <w:pStyle w:val="Heading2"/>
       </w:pPr>
-      <w:r>
-        <w:rPr>
-          <w:rStyle w:val="SectionNumber"/>
-        </w:rPr>
-        <w:t xml:space="preserve">7.10</w:t>
-      </w:r>
-      <w:r>
-        <w:tab/>
-      </w:r>
       <w:r>
         <w:t xml:space="preserve">Zoom and pan</w:t>
       </w:r>
@@ -13663,15 +13402,6 @@
         <w:pStyle w:val="Heading2"/>
       </w:pPr>
       <w:r>
-        <w:rPr>
-          <w:rStyle w:val="SectionNumber"/>
-        </w:rPr>
-        <w:t xml:space="preserve">7.11</w:t>
-      </w:r>
-      <w:r>
-        <w:tab/>
-      </w:r>
-      <w:r>
         <w:t xml:space="preserve">The CD toolbar</w:t>
       </w:r>
     </w:p>
@@ -13885,15 +13615,6 @@
         <w:pStyle w:val="Heading2"/>
       </w:pPr>
       <w:r>
-        <w:rPr>
-          <w:rStyle w:val="SectionNumber"/>
-        </w:rPr>
-        <w:t xml:space="preserve">7.12</w:t>
-      </w:r>
-      <w:r>
-        <w:tab/>
-      </w:r>
-      <w:r>
         <w:t xml:space="preserve">The CD context menu</w:t>
       </w:r>
     </w:p>
@@ -14235,15 +13956,6 @@
       <w:pPr>
         <w:pStyle w:val="Heading2"/>
       </w:pPr>
-      <w:r>
-        <w:rPr>
-          <w:rStyle w:val="SectionNumber"/>
-        </w:rPr>
-        <w:t xml:space="preserve">7.13</w:t>
-      </w:r>
-      <w:r>
-        <w:tab/>
-      </w:r>
       <w:r>
         <w:t xml:space="preserve">Canvas keys</w:t>
       </w:r>
@@ -14565,15 +14277,6 @@
       <w:pPr>
         <w:pStyle w:val="Heading1"/>
       </w:pPr>
-      <w:r>
-        <w:rPr>
-          <w:rStyle w:val="SectionNumber"/>
-        </w:rPr>
-        <w:t xml:space="preserve">8</w:t>
-      </w:r>
-      <w:r>
-        <w:tab/>
-      </w:r>
       <w:r>
         <w:t xml:space="preserve">Reference: sequence diagrams</w:t>
       </w:r>
@@ -14789,15 +14492,6 @@
         <w:pStyle w:val="Heading2"/>
       </w:pPr>
       <w:r>
-        <w:rPr>
-          <w:rStyle w:val="SectionNumber"/>
-        </w:rPr>
-        <w:t xml:space="preserve">8.1</w:t>
-      </w:r>
-      <w:r>
-        <w:tab/>
-      </w:r>
-      <w:r>
         <w:t xml:space="preserve">Building one</w:t>
       </w:r>
     </w:p>
@@ -14973,15 +14667,6 @@
       <w:pPr>
         <w:pStyle w:val="Heading2"/>
       </w:pPr>
-      <w:r>
-        <w:rPr>
-          <w:rStyle w:val="SectionNumber"/>
-        </w:rPr>
-        <w:t xml:space="preserve">8.2</w:t>
-      </w:r>
-      <w:r>
-        <w:tab/>
-      </w:r>
       <w:r>
         <w:t xml:space="preserve">What moves, and how</w:t>
       </w:r>
@@ -15417,15 +15102,6 @@
         <w:pStyle w:val="Heading2"/>
       </w:pPr>
       <w:r>
-        <w:rPr>
-          <w:rStyle w:val="SectionNumber"/>
-        </w:rPr>
-        <w:t xml:space="preserve">8.3</w:t>
-      </w:r>
-      <w:r>
-        <w:tab/>
-      </w:r>
-      <w:r>
         <w:t xml:space="preserve">Keeping it readable</w:t>
       </w:r>
     </w:p>
@@ -15527,15 +15203,6 @@
         <w:pStyle w:val="Heading2"/>
       </w:pPr>
       <w:r>
-        <w:rPr>
-          <w:rStyle w:val="SectionNumber"/>
-        </w:rPr>
-        <w:t xml:space="preserve">8.4</w:t>
-      </w:r>
-      <w:r>
-        <w:tab/>
-      </w:r>
-      <w:r>
         <w:t xml:space="preserve">Toolbar, colors, zoom</w:t>
       </w:r>
     </w:p>
@@ -15694,15 +15361,6 @@
       <w:pPr>
         <w:pStyle w:val="Heading2"/>
       </w:pPr>
-      <w:r>
-        <w:rPr>
-          <w:rStyle w:val="SectionNumber"/>
-        </w:rPr>
-        <w:t xml:space="preserve">8.5</w:t>
-      </w:r>
-      <w:r>
-        <w:tab/>
-      </w:r>
       <w:r>
         <w:t xml:space="preserve">Canvas keys</w:t>
       </w:r>
@@ -16173,15 +15831,6 @@
         <w:pStyle w:val="Heading1"/>
       </w:pPr>
       <w:r>
-        <w:rPr>
-          <w:rStyle w:val="SectionNumber"/>
-        </w:rPr>
-        <w:t xml:space="preserve">9</w:t>
-      </w:r>
-      <w:r>
-        <w:tab/>
-      </w:r>
-      <w:r>
         <w:t xml:space="preserve">Reference: dialogs</w:t>
       </w:r>
     </w:p>
@@ -16347,15 +15996,6 @@
         <w:pStyle w:val="Heading2"/>
       </w:pPr>
       <w:r>
-        <w:rPr>
-          <w:rStyle w:val="SectionNumber"/>
-        </w:rPr>
-        <w:t xml:space="preserve">9.1</w:t>
-      </w:r>
-      <w:r>
-        <w:tab/>
-      </w:r>
-      <w:r>
         <w:t xml:space="preserve">Class</w:t>
       </w:r>
     </w:p>
@@ -16572,15 +16212,6 @@
         <w:pStyle w:val="Heading2"/>
       </w:pPr>
       <w:r>
-        <w:rPr>
-          <w:rStyle w:val="SectionNumber"/>
-        </w:rPr>
-        <w:t xml:space="preserve">9.2</w:t>
-      </w:r>
-      <w:r>
-        <w:tab/>
-      </w:r>
-      <w:r>
         <w:t xml:space="preserve">External Class</w:t>
       </w:r>
     </w:p>
@@ -16661,15 +16292,6 @@
         <w:pStyle w:val="Heading2"/>
       </w:pPr>
       <w:r>
-        <w:rPr>
-          <w:rStyle w:val="SectionNumber"/>
-        </w:rPr>
-        <w:t xml:space="preserve">9.3</w:t>
-      </w:r>
-      <w:r>
-        <w:tab/>
-      </w:r>
-      <w:r>
         <w:t xml:space="preserve">Member</w:t>
       </w:r>
     </w:p>
@@ -16956,15 +16578,6 @@
         <w:pStyle w:val="Heading2"/>
       </w:pPr>
       <w:r>
-        <w:rPr>
-          <w:rStyle w:val="SectionNumber"/>
-        </w:rPr>
-        <w:t xml:space="preserve">9.4</w:t>
-      </w:r>
-      <w:r>
-        <w:tab/>
-      </w:r>
-      <w:r>
         <w:t xml:space="preserve">Method</w:t>
       </w:r>
     </w:p>
@@ -17297,15 +16910,6 @@
         <w:pStyle w:val="Heading2"/>
       </w:pPr>
       <w:r>
-        <w:rPr>
-          <w:rStyle w:val="SectionNumber"/>
-        </w:rPr>
-        <w:t xml:space="preserve">9.5</w:t>
-      </w:r>
-      <w:r>
-        <w:tab/>
-      </w:r>
-      <w:r>
         <w:t xml:space="preserve">Constructor / Destructor</w:t>
       </w:r>
     </w:p>
@@ -17466,15 +17070,6 @@
         <w:pStyle w:val="Heading2"/>
       </w:pPr>
       <w:r>
-        <w:rPr>
-          <w:rStyle w:val="SectionNumber"/>
-        </w:rPr>
-        <w:t xml:space="preserve">9.6</w:t>
-      </w:r>
-      <w:r>
-        <w:tab/>
-      </w:r>
-      <w:r>
         <w:t xml:space="preserve">Exception Specification</w:t>
       </w:r>
     </w:p>
@@ -17607,15 +17202,6 @@
         <w:pStyle w:val="Heading2"/>
       </w:pPr>
       <w:r>
-        <w:rPr>
-          <w:rStyle w:val="SectionNumber"/>
-        </w:rPr>
-        <w:t xml:space="preserve">9.7</w:t>
-      </w:r>
-      <w:r>
-        <w:tab/>
-      </w:r>
-      <w:r>
         <w:t xml:space="preserve">Argument</w:t>
       </w:r>
     </w:p>
@@ -17680,15 +17266,6 @@
         <w:pStyle w:val="Heading2"/>
       </w:pPr>
       <w:r>
-        <w:rPr>
-          <w:rStyle w:val="SectionNumber"/>
-        </w:rPr>
-        <w:t xml:space="preserve">9.8</w:t>
-      </w:r>
-      <w:r>
-        <w:tab/>
-      </w:r>
-      <w:r>
         <w:t xml:space="preserve">Inheritance</w:t>
       </w:r>
     </w:p>
@@ -17827,15 +17404,6 @@
       <w:pPr>
         <w:pStyle w:val="Heading2"/>
       </w:pPr>
-      <w:r>
-        <w:rPr>
-          <w:rStyle w:val="SectionNumber"/>
-        </w:rPr>
-        <w:t xml:space="preserve">9.9</w:t>
-      </w:r>
-      <w:r>
-        <w:tab/>
-      </w:r>
       <w:r>
         <w:t xml:space="preserve">Relation</w:t>
       </w:r>
@@ -18302,15 +17870,6 @@
         <w:pStyle w:val="Heading2"/>
       </w:pPr>
       <w:r>
-        <w:rPr>
-          <w:rStyle w:val="SectionNumber"/>
-        </w:rPr>
-        <w:t xml:space="preserve">9.10</w:t>
-      </w:r>
-      <w:r>
-        <w:tab/>
-      </w:r>
-      <w:r>
         <w:t xml:space="preserve">Find Method (on a relation)</w:t>
       </w:r>
     </w:p>
@@ -18458,15 +18017,6 @@
         <w:pStyle w:val="Heading2"/>
       </w:pPr>
       <w:r>
-        <w:rPr>
-          <w:rStyle w:val="SectionNumber"/>
-        </w:rPr>
-        <w:t xml:space="preserve">9.11</w:t>
-      </w:r>
-      <w:r>
-        <w:tab/>
-      </w:r>
-      <w:r>
         <w:t xml:space="preserve">Dependency</w:t>
       </w:r>
     </w:p>
@@ -18588,15 +18138,6 @@
         <w:pStyle w:val="Heading2"/>
       </w:pPr>
       <w:r>
-        <w:rPr>
-          <w:rStyle w:val="SectionNumber"/>
-        </w:rPr>
-        <w:t xml:space="preserve">9.12</w:t>
-      </w:r>
-      <w:r>
-        <w:tab/>
-      </w:r>
-      <w:r>
         <w:t xml:space="preserve">Relation (Diagram Only)</w:t>
       </w:r>
     </w:p>
@@ -18725,15 +18266,6 @@
         <w:pStyle w:val="Heading2"/>
       </w:pPr>
       <w:r>
-        <w:rPr>
-          <w:rStyle w:val="SectionNumber"/>
-        </w:rPr>
-        <w:t xml:space="preserve">9.13</w:t>
-      </w:r>
-      <w:r>
-        <w:tab/>
-      </w:r>
-      <w:r>
         <w:t xml:space="preserve">Type</w:t>
       </w:r>
     </w:p>
@@ -18863,15 +18395,6 @@
         <w:pStyle w:val="Heading2"/>
       </w:pPr>
       <w:r>
-        <w:rPr>
-          <w:rStyle w:val="SectionNumber"/>
-        </w:rPr>
-        <w:t xml:space="preserve">9.14</w:t>
-      </w:r>
-      <w:r>
-        <w:tab/>
-      </w:r>
-      <w:r>
         <w:t xml:space="preserve">Group / Meta Group</w:t>
       </w:r>
     </w:p>
@@ -18922,15 +18445,6 @@
       <w:pPr>
         <w:pStyle w:val="Heading2"/>
       </w:pPr>
-      <w:r>
-        <w:rPr>
-          <w:rStyle w:val="SectionNumber"/>
-        </w:rPr>
-        <w:t xml:space="preserve">9.15</w:t>
-      </w:r>
-      <w:r>
-        <w:tab/>
-      </w:r>
       <w:r>
         <w:t xml:space="preserve">Context — define and assign</w:t>
       </w:r>
@@ -19207,15 +18721,6 @@
         <w:pStyle w:val="Heading2"/>
       </w:pPr>
       <w:r>
-        <w:rPr>
-          <w:rStyle w:val="SectionNumber"/>
-        </w:rPr>
-        <w:t xml:space="preserve">9.16</w:t>
-      </w:r>
-      <w:r>
-        <w:tab/>
-      </w:r>
-      <w:r>
         <w:t xml:space="preserve">Actor</w:t>
       </w:r>
     </w:p>
@@ -19282,15 +18787,6 @@
         <w:pStyle w:val="Heading2"/>
       </w:pPr>
       <w:r>
-        <w:rPr>
-          <w:rStyle w:val="SectionNumber"/>
-        </w:rPr>
-        <w:t xml:space="preserve">9.17</w:t>
-      </w:r>
-      <w:r>
-        <w:tab/>
-      </w:r>
-      <w:r>
         <w:t xml:space="preserve">Class Diagram</w:t>
       </w:r>
     </w:p>
@@ -19358,15 +18854,6 @@
         <w:pStyle w:val="Heading2"/>
       </w:pPr>
       <w:r>
-        <w:rPr>
-          <w:rStyle w:val="SectionNumber"/>
-        </w:rPr>
-        <w:t xml:space="preserve">9.18</w:t>
-      </w:r>
-      <w:r>
-        <w:tab/>
-      </w:r>
-      <w:r>
         <w:t xml:space="preserve">Sequence Diagram</w:t>
       </w:r>
     </w:p>
@@ -19522,15 +19009,6 @@
         <w:pStyle w:val="Heading2"/>
       </w:pPr>
       <w:r>
-        <w:rPr>
-          <w:rStyle w:val="SectionNumber"/>
-        </w:rPr>
-        <w:t xml:space="preserve">9.19</w:t>
-      </w:r>
-      <w:r>
-        <w:tab/>
-      </w:r>
-      <w:r>
         <w:t xml:space="preserve">Select Classes</w:t>
       </w:r>
     </w:p>
@@ -19595,15 +19073,6 @@
         <w:pStyle w:val="Heading2"/>
       </w:pPr>
       <w:r>
-        <w:rPr>
-          <w:rStyle w:val="SectionNumber"/>
-        </w:rPr>
-        <w:t xml:space="preserve">9.20</w:t>
-      </w:r>
-      <w:r>
-        <w:tab/>
-      </w:r>
-      <w:r>
         <w:t xml:space="preserve">Class Shape</w:t>
       </w:r>
     </w:p>
@@ -19718,15 +19187,6 @@
         <w:pStyle w:val="Heading2"/>
       </w:pPr>
       <w:r>
-        <w:rPr>
-          <w:rStyle w:val="SectionNumber"/>
-        </w:rPr>
-        <w:t xml:space="preserve">9.21</w:t>
-      </w:r>
-      <w:r>
-        <w:tab/>
-      </w:r>
-      <w:r>
         <w:t xml:space="preserve">Select Members &amp; Methods</w:t>
       </w:r>
     </w:p>
@@ -19779,15 +19239,6 @@
         <w:pStyle w:val="Heading2"/>
       </w:pPr>
       <w:r>
-        <w:rPr>
-          <w:rStyle w:val="SectionNumber"/>
-        </w:rPr>
-        <w:t xml:space="preserve">9.22</w:t>
-      </w:r>
-      <w:r>
-        <w:tab/>
-      </w:r>
-      <w:r>
         <w:t xml:space="preserve">Reorder Members &amp; Methods</w:t>
       </w:r>
     </w:p>
@@ -19837,15 +19288,6 @@
         <w:pStyle w:val="Heading2"/>
       </w:pPr>
       <w:r>
-        <w:rPr>
-          <w:rStyle w:val="SectionNumber"/>
-        </w:rPr>
-        <w:t xml:space="preserve">9.23</w:t>
-      </w:r>
-      <w:r>
-        <w:tab/>
-      </w:r>
-      <w:r>
         <w:t xml:space="preserve">Signal (message)</w:t>
       </w:r>
     </w:p>
@@ -19924,15 +19366,6 @@
         <w:pStyle w:val="Heading2"/>
       </w:pPr>
       <w:r>
-        <w:rPr>
-          <w:rStyle w:val="SectionNumber"/>
-        </w:rPr>
-        <w:t xml:space="preserve">9.24</w:t>
-      </w:r>
-      <w:r>
-        <w:tab/>
-      </w:r>
-      <w:r>
         <w:t xml:space="preserve">LifeLine / Note dialogs</w:t>
       </w:r>
     </w:p>
@@ -20003,15 +19436,6 @@
         <w:pStyle w:val="Heading2"/>
       </w:pPr>
       <w:r>
-        <w:rPr>
-          <w:rStyle w:val="SectionNumber"/>
-        </w:rPr>
-        <w:t xml:space="preserve">9.25</w:t>
-      </w:r>
-      <w:r>
-        <w:tab/>
-      </w:r>
-      <w:r>
         <w:t xml:space="preserve">Project Settings and the DataModel dialog</w:t>
       </w:r>
     </w:p>
@@ -20445,15 +19869,6 @@
         <w:pStyle w:val="Heading2"/>
       </w:pPr>
       <w:r>
-        <w:rPr>
-          <w:rStyle w:val="SectionNumber"/>
-        </w:rPr>
-        <w:t xml:space="preserve">9.26</w:t>
-      </w:r>
-      <w:r>
-        <w:tab/>
-      </w:r>
-      <w:r>
         <w:t xml:space="preserve">Add Serialization to project</w:t>
       </w:r>
     </w:p>
@@ -20533,15 +19948,6 @@
         <w:pStyle w:val="Heading2"/>
       </w:pPr>
       <w:r>
-        <w:rPr>
-          <w:rStyle w:val="SectionNumber"/>
-        </w:rPr>
-        <w:t xml:space="preserve">9.27</w:t>
-      </w:r>
-      <w:r>
-        <w:tab/>
-      </w:r>
-      <w:r>
         <w:t xml:space="preserve">Find</w:t>
       </w:r>
     </w:p>
@@ -20614,15 +20020,6 @@
         <w:pStyle w:val="Heading2"/>
       </w:pPr>
       <w:r>
-        <w:rPr>
-          <w:rStyle w:val="SectionNumber"/>
-        </w:rPr>
-        <w:t xml:space="preserve">9.28</w:t>
-      </w:r>
-      <w:r>
-        <w:tab/>
-      </w:r>
-      <w:r>
         <w:t xml:space="preserve">Read Source</w:t>
       </w:r>
     </w:p>
@@ -20703,15 +20100,6 @@
         <w:pStyle w:val="Heading2"/>
       </w:pPr>
       <w:r>
-        <w:rPr>
-          <w:rStyle w:val="SectionNumber"/>
-        </w:rPr>
-        <w:t xml:space="preserve">9.29</w:t>
-      </w:r>
-      <w:r>
-        <w:tab/>
-      </w:r>
-      <w:r>
         <w:t xml:space="preserve">Save Source</w:t>
       </w:r>
     </w:p>
@@ -20839,15 +20227,6 @@
         <w:pStyle w:val="Heading2"/>
       </w:pPr>
       <w:r>
-        <w:rPr>
-          <w:rStyle w:val="SectionNumber"/>
-        </w:rPr>
-        <w:t xml:space="preserve">9.30</w:t>
-      </w:r>
-      <w:r>
-        <w:tab/>
-      </w:r>
-      <w:r>
         <w:t xml:space="preserve">Virtual Methods / IsClass Methods</w:t>
       </w:r>
     </w:p>
@@ -20956,15 +20335,6 @@
         <w:pStyle w:val="Heading2"/>
       </w:pPr>
       <w:r>
-        <w:rPr>
-          <w:rStyle w:val="SectionNumber"/>
-        </w:rPr>
-        <w:t xml:space="preserve">9.31</w:t>
-      </w:r>
-      <w:r>
-        <w:tab/>
-      </w:r>
-      <w:r>
         <w:t xml:space="preserve">User Sections / Code dialogs</w:t>
       </w:r>
     </w:p>
@@ -21055,15 +20425,6 @@
       <w:pPr>
         <w:pStyle w:val="Heading2"/>
       </w:pPr>
-      <w:r>
-        <w:rPr>
-          <w:rStyle w:val="SectionNumber"/>
-        </w:rPr>
-        <w:t xml:space="preserve">9.32</w:t>
-      </w:r>
-      <w:r>
-        <w:tab/>
-      </w:r>
       <w:r>
         <w:t xml:space="preserve">Code-editing helper wizards</w:t>
       </w:r>
@@ -21364,15 +20725,6 @@
         <w:pStyle w:val="Heading1"/>
       </w:pPr>
       <w:r>
-        <w:rPr>
-          <w:rStyle w:val="SectionNumber"/>
-        </w:rPr>
-        <w:t xml:space="preserve">10</w:t>
-      </w:r>
-      <w:r>
-        <w:tab/>
-      </w:r>
-      <w:r>
         <w:t xml:space="preserve">Reference: the code editor</w:t>
       </w:r>
     </w:p>
@@ -21389,15 +20741,6 @@
       <w:pPr>
         <w:pStyle w:val="Heading2"/>
       </w:pPr>
-      <w:r>
-        <w:rPr>
-          <w:rStyle w:val="SectionNumber"/>
-        </w:rPr>
-        <w:t xml:space="preserve">10.1</w:t>
-      </w:r>
-      <w:r>
-        <w:tab/>
-      </w:r>
       <w:r>
         <w:t xml:space="preserve">Editing behavior</w:t>
       </w:r>
@@ -21602,15 +20945,6 @@
         <w:pStyle w:val="Heading2"/>
       </w:pPr>
       <w:r>
-        <w:rPr>
-          <w:rStyle w:val="SectionNumber"/>
-        </w:rPr>
-        <w:t xml:space="preserve">10.2</w:t>
-      </w:r>
-      <w:r>
-        <w:tab/>
-      </w:r>
-      <w:r>
         <w:t xml:space="preserve">Code insertion</w:t>
       </w:r>
     </w:p>
@@ -21734,15 +21068,6 @@
       <w:pPr>
         <w:pStyle w:val="Heading2"/>
       </w:pPr>
-      <w:r>
-        <w:rPr>
-          <w:rStyle w:val="SectionNumber"/>
-        </w:rPr>
-        <w:t xml:space="preserve">10.3</w:t>
-      </w:r>
-      <w:r>
-        <w:tab/>
-      </w:r>
       <w:r>
         <w:t xml:space="preserve">Where it appears</w:t>
       </w:r>
@@ -21954,15 +21279,6 @@
         <w:pStyle w:val="Heading1"/>
       </w:pPr>
       <w:r>
-        <w:rPr>
-          <w:rStyle w:val="SectionNumber"/>
-        </w:rPr>
-        <w:t xml:space="preserve">11</w:t>
-      </w:r>
-      <w:r>
-        <w:tab/>
-      </w:r>
-      <w:r>
         <w:t xml:space="preserve">Code generation in depth</w:t>
       </w:r>
     </w:p>
@@ -21971,15 +21287,6 @@
       <w:pPr>
         <w:pStyle w:val="Heading2"/>
       </w:pPr>
-      <w:r>
-        <w:rPr>
-          <w:rStyle w:val="SectionNumber"/>
-        </w:rPr>
-        <w:t xml:space="preserve">11.1</w:t>
-      </w:r>
-      <w:r>
-        <w:tab/>
-      </w:r>
       <w:r>
         <w:t xml:space="preserve">Files produced</w:t>
       </w:r>
@@ -22080,15 +21387,6 @@
       <w:pPr>
         <w:pStyle w:val="Heading2"/>
       </w:pPr>
-      <w:r>
-        <w:rPr>
-          <w:rStyle w:val="SectionNumber"/>
-        </w:rPr>
-        <w:t xml:space="preserve">11.2</w:t>
-      </w:r>
-      <w:r>
-        <w:tab/>
-      </w:r>
       <w:r>
         <w:t xml:space="preserve">Anatomy of a generated file</w:t>
       </w:r>
@@ -22514,15 +21812,6 @@
         <w:pStyle w:val="Heading2"/>
       </w:pPr>
       <w:r>
-        <w:rPr>
-          <w:rStyle w:val="SectionNumber"/>
-        </w:rPr>
-        <w:t xml:space="preserve">11.3</w:t>
-      </w:r>
-      <w:r>
-        <w:tab/>
-      </w:r>
-      <w:r>
         <w:t xml:space="preserve">The six user sections</w:t>
       </w:r>
     </w:p>
@@ -22621,15 +21910,6 @@
       <w:pPr>
         <w:pStyle w:val="Heading2"/>
       </w:pPr>
-      <w:r>
-        <w:rPr>
-          <w:rStyle w:val="SectionNumber"/>
-        </w:rPr>
-        <w:t xml:space="preserve">11.4</w:t>
-      </w:r>
-      <w:r>
-        <w:tab/>
-      </w:r>
       <w:r>
         <w:t xml:space="preserve">ConstructorInclude / DestructorInclude</w:t>
       </w:r>
@@ -22771,15 +22051,6 @@
         <w:pStyle w:val="Heading2"/>
       </w:pPr>
       <w:r>
-        <w:rPr>
-          <w:rStyle w:val="SectionNumber"/>
-        </w:rPr>
-        <w:t xml:space="preserve">11.5</w:t>
-      </w:r>
-      <w:r>
-        <w:tab/>
-      </w:r>
-      <w:r>
         <w:t xml:space="preserve">Read Source — the round trip</w:t>
       </w:r>
     </w:p>
@@ -22946,15 +22217,6 @@
         <w:pStyle w:val="Heading1"/>
       </w:pPr>
       <w:r>
-        <w:rPr>
-          <w:rStyle w:val="SectionNumber"/>
-        </w:rPr>
-        <w:t xml:space="preserve">12</w:t>
-      </w:r>
-      <w:r>
-        <w:tab/>
-      </w:r>
-      <w:r>
         <w:t xml:space="preserve">Relations and the intrusive runtime</w:t>
       </w:r>
     </w:p>
@@ -22971,15 +22233,6 @@
       <w:pPr>
         <w:pStyle w:val="Heading2"/>
       </w:pPr>
-      <w:r>
-        <w:rPr>
-          <w:rStyle w:val="SectionNumber"/>
-        </w:rPr>
-        <w:t xml:space="preserve">12.1</w:t>
-      </w:r>
-      <w:r>
-        <w:tab/>
-      </w:r>
       <w:r>
         <w:t xml:space="preserve">What</w:t>
       </w:r>
@@ -23505,15 +22758,6 @@
         <w:pStyle w:val="Heading2"/>
       </w:pPr>
       <w:r>
-        <w:rPr>
-          <w:rStyle w:val="SectionNumber"/>
-        </w:rPr>
-        <w:t xml:space="preserve">12.2</w:t>
-      </w:r>
-      <w:r>
-        <w:tab/>
-      </w:r>
-      <w:r>
         <w:t xml:space="preserve">Declaring relations: the macro surface</w:t>
       </w:r>
     </w:p>
@@ -24217,15 +23461,6 @@
         <w:pStyle w:val="Heading2"/>
       </w:pPr>
       <w:r>
-        <w:rPr>
-          <w:rStyle w:val="SectionNumber"/>
-        </w:rPr>
-        <w:t xml:space="preserve">12.3</w:t>
-      </w:r>
-      <w:r>
-        <w:tab/>
-      </w:r>
-      <w:r>
         <w:t xml:space="preserve">The generated API of a multi relation</w:t>
       </w:r>
     </w:p>
@@ -25154,15 +24389,6 @@
       <w:pPr>
         <w:pStyle w:val="Heading2"/>
       </w:pPr>
-      <w:r>
-        <w:rPr>
-          <w:rStyle w:val="SectionNumber"/>
-        </w:rPr>
-        <w:t xml:space="preserve">12.4</w:t>
-      </w:r>
-      <w:r>
-        <w:tab/>
-      </w:r>
       <w:r>
         <w:t xml:space="preserve">Lifetime semantics — the formal ground rules</w:t>
       </w:r>
@@ -25652,15 +24878,6 @@
       <w:pPr>
         <w:pStyle w:val="Heading2"/>
       </w:pPr>
-      <w:r>
-        <w:rPr>
-          <w:rStyle w:val="SectionNumber"/>
-        </w:rPr>
-        <w:t xml:space="preserve">12.5</w:t>
-      </w:r>
-      <w:r>
-        <w:tab/>
-      </w:r>
       <w:r>
         <w:t xml:space="preserve">Ownership and cascade delete</w:t>
       </w:r>
@@ -25860,15 +25077,6 @@
         <w:pStyle w:val="Heading2"/>
       </w:pPr>
       <w:r>
-        <w:rPr>
-          <w:rStyle w:val="SectionNumber"/>
-        </w:rPr>
-        <w:t xml:space="preserve">12.6</w:t>
-      </w:r>
-      <w:r>
-        <w:tab/>
-      </w:r>
-      <w:r>
         <w:t xml:space="preserve">Iterators that survive modification</w:t>
       </w:r>
     </w:p>
@@ -26134,15 +25342,6 @@
         <w:pStyle w:val="Heading2"/>
       </w:pPr>
       <w:r>
-        <w:rPr>
-          <w:rStyle w:val="SectionNumber"/>
-        </w:rPr>
-        <w:t xml:space="preserve">12.7</w:t>
-      </w:r>
-      <w:r>
-        <w:tab/>
-      </w:r>
-      <w:r>
         <w:t xml:space="preserve">Single, static-multi</w:t>
       </w:r>
     </w:p>
@@ -26219,15 +25418,6 @@
         <w:pStyle w:val="Heading2"/>
       </w:pPr>
       <w:r>
-        <w:rPr>
-          <w:rStyle w:val="SectionNumber"/>
-        </w:rPr>
-        <w:t xml:space="preserve">12.8</w:t>
-      </w:r>
-      <w:r>
-        <w:tab/>
-      </w:r>
-      <w:r>
         <w:t xml:space="preserve">Tree implementations and find methods</w:t>
       </w:r>
     </w:p>
@@ -26982,15 +26172,6 @@
         <w:pStyle w:val="Heading2"/>
       </w:pPr>
       <w:r>
-        <w:rPr>
-          <w:rStyle w:val="SectionNumber"/>
-        </w:rPr>
-        <w:t xml:space="preserve">12.9</w:t>
-      </w:r>
-      <w:r>
-        <w:tab/>
-      </w:r>
-      <w:r>
         <w:t xml:space="preserve">Critical relations (threads)</w:t>
       </w:r>
     </w:p>
@@ -27049,15 +26230,6 @@
       <w:pPr>
         <w:pStyle w:val="Heading2"/>
       </w:pPr>
-      <w:r>
-        <w:rPr>
-          <w:rStyle w:val="SectionNumber"/>
-        </w:rPr>
-        <w:t xml:space="preserve">12.10</w:t>
-      </w:r>
-      <w:r>
-        <w:tab/>
-      </w:r>
       <w:r>
         <w:t xml:space="preserve">Writing loops the generated way</w:t>
       </w:r>
@@ -27403,15 +26575,6 @@
         <w:pStyle w:val="Heading1"/>
       </w:pPr>
       <w:r>
-        <w:rPr>
-          <w:rStyle w:val="SectionNumber"/>
-        </w:rPr>
-        <w:t xml:space="preserve">13</w:t>
-      </w:r>
-      <w:r>
-        <w:tab/>
-      </w:r>
-      <w:r>
         <w:t xml:space="preserve">Serialization</w:t>
       </w:r>
     </w:p>
@@ -27420,15 +26583,6 @@
       <w:pPr>
         <w:pStyle w:val="Heading2"/>
       </w:pPr>
-      <w:r>
-        <w:rPr>
-          <w:rStyle w:val="SectionNumber"/>
-        </w:rPr>
-        <w:t xml:space="preserve">13.1</w:t>
-      </w:r>
-      <w:r>
-        <w:tab/>
-      </w:r>
       <w:r>
         <w:t xml:space="preserve">What you get</w:t>
       </w:r>
@@ -27671,15 +26825,6 @@
         <w:pStyle w:val="Heading2"/>
       </w:pPr>
       <w:r>
-        <w:rPr>
-          <w:rStyle w:val="SectionNumber"/>
-        </w:rPr>
-        <w:t xml:space="preserve">13.2</w:t>
-      </w:r>
-      <w:r>
-        <w:tab/>
-      </w:r>
-      <w:r>
         <w:t xml:space="preserve">CbArchive and the wire format</w:t>
       </w:r>
     </w:p>
@@ -27839,15 +26984,6 @@
         <w:pStyle w:val="Heading2"/>
       </w:pPr>
       <w:r>
-        <w:rPr>
-          <w:rStyle w:val="SectionNumber"/>
-        </w:rPr>
-        <w:t xml:space="preserve">13.3</w:t>
-      </w:r>
-      <w:r>
-        <w:tab/>
-      </w:r>
-      <w:r>
         <w:t xml:space="preserve">CBZ: compression on the fly</w:t>
       </w:r>
     </w:p>
@@ -28198,15 +27334,6 @@
       <w:pPr>
         <w:pStyle w:val="Heading2"/>
       </w:pPr>
-      <w:r>
-        <w:rPr>
-          <w:rStyle w:val="SectionNumber"/>
-        </w:rPr>
-        <w:t xml:space="preserve">13.4</w:t>
-      </w:r>
-      <w:r>
-        <w:tab/>
-      </w:r>
       <w:r>
         <w:t xml:space="preserve">Versioning: evolving the model without breaking old files</w:t>
       </w:r>
@@ -28504,15 +27631,6 @@
         <w:pStyle w:val="Heading2"/>
       </w:pPr>
       <w:r>
-        <w:rPr>
-          <w:rStyle w:val="SectionNumber"/>
-        </w:rPr>
-        <w:t xml:space="preserve">13.5</w:t>
-      </w:r>
-      <w:r>
-        <w:tab/>
-      </w:r>
-      <w:r>
         <w:t xml:space="preserve">Rules and properties</w:t>
       </w:r>
     </w:p>
@@ -28720,15 +27838,6 @@
         <w:pStyle w:val="Heading2"/>
       </w:pPr>
       <w:r>
-        <w:rPr>
-          <w:rStyle w:val="SectionNumber"/>
-        </w:rPr>
-        <w:t xml:space="preserve">13.6</w:t>
-      </w:r>
-      <w:r>
-        <w:tab/>
-      </w:r>
-      <w:r>
         <w:t xml:space="preserve">Starting a new serialize model — current scaffolding checklist</w:t>
       </w:r>
     </w:p>
@@ -28941,15 +28050,6 @@
         <w:pStyle w:val="Heading1"/>
       </w:pPr>
       <w:r>
-        <w:rPr>
-          <w:rStyle w:val="SectionNumber"/>
-        </w:rPr>
-        <w:t xml:space="preserve">14</w:t>
-      </w:r>
-      <w:r>
-        <w:tab/>
-      </w:r>
-      <w:r>
         <w:t xml:space="preserve">The generated Undo/Redo framework</w:t>
       </w:r>
     </w:p>
@@ -28958,15 +28058,6 @@
       <w:pPr>
         <w:pStyle w:val="Heading2"/>
       </w:pPr>
-      <w:r>
-        <w:rPr>
-          <w:rStyle w:val="SectionNumber"/>
-        </w:rPr>
-        <w:t xml:space="preserve">14.1</w:t>
-      </w:r>
-      <w:r>
-        <w:tab/>
-      </w:r>
       <w:r>
         <w:t xml:space="preserve">What it is</w:t>
       </w:r>
@@ -29017,15 +28108,6 @@
       <w:pPr>
         <w:pStyle w:val="Heading2"/>
       </w:pPr>
-      <w:r>
-        <w:rPr>
-          <w:rStyle w:val="SectionNumber"/>
-        </w:rPr>
-        <w:t xml:space="preserve">14.2</w:t>
-      </w:r>
-      <w:r>
-        <w:tab/>
-      </w:r>
       <w:r>
         <w:t xml:space="preserve">How it works</w:t>
       </w:r>
@@ -29462,15 +28544,6 @@
         <w:pStyle w:val="Heading2"/>
       </w:pPr>
       <w:r>
-        <w:rPr>
-          <w:rStyle w:val="SectionNumber"/>
-        </w:rPr>
-        <w:t xml:space="preserve">14.3</w:t>
-      </w:r>
-      <w:r>
-        <w:tab/>
-      </w:r>
-      <w:r>
         <w:t xml:space="preserve">The undo/replace entanglement</w:t>
       </w:r>
     </w:p>
@@ -29586,15 +28659,6 @@
         <w:pStyle w:val="Heading1"/>
       </w:pPr>
       <w:r>
-        <w:rPr>
-          <w:rStyle w:val="SectionNumber"/>
-        </w:rPr>
-        <w:t xml:space="preserve">15</w:t>
-      </w:r>
-      <w:r>
-        <w:tab/>
-      </w:r>
-      <w:r>
         <w:t xml:space="preserve">The replace constructor</w:t>
       </w:r>
     </w:p>
@@ -29603,15 +28667,6 @@
       <w:pPr>
         <w:pStyle w:val="Heading2"/>
       </w:pPr>
-      <w:r>
-        <w:rPr>
-          <w:rStyle w:val="SectionNumber"/>
-        </w:rPr>
-        <w:t xml:space="preserve">15.1</w:t>
-      </w:r>
-      <w:r>
-        <w:tab/>
-      </w:r>
       <w:r>
         <w:t xml:space="preserve">The idea</w:t>
       </w:r>
@@ -29828,15 +28883,6 @@
         <w:pStyle w:val="Heading2"/>
       </w:pPr>
       <w:r>
-        <w:rPr>
-          <w:rStyle w:val="SectionNumber"/>
-        </w:rPr>
-        <w:t xml:space="preserve">15.2</w:t>
-      </w:r>
-      <w:r>
-        <w:tab/>
-      </w:r>
-      <w:r>
         <w:t xml:space="preserve">Why it is more powerful than a factory</w:t>
       </w:r>
     </w:p>
@@ -30502,15 +29548,6 @@
         <w:pStyle w:val="Heading2"/>
       </w:pPr>
       <w:r>
-        <w:rPr>
-          <w:rStyle w:val="SectionNumber"/>
-        </w:rPr>
-        <w:t xml:space="preserve">15.3</w:t>
-      </w:r>
-      <w:r>
-        <w:tab/>
-      </w:r>
-      <w:r>
         <w:t xml:space="preserve">Mechanics and constraints</w:t>
       </w:r>
     </w:p>
@@ -30616,15 +29653,6 @@
         <w:pStyle w:val="Heading1"/>
       </w:pPr>
       <w:r>
-        <w:rPr>
-          <w:rStyle w:val="SectionNumber"/>
-        </w:rPr>
-        <w:t xml:space="preserve">16</w:t>
-      </w:r>
-      <w:r>
-        <w:tab/>
-      </w:r>
-      <w:r>
         <w:t xml:space="preserve">The command interface</w:t>
       </w:r>
     </w:p>
@@ -30633,15 +29661,6 @@
       <w:pPr>
         <w:pStyle w:val="Heading2"/>
       </w:pPr>
-      <w:r>
-        <w:rPr>
-          <w:rStyle w:val="SectionNumber"/>
-        </w:rPr>
-        <w:t xml:space="preserve">16.1</w:t>
-      </w:r>
-      <w:r>
-        <w:tab/>
-      </w:r>
       <w:r>
         <w:t xml:space="preserve">What it is</w:t>
       </w:r>
@@ -30847,15 +29866,6 @@
         <w:pStyle w:val="Heading2"/>
       </w:pPr>
       <w:r>
-        <w:rPr>
-          <w:rStyle w:val="SectionNumber"/>
-        </w:rPr>
-        <w:t xml:space="preserve">16.2</w:t>
-      </w:r>
-      <w:r>
-        <w:tab/>
-      </w:r>
-      <w:r>
         <w:t xml:space="preserve">Connecting</w:t>
       </w:r>
     </w:p>
@@ -31320,15 +30330,6 @@
       <w:pPr>
         <w:pStyle w:val="Heading2"/>
       </w:pPr>
-      <w:r>
-        <w:rPr>
-          <w:rStyle w:val="SectionNumber"/>
-        </w:rPr>
-        <w:t xml:space="preserve">16.3</w:t>
-      </w:r>
-      <w:r>
-        <w:tab/>
-      </w:r>
       <w:r>
         <w:t xml:space="preserve">The command families</w:t>
       </w:r>
@@ -32400,15 +31401,6 @@
         <w:pStyle w:val="Heading2"/>
       </w:pPr>
       <w:r>
-        <w:rPr>
-          <w:rStyle w:val="SectionNumber"/>
-        </w:rPr>
-        <w:t xml:space="preserve">16.4</w:t>
-      </w:r>
-      <w:r>
-        <w:tab/>
-      </w:r>
-      <w:r>
         <w:t xml:space="preserve">Worked examples (real requests)</w:t>
       </w:r>
     </w:p>
@@ -34308,15 +33300,6 @@
       <w:pPr>
         <w:pStyle w:val="Heading2"/>
       </w:pPr>
-      <w:r>
-        <w:rPr>
-          <w:rStyle w:val="SectionNumber"/>
-        </w:rPr>
-        <w:t xml:space="preserve">16.5</w:t>
-      </w:r>
-      <w:r>
-        <w:tab/>
-      </w:r>
       <w:r>
         <w:t xml:space="preserve">Conventions and gotchas</w:t>
       </w:r>
@@ -34652,15 +33635,6 @@
         <w:pStyle w:val="Heading1"/>
       </w:pPr>
       <w:r>
-        <w:rPr>
-          <w:rStyle w:val="SectionNumber"/>
-        </w:rPr>
-        <w:t xml:space="preserve">17</w:t>
-      </w:r>
-      <w:r>
-        <w:tab/>
-      </w:r>
-      <w:r>
         <w:t xml:space="preserve">Tips, pitfalls, and best practices</w:t>
       </w:r>
     </w:p>
@@ -35209,15 +34183,6 @@
         <w:pStyle w:val="Heading1"/>
       </w:pPr>
       <w:r>
-        <w:rPr>
-          <w:rStyle w:val="SectionNumber"/>
-        </w:rPr>
-        <w:t xml:space="preserve">18</w:t>
-      </w:r>
-      <w:r>
-        <w:tab/>
-      </w:r>
-      <w:r>
         <w:t xml:space="preserve">Appendix</w:t>
       </w:r>
     </w:p>
@@ -35226,15 +34191,6 @@
       <w:pPr>
         <w:pStyle w:val="Heading2"/>
       </w:pPr>
-      <w:r>
-        <w:rPr>
-          <w:rStyle w:val="SectionNumber"/>
-        </w:rPr>
-        <w:t xml:space="preserve">18.1</w:t>
-      </w:r>
-      <w:r>
-        <w:tab/>
-      </w:r>
       <w:r>
         <w:t xml:space="preserve">A. Runtime header inventory</w:t>
       </w:r>
@@ -35788,15 +34744,6 @@
         <w:pStyle w:val="Heading2"/>
       </w:pPr>
       <w:r>
-        <w:rPr>
-          <w:rStyle w:val="SectionNumber"/>
-        </w:rPr>
-        <w:t xml:space="preserve">18.2</w:t>
-      </w:r>
-      <w:r>
-        <w:tab/>
-      </w:r>
-      <w:r>
         <w:t xml:space="preserve">B. Marker quick reference</w:t>
       </w:r>
     </w:p>
@@ -35871,15 +34818,6 @@
       <w:pPr>
         <w:pStyle w:val="Heading2"/>
       </w:pPr>
-      <w:r>
-        <w:rPr>
-          <w:rStyle w:val="SectionNumber"/>
-        </w:rPr>
-        <w:t xml:space="preserve">18.3</w:t>
-      </w:r>
-      <w:r>
-        <w:tab/>
-      </w:r>
       <w:r>
         <w:t xml:space="preserve">C. Glossary</w:t>
       </w:r>

</xml_diff>

<commit_message>
docs(manual): review round 2 -- wizard figure, MatrixInclude.h, groups taxonomy
- Step 1 gets JV's real New-wizard screenshot (New_DataModel.png) with a
  corrected caption: the master include is MatrixInclude.h -- it cannot be
  Matrix.h, the Matrix class itself generates that file (the old placeholder
  text claimed Matrix.h). Same h_file fix in the ch16 pipe example. Caption
  matches the New route: Serialize is tickable at creation (the one-off
  moment); it shows locked in Project Settings afterwards.
- Concepts: "Inheritance edges" de-jargoned; Groups rewritten as the real
  three-level taxonomy (member/method groups inside a class -- with the
  folder colour bar cyan/magenta/mixed -- ClassGroups above classes,
  MetaGroups at model-root level).
- docx regenerated (WSL pandoc, reference.docx).

Co-Authored-By: Claude Fable 5 <noreply@anthropic.com>
</commit_message>
<xml_diff>
--- a/docs/manual/ClassBuilder_Manual.docx
+++ b/docs/manual/ClassBuilder_Manual.docx
@@ -1563,13 +1563,28 @@
           <w:bCs/>
           <w:b/>
         </w:rPr>
-        <w:t xml:space="preserve">Inheritance</w:t>
-      </w:r>
-      <w:r>
-        <w:t xml:space="preserve"> </w:t>
-      </w:r>
-      <w:r>
-        <w:t xml:space="preserve">edges, with virtual/access modifiers.</w:t>
+        <w:t xml:space="preserve">Inheritances</w:t>
+      </w:r>
+      <w:r>
+        <w:t xml:space="preserve"> </w:t>
+      </w:r>
+      <w:r>
+        <w:t xml:space="preserve">— which class inherits from which, each with its access (public/protected/private) and optional</w:t>
+      </w:r>
+      <w:r>
+        <w:t xml:space="preserve"> </w:t>
+      </w:r>
+      <w:r>
+        <w:rPr>
+          <w:rStyle w:val="VerbatimChar"/>
+        </w:rPr>
+        <w:t xml:space="preserve">virtual</w:t>
+      </w:r>
+      <w:r>
+        <w:t xml:space="preserve"> </w:t>
+      </w:r>
+      <w:r>
+        <w:t xml:space="preserve">modifier.</w:t>
       </w:r>
     </w:p>
     <w:p>
@@ -1591,7 +1606,46 @@
         <w:t xml:space="preserve"> </w:t>
       </w:r>
       <w:r>
-        <w:t xml:space="preserve">— folders (ClassGroups inside the model or inside MetaGroups) to organize large models; purely organizational.</w:t>
+        <w:t xml:space="preserve">— folders that organize a model, at three levels.</w:t>
+      </w:r>
+      <w:r>
+        <w:t xml:space="preserve"> </w:t>
+      </w:r>
+      <w:r>
+        <w:rPr>
+          <w:iCs/>
+          <w:i/>
+        </w:rPr>
+        <w:t xml:space="preserve">Inside a class</w:t>
+      </w:r>
+      <w:r>
+        <w:t xml:space="preserve">, a group collects members and/or methods — the coloured bar on its folder icon tells what is inside: cyan for members, magenta for methods, both colours for a mix.</w:t>
+      </w:r>
+      <w:r>
+        <w:t xml:space="preserve"> </w:t>
+      </w:r>
+      <w:r>
+        <w:rPr>
+          <w:iCs/>
+          <w:i/>
+        </w:rPr>
+        <w:t xml:space="preserve">Above the classes</w:t>
+      </w:r>
+      <w:r>
+        <w:t xml:space="preserve">, a ClassGroup collects classes that belong together.</w:t>
+      </w:r>
+      <w:r>
+        <w:t xml:space="preserve"> </w:t>
+      </w:r>
+      <w:r>
+        <w:rPr>
+          <w:iCs/>
+          <w:i/>
+        </w:rPr>
+        <w:t xml:space="preserve">At the top level</w:t>
+      </w:r>
+      <w:r>
+        <w:t xml:space="preserve">, next to the model root, a MetaGroup collects ClassGroups. Groups are purely organizational — they do not change the generated code.</w:t>
       </w:r>
     </w:p>
     <w:p>
@@ -2992,7 +3046,7 @@
     </w:p>
     <w:bookmarkEnd w:id="33"/>
     <w:bookmarkEnd w:id="34"/>
-    <w:bookmarkStart w:id="55" w:name="quick-start-the-matrix-model"/>
+    <w:bookmarkStart w:id="58" w:name="quick-start-the-matrix-model"/>
     <w:p>
       <w:pPr>
         <w:pStyle w:val="Heading1"/>
@@ -3150,7 +3204,7 @@
       <w:r>
         <w:drawing>
           <wp:inline>
-            <wp:extent cx="5334000" cy="3583781"/>
+            <wp:extent cx="5334000" cy="4712710"/>
             <wp:effectExtent b="0" l="0" r="0" t="0"/>
             <wp:docPr descr="The ClassBuilder shell with the Matrix model open: menu bar, toolbar, and the model tree (diagrams, classes, members, methods, relation methods)." title="" id="36" name="Picture"/>
             <a:graphic>
@@ -3171,7 +3225,7 @@
                   <pic:spPr bwMode="auto">
                     <a:xfrm>
                       <a:off x="0" y="0"/>
-                      <a:ext cx="5334000" cy="3583781"/>
+                      <a:ext cx="5334000" cy="4712710"/>
                     </a:xfrm>
                     <a:prstGeom prst="rect">
                       <a:avLst/>
@@ -3198,7 +3252,7 @@
         <w:t xml:space="preserve">The ClassBuilder shell with the Matrix model open: menu bar, toolbar, and the model tree (diagrams, classes, members, methods, relation methods).</w:t>
       </w:r>
     </w:p>
-    <w:bookmarkStart w:id="38" w:name="step-1-create-the-model"/>
+    <w:bookmarkStart w:id="41" w:name="step-1-create-the-model"/>
     <w:p>
       <w:pPr>
         <w:pStyle w:val="Heading2"/>
@@ -3226,162 +3280,107 @@
     </w:p>
     <w:p>
       <w:pPr>
-        <w:pStyle w:val="BlockText"/>
-      </w:pPr>
-      <w:r>
-        <w:rPr>
-          <w:bCs/>
-          <w:b/>
-        </w:rPr>
-        <w:t xml:space="preserve">[FIGURE]</w:t>
-      </w:r>
-      <w:r>
-        <w:t xml:space="preserve"> </w:t>
-      </w:r>
-      <w:r>
-        <w:rPr>
-          <w:iCs/>
-          <w:i/>
-        </w:rPr>
-        <w:t xml:space="preserve">The New Model wizard: model name</w:t>
-      </w:r>
-      <w:r>
-        <w:rPr>
-          <w:iCs/>
-          <w:i/>
-        </w:rPr>
-        <w:t xml:space="preserve"> </w:t>
-      </w:r>
-      <w:r>
-        <w:rPr>
-          <w:iCs/>
-          <w:i/>
-        </w:rPr>
+        <w:pStyle w:val="CaptionedFigure"/>
+      </w:pPr>
+      <w:r>
+        <w:drawing>
+          <wp:inline>
+            <wp:extent cx="5334000" cy="4578112"/>
+            <wp:effectExtent b="0" l="0" r="0" t="0"/>
+            <wp:docPr descr="Creating a serialize-enabled model: DataModel name “Matrix”, master include file “MatrixInclude.h”, document class “Matrix”. The master include cannot be named Matrix.h — the Matrix class itself generates that file. Tick Serialize here: it is a one-off choice, made at creation — in the Project ▸ Settings dialog of an existing model the checkbox shows locked." title="" id="39" name="Picture"/>
+            <a:graphic>
+              <a:graphicData uri="http://schemas.openxmlformats.org/drawingml/2006/picture">
+                <pic:pic>
+                  <pic:nvPicPr>
+                    <pic:cNvPr descr="images/New_DataModel.png" id="40" name="Picture"/>
+                    <pic:cNvPicPr>
+                      <a:picLocks noChangeArrowheads="1" noChangeAspect="1"/>
+                    </pic:cNvPicPr>
+                  </pic:nvPicPr>
+                  <pic:blipFill>
+                    <a:blip r:embed="rId38"/>
+                    <a:stretch>
+                      <a:fillRect/>
+                    </a:stretch>
+                  </pic:blipFill>
+                  <pic:spPr bwMode="auto">
+                    <a:xfrm>
+                      <a:off x="0" y="0"/>
+                      <a:ext cx="5334000" cy="4578112"/>
+                    </a:xfrm>
+                    <a:prstGeom prst="rect">
+                      <a:avLst/>
+                    </a:prstGeom>
+                    <a:noFill/>
+                    <a:ln w="9525">
+                      <a:noFill/>
+                      <a:headEnd/>
+                      <a:tailEnd/>
+                    </a:ln>
+                  </pic:spPr>
+                </pic:pic>
+              </a:graphicData>
+            </a:graphic>
+          </wp:inline>
+        </w:drawing>
+      </w:r>
+    </w:p>
+    <w:p>
+      <w:pPr>
+        <w:pStyle w:val="ImageCaption"/>
+      </w:pPr>
+      <w:r>
+        <w:t xml:space="preserve">Creating a serialize-enabled model: DataModel name</w:t>
+      </w:r>
+      <w:r>
+        <w:t xml:space="preserve"> </w:t>
+      </w:r>
+      <w:r>
         <w:t xml:space="preserve">“</w:t>
       </w:r>
       <w:r>
-        <w:rPr>
-          <w:iCs/>
-          <w:i/>
-        </w:rPr>
         <w:t xml:space="preserve">Matrix</w:t>
       </w:r>
       <w:r>
-        <w:rPr>
-          <w:iCs/>
-          <w:i/>
-        </w:rPr>
         <w:t xml:space="preserve">”</w:t>
       </w:r>
       <w:r>
-        <w:rPr>
-          <w:iCs/>
-          <w:i/>
-        </w:rPr>
         <w:t xml:space="preserve">, master include file</w:t>
       </w:r>
       <w:r>
-        <w:rPr>
-          <w:iCs/>
-          <w:i/>
-        </w:rPr>
-        <w:t xml:space="preserve"> </w:t>
-      </w:r>
-      <w:r>
-        <w:rPr>
-          <w:iCs/>
-          <w:i/>
-        </w:rPr>
+        <w:t xml:space="preserve"> </w:t>
+      </w:r>
+      <w:r>
         <w:t xml:space="preserve">“</w:t>
       </w:r>
       <w:r>
-        <w:rPr>
-          <w:iCs/>
-          <w:i/>
-        </w:rPr>
-        <w:t xml:space="preserve">Matrix.h</w:t>
-      </w:r>
-      <w:r>
-        <w:rPr>
-          <w:iCs/>
-          <w:i/>
-        </w:rPr>
+        <w:t xml:space="preserve">MatrixInclude.h</w:t>
+      </w:r>
+      <w:r>
         <w:t xml:space="preserve">”</w:t>
       </w:r>
       <w:r>
-        <w:rPr>
-          <w:iCs/>
-          <w:i/>
-        </w:rPr>
-        <w:t xml:space="preserve">, the Serialize checkbox ticked and Document class name</w:t>
-      </w:r>
-      <w:r>
-        <w:rPr>
-          <w:iCs/>
-          <w:i/>
-        </w:rPr>
-        <w:t xml:space="preserve"> </w:t>
-      </w:r>
-      <w:r>
-        <w:rPr>
-          <w:iCs/>
-          <w:i/>
-        </w:rPr>
+        <w:t xml:space="preserve">, document class</w:t>
+      </w:r>
+      <w:r>
+        <w:t xml:space="preserve"> </w:t>
+      </w:r>
+      <w:r>
         <w:t xml:space="preserve">“</w:t>
       </w:r>
       <w:r>
-        <w:rPr>
-          <w:iCs/>
-          <w:i/>
-        </w:rPr>
         <w:t xml:space="preserve">Matrix</w:t>
       </w:r>
       <w:r>
-        <w:rPr>
-          <w:iCs/>
-          <w:i/>
-        </w:rPr>
         <w:t xml:space="preserve">”</w:t>
       </w:r>
       <w:r>
-        <w:rPr>
-          <w:iCs/>
-          <w:i/>
-        </w:rPr>
-        <w:t xml:space="preserve">. Caption:</w:t>
-      </w:r>
-      <w:r>
-        <w:rPr>
-          <w:iCs/>
-          <w:i/>
-        </w:rPr>
-        <w:t xml:space="preserve"> </w:t>
-      </w:r>
-      <w:r>
-        <w:rPr>
-          <w:iCs/>
-          <w:i/>
-        </w:rPr>
-        <w:t xml:space="preserve">“</w:t>
-      </w:r>
-      <w:r>
-        <w:rPr>
-          <w:iCs/>
-          <w:i/>
-        </w:rPr>
-        <w:t xml:space="preserve">Creating a serialize-enabled model. The Serialize choice is one-off — it cannot be changed later.</w:t>
-      </w:r>
-      <w:r>
-        <w:rPr>
-          <w:iCs/>
-          <w:i/>
-        </w:rPr>
-        <w:t xml:space="preserve">”</w:t>
-      </w:r>
-    </w:p>
-    <w:p>
-      <w:pPr>
-        <w:pStyle w:val="FirstParagraph"/>
+        <w:t xml:space="preserve">. The master include cannot be named Matrix.h — the Matrix class itself generates that file. Tick Serialize here: it is a one-off choice, made at creation — in the Project ▸ Settings dialog of an existing model the checkbox shows locked.</w:t>
+      </w:r>
+    </w:p>
+    <w:p>
+      <w:pPr>
+        <w:pStyle w:val="BodyText"/>
       </w:pPr>
       <w:r>
         <w:t xml:space="preserve">Choose</w:t>
@@ -3510,8 +3509,8 @@
         <w:t xml:space="preserve">from the document-object root, directly or transitively; the GUI enforces this.</w:t>
       </w:r>
     </w:p>
-    <w:bookmarkEnd w:id="38"/>
-    <w:bookmarkStart w:id="39" w:name="step-2-add-the-classes"/>
+    <w:bookmarkEnd w:id="41"/>
+    <w:bookmarkStart w:id="42" w:name="step-2-add-the-classes"/>
     <w:p>
       <w:pPr>
         <w:pStyle w:val="Heading2"/>
@@ -3691,8 +3690,8 @@
         <w:t xml:space="preserve">”</w:t>
       </w:r>
     </w:p>
-    <w:bookmarkEnd w:id="39"/>
-    <w:bookmarkStart w:id="40" w:name="step-3-add-members"/>
+    <w:bookmarkEnd w:id="42"/>
+    <w:bookmarkStart w:id="43" w:name="step-3-add-members"/>
     <w:p>
       <w:pPr>
         <w:pStyle w:val="Heading2"/>
@@ -3969,8 +3968,8 @@
         <w:t xml:space="preserve">”</w:t>
       </w:r>
     </w:p>
-    <w:bookmarkEnd w:id="40"/>
-    <w:bookmarkStart w:id="41" w:name="step-4-add-the-relations"/>
+    <w:bookmarkEnd w:id="43"/>
+    <w:bookmarkStart w:id="44" w:name="step-4-add-the-relations"/>
     <w:p>
       <w:pPr>
         <w:pStyle w:val="Heading2"/>
@@ -4377,8 +4376,8 @@
         <w:t xml:space="preserve">”</w:t>
       </w:r>
     </w:p>
-    <w:bookmarkEnd w:id="41"/>
-    <w:bookmarkStart w:id="42" w:name="X267736c760e32dc6d865ac46fc2c6b29b8f25a5"/>
+    <w:bookmarkEnd w:id="44"/>
+    <w:bookmarkStart w:id="45" w:name="X267736c760e32dc6d865ac46fc2c6b29b8f25a5"/>
     <w:p>
       <w:pPr>
         <w:pStyle w:val="Heading2"/>
@@ -5235,8 +5234,8 @@
         <w:t xml:space="preserve">the insertion.</w:t>
       </w:r>
     </w:p>
-    <w:bookmarkEnd w:id="42"/>
-    <w:bookmarkStart w:id="43" w:name="step-6-a-find-method"/>
+    <w:bookmarkEnd w:id="45"/>
+    <w:bookmarkStart w:id="46" w:name="step-6-a-find-method"/>
     <w:p>
       <w:pPr>
         <w:pStyle w:val="Heading2"/>
@@ -5652,8 +5651,8 @@
         <w:t xml:space="preserve">//@CODE_3308</w:t>
       </w:r>
     </w:p>
-    <w:bookmarkEnd w:id="43"/>
-    <w:bookmarkStart w:id="51" w:name="step-7-a-class-diagram"/>
+    <w:bookmarkEnd w:id="46"/>
+    <w:bookmarkStart w:id="54" w:name="step-7-a-class-diagram"/>
     <w:p>
       <w:pPr>
         <w:pStyle w:val="Heading2"/>
@@ -5731,24 +5730,24 @@
           <wp:inline>
             <wp:extent cx="5334000" cy="3212933"/>
             <wp:effectExtent b="0" l="0" r="0" t="0"/>
-            <wp:docPr descr="The Matrix Overview class diagram as exported by ClassBuilder (Export SVG). Diamonds mark owned (aggregation) relations; 1/* are the multiplicities." title="" id="45" name="Picture"/>
+            <wp:docPr descr="The Matrix Overview class diagram as exported by ClassBuilder (Export SVG). Diamonds mark owned (aggregation) relations; 1/* are the multiplicities." title="" id="48" name="Picture"/>
             <a:graphic>
               <a:graphicData uri="http://schemas.openxmlformats.org/drawingml/2006/picture">
                 <pic:pic>
                   <pic:nvPicPr>
-                    <pic:cNvPr descr="images/cd-matrix-overview.svg" id="46" name="Picture"/>
+                    <pic:cNvPr descr="images/cd-matrix-overview.svg" id="49" name="Picture"/>
                     <pic:cNvPicPr>
                       <a:picLocks noChangeArrowheads="1" noChangeAspect="1"/>
                     </pic:cNvPicPr>
                   </pic:nvPicPr>
                   <pic:blipFill>
-                    <a:blip r:embed="rId47">
+                    <a:blip r:embed="rId50">
                       <a:extLst>
                         <a:ext uri="{28A0092B-C50C-407E-A947-70E740481C1C}">
                           <a14:useLocalDpi xmlns:a14="http://schemas.microsoft.com/office/drawing/2010/main" val="0"/>
                         </a:ext>
                         <a:ext uri="{96DAC541-7B7A-43D3-8B79-37D633B846F1}">
-                          <asvg:svgBlip xmlns:asvg="http://schemas.microsoft.com/office/drawing/2016/SVG/main" r:embed="rId44"/>
+                          <asvg:svgBlip xmlns:asvg="http://schemas.microsoft.com/office/drawing/2016/SVG/main" r:embed="rId47"/>
                         </a:ext>
                       </a:extLst>
                     </a:blip>
@@ -5795,18 +5794,18 @@
           <wp:inline>
             <wp:extent cx="5334000" cy="3757996"/>
             <wp:effectExtent b="0" l="0" r="0" t="0"/>
-            <wp:docPr descr="A class-diagram view opens as a dockable window over the shell — dock it, tab it, or float it." title="" id="49" name="Picture"/>
+            <wp:docPr descr="A class-diagram view opens as a dockable window over the shell — dock it, tab it, or float it." title="" id="52" name="Picture"/>
             <a:graphic>
               <a:graphicData uri="http://schemas.openxmlformats.org/drawingml/2006/picture">
                 <pic:pic>
                   <pic:nvPicPr>
-                    <pic:cNvPr descr="images/cd-view.png" id="50" name="Picture"/>
+                    <pic:cNvPr descr="images/cd-view.png" id="53" name="Picture"/>
                     <pic:cNvPicPr>
                       <a:picLocks noChangeArrowheads="1" noChangeAspect="1"/>
                     </pic:cNvPicPr>
                   </pic:nvPicPr>
                   <pic:blipFill>
-                    <a:blip r:embed="rId48"/>
+                    <a:blip r:embed="rId51"/>
                     <a:stretch>
                       <a:fillRect/>
                     </a:stretch>
@@ -5841,8 +5840,8 @@
         <w:t xml:space="preserve">A class-diagram view opens as a dockable window over the shell — dock it, tab it, or float it.</w:t>
       </w:r>
     </w:p>
-    <w:bookmarkEnd w:id="51"/>
-    <w:bookmarkStart w:id="52" w:name="step-8-generate-the-source"/>
+    <w:bookmarkEnd w:id="54"/>
+    <w:bookmarkStart w:id="55" w:name="step-8-generate-the-source"/>
     <w:p>
       <w:pPr>
         <w:pStyle w:val="Heading2"/>
@@ -6953,8 +6952,8 @@
         <w:t xml:space="preserve">bodies (chapter 11 lists every editable region).</w:t>
       </w:r>
     </w:p>
-    <w:bookmarkEnd w:id="52"/>
-    <w:bookmarkStart w:id="53" w:name="step-9-compile-and-run"/>
+    <w:bookmarkEnd w:id="55"/>
+    <w:bookmarkStart w:id="56" w:name="step-9-compile-and-run"/>
     <w:p>
       <w:pPr>
         <w:pStyle w:val="Heading2"/>
@@ -8490,8 +8489,8 @@
         <w:t xml:space="preserve">— the loop just continued. The whole surviving structure round-tripped through a compressed binary file. That is the value proposition of ClassBuilder in eleven lines of console output.</w:t>
       </w:r>
     </w:p>
-    <w:bookmarkEnd w:id="53"/>
-    <w:bookmarkStart w:id="54" w:name="step-10-the-round-trip"/>
+    <w:bookmarkEnd w:id="56"/>
+    <w:bookmarkStart w:id="57" w:name="step-10-the-round-trip"/>
     <w:p>
       <w:pPr>
         <w:pStyle w:val="Heading2"/>
@@ -8564,9 +8563,9 @@
         <w:t xml:space="preserve">): the model absorbs your edit. If ClassBuilder itself has the file’s model open when the source changes, it offers the read-back automatically — accept it, or your next Write Source will overwrite the edit. Model ↔ source is a two-way street.</w:t>
       </w:r>
     </w:p>
-    <w:bookmarkEnd w:id="54"/>
-    <w:bookmarkEnd w:id="55"/>
-    <w:bookmarkStart w:id="60" w:name="reference-the-application-shell"/>
+    <w:bookmarkEnd w:id="57"/>
+    <w:bookmarkEnd w:id="58"/>
+    <w:bookmarkStart w:id="63" w:name="reference-the-application-shell"/>
     <w:p>
       <w:pPr>
         <w:pStyle w:val="Heading1"/>
@@ -8575,7 +8574,7 @@
         <w:t xml:space="preserve">Reference: the application shell</w:t>
       </w:r>
     </w:p>
-    <w:bookmarkStart w:id="56" w:name="menus"/>
+    <w:bookmarkStart w:id="59" w:name="menus"/>
     <w:p>
       <w:pPr>
         <w:pStyle w:val="Heading2"/>
@@ -8899,8 +8898,8 @@
         <w:t xml:space="preserve">enlarges the whole application — text, icons, dialogs — independently of the operating system’s display scaling: useful on a monitor whose system scaling you don’t want to change, or when ClassBuilder alone should be bigger. It is a per-machine setting (stored per user, not in the model) and takes effect after a restart — picking a scale offers to restart ClassBuilder right away. Not to be confused with the Zoom items, which magnify only the active diagram canvas.</w:t>
       </w:r>
     </w:p>
-    <w:bookmarkEnd w:id="56"/>
-    <w:bookmarkStart w:id="57" w:name="the-main-toolbar"/>
+    <w:bookmarkEnd w:id="59"/>
+    <w:bookmarkStart w:id="60" w:name="the-main-toolbar"/>
     <w:p>
       <w:pPr>
         <w:pStyle w:val="Heading2"/>
@@ -9227,8 +9226,8 @@
         <w:t xml:space="preserve">— cropped strip of the main window toolbar (New / Open / Save / Read Source / Write Source).</w:t>
       </w:r>
     </w:p>
-    <w:bookmarkEnd w:id="57"/>
-    <w:bookmarkStart w:id="58" w:name="docking"/>
+    <w:bookmarkEnd w:id="60"/>
+    <w:bookmarkStart w:id="61" w:name="docking"/>
     <w:p>
       <w:pPr>
         <w:pStyle w:val="Heading2"/>
@@ -9373,8 +9372,8 @@
         <w:t xml:space="preserve">Closing a model’s tab closes the model (with a save prompt when modified).</w:t>
       </w:r>
     </w:p>
-    <w:bookmarkEnd w:id="58"/>
-    <w:bookmarkStart w:id="59" w:name="platforms-and-keys"/>
+    <w:bookmarkEnd w:id="61"/>
+    <w:bookmarkStart w:id="62" w:name="platforms-and-keys"/>
     <w:p>
       <w:pPr>
         <w:pStyle w:val="Heading2"/>
@@ -9513,9 +9512,9 @@
         <w:t xml:space="preserve">shows Width/Height/X/Y of the shape under the cursor in diagram views.</w:t>
       </w:r>
     </w:p>
-    <w:bookmarkEnd w:id="59"/>
-    <w:bookmarkEnd w:id="60"/>
-    <w:bookmarkStart w:id="67" w:name="reference-the-main-tree-view"/>
+    <w:bookmarkEnd w:id="62"/>
+    <w:bookmarkEnd w:id="63"/>
+    <w:bookmarkStart w:id="70" w:name="reference-the-main-tree-view"/>
     <w:p>
       <w:pPr>
         <w:pStyle w:val="Heading1"/>
@@ -9532,7 +9531,7 @@
         <w:t xml:space="preserve">The tree is the master view of a model: every element of the model, shown in its structure. Several models can be open at the same time — each model’s tree gets its own tab in the main window — and like every other view it can also be split off or floated (chapter 5.3).</w:t>
       </w:r>
     </w:p>
-    <w:bookmarkStart w:id="61" w:name="what-the-tree-shows"/>
+    <w:bookmarkStart w:id="64" w:name="what-the-tree-shows"/>
     <w:p>
       <w:pPr>
         <w:pStyle w:val="Heading2"/>
@@ -9607,8 +9606,8 @@
         <w:t xml:space="preserve">in their own folder — visible but owned by the generator. Every node type has its own icon; with Phase Support on, a phase glyph joins it.</w:t>
       </w:r>
     </w:p>
-    <w:bookmarkEnd w:id="61"/>
-    <w:bookmarkStart w:id="62" w:name="the-tree-toolbar"/>
+    <w:bookmarkEnd w:id="64"/>
+    <w:bookmarkStart w:id="65" w:name="the-tree-toolbar"/>
     <w:p>
       <w:pPr>
         <w:pStyle w:val="Heading2"/>
@@ -10545,8 +10544,8 @@
         <w:t xml:space="preserve">set as fallback.</w:t>
       </w:r>
     </w:p>
-    <w:bookmarkEnd w:id="62"/>
-    <w:bookmarkStart w:id="63" w:name="the-context-menu"/>
+    <w:bookmarkEnd w:id="65"/>
+    <w:bookmarkStart w:id="66" w:name="the-context-menu"/>
     <w:p>
       <w:pPr>
         <w:pStyle w:val="Heading2"/>
@@ -11027,8 +11026,8 @@
         <w:t xml:space="preserve">node, with the Add submenu expanded.</w:t>
       </w:r>
     </w:p>
-    <w:bookmarkEnd w:id="63"/>
-    <w:bookmarkStart w:id="64" w:name="filters"/>
+    <w:bookmarkEnd w:id="66"/>
+    <w:bookmarkStart w:id="67" w:name="filters"/>
     <w:p>
       <w:pPr>
         <w:pStyle w:val="Heading2"/>
@@ -11121,8 +11120,8 @@
         <w:t xml:space="preserve">”</w:t>
       </w:r>
     </w:p>
-    <w:bookmarkEnd w:id="64"/>
-    <w:bookmarkStart w:id="65" w:name="delete-multiple"/>
+    <w:bookmarkEnd w:id="67"/>
+    <w:bookmarkStart w:id="68" w:name="delete-multiple"/>
     <w:p>
       <w:pPr>
         <w:pStyle w:val="Heading2"/>
@@ -11211,8 +11210,8 @@
         <w:t xml:space="preserve">”</w:t>
       </w:r>
     </w:p>
-    <w:bookmarkEnd w:id="65"/>
-    <w:bookmarkStart w:id="66" w:name="drag-and-copy-drag"/>
+    <w:bookmarkEnd w:id="68"/>
+    <w:bookmarkStart w:id="69" w:name="drag-and-copy-drag"/>
     <w:p>
       <w:pPr>
         <w:pStyle w:val="Heading2"/>
@@ -11496,9 +11495,9 @@
         <w:t xml:space="preserve">: a class or actor drops as a new lifeline.</w:t>
       </w:r>
     </w:p>
-    <w:bookmarkEnd w:id="66"/>
-    <w:bookmarkEnd w:id="67"/>
-    <w:bookmarkStart w:id="81" w:name="reference-class-diagrams"/>
+    <w:bookmarkEnd w:id="69"/>
+    <w:bookmarkEnd w:id="70"/>
+    <w:bookmarkStart w:id="84" w:name="reference-class-diagrams"/>
     <w:p>
       <w:pPr>
         <w:pStyle w:val="Heading1"/>
@@ -11565,7 +11564,7 @@
         <w:t xml:space="preserve">”</w:t>
       </w:r>
     </w:p>
-    <w:bookmarkStart w:id="68" w:name="reading-the-diagram"/>
+    <w:bookmarkStart w:id="71" w:name="reading-the-diagram"/>
     <w:p>
       <w:pPr>
         <w:pStyle w:val="Heading2"/>
@@ -11792,8 +11791,8 @@
         <w:t xml:space="preserve">: free-text boxes, attachable by connection points to other shapes.</w:t>
       </w:r>
     </w:p>
-    <w:bookmarkEnd w:id="68"/>
-    <w:bookmarkStart w:id="69" w:name="selection"/>
+    <w:bookmarkEnd w:id="71"/>
+    <w:bookmarkStart w:id="72" w:name="selection"/>
     <w:p>
       <w:pPr>
         <w:pStyle w:val="Heading2"/>
@@ -12030,8 +12029,8 @@
         <w:t xml:space="preserve">A right-click on an unselected shape selects it first, then opens the context menu.</w:t>
       </w:r>
     </w:p>
-    <w:bookmarkEnd w:id="69"/>
-    <w:bookmarkStart w:id="70" w:name="moving-and-resizing"/>
+    <w:bookmarkEnd w:id="72"/>
+    <w:bookmarkStart w:id="73" w:name="moving-and-resizing"/>
     <w:p>
       <w:pPr>
         <w:pStyle w:val="Heading2"/>
@@ -12110,8 +12109,8 @@
         <w:t xml:space="preserve">off (re-enable via the context menu).</w:t>
       </w:r>
     </w:p>
-    <w:bookmarkEnd w:id="70"/>
-    <w:bookmarkStart w:id="71" w:name="editing-connection-routing"/>
+    <w:bookmarkEnd w:id="73"/>
+    <w:bookmarkStart w:id="74" w:name="editing-connection-routing"/>
     <w:p>
       <w:pPr>
         <w:pStyle w:val="Heading2"/>
@@ -12286,8 +12285,8 @@
         <w:t xml:space="preserve">(relation role names and multiplicities, dependency name/stereotype) are draggable on a selected connection (four-arrow cursor, snaps to the grid). Once moved, a label stays where you put it.</w:t>
       </w:r>
     </w:p>
-    <w:bookmarkEnd w:id="71"/>
-    <w:bookmarkStart w:id="72" w:name="members-and-methods-inside-the-box"/>
+    <w:bookmarkEnd w:id="74"/>
+    <w:bookmarkStart w:id="75" w:name="members-and-methods-inside-the-box"/>
     <w:p>
       <w:pPr>
         <w:pStyle w:val="Heading2"/>
@@ -12355,8 +12354,8 @@
         <w:t xml:space="preserve">Arrow keys walk the rows of a class (header ↔ members ↔ methods).</w:t>
       </w:r>
     </w:p>
-    <w:bookmarkEnd w:id="72"/>
-    <w:bookmarkStart w:id="73" w:name="notes-and-their-connection-points"/>
+    <w:bookmarkEnd w:id="75"/>
+    <w:bookmarkStart w:id="76" w:name="notes-and-their-connection-points"/>
     <w:p>
       <w:pPr>
         <w:pStyle w:val="Heading2"/>
@@ -12457,8 +12456,8 @@
         <w:t xml:space="preserve">While dragging, a dashed line plus a small square marker previews the geometry.</w:t>
       </w:r>
     </w:p>
-    <w:bookmarkEnd w:id="73"/>
-    <w:bookmarkStart w:id="74" w:name="creating-elements-on-the-canvas"/>
+    <w:bookmarkEnd w:id="76"/>
+    <w:bookmarkStart w:id="77" w:name="creating-elements-on-the-canvas"/>
     <w:p>
       <w:pPr>
         <w:pStyle w:val="Heading2"/>
@@ -12879,8 +12878,8 @@
         <w:t xml:space="preserve">.</w:t>
       </w:r>
     </w:p>
-    <w:bookmarkEnd w:id="74"/>
-    <w:bookmarkStart w:id="75" w:name="align"/>
+    <w:bookmarkEnd w:id="77"/>
+    <w:bookmarkStart w:id="78" w:name="align"/>
     <w:p>
       <w:pPr>
         <w:pStyle w:val="Heading2"/>
@@ -12975,8 +12974,8 @@
         <w:t xml:space="preserve">(≥ 2 classes) auto-lays-out the whole diagram instead.</w:t>
       </w:r>
     </w:p>
-    <w:bookmarkEnd w:id="75"/>
-    <w:bookmarkStart w:id="76" w:name="hiding-per-shape-toggles-colors"/>
+    <w:bookmarkEnd w:id="78"/>
+    <w:bookmarkStart w:id="79" w:name="hiding-per-shape-toggles-colors"/>
     <w:p>
       <w:pPr>
         <w:pStyle w:val="Heading2"/>
@@ -13134,8 +13133,8 @@
         <w:t xml:space="preserve">— class line/text, member text, method text, relation line/critical-relation line/text, inherit line, diagram-only line/text, dependency line/text, note line/text. Each opens a color picker seeded with the current value; the change applies to every diagram of the model (and is undoable).</w:t>
       </w:r>
     </w:p>
-    <w:bookmarkEnd w:id="76"/>
-    <w:bookmarkStart w:id="77" w:name="zoom-and-pan"/>
+    <w:bookmarkEnd w:id="79"/>
+    <w:bookmarkStart w:id="80" w:name="zoom-and-pan"/>
     <w:p>
       <w:pPr>
         <w:pStyle w:val="Heading2"/>
@@ -13395,8 +13394,8 @@
         <w:t xml:space="preserve">Zoom ranges from 0.1× to 32×; the status bar’s X/Y fields track the model coordinates under the cursor.</w:t>
       </w:r>
     </w:p>
-    <w:bookmarkEnd w:id="77"/>
-    <w:bookmarkStart w:id="78" w:name="the-cd-toolbar"/>
+    <w:bookmarkEnd w:id="80"/>
+    <w:bookmarkStart w:id="81" w:name="the-cd-toolbar"/>
     <w:p>
       <w:pPr>
         <w:pStyle w:val="Heading2"/>
@@ -13608,8 +13607,8 @@
         <w:t xml:space="preserve">— cropped strip of the CD toolbar in the order above.</w:t>
       </w:r>
     </w:p>
-    <w:bookmarkEnd w:id="78"/>
-    <w:bookmarkStart w:id="79" w:name="the-cd-context-menu"/>
+    <w:bookmarkEnd w:id="81"/>
+    <w:bookmarkStart w:id="82" w:name="the-cd-context-menu"/>
     <w:p>
       <w:pPr>
         <w:pStyle w:val="Heading2"/>
@@ -13950,8 +13949,8 @@
         <w:t xml:space="preserve">— the context menu open on a selected class shape, with the Add submenu expanded.</w:t>
       </w:r>
     </w:p>
-    <w:bookmarkEnd w:id="79"/>
-    <w:bookmarkStart w:id="80" w:name="canvas-keys"/>
+    <w:bookmarkEnd w:id="82"/>
+    <w:bookmarkStart w:id="83" w:name="canvas-keys"/>
     <w:p>
       <w:pPr>
         <w:pStyle w:val="Heading2"/>
@@ -14270,9 +14269,9 @@
         </w:tc>
       </w:tr>
     </w:tbl>
-    <w:bookmarkEnd w:id="80"/>
-    <w:bookmarkEnd w:id="81"/>
-    <w:bookmarkStart w:id="98" w:name="reference-sequence-diagrams"/>
+    <w:bookmarkEnd w:id="83"/>
+    <w:bookmarkEnd w:id="84"/>
+    <w:bookmarkStart w:id="101" w:name="reference-sequence-diagrams"/>
     <w:p>
       <w:pPr>
         <w:pStyle w:val="Heading1"/>
@@ -14358,18 +14357,18 @@
           <wp:inline>
             <wp:extent cx="5334000" cy="3429000"/>
             <wp:effectExtent b="0" l="0" r="0" t="0"/>
-            <wp:docPr descr="A sequence-diagram view in the shell — its own toolbar (delete, undo/redo, zoom, export SVG) at the top; diagram views dock, tab and float exactly like the trees." title="" id="83" name="Picture"/>
+            <wp:docPr descr="A sequence-diagram view in the shell — its own toolbar (delete, undo/redo, zoom, export SVG) at the top; diagram views dock, tab and float exactly like the trees." title="" id="86" name="Picture"/>
             <a:graphic>
               <a:graphicData uri="http://schemas.openxmlformats.org/drawingml/2006/picture">
                 <pic:pic>
                   <pic:nvPicPr>
-                    <pic:cNvPr descr="images/sd-view.png" id="84" name="Picture"/>
+                    <pic:cNvPr descr="images/sd-view.png" id="87" name="Picture"/>
                     <pic:cNvPicPr>
                       <a:picLocks noChangeArrowheads="1" noChangeAspect="1"/>
                     </pic:cNvPicPr>
                   </pic:nvPicPr>
                   <pic:blipFill>
-                    <a:blip r:embed="rId82"/>
+                    <a:blip r:embed="rId85"/>
                     <a:stretch>
                       <a:fillRect/>
                     </a:stretch>
@@ -14413,24 +14412,24 @@
           <wp:inline>
             <wp:extent cx="5334000" cy="7544589"/>
             <wp:effectExtent b="0" l="0" r="0" t="0"/>
-            <wp:docPr descr="The “Creating a Matrix” sequence diagram (SVG export, generated with add_call_trace): a User triggers Matrix(rows, columns), which constructs the Columns and Rows." title="" id="86" name="Picture"/>
+            <wp:docPr descr="The “Creating a Matrix” sequence diagram (SVG export, generated with add_call_trace): a User triggers Matrix(rows, columns), which constructs the Columns and Rows." title="" id="89" name="Picture"/>
             <a:graphic>
               <a:graphicData uri="http://schemas.openxmlformats.org/drawingml/2006/picture">
                 <pic:pic>
                   <pic:nvPicPr>
-                    <pic:cNvPr descr="images/sd-create.svg" id="87" name="Picture"/>
+                    <pic:cNvPr descr="images/sd-create.svg" id="90" name="Picture"/>
                     <pic:cNvPicPr>
                       <a:picLocks noChangeArrowheads="1" noChangeAspect="1"/>
                     </pic:cNvPicPr>
                   </pic:nvPicPr>
                   <pic:blipFill>
-                    <a:blip r:embed="rId88">
+                    <a:blip r:embed="rId91">
                       <a:extLst>
                         <a:ext uri="{28A0092B-C50C-407E-A947-70E740481C1C}">
                           <a14:useLocalDpi xmlns:a14="http://schemas.microsoft.com/office/drawing/2010/main" val="0"/>
                         </a:ext>
                         <a:ext uri="{96DAC541-7B7A-43D3-8B79-37D633B846F1}">
-                          <asvg:svgBlip xmlns:asvg="http://schemas.microsoft.com/office/drawing/2016/SVG/main" r:embed="rId85"/>
+                          <asvg:svgBlip xmlns:asvg="http://schemas.microsoft.com/office/drawing/2016/SVG/main" r:embed="rId88"/>
                         </a:ext>
                       </a:extLst>
                     </a:blip>
@@ -14486,7 +14485,7 @@
         <w:t xml:space="preserve">sequence diagram (SVG export, generated with add_call_trace): a User triggers Matrix(rows, columns), which constructs the Columns and Rows.</w:t>
       </w:r>
     </w:p>
-    <w:bookmarkStart w:id="89" w:name="building-one"/>
+    <w:bookmarkStart w:id="92" w:name="building-one"/>
     <w:p>
       <w:pPr>
         <w:pStyle w:val="Heading2"/>
@@ -14661,8 +14660,8 @@
         <w:t xml:space="preserve">Notes: free boxes with attach-lines — see below.</w:t>
       </w:r>
     </w:p>
-    <w:bookmarkEnd w:id="89"/>
-    <w:bookmarkStart w:id="90" w:name="what-moves-and-how"/>
+    <w:bookmarkEnd w:id="92"/>
+    <w:bookmarkStart w:id="93" w:name="what-moves-and-how"/>
     <w:p>
       <w:pPr>
         <w:pStyle w:val="Heading2"/>
@@ -15095,8 +15094,8 @@
         <w:t xml:space="preserve">: purely positional, so a point lying on a lifeline or signal travels with it. Dragging a corner point outward spawns a new joint; dragging a point back into the note deletes it. On release, a point near a signal arrow snaps vertically onto it — the line then tracks that signal.</w:t>
       </w:r>
     </w:p>
-    <w:bookmarkEnd w:id="90"/>
-    <w:bookmarkStart w:id="91" w:name="keeping-it-readable"/>
+    <w:bookmarkEnd w:id="93"/>
+    <w:bookmarkStart w:id="94" w:name="keeping-it-readable"/>
     <w:p>
       <w:pPr>
         <w:pStyle w:val="Heading2"/>
@@ -15196,8 +15195,8 @@
         <w:t xml:space="preserve">replaces a selected group of nested activations with a summarizing note — good for hiding boilerplate sub-calls.</w:t>
       </w:r>
     </w:p>
-    <w:bookmarkEnd w:id="91"/>
-    <w:bookmarkStart w:id="92" w:name="toolbar-colors-zoom"/>
+    <w:bookmarkEnd w:id="94"/>
+    <w:bookmarkStart w:id="95" w:name="toolbar-colors-zoom"/>
     <w:p>
       <w:pPr>
         <w:pStyle w:val="Heading2"/>
@@ -15355,8 +15354,8 @@
         <w:t xml:space="preserve">, Fit via toolbar or double-click on empty space, pan with plain scroll / middle-drag / scrollbars, pinch on trackpads).</w:t>
       </w:r>
     </w:p>
-    <w:bookmarkEnd w:id="92"/>
-    <w:bookmarkStart w:id="97" w:name="canvas-keys-1"/>
+    <w:bookmarkEnd w:id="95"/>
+    <w:bookmarkStart w:id="100" w:name="canvas-keys-1"/>
     <w:p>
       <w:pPr>
         <w:pStyle w:val="Heading2"/>
@@ -15756,24 +15755,24 @@
           <wp:inline>
             <wp:extent cx="5334000" cy="7544589"/>
             <wp:effectExtent b="0" l="0" r="0" t="0"/>
-            <wp:docPr descr="A pipe-generated call trace of the Matrix constructor (“Matrix constructor walkthrough”)." title="" id="94" name="Picture"/>
+            <wp:docPr descr="A pipe-generated call trace of the Matrix constructor (“Matrix constructor walkthrough”)." title="" id="97" name="Picture"/>
             <a:graphic>
               <a:graphicData uri="http://schemas.openxmlformats.org/drawingml/2006/picture">
                 <pic:pic>
                   <pic:nvPicPr>
-                    <pic:cNvPr descr="images/sd-ctor-walkthrough.svg" id="95" name="Picture"/>
+                    <pic:cNvPr descr="images/sd-ctor-walkthrough.svg" id="98" name="Picture"/>
                     <pic:cNvPicPr>
                       <a:picLocks noChangeArrowheads="1" noChangeAspect="1"/>
                     </pic:cNvPicPr>
                   </pic:nvPicPr>
                   <pic:blipFill>
-                    <a:blip r:embed="rId96">
+                    <a:blip r:embed="rId99">
                       <a:extLst>
                         <a:ext uri="{28A0092B-C50C-407E-A947-70E740481C1C}">
                           <a14:useLocalDpi xmlns:a14="http://schemas.microsoft.com/office/drawing/2010/main" val="0"/>
                         </a:ext>
                         <a:ext uri="{96DAC541-7B7A-43D3-8B79-37D633B846F1}">
-                          <asvg:svgBlip xmlns:asvg="http://schemas.microsoft.com/office/drawing/2016/SVG/main" r:embed="rId93"/>
+                          <asvg:svgBlip xmlns:asvg="http://schemas.microsoft.com/office/drawing/2016/SVG/main" r:embed="rId96"/>
                         </a:ext>
                       </a:extLst>
                     </a:blip>
@@ -15823,9 +15822,9 @@
         <w:t xml:space="preserve">).</w:t>
       </w:r>
     </w:p>
-    <w:bookmarkEnd w:id="97"/>
-    <w:bookmarkEnd w:id="98"/>
-    <w:bookmarkStart w:id="131" w:name="reference-dialogs"/>
+    <w:bookmarkEnd w:id="100"/>
+    <w:bookmarkEnd w:id="101"/>
+    <w:bookmarkStart w:id="134" w:name="reference-dialogs"/>
     <w:p>
       <w:pPr>
         <w:pStyle w:val="Heading1"/>
@@ -15990,7 +15989,7 @@
         <w:t xml:space="preserve">One screenshot per dialog in this chapter, captured on Windows at 100% scale with realistic content from the Matrix model. Captions are given per dialog below.</w:t>
       </w:r>
     </w:p>
-    <w:bookmarkStart w:id="99" w:name="class"/>
+    <w:bookmarkStart w:id="102" w:name="class"/>
     <w:p>
       <w:pPr>
         <w:pStyle w:val="Heading2"/>
@@ -16205,8 +16204,8 @@
         <w:t xml:space="preserve">the checkbox disables when switching would break the model — most importantly, a class with a Serialize-on subclass cannot turn Serialize off.</w:t>
       </w:r>
     </w:p>
-    <w:bookmarkEnd w:id="99"/>
-    <w:bookmarkStart w:id="100" w:name="external-class"/>
+    <w:bookmarkEnd w:id="102"/>
+    <w:bookmarkStart w:id="103" w:name="external-class"/>
     <w:p>
       <w:pPr>
         <w:pStyle w:val="Heading2"/>
@@ -16285,8 +16284,8 @@
         <w:t xml:space="preserve">(for types that must not be forward-declared, e.g. typedefs), member prefix (used when generated code calls its getters/setters).</w:t>
       </w:r>
     </w:p>
-    <w:bookmarkEnd w:id="100"/>
-    <w:bookmarkStart w:id="101" w:name="member"/>
+    <w:bookmarkEnd w:id="103"/>
+    <w:bookmarkStart w:id="104" w:name="member"/>
     <w:p>
       <w:pPr>
         <w:pStyle w:val="Heading2"/>
@@ -16571,8 +16570,8 @@
         <w:t xml:space="preserve">— changing a key must never be a plain assignment. See chapter 12.7 for the generated code.</w:t>
       </w:r>
     </w:p>
-    <w:bookmarkEnd w:id="101"/>
-    <w:bookmarkStart w:id="102" w:name="method"/>
+    <w:bookmarkEnd w:id="104"/>
+    <w:bookmarkStart w:id="105" w:name="method"/>
     <w:p>
       <w:pPr>
         <w:pStyle w:val="Heading2"/>
@@ -16903,8 +16902,8 @@
         <w:t xml:space="preserve">”</w:t>
       </w:r>
     </w:p>
-    <w:bookmarkEnd w:id="102"/>
-    <w:bookmarkStart w:id="103" w:name="constructor-destructor"/>
+    <w:bookmarkEnd w:id="105"/>
+    <w:bookmarkStart w:id="106" w:name="constructor-destructor"/>
     <w:p>
       <w:pPr>
         <w:pStyle w:val="Heading2"/>
@@ -17063,8 +17062,8 @@
         <w:t xml:space="preserve">). If you edit an initializer by hand in the constructor dialog, your text wins until the next structural change re-derives that entry.</w:t>
       </w:r>
     </w:p>
-    <w:bookmarkEnd w:id="103"/>
-    <w:bookmarkStart w:id="104" w:name="exception-specification"/>
+    <w:bookmarkEnd w:id="106"/>
+    <w:bookmarkStart w:id="107" w:name="exception-specification"/>
     <w:p>
       <w:pPr>
         <w:pStyle w:val="Heading2"/>
@@ -17195,8 +17194,8 @@
         <w:t xml:space="preserve">clause.</w:t>
       </w:r>
     </w:p>
-    <w:bookmarkEnd w:id="104"/>
-    <w:bookmarkStart w:id="105" w:name="argument"/>
+    <w:bookmarkEnd w:id="107"/>
+    <w:bookmarkStart w:id="108" w:name="argument"/>
     <w:p>
       <w:pPr>
         <w:pStyle w:val="Heading2"/>
@@ -17259,8 +17258,8 @@
         <w:t xml:space="preserve">, note. Reorder arguments by drag in the tree.</w:t>
       </w:r>
     </w:p>
-    <w:bookmarkEnd w:id="105"/>
-    <w:bookmarkStart w:id="106" w:name="inheritance"/>
+    <w:bookmarkEnd w:id="108"/>
+    <w:bookmarkStart w:id="109" w:name="inheritance"/>
     <w:p>
       <w:pPr>
         <w:pStyle w:val="Heading2"/>
@@ -17398,8 +17397,8 @@
         <w:t xml:space="preserve">browser.</w:t>
       </w:r>
     </w:p>
-    <w:bookmarkEnd w:id="106"/>
-    <w:bookmarkStart w:id="107" w:name="relation"/>
+    <w:bookmarkEnd w:id="109"/>
+    <w:bookmarkStart w:id="110" w:name="relation"/>
     <w:p>
       <w:pPr>
         <w:pStyle w:val="Heading2"/>
@@ -17863,8 +17862,8 @@
         <w:t xml:space="preserve">(chapter 12.7).</w:t>
       </w:r>
     </w:p>
-    <w:bookmarkEnd w:id="107"/>
-    <w:bookmarkStart w:id="108" w:name="find-method-on-a-relation"/>
+    <w:bookmarkEnd w:id="110"/>
+    <w:bookmarkStart w:id="111" w:name="find-method-on-a-relation"/>
     <w:p>
       <w:pPr>
         <w:pStyle w:val="Heading2"/>
@@ -18010,8 +18009,8 @@
         <w:t xml:space="preserve">is generated instead — callers are identical either way.</w:t>
       </w:r>
     </w:p>
-    <w:bookmarkEnd w:id="108"/>
-    <w:bookmarkStart w:id="109" w:name="dependency"/>
+    <w:bookmarkEnd w:id="111"/>
+    <w:bookmarkStart w:id="112" w:name="dependency"/>
     <w:p>
       <w:pPr>
         <w:pStyle w:val="Heading2"/>
@@ -18131,8 +18130,8 @@
         <w:t xml:space="preserve">. A dependency is modeled — it affects the include/forward-declaration emission for the client — but adds no members or relation code.</w:t>
       </w:r>
     </w:p>
-    <w:bookmarkEnd w:id="109"/>
-    <w:bookmarkStart w:id="110" w:name="relation-diagram-only"/>
+    <w:bookmarkEnd w:id="112"/>
+    <w:bookmarkStart w:id="113" w:name="relation-diagram-only"/>
     <w:p>
       <w:pPr>
         <w:pStyle w:val="Heading2"/>
@@ -18259,8 +18258,8 @@
         <w:t xml:space="preserve">than modeled relations (e.g. Composition).</w:t>
       </w:r>
     </w:p>
-    <w:bookmarkEnd w:id="110"/>
-    <w:bookmarkStart w:id="111" w:name="type"/>
+    <w:bookmarkEnd w:id="113"/>
+    <w:bookmarkStart w:id="114" w:name="type"/>
     <w:p>
       <w:pPr>
         <w:pStyle w:val="Heading2"/>
@@ -18388,8 +18387,8 @@
         <w:t xml:space="preserve">C++ text that gets emitted into the master include.</w:t>
       </w:r>
     </w:p>
-    <w:bookmarkEnd w:id="111"/>
-    <w:bookmarkStart w:id="112" w:name="group-meta-group"/>
+    <w:bookmarkEnd w:id="114"/>
+    <w:bookmarkStart w:id="115" w:name="group-meta-group"/>
     <w:p>
       <w:pPr>
         <w:pStyle w:val="Heading2"/>
@@ -18439,8 +18438,8 @@
         <w:t xml:space="preserve">Name + note. (MemberAndMethodGroups — in-class folders — are created from the class context menu.)</w:t>
       </w:r>
     </w:p>
-    <w:bookmarkEnd w:id="112"/>
-    <w:bookmarkStart w:id="113" w:name="context-define-and-assign"/>
+    <w:bookmarkEnd w:id="115"/>
+    <w:bookmarkStart w:id="116" w:name="context-define-and-assign"/>
     <w:p>
       <w:pPr>
         <w:pStyle w:val="Heading2"/>
@@ -18714,8 +18713,8 @@
         <w:t xml:space="preserve">”</w:t>
       </w:r>
     </w:p>
-    <w:bookmarkEnd w:id="113"/>
-    <w:bookmarkStart w:id="114" w:name="actor"/>
+    <w:bookmarkEnd w:id="116"/>
+    <w:bookmarkStart w:id="117" w:name="actor"/>
     <w:p>
       <w:pPr>
         <w:pStyle w:val="Heading2"/>
@@ -18780,8 +18779,8 @@
         <w:t xml:space="preserve">and go on sequence diagrams as stick figures.</w:t>
       </w:r>
     </w:p>
-    <w:bookmarkEnd w:id="114"/>
-    <w:bookmarkStart w:id="115" w:name="class-diagram"/>
+    <w:bookmarkEnd w:id="117"/>
+    <w:bookmarkStart w:id="118" w:name="class-diagram"/>
     <w:p>
       <w:pPr>
         <w:pStyle w:val="Heading2"/>
@@ -18847,8 +18846,8 @@
         <w:t xml:space="preserve">matrix: which member/method access levels are automatically shown when a class is placed on this diagram (private/protected/public members and methods, plus Get/Set methods).</w:t>
       </w:r>
     </w:p>
-    <w:bookmarkEnd w:id="115"/>
-    <w:bookmarkStart w:id="116" w:name="sequence-diagram"/>
+    <w:bookmarkEnd w:id="118"/>
+    <w:bookmarkStart w:id="119" w:name="sequence-diagram"/>
     <w:p>
       <w:pPr>
         <w:pStyle w:val="Heading2"/>
@@ -19002,8 +19001,8 @@
         <w:t xml:space="preserve">options (argument types, argument names, scope). Per-message overrides exist on each signal’s own dialog.</w:t>
       </w:r>
     </w:p>
-    <w:bookmarkEnd w:id="116"/>
-    <w:bookmarkStart w:id="117" w:name="select-classes"/>
+    <w:bookmarkEnd w:id="119"/>
+    <w:bookmarkStart w:id="120" w:name="select-classes"/>
     <w:p>
       <w:pPr>
         <w:pStyle w:val="Heading2"/>
@@ -19066,8 +19065,8 @@
         <w:t xml:space="preserve">afterwards).</w:t>
       </w:r>
     </w:p>
-    <w:bookmarkEnd w:id="117"/>
-    <w:bookmarkStart w:id="118" w:name="class-shape"/>
+    <w:bookmarkEnd w:id="120"/>
+    <w:bookmarkStart w:id="121" w:name="class-shape"/>
     <w:p>
       <w:pPr>
         <w:pStyle w:val="Heading2"/>
@@ -19180,8 +19179,8 @@
         <w:t xml:space="preserve">shape. The same class can show different features on different diagrams.</w:t>
       </w:r>
     </w:p>
-    <w:bookmarkEnd w:id="118"/>
-    <w:bookmarkStart w:id="119" w:name="select-members-methods"/>
+    <w:bookmarkEnd w:id="121"/>
+    <w:bookmarkStart w:id="122" w:name="select-members-methods"/>
     <w:p>
       <w:pPr>
         <w:pStyle w:val="Heading2"/>
@@ -19232,8 +19231,8 @@
         <w:t xml:space="preserve">on a class shape (within what the diagram’s access-level flags allow). Checkbox lists per section, with Select All / Unselect All. Diagram-wide or per-class, depending on where it was opened.</w:t>
       </w:r>
     </w:p>
-    <w:bookmarkEnd w:id="119"/>
-    <w:bookmarkStart w:id="120" w:name="reorder-members-methods"/>
+    <w:bookmarkEnd w:id="122"/>
+    <w:bookmarkStart w:id="123" w:name="reorder-members-methods"/>
     <w:p>
       <w:pPr>
         <w:pStyle w:val="Heading2"/>
@@ -19281,8 +19280,8 @@
         <w:t xml:space="preserve">: it changes declaration order in the generated file.</w:t>
       </w:r>
     </w:p>
-    <w:bookmarkEnd w:id="120"/>
-    <w:bookmarkStart w:id="121" w:name="signal-message"/>
+    <w:bookmarkEnd w:id="123"/>
+    <w:bookmarkStart w:id="124" w:name="signal-message"/>
     <w:p>
       <w:pPr>
         <w:pStyle w:val="Heading2"/>
@@ -19359,8 +19358,8 @@
         <w:t xml:space="preserve">), return text + show-return-arrow, async flag, per-message argument/scope display, note.</w:t>
       </w:r>
     </w:p>
-    <w:bookmarkEnd w:id="121"/>
-    <w:bookmarkStart w:id="122" w:name="lifeline-note-dialogs"/>
+    <w:bookmarkEnd w:id="124"/>
+    <w:bookmarkStart w:id="125" w:name="lifeline-note-dialogs"/>
     <w:p>
       <w:pPr>
         <w:pStyle w:val="Heading2"/>
@@ -19429,8 +19428,8 @@
         <w:t xml:space="preserve">(apply the size everywhere).</w:t>
       </w:r>
     </w:p>
-    <w:bookmarkEnd w:id="122"/>
-    <w:bookmarkStart w:id="123" w:name="Xb9470c6e63f702dcde05f89c7607c45c6bcf312"/>
+    <w:bookmarkEnd w:id="125"/>
+    <w:bookmarkStart w:id="126" w:name="Xb9470c6e63f702dcde05f89c7607c45c6bcf312"/>
     <w:p>
       <w:pPr>
         <w:pStyle w:val="Heading2"/>
@@ -19862,8 +19861,8 @@
         <w:t xml:space="preserve">(the TODO line seeded into new method bodies); Method Name List / Similar Lines List (name suggestions and the similar-lines tool’s pattern list).</w:t>
       </w:r>
     </w:p>
-    <w:bookmarkEnd w:id="123"/>
-    <w:bookmarkStart w:id="124" w:name="add-serialization-to-project"/>
+    <w:bookmarkEnd w:id="126"/>
+    <w:bookmarkStart w:id="127" w:name="add-serialization-to-project"/>
     <w:p>
       <w:pPr>
         <w:pStyle w:val="Heading2"/>
@@ -19941,8 +19940,8 @@
         <w:t xml:space="preserve">machinery (chapter 13.1). One-way — once a model has Serialize, it keeps it.</w:t>
       </w:r>
     </w:p>
-    <w:bookmarkEnd w:id="124"/>
-    <w:bookmarkStart w:id="125" w:name="find"/>
+    <w:bookmarkEnd w:id="127"/>
+    <w:bookmarkStart w:id="128" w:name="find"/>
     <w:p>
       <w:pPr>
         <w:pStyle w:val="Heading2"/>
@@ -20013,8 +20012,8 @@
         <w:t xml:space="preserve">repeats.</w:t>
       </w:r>
     </w:p>
-    <w:bookmarkEnd w:id="125"/>
-    <w:bookmarkStart w:id="126" w:name="read-source"/>
+    <w:bookmarkEnd w:id="128"/>
+    <w:bookmarkStart w:id="129" w:name="read-source"/>
     <w:p>
       <w:pPr>
         <w:pStyle w:val="Heading2"/>
@@ -20093,8 +20092,8 @@
         <w:t xml:space="preserve">.</w:t>
       </w:r>
     </w:p>
-    <w:bookmarkEnd w:id="126"/>
-    <w:bookmarkStart w:id="127" w:name="save-source"/>
+    <w:bookmarkEnd w:id="129"/>
+    <w:bookmarkStart w:id="130" w:name="save-source"/>
     <w:p>
       <w:pPr>
         <w:pStyle w:val="Heading2"/>
@@ -20220,8 +20219,8 @@
         <w:t xml:space="preserve">block in the header comment). That is where the author initials next to each change line in generated headers come from.</w:t>
       </w:r>
     </w:p>
-    <w:bookmarkEnd w:id="127"/>
-    <w:bookmarkStart w:id="128" w:name="virtual-methods-isclass-methods"/>
+    <w:bookmarkEnd w:id="130"/>
+    <w:bookmarkStart w:id="131" w:name="virtual-methods-isclass-methods"/>
     <w:p>
       <w:pPr>
         <w:pStyle w:val="Heading2"/>
@@ -20328,8 +20327,8 @@
         <w:t xml:space="preserve">, returning a boolean truth value).</w:t>
       </w:r>
     </w:p>
-    <w:bookmarkEnd w:id="128"/>
-    <w:bookmarkStart w:id="129" w:name="user-sections-code-dialogs"/>
+    <w:bookmarkEnd w:id="131"/>
+    <w:bookmarkStart w:id="132" w:name="user-sections-code-dialogs"/>
     <w:p>
       <w:pPr>
         <w:pStyle w:val="Heading2"/>
@@ -20419,8 +20418,8 @@
         <w:t xml:space="preserve">marker bands above and below your text.</w:t>
       </w:r>
     </w:p>
-    <w:bookmarkEnd w:id="129"/>
-    <w:bookmarkStart w:id="130" w:name="code-editing-helper-wizards"/>
+    <w:bookmarkEnd w:id="132"/>
+    <w:bookmarkStart w:id="133" w:name="code-editing-helper-wizards"/>
     <w:p>
       <w:pPr>
         <w:pStyle w:val="Heading2"/>
@@ -20717,9 +20716,9 @@
         <w:t xml:space="preserve">— the member-method wrapper picker.</w:t>
       </w:r>
     </w:p>
-    <w:bookmarkEnd w:id="130"/>
-    <w:bookmarkEnd w:id="131"/>
-    <w:bookmarkStart w:id="135" w:name="reference-the-code-editor"/>
+    <w:bookmarkEnd w:id="133"/>
+    <w:bookmarkEnd w:id="134"/>
+    <w:bookmarkStart w:id="138" w:name="reference-the-code-editor"/>
     <w:p>
       <w:pPr>
         <w:pStyle w:val="Heading1"/>
@@ -20736,7 +20735,7 @@
         <w:t xml:space="preserve">Method bodies, constructor/destructor bodies and the user sections are edited in ClassBuilder’s built-in code editor (a fixed-pitch C++ editor; Consolas 11 pt on Windows).</w:t>
       </w:r>
     </w:p>
-    <w:bookmarkStart w:id="132" w:name="editing-behavior"/>
+    <w:bookmarkStart w:id="135" w:name="editing-behavior"/>
     <w:p>
       <w:pPr>
         <w:pStyle w:val="Heading2"/>
@@ -20938,8 +20937,8 @@
         <w:t xml:space="preserve">No line wrapping; long lines scroll.</w:t>
       </w:r>
     </w:p>
-    <w:bookmarkEnd w:id="132"/>
-    <w:bookmarkStart w:id="133" w:name="code-insertion"/>
+    <w:bookmarkEnd w:id="135"/>
+    <w:bookmarkStart w:id="136" w:name="code-insertion"/>
     <w:p>
       <w:pPr>
         <w:pStyle w:val="Heading2"/>
@@ -21062,8 +21061,8 @@
         <w:t xml:space="preserve">marker already in place — write below the marker (chapter 11.4 for the destructor-order exception).</w:t>
       </w:r>
     </w:p>
-    <w:bookmarkEnd w:id="133"/>
-    <w:bookmarkStart w:id="134" w:name="where-it-appears"/>
+    <w:bookmarkEnd w:id="136"/>
+    <w:bookmarkStart w:id="137" w:name="where-it-appears"/>
     <w:p>
       <w:pPr>
         <w:pStyle w:val="Heading2"/>
@@ -21271,9 +21270,9 @@
         </w:tc>
       </w:tr>
     </w:tbl>
-    <w:bookmarkEnd w:id="134"/>
-    <w:bookmarkEnd w:id="135"/>
-    <w:bookmarkStart w:id="141" w:name="code-generation-in-depth"/>
+    <w:bookmarkEnd w:id="137"/>
+    <w:bookmarkEnd w:id="138"/>
+    <w:bookmarkStart w:id="144" w:name="code-generation-in-depth"/>
     <w:p>
       <w:pPr>
         <w:pStyle w:val="Heading1"/>
@@ -21282,7 +21281,7 @@
         <w:t xml:space="preserve">Code generation in depth</w:t>
       </w:r>
     </w:p>
-    <w:bookmarkStart w:id="136" w:name="files-produced"/>
+    <w:bookmarkStart w:id="139" w:name="files-produced"/>
     <w:p>
       <w:pPr>
         <w:pStyle w:val="Heading2"/>
@@ -21381,8 +21380,8 @@
         <w:t xml:space="preserve">).</w:t>
       </w:r>
     </w:p>
-    <w:bookmarkEnd w:id="136"/>
-    <w:bookmarkStart w:id="137" w:name="anatomy-of-a-generated-file"/>
+    <w:bookmarkEnd w:id="139"/>
+    <w:bookmarkStart w:id="140" w:name="anatomy-of-a-generated-file"/>
     <w:p>
       <w:pPr>
         <w:pStyle w:val="Heading2"/>
@@ -21805,8 +21804,8 @@
         <w:t xml:space="preserve">bodies, relation macros, class declarations or member lists on disk; change the model instead.</w:t>
       </w:r>
     </w:p>
-    <w:bookmarkEnd w:id="137"/>
-    <w:bookmarkStart w:id="138" w:name="the-six-user-sections"/>
+    <w:bookmarkEnd w:id="140"/>
+    <w:bookmarkStart w:id="141" w:name="the-six-user-sections"/>
     <w:p>
       <w:pPr>
         <w:pStyle w:val="Heading2"/>
@@ -21904,8 +21903,8 @@
         <w:t xml:space="preserve">is the place for hand-written members or friend declarations that should live in the class but not in the model.</w:t>
       </w:r>
     </w:p>
-    <w:bookmarkEnd w:id="138"/>
-    <w:bookmarkStart w:id="139" w:name="constructorinclude-destructorinclude"/>
+    <w:bookmarkEnd w:id="141"/>
+    <w:bookmarkStart w:id="142" w:name="constructorinclude-destructorinclude"/>
     <w:p>
       <w:pPr>
         <w:pStyle w:val="Heading2"/>
@@ -22044,8 +22043,8 @@
         <w:t xml:space="preserve">(the generator preserves your body; you own the order inside it).</w:t>
       </w:r>
     </w:p>
-    <w:bookmarkEnd w:id="139"/>
-    <w:bookmarkStart w:id="140" w:name="read-source-the-round-trip"/>
+    <w:bookmarkEnd w:id="142"/>
+    <w:bookmarkStart w:id="143" w:name="read-source-the-round-trip"/>
     <w:p>
       <w:pPr>
         <w:pStyle w:val="Heading2"/>
@@ -22209,9 +22208,9 @@
         <w:t xml:space="preserve">Line endings: bodies are stored with CRLF; keep generated files CRLF (the model’s line-ending setting controls emissions).</w:t>
       </w:r>
     </w:p>
-    <w:bookmarkEnd w:id="140"/>
-    <w:bookmarkEnd w:id="141"/>
-    <w:bookmarkStart w:id="160" w:name="relations-and-the-intrusive-runtime"/>
+    <w:bookmarkEnd w:id="143"/>
+    <w:bookmarkEnd w:id="144"/>
+    <w:bookmarkStart w:id="163" w:name="relations-and-the-intrusive-runtime"/>
     <w:p>
       <w:pPr>
         <w:pStyle w:val="Heading1"/>
@@ -22228,7 +22227,7 @@
         <w:t xml:space="preserve">This chapter is the heart of ClassBuilder. It explains what the relation macros generate, why intrusive linked lists were chosen, and what guarantees you get.</w:t>
       </w:r>
     </w:p>
-    <w:bookmarkStart w:id="146" w:name="what-intrusive-means"/>
+    <w:bookmarkStart w:id="149" w:name="what-intrusive-means"/>
     <w:p>
       <w:pPr>
         <w:pStyle w:val="Heading2"/>
@@ -22264,24 +22263,24 @@
           <wp:inline>
             <wp:extent cx="5334000" cy="3246782"/>
             <wp:effectExtent b="0" l="0" r="0" t="0"/>
-            <wp:docPr descr="One Cell in two lists: all link pointers are members of the Cell itself." title="" id="143" name="Picture"/>
+            <wp:docPr descr="One Cell in two lists: all link pointers are members of the Cell itself." title="" id="146" name="Picture"/>
             <a:graphic>
               <a:graphicData uri="http://schemas.openxmlformats.org/drawingml/2006/picture">
                 <pic:pic>
                   <pic:nvPicPr>
-                    <pic:cNvPr descr="images/fig-intrusive-lists.svg" id="144" name="Picture"/>
+                    <pic:cNvPr descr="images/fig-intrusive-lists.svg" id="147" name="Picture"/>
                     <pic:cNvPicPr>
                       <a:picLocks noChangeArrowheads="1" noChangeAspect="1"/>
                     </pic:cNvPicPr>
                   </pic:nvPicPr>
                   <pic:blipFill>
-                    <a:blip r:embed="rId145">
+                    <a:blip r:embed="rId148">
                       <a:extLst>
                         <a:ext uri="{28A0092B-C50C-407E-A947-70E740481C1C}">
                           <a14:useLocalDpi xmlns:a14="http://schemas.microsoft.com/office/drawing/2010/main" val="0"/>
                         </a:ext>
                         <a:ext uri="{96DAC541-7B7A-43D3-8B79-37D633B846F1}">
-                          <asvg:svgBlip xmlns:asvg="http://schemas.microsoft.com/office/drawing/2016/SVG/main" r:embed="rId142"/>
+                          <asvg:svgBlip xmlns:asvg="http://schemas.microsoft.com/office/drawing/2016/SVG/main" r:embed="rId145"/>
                         </a:ext>
                       </a:extLst>
                     </a:blip>
@@ -22751,8 +22750,8 @@
         <w:t xml:space="preserve">In ClassBuilder a new relation on an existing class is one dialog and a regeneration; existing relations, code and files are untouched.</w:t>
       </w:r>
     </w:p>
-    <w:bookmarkEnd w:id="146"/>
-    <w:bookmarkStart w:id="147" w:name="declaring-relations-the-macro-surface"/>
+    <w:bookmarkEnd w:id="149"/>
+    <w:bookmarkStart w:id="150" w:name="declaring-relations-the-macro-surface"/>
     <w:p>
       <w:pPr>
         <w:pStyle w:val="Heading2"/>
@@ -23454,8 +23453,8 @@
         </w:tc>
       </w:tr>
     </w:tbl>
-    <w:bookmarkEnd w:id="147"/>
-    <w:bookmarkStart w:id="148" w:name="the-generated-api-of-a-multi-relation"/>
+    <w:bookmarkEnd w:id="150"/>
+    <w:bookmarkStart w:id="151" w:name="the-generated-api-of-a-multi-relation"/>
     <w:p>
       <w:pPr>
         <w:pStyle w:val="Heading2"/>
@@ -24383,8 +24382,8 @@
         <w:t xml:space="preserve">, so their exact signatures are always visible.</w:t>
       </w:r>
     </w:p>
-    <w:bookmarkEnd w:id="148"/>
-    <w:bookmarkStart w:id="149" w:name="Xaaa89ef9d7adb0d0fb470691c4808f6f6b0754c"/>
+    <w:bookmarkEnd w:id="151"/>
+    <w:bookmarkStart w:id="152" w:name="Xaaa89ef9d7adb0d0fb470691c4808f6f6b0754c"/>
     <w:p>
       <w:pPr>
         <w:pStyle w:val="Heading2"/>
@@ -24872,8 +24871,8 @@
         <w:t xml:space="preserve">.</w:t>
       </w:r>
     </w:p>
-    <w:bookmarkEnd w:id="149"/>
-    <w:bookmarkStart w:id="154" w:name="ownership-and-cascade-delete"/>
+    <w:bookmarkEnd w:id="152"/>
+    <w:bookmarkStart w:id="157" w:name="ownership-and-cascade-delete"/>
     <w:p>
       <w:pPr>
         <w:pStyle w:val="Heading2"/>
@@ -24891,24 +24890,24 @@
           <wp:inline>
             <wp:extent cx="5334000" cy="2724978"/>
             <wp:effectExtent b="0" l="0" r="0" t="0"/>
-            <wp:docPr descr="delete pMatrix — the cascade frees the entire graph." title="" id="151" name="Picture"/>
+            <wp:docPr descr="delete pMatrix — the cascade frees the entire graph." title="" id="154" name="Picture"/>
             <a:graphic>
               <a:graphicData uri="http://schemas.openxmlformats.org/drawingml/2006/picture">
                 <pic:pic>
                   <pic:nvPicPr>
-                    <pic:cNvPr descr="images/fig-ownership-cascade.svg" id="152" name="Picture"/>
+                    <pic:cNvPr descr="images/fig-ownership-cascade.svg" id="155" name="Picture"/>
                     <pic:cNvPicPr>
                       <a:picLocks noChangeArrowheads="1" noChangeAspect="1"/>
                     </pic:cNvPicPr>
                   </pic:nvPicPr>
                   <pic:blipFill>
-                    <a:blip r:embed="rId153">
+                    <a:blip r:embed="rId156">
                       <a:extLst>
                         <a:ext uri="{28A0092B-C50C-407E-A947-70E740481C1C}">
                           <a14:useLocalDpi xmlns:a14="http://schemas.microsoft.com/office/drawing/2010/main" val="0"/>
                         </a:ext>
                         <a:ext uri="{96DAC541-7B7A-43D3-8B79-37D633B846F1}">
-                          <asvg:svgBlip xmlns:asvg="http://schemas.microsoft.com/office/drawing/2016/SVG/main" r:embed="rId150"/>
+                          <asvg:svgBlip xmlns:asvg="http://schemas.microsoft.com/office/drawing/2016/SVG/main" r:embed="rId153"/>
                         </a:ext>
                       </a:extLst>
                     </a:blip>
@@ -25070,8 +25069,8 @@
         <w:t xml:space="preserve">members, and destructors clear them. In the demo run of chapter 4 this is the last line: every object freed by cascade.</w:t>
       </w:r>
     </w:p>
-    <w:bookmarkEnd w:id="154"/>
-    <w:bookmarkStart w:id="155" w:name="iterators-that-survive-modification"/>
+    <w:bookmarkEnd w:id="157"/>
+    <w:bookmarkStart w:id="158" w:name="iterators-that-survive-modification"/>
     <w:p>
       <w:pPr>
         <w:pStyle w:val="Heading2"/>
@@ -25335,8 +25334,8 @@
         <w:t xml:space="preserve">). Setters may trigger model-side reordering (e.g. in sorted tree relations); the captured pointer stays valid, the iterator re-anchors.</w:t>
       </w:r>
     </w:p>
-    <w:bookmarkEnd w:id="155"/>
-    <w:bookmarkStart w:id="156" w:name="single-static-multi"/>
+    <w:bookmarkEnd w:id="158"/>
+    <w:bookmarkStart w:id="159" w:name="single-static-multi"/>
     <w:p>
       <w:pPr>
         <w:pStyle w:val="Heading2"/>
@@ -25411,8 +25410,8 @@
         <w:t xml:space="preserve">instances of the from-class (class-level registry). Not available for template or serialize classes.</w:t>
       </w:r>
     </w:p>
-    <w:bookmarkEnd w:id="156"/>
-    <w:bookmarkStart w:id="157" w:name="tree-implementations-and-find-methods"/>
+    <w:bookmarkEnd w:id="159"/>
+    <w:bookmarkStart w:id="160" w:name="tree-implementations-and-find-methods"/>
     <w:p>
       <w:pPr>
         <w:pStyle w:val="Heading2"/>
@@ -26165,8 +26164,8 @@
         <w:t xml:space="preserve">— implemented as a loop on a list relation, or as the native tree search when the argument matches the tree key. Design workflow: start with lists; when profiling says a find is hot, flip the relation to a tree — the find method regenerates to the fast path, callers unchanged.</w:t>
       </w:r>
     </w:p>
-    <w:bookmarkEnd w:id="157"/>
-    <w:bookmarkStart w:id="158" w:name="critical-relations-threads"/>
+    <w:bookmarkEnd w:id="160"/>
+    <w:bookmarkStart w:id="161" w:name="critical-relations-threads"/>
     <w:p>
       <w:pPr>
         <w:pStyle w:val="Heading2"/>
@@ -26224,8 +26223,8 @@
         <w:t xml:space="preserve">only — your own data races remain your own; keep cross-thread mutation points few and explicit.</w:t>
       </w:r>
     </w:p>
-    <w:bookmarkEnd w:id="158"/>
-    <w:bookmarkStart w:id="159" w:name="writing-loops-the-generated-way"/>
+    <w:bookmarkEnd w:id="161"/>
+    <w:bookmarkStart w:id="162" w:name="writing-loops-the-generated-way"/>
     <w:p>
       <w:pPr>
         <w:pStyle w:val="Heading2"/>
@@ -26567,9 +26566,9 @@
         <w:t xml:space="preserve">before a loop that deletes — the list is live and your snapshot is not.</w:t>
       </w:r>
     </w:p>
-    <w:bookmarkEnd w:id="159"/>
-    <w:bookmarkEnd w:id="160"/>
-    <w:bookmarkStart w:id="167" w:name="serialization"/>
+    <w:bookmarkEnd w:id="162"/>
+    <w:bookmarkEnd w:id="163"/>
+    <w:bookmarkStart w:id="170" w:name="serialization"/>
     <w:p>
       <w:pPr>
         <w:pStyle w:val="Heading1"/>
@@ -26578,7 +26577,7 @@
         <w:t xml:space="preserve">Serialization</w:t>
       </w:r>
     </w:p>
-    <w:bookmarkStart w:id="161" w:name="what-you-get"/>
+    <w:bookmarkStart w:id="164" w:name="what-you-get"/>
     <w:p>
       <w:pPr>
         <w:pStyle w:val="Heading2"/>
@@ -26818,8 +26817,8 @@
         <w:t xml:space="preserve">registers the factory), then re-links all relations through a pointer table. Shared pointers, back-pointers, multi-ownership — the graph reloads exactly.</w:t>
       </w:r>
     </w:p>
-    <w:bookmarkEnd w:id="161"/>
-    <w:bookmarkStart w:id="162" w:name="cbarchive-and-the-wire-format"/>
+    <w:bookmarkEnd w:id="164"/>
+    <w:bookmarkStart w:id="165" w:name="cbarchive-and-the-wire-format"/>
     <w:p>
       <w:pPr>
         <w:pStyle w:val="Heading2"/>
@@ -26977,8 +26976,8 @@
         <w:t xml:space="preserve">rather than crashing.</w:t>
       </w:r>
     </w:p>
-    <w:bookmarkEnd w:id="162"/>
-    <w:bookmarkStart w:id="163" w:name="cbz-compression-on-the-fly"/>
+    <w:bookmarkEnd w:id="165"/>
+    <w:bookmarkStart w:id="166" w:name="cbz-compression-on-the-fly"/>
     <w:p>
       <w:pPr>
         <w:pStyle w:val="Heading2"/>
@@ -27328,8 +27327,8 @@
         <w:t xml:space="preserve">; the quick start’s whole matrix saved in 114 bytes. Your applications get the same for free — link zstd and use the two wrappers.</w:t>
       </w:r>
     </w:p>
-    <w:bookmarkEnd w:id="163"/>
-    <w:bookmarkStart w:id="164" w:name="Xbded68cf7b5dad621557026fdc0855cc4156113"/>
+    <w:bookmarkEnd w:id="166"/>
+    <w:bookmarkStart w:id="167" w:name="Xbded68cf7b5dad621557026fdc0855cc4156113"/>
     <w:p>
       <w:pPr>
         <w:pStyle w:val="Heading2"/>
@@ -27624,8 +27623,8 @@
         <w:t xml:space="preserve">button (Project Settings) renumbers a long version history down to the minimal equivalent scheme (max used + 1) — cosmetic, but keeps gates readable. Only compact when files older than the compacted scheme no longer need to load.</w:t>
       </w:r>
     </w:p>
-    <w:bookmarkEnd w:id="164"/>
-    <w:bookmarkStart w:id="165" w:name="rules-and-properties"/>
+    <w:bookmarkEnd w:id="167"/>
+    <w:bookmarkStart w:id="168" w:name="rules-and-properties"/>
     <w:p>
       <w:pPr>
         <w:pStyle w:val="Heading2"/>
@@ -27831,8 +27830,8 @@
         <w:t xml:space="preserve">for streaming (type dialog).</w:t>
       </w:r>
     </w:p>
-    <w:bookmarkEnd w:id="165"/>
-    <w:bookmarkStart w:id="166" w:name="Xe93cc69c5286d8ba9c1392594baf9a373c30c75"/>
+    <w:bookmarkEnd w:id="168"/>
+    <w:bookmarkStart w:id="169" w:name="Xe93cc69c5286d8ba9c1392594baf9a373c30c75"/>
     <w:p>
       <w:pPr>
         <w:pStyle w:val="Heading2"/>
@@ -28042,9 +28041,9 @@
         <w:t xml:space="preserve">Models that already build (like ClassBuilder’s own) are unaffected.</w:t>
       </w:r>
     </w:p>
-    <w:bookmarkEnd w:id="166"/>
-    <w:bookmarkEnd w:id="167"/>
-    <w:bookmarkStart w:id="171" w:name="the-generated-undoredo-framework"/>
+    <w:bookmarkEnd w:id="169"/>
+    <w:bookmarkEnd w:id="170"/>
+    <w:bookmarkStart w:id="174" w:name="the-generated-undoredo-framework"/>
     <w:p>
       <w:pPr>
         <w:pStyle w:val="Heading1"/>
@@ -28053,7 +28052,7 @@
         <w:t xml:space="preserve">The generated Undo/Redo framework</w:t>
       </w:r>
     </w:p>
-    <w:bookmarkStart w:id="168" w:name="what-it-is"/>
+    <w:bookmarkStart w:id="171" w:name="what-it-is"/>
     <w:p>
       <w:pPr>
         <w:pStyle w:val="Heading2"/>
@@ -28102,8 +28101,8 @@
         <w:t xml:space="preserve">generated model — the same machinery ClassBuilder itself uses for its own Edit ▸ Undo/Redo.</w:t>
       </w:r>
     </w:p>
-    <w:bookmarkEnd w:id="168"/>
-    <w:bookmarkStart w:id="169" w:name="how-it-works"/>
+    <w:bookmarkEnd w:id="171"/>
+    <w:bookmarkStart w:id="172" w:name="how-it-works"/>
     <w:p>
       <w:pPr>
         <w:pStyle w:val="Heading2"/>
@@ -28537,8 +28536,8 @@
         <w:t xml:space="preserve">deduplicates: an object already captured in the open step is not snapshotted again.</w:t>
       </w:r>
     </w:p>
-    <w:bookmarkEnd w:id="169"/>
-    <w:bookmarkStart w:id="170" w:name="the-undoreplace-entanglement"/>
+    <w:bookmarkEnd w:id="172"/>
+    <w:bookmarkStart w:id="173" w:name="the-undoreplace-entanglement"/>
     <w:p>
       <w:pPr>
         <w:pStyle w:val="Heading2"/>
@@ -28651,9 +28650,9 @@
         <w:t xml:space="preserve">undos.</w:t>
       </w:r>
     </w:p>
-    <w:bookmarkEnd w:id="170"/>
-    <w:bookmarkEnd w:id="171"/>
-    <w:bookmarkStart w:id="179" w:name="the-replace-constructor"/>
+    <w:bookmarkEnd w:id="173"/>
+    <w:bookmarkEnd w:id="174"/>
+    <w:bookmarkStart w:id="182" w:name="the-replace-constructor"/>
     <w:p>
       <w:pPr>
         <w:pStyle w:val="Heading1"/>
@@ -28662,7 +28661,7 @@
         <w:t xml:space="preserve">The replace constructor</w:t>
       </w:r>
     </w:p>
-    <w:bookmarkStart w:id="176" w:name="the-idea"/>
+    <w:bookmarkStart w:id="179" w:name="the-idea"/>
     <w:p>
       <w:pPr>
         <w:pStyle w:val="Heading2"/>
@@ -28680,24 +28679,24 @@
           <wp:inline>
             <wp:extent cx="5334000" cy="2782956"/>
             <wp:effectExtent b="0" l="0" r="0" t="0"/>
-            <wp:docPr descr="Replace: the new object takes over every relation slot of the old one." title="" id="173" name="Picture"/>
+            <wp:docPr descr="Replace: the new object takes over every relation slot of the old one." title="" id="176" name="Picture"/>
             <a:graphic>
               <a:graphicData uri="http://schemas.openxmlformats.org/drawingml/2006/picture">
                 <pic:pic>
                   <pic:nvPicPr>
-                    <pic:cNvPr descr="images/fig-replace-constructor.svg" id="174" name="Picture"/>
+                    <pic:cNvPr descr="images/fig-replace-constructor.svg" id="177" name="Picture"/>
                     <pic:cNvPicPr>
                       <a:picLocks noChangeArrowheads="1" noChangeAspect="1"/>
                     </pic:cNvPicPr>
                   </pic:nvPicPr>
                   <pic:blipFill>
-                    <a:blip r:embed="rId175">
+                    <a:blip r:embed="rId178">
                       <a:extLst>
                         <a:ext uri="{28A0092B-C50C-407E-A947-70E740481C1C}">
                           <a14:useLocalDpi xmlns:a14="http://schemas.microsoft.com/office/drawing/2010/main" val="0"/>
                         </a:ext>
                         <a:ext uri="{96DAC541-7B7A-43D3-8B79-37D633B846F1}">
-                          <asvg:svgBlip xmlns:asvg="http://schemas.microsoft.com/office/drawing/2016/SVG/main" r:embed="rId172"/>
+                          <asvg:svgBlip xmlns:asvg="http://schemas.microsoft.com/office/drawing/2016/SVG/main" r:embed="rId175"/>
                         </a:ext>
                       </a:extLst>
                     </a:blip>
@@ -28876,8 +28875,8 @@
         <w:t xml:space="preserve">a different class.</w:t>
       </w:r>
     </w:p>
-    <w:bookmarkEnd w:id="176"/>
-    <w:bookmarkStart w:id="177" w:name="why-it-is-more-powerful-than-a-factory"/>
+    <w:bookmarkEnd w:id="179"/>
+    <w:bookmarkStart w:id="180" w:name="why-it-is-more-powerful-than-a-factory"/>
     <w:p>
       <w:pPr>
         <w:pStyle w:val="Heading2"/>
@@ -29541,8 +29540,8 @@
         <w:t xml:space="preserve">is the state — the type system enforces the state chart.</w:t>
       </w:r>
     </w:p>
-    <w:bookmarkEnd w:id="177"/>
-    <w:bookmarkStart w:id="178" w:name="mechanics-and-constraints"/>
+    <w:bookmarkEnd w:id="180"/>
+    <w:bookmarkStart w:id="181" w:name="mechanics-and-constraints"/>
     <w:p>
       <w:pPr>
         <w:pStyle w:val="Heading2"/>
@@ -29645,9 +29644,9 @@
         <w:t xml:space="preserve">: see chapter 14.3 — the undo framework itself replaces objects on restore; mixing both requires redirecting parked undo entries, as ClassBuilder’s own model does.</w:t>
       </w:r>
     </w:p>
-    <w:bookmarkEnd w:id="178"/>
-    <w:bookmarkEnd w:id="179"/>
-    <w:bookmarkStart w:id="185" w:name="the-command-interface"/>
+    <w:bookmarkEnd w:id="181"/>
+    <w:bookmarkEnd w:id="182"/>
+    <w:bookmarkStart w:id="188" w:name="the-command-interface"/>
     <w:p>
       <w:pPr>
         <w:pStyle w:val="Heading1"/>
@@ -29656,7 +29655,7 @@
         <w:t xml:space="preserve">The command interface</w:t>
       </w:r>
     </w:p>
-    <w:bookmarkStart w:id="180" w:name="what-it-is-1"/>
+    <w:bookmarkStart w:id="183" w:name="what-it-is-1"/>
     <w:p>
       <w:pPr>
         <w:pStyle w:val="Heading2"/>
@@ -29859,8 +29858,8 @@
         <w:t xml:space="preserve">; below is the map plus worked examples.</w:t>
       </w:r>
     </w:p>
-    <w:bookmarkEnd w:id="180"/>
-    <w:bookmarkStart w:id="181" w:name="connecting"/>
+    <w:bookmarkEnd w:id="183"/>
+    <w:bookmarkStart w:id="184" w:name="connecting"/>
     <w:p>
       <w:pPr>
         <w:pStyle w:val="Heading2"/>
@@ -30324,8 +30323,8 @@
         <w:t xml:space="preserve">))</w:t>
       </w:r>
     </w:p>
-    <w:bookmarkEnd w:id="181"/>
-    <w:bookmarkStart w:id="182" w:name="the-command-families"/>
+    <w:bookmarkEnd w:id="184"/>
+    <w:bookmarkStart w:id="185" w:name="the-command-families"/>
     <w:p>
       <w:pPr>
         <w:pStyle w:val="Heading2"/>
@@ -31394,8 +31393,8 @@
         </w:tc>
       </w:tr>
     </w:tbl>
-    <w:bookmarkEnd w:id="182"/>
-    <w:bookmarkStart w:id="183" w:name="worked-examples-real-requests"/>
+    <w:bookmarkEnd w:id="185"/>
+    <w:bookmarkStart w:id="186" w:name="worked-examples-real-requests"/>
     <w:p>
       <w:pPr>
         <w:pStyle w:val="Heading2"/>
@@ -31537,7 +31536,7 @@
         <w:rPr>
           <w:rStyle w:val="StringTok"/>
         </w:rPr>
-        <w:t xml:space="preserve">"Matrix.h"</w:t>
+        <w:t xml:space="preserve">"MatrixInclude.h"</w:t>
       </w:r>
       <w:r>
         <w:rPr>
@@ -33294,8 +33293,8 @@
         <w:t xml:space="preserve">}}</w:t>
       </w:r>
     </w:p>
-    <w:bookmarkEnd w:id="183"/>
-    <w:bookmarkStart w:id="184" w:name="conventions-and-gotchas"/>
+    <w:bookmarkEnd w:id="186"/>
+    <w:bookmarkStart w:id="187" w:name="conventions-and-gotchas"/>
     <w:p>
       <w:pPr>
         <w:pStyle w:val="Heading2"/>
@@ -33627,9 +33626,9 @@
         <w:t xml:space="preserve">stamp tells you.</w:t>
       </w:r>
     </w:p>
-    <w:bookmarkEnd w:id="184"/>
-    <w:bookmarkEnd w:id="185"/>
-    <w:bookmarkStart w:id="186" w:name="tips-pitfalls-and-best-practices"/>
+    <w:bookmarkEnd w:id="187"/>
+    <w:bookmarkEnd w:id="188"/>
+    <w:bookmarkStart w:id="189" w:name="tips-pitfalls-and-best-practices"/>
     <w:p>
       <w:pPr>
         <w:pStyle w:val="Heading1"/>
@@ -34176,8 +34175,8 @@
         <w:t xml:space="preserve">) for documentation — it is the same renderer as the screen, vector-clean at any size.</w:t>
       </w:r>
     </w:p>
-    <w:bookmarkEnd w:id="186"/>
-    <w:bookmarkStart w:id="190" w:name="appendix"/>
+    <w:bookmarkEnd w:id="189"/>
+    <w:bookmarkStart w:id="193" w:name="appendix"/>
     <w:p>
       <w:pPr>
         <w:pStyle w:val="Heading1"/>
@@ -34186,7 +34185,7 @@
         <w:t xml:space="preserve">Appendix</w:t>
       </w:r>
     </w:p>
-    <w:bookmarkStart w:id="187" w:name="a.-runtime-header-inventory"/>
+    <w:bookmarkStart w:id="190" w:name="a.-runtime-header-inventory"/>
     <w:p>
       <w:pPr>
         <w:pStyle w:val="Heading2"/>
@@ -34737,8 +34736,8 @@
         </w:tc>
       </w:tr>
     </w:tbl>
-    <w:bookmarkEnd w:id="187"/>
-    <w:bookmarkStart w:id="188" w:name="b.-marker-quick-reference"/>
+    <w:bookmarkEnd w:id="190"/>
+    <w:bookmarkStart w:id="191" w:name="b.-marker-quick-reference"/>
     <w:p>
       <w:pPr>
         <w:pStyle w:val="Heading2"/>
@@ -34812,8 +34811,8 @@
         <w:t xml:space="preserve">@INSERT_MODIFICATIONS(* )             per-file change log insertion point</w:t>
       </w:r>
     </w:p>
-    <w:bookmarkEnd w:id="188"/>
-    <w:bookmarkStart w:id="189" w:name="c.-glossary"/>
+    <w:bookmarkEnd w:id="191"/>
+    <w:bookmarkStart w:id="192" w:name="c.-glossary"/>
     <w:p>
       <w:pPr>
         <w:pStyle w:val="Heading2"/>
@@ -35149,8 +35148,8 @@
         </w:tc>
       </w:tr>
     </w:tbl>
-    <w:bookmarkEnd w:id="189"/>
-    <w:bookmarkEnd w:id="190"/>
+    <w:bookmarkEnd w:id="192"/>
+    <w:bookmarkEnd w:id="193"/>
     <w:sectPr/>
   </w:body>
 </w:document>

</xml_diff>

<commit_message>
docs(manual): regenerate docx (Row Class-dialog figure included)
Co-Authored-By: Claude Fable 5 <noreply@anthropic.com>
</commit_message>
<xml_diff>
--- a/docs/manual/ClassBuilder_Manual.docx
+++ b/docs/manual/ClassBuilder_Manual.docx
@@ -3046,7 +3046,7 @@
     </w:p>
     <w:bookmarkEnd w:id="33"/>
     <w:bookmarkEnd w:id="34"/>
-    <w:bookmarkStart w:id="58" w:name="quick-start-the-matrix-model"/>
+    <w:bookmarkStart w:id="61" w:name="quick-start-the-matrix-model"/>
     <w:p>
       <w:pPr>
         <w:pStyle w:val="Heading1"/>
@@ -3510,7 +3510,7 @@
       </w:r>
     </w:p>
     <w:bookmarkEnd w:id="41"/>
-    <w:bookmarkStart w:id="42" w:name="step-2-add-the-classes"/>
+    <w:bookmarkStart w:id="45" w:name="step-2-add-the-classes"/>
     <w:p>
       <w:pPr>
         <w:pStyle w:val="Heading2"/>
@@ -3607,14 +3607,178 @@
     </w:p>
     <w:p>
       <w:pPr>
-        <w:pStyle w:val="BlockText"/>
-      </w:pPr>
-      <w:r>
-        <w:rPr>
-          <w:bCs/>
-          <w:b/>
-        </w:rPr>
-        <w:t xml:space="preserve">[FIGURE]</w:t>
+        <w:pStyle w:val="CaptionedFigure"/>
+      </w:pPr>
+      <w:r>
+        <w:drawing>
+          <wp:inline>
+            <wp:extent cx="4993049" cy="4495445"/>
+            <wp:effectExtent b="0" l="0" r="0" t="0"/>
+            <wp:docPr descr="The Class dialog. With Serialize ticked, the class inherits the model’s document-object root automatically." title="" id="43" name="Picture"/>
+            <a:graphic>
+              <a:graphicData uri="http://schemas.openxmlformats.org/drawingml/2006/picture">
+                <pic:pic>
+                  <pic:nvPicPr>
+                    <pic:cNvPr descr="images/Row_class.png" id="44" name="Picture"/>
+                    <pic:cNvPicPr>
+                      <a:picLocks noChangeArrowheads="1" noChangeAspect="1"/>
+                    </pic:cNvPicPr>
+                  </pic:nvPicPr>
+                  <pic:blipFill>
+                    <a:blip r:embed="rId42"/>
+                    <a:stretch>
+                      <a:fillRect/>
+                    </a:stretch>
+                  </pic:blipFill>
+                  <pic:spPr bwMode="auto">
+                    <a:xfrm>
+                      <a:off x="0" y="0"/>
+                      <a:ext cx="4993049" cy="4495445"/>
+                    </a:xfrm>
+                    <a:prstGeom prst="rect">
+                      <a:avLst/>
+                    </a:prstGeom>
+                    <a:noFill/>
+                    <a:ln w="9525">
+                      <a:noFill/>
+                      <a:headEnd/>
+                      <a:tailEnd/>
+                    </a:ln>
+                  </pic:spPr>
+                </pic:pic>
+              </a:graphicData>
+            </a:graphic>
+          </wp:inline>
+        </w:drawing>
+      </w:r>
+    </w:p>
+    <w:p>
+      <w:pPr>
+        <w:pStyle w:val="ImageCaption"/>
+      </w:pPr>
+      <w:r>
+        <w:t xml:space="preserve">The Class dialog. With Serialize ticked, the class inherits the model’s document-object root automatically.</w:t>
+      </w:r>
+    </w:p>
+    <w:bookmarkEnd w:id="45"/>
+    <w:bookmarkStart w:id="46" w:name="step-3-add-members"/>
+    <w:p>
+      <w:pPr>
+        <w:pStyle w:val="Heading2"/>
+      </w:pPr>
+      <w:r>
+        <w:t xml:space="preserve">Step 3 — add members</w:t>
+      </w:r>
+    </w:p>
+    <w:p>
+      <w:pPr>
+        <w:pStyle w:val="FirstParagraph"/>
+      </w:pPr>
+      <w:r>
+        <w:t xml:space="preserve">Right-click</w:t>
+      </w:r>
+      <w:r>
+        <w:t xml:space="preserve"> </w:t>
+      </w:r>
+      <w:r>
+        <w:rPr>
+          <w:rStyle w:val="VerbatimChar"/>
+        </w:rPr>
+        <w:t xml:space="preserve">Row</w:t>
+      </w:r>
+      <w:r>
+        <w:t xml:space="preserve"> </w:t>
+      </w:r>
+      <w:r>
+        <w:t xml:space="preserve">▸</w:t>
+      </w:r>
+      <w:r>
+        <w:t xml:space="preserve"> </w:t>
+      </w:r>
+      <w:r>
+        <w:rPr>
+          <w:rStyle w:val="VerbatimChar"/>
+        </w:rPr>
+        <w:t xml:space="preserve">Add ▸ Member</w:t>
+      </w:r>
+      <w:r>
+        <w:t xml:space="preserve"> </w:t>
+      </w:r>
+      <w:r>
+        <w:t xml:space="preserve">(</w:t>
+      </w:r>
+      <w:r>
+        <w:rPr>
+          <w:rStyle w:val="VerbatimChar"/>
+        </w:rPr>
+        <w:t xml:space="preserve">Ctrl+Shift+B</w:t>
+      </w:r>
+      <w:r>
+        <w:t xml:space="preserve">): type</w:t>
+      </w:r>
+      <w:r>
+        <w:t xml:space="preserve"> </w:t>
+      </w:r>
+      <w:r>
+        <w:rPr>
+          <w:rStyle w:val="VerbatimChar"/>
+        </w:rPr>
+        <w:t xml:space="preserve">int</w:t>
+      </w:r>
+      <w:r>
+        <w:t xml:space="preserve">, name</w:t>
+      </w:r>
+      <w:r>
+        <w:t xml:space="preserve"> </w:t>
+      </w:r>
+      <w:r>
+        <w:rPr>
+          <w:rStyle w:val="VerbatimChar"/>
+        </w:rPr>
+        <w:t xml:space="preserve">id</w:t>
+      </w:r>
+      <w:r>
+        <w:t xml:space="preserve"> </w:t>
+      </w:r>
+      <w:r>
+        <w:t xml:space="preserve">—</w:t>
+      </w:r>
+      <w:r>
+        <w:t xml:space="preserve"> </w:t>
+      </w:r>
+      <w:r>
+        <w:rPr>
+          <w:bCs/>
+          <w:b/>
+        </w:rPr>
+        <w:t xml:space="preserve">bare name, no underscore</w:t>
+      </w:r>
+      <w:r>
+        <w:t xml:space="preserve">: the class’s member prefix (default</w:t>
+      </w:r>
+      <w:r>
+        <w:t xml:space="preserve"> </w:t>
+      </w:r>
+      <w:r>
+        <w:rPr>
+          <w:rStyle w:val="VerbatimChar"/>
+        </w:rPr>
+        <w:t xml:space="preserve">_</w:t>
+      </w:r>
+      <w:r>
+        <w:t xml:space="preserve">) is added at generation time, so the emitted member is</w:t>
+      </w:r>
+      <w:r>
+        <w:t xml:space="preserve"> </w:t>
+      </w:r>
+      <w:r>
+        <w:rPr>
+          <w:rStyle w:val="VerbatimChar"/>
+        </w:rPr>
+        <w:t xml:space="preserve">_id</w:t>
+      </w:r>
+      <w:r>
+        <w:t xml:space="preserve">. Set access</w:t>
       </w:r>
       <w:r>
         <w:t xml:space="preserve"> </w:t>
@@ -3624,13 +3788,118 @@
           <w:iCs/>
           <w:i/>
         </w:rPr>
-        <w:t xml:space="preserve">The Class dialog for</w:t>
+        <w:t xml:space="preserve">private</w:t>
+      </w:r>
+      <w:r>
+        <w:t xml:space="preserve"> </w:t>
+      </w:r>
+      <w:r>
+        <w:t xml:space="preserve">and Get method</w:t>
+      </w:r>
+      <w:r>
+        <w:t xml:space="preserve"> </w:t>
       </w:r>
       <w:r>
         <w:rPr>
           <w:iCs/>
           <w:i/>
         </w:rPr>
+        <w:t xml:space="preserve">Public</w:t>
+      </w:r>
+      <w:r>
+        <w:t xml:space="preserve">: a</w:t>
+      </w:r>
+      <w:r>
+        <w:t xml:space="preserve"> </w:t>
+      </w:r>
+      <w:r>
+        <w:rPr>
+          <w:rStyle w:val="VerbatimChar"/>
+        </w:rPr>
+        <w:t xml:space="preserve">GetId()</w:t>
+      </w:r>
+      <w:r>
+        <w:t xml:space="preserve"> </w:t>
+      </w:r>
+      <w:r>
+        <w:t xml:space="preserve">getter is generated (and stays in sync if you retype the member). Repeat for</w:t>
+      </w:r>
+      <w:r>
+        <w:t xml:space="preserve"> </w:t>
+      </w:r>
+      <w:r>
+        <w:rPr>
+          <w:rStyle w:val="VerbatimChar"/>
+        </w:rPr>
+        <w:t xml:space="preserve">Column</w:t>
+      </w:r>
+      <w:r>
+        <w:t xml:space="preserve"> </w:t>
+      </w:r>
+      <w:r>
+        <w:t xml:space="preserve">(</w:t>
+      </w:r>
+      <w:r>
+        <w:rPr>
+          <w:rStyle w:val="VerbatimChar"/>
+        </w:rPr>
+        <w:t xml:space="preserve">id</w:t>
+      </w:r>
+      <w:r>
+        <w:t xml:space="preserve">, same settings) and</w:t>
+      </w:r>
+      <w:r>
+        <w:t xml:space="preserve"> </w:t>
+      </w:r>
+      <w:r>
+        <w:rPr>
+          <w:rStyle w:val="VerbatimChar"/>
+        </w:rPr>
+        <w:t xml:space="preserve">Cell</w:t>
+      </w:r>
+      <w:r>
+        <w:t xml:space="preserve"> </w:t>
+      </w:r>
+      <w:r>
+        <w:t xml:space="preserve">(</w:t>
+      </w:r>
+      <w:r>
+        <w:rPr>
+          <w:rStyle w:val="VerbatimChar"/>
+        </w:rPr>
+        <w:t xml:space="preserve">value</w:t>
+      </w:r>
+      <w:r>
+        <w:t xml:space="preserve"> </w:t>
+      </w:r>
+      <w:r>
+        <w:t xml:space="preserve">of type</w:t>
+      </w:r>
+      <w:r>
+        <w:t xml:space="preserve"> </w:t>
+      </w:r>
+      <w:r>
+        <w:rPr>
+          <w:rStyle w:val="VerbatimChar"/>
+        </w:rPr>
+        <w:t xml:space="preserve">CString</w:t>
+      </w:r>
+      <w:r>
+        <w:t xml:space="preserve">, public, no getter).</w:t>
+      </w:r>
+    </w:p>
+    <w:p>
+      <w:pPr>
+        <w:pStyle w:val="BlockText"/>
+      </w:pPr>
+      <w:r>
+        <w:rPr>
+          <w:bCs/>
+          <w:b/>
+        </w:rPr>
+        <w:t xml:space="preserve">[FIGURE]</w:t>
+      </w:r>
+      <w:r>
         <w:t xml:space="preserve"> </w:t>
       </w:r>
       <w:r>
@@ -3638,338 +3907,39 @@
           <w:iCs/>
           <w:i/>
         </w:rPr>
-        <w:t xml:space="preserve">“</w:t>
+        <w:t xml:space="preserve">The Member dialog for Row.id: Type combo, Name, the type-property checkboxes (Const/Reference/Pointer/Array/Bit Field…), Access radio group, Get/Set method groups, Initial Value, Serialize checkbox, Note. Caption:</w:t>
       </w:r>
       <w:r>
         <w:rPr>
           <w:iCs/>
           <w:i/>
         </w:rPr>
-        <w:t xml:space="preserve">Row</w:t>
+        <w:t xml:space="preserve"> </w:t>
       </w:r>
       <w:r>
         <w:rPr>
           <w:iCs/>
           <w:i/>
         </w:rPr>
-        <w:t xml:space="preserve">”</w:t>
+        <w:t xml:space="preserve">“</w:t>
       </w:r>
       <w:r>
         <w:rPr>
           <w:iCs/>
           <w:i/>
         </w:rPr>
-        <w:t xml:space="preserve">: Class Name, Source/Include File fields, the Properties group (Replace / Dll Export / Serialize / Struct / Relation Macros Last), Member Prefix, Note. Caption:</w:t>
+        <w:t xml:space="preserve">The Member dialog. Getter/setter generation and the serialize flag are per-member choices.</w:t>
       </w:r>
       <w:r>
         <w:rPr>
           <w:iCs/>
           <w:i/>
         </w:rPr>
-        <w:t xml:space="preserve"> </w:t>
-      </w:r>
-      <w:r>
-        <w:rPr>
-          <w:iCs/>
-          <w:i/>
-        </w:rPr>
-        <w:t xml:space="preserve">“</w:t>
-      </w:r>
-      <w:r>
-        <w:rPr>
-          <w:iCs/>
-          <w:i/>
-        </w:rPr>
-        <w:t xml:space="preserve">The Class dialog. With Serialize ticked, the class inherits the model’s document-object root automatically.</w:t>
-      </w:r>
-      <w:r>
-        <w:rPr>
-          <w:iCs/>
-          <w:i/>
-        </w:rPr>
         <w:t xml:space="preserve">”</w:t>
       </w:r>
     </w:p>
-    <w:bookmarkEnd w:id="42"/>
-    <w:bookmarkStart w:id="43" w:name="step-3-add-members"/>
-    <w:p>
-      <w:pPr>
-        <w:pStyle w:val="Heading2"/>
-      </w:pPr>
-      <w:r>
-        <w:t xml:space="preserve">Step 3 — add members</w:t>
-      </w:r>
-    </w:p>
-    <w:p>
-      <w:pPr>
-        <w:pStyle w:val="FirstParagraph"/>
-      </w:pPr>
-      <w:r>
-        <w:t xml:space="preserve">Right-click</w:t>
-      </w:r>
-      <w:r>
-        <w:t xml:space="preserve"> </w:t>
-      </w:r>
-      <w:r>
-        <w:rPr>
-          <w:rStyle w:val="VerbatimChar"/>
-        </w:rPr>
-        <w:t xml:space="preserve">Row</w:t>
-      </w:r>
-      <w:r>
-        <w:t xml:space="preserve"> </w:t>
-      </w:r>
-      <w:r>
-        <w:t xml:space="preserve">▸</w:t>
-      </w:r>
-      <w:r>
-        <w:t xml:space="preserve"> </w:t>
-      </w:r>
-      <w:r>
-        <w:rPr>
-          <w:rStyle w:val="VerbatimChar"/>
-        </w:rPr>
-        <w:t xml:space="preserve">Add ▸ Member</w:t>
-      </w:r>
-      <w:r>
-        <w:t xml:space="preserve"> </w:t>
-      </w:r>
-      <w:r>
-        <w:t xml:space="preserve">(</w:t>
-      </w:r>
-      <w:r>
-        <w:rPr>
-          <w:rStyle w:val="VerbatimChar"/>
-        </w:rPr>
-        <w:t xml:space="preserve">Ctrl+Shift+B</w:t>
-      </w:r>
-      <w:r>
-        <w:t xml:space="preserve">): type</w:t>
-      </w:r>
-      <w:r>
-        <w:t xml:space="preserve"> </w:t>
-      </w:r>
-      <w:r>
-        <w:rPr>
-          <w:rStyle w:val="VerbatimChar"/>
-        </w:rPr>
-        <w:t xml:space="preserve">int</w:t>
-      </w:r>
-      <w:r>
-        <w:t xml:space="preserve">, name</w:t>
-      </w:r>
-      <w:r>
-        <w:t xml:space="preserve"> </w:t>
-      </w:r>
-      <w:r>
-        <w:rPr>
-          <w:rStyle w:val="VerbatimChar"/>
-        </w:rPr>
-        <w:t xml:space="preserve">id</w:t>
-      </w:r>
-      <w:r>
-        <w:t xml:space="preserve"> </w:t>
-      </w:r>
-      <w:r>
-        <w:t xml:space="preserve">—</w:t>
-      </w:r>
-      <w:r>
-        <w:t xml:space="preserve"> </w:t>
-      </w:r>
-      <w:r>
-        <w:rPr>
-          <w:bCs/>
-          <w:b/>
-        </w:rPr>
-        <w:t xml:space="preserve">bare name, no underscore</w:t>
-      </w:r>
-      <w:r>
-        <w:t xml:space="preserve">: the class’s member prefix (default</w:t>
-      </w:r>
-      <w:r>
-        <w:t xml:space="preserve"> </w:t>
-      </w:r>
-      <w:r>
-        <w:rPr>
-          <w:rStyle w:val="VerbatimChar"/>
-        </w:rPr>
-        <w:t xml:space="preserve">_</w:t>
-      </w:r>
-      <w:r>
-        <w:t xml:space="preserve">) is added at generation time, so the emitted member is</w:t>
-      </w:r>
-      <w:r>
-        <w:t xml:space="preserve"> </w:t>
-      </w:r>
-      <w:r>
-        <w:rPr>
-          <w:rStyle w:val="VerbatimChar"/>
-        </w:rPr>
-        <w:t xml:space="preserve">_id</w:t>
-      </w:r>
-      <w:r>
-        <w:t xml:space="preserve">. Set access</w:t>
-      </w:r>
-      <w:r>
-        <w:t xml:space="preserve"> </w:t>
-      </w:r>
-      <w:r>
-        <w:rPr>
-          <w:iCs/>
-          <w:i/>
-        </w:rPr>
-        <w:t xml:space="preserve">private</w:t>
-      </w:r>
-      <w:r>
-        <w:t xml:space="preserve"> </w:t>
-      </w:r>
-      <w:r>
-        <w:t xml:space="preserve">and Get method</w:t>
-      </w:r>
-      <w:r>
-        <w:t xml:space="preserve"> </w:t>
-      </w:r>
-      <w:r>
-        <w:rPr>
-          <w:iCs/>
-          <w:i/>
-        </w:rPr>
-        <w:t xml:space="preserve">Public</w:t>
-      </w:r>
-      <w:r>
-        <w:t xml:space="preserve">: a</w:t>
-      </w:r>
-      <w:r>
-        <w:t xml:space="preserve"> </w:t>
-      </w:r>
-      <w:r>
-        <w:rPr>
-          <w:rStyle w:val="VerbatimChar"/>
-        </w:rPr>
-        <w:t xml:space="preserve">GetId()</w:t>
-      </w:r>
-      <w:r>
-        <w:t xml:space="preserve"> </w:t>
-      </w:r>
-      <w:r>
-        <w:t xml:space="preserve">getter is generated (and stays in sync if you retype the member). Repeat for</w:t>
-      </w:r>
-      <w:r>
-        <w:t xml:space="preserve"> </w:t>
-      </w:r>
-      <w:r>
-        <w:rPr>
-          <w:rStyle w:val="VerbatimChar"/>
-        </w:rPr>
-        <w:t xml:space="preserve">Column</w:t>
-      </w:r>
-      <w:r>
-        <w:t xml:space="preserve"> </w:t>
-      </w:r>
-      <w:r>
-        <w:t xml:space="preserve">(</w:t>
-      </w:r>
-      <w:r>
-        <w:rPr>
-          <w:rStyle w:val="VerbatimChar"/>
-        </w:rPr>
-        <w:t xml:space="preserve">id</w:t>
-      </w:r>
-      <w:r>
-        <w:t xml:space="preserve">, same settings) and</w:t>
-      </w:r>
-      <w:r>
-        <w:t xml:space="preserve"> </w:t>
-      </w:r>
-      <w:r>
-        <w:rPr>
-          <w:rStyle w:val="VerbatimChar"/>
-        </w:rPr>
-        <w:t xml:space="preserve">Cell</w:t>
-      </w:r>
-      <w:r>
-        <w:t xml:space="preserve"> </w:t>
-      </w:r>
-      <w:r>
-        <w:t xml:space="preserve">(</w:t>
-      </w:r>
-      <w:r>
-        <w:rPr>
-          <w:rStyle w:val="VerbatimChar"/>
-        </w:rPr>
-        <w:t xml:space="preserve">value</w:t>
-      </w:r>
-      <w:r>
-        <w:t xml:space="preserve"> </w:t>
-      </w:r>
-      <w:r>
-        <w:t xml:space="preserve">of type</w:t>
-      </w:r>
-      <w:r>
-        <w:t xml:space="preserve"> </w:t>
-      </w:r>
-      <w:r>
-        <w:rPr>
-          <w:rStyle w:val="VerbatimChar"/>
-        </w:rPr>
-        <w:t xml:space="preserve">CString</w:t>
-      </w:r>
-      <w:r>
-        <w:t xml:space="preserve">, public, no getter).</w:t>
-      </w:r>
-    </w:p>
-    <w:p>
-      <w:pPr>
-        <w:pStyle w:val="BlockText"/>
-      </w:pPr>
-      <w:r>
-        <w:rPr>
-          <w:bCs/>
-          <w:b/>
-        </w:rPr>
-        <w:t xml:space="preserve">[FIGURE]</w:t>
-      </w:r>
-      <w:r>
-        <w:t xml:space="preserve"> </w:t>
-      </w:r>
-      <w:r>
-        <w:rPr>
-          <w:iCs/>
-          <w:i/>
-        </w:rPr>
-        <w:t xml:space="preserve">The Member dialog for Row.id: Type combo, Name, the type-property checkboxes (Const/Reference/Pointer/Array/Bit Field…), Access radio group, Get/Set method groups, Initial Value, Serialize checkbox, Note. Caption:</w:t>
-      </w:r>
-      <w:r>
-        <w:rPr>
-          <w:iCs/>
-          <w:i/>
-        </w:rPr>
-        <w:t xml:space="preserve"> </w:t>
-      </w:r>
-      <w:r>
-        <w:rPr>
-          <w:iCs/>
-          <w:i/>
-        </w:rPr>
-        <w:t xml:space="preserve">“</w:t>
-      </w:r>
-      <w:r>
-        <w:rPr>
-          <w:iCs/>
-          <w:i/>
-        </w:rPr>
-        <w:t xml:space="preserve">The Member dialog. Getter/setter generation and the serialize flag are per-member choices.</w:t>
-      </w:r>
-      <w:r>
-        <w:rPr>
-          <w:iCs/>
-          <w:i/>
-        </w:rPr>
-        <w:t xml:space="preserve">”</w:t>
-      </w:r>
-    </w:p>
-    <w:bookmarkEnd w:id="43"/>
-    <w:bookmarkStart w:id="44" w:name="step-4-add-the-relations"/>
+    <w:bookmarkEnd w:id="46"/>
+    <w:bookmarkStart w:id="47" w:name="step-4-add-the-relations"/>
     <w:p>
       <w:pPr>
         <w:pStyle w:val="Heading2"/>
@@ -4376,8 +4346,8 @@
         <w:t xml:space="preserve">”</w:t>
       </w:r>
     </w:p>
-    <w:bookmarkEnd w:id="44"/>
-    <w:bookmarkStart w:id="45" w:name="X267736c760e32dc6d865ac46fc2c6b29b8f25a5"/>
+    <w:bookmarkEnd w:id="47"/>
+    <w:bookmarkStart w:id="48" w:name="X267736c760e32dc6d865ac46fc2c6b29b8f25a5"/>
     <w:p>
       <w:pPr>
         <w:pStyle w:val="Heading2"/>
@@ -5234,8 +5204,8 @@
         <w:t xml:space="preserve">the insertion.</w:t>
       </w:r>
     </w:p>
-    <w:bookmarkEnd w:id="45"/>
-    <w:bookmarkStart w:id="46" w:name="step-6-a-find-method"/>
+    <w:bookmarkEnd w:id="48"/>
+    <w:bookmarkStart w:id="49" w:name="step-6-a-find-method"/>
     <w:p>
       <w:pPr>
         <w:pStyle w:val="Heading2"/>
@@ -5651,8 +5621,8 @@
         <w:t xml:space="preserve">//@CODE_3308</w:t>
       </w:r>
     </w:p>
-    <w:bookmarkEnd w:id="46"/>
-    <w:bookmarkStart w:id="54" w:name="step-7-a-class-diagram"/>
+    <w:bookmarkEnd w:id="49"/>
+    <w:bookmarkStart w:id="57" w:name="step-7-a-class-diagram"/>
     <w:p>
       <w:pPr>
         <w:pStyle w:val="Heading2"/>
@@ -5730,24 +5700,24 @@
           <wp:inline>
             <wp:extent cx="5334000" cy="3212933"/>
             <wp:effectExtent b="0" l="0" r="0" t="0"/>
-            <wp:docPr descr="The Matrix Overview class diagram as exported by ClassBuilder (Export SVG). Diamonds mark owned (aggregation) relations; 1/* are the multiplicities." title="" id="48" name="Picture"/>
+            <wp:docPr descr="The Matrix Overview class diagram as exported by ClassBuilder (Export SVG). Diamonds mark owned (aggregation) relations; 1/* are the multiplicities." title="" id="51" name="Picture"/>
             <a:graphic>
               <a:graphicData uri="http://schemas.openxmlformats.org/drawingml/2006/picture">
                 <pic:pic>
                   <pic:nvPicPr>
-                    <pic:cNvPr descr="images/cd-matrix-overview.svg" id="49" name="Picture"/>
+                    <pic:cNvPr descr="images/cd-matrix-overview.svg" id="52" name="Picture"/>
                     <pic:cNvPicPr>
                       <a:picLocks noChangeArrowheads="1" noChangeAspect="1"/>
                     </pic:cNvPicPr>
                   </pic:nvPicPr>
                   <pic:blipFill>
-                    <a:blip r:embed="rId50">
+                    <a:blip r:embed="rId53">
                       <a:extLst>
                         <a:ext uri="{28A0092B-C50C-407E-A947-70E740481C1C}">
                           <a14:useLocalDpi xmlns:a14="http://schemas.microsoft.com/office/drawing/2010/main" val="0"/>
                         </a:ext>
                         <a:ext uri="{96DAC541-7B7A-43D3-8B79-37D633B846F1}">
-                          <asvg:svgBlip xmlns:asvg="http://schemas.microsoft.com/office/drawing/2016/SVG/main" r:embed="rId47"/>
+                          <asvg:svgBlip xmlns:asvg="http://schemas.microsoft.com/office/drawing/2016/SVG/main" r:embed="rId50"/>
                         </a:ext>
                       </a:extLst>
                     </a:blip>
@@ -5794,18 +5764,18 @@
           <wp:inline>
             <wp:extent cx="5334000" cy="3757996"/>
             <wp:effectExtent b="0" l="0" r="0" t="0"/>
-            <wp:docPr descr="A class-diagram view opens as a dockable window over the shell — dock it, tab it, or float it." title="" id="52" name="Picture"/>
+            <wp:docPr descr="A class-diagram view opens as a dockable window over the shell — dock it, tab it, or float it." title="" id="55" name="Picture"/>
             <a:graphic>
               <a:graphicData uri="http://schemas.openxmlformats.org/drawingml/2006/picture">
                 <pic:pic>
                   <pic:nvPicPr>
-                    <pic:cNvPr descr="images/cd-view.png" id="53" name="Picture"/>
+                    <pic:cNvPr descr="images/cd-view.png" id="56" name="Picture"/>
                     <pic:cNvPicPr>
                       <a:picLocks noChangeArrowheads="1" noChangeAspect="1"/>
                     </pic:cNvPicPr>
                   </pic:nvPicPr>
                   <pic:blipFill>
-                    <a:blip r:embed="rId51"/>
+                    <a:blip r:embed="rId54"/>
                     <a:stretch>
                       <a:fillRect/>
                     </a:stretch>
@@ -5840,8 +5810,8 @@
         <w:t xml:space="preserve">A class-diagram view opens as a dockable window over the shell — dock it, tab it, or float it.</w:t>
       </w:r>
     </w:p>
-    <w:bookmarkEnd w:id="54"/>
-    <w:bookmarkStart w:id="55" w:name="step-8-generate-the-source"/>
+    <w:bookmarkEnd w:id="57"/>
+    <w:bookmarkStart w:id="58" w:name="step-8-generate-the-source"/>
     <w:p>
       <w:pPr>
         <w:pStyle w:val="Heading2"/>
@@ -6952,8 +6922,8 @@
         <w:t xml:space="preserve">bodies (chapter 11 lists every editable region).</w:t>
       </w:r>
     </w:p>
-    <w:bookmarkEnd w:id="55"/>
-    <w:bookmarkStart w:id="56" w:name="step-9-compile-and-run"/>
+    <w:bookmarkEnd w:id="58"/>
+    <w:bookmarkStart w:id="59" w:name="step-9-compile-and-run"/>
     <w:p>
       <w:pPr>
         <w:pStyle w:val="Heading2"/>
@@ -8489,8 +8459,8 @@
         <w:t xml:space="preserve">— the loop just continued. The whole surviving structure round-tripped through a compressed binary file. That is the value proposition of ClassBuilder in eleven lines of console output.</w:t>
       </w:r>
     </w:p>
-    <w:bookmarkEnd w:id="56"/>
-    <w:bookmarkStart w:id="57" w:name="step-10-the-round-trip"/>
+    <w:bookmarkEnd w:id="59"/>
+    <w:bookmarkStart w:id="60" w:name="step-10-the-round-trip"/>
     <w:p>
       <w:pPr>
         <w:pStyle w:val="Heading2"/>
@@ -8563,9 +8533,9 @@
         <w:t xml:space="preserve">): the model absorbs your edit. If ClassBuilder itself has the file’s model open when the source changes, it offers the read-back automatically — accept it, or your next Write Source will overwrite the edit. Model ↔ source is a two-way street.</w:t>
       </w:r>
     </w:p>
-    <w:bookmarkEnd w:id="57"/>
-    <w:bookmarkEnd w:id="58"/>
-    <w:bookmarkStart w:id="63" w:name="reference-the-application-shell"/>
+    <w:bookmarkEnd w:id="60"/>
+    <w:bookmarkEnd w:id="61"/>
+    <w:bookmarkStart w:id="66" w:name="reference-the-application-shell"/>
     <w:p>
       <w:pPr>
         <w:pStyle w:val="Heading1"/>
@@ -8574,7 +8544,7 @@
         <w:t xml:space="preserve">Reference: the application shell</w:t>
       </w:r>
     </w:p>
-    <w:bookmarkStart w:id="59" w:name="menus"/>
+    <w:bookmarkStart w:id="62" w:name="menus"/>
     <w:p>
       <w:pPr>
         <w:pStyle w:val="Heading2"/>
@@ -8898,8 +8868,8 @@
         <w:t xml:space="preserve">enlarges the whole application — text, icons, dialogs — independently of the operating system’s display scaling: useful on a monitor whose system scaling you don’t want to change, or when ClassBuilder alone should be bigger. It is a per-machine setting (stored per user, not in the model) and takes effect after a restart — picking a scale offers to restart ClassBuilder right away. Not to be confused with the Zoom items, which magnify only the active diagram canvas.</w:t>
       </w:r>
     </w:p>
-    <w:bookmarkEnd w:id="59"/>
-    <w:bookmarkStart w:id="60" w:name="the-main-toolbar"/>
+    <w:bookmarkEnd w:id="62"/>
+    <w:bookmarkStart w:id="63" w:name="the-main-toolbar"/>
     <w:p>
       <w:pPr>
         <w:pStyle w:val="Heading2"/>
@@ -9226,8 +9196,8 @@
         <w:t xml:space="preserve">— cropped strip of the main window toolbar (New / Open / Save / Read Source / Write Source).</w:t>
       </w:r>
     </w:p>
-    <w:bookmarkEnd w:id="60"/>
-    <w:bookmarkStart w:id="61" w:name="docking"/>
+    <w:bookmarkEnd w:id="63"/>
+    <w:bookmarkStart w:id="64" w:name="docking"/>
     <w:p>
       <w:pPr>
         <w:pStyle w:val="Heading2"/>
@@ -9372,8 +9342,8 @@
         <w:t xml:space="preserve">Closing a model’s tab closes the model (with a save prompt when modified).</w:t>
       </w:r>
     </w:p>
-    <w:bookmarkEnd w:id="61"/>
-    <w:bookmarkStart w:id="62" w:name="platforms-and-keys"/>
+    <w:bookmarkEnd w:id="64"/>
+    <w:bookmarkStart w:id="65" w:name="platforms-and-keys"/>
     <w:p>
       <w:pPr>
         <w:pStyle w:val="Heading2"/>
@@ -9512,9 +9482,9 @@
         <w:t xml:space="preserve">shows Width/Height/X/Y of the shape under the cursor in diagram views.</w:t>
       </w:r>
     </w:p>
-    <w:bookmarkEnd w:id="62"/>
-    <w:bookmarkEnd w:id="63"/>
-    <w:bookmarkStart w:id="70" w:name="reference-the-main-tree-view"/>
+    <w:bookmarkEnd w:id="65"/>
+    <w:bookmarkEnd w:id="66"/>
+    <w:bookmarkStart w:id="73" w:name="reference-the-main-tree-view"/>
     <w:p>
       <w:pPr>
         <w:pStyle w:val="Heading1"/>
@@ -9531,7 +9501,7 @@
         <w:t xml:space="preserve">The tree is the master view of a model: every element of the model, shown in its structure. Several models can be open at the same time — each model’s tree gets its own tab in the main window — and like every other view it can also be split off or floated (chapter 5.3).</w:t>
       </w:r>
     </w:p>
-    <w:bookmarkStart w:id="64" w:name="what-the-tree-shows"/>
+    <w:bookmarkStart w:id="67" w:name="what-the-tree-shows"/>
     <w:p>
       <w:pPr>
         <w:pStyle w:val="Heading2"/>
@@ -9606,8 +9576,8 @@
         <w:t xml:space="preserve">in their own folder — visible but owned by the generator. Every node type has its own icon; with Phase Support on, a phase glyph joins it.</w:t>
       </w:r>
     </w:p>
-    <w:bookmarkEnd w:id="64"/>
-    <w:bookmarkStart w:id="65" w:name="the-tree-toolbar"/>
+    <w:bookmarkEnd w:id="67"/>
+    <w:bookmarkStart w:id="68" w:name="the-tree-toolbar"/>
     <w:p>
       <w:pPr>
         <w:pStyle w:val="Heading2"/>
@@ -10544,8 +10514,8 @@
         <w:t xml:space="preserve">set as fallback.</w:t>
       </w:r>
     </w:p>
-    <w:bookmarkEnd w:id="65"/>
-    <w:bookmarkStart w:id="66" w:name="the-context-menu"/>
+    <w:bookmarkEnd w:id="68"/>
+    <w:bookmarkStart w:id="69" w:name="the-context-menu"/>
     <w:p>
       <w:pPr>
         <w:pStyle w:val="Heading2"/>
@@ -11026,8 +10996,8 @@
         <w:t xml:space="preserve">node, with the Add submenu expanded.</w:t>
       </w:r>
     </w:p>
-    <w:bookmarkEnd w:id="66"/>
-    <w:bookmarkStart w:id="67" w:name="filters"/>
+    <w:bookmarkEnd w:id="69"/>
+    <w:bookmarkStart w:id="70" w:name="filters"/>
     <w:p>
       <w:pPr>
         <w:pStyle w:val="Heading2"/>
@@ -11120,8 +11090,8 @@
         <w:t xml:space="preserve">”</w:t>
       </w:r>
     </w:p>
-    <w:bookmarkEnd w:id="67"/>
-    <w:bookmarkStart w:id="68" w:name="delete-multiple"/>
+    <w:bookmarkEnd w:id="70"/>
+    <w:bookmarkStart w:id="71" w:name="delete-multiple"/>
     <w:p>
       <w:pPr>
         <w:pStyle w:val="Heading2"/>
@@ -11210,8 +11180,8 @@
         <w:t xml:space="preserve">”</w:t>
       </w:r>
     </w:p>
-    <w:bookmarkEnd w:id="68"/>
-    <w:bookmarkStart w:id="69" w:name="drag-and-copy-drag"/>
+    <w:bookmarkEnd w:id="71"/>
+    <w:bookmarkStart w:id="72" w:name="drag-and-copy-drag"/>
     <w:p>
       <w:pPr>
         <w:pStyle w:val="Heading2"/>
@@ -11495,9 +11465,9 @@
         <w:t xml:space="preserve">: a class or actor drops as a new lifeline.</w:t>
       </w:r>
     </w:p>
-    <w:bookmarkEnd w:id="69"/>
-    <w:bookmarkEnd w:id="70"/>
-    <w:bookmarkStart w:id="84" w:name="reference-class-diagrams"/>
+    <w:bookmarkEnd w:id="72"/>
+    <w:bookmarkEnd w:id="73"/>
+    <w:bookmarkStart w:id="87" w:name="reference-class-diagrams"/>
     <w:p>
       <w:pPr>
         <w:pStyle w:val="Heading1"/>
@@ -11564,7 +11534,7 @@
         <w:t xml:space="preserve">”</w:t>
       </w:r>
     </w:p>
-    <w:bookmarkStart w:id="71" w:name="reading-the-diagram"/>
+    <w:bookmarkStart w:id="74" w:name="reading-the-diagram"/>
     <w:p>
       <w:pPr>
         <w:pStyle w:val="Heading2"/>
@@ -11791,8 +11761,8 @@
         <w:t xml:space="preserve">: free-text boxes, attachable by connection points to other shapes.</w:t>
       </w:r>
     </w:p>
-    <w:bookmarkEnd w:id="71"/>
-    <w:bookmarkStart w:id="72" w:name="selection"/>
+    <w:bookmarkEnd w:id="74"/>
+    <w:bookmarkStart w:id="75" w:name="selection"/>
     <w:p>
       <w:pPr>
         <w:pStyle w:val="Heading2"/>
@@ -12029,8 +11999,8 @@
         <w:t xml:space="preserve">A right-click on an unselected shape selects it first, then opens the context menu.</w:t>
       </w:r>
     </w:p>
-    <w:bookmarkEnd w:id="72"/>
-    <w:bookmarkStart w:id="73" w:name="moving-and-resizing"/>
+    <w:bookmarkEnd w:id="75"/>
+    <w:bookmarkStart w:id="76" w:name="moving-and-resizing"/>
     <w:p>
       <w:pPr>
         <w:pStyle w:val="Heading2"/>
@@ -12109,8 +12079,8 @@
         <w:t xml:space="preserve">off (re-enable via the context menu).</w:t>
       </w:r>
     </w:p>
-    <w:bookmarkEnd w:id="73"/>
-    <w:bookmarkStart w:id="74" w:name="editing-connection-routing"/>
+    <w:bookmarkEnd w:id="76"/>
+    <w:bookmarkStart w:id="77" w:name="editing-connection-routing"/>
     <w:p>
       <w:pPr>
         <w:pStyle w:val="Heading2"/>
@@ -12285,8 +12255,8 @@
         <w:t xml:space="preserve">(relation role names and multiplicities, dependency name/stereotype) are draggable on a selected connection (four-arrow cursor, snaps to the grid). Once moved, a label stays where you put it.</w:t>
       </w:r>
     </w:p>
-    <w:bookmarkEnd w:id="74"/>
-    <w:bookmarkStart w:id="75" w:name="members-and-methods-inside-the-box"/>
+    <w:bookmarkEnd w:id="77"/>
+    <w:bookmarkStart w:id="78" w:name="members-and-methods-inside-the-box"/>
     <w:p>
       <w:pPr>
         <w:pStyle w:val="Heading2"/>
@@ -12354,8 +12324,8 @@
         <w:t xml:space="preserve">Arrow keys walk the rows of a class (header ↔ members ↔ methods).</w:t>
       </w:r>
     </w:p>
-    <w:bookmarkEnd w:id="75"/>
-    <w:bookmarkStart w:id="76" w:name="notes-and-their-connection-points"/>
+    <w:bookmarkEnd w:id="78"/>
+    <w:bookmarkStart w:id="79" w:name="notes-and-their-connection-points"/>
     <w:p>
       <w:pPr>
         <w:pStyle w:val="Heading2"/>
@@ -12456,8 +12426,8 @@
         <w:t xml:space="preserve">While dragging, a dashed line plus a small square marker previews the geometry.</w:t>
       </w:r>
     </w:p>
-    <w:bookmarkEnd w:id="76"/>
-    <w:bookmarkStart w:id="77" w:name="creating-elements-on-the-canvas"/>
+    <w:bookmarkEnd w:id="79"/>
+    <w:bookmarkStart w:id="80" w:name="creating-elements-on-the-canvas"/>
     <w:p>
       <w:pPr>
         <w:pStyle w:val="Heading2"/>
@@ -12878,8 +12848,8 @@
         <w:t xml:space="preserve">.</w:t>
       </w:r>
     </w:p>
-    <w:bookmarkEnd w:id="77"/>
-    <w:bookmarkStart w:id="78" w:name="align"/>
+    <w:bookmarkEnd w:id="80"/>
+    <w:bookmarkStart w:id="81" w:name="align"/>
     <w:p>
       <w:pPr>
         <w:pStyle w:val="Heading2"/>
@@ -12974,8 +12944,8 @@
         <w:t xml:space="preserve">(≥ 2 classes) auto-lays-out the whole diagram instead.</w:t>
       </w:r>
     </w:p>
-    <w:bookmarkEnd w:id="78"/>
-    <w:bookmarkStart w:id="79" w:name="hiding-per-shape-toggles-colors"/>
+    <w:bookmarkEnd w:id="81"/>
+    <w:bookmarkStart w:id="82" w:name="hiding-per-shape-toggles-colors"/>
     <w:p>
       <w:pPr>
         <w:pStyle w:val="Heading2"/>
@@ -13133,8 +13103,8 @@
         <w:t xml:space="preserve">— class line/text, member text, method text, relation line/critical-relation line/text, inherit line, diagram-only line/text, dependency line/text, note line/text. Each opens a color picker seeded with the current value; the change applies to every diagram of the model (and is undoable).</w:t>
       </w:r>
     </w:p>
-    <w:bookmarkEnd w:id="79"/>
-    <w:bookmarkStart w:id="80" w:name="zoom-and-pan"/>
+    <w:bookmarkEnd w:id="82"/>
+    <w:bookmarkStart w:id="83" w:name="zoom-and-pan"/>
     <w:p>
       <w:pPr>
         <w:pStyle w:val="Heading2"/>
@@ -13394,8 +13364,8 @@
         <w:t xml:space="preserve">Zoom ranges from 0.1× to 32×; the status bar’s X/Y fields track the model coordinates under the cursor.</w:t>
       </w:r>
     </w:p>
-    <w:bookmarkEnd w:id="80"/>
-    <w:bookmarkStart w:id="81" w:name="the-cd-toolbar"/>
+    <w:bookmarkEnd w:id="83"/>
+    <w:bookmarkStart w:id="84" w:name="the-cd-toolbar"/>
     <w:p>
       <w:pPr>
         <w:pStyle w:val="Heading2"/>
@@ -13607,8 +13577,8 @@
         <w:t xml:space="preserve">— cropped strip of the CD toolbar in the order above.</w:t>
       </w:r>
     </w:p>
-    <w:bookmarkEnd w:id="81"/>
-    <w:bookmarkStart w:id="82" w:name="the-cd-context-menu"/>
+    <w:bookmarkEnd w:id="84"/>
+    <w:bookmarkStart w:id="85" w:name="the-cd-context-menu"/>
     <w:p>
       <w:pPr>
         <w:pStyle w:val="Heading2"/>
@@ -13949,8 +13919,8 @@
         <w:t xml:space="preserve">— the context menu open on a selected class shape, with the Add submenu expanded.</w:t>
       </w:r>
     </w:p>
-    <w:bookmarkEnd w:id="82"/>
-    <w:bookmarkStart w:id="83" w:name="canvas-keys"/>
+    <w:bookmarkEnd w:id="85"/>
+    <w:bookmarkStart w:id="86" w:name="canvas-keys"/>
     <w:p>
       <w:pPr>
         <w:pStyle w:val="Heading2"/>
@@ -14269,9 +14239,9 @@
         </w:tc>
       </w:tr>
     </w:tbl>
-    <w:bookmarkEnd w:id="83"/>
-    <w:bookmarkEnd w:id="84"/>
-    <w:bookmarkStart w:id="101" w:name="reference-sequence-diagrams"/>
+    <w:bookmarkEnd w:id="86"/>
+    <w:bookmarkEnd w:id="87"/>
+    <w:bookmarkStart w:id="104" w:name="reference-sequence-diagrams"/>
     <w:p>
       <w:pPr>
         <w:pStyle w:val="Heading1"/>
@@ -14357,18 +14327,18 @@
           <wp:inline>
             <wp:extent cx="5334000" cy="3429000"/>
             <wp:effectExtent b="0" l="0" r="0" t="0"/>
-            <wp:docPr descr="A sequence-diagram view in the shell — its own toolbar (delete, undo/redo, zoom, export SVG) at the top; diagram views dock, tab and float exactly like the trees." title="" id="86" name="Picture"/>
+            <wp:docPr descr="A sequence-diagram view in the shell — its own toolbar (delete, undo/redo, zoom, export SVG) at the top; diagram views dock, tab and float exactly like the trees." title="" id="89" name="Picture"/>
             <a:graphic>
               <a:graphicData uri="http://schemas.openxmlformats.org/drawingml/2006/picture">
                 <pic:pic>
                   <pic:nvPicPr>
-                    <pic:cNvPr descr="images/sd-view.png" id="87" name="Picture"/>
+                    <pic:cNvPr descr="images/sd-view.png" id="90" name="Picture"/>
                     <pic:cNvPicPr>
                       <a:picLocks noChangeArrowheads="1" noChangeAspect="1"/>
                     </pic:cNvPicPr>
                   </pic:nvPicPr>
                   <pic:blipFill>
-                    <a:blip r:embed="rId85"/>
+                    <a:blip r:embed="rId88"/>
                     <a:stretch>
                       <a:fillRect/>
                     </a:stretch>
@@ -14412,24 +14382,24 @@
           <wp:inline>
             <wp:extent cx="5334000" cy="7544589"/>
             <wp:effectExtent b="0" l="0" r="0" t="0"/>
-            <wp:docPr descr="The “Creating a Matrix” sequence diagram (SVG export, generated with add_call_trace): a User triggers Matrix(rows, columns), which constructs the Columns and Rows." title="" id="89" name="Picture"/>
+            <wp:docPr descr="The “Creating a Matrix” sequence diagram (SVG export, generated with add_call_trace): a User triggers Matrix(rows, columns), which constructs the Columns and Rows." title="" id="92" name="Picture"/>
             <a:graphic>
               <a:graphicData uri="http://schemas.openxmlformats.org/drawingml/2006/picture">
                 <pic:pic>
                   <pic:nvPicPr>
-                    <pic:cNvPr descr="images/sd-create.svg" id="90" name="Picture"/>
+                    <pic:cNvPr descr="images/sd-create.svg" id="93" name="Picture"/>
                     <pic:cNvPicPr>
                       <a:picLocks noChangeArrowheads="1" noChangeAspect="1"/>
                     </pic:cNvPicPr>
                   </pic:nvPicPr>
                   <pic:blipFill>
-                    <a:blip r:embed="rId91">
+                    <a:blip r:embed="rId94">
                       <a:extLst>
                         <a:ext uri="{28A0092B-C50C-407E-A947-70E740481C1C}">
                           <a14:useLocalDpi xmlns:a14="http://schemas.microsoft.com/office/drawing/2010/main" val="0"/>
                         </a:ext>
                         <a:ext uri="{96DAC541-7B7A-43D3-8B79-37D633B846F1}">
-                          <asvg:svgBlip xmlns:asvg="http://schemas.microsoft.com/office/drawing/2016/SVG/main" r:embed="rId88"/>
+                          <asvg:svgBlip xmlns:asvg="http://schemas.microsoft.com/office/drawing/2016/SVG/main" r:embed="rId91"/>
                         </a:ext>
                       </a:extLst>
                     </a:blip>
@@ -14485,7 +14455,7 @@
         <w:t xml:space="preserve">sequence diagram (SVG export, generated with add_call_trace): a User triggers Matrix(rows, columns), which constructs the Columns and Rows.</w:t>
       </w:r>
     </w:p>
-    <w:bookmarkStart w:id="92" w:name="building-one"/>
+    <w:bookmarkStart w:id="95" w:name="building-one"/>
     <w:p>
       <w:pPr>
         <w:pStyle w:val="Heading2"/>
@@ -14660,8 +14630,8 @@
         <w:t xml:space="preserve">Notes: free boxes with attach-lines — see below.</w:t>
       </w:r>
     </w:p>
-    <w:bookmarkEnd w:id="92"/>
-    <w:bookmarkStart w:id="93" w:name="what-moves-and-how"/>
+    <w:bookmarkEnd w:id="95"/>
+    <w:bookmarkStart w:id="96" w:name="what-moves-and-how"/>
     <w:p>
       <w:pPr>
         <w:pStyle w:val="Heading2"/>
@@ -15094,8 +15064,8 @@
         <w:t xml:space="preserve">: purely positional, so a point lying on a lifeline or signal travels with it. Dragging a corner point outward spawns a new joint; dragging a point back into the note deletes it. On release, a point near a signal arrow snaps vertically onto it — the line then tracks that signal.</w:t>
       </w:r>
     </w:p>
-    <w:bookmarkEnd w:id="93"/>
-    <w:bookmarkStart w:id="94" w:name="keeping-it-readable"/>
+    <w:bookmarkEnd w:id="96"/>
+    <w:bookmarkStart w:id="97" w:name="keeping-it-readable"/>
     <w:p>
       <w:pPr>
         <w:pStyle w:val="Heading2"/>
@@ -15195,8 +15165,8 @@
         <w:t xml:space="preserve">replaces a selected group of nested activations with a summarizing note — good for hiding boilerplate sub-calls.</w:t>
       </w:r>
     </w:p>
-    <w:bookmarkEnd w:id="94"/>
-    <w:bookmarkStart w:id="95" w:name="toolbar-colors-zoom"/>
+    <w:bookmarkEnd w:id="97"/>
+    <w:bookmarkStart w:id="98" w:name="toolbar-colors-zoom"/>
     <w:p>
       <w:pPr>
         <w:pStyle w:val="Heading2"/>
@@ -15354,8 +15324,8 @@
         <w:t xml:space="preserve">, Fit via toolbar or double-click on empty space, pan with plain scroll / middle-drag / scrollbars, pinch on trackpads).</w:t>
       </w:r>
     </w:p>
-    <w:bookmarkEnd w:id="95"/>
-    <w:bookmarkStart w:id="100" w:name="canvas-keys-1"/>
+    <w:bookmarkEnd w:id="98"/>
+    <w:bookmarkStart w:id="103" w:name="canvas-keys-1"/>
     <w:p>
       <w:pPr>
         <w:pStyle w:val="Heading2"/>
@@ -15755,24 +15725,24 @@
           <wp:inline>
             <wp:extent cx="5334000" cy="7544589"/>
             <wp:effectExtent b="0" l="0" r="0" t="0"/>
-            <wp:docPr descr="A pipe-generated call trace of the Matrix constructor (“Matrix constructor walkthrough”)." title="" id="97" name="Picture"/>
+            <wp:docPr descr="A pipe-generated call trace of the Matrix constructor (“Matrix constructor walkthrough”)." title="" id="100" name="Picture"/>
             <a:graphic>
               <a:graphicData uri="http://schemas.openxmlformats.org/drawingml/2006/picture">
                 <pic:pic>
                   <pic:nvPicPr>
-                    <pic:cNvPr descr="images/sd-ctor-walkthrough.svg" id="98" name="Picture"/>
+                    <pic:cNvPr descr="images/sd-ctor-walkthrough.svg" id="101" name="Picture"/>
                     <pic:cNvPicPr>
                       <a:picLocks noChangeArrowheads="1" noChangeAspect="1"/>
                     </pic:cNvPicPr>
                   </pic:nvPicPr>
                   <pic:blipFill>
-                    <a:blip r:embed="rId99">
+                    <a:blip r:embed="rId102">
                       <a:extLst>
                         <a:ext uri="{28A0092B-C50C-407E-A947-70E740481C1C}">
                           <a14:useLocalDpi xmlns:a14="http://schemas.microsoft.com/office/drawing/2010/main" val="0"/>
                         </a:ext>
                         <a:ext uri="{96DAC541-7B7A-43D3-8B79-37D633B846F1}">
-                          <asvg:svgBlip xmlns:asvg="http://schemas.microsoft.com/office/drawing/2016/SVG/main" r:embed="rId96"/>
+                          <asvg:svgBlip xmlns:asvg="http://schemas.microsoft.com/office/drawing/2016/SVG/main" r:embed="rId99"/>
                         </a:ext>
                       </a:extLst>
                     </a:blip>
@@ -15822,9 +15792,9 @@
         <w:t xml:space="preserve">).</w:t>
       </w:r>
     </w:p>
-    <w:bookmarkEnd w:id="100"/>
-    <w:bookmarkEnd w:id="101"/>
-    <w:bookmarkStart w:id="134" w:name="reference-dialogs"/>
+    <w:bookmarkEnd w:id="103"/>
+    <w:bookmarkEnd w:id="104"/>
+    <w:bookmarkStart w:id="137" w:name="reference-dialogs"/>
     <w:p>
       <w:pPr>
         <w:pStyle w:val="Heading1"/>
@@ -15989,7 +15959,7 @@
         <w:t xml:space="preserve">One screenshot per dialog in this chapter, captured on Windows at 100% scale with realistic content from the Matrix model. Captions are given per dialog below.</w:t>
       </w:r>
     </w:p>
-    <w:bookmarkStart w:id="102" w:name="class"/>
+    <w:bookmarkStart w:id="105" w:name="class"/>
     <w:p>
       <w:pPr>
         <w:pStyle w:val="Heading2"/>
@@ -16204,8 +16174,8 @@
         <w:t xml:space="preserve">the checkbox disables when switching would break the model — most importantly, a class with a Serialize-on subclass cannot turn Serialize off.</w:t>
       </w:r>
     </w:p>
-    <w:bookmarkEnd w:id="102"/>
-    <w:bookmarkStart w:id="103" w:name="external-class"/>
+    <w:bookmarkEnd w:id="105"/>
+    <w:bookmarkStart w:id="106" w:name="external-class"/>
     <w:p>
       <w:pPr>
         <w:pStyle w:val="Heading2"/>
@@ -16284,8 +16254,8 @@
         <w:t xml:space="preserve">(for types that must not be forward-declared, e.g. typedefs), member prefix (used when generated code calls its getters/setters).</w:t>
       </w:r>
     </w:p>
-    <w:bookmarkEnd w:id="103"/>
-    <w:bookmarkStart w:id="104" w:name="member"/>
+    <w:bookmarkEnd w:id="106"/>
+    <w:bookmarkStart w:id="107" w:name="member"/>
     <w:p>
       <w:pPr>
         <w:pStyle w:val="Heading2"/>
@@ -16570,8 +16540,8 @@
         <w:t xml:space="preserve">— changing a key must never be a plain assignment. See chapter 12.7 for the generated code.</w:t>
       </w:r>
     </w:p>
-    <w:bookmarkEnd w:id="104"/>
-    <w:bookmarkStart w:id="105" w:name="method"/>
+    <w:bookmarkEnd w:id="107"/>
+    <w:bookmarkStart w:id="108" w:name="method"/>
     <w:p>
       <w:pPr>
         <w:pStyle w:val="Heading2"/>
@@ -16902,8 +16872,8 @@
         <w:t xml:space="preserve">”</w:t>
       </w:r>
     </w:p>
-    <w:bookmarkEnd w:id="105"/>
-    <w:bookmarkStart w:id="106" w:name="constructor-destructor"/>
+    <w:bookmarkEnd w:id="108"/>
+    <w:bookmarkStart w:id="109" w:name="constructor-destructor"/>
     <w:p>
       <w:pPr>
         <w:pStyle w:val="Heading2"/>
@@ -17062,8 +17032,8 @@
         <w:t xml:space="preserve">). If you edit an initializer by hand in the constructor dialog, your text wins until the next structural change re-derives that entry.</w:t>
       </w:r>
     </w:p>
-    <w:bookmarkEnd w:id="106"/>
-    <w:bookmarkStart w:id="107" w:name="exception-specification"/>
+    <w:bookmarkEnd w:id="109"/>
+    <w:bookmarkStart w:id="110" w:name="exception-specification"/>
     <w:p>
       <w:pPr>
         <w:pStyle w:val="Heading2"/>
@@ -17194,8 +17164,8 @@
         <w:t xml:space="preserve">clause.</w:t>
       </w:r>
     </w:p>
-    <w:bookmarkEnd w:id="107"/>
-    <w:bookmarkStart w:id="108" w:name="argument"/>
+    <w:bookmarkEnd w:id="110"/>
+    <w:bookmarkStart w:id="111" w:name="argument"/>
     <w:p>
       <w:pPr>
         <w:pStyle w:val="Heading2"/>
@@ -17258,8 +17228,8 @@
         <w:t xml:space="preserve">, note. Reorder arguments by drag in the tree.</w:t>
       </w:r>
     </w:p>
-    <w:bookmarkEnd w:id="108"/>
-    <w:bookmarkStart w:id="109" w:name="inheritance"/>
+    <w:bookmarkEnd w:id="111"/>
+    <w:bookmarkStart w:id="112" w:name="inheritance"/>
     <w:p>
       <w:pPr>
         <w:pStyle w:val="Heading2"/>
@@ -17397,8 +17367,8 @@
         <w:t xml:space="preserve">browser.</w:t>
       </w:r>
     </w:p>
-    <w:bookmarkEnd w:id="109"/>
-    <w:bookmarkStart w:id="110" w:name="relation"/>
+    <w:bookmarkEnd w:id="112"/>
+    <w:bookmarkStart w:id="113" w:name="relation"/>
     <w:p>
       <w:pPr>
         <w:pStyle w:val="Heading2"/>
@@ -17862,8 +17832,8 @@
         <w:t xml:space="preserve">(chapter 12.7).</w:t>
       </w:r>
     </w:p>
-    <w:bookmarkEnd w:id="110"/>
-    <w:bookmarkStart w:id="111" w:name="find-method-on-a-relation"/>
+    <w:bookmarkEnd w:id="113"/>
+    <w:bookmarkStart w:id="114" w:name="find-method-on-a-relation"/>
     <w:p>
       <w:pPr>
         <w:pStyle w:val="Heading2"/>
@@ -18009,8 +17979,8 @@
         <w:t xml:space="preserve">is generated instead — callers are identical either way.</w:t>
       </w:r>
     </w:p>
-    <w:bookmarkEnd w:id="111"/>
-    <w:bookmarkStart w:id="112" w:name="dependency"/>
+    <w:bookmarkEnd w:id="114"/>
+    <w:bookmarkStart w:id="115" w:name="dependency"/>
     <w:p>
       <w:pPr>
         <w:pStyle w:val="Heading2"/>
@@ -18130,8 +18100,8 @@
         <w:t xml:space="preserve">. A dependency is modeled — it affects the include/forward-declaration emission for the client — but adds no members or relation code.</w:t>
       </w:r>
     </w:p>
-    <w:bookmarkEnd w:id="112"/>
-    <w:bookmarkStart w:id="113" w:name="relation-diagram-only"/>
+    <w:bookmarkEnd w:id="115"/>
+    <w:bookmarkStart w:id="116" w:name="relation-diagram-only"/>
     <w:p>
       <w:pPr>
         <w:pStyle w:val="Heading2"/>
@@ -18258,8 +18228,8 @@
         <w:t xml:space="preserve">than modeled relations (e.g. Composition).</w:t>
       </w:r>
     </w:p>
-    <w:bookmarkEnd w:id="113"/>
-    <w:bookmarkStart w:id="114" w:name="type"/>
+    <w:bookmarkEnd w:id="116"/>
+    <w:bookmarkStart w:id="117" w:name="type"/>
     <w:p>
       <w:pPr>
         <w:pStyle w:val="Heading2"/>
@@ -18387,8 +18357,8 @@
         <w:t xml:space="preserve">C++ text that gets emitted into the master include.</w:t>
       </w:r>
     </w:p>
-    <w:bookmarkEnd w:id="114"/>
-    <w:bookmarkStart w:id="115" w:name="group-meta-group"/>
+    <w:bookmarkEnd w:id="117"/>
+    <w:bookmarkStart w:id="118" w:name="group-meta-group"/>
     <w:p>
       <w:pPr>
         <w:pStyle w:val="Heading2"/>
@@ -18438,8 +18408,8 @@
         <w:t xml:space="preserve">Name + note. (MemberAndMethodGroups — in-class folders — are created from the class context menu.)</w:t>
       </w:r>
     </w:p>
-    <w:bookmarkEnd w:id="115"/>
-    <w:bookmarkStart w:id="116" w:name="context-define-and-assign"/>
+    <w:bookmarkEnd w:id="118"/>
+    <w:bookmarkStart w:id="119" w:name="context-define-and-assign"/>
     <w:p>
       <w:pPr>
         <w:pStyle w:val="Heading2"/>
@@ -18713,8 +18683,8 @@
         <w:t xml:space="preserve">”</w:t>
       </w:r>
     </w:p>
-    <w:bookmarkEnd w:id="116"/>
-    <w:bookmarkStart w:id="117" w:name="actor"/>
+    <w:bookmarkEnd w:id="119"/>
+    <w:bookmarkStart w:id="120" w:name="actor"/>
     <w:p>
       <w:pPr>
         <w:pStyle w:val="Heading2"/>
@@ -18779,8 +18749,8 @@
         <w:t xml:space="preserve">and go on sequence diagrams as stick figures.</w:t>
       </w:r>
     </w:p>
-    <w:bookmarkEnd w:id="117"/>
-    <w:bookmarkStart w:id="118" w:name="class-diagram"/>
+    <w:bookmarkEnd w:id="120"/>
+    <w:bookmarkStart w:id="121" w:name="class-diagram"/>
     <w:p>
       <w:pPr>
         <w:pStyle w:val="Heading2"/>
@@ -18846,8 +18816,8 @@
         <w:t xml:space="preserve">matrix: which member/method access levels are automatically shown when a class is placed on this diagram (private/protected/public members and methods, plus Get/Set methods).</w:t>
       </w:r>
     </w:p>
-    <w:bookmarkEnd w:id="118"/>
-    <w:bookmarkStart w:id="119" w:name="sequence-diagram"/>
+    <w:bookmarkEnd w:id="121"/>
+    <w:bookmarkStart w:id="122" w:name="sequence-diagram"/>
     <w:p>
       <w:pPr>
         <w:pStyle w:val="Heading2"/>
@@ -19001,8 +18971,8 @@
         <w:t xml:space="preserve">options (argument types, argument names, scope). Per-message overrides exist on each signal’s own dialog.</w:t>
       </w:r>
     </w:p>
-    <w:bookmarkEnd w:id="119"/>
-    <w:bookmarkStart w:id="120" w:name="select-classes"/>
+    <w:bookmarkEnd w:id="122"/>
+    <w:bookmarkStart w:id="123" w:name="select-classes"/>
     <w:p>
       <w:pPr>
         <w:pStyle w:val="Heading2"/>
@@ -19065,8 +19035,8 @@
         <w:t xml:space="preserve">afterwards).</w:t>
       </w:r>
     </w:p>
-    <w:bookmarkEnd w:id="120"/>
-    <w:bookmarkStart w:id="121" w:name="class-shape"/>
+    <w:bookmarkEnd w:id="123"/>
+    <w:bookmarkStart w:id="124" w:name="class-shape"/>
     <w:p>
       <w:pPr>
         <w:pStyle w:val="Heading2"/>
@@ -19179,8 +19149,8 @@
         <w:t xml:space="preserve">shape. The same class can show different features on different diagrams.</w:t>
       </w:r>
     </w:p>
-    <w:bookmarkEnd w:id="121"/>
-    <w:bookmarkStart w:id="122" w:name="select-members-methods"/>
+    <w:bookmarkEnd w:id="124"/>
+    <w:bookmarkStart w:id="125" w:name="select-members-methods"/>
     <w:p>
       <w:pPr>
         <w:pStyle w:val="Heading2"/>
@@ -19231,8 +19201,8 @@
         <w:t xml:space="preserve">on a class shape (within what the diagram’s access-level flags allow). Checkbox lists per section, with Select All / Unselect All. Diagram-wide or per-class, depending on where it was opened.</w:t>
       </w:r>
     </w:p>
-    <w:bookmarkEnd w:id="122"/>
-    <w:bookmarkStart w:id="123" w:name="reorder-members-methods"/>
+    <w:bookmarkEnd w:id="125"/>
+    <w:bookmarkStart w:id="126" w:name="reorder-members-methods"/>
     <w:p>
       <w:pPr>
         <w:pStyle w:val="Heading2"/>
@@ -19280,8 +19250,8 @@
         <w:t xml:space="preserve">: it changes declaration order in the generated file.</w:t>
       </w:r>
     </w:p>
-    <w:bookmarkEnd w:id="123"/>
-    <w:bookmarkStart w:id="124" w:name="signal-message"/>
+    <w:bookmarkEnd w:id="126"/>
+    <w:bookmarkStart w:id="127" w:name="signal-message"/>
     <w:p>
       <w:pPr>
         <w:pStyle w:val="Heading2"/>
@@ -19358,8 +19328,8 @@
         <w:t xml:space="preserve">), return text + show-return-arrow, async flag, per-message argument/scope display, note.</w:t>
       </w:r>
     </w:p>
-    <w:bookmarkEnd w:id="124"/>
-    <w:bookmarkStart w:id="125" w:name="lifeline-note-dialogs"/>
+    <w:bookmarkEnd w:id="127"/>
+    <w:bookmarkStart w:id="128" w:name="lifeline-note-dialogs"/>
     <w:p>
       <w:pPr>
         <w:pStyle w:val="Heading2"/>
@@ -19428,8 +19398,8 @@
         <w:t xml:space="preserve">(apply the size everywhere).</w:t>
       </w:r>
     </w:p>
-    <w:bookmarkEnd w:id="125"/>
-    <w:bookmarkStart w:id="126" w:name="Xb9470c6e63f702dcde05f89c7607c45c6bcf312"/>
+    <w:bookmarkEnd w:id="128"/>
+    <w:bookmarkStart w:id="129" w:name="Xb9470c6e63f702dcde05f89c7607c45c6bcf312"/>
     <w:p>
       <w:pPr>
         <w:pStyle w:val="Heading2"/>
@@ -19861,8 +19831,8 @@
         <w:t xml:space="preserve">(the TODO line seeded into new method bodies); Method Name List / Similar Lines List (name suggestions and the similar-lines tool’s pattern list).</w:t>
       </w:r>
     </w:p>
-    <w:bookmarkEnd w:id="126"/>
-    <w:bookmarkStart w:id="127" w:name="add-serialization-to-project"/>
+    <w:bookmarkEnd w:id="129"/>
+    <w:bookmarkStart w:id="130" w:name="add-serialization-to-project"/>
     <w:p>
       <w:pPr>
         <w:pStyle w:val="Heading2"/>
@@ -19940,8 +19910,8 @@
         <w:t xml:space="preserve">machinery (chapter 13.1). One-way — once a model has Serialize, it keeps it.</w:t>
       </w:r>
     </w:p>
-    <w:bookmarkEnd w:id="127"/>
-    <w:bookmarkStart w:id="128" w:name="find"/>
+    <w:bookmarkEnd w:id="130"/>
+    <w:bookmarkStart w:id="131" w:name="find"/>
     <w:p>
       <w:pPr>
         <w:pStyle w:val="Heading2"/>
@@ -20012,8 +19982,8 @@
         <w:t xml:space="preserve">repeats.</w:t>
       </w:r>
     </w:p>
-    <w:bookmarkEnd w:id="128"/>
-    <w:bookmarkStart w:id="129" w:name="read-source"/>
+    <w:bookmarkEnd w:id="131"/>
+    <w:bookmarkStart w:id="132" w:name="read-source"/>
     <w:p>
       <w:pPr>
         <w:pStyle w:val="Heading2"/>
@@ -20092,8 +20062,8 @@
         <w:t xml:space="preserve">.</w:t>
       </w:r>
     </w:p>
-    <w:bookmarkEnd w:id="129"/>
-    <w:bookmarkStart w:id="130" w:name="save-source"/>
+    <w:bookmarkEnd w:id="132"/>
+    <w:bookmarkStart w:id="133" w:name="save-source"/>
     <w:p>
       <w:pPr>
         <w:pStyle w:val="Heading2"/>
@@ -20219,8 +20189,8 @@
         <w:t xml:space="preserve">block in the header comment). That is where the author initials next to each change line in generated headers come from.</w:t>
       </w:r>
     </w:p>
-    <w:bookmarkEnd w:id="130"/>
-    <w:bookmarkStart w:id="131" w:name="virtual-methods-isclass-methods"/>
+    <w:bookmarkEnd w:id="133"/>
+    <w:bookmarkStart w:id="134" w:name="virtual-methods-isclass-methods"/>
     <w:p>
       <w:pPr>
         <w:pStyle w:val="Heading2"/>
@@ -20327,8 +20297,8 @@
         <w:t xml:space="preserve">, returning a boolean truth value).</w:t>
       </w:r>
     </w:p>
-    <w:bookmarkEnd w:id="131"/>
-    <w:bookmarkStart w:id="132" w:name="user-sections-code-dialogs"/>
+    <w:bookmarkEnd w:id="134"/>
+    <w:bookmarkStart w:id="135" w:name="user-sections-code-dialogs"/>
     <w:p>
       <w:pPr>
         <w:pStyle w:val="Heading2"/>
@@ -20418,8 +20388,8 @@
         <w:t xml:space="preserve">marker bands above and below your text.</w:t>
       </w:r>
     </w:p>
-    <w:bookmarkEnd w:id="132"/>
-    <w:bookmarkStart w:id="133" w:name="code-editing-helper-wizards"/>
+    <w:bookmarkEnd w:id="135"/>
+    <w:bookmarkStart w:id="136" w:name="code-editing-helper-wizards"/>
     <w:p>
       <w:pPr>
         <w:pStyle w:val="Heading2"/>
@@ -20716,9 +20686,9 @@
         <w:t xml:space="preserve">— the member-method wrapper picker.</w:t>
       </w:r>
     </w:p>
-    <w:bookmarkEnd w:id="133"/>
-    <w:bookmarkEnd w:id="134"/>
-    <w:bookmarkStart w:id="138" w:name="reference-the-code-editor"/>
+    <w:bookmarkEnd w:id="136"/>
+    <w:bookmarkEnd w:id="137"/>
+    <w:bookmarkStart w:id="141" w:name="reference-the-code-editor"/>
     <w:p>
       <w:pPr>
         <w:pStyle w:val="Heading1"/>
@@ -20735,7 +20705,7 @@
         <w:t xml:space="preserve">Method bodies, constructor/destructor bodies and the user sections are edited in ClassBuilder’s built-in code editor (a fixed-pitch C++ editor; Consolas 11 pt on Windows).</w:t>
       </w:r>
     </w:p>
-    <w:bookmarkStart w:id="135" w:name="editing-behavior"/>
+    <w:bookmarkStart w:id="138" w:name="editing-behavior"/>
     <w:p>
       <w:pPr>
         <w:pStyle w:val="Heading2"/>
@@ -20937,8 +20907,8 @@
         <w:t xml:space="preserve">No line wrapping; long lines scroll.</w:t>
       </w:r>
     </w:p>
-    <w:bookmarkEnd w:id="135"/>
-    <w:bookmarkStart w:id="136" w:name="code-insertion"/>
+    <w:bookmarkEnd w:id="138"/>
+    <w:bookmarkStart w:id="139" w:name="code-insertion"/>
     <w:p>
       <w:pPr>
         <w:pStyle w:val="Heading2"/>
@@ -21061,8 +21031,8 @@
         <w:t xml:space="preserve">marker already in place — write below the marker (chapter 11.4 for the destructor-order exception).</w:t>
       </w:r>
     </w:p>
-    <w:bookmarkEnd w:id="136"/>
-    <w:bookmarkStart w:id="137" w:name="where-it-appears"/>
+    <w:bookmarkEnd w:id="139"/>
+    <w:bookmarkStart w:id="140" w:name="where-it-appears"/>
     <w:p>
       <w:pPr>
         <w:pStyle w:val="Heading2"/>
@@ -21270,9 +21240,9 @@
         </w:tc>
       </w:tr>
     </w:tbl>
-    <w:bookmarkEnd w:id="137"/>
-    <w:bookmarkEnd w:id="138"/>
-    <w:bookmarkStart w:id="144" w:name="code-generation-in-depth"/>
+    <w:bookmarkEnd w:id="140"/>
+    <w:bookmarkEnd w:id="141"/>
+    <w:bookmarkStart w:id="147" w:name="code-generation-in-depth"/>
     <w:p>
       <w:pPr>
         <w:pStyle w:val="Heading1"/>
@@ -21281,7 +21251,7 @@
         <w:t xml:space="preserve">Code generation in depth</w:t>
       </w:r>
     </w:p>
-    <w:bookmarkStart w:id="139" w:name="files-produced"/>
+    <w:bookmarkStart w:id="142" w:name="files-produced"/>
     <w:p>
       <w:pPr>
         <w:pStyle w:val="Heading2"/>
@@ -21380,8 +21350,8 @@
         <w:t xml:space="preserve">).</w:t>
       </w:r>
     </w:p>
-    <w:bookmarkEnd w:id="139"/>
-    <w:bookmarkStart w:id="140" w:name="anatomy-of-a-generated-file"/>
+    <w:bookmarkEnd w:id="142"/>
+    <w:bookmarkStart w:id="143" w:name="anatomy-of-a-generated-file"/>
     <w:p>
       <w:pPr>
         <w:pStyle w:val="Heading2"/>
@@ -21804,8 +21774,8 @@
         <w:t xml:space="preserve">bodies, relation macros, class declarations or member lists on disk; change the model instead.</w:t>
       </w:r>
     </w:p>
-    <w:bookmarkEnd w:id="140"/>
-    <w:bookmarkStart w:id="141" w:name="the-six-user-sections"/>
+    <w:bookmarkEnd w:id="143"/>
+    <w:bookmarkStart w:id="144" w:name="the-six-user-sections"/>
     <w:p>
       <w:pPr>
         <w:pStyle w:val="Heading2"/>
@@ -21903,8 +21873,8 @@
         <w:t xml:space="preserve">is the place for hand-written members or friend declarations that should live in the class but not in the model.</w:t>
       </w:r>
     </w:p>
-    <w:bookmarkEnd w:id="141"/>
-    <w:bookmarkStart w:id="142" w:name="constructorinclude-destructorinclude"/>
+    <w:bookmarkEnd w:id="144"/>
+    <w:bookmarkStart w:id="145" w:name="constructorinclude-destructorinclude"/>
     <w:p>
       <w:pPr>
         <w:pStyle w:val="Heading2"/>
@@ -22043,8 +22013,8 @@
         <w:t xml:space="preserve">(the generator preserves your body; you own the order inside it).</w:t>
       </w:r>
     </w:p>
-    <w:bookmarkEnd w:id="142"/>
-    <w:bookmarkStart w:id="143" w:name="read-source-the-round-trip"/>
+    <w:bookmarkEnd w:id="145"/>
+    <w:bookmarkStart w:id="146" w:name="read-source-the-round-trip"/>
     <w:p>
       <w:pPr>
         <w:pStyle w:val="Heading2"/>
@@ -22208,9 +22178,9 @@
         <w:t xml:space="preserve">Line endings: bodies are stored with CRLF; keep generated files CRLF (the model’s line-ending setting controls emissions).</w:t>
       </w:r>
     </w:p>
-    <w:bookmarkEnd w:id="143"/>
-    <w:bookmarkEnd w:id="144"/>
-    <w:bookmarkStart w:id="163" w:name="relations-and-the-intrusive-runtime"/>
+    <w:bookmarkEnd w:id="146"/>
+    <w:bookmarkEnd w:id="147"/>
+    <w:bookmarkStart w:id="166" w:name="relations-and-the-intrusive-runtime"/>
     <w:p>
       <w:pPr>
         <w:pStyle w:val="Heading1"/>
@@ -22227,7 +22197,7 @@
         <w:t xml:space="preserve">This chapter is the heart of ClassBuilder. It explains what the relation macros generate, why intrusive linked lists were chosen, and what guarantees you get.</w:t>
       </w:r>
     </w:p>
-    <w:bookmarkStart w:id="149" w:name="what-intrusive-means"/>
+    <w:bookmarkStart w:id="152" w:name="what-intrusive-means"/>
     <w:p>
       <w:pPr>
         <w:pStyle w:val="Heading2"/>
@@ -22263,24 +22233,24 @@
           <wp:inline>
             <wp:extent cx="5334000" cy="3246782"/>
             <wp:effectExtent b="0" l="0" r="0" t="0"/>
-            <wp:docPr descr="One Cell in two lists: all link pointers are members of the Cell itself." title="" id="146" name="Picture"/>
+            <wp:docPr descr="One Cell in two lists: all link pointers are members of the Cell itself." title="" id="149" name="Picture"/>
             <a:graphic>
               <a:graphicData uri="http://schemas.openxmlformats.org/drawingml/2006/picture">
                 <pic:pic>
                   <pic:nvPicPr>
-                    <pic:cNvPr descr="images/fig-intrusive-lists.svg" id="147" name="Picture"/>
+                    <pic:cNvPr descr="images/fig-intrusive-lists.svg" id="150" name="Picture"/>
                     <pic:cNvPicPr>
                       <a:picLocks noChangeArrowheads="1" noChangeAspect="1"/>
                     </pic:cNvPicPr>
                   </pic:nvPicPr>
                   <pic:blipFill>
-                    <a:blip r:embed="rId148">
+                    <a:blip r:embed="rId151">
                       <a:extLst>
                         <a:ext uri="{28A0092B-C50C-407E-A947-70E740481C1C}">
                           <a14:useLocalDpi xmlns:a14="http://schemas.microsoft.com/office/drawing/2010/main" val="0"/>
                         </a:ext>
                         <a:ext uri="{96DAC541-7B7A-43D3-8B79-37D633B846F1}">
-                          <asvg:svgBlip xmlns:asvg="http://schemas.microsoft.com/office/drawing/2016/SVG/main" r:embed="rId145"/>
+                          <asvg:svgBlip xmlns:asvg="http://schemas.microsoft.com/office/drawing/2016/SVG/main" r:embed="rId148"/>
                         </a:ext>
                       </a:extLst>
                     </a:blip>
@@ -22750,8 +22720,8 @@
         <w:t xml:space="preserve">In ClassBuilder a new relation on an existing class is one dialog and a regeneration; existing relations, code and files are untouched.</w:t>
       </w:r>
     </w:p>
-    <w:bookmarkEnd w:id="149"/>
-    <w:bookmarkStart w:id="150" w:name="declaring-relations-the-macro-surface"/>
+    <w:bookmarkEnd w:id="152"/>
+    <w:bookmarkStart w:id="153" w:name="declaring-relations-the-macro-surface"/>
     <w:p>
       <w:pPr>
         <w:pStyle w:val="Heading2"/>
@@ -23453,8 +23423,8 @@
         </w:tc>
       </w:tr>
     </w:tbl>
-    <w:bookmarkEnd w:id="150"/>
-    <w:bookmarkStart w:id="151" w:name="the-generated-api-of-a-multi-relation"/>
+    <w:bookmarkEnd w:id="153"/>
+    <w:bookmarkStart w:id="154" w:name="the-generated-api-of-a-multi-relation"/>
     <w:p>
       <w:pPr>
         <w:pStyle w:val="Heading2"/>
@@ -24382,8 +24352,8 @@
         <w:t xml:space="preserve">, so their exact signatures are always visible.</w:t>
       </w:r>
     </w:p>
-    <w:bookmarkEnd w:id="151"/>
-    <w:bookmarkStart w:id="152" w:name="Xaaa89ef9d7adb0d0fb470691c4808f6f6b0754c"/>
+    <w:bookmarkEnd w:id="154"/>
+    <w:bookmarkStart w:id="155" w:name="Xaaa89ef9d7adb0d0fb470691c4808f6f6b0754c"/>
     <w:p>
       <w:pPr>
         <w:pStyle w:val="Heading2"/>
@@ -24871,8 +24841,8 @@
         <w:t xml:space="preserve">.</w:t>
       </w:r>
     </w:p>
-    <w:bookmarkEnd w:id="152"/>
-    <w:bookmarkStart w:id="157" w:name="ownership-and-cascade-delete"/>
+    <w:bookmarkEnd w:id="155"/>
+    <w:bookmarkStart w:id="160" w:name="ownership-and-cascade-delete"/>
     <w:p>
       <w:pPr>
         <w:pStyle w:val="Heading2"/>
@@ -24890,24 +24860,24 @@
           <wp:inline>
             <wp:extent cx="5334000" cy="2724978"/>
             <wp:effectExtent b="0" l="0" r="0" t="0"/>
-            <wp:docPr descr="delete pMatrix — the cascade frees the entire graph." title="" id="154" name="Picture"/>
+            <wp:docPr descr="delete pMatrix — the cascade frees the entire graph." title="" id="157" name="Picture"/>
             <a:graphic>
               <a:graphicData uri="http://schemas.openxmlformats.org/drawingml/2006/picture">
                 <pic:pic>
                   <pic:nvPicPr>
-                    <pic:cNvPr descr="images/fig-ownership-cascade.svg" id="155" name="Picture"/>
+                    <pic:cNvPr descr="images/fig-ownership-cascade.svg" id="158" name="Picture"/>
                     <pic:cNvPicPr>
                       <a:picLocks noChangeArrowheads="1" noChangeAspect="1"/>
                     </pic:cNvPicPr>
                   </pic:nvPicPr>
                   <pic:blipFill>
-                    <a:blip r:embed="rId156">
+                    <a:blip r:embed="rId159">
                       <a:extLst>
                         <a:ext uri="{28A0092B-C50C-407E-A947-70E740481C1C}">
                           <a14:useLocalDpi xmlns:a14="http://schemas.microsoft.com/office/drawing/2010/main" val="0"/>
                         </a:ext>
                         <a:ext uri="{96DAC541-7B7A-43D3-8B79-37D633B846F1}">
-                          <asvg:svgBlip xmlns:asvg="http://schemas.microsoft.com/office/drawing/2016/SVG/main" r:embed="rId153"/>
+                          <asvg:svgBlip xmlns:asvg="http://schemas.microsoft.com/office/drawing/2016/SVG/main" r:embed="rId156"/>
                         </a:ext>
                       </a:extLst>
                     </a:blip>
@@ -25069,8 +25039,8 @@
         <w:t xml:space="preserve">members, and destructors clear them. In the demo run of chapter 4 this is the last line: every object freed by cascade.</w:t>
       </w:r>
     </w:p>
-    <w:bookmarkEnd w:id="157"/>
-    <w:bookmarkStart w:id="158" w:name="iterators-that-survive-modification"/>
+    <w:bookmarkEnd w:id="160"/>
+    <w:bookmarkStart w:id="161" w:name="iterators-that-survive-modification"/>
     <w:p>
       <w:pPr>
         <w:pStyle w:val="Heading2"/>
@@ -25334,8 +25304,8 @@
         <w:t xml:space="preserve">). Setters may trigger model-side reordering (e.g. in sorted tree relations); the captured pointer stays valid, the iterator re-anchors.</w:t>
       </w:r>
     </w:p>
-    <w:bookmarkEnd w:id="158"/>
-    <w:bookmarkStart w:id="159" w:name="single-static-multi"/>
+    <w:bookmarkEnd w:id="161"/>
+    <w:bookmarkStart w:id="162" w:name="single-static-multi"/>
     <w:p>
       <w:pPr>
         <w:pStyle w:val="Heading2"/>
@@ -25410,8 +25380,8 @@
         <w:t xml:space="preserve">instances of the from-class (class-level registry). Not available for template or serialize classes.</w:t>
       </w:r>
     </w:p>
-    <w:bookmarkEnd w:id="159"/>
-    <w:bookmarkStart w:id="160" w:name="tree-implementations-and-find-methods"/>
+    <w:bookmarkEnd w:id="162"/>
+    <w:bookmarkStart w:id="163" w:name="tree-implementations-and-find-methods"/>
     <w:p>
       <w:pPr>
         <w:pStyle w:val="Heading2"/>
@@ -26164,8 +26134,8 @@
         <w:t xml:space="preserve">— implemented as a loop on a list relation, or as the native tree search when the argument matches the tree key. Design workflow: start with lists; when profiling says a find is hot, flip the relation to a tree — the find method regenerates to the fast path, callers unchanged.</w:t>
       </w:r>
     </w:p>
-    <w:bookmarkEnd w:id="160"/>
-    <w:bookmarkStart w:id="161" w:name="critical-relations-threads"/>
+    <w:bookmarkEnd w:id="163"/>
+    <w:bookmarkStart w:id="164" w:name="critical-relations-threads"/>
     <w:p>
       <w:pPr>
         <w:pStyle w:val="Heading2"/>
@@ -26223,8 +26193,8 @@
         <w:t xml:space="preserve">only — your own data races remain your own; keep cross-thread mutation points few and explicit.</w:t>
       </w:r>
     </w:p>
-    <w:bookmarkEnd w:id="161"/>
-    <w:bookmarkStart w:id="162" w:name="writing-loops-the-generated-way"/>
+    <w:bookmarkEnd w:id="164"/>
+    <w:bookmarkStart w:id="165" w:name="writing-loops-the-generated-way"/>
     <w:p>
       <w:pPr>
         <w:pStyle w:val="Heading2"/>
@@ -26566,9 +26536,9 @@
         <w:t xml:space="preserve">before a loop that deletes — the list is live and your snapshot is not.</w:t>
       </w:r>
     </w:p>
-    <w:bookmarkEnd w:id="162"/>
-    <w:bookmarkEnd w:id="163"/>
-    <w:bookmarkStart w:id="170" w:name="serialization"/>
+    <w:bookmarkEnd w:id="165"/>
+    <w:bookmarkEnd w:id="166"/>
+    <w:bookmarkStart w:id="173" w:name="serialization"/>
     <w:p>
       <w:pPr>
         <w:pStyle w:val="Heading1"/>
@@ -26577,7 +26547,7 @@
         <w:t xml:space="preserve">Serialization</w:t>
       </w:r>
     </w:p>
-    <w:bookmarkStart w:id="164" w:name="what-you-get"/>
+    <w:bookmarkStart w:id="167" w:name="what-you-get"/>
     <w:p>
       <w:pPr>
         <w:pStyle w:val="Heading2"/>
@@ -26817,8 +26787,8 @@
         <w:t xml:space="preserve">registers the factory), then re-links all relations through a pointer table. Shared pointers, back-pointers, multi-ownership — the graph reloads exactly.</w:t>
       </w:r>
     </w:p>
-    <w:bookmarkEnd w:id="164"/>
-    <w:bookmarkStart w:id="165" w:name="cbarchive-and-the-wire-format"/>
+    <w:bookmarkEnd w:id="167"/>
+    <w:bookmarkStart w:id="168" w:name="cbarchive-and-the-wire-format"/>
     <w:p>
       <w:pPr>
         <w:pStyle w:val="Heading2"/>
@@ -26976,8 +26946,8 @@
         <w:t xml:space="preserve">rather than crashing.</w:t>
       </w:r>
     </w:p>
-    <w:bookmarkEnd w:id="165"/>
-    <w:bookmarkStart w:id="166" w:name="cbz-compression-on-the-fly"/>
+    <w:bookmarkEnd w:id="168"/>
+    <w:bookmarkStart w:id="169" w:name="cbz-compression-on-the-fly"/>
     <w:p>
       <w:pPr>
         <w:pStyle w:val="Heading2"/>
@@ -27327,8 +27297,8 @@
         <w:t xml:space="preserve">; the quick start’s whole matrix saved in 114 bytes. Your applications get the same for free — link zstd and use the two wrappers.</w:t>
       </w:r>
     </w:p>
-    <w:bookmarkEnd w:id="166"/>
-    <w:bookmarkStart w:id="167" w:name="Xbded68cf7b5dad621557026fdc0855cc4156113"/>
+    <w:bookmarkEnd w:id="169"/>
+    <w:bookmarkStart w:id="170" w:name="Xbded68cf7b5dad621557026fdc0855cc4156113"/>
     <w:p>
       <w:pPr>
         <w:pStyle w:val="Heading2"/>
@@ -27623,8 +27593,8 @@
         <w:t xml:space="preserve">button (Project Settings) renumbers a long version history down to the minimal equivalent scheme (max used + 1) — cosmetic, but keeps gates readable. Only compact when files older than the compacted scheme no longer need to load.</w:t>
       </w:r>
     </w:p>
-    <w:bookmarkEnd w:id="167"/>
-    <w:bookmarkStart w:id="168" w:name="rules-and-properties"/>
+    <w:bookmarkEnd w:id="170"/>
+    <w:bookmarkStart w:id="171" w:name="rules-and-properties"/>
     <w:p>
       <w:pPr>
         <w:pStyle w:val="Heading2"/>
@@ -27830,8 +27800,8 @@
         <w:t xml:space="preserve">for streaming (type dialog).</w:t>
       </w:r>
     </w:p>
-    <w:bookmarkEnd w:id="168"/>
-    <w:bookmarkStart w:id="169" w:name="Xe93cc69c5286d8ba9c1392594baf9a373c30c75"/>
+    <w:bookmarkEnd w:id="171"/>
+    <w:bookmarkStart w:id="172" w:name="Xe93cc69c5286d8ba9c1392594baf9a373c30c75"/>
     <w:p>
       <w:pPr>
         <w:pStyle w:val="Heading2"/>
@@ -28041,9 +28011,9 @@
         <w:t xml:space="preserve">Models that already build (like ClassBuilder’s own) are unaffected.</w:t>
       </w:r>
     </w:p>
-    <w:bookmarkEnd w:id="169"/>
-    <w:bookmarkEnd w:id="170"/>
-    <w:bookmarkStart w:id="174" w:name="the-generated-undoredo-framework"/>
+    <w:bookmarkEnd w:id="172"/>
+    <w:bookmarkEnd w:id="173"/>
+    <w:bookmarkStart w:id="177" w:name="the-generated-undoredo-framework"/>
     <w:p>
       <w:pPr>
         <w:pStyle w:val="Heading1"/>
@@ -28052,7 +28022,7 @@
         <w:t xml:space="preserve">The generated Undo/Redo framework</w:t>
       </w:r>
     </w:p>
-    <w:bookmarkStart w:id="171" w:name="what-it-is"/>
+    <w:bookmarkStart w:id="174" w:name="what-it-is"/>
     <w:p>
       <w:pPr>
         <w:pStyle w:val="Heading2"/>
@@ -28101,8 +28071,8 @@
         <w:t xml:space="preserve">generated model — the same machinery ClassBuilder itself uses for its own Edit ▸ Undo/Redo.</w:t>
       </w:r>
     </w:p>
-    <w:bookmarkEnd w:id="171"/>
-    <w:bookmarkStart w:id="172" w:name="how-it-works"/>
+    <w:bookmarkEnd w:id="174"/>
+    <w:bookmarkStart w:id="175" w:name="how-it-works"/>
     <w:p>
       <w:pPr>
         <w:pStyle w:val="Heading2"/>
@@ -28536,8 +28506,8 @@
         <w:t xml:space="preserve">deduplicates: an object already captured in the open step is not snapshotted again.</w:t>
       </w:r>
     </w:p>
-    <w:bookmarkEnd w:id="172"/>
-    <w:bookmarkStart w:id="173" w:name="the-undoreplace-entanglement"/>
+    <w:bookmarkEnd w:id="175"/>
+    <w:bookmarkStart w:id="176" w:name="the-undoreplace-entanglement"/>
     <w:p>
       <w:pPr>
         <w:pStyle w:val="Heading2"/>
@@ -28650,9 +28620,9 @@
         <w:t xml:space="preserve">undos.</w:t>
       </w:r>
     </w:p>
-    <w:bookmarkEnd w:id="173"/>
-    <w:bookmarkEnd w:id="174"/>
-    <w:bookmarkStart w:id="182" w:name="the-replace-constructor"/>
+    <w:bookmarkEnd w:id="176"/>
+    <w:bookmarkEnd w:id="177"/>
+    <w:bookmarkStart w:id="185" w:name="the-replace-constructor"/>
     <w:p>
       <w:pPr>
         <w:pStyle w:val="Heading1"/>
@@ -28661,7 +28631,7 @@
         <w:t xml:space="preserve">The replace constructor</w:t>
       </w:r>
     </w:p>
-    <w:bookmarkStart w:id="179" w:name="the-idea"/>
+    <w:bookmarkStart w:id="182" w:name="the-idea"/>
     <w:p>
       <w:pPr>
         <w:pStyle w:val="Heading2"/>
@@ -28679,24 +28649,24 @@
           <wp:inline>
             <wp:extent cx="5334000" cy="2782956"/>
             <wp:effectExtent b="0" l="0" r="0" t="0"/>
-            <wp:docPr descr="Replace: the new object takes over every relation slot of the old one." title="" id="176" name="Picture"/>
+            <wp:docPr descr="Replace: the new object takes over every relation slot of the old one." title="" id="179" name="Picture"/>
             <a:graphic>
               <a:graphicData uri="http://schemas.openxmlformats.org/drawingml/2006/picture">
                 <pic:pic>
                   <pic:nvPicPr>
-                    <pic:cNvPr descr="images/fig-replace-constructor.svg" id="177" name="Picture"/>
+                    <pic:cNvPr descr="images/fig-replace-constructor.svg" id="180" name="Picture"/>
                     <pic:cNvPicPr>
                       <a:picLocks noChangeArrowheads="1" noChangeAspect="1"/>
                     </pic:cNvPicPr>
                   </pic:nvPicPr>
                   <pic:blipFill>
-                    <a:blip r:embed="rId178">
+                    <a:blip r:embed="rId181">
                       <a:extLst>
                         <a:ext uri="{28A0092B-C50C-407E-A947-70E740481C1C}">
                           <a14:useLocalDpi xmlns:a14="http://schemas.microsoft.com/office/drawing/2010/main" val="0"/>
                         </a:ext>
                         <a:ext uri="{96DAC541-7B7A-43D3-8B79-37D633B846F1}">
-                          <asvg:svgBlip xmlns:asvg="http://schemas.microsoft.com/office/drawing/2016/SVG/main" r:embed="rId175"/>
+                          <asvg:svgBlip xmlns:asvg="http://schemas.microsoft.com/office/drawing/2016/SVG/main" r:embed="rId178"/>
                         </a:ext>
                       </a:extLst>
                     </a:blip>
@@ -28875,8 +28845,8 @@
         <w:t xml:space="preserve">a different class.</w:t>
       </w:r>
     </w:p>
-    <w:bookmarkEnd w:id="179"/>
-    <w:bookmarkStart w:id="180" w:name="why-it-is-more-powerful-than-a-factory"/>
+    <w:bookmarkEnd w:id="182"/>
+    <w:bookmarkStart w:id="183" w:name="why-it-is-more-powerful-than-a-factory"/>
     <w:p>
       <w:pPr>
         <w:pStyle w:val="Heading2"/>
@@ -29540,8 +29510,8 @@
         <w:t xml:space="preserve">is the state — the type system enforces the state chart.</w:t>
       </w:r>
     </w:p>
-    <w:bookmarkEnd w:id="180"/>
-    <w:bookmarkStart w:id="181" w:name="mechanics-and-constraints"/>
+    <w:bookmarkEnd w:id="183"/>
+    <w:bookmarkStart w:id="184" w:name="mechanics-and-constraints"/>
     <w:p>
       <w:pPr>
         <w:pStyle w:val="Heading2"/>
@@ -29644,9 +29614,9 @@
         <w:t xml:space="preserve">: see chapter 14.3 — the undo framework itself replaces objects on restore; mixing both requires redirecting parked undo entries, as ClassBuilder’s own model does.</w:t>
       </w:r>
     </w:p>
-    <w:bookmarkEnd w:id="181"/>
-    <w:bookmarkEnd w:id="182"/>
-    <w:bookmarkStart w:id="188" w:name="the-command-interface"/>
+    <w:bookmarkEnd w:id="184"/>
+    <w:bookmarkEnd w:id="185"/>
+    <w:bookmarkStart w:id="191" w:name="the-command-interface"/>
     <w:p>
       <w:pPr>
         <w:pStyle w:val="Heading1"/>
@@ -29655,7 +29625,7 @@
         <w:t xml:space="preserve">The command interface</w:t>
       </w:r>
     </w:p>
-    <w:bookmarkStart w:id="183" w:name="what-it-is-1"/>
+    <w:bookmarkStart w:id="186" w:name="what-it-is-1"/>
     <w:p>
       <w:pPr>
         <w:pStyle w:val="Heading2"/>
@@ -29858,8 +29828,8 @@
         <w:t xml:space="preserve">; below is the map plus worked examples.</w:t>
       </w:r>
     </w:p>
-    <w:bookmarkEnd w:id="183"/>
-    <w:bookmarkStart w:id="184" w:name="connecting"/>
+    <w:bookmarkEnd w:id="186"/>
+    <w:bookmarkStart w:id="187" w:name="connecting"/>
     <w:p>
       <w:pPr>
         <w:pStyle w:val="Heading2"/>
@@ -30323,8 +30293,8 @@
         <w:t xml:space="preserve">))</w:t>
       </w:r>
     </w:p>
-    <w:bookmarkEnd w:id="184"/>
-    <w:bookmarkStart w:id="185" w:name="the-command-families"/>
+    <w:bookmarkEnd w:id="187"/>
+    <w:bookmarkStart w:id="188" w:name="the-command-families"/>
     <w:p>
       <w:pPr>
         <w:pStyle w:val="Heading2"/>
@@ -31393,8 +31363,8 @@
         </w:tc>
       </w:tr>
     </w:tbl>
-    <w:bookmarkEnd w:id="185"/>
-    <w:bookmarkStart w:id="186" w:name="worked-examples-real-requests"/>
+    <w:bookmarkEnd w:id="188"/>
+    <w:bookmarkStart w:id="189" w:name="worked-examples-real-requests"/>
     <w:p>
       <w:pPr>
         <w:pStyle w:val="Heading2"/>
@@ -33293,8 +33263,8 @@
         <w:t xml:space="preserve">}}</w:t>
       </w:r>
     </w:p>
-    <w:bookmarkEnd w:id="186"/>
-    <w:bookmarkStart w:id="187" w:name="conventions-and-gotchas"/>
+    <w:bookmarkEnd w:id="189"/>
+    <w:bookmarkStart w:id="190" w:name="conventions-and-gotchas"/>
     <w:p>
       <w:pPr>
         <w:pStyle w:val="Heading2"/>
@@ -33626,9 +33596,9 @@
         <w:t xml:space="preserve">stamp tells you.</w:t>
       </w:r>
     </w:p>
-    <w:bookmarkEnd w:id="187"/>
-    <w:bookmarkEnd w:id="188"/>
-    <w:bookmarkStart w:id="189" w:name="tips-pitfalls-and-best-practices"/>
+    <w:bookmarkEnd w:id="190"/>
+    <w:bookmarkEnd w:id="191"/>
+    <w:bookmarkStart w:id="192" w:name="tips-pitfalls-and-best-practices"/>
     <w:p>
       <w:pPr>
         <w:pStyle w:val="Heading1"/>
@@ -34175,8 +34145,8 @@
         <w:t xml:space="preserve">) for documentation — it is the same renderer as the screen, vector-clean at any size.</w:t>
       </w:r>
     </w:p>
-    <w:bookmarkEnd w:id="189"/>
-    <w:bookmarkStart w:id="193" w:name="appendix"/>
+    <w:bookmarkEnd w:id="192"/>
+    <w:bookmarkStart w:id="196" w:name="appendix"/>
     <w:p>
       <w:pPr>
         <w:pStyle w:val="Heading1"/>
@@ -34185,7 +34155,7 @@
         <w:t xml:space="preserve">Appendix</w:t>
       </w:r>
     </w:p>
-    <w:bookmarkStart w:id="190" w:name="a.-runtime-header-inventory"/>
+    <w:bookmarkStart w:id="193" w:name="a.-runtime-header-inventory"/>
     <w:p>
       <w:pPr>
         <w:pStyle w:val="Heading2"/>
@@ -34736,8 +34706,8 @@
         </w:tc>
       </w:tr>
     </w:tbl>
-    <w:bookmarkEnd w:id="190"/>
-    <w:bookmarkStart w:id="191" w:name="b.-marker-quick-reference"/>
+    <w:bookmarkEnd w:id="193"/>
+    <w:bookmarkStart w:id="194" w:name="b.-marker-quick-reference"/>
     <w:p>
       <w:pPr>
         <w:pStyle w:val="Heading2"/>
@@ -34811,8 +34781,8 @@
         <w:t xml:space="preserve">@INSERT_MODIFICATIONS(* )             per-file change log insertion point</w:t>
       </w:r>
     </w:p>
-    <w:bookmarkEnd w:id="191"/>
-    <w:bookmarkStart w:id="192" w:name="c.-glossary"/>
+    <w:bookmarkEnd w:id="194"/>
+    <w:bookmarkStart w:id="195" w:name="c.-glossary"/>
     <w:p>
       <w:pPr>
         <w:pStyle w:val="Heading2"/>
@@ -35148,8 +35118,8 @@
         </w:tc>
       </w:tr>
     </w:tbl>
-    <w:bookmarkEnd w:id="192"/>
-    <w:bookmarkEnd w:id="193"/>
+    <w:bookmarkEnd w:id="195"/>
+    <w:bookmarkEnd w:id="196"/>
     <w:sectPr/>
   </w:body>
 </w:document>

</xml_diff>

<commit_message>
docs(manual): version handling is invisible; wire Member/Relation/Find figures
The _version story was wrong twice over: the quick start assigned
_version = 2 in a constructor body and chapter 13 told readers to
maintain the initialization by hand. In reality the whole version
mechanism is hidden — the only visible control is the Version field
(+ Compact Version button) in the DataModel dialog; members are
stamped (version+1) automatically on creation and the generated
document Serialize does the write/read/publish. Rewritten in Step 3,
chapter 13, and the pipe example body.

Wire JV's three new dialog screenshots: Member dialog (Row.id),
Relation dialog (Row->Cell), and the Find Method dialog composite
(dialog + code window + tree) in Step 6.

Co-Authored-By: Claude Fable 5 <noreply@anthropic.com>
</commit_message>
<xml_diff>
--- a/docs/manual/ClassBuilder_Manual.docx
+++ b/docs/manual/ClassBuilder_Manual.docx
@@ -3046,7 +3046,7 @@
     </w:p>
     <w:bookmarkEnd w:id="33"/>
     <w:bookmarkEnd w:id="34"/>
-    <w:bookmarkStart w:id="61" w:name="quick-start-the-matrix-model"/>
+    <w:bookmarkStart w:id="70" w:name="quick-start-the-matrix-model"/>
     <w:p>
       <w:pPr>
         <w:pStyle w:val="Heading1"/>
@@ -3661,7 +3661,7 @@
       </w:r>
     </w:p>
     <w:bookmarkEnd w:id="45"/>
-    <w:bookmarkStart w:id="46" w:name="step-3-add-members"/>
+    <w:bookmarkStart w:id="49" w:name="step-3-add-members"/>
     <w:p>
       <w:pPr>
         <w:pStyle w:val="Heading2"/>
@@ -3890,14 +3890,26 @@
     </w:p>
     <w:p>
       <w:pPr>
-        <w:pStyle w:val="BlockText"/>
-      </w:pPr>
-      <w:r>
-        <w:rPr>
-          <w:bCs/>
-          <w:b/>
-        </w:rPr>
-        <w:t xml:space="preserve">[FIGURE]</w:t>
+        <w:pStyle w:val="BodyText"/>
+      </w:pPr>
+      <w:r>
+        <w:t xml:space="preserve">The model’s format</w:t>
+      </w:r>
+      <w:r>
+        <w:t xml:space="preserve"> </w:t>
+      </w:r>
+      <w:r>
+        <w:rPr>
+          <w:bCs/>
+          <w:b/>
+        </w:rPr>
+        <w:t xml:space="preserve">version</w:t>
+      </w:r>
+      <w:r>
+        <w:t xml:space="preserve"> </w:t>
+      </w:r>
+      <w:r>
+        <w:t xml:space="preserve">needs no member and no code: it is the</w:t>
       </w:r>
       <w:r>
         <w:t xml:space="preserve"> </w:t>
@@ -3907,39 +3919,87 @@
           <w:iCs/>
           <w:i/>
         </w:rPr>
-        <w:t xml:space="preserve">The Member dialog for Row.id: Type combo, Name, the type-property checkboxes (Const/Reference/Pointer/Array/Bit Field…), Access radio group, Get/Set method groups, Initial Value, Serialize checkbox, Note. Caption:</w:t>
-      </w:r>
-      <w:r>
-        <w:rPr>
-          <w:iCs/>
-          <w:i/>
-        </w:rPr>
-        <w:t xml:space="preserve"> </w:t>
-      </w:r>
-      <w:r>
-        <w:rPr>
-          <w:iCs/>
-          <w:i/>
-        </w:rPr>
-        <w:t xml:space="preserve">“</w:t>
-      </w:r>
-      <w:r>
-        <w:rPr>
-          <w:iCs/>
-          <w:i/>
-        </w:rPr>
+        <w:t xml:space="preserve">Version</w:t>
+      </w:r>
+      <w:r>
+        <w:t xml:space="preserve"> </w:t>
+      </w:r>
+      <w:r>
+        <w:t xml:space="preserve">field in the DataModel dialog (visible in the Step 1 figure). ClassBuilder handles the rest invisibly — the generated document</w:t>
+      </w:r>
+      <w:r>
+        <w:t xml:space="preserve"> </w:t>
+      </w:r>
+      <w:r>
+        <w:rPr>
+          <w:rStyle w:val="VerbatimChar"/>
+        </w:rPr>
+        <w:t xml:space="preserve">Serialize</w:t>
+      </w:r>
+      <w:r>
+        <w:t xml:space="preserve"> </w:t>
+      </w:r>
+      <w:r>
+        <w:t xml:space="preserve">writes the version into every save and uses it when reading older files back; chapter 13 shows how that supports evolving the model.</w:t>
+      </w:r>
+    </w:p>
+    <w:p>
+      <w:pPr>
+        <w:pStyle w:val="CaptionedFigure"/>
+      </w:pPr>
+      <w:r>
+        <w:drawing>
+          <wp:inline>
+            <wp:extent cx="5334000" cy="6093588"/>
+            <wp:effectExtent b="0" l="0" r="0" t="0"/>
+            <wp:docPr descr="The Member dialog. Getter/setter generation and the serialize flag are per-member choices." title="" id="47" name="Picture"/>
+            <a:graphic>
+              <a:graphicData uri="http://schemas.openxmlformats.org/drawingml/2006/picture">
+                <pic:pic>
+                  <pic:nvPicPr>
+                    <pic:cNvPr descr="images/Row_id.png" id="48" name="Picture"/>
+                    <pic:cNvPicPr>
+                      <a:picLocks noChangeArrowheads="1" noChangeAspect="1"/>
+                    </pic:cNvPicPr>
+                  </pic:nvPicPr>
+                  <pic:blipFill>
+                    <a:blip r:embed="rId46"/>
+                    <a:stretch>
+                      <a:fillRect/>
+                    </a:stretch>
+                  </pic:blipFill>
+                  <pic:spPr bwMode="auto">
+                    <a:xfrm>
+                      <a:off x="0" y="0"/>
+                      <a:ext cx="5334000" cy="6093588"/>
+                    </a:xfrm>
+                    <a:prstGeom prst="rect">
+                      <a:avLst/>
+                    </a:prstGeom>
+                    <a:noFill/>
+                    <a:ln w="9525">
+                      <a:noFill/>
+                      <a:headEnd/>
+                      <a:tailEnd/>
+                    </a:ln>
+                  </pic:spPr>
+                </pic:pic>
+              </a:graphicData>
+            </a:graphic>
+          </wp:inline>
+        </w:drawing>
+      </w:r>
+    </w:p>
+    <w:p>
+      <w:pPr>
+        <w:pStyle w:val="ImageCaption"/>
+      </w:pPr>
+      <w:r>
         <w:t xml:space="preserve">The Member dialog. Getter/setter generation and the serialize flag are per-member choices.</w:t>
       </w:r>
-      <w:r>
-        <w:rPr>
-          <w:iCs/>
-          <w:i/>
-        </w:rPr>
-        <w:t xml:space="preserve">”</w:t>
-      </w:r>
-    </w:p>
-    <w:bookmarkEnd w:id="46"/>
-    <w:bookmarkStart w:id="47" w:name="step-4-add-the-relations"/>
+    </w:p>
+    <w:bookmarkEnd w:id="49"/>
+    <w:bookmarkStart w:id="53" w:name="step-4-add-the-relations"/>
     <w:p>
       <w:pPr>
         <w:pStyle w:val="Heading2"/>
@@ -4298,1426 +4358,1465 @@
     </w:p>
     <w:p>
       <w:pPr>
-        <w:pStyle w:val="BlockText"/>
-      </w:pPr>
-      <w:r>
-        <w:rPr>
-          <w:bCs/>
-          <w:b/>
-        </w:rPr>
-        <w:t xml:space="preserve">[FIGURE]</w:t>
-      </w:r>
-      <w:r>
-        <w:t xml:space="preserve"> </w:t>
-      </w:r>
-      <w:r>
-        <w:rPr>
-          <w:iCs/>
-          <w:i/>
-        </w:rPr>
-        <w:t xml:space="preserve">The Relation dialog for Row→Cell: From/To class combos and role names, Association Type radio group (Single / Multi / Static Multi), Association Properties (Aggregation / Critical / Filter), Implementation group (Standard / Value Tree / AVL Tree, Unique). Caption:</w:t>
-      </w:r>
-      <w:r>
-        <w:rPr>
-          <w:iCs/>
-          <w:i/>
-        </w:rPr>
-        <w:t xml:space="preserve"> </w:t>
-      </w:r>
-      <w:r>
-        <w:rPr>
-          <w:iCs/>
-          <w:i/>
-        </w:rPr>
-        <w:t xml:space="preserve">“</w:t>
-      </w:r>
-      <w:r>
-        <w:rPr>
-          <w:iCs/>
-          <w:i/>
-        </w:rPr>
-        <w:t xml:space="preserve">A relation: kind, ownership, thread-safety, and container implementation are all declared here — the code is generated.</w:t>
-      </w:r>
-      <w:r>
-        <w:rPr>
-          <w:iCs/>
-          <w:i/>
-        </w:rPr>
-        <w:t xml:space="preserve">”</w:t>
-      </w:r>
-    </w:p>
-    <w:bookmarkEnd w:id="47"/>
-    <w:bookmarkStart w:id="48" w:name="X267736c760e32dc6d865ac46fc2c6b29b8f25a5"/>
-    <w:p>
-      <w:pPr>
-        <w:pStyle w:val="Heading2"/>
-      </w:pPr>
-      <w:r>
-        <w:t xml:space="preserve">Step 5 — constructors, with real code in the bodies</w:t>
-      </w:r>
-    </w:p>
-    <w:p>
-      <w:pPr>
-        <w:pStyle w:val="FirstParagraph"/>
-      </w:pPr>
-      <w:r>
-        <w:t xml:space="preserve">Right-click each class ▸</w:t>
-      </w:r>
-      <w:r>
-        <w:t xml:space="preserve"> </w:t>
-      </w:r>
-      <w:r>
-        <w:rPr>
-          <w:rStyle w:val="VerbatimChar"/>
-        </w:rPr>
-        <w:t xml:space="preserve">Add ▸ Constructor</w:t>
-      </w:r>
-      <w:r>
-        <w:t xml:space="preserve"> </w:t>
-      </w:r>
-      <w:r>
-        <w:t xml:space="preserve">(</w:t>
-      </w:r>
-      <w:r>
-        <w:rPr>
-          <w:rStyle w:val="VerbatimChar"/>
-        </w:rPr>
-        <w:t xml:space="preserve">Ctrl+Shift+U</w:t>
-      </w:r>
-      <w:r>
-        <w:t xml:space="preserve">). ClassBuilder</w:t>
-      </w:r>
-      <w:r>
-        <w:t xml:space="preserve"> </w:t>
-      </w:r>
-      <w:r>
-        <w:rPr>
-          <w:bCs/>
-          <w:b/>
-        </w:rPr>
-        <w:t xml:space="preserve">derives the argument list</w:t>
-      </w:r>
-      <w:r>
-        <w:t xml:space="preserve">:</w:t>
-      </w:r>
-      <w:r>
-        <w:t xml:space="preserve"> </w:t>
-      </w:r>
-      <w:r>
-        <w:rPr>
-          <w:rStyle w:val="VerbatimChar"/>
-        </w:rPr>
-        <w:t xml:space="preserve">Row</w:t>
-      </w:r>
-      <w:r>
-        <w:t xml:space="preserve">’s constructor automatically takes</w:t>
-      </w:r>
-      <w:r>
-        <w:t xml:space="preserve"> </w:t>
-      </w:r>
-      <w:r>
-        <w:rPr>
-          <w:rStyle w:val="VerbatimChar"/>
-        </w:rPr>
-        <w:t xml:space="preserve">(Matrix* pMatrix)</w:t>
-      </w:r>
-      <w:r>
-        <w:t xml:space="preserve"> </w:t>
-      </w:r>
-      <w:r>
-        <w:t xml:space="preserve">— the owner — plus whatever you add (here:</w:t>
-      </w:r>
-      <w:r>
-        <w:t xml:space="preserve"> </w:t>
-      </w:r>
-      <w:r>
-        <w:rPr>
-          <w:rStyle w:val="VerbatimChar"/>
-        </w:rPr>
-        <w:t xml:space="preserve">int id</w:t>
-      </w:r>
-      <w:r>
-        <w:t xml:space="preserve">). The generated body begins with</w:t>
-      </w:r>
-      <w:r>
-        <w:t xml:space="preserve"> </w:t>
-      </w:r>
-      <w:r>
-        <w:rPr>
-          <w:rStyle w:val="VerbatimChar"/>
-        </w:rPr>
-        <w:t xml:space="preserve">ConstructorInclude(pMatrix)</w:t>
-      </w:r>
-      <w:r>
-        <w:t xml:space="preserve">, which splices the new Row into the matrix’s list; below the</w:t>
-      </w:r>
-      <w:r>
-        <w:t xml:space="preserve"> </w:t>
-      </w:r>
-      <w:r>
-        <w:rPr>
-          <w:rStyle w:val="VerbatimChar"/>
-        </w:rPr>
-        <w:t xml:space="preserve">// Put in your own code</w:t>
-      </w:r>
-      <w:r>
-        <w:t xml:space="preserve"> </w:t>
-      </w:r>
-      <w:r>
-        <w:t xml:space="preserve">marker the body is yours.</w:t>
-      </w:r>
-    </w:p>
-    <w:p>
-      <w:pPr>
-        <w:pStyle w:val="BodyText"/>
-      </w:pPr>
-      <w:r>
-        <w:t xml:space="preserve">Give</w:t>
-      </w:r>
-      <w:r>
-        <w:t xml:space="preserve"> </w:t>
-      </w:r>
-      <w:r>
-        <w:rPr>
-          <w:rStyle w:val="VerbatimChar"/>
-        </w:rPr>
-        <w:t xml:space="preserve">Row</w:t>
-      </w:r>
-      <w:r>
-        <w:t xml:space="preserve"> </w:t>
-      </w:r>
-      <w:r>
-        <w:t xml:space="preserve">this body (the code editor auto-indents C++). It walks the matrix’s Columns and creates one Cell per column — using a</w:t>
-      </w:r>
-      <w:r>
-        <w:t xml:space="preserve"> </w:t>
-      </w:r>
-      <w:r>
-        <w:rPr>
-          <w:bCs/>
-          <w:b/>
-        </w:rPr>
-        <w:t xml:space="preserve">generated iterator</w:t>
-      </w:r>
-      <w:r>
-        <w:t xml:space="preserve">:</w:t>
-      </w:r>
-    </w:p>
-    <w:p>
-      <w:pPr>
-        <w:pStyle w:val="SourceCode"/>
-      </w:pPr>
-      <w:r>
-        <w:rPr>
-          <w:rStyle w:val="NormalTok"/>
-        </w:rPr>
-        <w:t xml:space="preserve">Matrix</w:t>
-      </w:r>
-      <w:r>
-        <w:rPr>
-          <w:rStyle w:val="OperatorTok"/>
-        </w:rPr>
-        <w:t xml:space="preserve">::</w:t>
-      </w:r>
-      <w:r>
-        <w:rPr>
-          <w:rStyle w:val="NormalTok"/>
-        </w:rPr>
-        <w:t xml:space="preserve">ColumnIterator iColumn</w:t>
-      </w:r>
-      <w:r>
-        <w:rPr>
-          <w:rStyle w:val="OperatorTok"/>
-        </w:rPr>
-        <w:t xml:space="preserve">(</w:t>
-      </w:r>
-      <w:r>
-        <w:rPr>
-          <w:rStyle w:val="NormalTok"/>
-        </w:rPr>
-        <w:t xml:space="preserve">pMatrix</w:t>
-      </w:r>
-      <w:r>
-        <w:rPr>
-          <w:rStyle w:val="OperatorTok"/>
-        </w:rPr>
-        <w:t xml:space="preserve">);</w:t>
-      </w:r>
-      <w:r>
-        <w:br/>
-      </w:r>
-      <w:r>
-        <w:rPr>
-          <w:rStyle w:val="ControlFlowTok"/>
-        </w:rPr>
-        <w:t xml:space="preserve">while</w:t>
-      </w:r>
-      <w:r>
-        <w:rPr>
-          <w:rStyle w:val="NormalTok"/>
-        </w:rPr>
-        <w:t xml:space="preserve"> </w:t>
-      </w:r>
-      <w:r>
-        <w:rPr>
-          <w:rStyle w:val="OperatorTok"/>
-        </w:rPr>
-        <w:t xml:space="preserve">(++</w:t>
-      </w:r>
-      <w:r>
-        <w:rPr>
-          <w:rStyle w:val="NormalTok"/>
-        </w:rPr>
-        <w:t xml:space="preserve">iColumn</w:t>
-      </w:r>
-      <w:r>
-        <w:rPr>
-          <w:rStyle w:val="OperatorTok"/>
-        </w:rPr>
-        <w:t xml:space="preserve">)</w:t>
-      </w:r>
-      <w:r>
-        <w:br/>
-      </w:r>
-      <w:r>
-        <w:rPr>
-          <w:rStyle w:val="OperatorTok"/>
-        </w:rPr>
-        <w:t xml:space="preserve">{</w:t>
-      </w:r>
-      <w:r>
-        <w:br/>
-      </w:r>
-      <w:r>
-        <w:rPr>
-          <w:rStyle w:val="NormalTok"/>
-        </w:rPr>
-        <w:t xml:space="preserve">    </w:t>
-      </w:r>
-      <w:r>
-        <w:rPr>
-          <w:rStyle w:val="OperatorTok"/>
-        </w:rPr>
-        <w:t xml:space="preserve">(</w:t>
-      </w:r>
-      <w:r>
-        <w:rPr>
-          <w:rStyle w:val="DataTypeTok"/>
-        </w:rPr>
-        <w:t xml:space="preserve">void</w:t>
-      </w:r>
-      <w:r>
-        <w:rPr>
-          <w:rStyle w:val="OperatorTok"/>
-        </w:rPr>
-        <w:t xml:space="preserve">)</w:t>
-      </w:r>
-      <w:r>
-        <w:rPr>
-          <w:rStyle w:val="KeywordTok"/>
-        </w:rPr>
-        <w:t xml:space="preserve">new</w:t>
-      </w:r>
-      <w:r>
-        <w:rPr>
-          <w:rStyle w:val="NormalTok"/>
-        </w:rPr>
-        <w:t xml:space="preserve"> Cell</w:t>
-      </w:r>
-      <w:r>
-        <w:rPr>
-          <w:rStyle w:val="OperatorTok"/>
-        </w:rPr>
-        <w:t xml:space="preserve">(</w:t>
-      </w:r>
-      <w:r>
-        <w:rPr>
-          <w:rStyle w:val="KeywordTok"/>
-        </w:rPr>
-        <w:t xml:space="preserve">this</w:t>
-      </w:r>
-      <w:r>
-        <w:rPr>
-          <w:rStyle w:val="OperatorTok"/>
-        </w:rPr>
-        <w:t xml:space="preserve">,</w:t>
-      </w:r>
-      <w:r>
-        <w:rPr>
-          <w:rStyle w:val="NormalTok"/>
-        </w:rPr>
-        <w:t xml:space="preserve"> iColumn</w:t>
-      </w:r>
-      <w:r>
-        <w:rPr>
-          <w:rStyle w:val="OperatorTok"/>
-        </w:rPr>
-        <w:t xml:space="preserve">,</w:t>
-      </w:r>
-      <w:r>
-        <w:rPr>
-          <w:rStyle w:val="NormalTok"/>
-        </w:rPr>
-        <w:t xml:space="preserve"> </w:t>
-      </w:r>
-      <w:r>
-        <w:rPr>
-          <w:rStyle w:val="StringTok"/>
-        </w:rPr>
-        <w:t xml:space="preserve">""</w:t>
-      </w:r>
-      <w:r>
-        <w:rPr>
-          <w:rStyle w:val="OperatorTok"/>
-        </w:rPr>
-        <w:t xml:space="preserve">);</w:t>
-      </w:r>
-      <w:r>
-        <w:br/>
-      </w:r>
-      <w:r>
-        <w:rPr>
-          <w:rStyle w:val="OperatorTok"/>
-        </w:rPr>
-        <w:t xml:space="preserve">}</w:t>
-      </w:r>
-    </w:p>
-    <w:p>
-      <w:pPr>
-        <w:pStyle w:val="FirstParagraph"/>
-      </w:pPr>
-      <w:r>
-        <w:rPr>
-          <w:rStyle w:val="VerbatimChar"/>
-        </w:rPr>
-        <w:t xml:space="preserve">Column</w:t>
-      </w:r>
-      <w:r>
-        <w:t xml:space="preserve">’s constructor mirrors it (one Cell per existing Row) — the symmetry means Rows and Columns can be added in any order later and the cell grid stays complete.</w:t>
-      </w:r>
-      <w:r>
-        <w:t xml:space="preserve"> </w:t>
-      </w:r>
-      <w:r>
-        <w:rPr>
-          <w:rStyle w:val="VerbatimChar"/>
-        </w:rPr>
-        <w:t xml:space="preserve">Cell</w:t>
-      </w:r>
-      <w:r>
-        <w:t xml:space="preserve">’s constructor just takes its two owners plus the value; its</w:t>
-      </w:r>
-      <w:r>
-        <w:t xml:space="preserve"> </w:t>
-      </w:r>
-      <w:r>
-        <w:rPr>
-          <w:rStyle w:val="VerbatimChar"/>
-        </w:rPr>
-        <w:t xml:space="preserve">ConstructorInclude(pRow, pColumn)</w:t>
-      </w:r>
-      <w:r>
-        <w:t xml:space="preserve"> </w:t>
-      </w:r>
-      <w:r>
-        <w:t xml:space="preserve">splices it into</w:t>
-      </w:r>
-      <w:r>
-        <w:t xml:space="preserve"> </w:t>
-      </w:r>
-      <w:r>
-        <w:rPr>
-          <w:bCs/>
-          <w:b/>
-        </w:rPr>
-        <w:t xml:space="preserve">both</w:t>
-      </w:r>
-      <w:r>
-        <w:t xml:space="preserve"> </w:t>
-      </w:r>
-      <w:r>
-        <w:t xml:space="preserve">lists.</w:t>
-      </w:r>
-      <w:r>
-        <w:t xml:space="preserve"> </w:t>
-      </w:r>
-      <w:r>
-        <w:rPr>
-          <w:rStyle w:val="VerbatimChar"/>
-        </w:rPr>
-        <w:t xml:space="preserve">Matrix(int rows, int columns)</w:t>
-      </w:r>
-      <w:r>
-        <w:t xml:space="preserve"> </w:t>
-      </w:r>
-      <w:r>
-        <w:t xml:space="preserve">creates the grid:</w:t>
-      </w:r>
-    </w:p>
-    <w:p>
-      <w:pPr>
-        <w:pStyle w:val="SourceCode"/>
-      </w:pPr>
-      <w:r>
-        <w:rPr>
-          <w:rStyle w:val="NormalTok"/>
-        </w:rPr>
-        <w:t xml:space="preserve">_version </w:t>
-      </w:r>
-      <w:r>
-        <w:rPr>
-          <w:rStyle w:val="OperatorTok"/>
-        </w:rPr>
-        <w:t xml:space="preserve">=</w:t>
-      </w:r>
-      <w:r>
-        <w:rPr>
-          <w:rStyle w:val="NormalTok"/>
-        </w:rPr>
-        <w:t xml:space="preserve"> </w:t>
-      </w:r>
-      <w:r>
-        <w:rPr>
-          <w:rStyle w:val="DecValTok"/>
-        </w:rPr>
-        <w:t xml:space="preserve">2</w:t>
-      </w:r>
-      <w:r>
-        <w:rPr>
-          <w:rStyle w:val="OperatorTok"/>
-        </w:rPr>
-        <w:t xml:space="preserve">;</w:t>
-      </w:r>
-      <w:r>
-        <w:rPr>
-          <w:rStyle w:val="NormalTok"/>
-        </w:rPr>
-        <w:t xml:space="preserve">    </w:t>
-      </w:r>
-      <w:r>
-        <w:rPr>
-          <w:rStyle w:val="CommentTok"/>
-        </w:rPr>
-        <w:t xml:space="preserve">// model version written into every save (chapter 13)</w:t>
-      </w:r>
-      <w:r>
-        <w:br/>
-      </w:r>
-      <w:r>
-        <w:br/>
-      </w:r>
-      <w:r>
-        <w:rPr>
-          <w:rStyle w:val="ControlFlowTok"/>
-        </w:rPr>
-        <w:t xml:space="preserve">for</w:t>
-      </w:r>
-      <w:r>
-        <w:rPr>
-          <w:rStyle w:val="NormalTok"/>
-        </w:rPr>
-        <w:t xml:space="preserve"> </w:t>
-      </w:r>
-      <w:r>
-        <w:rPr>
-          <w:rStyle w:val="OperatorTok"/>
-        </w:rPr>
-        <w:t xml:space="preserve">(</w:t>
-      </w:r>
-      <w:r>
-        <w:rPr>
-          <w:rStyle w:val="DataTypeTok"/>
-        </w:rPr>
-        <w:t xml:space="preserve">int</w:t>
-      </w:r>
-      <w:r>
-        <w:rPr>
-          <w:rStyle w:val="NormalTok"/>
-        </w:rPr>
-        <w:t xml:space="preserve"> c </w:t>
-      </w:r>
-      <w:r>
-        <w:rPr>
-          <w:rStyle w:val="OperatorTok"/>
-        </w:rPr>
-        <w:t xml:space="preserve">=</w:t>
-      </w:r>
-      <w:r>
-        <w:rPr>
-          <w:rStyle w:val="NormalTok"/>
-        </w:rPr>
-        <w:t xml:space="preserve"> </w:t>
-      </w:r>
-      <w:r>
-        <w:rPr>
-          <w:rStyle w:val="DecValTok"/>
-        </w:rPr>
-        <w:t xml:space="preserve">0</w:t>
-      </w:r>
-      <w:r>
-        <w:rPr>
-          <w:rStyle w:val="OperatorTok"/>
-        </w:rPr>
-        <w:t xml:space="preserve">;</w:t>
-      </w:r>
-      <w:r>
-        <w:rPr>
-          <w:rStyle w:val="NormalTok"/>
-        </w:rPr>
-        <w:t xml:space="preserve"> c </w:t>
-      </w:r>
-      <w:r>
-        <w:rPr>
-          <w:rStyle w:val="OperatorTok"/>
-        </w:rPr>
-        <w:t xml:space="preserve">&lt;</w:t>
-      </w:r>
-      <w:r>
-        <w:rPr>
-          <w:rStyle w:val="NormalTok"/>
-        </w:rPr>
-        <w:t xml:space="preserve"> columns</w:t>
-      </w:r>
-      <w:r>
-        <w:rPr>
-          <w:rStyle w:val="OperatorTok"/>
-        </w:rPr>
-        <w:t xml:space="preserve">;</w:t>
-      </w:r>
-      <w:r>
-        <w:rPr>
-          <w:rStyle w:val="NormalTok"/>
-        </w:rPr>
-        <w:t xml:space="preserve"> c</w:t>
-      </w:r>
-      <w:r>
-        <w:rPr>
-          <w:rStyle w:val="OperatorTok"/>
-        </w:rPr>
-        <w:t xml:space="preserve">++)</w:t>
-      </w:r>
-      <w:r>
-        <w:br/>
-      </w:r>
-      <w:r>
-        <w:rPr>
-          <w:rStyle w:val="OperatorTok"/>
-        </w:rPr>
-        <w:t xml:space="preserve">{</w:t>
-      </w:r>
-      <w:r>
-        <w:br/>
-      </w:r>
-      <w:r>
-        <w:rPr>
-          <w:rStyle w:val="NormalTok"/>
-        </w:rPr>
-        <w:t xml:space="preserve">    </w:t>
-      </w:r>
-      <w:r>
-        <w:rPr>
-          <w:rStyle w:val="OperatorTok"/>
-        </w:rPr>
-        <w:t xml:space="preserve">(</w:t>
-      </w:r>
-      <w:r>
-        <w:rPr>
-          <w:rStyle w:val="DataTypeTok"/>
-        </w:rPr>
-        <w:t xml:space="preserve">void</w:t>
-      </w:r>
-      <w:r>
-        <w:rPr>
-          <w:rStyle w:val="OperatorTok"/>
-        </w:rPr>
-        <w:t xml:space="preserve">)</w:t>
-      </w:r>
-      <w:r>
-        <w:rPr>
-          <w:rStyle w:val="KeywordTok"/>
-        </w:rPr>
-        <w:t xml:space="preserve">new</w:t>
-      </w:r>
-      <w:r>
-        <w:rPr>
-          <w:rStyle w:val="NormalTok"/>
-        </w:rPr>
-        <w:t xml:space="preserve"> Column</w:t>
-      </w:r>
-      <w:r>
-        <w:rPr>
-          <w:rStyle w:val="OperatorTok"/>
-        </w:rPr>
-        <w:t xml:space="preserve">(</w:t>
-      </w:r>
-      <w:r>
-        <w:rPr>
-          <w:rStyle w:val="KeywordTok"/>
-        </w:rPr>
-        <w:t xml:space="preserve">this</w:t>
-      </w:r>
-      <w:r>
-        <w:rPr>
-          <w:rStyle w:val="OperatorTok"/>
-        </w:rPr>
-        <w:t xml:space="preserve">,</w:t>
-      </w:r>
-      <w:r>
-        <w:rPr>
-          <w:rStyle w:val="NormalTok"/>
-        </w:rPr>
-        <w:t xml:space="preserve"> c</w:t>
-      </w:r>
-      <w:r>
-        <w:rPr>
-          <w:rStyle w:val="OperatorTok"/>
-        </w:rPr>
-        <w:t xml:space="preserve">);</w:t>
-      </w:r>
-      <w:r>
-        <w:br/>
-      </w:r>
-      <w:r>
-        <w:rPr>
-          <w:rStyle w:val="OperatorTok"/>
-        </w:rPr>
-        <w:t xml:space="preserve">}</w:t>
-      </w:r>
-      <w:r>
-        <w:br/>
-      </w:r>
-      <w:r>
-        <w:br/>
-      </w:r>
-      <w:r>
-        <w:rPr>
-          <w:rStyle w:val="ControlFlowTok"/>
-        </w:rPr>
-        <w:t xml:space="preserve">for</w:t>
-      </w:r>
-      <w:r>
-        <w:rPr>
-          <w:rStyle w:val="NormalTok"/>
-        </w:rPr>
-        <w:t xml:space="preserve"> </w:t>
-      </w:r>
-      <w:r>
-        <w:rPr>
-          <w:rStyle w:val="OperatorTok"/>
-        </w:rPr>
-        <w:t xml:space="preserve">(</w:t>
-      </w:r>
-      <w:r>
-        <w:rPr>
-          <w:rStyle w:val="DataTypeTok"/>
-        </w:rPr>
-        <w:t xml:space="preserve">int</w:t>
-      </w:r>
-      <w:r>
-        <w:rPr>
-          <w:rStyle w:val="NormalTok"/>
-        </w:rPr>
-        <w:t xml:space="preserve"> r </w:t>
-      </w:r>
-      <w:r>
-        <w:rPr>
-          <w:rStyle w:val="OperatorTok"/>
-        </w:rPr>
-        <w:t xml:space="preserve">=</w:t>
-      </w:r>
-      <w:r>
-        <w:rPr>
-          <w:rStyle w:val="NormalTok"/>
-        </w:rPr>
-        <w:t xml:space="preserve"> </w:t>
-      </w:r>
-      <w:r>
-        <w:rPr>
-          <w:rStyle w:val="DecValTok"/>
-        </w:rPr>
-        <w:t xml:space="preserve">0</w:t>
-      </w:r>
-      <w:r>
-        <w:rPr>
-          <w:rStyle w:val="OperatorTok"/>
-        </w:rPr>
-        <w:t xml:space="preserve">;</w:t>
-      </w:r>
-      <w:r>
-        <w:rPr>
-          <w:rStyle w:val="NormalTok"/>
-        </w:rPr>
-        <w:t xml:space="preserve"> r </w:t>
-      </w:r>
-      <w:r>
-        <w:rPr>
-          <w:rStyle w:val="OperatorTok"/>
-        </w:rPr>
-        <w:t xml:space="preserve">&lt;</w:t>
-      </w:r>
-      <w:r>
-        <w:rPr>
-          <w:rStyle w:val="NormalTok"/>
-        </w:rPr>
-        <w:t xml:space="preserve"> rows</w:t>
-      </w:r>
-      <w:r>
-        <w:rPr>
-          <w:rStyle w:val="OperatorTok"/>
-        </w:rPr>
-        <w:t xml:space="preserve">;</w:t>
-      </w:r>
-      <w:r>
-        <w:rPr>
-          <w:rStyle w:val="NormalTok"/>
-        </w:rPr>
-        <w:t xml:space="preserve"> r</w:t>
-      </w:r>
-      <w:r>
-        <w:rPr>
-          <w:rStyle w:val="OperatorTok"/>
-        </w:rPr>
-        <w:t xml:space="preserve">++)</w:t>
-      </w:r>
-      <w:r>
-        <w:br/>
-      </w:r>
-      <w:r>
-        <w:rPr>
-          <w:rStyle w:val="OperatorTok"/>
-        </w:rPr>
-        <w:t xml:space="preserve">{</w:t>
-      </w:r>
-      <w:r>
-        <w:br/>
-      </w:r>
-      <w:r>
-        <w:rPr>
-          <w:rStyle w:val="NormalTok"/>
-        </w:rPr>
-        <w:t xml:space="preserve">    </w:t>
-      </w:r>
-      <w:r>
-        <w:rPr>
-          <w:rStyle w:val="OperatorTok"/>
-        </w:rPr>
-        <w:t xml:space="preserve">(</w:t>
-      </w:r>
-      <w:r>
-        <w:rPr>
-          <w:rStyle w:val="DataTypeTok"/>
-        </w:rPr>
-        <w:t xml:space="preserve">void</w:t>
-      </w:r>
-      <w:r>
-        <w:rPr>
-          <w:rStyle w:val="OperatorTok"/>
-        </w:rPr>
-        <w:t xml:space="preserve">)</w:t>
-      </w:r>
-      <w:r>
-        <w:rPr>
-          <w:rStyle w:val="KeywordTok"/>
-        </w:rPr>
-        <w:t xml:space="preserve">new</w:t>
-      </w:r>
-      <w:r>
-        <w:rPr>
-          <w:rStyle w:val="NormalTok"/>
-        </w:rPr>
-        <w:t xml:space="preserve"> Row</w:t>
-      </w:r>
-      <w:r>
-        <w:rPr>
-          <w:rStyle w:val="OperatorTok"/>
-        </w:rPr>
-        <w:t xml:space="preserve">(</w:t>
-      </w:r>
-      <w:r>
-        <w:rPr>
-          <w:rStyle w:val="KeywordTok"/>
-        </w:rPr>
-        <w:t xml:space="preserve">this</w:t>
-      </w:r>
-      <w:r>
-        <w:rPr>
-          <w:rStyle w:val="OperatorTok"/>
-        </w:rPr>
-        <w:t xml:space="preserve">,</w:t>
-      </w:r>
-      <w:r>
-        <w:rPr>
-          <w:rStyle w:val="NormalTok"/>
-        </w:rPr>
-        <w:t xml:space="preserve"> r</w:t>
-      </w:r>
-      <w:r>
-        <w:rPr>
-          <w:rStyle w:val="OperatorTok"/>
-        </w:rPr>
-        <w:t xml:space="preserve">);</w:t>
-      </w:r>
-      <w:r>
-        <w:br/>
-      </w:r>
-      <w:r>
-        <w:rPr>
-          <w:rStyle w:val="OperatorTok"/>
-        </w:rPr>
-        <w:t xml:space="preserve">}</w:t>
-      </w:r>
-    </w:p>
-    <w:p>
-      <w:pPr>
-        <w:pStyle w:val="FirstParagraph"/>
-      </w:pPr>
-      <w:r>
-        <w:t xml:space="preserve">Note what is</w:t>
-      </w:r>
-      <w:r>
-        <w:t xml:space="preserve"> </w:t>
-      </w:r>
-      <w:r>
-        <w:rPr>
-          <w:iCs/>
-          <w:i/>
-        </w:rPr>
-        <w:t xml:space="preserve">absent</w:t>
-      </w:r>
-      <w:r>
-        <w:t xml:space="preserve">: no container declarations, no push_back, no bookkeeping. Creating an object with its owner as argument</w:t>
-      </w:r>
-      <w:r>
-        <w:t xml:space="preserve"> </w:t>
-      </w:r>
-      <w:r>
-        <w:rPr>
-          <w:bCs/>
-          <w:b/>
-        </w:rPr>
-        <w:t xml:space="preserve">is</w:t>
-      </w:r>
-      <w:r>
-        <w:t xml:space="preserve"> </w:t>
-      </w:r>
-      <w:r>
-        <w:t xml:space="preserve">the insertion.</w:t>
-      </w:r>
-    </w:p>
-    <w:bookmarkEnd w:id="48"/>
-    <w:bookmarkStart w:id="49" w:name="step-6-a-find-method"/>
-    <w:p>
-      <w:pPr>
-        <w:pStyle w:val="Heading2"/>
-      </w:pPr>
-      <w:r>
-        <w:t xml:space="preserve">Step 6 — a find method</w:t>
-      </w:r>
-    </w:p>
-    <w:p>
-      <w:pPr>
-        <w:pStyle w:val="FirstParagraph"/>
-      </w:pPr>
-      <w:r>
-        <w:t xml:space="preserve">Right-click the</w:t>
-      </w:r>
-      <w:r>
-        <w:t xml:space="preserve"> </w:t>
-      </w:r>
-      <w:r>
-        <w:rPr>
-          <w:rStyle w:val="VerbatimChar"/>
-        </w:rPr>
-        <w:t xml:space="preserve">Matrix→Row</w:t>
-      </w:r>
-      <w:r>
-        <w:t xml:space="preserve"> </w:t>
-      </w:r>
-      <w:r>
-        <w:t xml:space="preserve">relation ▸ add a</w:t>
-      </w:r>
-      <w:r>
-        <w:t xml:space="preserve"> </w:t>
-      </w:r>
-      <w:r>
-        <w:rPr>
-          <w:bCs/>
-          <w:b/>
-        </w:rPr>
-        <w:t xml:space="preserve">Find Method</w:t>
-      </w:r>
-      <w:r>
-        <w:t xml:space="preserve"> </w:t>
-      </w:r>
-      <w:r>
-        <w:t xml:space="preserve">on member</w:t>
-      </w:r>
-      <w:r>
-        <w:t xml:space="preserve"> </w:t>
-      </w:r>
-      <w:r>
-        <w:rPr>
-          <w:rStyle w:val="VerbatimChar"/>
-        </w:rPr>
-        <w:t xml:space="preserve">id</w:t>
-      </w:r>
-      <w:r>
-        <w:t xml:space="preserve">. The generated</w:t>
-      </w:r>
-      <w:r>
-        <w:t xml:space="preserve"> </w:t>
-      </w:r>
-      <w:r>
-        <w:rPr>
-          <w:rStyle w:val="VerbatimChar"/>
-        </w:rPr>
-        <w:t xml:space="preserve">FindRow(int id)</w:t>
-      </w:r>
-      <w:r>
-        <w:t xml:space="preserve"> </w:t>
-      </w:r>
-      <w:r>
-        <w:t xml:space="preserve">iterates the relation and compares — and if the relation used a tree implementation, the same dialog generates the fast tree lookup instead (chapter 12.7):</w:t>
-      </w:r>
-    </w:p>
-    <w:p>
-      <w:pPr>
-        <w:pStyle w:val="SourceCode"/>
-      </w:pPr>
-      <w:r>
-        <w:rPr>
-          <w:rStyle w:val="NormalTok"/>
-        </w:rPr>
-        <w:t xml:space="preserve">Row</w:t>
-      </w:r>
-      <w:r>
-        <w:rPr>
-          <w:rStyle w:val="OperatorTok"/>
-        </w:rPr>
-        <w:t xml:space="preserve">*</w:t>
-      </w:r>
-      <w:r>
-        <w:rPr>
-          <w:rStyle w:val="NormalTok"/>
-        </w:rPr>
-        <w:t xml:space="preserve"> Matrix</w:t>
-      </w:r>
-      <w:r>
-        <w:rPr>
-          <w:rStyle w:val="OperatorTok"/>
-        </w:rPr>
-        <w:t xml:space="preserve">::</w:t>
-      </w:r>
-      <w:r>
-        <w:rPr>
-          <w:rStyle w:val="NormalTok"/>
-        </w:rPr>
-        <w:t xml:space="preserve">FindRow</w:t>
-      </w:r>
-      <w:r>
-        <w:rPr>
-          <w:rStyle w:val="OperatorTok"/>
-        </w:rPr>
-        <w:t xml:space="preserve">(</w:t>
-      </w:r>
-      <w:r>
-        <w:rPr>
-          <w:rStyle w:val="DataTypeTok"/>
-        </w:rPr>
-        <w:t xml:space="preserve">int</w:t>
-      </w:r>
-      <w:r>
-        <w:rPr>
-          <w:rStyle w:val="NormalTok"/>
-        </w:rPr>
-        <w:t xml:space="preserve"> id</w:t>
-      </w:r>
-      <w:r>
-        <w:rPr>
-          <w:rStyle w:val="OperatorTok"/>
-        </w:rPr>
-        <w:t xml:space="preserve">)</w:t>
-      </w:r>
-      <w:r>
-        <w:br/>
-      </w:r>
-      <w:r>
-        <w:rPr>
-          <w:rStyle w:val="OperatorTok"/>
-        </w:rPr>
-        <w:t xml:space="preserve">{</w:t>
-      </w:r>
-      <w:r>
-        <w:rPr>
-          <w:rStyle w:val="CommentTok"/>
-        </w:rPr>
-        <w:t xml:space="preserve">//@CODE_3308</w:t>
-      </w:r>
-      <w:r>
-        <w:br/>
-      </w:r>
-      <w:r>
-        <w:rPr>
-          <w:rStyle w:val="NormalTok"/>
-        </w:rPr>
-        <w:t xml:space="preserve">    RowIterator iRow</w:t>
-      </w:r>
-      <w:r>
-        <w:rPr>
-          <w:rStyle w:val="OperatorTok"/>
-        </w:rPr>
-        <w:t xml:space="preserve">(</w:t>
-      </w:r>
-      <w:r>
-        <w:rPr>
-          <w:rStyle w:val="KeywordTok"/>
-        </w:rPr>
-        <w:t xml:space="preserve">this</w:t>
-      </w:r>
-      <w:r>
-        <w:rPr>
-          <w:rStyle w:val="OperatorTok"/>
-        </w:rPr>
-        <w:t xml:space="preserve">);</w:t>
-      </w:r>
-      <w:r>
-        <w:br/>
-      </w:r>
-      <w:r>
-        <w:rPr>
-          <w:rStyle w:val="NormalTok"/>
-        </w:rPr>
-        <w:t xml:space="preserve">    </w:t>
-      </w:r>
-      <w:r>
-        <w:rPr>
-          <w:rStyle w:val="ControlFlowTok"/>
-        </w:rPr>
-        <w:t xml:space="preserve">while</w:t>
-      </w:r>
-      <w:r>
-        <w:rPr>
-          <w:rStyle w:val="NormalTok"/>
-        </w:rPr>
-        <w:t xml:space="preserve"> </w:t>
-      </w:r>
-      <w:r>
-        <w:rPr>
-          <w:rStyle w:val="OperatorTok"/>
-        </w:rPr>
-        <w:t xml:space="preserve">(++</w:t>
-      </w:r>
-      <w:r>
-        <w:rPr>
-          <w:rStyle w:val="NormalTok"/>
-        </w:rPr>
-        <w:t xml:space="preserve">iRow</w:t>
-      </w:r>
-      <w:r>
-        <w:rPr>
-          <w:rStyle w:val="OperatorTok"/>
-        </w:rPr>
-        <w:t xml:space="preserve">)</w:t>
-      </w:r>
-      <w:r>
-        <w:br/>
-      </w:r>
-      <w:r>
-        <w:rPr>
-          <w:rStyle w:val="NormalTok"/>
-        </w:rPr>
-        <w:t xml:space="preserve">    </w:t>
-      </w:r>
-      <w:r>
-        <w:rPr>
-          <w:rStyle w:val="OperatorTok"/>
-        </w:rPr>
-        <w:t xml:space="preserve">{</w:t>
-      </w:r>
-      <w:r>
-        <w:br/>
-      </w:r>
-      <w:r>
-        <w:rPr>
-          <w:rStyle w:val="NormalTok"/>
-        </w:rPr>
-        <w:t xml:space="preserve">        </w:t>
-      </w:r>
-      <w:r>
-        <w:rPr>
-          <w:rStyle w:val="ControlFlowTok"/>
-        </w:rPr>
-        <w:t xml:space="preserve">if</w:t>
-      </w:r>
-      <w:r>
-        <w:rPr>
-          <w:rStyle w:val="NormalTok"/>
-        </w:rPr>
-        <w:t xml:space="preserve"> </w:t>
-      </w:r>
-      <w:r>
-        <w:rPr>
-          <w:rStyle w:val="OperatorTok"/>
-        </w:rPr>
-        <w:t xml:space="preserve">(</w:t>
-      </w:r>
-      <w:r>
-        <w:rPr>
-          <w:rStyle w:val="NormalTok"/>
-        </w:rPr>
-        <w:t xml:space="preserve">id </w:t>
-      </w:r>
-      <w:r>
-        <w:rPr>
-          <w:rStyle w:val="OperatorTok"/>
-        </w:rPr>
-        <w:t xml:space="preserve">==</w:t>
-      </w:r>
-      <w:r>
-        <w:rPr>
-          <w:rStyle w:val="NormalTok"/>
-        </w:rPr>
-        <w:t xml:space="preserve"> iRow</w:t>
-      </w:r>
-      <w:r>
-        <w:rPr>
-          <w:rStyle w:val="OperatorTok"/>
-        </w:rPr>
-        <w:t xml:space="preserve">-&gt;</w:t>
-      </w:r>
-      <w:r>
-        <w:rPr>
-          <w:rStyle w:val="NormalTok"/>
-        </w:rPr>
-        <w:t xml:space="preserve">GetId</w:t>
-      </w:r>
-      <w:r>
-        <w:rPr>
-          <w:rStyle w:val="OperatorTok"/>
-        </w:rPr>
-        <w:t xml:space="preserve">())</w:t>
-      </w:r>
-      <w:r>
-        <w:br/>
-      </w:r>
-      <w:r>
-        <w:rPr>
-          <w:rStyle w:val="NormalTok"/>
-        </w:rPr>
-        <w:t xml:space="preserve">        </w:t>
-      </w:r>
-      <w:r>
-        <w:rPr>
-          <w:rStyle w:val="OperatorTok"/>
-        </w:rPr>
-        <w:t xml:space="preserve">{</w:t>
-      </w:r>
-      <w:r>
-        <w:br/>
-      </w:r>
-      <w:r>
-        <w:rPr>
-          <w:rStyle w:val="NormalTok"/>
-        </w:rPr>
-        <w:t xml:space="preserve">            </w:t>
-      </w:r>
-      <w:r>
-        <w:rPr>
-          <w:rStyle w:val="ControlFlowTok"/>
-        </w:rPr>
-        <w:t xml:space="preserve">return</w:t>
-      </w:r>
-      <w:r>
-        <w:rPr>
-          <w:rStyle w:val="NormalTok"/>
-        </w:rPr>
-        <w:t xml:space="preserve"> iRow</w:t>
-      </w:r>
-      <w:r>
-        <w:rPr>
-          <w:rStyle w:val="OperatorTok"/>
-        </w:rPr>
-        <w:t xml:space="preserve">;</w:t>
-      </w:r>
-      <w:r>
-        <w:br/>
-      </w:r>
-      <w:r>
-        <w:rPr>
-          <w:rStyle w:val="NormalTok"/>
-        </w:rPr>
-        <w:t xml:space="preserve">        </w:t>
-      </w:r>
-      <w:r>
-        <w:rPr>
-          <w:rStyle w:val="OperatorTok"/>
-        </w:rPr>
-        <w:t xml:space="preserve">}</w:t>
-      </w:r>
-      <w:r>
-        <w:br/>
-      </w:r>
-      <w:r>
-        <w:rPr>
-          <w:rStyle w:val="NormalTok"/>
-        </w:rPr>
-        <w:t xml:space="preserve">    </w:t>
-      </w:r>
-      <w:r>
-        <w:rPr>
-          <w:rStyle w:val="OperatorTok"/>
-        </w:rPr>
-        <w:t xml:space="preserve">}</w:t>
-      </w:r>
-      <w:r>
-        <w:br/>
-      </w:r>
-      <w:r>
-        <w:br/>
-      </w:r>
-      <w:r>
-        <w:rPr>
-          <w:rStyle w:val="NormalTok"/>
-        </w:rPr>
-        <w:t xml:space="preserve">    </w:t>
-      </w:r>
-      <w:r>
-        <w:rPr>
-          <w:rStyle w:val="ControlFlowTok"/>
-        </w:rPr>
-        <w:t xml:space="preserve">return</w:t>
-      </w:r>
-      <w:r>
-        <w:rPr>
-          <w:rStyle w:val="NormalTok"/>
-        </w:rPr>
-        <w:t xml:space="preserve"> </w:t>
-      </w:r>
-      <w:r>
-        <w:rPr>
-          <w:rStyle w:val="DecValTok"/>
-        </w:rPr>
-        <w:t xml:space="preserve">0</w:t>
-      </w:r>
-      <w:r>
-        <w:rPr>
-          <w:rStyle w:val="OperatorTok"/>
-        </w:rPr>
-        <w:t xml:space="preserve">;</w:t>
-      </w:r>
-      <w:r>
-        <w:br/>
-      </w:r>
-      <w:r>
-        <w:rPr>
-          <w:rStyle w:val="OperatorTok"/>
-        </w:rPr>
-        <w:t xml:space="preserve">}</w:t>
-      </w:r>
-      <w:r>
-        <w:rPr>
-          <w:rStyle w:val="CommentTok"/>
-        </w:rPr>
-        <w:t xml:space="preserve">//@CODE_3308</w:t>
-      </w:r>
-    </w:p>
-    <w:bookmarkEnd w:id="49"/>
-    <w:bookmarkStart w:id="57" w:name="step-7-a-class-diagram"/>
-    <w:p>
-      <w:pPr>
-        <w:pStyle w:val="Heading2"/>
-      </w:pPr>
-      <w:r>
-        <w:t xml:space="preserve">Step 7 — a class diagram</w:t>
-      </w:r>
-    </w:p>
-    <w:p>
-      <w:pPr>
-        <w:pStyle w:val="FirstParagraph"/>
-      </w:pPr>
-      <w:r>
-        <w:t xml:space="preserve">Right-click the model node ▸</w:t>
-      </w:r>
-      <w:r>
-        <w:t xml:space="preserve"> </w:t>
-      </w:r>
-      <w:r>
-        <w:rPr>
-          <w:rStyle w:val="VerbatimChar"/>
-        </w:rPr>
-        <w:t xml:space="preserve">Add ▸ Class Diagram</w:t>
-      </w:r>
-      <w:r>
-        <w:t xml:space="preserve">, name it</w:t>
-      </w:r>
-      <w:r>
-        <w:t xml:space="preserve"> </w:t>
-      </w:r>
-      <w:r>
-        <w:rPr>
-          <w:iCs/>
-          <w:i/>
-        </w:rPr>
-        <w:t xml:space="preserve">Matrix Overview</w:t>
-      </w:r>
-      <w:r>
-        <w:t xml:space="preserve">, and add the four classes (</w:t>
-      </w:r>
-      <w:r>
-        <w:rPr>
-          <w:rStyle w:val="VerbatimChar"/>
-        </w:rPr>
-        <w:t xml:space="preserve">Select Classes...</w:t>
-      </w:r>
-      <w:r>
-        <w:t xml:space="preserve"> </w:t>
-      </w:r>
-      <w:r>
-        <w:t xml:space="preserve">from the diagram’s context menu, or drag them from the tree).</w:t>
-      </w:r>
-      <w:r>
-        <w:t xml:space="preserve"> </w:t>
-      </w:r>
-      <w:r>
-        <w:rPr>
-          <w:rStyle w:val="VerbatimChar"/>
-        </w:rPr>
-        <w:t xml:space="preserve">Optimize Placement</w:t>
-      </w:r>
-      <w:r>
-        <w:t xml:space="preserve"> </w:t>
-      </w:r>
-      <w:r>
-        <w:t xml:space="preserve">lays them out.</w:t>
-      </w:r>
-    </w:p>
-    <w:p>
-      <w:pPr>
         <w:pStyle w:val="CaptionedFigure"/>
       </w:pPr>
       <w:r>
         <w:drawing>
           <wp:inline>
-            <wp:extent cx="5334000" cy="3212933"/>
+            <wp:extent cx="5184435" cy="5069603"/>
             <wp:effectExtent b="0" l="0" r="0" t="0"/>
-            <wp:docPr descr="The Matrix Overview class diagram as exported by ClassBuilder (Export SVG). Diamonds mark owned (aggregation) relations; 1/* are the multiplicities." title="" id="51" name="Picture"/>
+            <wp:docPr descr="A relation: kind, ownership, thread-safety, and container implementation are all declared here — the code is generated." title="" id="51" name="Picture"/>
             <a:graphic>
               <a:graphicData uri="http://schemas.openxmlformats.org/drawingml/2006/picture">
                 <pic:pic>
                   <pic:nvPicPr>
-                    <pic:cNvPr descr="images/cd-matrix-overview.svg" id="52" name="Picture"/>
+                    <pic:cNvPr descr="images/Row_Cell.png" id="52" name="Picture"/>
                     <pic:cNvPicPr>
                       <a:picLocks noChangeArrowheads="1" noChangeAspect="1"/>
                     </pic:cNvPicPr>
                   </pic:nvPicPr>
                   <pic:blipFill>
-                    <a:blip r:embed="rId53">
+                    <a:blip r:embed="rId50"/>
+                    <a:stretch>
+                      <a:fillRect/>
+                    </a:stretch>
+                  </pic:blipFill>
+                  <pic:spPr bwMode="auto">
+                    <a:xfrm>
+                      <a:off x="0" y="0"/>
+                      <a:ext cx="5184435" cy="5069603"/>
+                    </a:xfrm>
+                    <a:prstGeom prst="rect">
+                      <a:avLst/>
+                    </a:prstGeom>
+                    <a:noFill/>
+                    <a:ln w="9525">
+                      <a:noFill/>
+                      <a:headEnd/>
+                      <a:tailEnd/>
+                    </a:ln>
+                  </pic:spPr>
+                </pic:pic>
+              </a:graphicData>
+            </a:graphic>
+          </wp:inline>
+        </w:drawing>
+      </w:r>
+    </w:p>
+    <w:p>
+      <w:pPr>
+        <w:pStyle w:val="ImageCaption"/>
+      </w:pPr>
+      <w:r>
+        <w:t xml:space="preserve">A relation: kind, ownership, thread-safety, and container implementation are all declared here — the code is generated.</w:t>
+      </w:r>
+    </w:p>
+    <w:bookmarkEnd w:id="53"/>
+    <w:bookmarkStart w:id="54" w:name="X267736c760e32dc6d865ac46fc2c6b29b8f25a5"/>
+    <w:p>
+      <w:pPr>
+        <w:pStyle w:val="Heading2"/>
+      </w:pPr>
+      <w:r>
+        <w:t xml:space="preserve">Step 5 — constructors, with real code in the bodies</w:t>
+      </w:r>
+    </w:p>
+    <w:p>
+      <w:pPr>
+        <w:pStyle w:val="FirstParagraph"/>
+      </w:pPr>
+      <w:r>
+        <w:t xml:space="preserve">Right-click each class ▸</w:t>
+      </w:r>
+      <w:r>
+        <w:t xml:space="preserve"> </w:t>
+      </w:r>
+      <w:r>
+        <w:rPr>
+          <w:rStyle w:val="VerbatimChar"/>
+        </w:rPr>
+        <w:t xml:space="preserve">Add ▸ Constructor</w:t>
+      </w:r>
+      <w:r>
+        <w:t xml:space="preserve"> </w:t>
+      </w:r>
+      <w:r>
+        <w:t xml:space="preserve">(</w:t>
+      </w:r>
+      <w:r>
+        <w:rPr>
+          <w:rStyle w:val="VerbatimChar"/>
+        </w:rPr>
+        <w:t xml:space="preserve">Ctrl+Shift+U</w:t>
+      </w:r>
+      <w:r>
+        <w:t xml:space="preserve">). ClassBuilder</w:t>
+      </w:r>
+      <w:r>
+        <w:t xml:space="preserve"> </w:t>
+      </w:r>
+      <w:r>
+        <w:rPr>
+          <w:bCs/>
+          <w:b/>
+        </w:rPr>
+        <w:t xml:space="preserve">derives the argument list</w:t>
+      </w:r>
+      <w:r>
+        <w:t xml:space="preserve">:</w:t>
+      </w:r>
+      <w:r>
+        <w:t xml:space="preserve"> </w:t>
+      </w:r>
+      <w:r>
+        <w:rPr>
+          <w:rStyle w:val="VerbatimChar"/>
+        </w:rPr>
+        <w:t xml:space="preserve">Row</w:t>
+      </w:r>
+      <w:r>
+        <w:t xml:space="preserve">’s constructor automatically takes</w:t>
+      </w:r>
+      <w:r>
+        <w:t xml:space="preserve"> </w:t>
+      </w:r>
+      <w:r>
+        <w:rPr>
+          <w:rStyle w:val="VerbatimChar"/>
+        </w:rPr>
+        <w:t xml:space="preserve">(Matrix* pMatrix)</w:t>
+      </w:r>
+      <w:r>
+        <w:t xml:space="preserve"> </w:t>
+      </w:r>
+      <w:r>
+        <w:t xml:space="preserve">— the owner — plus whatever you add (here:</w:t>
+      </w:r>
+      <w:r>
+        <w:t xml:space="preserve"> </w:t>
+      </w:r>
+      <w:r>
+        <w:rPr>
+          <w:rStyle w:val="VerbatimChar"/>
+        </w:rPr>
+        <w:t xml:space="preserve">int id</w:t>
+      </w:r>
+      <w:r>
+        <w:t xml:space="preserve">). The generated body begins with</w:t>
+      </w:r>
+      <w:r>
+        <w:t xml:space="preserve"> </w:t>
+      </w:r>
+      <w:r>
+        <w:rPr>
+          <w:rStyle w:val="VerbatimChar"/>
+        </w:rPr>
+        <w:t xml:space="preserve">ConstructorInclude(pMatrix)</w:t>
+      </w:r>
+      <w:r>
+        <w:t xml:space="preserve">, which splices the new Row into the matrix’s list; below the</w:t>
+      </w:r>
+      <w:r>
+        <w:t xml:space="preserve"> </w:t>
+      </w:r>
+      <w:r>
+        <w:rPr>
+          <w:rStyle w:val="VerbatimChar"/>
+        </w:rPr>
+        <w:t xml:space="preserve">// Put in your own code</w:t>
+      </w:r>
+      <w:r>
+        <w:t xml:space="preserve"> </w:t>
+      </w:r>
+      <w:r>
+        <w:t xml:space="preserve">marker the body is yours.</w:t>
+      </w:r>
+    </w:p>
+    <w:p>
+      <w:pPr>
+        <w:pStyle w:val="BodyText"/>
+      </w:pPr>
+      <w:r>
+        <w:t xml:space="preserve">Give</w:t>
+      </w:r>
+      <w:r>
+        <w:t xml:space="preserve"> </w:t>
+      </w:r>
+      <w:r>
+        <w:rPr>
+          <w:rStyle w:val="VerbatimChar"/>
+        </w:rPr>
+        <w:t xml:space="preserve">Row</w:t>
+      </w:r>
+      <w:r>
+        <w:t xml:space="preserve"> </w:t>
+      </w:r>
+      <w:r>
+        <w:t xml:space="preserve">this body (the code editor auto-indents C++). It walks the matrix’s Columns and creates one Cell per column — using a</w:t>
+      </w:r>
+      <w:r>
+        <w:t xml:space="preserve"> </w:t>
+      </w:r>
+      <w:r>
+        <w:rPr>
+          <w:bCs/>
+          <w:b/>
+        </w:rPr>
+        <w:t xml:space="preserve">generated iterator</w:t>
+      </w:r>
+      <w:r>
+        <w:t xml:space="preserve">:</w:t>
+      </w:r>
+    </w:p>
+    <w:p>
+      <w:pPr>
+        <w:pStyle w:val="SourceCode"/>
+      </w:pPr>
+      <w:r>
+        <w:rPr>
+          <w:rStyle w:val="NormalTok"/>
+        </w:rPr>
+        <w:t xml:space="preserve">Matrix</w:t>
+      </w:r>
+      <w:r>
+        <w:rPr>
+          <w:rStyle w:val="OperatorTok"/>
+        </w:rPr>
+        <w:t xml:space="preserve">::</w:t>
+      </w:r>
+      <w:r>
+        <w:rPr>
+          <w:rStyle w:val="NormalTok"/>
+        </w:rPr>
+        <w:t xml:space="preserve">ColumnIterator iColumn</w:t>
+      </w:r>
+      <w:r>
+        <w:rPr>
+          <w:rStyle w:val="OperatorTok"/>
+        </w:rPr>
+        <w:t xml:space="preserve">(</w:t>
+      </w:r>
+      <w:r>
+        <w:rPr>
+          <w:rStyle w:val="NormalTok"/>
+        </w:rPr>
+        <w:t xml:space="preserve">pMatrix</w:t>
+      </w:r>
+      <w:r>
+        <w:rPr>
+          <w:rStyle w:val="OperatorTok"/>
+        </w:rPr>
+        <w:t xml:space="preserve">);</w:t>
+      </w:r>
+      <w:r>
+        <w:br/>
+      </w:r>
+      <w:r>
+        <w:rPr>
+          <w:rStyle w:val="ControlFlowTok"/>
+        </w:rPr>
+        <w:t xml:space="preserve">while</w:t>
+      </w:r>
+      <w:r>
+        <w:rPr>
+          <w:rStyle w:val="NormalTok"/>
+        </w:rPr>
+        <w:t xml:space="preserve"> </w:t>
+      </w:r>
+      <w:r>
+        <w:rPr>
+          <w:rStyle w:val="OperatorTok"/>
+        </w:rPr>
+        <w:t xml:space="preserve">(++</w:t>
+      </w:r>
+      <w:r>
+        <w:rPr>
+          <w:rStyle w:val="NormalTok"/>
+        </w:rPr>
+        <w:t xml:space="preserve">iColumn</w:t>
+      </w:r>
+      <w:r>
+        <w:rPr>
+          <w:rStyle w:val="OperatorTok"/>
+        </w:rPr>
+        <w:t xml:space="preserve">)</w:t>
+      </w:r>
+      <w:r>
+        <w:br/>
+      </w:r>
+      <w:r>
+        <w:rPr>
+          <w:rStyle w:val="OperatorTok"/>
+        </w:rPr>
+        <w:t xml:space="preserve">{</w:t>
+      </w:r>
+      <w:r>
+        <w:br/>
+      </w:r>
+      <w:r>
+        <w:rPr>
+          <w:rStyle w:val="NormalTok"/>
+        </w:rPr>
+        <w:t xml:space="preserve">    </w:t>
+      </w:r>
+      <w:r>
+        <w:rPr>
+          <w:rStyle w:val="OperatorTok"/>
+        </w:rPr>
+        <w:t xml:space="preserve">(</w:t>
+      </w:r>
+      <w:r>
+        <w:rPr>
+          <w:rStyle w:val="DataTypeTok"/>
+        </w:rPr>
+        <w:t xml:space="preserve">void</w:t>
+      </w:r>
+      <w:r>
+        <w:rPr>
+          <w:rStyle w:val="OperatorTok"/>
+        </w:rPr>
+        <w:t xml:space="preserve">)</w:t>
+      </w:r>
+      <w:r>
+        <w:rPr>
+          <w:rStyle w:val="KeywordTok"/>
+        </w:rPr>
+        <w:t xml:space="preserve">new</w:t>
+      </w:r>
+      <w:r>
+        <w:rPr>
+          <w:rStyle w:val="NormalTok"/>
+        </w:rPr>
+        <w:t xml:space="preserve"> Cell</w:t>
+      </w:r>
+      <w:r>
+        <w:rPr>
+          <w:rStyle w:val="OperatorTok"/>
+        </w:rPr>
+        <w:t xml:space="preserve">(</w:t>
+      </w:r>
+      <w:r>
+        <w:rPr>
+          <w:rStyle w:val="KeywordTok"/>
+        </w:rPr>
+        <w:t xml:space="preserve">this</w:t>
+      </w:r>
+      <w:r>
+        <w:rPr>
+          <w:rStyle w:val="OperatorTok"/>
+        </w:rPr>
+        <w:t xml:space="preserve">,</w:t>
+      </w:r>
+      <w:r>
+        <w:rPr>
+          <w:rStyle w:val="NormalTok"/>
+        </w:rPr>
+        <w:t xml:space="preserve"> iColumn</w:t>
+      </w:r>
+      <w:r>
+        <w:rPr>
+          <w:rStyle w:val="OperatorTok"/>
+        </w:rPr>
+        <w:t xml:space="preserve">,</w:t>
+      </w:r>
+      <w:r>
+        <w:rPr>
+          <w:rStyle w:val="NormalTok"/>
+        </w:rPr>
+        <w:t xml:space="preserve"> </w:t>
+      </w:r>
+      <w:r>
+        <w:rPr>
+          <w:rStyle w:val="StringTok"/>
+        </w:rPr>
+        <w:t xml:space="preserve">""</w:t>
+      </w:r>
+      <w:r>
+        <w:rPr>
+          <w:rStyle w:val="OperatorTok"/>
+        </w:rPr>
+        <w:t xml:space="preserve">);</w:t>
+      </w:r>
+      <w:r>
+        <w:br/>
+      </w:r>
+      <w:r>
+        <w:rPr>
+          <w:rStyle w:val="OperatorTok"/>
+        </w:rPr>
+        <w:t xml:space="preserve">}</w:t>
+      </w:r>
+    </w:p>
+    <w:p>
+      <w:pPr>
+        <w:pStyle w:val="FirstParagraph"/>
+      </w:pPr>
+      <w:r>
+        <w:rPr>
+          <w:rStyle w:val="VerbatimChar"/>
+        </w:rPr>
+        <w:t xml:space="preserve">Column</w:t>
+      </w:r>
+      <w:r>
+        <w:t xml:space="preserve">’s constructor mirrors it (one Cell per existing Row) — the symmetry means Rows and Columns can be added in any order later and the cell grid stays complete.</w:t>
+      </w:r>
+      <w:r>
+        <w:t xml:space="preserve"> </w:t>
+      </w:r>
+      <w:r>
+        <w:rPr>
+          <w:rStyle w:val="VerbatimChar"/>
+        </w:rPr>
+        <w:t xml:space="preserve">Cell</w:t>
+      </w:r>
+      <w:r>
+        <w:t xml:space="preserve">’s constructor just takes its two owners plus the value; its</w:t>
+      </w:r>
+      <w:r>
+        <w:t xml:space="preserve"> </w:t>
+      </w:r>
+      <w:r>
+        <w:rPr>
+          <w:rStyle w:val="VerbatimChar"/>
+        </w:rPr>
+        <w:t xml:space="preserve">ConstructorInclude(pRow, pColumn)</w:t>
+      </w:r>
+      <w:r>
+        <w:t xml:space="preserve"> </w:t>
+      </w:r>
+      <w:r>
+        <w:t xml:space="preserve">splices it into</w:t>
+      </w:r>
+      <w:r>
+        <w:t xml:space="preserve"> </w:t>
+      </w:r>
+      <w:r>
+        <w:rPr>
+          <w:bCs/>
+          <w:b/>
+        </w:rPr>
+        <w:t xml:space="preserve">both</w:t>
+      </w:r>
+      <w:r>
+        <w:t xml:space="preserve"> </w:t>
+      </w:r>
+      <w:r>
+        <w:t xml:space="preserve">lists. The constructor</w:t>
+      </w:r>
+      <w:r>
+        <w:t xml:space="preserve"> </w:t>
+      </w:r>
+      <w:r>
+        <w:rPr>
+          <w:rStyle w:val="VerbatimChar"/>
+        </w:rPr>
+        <w:t xml:space="preserve">Matrix(int rows, int columns)</w:t>
+      </w:r>
+      <w:r>
+        <w:t xml:space="preserve"> </w:t>
+      </w:r>
+      <w:r>
+        <w:t xml:space="preserve">creates the grid:</w:t>
+      </w:r>
+    </w:p>
+    <w:p>
+      <w:pPr>
+        <w:pStyle w:val="SourceCode"/>
+      </w:pPr>
+      <w:r>
+        <w:rPr>
+          <w:rStyle w:val="ControlFlowTok"/>
+        </w:rPr>
+        <w:t xml:space="preserve">for</w:t>
+      </w:r>
+      <w:r>
+        <w:rPr>
+          <w:rStyle w:val="NormalTok"/>
+        </w:rPr>
+        <w:t xml:space="preserve"> </w:t>
+      </w:r>
+      <w:r>
+        <w:rPr>
+          <w:rStyle w:val="OperatorTok"/>
+        </w:rPr>
+        <w:t xml:space="preserve">(</w:t>
+      </w:r>
+      <w:r>
+        <w:rPr>
+          <w:rStyle w:val="DataTypeTok"/>
+        </w:rPr>
+        <w:t xml:space="preserve">int</w:t>
+      </w:r>
+      <w:r>
+        <w:rPr>
+          <w:rStyle w:val="NormalTok"/>
+        </w:rPr>
+        <w:t xml:space="preserve"> c </w:t>
+      </w:r>
+      <w:r>
+        <w:rPr>
+          <w:rStyle w:val="OperatorTok"/>
+        </w:rPr>
+        <w:t xml:space="preserve">=</w:t>
+      </w:r>
+      <w:r>
+        <w:rPr>
+          <w:rStyle w:val="NormalTok"/>
+        </w:rPr>
+        <w:t xml:space="preserve"> </w:t>
+      </w:r>
+      <w:r>
+        <w:rPr>
+          <w:rStyle w:val="DecValTok"/>
+        </w:rPr>
+        <w:t xml:space="preserve">0</w:t>
+      </w:r>
+      <w:r>
+        <w:rPr>
+          <w:rStyle w:val="OperatorTok"/>
+        </w:rPr>
+        <w:t xml:space="preserve">;</w:t>
+      </w:r>
+      <w:r>
+        <w:rPr>
+          <w:rStyle w:val="NormalTok"/>
+        </w:rPr>
+        <w:t xml:space="preserve"> c </w:t>
+      </w:r>
+      <w:r>
+        <w:rPr>
+          <w:rStyle w:val="OperatorTok"/>
+        </w:rPr>
+        <w:t xml:space="preserve">&lt;</w:t>
+      </w:r>
+      <w:r>
+        <w:rPr>
+          <w:rStyle w:val="NormalTok"/>
+        </w:rPr>
+        <w:t xml:space="preserve"> columns</w:t>
+      </w:r>
+      <w:r>
+        <w:rPr>
+          <w:rStyle w:val="OperatorTok"/>
+        </w:rPr>
+        <w:t xml:space="preserve">;</w:t>
+      </w:r>
+      <w:r>
+        <w:rPr>
+          <w:rStyle w:val="NormalTok"/>
+        </w:rPr>
+        <w:t xml:space="preserve"> c</w:t>
+      </w:r>
+      <w:r>
+        <w:rPr>
+          <w:rStyle w:val="OperatorTok"/>
+        </w:rPr>
+        <w:t xml:space="preserve">++)</w:t>
+      </w:r>
+      <w:r>
+        <w:br/>
+      </w:r>
+      <w:r>
+        <w:rPr>
+          <w:rStyle w:val="OperatorTok"/>
+        </w:rPr>
+        <w:t xml:space="preserve">{</w:t>
+      </w:r>
+      <w:r>
+        <w:br/>
+      </w:r>
+      <w:r>
+        <w:rPr>
+          <w:rStyle w:val="NormalTok"/>
+        </w:rPr>
+        <w:t xml:space="preserve">    </w:t>
+      </w:r>
+      <w:r>
+        <w:rPr>
+          <w:rStyle w:val="OperatorTok"/>
+        </w:rPr>
+        <w:t xml:space="preserve">(</w:t>
+      </w:r>
+      <w:r>
+        <w:rPr>
+          <w:rStyle w:val="DataTypeTok"/>
+        </w:rPr>
+        <w:t xml:space="preserve">void</w:t>
+      </w:r>
+      <w:r>
+        <w:rPr>
+          <w:rStyle w:val="OperatorTok"/>
+        </w:rPr>
+        <w:t xml:space="preserve">)</w:t>
+      </w:r>
+      <w:r>
+        <w:rPr>
+          <w:rStyle w:val="KeywordTok"/>
+        </w:rPr>
+        <w:t xml:space="preserve">new</w:t>
+      </w:r>
+      <w:r>
+        <w:rPr>
+          <w:rStyle w:val="NormalTok"/>
+        </w:rPr>
+        <w:t xml:space="preserve"> Column</w:t>
+      </w:r>
+      <w:r>
+        <w:rPr>
+          <w:rStyle w:val="OperatorTok"/>
+        </w:rPr>
+        <w:t xml:space="preserve">(</w:t>
+      </w:r>
+      <w:r>
+        <w:rPr>
+          <w:rStyle w:val="KeywordTok"/>
+        </w:rPr>
+        <w:t xml:space="preserve">this</w:t>
+      </w:r>
+      <w:r>
+        <w:rPr>
+          <w:rStyle w:val="OperatorTok"/>
+        </w:rPr>
+        <w:t xml:space="preserve">,</w:t>
+      </w:r>
+      <w:r>
+        <w:rPr>
+          <w:rStyle w:val="NormalTok"/>
+        </w:rPr>
+        <w:t xml:space="preserve"> c</w:t>
+      </w:r>
+      <w:r>
+        <w:rPr>
+          <w:rStyle w:val="OperatorTok"/>
+        </w:rPr>
+        <w:t xml:space="preserve">);</w:t>
+      </w:r>
+      <w:r>
+        <w:br/>
+      </w:r>
+      <w:r>
+        <w:rPr>
+          <w:rStyle w:val="OperatorTok"/>
+        </w:rPr>
+        <w:t xml:space="preserve">}</w:t>
+      </w:r>
+      <w:r>
+        <w:br/>
+      </w:r>
+      <w:r>
+        <w:br/>
+      </w:r>
+      <w:r>
+        <w:rPr>
+          <w:rStyle w:val="ControlFlowTok"/>
+        </w:rPr>
+        <w:t xml:space="preserve">for</w:t>
+      </w:r>
+      <w:r>
+        <w:rPr>
+          <w:rStyle w:val="NormalTok"/>
+        </w:rPr>
+        <w:t xml:space="preserve"> </w:t>
+      </w:r>
+      <w:r>
+        <w:rPr>
+          <w:rStyle w:val="OperatorTok"/>
+        </w:rPr>
+        <w:t xml:space="preserve">(</w:t>
+      </w:r>
+      <w:r>
+        <w:rPr>
+          <w:rStyle w:val="DataTypeTok"/>
+        </w:rPr>
+        <w:t xml:space="preserve">int</w:t>
+      </w:r>
+      <w:r>
+        <w:rPr>
+          <w:rStyle w:val="NormalTok"/>
+        </w:rPr>
+        <w:t xml:space="preserve"> r </w:t>
+      </w:r>
+      <w:r>
+        <w:rPr>
+          <w:rStyle w:val="OperatorTok"/>
+        </w:rPr>
+        <w:t xml:space="preserve">=</w:t>
+      </w:r>
+      <w:r>
+        <w:rPr>
+          <w:rStyle w:val="NormalTok"/>
+        </w:rPr>
+        <w:t xml:space="preserve"> </w:t>
+      </w:r>
+      <w:r>
+        <w:rPr>
+          <w:rStyle w:val="DecValTok"/>
+        </w:rPr>
+        <w:t xml:space="preserve">0</w:t>
+      </w:r>
+      <w:r>
+        <w:rPr>
+          <w:rStyle w:val="OperatorTok"/>
+        </w:rPr>
+        <w:t xml:space="preserve">;</w:t>
+      </w:r>
+      <w:r>
+        <w:rPr>
+          <w:rStyle w:val="NormalTok"/>
+        </w:rPr>
+        <w:t xml:space="preserve"> r </w:t>
+      </w:r>
+      <w:r>
+        <w:rPr>
+          <w:rStyle w:val="OperatorTok"/>
+        </w:rPr>
+        <w:t xml:space="preserve">&lt;</w:t>
+      </w:r>
+      <w:r>
+        <w:rPr>
+          <w:rStyle w:val="NormalTok"/>
+        </w:rPr>
+        <w:t xml:space="preserve"> rows</w:t>
+      </w:r>
+      <w:r>
+        <w:rPr>
+          <w:rStyle w:val="OperatorTok"/>
+        </w:rPr>
+        <w:t xml:space="preserve">;</w:t>
+      </w:r>
+      <w:r>
+        <w:rPr>
+          <w:rStyle w:val="NormalTok"/>
+        </w:rPr>
+        <w:t xml:space="preserve"> r</w:t>
+      </w:r>
+      <w:r>
+        <w:rPr>
+          <w:rStyle w:val="OperatorTok"/>
+        </w:rPr>
+        <w:t xml:space="preserve">++)</w:t>
+      </w:r>
+      <w:r>
+        <w:br/>
+      </w:r>
+      <w:r>
+        <w:rPr>
+          <w:rStyle w:val="OperatorTok"/>
+        </w:rPr>
+        <w:t xml:space="preserve">{</w:t>
+      </w:r>
+      <w:r>
+        <w:br/>
+      </w:r>
+      <w:r>
+        <w:rPr>
+          <w:rStyle w:val="NormalTok"/>
+        </w:rPr>
+        <w:t xml:space="preserve">    </w:t>
+      </w:r>
+      <w:r>
+        <w:rPr>
+          <w:rStyle w:val="OperatorTok"/>
+        </w:rPr>
+        <w:t xml:space="preserve">(</w:t>
+      </w:r>
+      <w:r>
+        <w:rPr>
+          <w:rStyle w:val="DataTypeTok"/>
+        </w:rPr>
+        <w:t xml:space="preserve">void</w:t>
+      </w:r>
+      <w:r>
+        <w:rPr>
+          <w:rStyle w:val="OperatorTok"/>
+        </w:rPr>
+        <w:t xml:space="preserve">)</w:t>
+      </w:r>
+      <w:r>
+        <w:rPr>
+          <w:rStyle w:val="KeywordTok"/>
+        </w:rPr>
+        <w:t xml:space="preserve">new</w:t>
+      </w:r>
+      <w:r>
+        <w:rPr>
+          <w:rStyle w:val="NormalTok"/>
+        </w:rPr>
+        <w:t xml:space="preserve"> Row</w:t>
+      </w:r>
+      <w:r>
+        <w:rPr>
+          <w:rStyle w:val="OperatorTok"/>
+        </w:rPr>
+        <w:t xml:space="preserve">(</w:t>
+      </w:r>
+      <w:r>
+        <w:rPr>
+          <w:rStyle w:val="KeywordTok"/>
+        </w:rPr>
+        <w:t xml:space="preserve">this</w:t>
+      </w:r>
+      <w:r>
+        <w:rPr>
+          <w:rStyle w:val="OperatorTok"/>
+        </w:rPr>
+        <w:t xml:space="preserve">,</w:t>
+      </w:r>
+      <w:r>
+        <w:rPr>
+          <w:rStyle w:val="NormalTok"/>
+        </w:rPr>
+        <w:t xml:space="preserve"> r</w:t>
+      </w:r>
+      <w:r>
+        <w:rPr>
+          <w:rStyle w:val="OperatorTok"/>
+        </w:rPr>
+        <w:t xml:space="preserve">);</w:t>
+      </w:r>
+      <w:r>
+        <w:br/>
+      </w:r>
+      <w:r>
+        <w:rPr>
+          <w:rStyle w:val="OperatorTok"/>
+        </w:rPr>
+        <w:t xml:space="preserve">}</w:t>
+      </w:r>
+    </w:p>
+    <w:p>
+      <w:pPr>
+        <w:pStyle w:val="FirstParagraph"/>
+      </w:pPr>
+      <w:r>
+        <w:t xml:space="preserve">Note what is</w:t>
+      </w:r>
+      <w:r>
+        <w:t xml:space="preserve"> </w:t>
+      </w:r>
+      <w:r>
+        <w:rPr>
+          <w:iCs/>
+          <w:i/>
+        </w:rPr>
+        <w:t xml:space="preserve">absent</w:t>
+      </w:r>
+      <w:r>
+        <w:t xml:space="preserve">: no container declarations, no push_back, no bookkeeping. Creating an object with its owner as argument</w:t>
+      </w:r>
+      <w:r>
+        <w:t xml:space="preserve"> </w:t>
+      </w:r>
+      <w:r>
+        <w:rPr>
+          <w:bCs/>
+          <w:b/>
+        </w:rPr>
+        <w:t xml:space="preserve">is</w:t>
+      </w:r>
+      <w:r>
+        <w:t xml:space="preserve"> </w:t>
+      </w:r>
+      <w:r>
+        <w:t xml:space="preserve">the insertion.</w:t>
+      </w:r>
+    </w:p>
+    <w:bookmarkEnd w:id="54"/>
+    <w:bookmarkStart w:id="58" w:name="step-6-a-find-method"/>
+    <w:p>
+      <w:pPr>
+        <w:pStyle w:val="Heading2"/>
+      </w:pPr>
+      <w:r>
+        <w:t xml:space="preserve">Step 6 — a find method</w:t>
+      </w:r>
+    </w:p>
+    <w:p>
+      <w:pPr>
+        <w:pStyle w:val="FirstParagraph"/>
+      </w:pPr>
+      <w:r>
+        <w:t xml:space="preserve">Right-click the</w:t>
+      </w:r>
+      <w:r>
+        <w:t xml:space="preserve"> </w:t>
+      </w:r>
+      <w:r>
+        <w:rPr>
+          <w:rStyle w:val="VerbatimChar"/>
+        </w:rPr>
+        <w:t xml:space="preserve">Matrix→Row</w:t>
+      </w:r>
+      <w:r>
+        <w:t xml:space="preserve"> </w:t>
+      </w:r>
+      <w:r>
+        <w:t xml:space="preserve">relation ▸ add a</w:t>
+      </w:r>
+      <w:r>
+        <w:t xml:space="preserve"> </w:t>
+      </w:r>
+      <w:r>
+        <w:rPr>
+          <w:bCs/>
+          <w:b/>
+        </w:rPr>
+        <w:t xml:space="preserve">Find Method</w:t>
+      </w:r>
+      <w:r>
+        <w:t xml:space="preserve"> </w:t>
+      </w:r>
+      <w:r>
+        <w:t xml:space="preserve">on member</w:t>
+      </w:r>
+      <w:r>
+        <w:t xml:space="preserve"> </w:t>
+      </w:r>
+      <w:r>
+        <w:rPr>
+          <w:rStyle w:val="VerbatimChar"/>
+        </w:rPr>
+        <w:t xml:space="preserve">id</w:t>
+      </w:r>
+      <w:r>
+        <w:t xml:space="preserve">. The generated</w:t>
+      </w:r>
+      <w:r>
+        <w:t xml:space="preserve"> </w:t>
+      </w:r>
+      <w:r>
+        <w:rPr>
+          <w:rStyle w:val="VerbatimChar"/>
+        </w:rPr>
+        <w:t xml:space="preserve">FindRow(int id)</w:t>
+      </w:r>
+      <w:r>
+        <w:t xml:space="preserve"> </w:t>
+      </w:r>
+      <w:r>
+        <w:t xml:space="preserve">iterates the relation and compares — and if the relation used a tree implementation, the same dialog generates the fast tree lookup instead (chapter 12.7):</w:t>
+      </w:r>
+    </w:p>
+    <w:p>
+      <w:pPr>
+        <w:pStyle w:val="CaptionedFigure"/>
+      </w:pPr>
+      <w:r>
+        <w:drawing>
+          <wp:inline>
+            <wp:extent cx="5334000" cy="3365899"/>
+            <wp:effectExtent b="0" l="0" r="0" t="0"/>
+            <wp:docPr descr="The Find Method dialog on the Matrix→Row relation: the argument map on the left pairs the method’s arguments with the members to compare — here -&gt;GetId(). Behind it the generated Matrix::FindRow in its code window, and the method in the tree under the class’s Relation methods." title="" id="56" name="Picture"/>
+            <a:graphic>
+              <a:graphicData uri="http://schemas.openxmlformats.org/drawingml/2006/picture">
+                <pic:pic>
+                  <pic:nvPicPr>
+                    <pic:cNvPr descr="images/Matrix_Row_FindId.png" id="57" name="Picture"/>
+                    <pic:cNvPicPr>
+                      <a:picLocks noChangeArrowheads="1" noChangeAspect="1"/>
+                    </pic:cNvPicPr>
+                  </pic:nvPicPr>
+                  <pic:blipFill>
+                    <a:blip r:embed="rId55"/>
+                    <a:stretch>
+                      <a:fillRect/>
+                    </a:stretch>
+                  </pic:blipFill>
+                  <pic:spPr bwMode="auto">
+                    <a:xfrm>
+                      <a:off x="0" y="0"/>
+                      <a:ext cx="5334000" cy="3365899"/>
+                    </a:xfrm>
+                    <a:prstGeom prst="rect">
+                      <a:avLst/>
+                    </a:prstGeom>
+                    <a:noFill/>
+                    <a:ln w="9525">
+                      <a:noFill/>
+                      <a:headEnd/>
+                      <a:tailEnd/>
+                    </a:ln>
+                  </pic:spPr>
+                </pic:pic>
+              </a:graphicData>
+            </a:graphic>
+          </wp:inline>
+        </w:drawing>
+      </w:r>
+    </w:p>
+    <w:p>
+      <w:pPr>
+        <w:pStyle w:val="ImageCaption"/>
+      </w:pPr>
+      <w:r>
+        <w:t xml:space="preserve">The Find Method dialog on the Matrix→Row relation: the argument map on the left pairs the method’s arguments with the members to compare — here</w:t>
+      </w:r>
+      <w:r>
+        <w:t xml:space="preserve"> </w:t>
+      </w:r>
+      <w:r>
+        <w:rPr>
+          <w:rStyle w:val="VerbatimChar"/>
+        </w:rPr>
+        <w:t xml:space="preserve">-&gt;GetId()</w:t>
+      </w:r>
+      <w:r>
+        <w:t xml:space="preserve">. Behind it the generated</w:t>
+      </w:r>
+      <w:r>
+        <w:t xml:space="preserve"> </w:t>
+      </w:r>
+      <w:r>
+        <w:rPr>
+          <w:rStyle w:val="VerbatimChar"/>
+        </w:rPr>
+        <w:t xml:space="preserve">Matrix::FindRow</w:t>
+      </w:r>
+      <w:r>
+        <w:t xml:space="preserve"> </w:t>
+      </w:r>
+      <w:r>
+        <w:t xml:space="preserve">in its code window, and the method in the tree under the class’s Relation methods.</w:t>
+      </w:r>
+    </w:p>
+    <w:p>
+      <w:pPr>
+        <w:pStyle w:val="SourceCode"/>
+      </w:pPr>
+      <w:r>
+        <w:rPr>
+          <w:rStyle w:val="NormalTok"/>
+        </w:rPr>
+        <w:t xml:space="preserve">Row</w:t>
+      </w:r>
+      <w:r>
+        <w:rPr>
+          <w:rStyle w:val="OperatorTok"/>
+        </w:rPr>
+        <w:t xml:space="preserve">*</w:t>
+      </w:r>
+      <w:r>
+        <w:rPr>
+          <w:rStyle w:val="NormalTok"/>
+        </w:rPr>
+        <w:t xml:space="preserve"> Matrix</w:t>
+      </w:r>
+      <w:r>
+        <w:rPr>
+          <w:rStyle w:val="OperatorTok"/>
+        </w:rPr>
+        <w:t xml:space="preserve">::</w:t>
+      </w:r>
+      <w:r>
+        <w:rPr>
+          <w:rStyle w:val="NormalTok"/>
+        </w:rPr>
+        <w:t xml:space="preserve">FindRow</w:t>
+      </w:r>
+      <w:r>
+        <w:rPr>
+          <w:rStyle w:val="OperatorTok"/>
+        </w:rPr>
+        <w:t xml:space="preserve">(</w:t>
+      </w:r>
+      <w:r>
+        <w:rPr>
+          <w:rStyle w:val="DataTypeTok"/>
+        </w:rPr>
+        <w:t xml:space="preserve">int</w:t>
+      </w:r>
+      <w:r>
+        <w:rPr>
+          <w:rStyle w:val="NormalTok"/>
+        </w:rPr>
+        <w:t xml:space="preserve"> id</w:t>
+      </w:r>
+      <w:r>
+        <w:rPr>
+          <w:rStyle w:val="OperatorTok"/>
+        </w:rPr>
+        <w:t xml:space="preserve">)</w:t>
+      </w:r>
+      <w:r>
+        <w:br/>
+      </w:r>
+      <w:r>
+        <w:rPr>
+          <w:rStyle w:val="OperatorTok"/>
+        </w:rPr>
+        <w:t xml:space="preserve">{</w:t>
+      </w:r>
+      <w:r>
+        <w:rPr>
+          <w:rStyle w:val="CommentTok"/>
+        </w:rPr>
+        <w:t xml:space="preserve">//@CODE_3308</w:t>
+      </w:r>
+      <w:r>
+        <w:br/>
+      </w:r>
+      <w:r>
+        <w:rPr>
+          <w:rStyle w:val="NormalTok"/>
+        </w:rPr>
+        <w:t xml:space="preserve">    RowIterator iRow</w:t>
+      </w:r>
+      <w:r>
+        <w:rPr>
+          <w:rStyle w:val="OperatorTok"/>
+        </w:rPr>
+        <w:t xml:space="preserve">(</w:t>
+      </w:r>
+      <w:r>
+        <w:rPr>
+          <w:rStyle w:val="KeywordTok"/>
+        </w:rPr>
+        <w:t xml:space="preserve">this</w:t>
+      </w:r>
+      <w:r>
+        <w:rPr>
+          <w:rStyle w:val="OperatorTok"/>
+        </w:rPr>
+        <w:t xml:space="preserve">);</w:t>
+      </w:r>
+      <w:r>
+        <w:br/>
+      </w:r>
+      <w:r>
+        <w:rPr>
+          <w:rStyle w:val="NormalTok"/>
+        </w:rPr>
+        <w:t xml:space="preserve">    </w:t>
+      </w:r>
+      <w:r>
+        <w:rPr>
+          <w:rStyle w:val="ControlFlowTok"/>
+        </w:rPr>
+        <w:t xml:space="preserve">while</w:t>
+      </w:r>
+      <w:r>
+        <w:rPr>
+          <w:rStyle w:val="NormalTok"/>
+        </w:rPr>
+        <w:t xml:space="preserve"> </w:t>
+      </w:r>
+      <w:r>
+        <w:rPr>
+          <w:rStyle w:val="OperatorTok"/>
+        </w:rPr>
+        <w:t xml:space="preserve">(++</w:t>
+      </w:r>
+      <w:r>
+        <w:rPr>
+          <w:rStyle w:val="NormalTok"/>
+        </w:rPr>
+        <w:t xml:space="preserve">iRow</w:t>
+      </w:r>
+      <w:r>
+        <w:rPr>
+          <w:rStyle w:val="OperatorTok"/>
+        </w:rPr>
+        <w:t xml:space="preserve">)</w:t>
+      </w:r>
+      <w:r>
+        <w:br/>
+      </w:r>
+      <w:r>
+        <w:rPr>
+          <w:rStyle w:val="NormalTok"/>
+        </w:rPr>
+        <w:t xml:space="preserve">    </w:t>
+      </w:r>
+      <w:r>
+        <w:rPr>
+          <w:rStyle w:val="OperatorTok"/>
+        </w:rPr>
+        <w:t xml:space="preserve">{</w:t>
+      </w:r>
+      <w:r>
+        <w:br/>
+      </w:r>
+      <w:r>
+        <w:rPr>
+          <w:rStyle w:val="NormalTok"/>
+        </w:rPr>
+        <w:t xml:space="preserve">        </w:t>
+      </w:r>
+      <w:r>
+        <w:rPr>
+          <w:rStyle w:val="ControlFlowTok"/>
+        </w:rPr>
+        <w:t xml:space="preserve">if</w:t>
+      </w:r>
+      <w:r>
+        <w:rPr>
+          <w:rStyle w:val="NormalTok"/>
+        </w:rPr>
+        <w:t xml:space="preserve"> </w:t>
+      </w:r>
+      <w:r>
+        <w:rPr>
+          <w:rStyle w:val="OperatorTok"/>
+        </w:rPr>
+        <w:t xml:space="preserve">(</w:t>
+      </w:r>
+      <w:r>
+        <w:rPr>
+          <w:rStyle w:val="NormalTok"/>
+        </w:rPr>
+        <w:t xml:space="preserve">id </w:t>
+      </w:r>
+      <w:r>
+        <w:rPr>
+          <w:rStyle w:val="OperatorTok"/>
+        </w:rPr>
+        <w:t xml:space="preserve">==</w:t>
+      </w:r>
+      <w:r>
+        <w:rPr>
+          <w:rStyle w:val="NormalTok"/>
+        </w:rPr>
+        <w:t xml:space="preserve"> iRow</w:t>
+      </w:r>
+      <w:r>
+        <w:rPr>
+          <w:rStyle w:val="OperatorTok"/>
+        </w:rPr>
+        <w:t xml:space="preserve">-&gt;</w:t>
+      </w:r>
+      <w:r>
+        <w:rPr>
+          <w:rStyle w:val="NormalTok"/>
+        </w:rPr>
+        <w:t xml:space="preserve">GetId</w:t>
+      </w:r>
+      <w:r>
+        <w:rPr>
+          <w:rStyle w:val="OperatorTok"/>
+        </w:rPr>
+        <w:t xml:space="preserve">())</w:t>
+      </w:r>
+      <w:r>
+        <w:br/>
+      </w:r>
+      <w:r>
+        <w:rPr>
+          <w:rStyle w:val="NormalTok"/>
+        </w:rPr>
+        <w:t xml:space="preserve">        </w:t>
+      </w:r>
+      <w:r>
+        <w:rPr>
+          <w:rStyle w:val="OperatorTok"/>
+        </w:rPr>
+        <w:t xml:space="preserve">{</w:t>
+      </w:r>
+      <w:r>
+        <w:br/>
+      </w:r>
+      <w:r>
+        <w:rPr>
+          <w:rStyle w:val="NormalTok"/>
+        </w:rPr>
+        <w:t xml:space="preserve">            </w:t>
+      </w:r>
+      <w:r>
+        <w:rPr>
+          <w:rStyle w:val="ControlFlowTok"/>
+        </w:rPr>
+        <w:t xml:space="preserve">return</w:t>
+      </w:r>
+      <w:r>
+        <w:rPr>
+          <w:rStyle w:val="NormalTok"/>
+        </w:rPr>
+        <w:t xml:space="preserve"> iRow</w:t>
+      </w:r>
+      <w:r>
+        <w:rPr>
+          <w:rStyle w:val="OperatorTok"/>
+        </w:rPr>
+        <w:t xml:space="preserve">;</w:t>
+      </w:r>
+      <w:r>
+        <w:br/>
+      </w:r>
+      <w:r>
+        <w:rPr>
+          <w:rStyle w:val="NormalTok"/>
+        </w:rPr>
+        <w:t xml:space="preserve">        </w:t>
+      </w:r>
+      <w:r>
+        <w:rPr>
+          <w:rStyle w:val="OperatorTok"/>
+        </w:rPr>
+        <w:t xml:space="preserve">}</w:t>
+      </w:r>
+      <w:r>
+        <w:br/>
+      </w:r>
+      <w:r>
+        <w:rPr>
+          <w:rStyle w:val="NormalTok"/>
+        </w:rPr>
+        <w:t xml:space="preserve">    </w:t>
+      </w:r>
+      <w:r>
+        <w:rPr>
+          <w:rStyle w:val="OperatorTok"/>
+        </w:rPr>
+        <w:t xml:space="preserve">}</w:t>
+      </w:r>
+      <w:r>
+        <w:br/>
+      </w:r>
+      <w:r>
+        <w:br/>
+      </w:r>
+      <w:r>
+        <w:rPr>
+          <w:rStyle w:val="NormalTok"/>
+        </w:rPr>
+        <w:t xml:space="preserve">    </w:t>
+      </w:r>
+      <w:r>
+        <w:rPr>
+          <w:rStyle w:val="ControlFlowTok"/>
+        </w:rPr>
+        <w:t xml:space="preserve">return</w:t>
+      </w:r>
+      <w:r>
+        <w:rPr>
+          <w:rStyle w:val="NormalTok"/>
+        </w:rPr>
+        <w:t xml:space="preserve"> </w:t>
+      </w:r>
+      <w:r>
+        <w:rPr>
+          <w:rStyle w:val="DecValTok"/>
+        </w:rPr>
+        <w:t xml:space="preserve">0</w:t>
+      </w:r>
+      <w:r>
+        <w:rPr>
+          <w:rStyle w:val="OperatorTok"/>
+        </w:rPr>
+        <w:t xml:space="preserve">;</w:t>
+      </w:r>
+      <w:r>
+        <w:br/>
+      </w:r>
+      <w:r>
+        <w:rPr>
+          <w:rStyle w:val="OperatorTok"/>
+        </w:rPr>
+        <w:t xml:space="preserve">}</w:t>
+      </w:r>
+      <w:r>
+        <w:rPr>
+          <w:rStyle w:val="CommentTok"/>
+        </w:rPr>
+        <w:t xml:space="preserve">//@CODE_3308</w:t>
+      </w:r>
+    </w:p>
+    <w:bookmarkEnd w:id="58"/>
+    <w:bookmarkStart w:id="66" w:name="step-7-a-class-diagram"/>
+    <w:p>
+      <w:pPr>
+        <w:pStyle w:val="Heading2"/>
+      </w:pPr>
+      <w:r>
+        <w:t xml:space="preserve">Step 7 — a class diagram</w:t>
+      </w:r>
+    </w:p>
+    <w:p>
+      <w:pPr>
+        <w:pStyle w:val="FirstParagraph"/>
+      </w:pPr>
+      <w:r>
+        <w:t xml:space="preserve">Right-click the model node ▸</w:t>
+      </w:r>
+      <w:r>
+        <w:t xml:space="preserve"> </w:t>
+      </w:r>
+      <w:r>
+        <w:rPr>
+          <w:rStyle w:val="VerbatimChar"/>
+        </w:rPr>
+        <w:t xml:space="preserve">Add ▸ Class Diagram</w:t>
+      </w:r>
+      <w:r>
+        <w:t xml:space="preserve">, name it</w:t>
+      </w:r>
+      <w:r>
+        <w:t xml:space="preserve"> </w:t>
+      </w:r>
+      <w:r>
+        <w:rPr>
+          <w:iCs/>
+          <w:i/>
+        </w:rPr>
+        <w:t xml:space="preserve">Matrix Overview</w:t>
+      </w:r>
+      <w:r>
+        <w:t xml:space="preserve">, and add the four classes (</w:t>
+      </w:r>
+      <w:r>
+        <w:rPr>
+          <w:rStyle w:val="VerbatimChar"/>
+        </w:rPr>
+        <w:t xml:space="preserve">Select Classes...</w:t>
+      </w:r>
+      <w:r>
+        <w:t xml:space="preserve"> </w:t>
+      </w:r>
+      <w:r>
+        <w:t xml:space="preserve">from the diagram’s context menu, or drag them from the tree).</w:t>
+      </w:r>
+      <w:r>
+        <w:t xml:space="preserve"> </w:t>
+      </w:r>
+      <w:r>
+        <w:rPr>
+          <w:rStyle w:val="VerbatimChar"/>
+        </w:rPr>
+        <w:t xml:space="preserve">Optimize Placement</w:t>
+      </w:r>
+      <w:r>
+        <w:t xml:space="preserve"> </w:t>
+      </w:r>
+      <w:r>
+        <w:t xml:space="preserve">lays them out.</w:t>
+      </w:r>
+    </w:p>
+    <w:p>
+      <w:pPr>
+        <w:pStyle w:val="CaptionedFigure"/>
+      </w:pPr>
+      <w:r>
+        <w:drawing>
+          <wp:inline>
+            <wp:extent cx="5334000" cy="3212933"/>
+            <wp:effectExtent b="0" l="0" r="0" t="0"/>
+            <wp:docPr descr="The Matrix Overview class diagram as exported by ClassBuilder (Export SVG). Diamonds mark owned (aggregation) relations; 1/* are the multiplicities." title="" id="60" name="Picture"/>
+            <a:graphic>
+              <a:graphicData uri="http://schemas.openxmlformats.org/drawingml/2006/picture">
+                <pic:pic>
+                  <pic:nvPicPr>
+                    <pic:cNvPr descr="images/cd-matrix-overview.svg" id="61" name="Picture"/>
+                    <pic:cNvPicPr>
+                      <a:picLocks noChangeArrowheads="1" noChangeAspect="1"/>
+                    </pic:cNvPicPr>
+                  </pic:nvPicPr>
+                  <pic:blipFill>
+                    <a:blip r:embed="rId62">
                       <a:extLst>
                         <a:ext uri="{28A0092B-C50C-407E-A947-70E740481C1C}">
                           <a14:useLocalDpi xmlns:a14="http://schemas.microsoft.com/office/drawing/2010/main" val="0"/>
                         </a:ext>
                         <a:ext uri="{96DAC541-7B7A-43D3-8B79-37D633B846F1}">
-                          <asvg:svgBlip xmlns:asvg="http://schemas.microsoft.com/office/drawing/2016/SVG/main" r:embed="rId50"/>
+                          <asvg:svgBlip xmlns:asvg="http://schemas.microsoft.com/office/drawing/2016/SVG/main" r:embed="rId59"/>
                         </a:ext>
                       </a:extLst>
                     </a:blip>
@@ -5764,18 +5863,18 @@
           <wp:inline>
             <wp:extent cx="5334000" cy="3757996"/>
             <wp:effectExtent b="0" l="0" r="0" t="0"/>
-            <wp:docPr descr="A class-diagram view opens as a dockable window over the shell — dock it, tab it, or float it." title="" id="55" name="Picture"/>
+            <wp:docPr descr="A class-diagram view opens as a dockable window over the shell — dock it, tab it, or float it." title="" id="64" name="Picture"/>
             <a:graphic>
               <a:graphicData uri="http://schemas.openxmlformats.org/drawingml/2006/picture">
                 <pic:pic>
                   <pic:nvPicPr>
-                    <pic:cNvPr descr="images/cd-view.png" id="56" name="Picture"/>
+                    <pic:cNvPr descr="images/cd-view.png" id="65" name="Picture"/>
                     <pic:cNvPicPr>
                       <a:picLocks noChangeArrowheads="1" noChangeAspect="1"/>
                     </pic:cNvPicPr>
                   </pic:nvPicPr>
                   <pic:blipFill>
-                    <a:blip r:embed="rId54"/>
+                    <a:blip r:embed="rId63"/>
                     <a:stretch>
                       <a:fillRect/>
                     </a:stretch>
@@ -5810,8 +5909,8 @@
         <w:t xml:space="preserve">A class-diagram view opens as a dockable window over the shell — dock it, tab it, or float it.</w:t>
       </w:r>
     </w:p>
-    <w:bookmarkEnd w:id="57"/>
-    <w:bookmarkStart w:id="58" w:name="step-8-generate-the-source"/>
+    <w:bookmarkEnd w:id="66"/>
+    <w:bookmarkStart w:id="67" w:name="step-8-generate-the-source"/>
     <w:p>
       <w:pPr>
         <w:pStyle w:val="Heading2"/>
@@ -6922,8 +7021,8 @@
         <w:t xml:space="preserve">bodies (chapter 11 lists every editable region).</w:t>
       </w:r>
     </w:p>
-    <w:bookmarkEnd w:id="58"/>
-    <w:bookmarkStart w:id="59" w:name="step-9-compile-and-run"/>
+    <w:bookmarkEnd w:id="67"/>
+    <w:bookmarkStart w:id="68" w:name="step-9-compile-and-run"/>
     <w:p>
       <w:pPr>
         <w:pStyle w:val="Heading2"/>
@@ -8459,8 +8558,8 @@
         <w:t xml:space="preserve">— the loop just continued. The whole surviving structure round-tripped through a compressed binary file. That is the value proposition of ClassBuilder in eleven lines of console output.</w:t>
       </w:r>
     </w:p>
-    <w:bookmarkEnd w:id="59"/>
-    <w:bookmarkStart w:id="60" w:name="step-10-the-round-trip"/>
+    <w:bookmarkEnd w:id="68"/>
+    <w:bookmarkStart w:id="69" w:name="step-10-the-round-trip"/>
     <w:p>
       <w:pPr>
         <w:pStyle w:val="Heading2"/>
@@ -8533,9 +8632,9 @@
         <w:t xml:space="preserve">): the model absorbs your edit. If ClassBuilder itself has the file’s model open when the source changes, it offers the read-back automatically — accept it, or your next Write Source will overwrite the edit. Model ↔ source is a two-way street.</w:t>
       </w:r>
     </w:p>
-    <w:bookmarkEnd w:id="60"/>
-    <w:bookmarkEnd w:id="61"/>
-    <w:bookmarkStart w:id="66" w:name="reference-the-application-shell"/>
+    <w:bookmarkEnd w:id="69"/>
+    <w:bookmarkEnd w:id="70"/>
+    <w:bookmarkStart w:id="75" w:name="reference-the-application-shell"/>
     <w:p>
       <w:pPr>
         <w:pStyle w:val="Heading1"/>
@@ -8544,7 +8643,7 @@
         <w:t xml:space="preserve">Reference: the application shell</w:t>
       </w:r>
     </w:p>
-    <w:bookmarkStart w:id="62" w:name="menus"/>
+    <w:bookmarkStart w:id="71" w:name="menus"/>
     <w:p>
       <w:pPr>
         <w:pStyle w:val="Heading2"/>
@@ -8868,8 +8967,8 @@
         <w:t xml:space="preserve">enlarges the whole application — text, icons, dialogs — independently of the operating system’s display scaling: useful on a monitor whose system scaling you don’t want to change, or when ClassBuilder alone should be bigger. It is a per-machine setting (stored per user, not in the model) and takes effect after a restart — picking a scale offers to restart ClassBuilder right away. Not to be confused with the Zoom items, which magnify only the active diagram canvas.</w:t>
       </w:r>
     </w:p>
-    <w:bookmarkEnd w:id="62"/>
-    <w:bookmarkStart w:id="63" w:name="the-main-toolbar"/>
+    <w:bookmarkEnd w:id="71"/>
+    <w:bookmarkStart w:id="72" w:name="the-main-toolbar"/>
     <w:p>
       <w:pPr>
         <w:pStyle w:val="Heading2"/>
@@ -9196,8 +9295,8 @@
         <w:t xml:space="preserve">— cropped strip of the main window toolbar (New / Open / Save / Read Source / Write Source).</w:t>
       </w:r>
     </w:p>
-    <w:bookmarkEnd w:id="63"/>
-    <w:bookmarkStart w:id="64" w:name="docking"/>
+    <w:bookmarkEnd w:id="72"/>
+    <w:bookmarkStart w:id="73" w:name="docking"/>
     <w:p>
       <w:pPr>
         <w:pStyle w:val="Heading2"/>
@@ -9342,8 +9441,8 @@
         <w:t xml:space="preserve">Closing a model’s tab closes the model (with a save prompt when modified).</w:t>
       </w:r>
     </w:p>
-    <w:bookmarkEnd w:id="64"/>
-    <w:bookmarkStart w:id="65" w:name="platforms-and-keys"/>
+    <w:bookmarkEnd w:id="73"/>
+    <w:bookmarkStart w:id="74" w:name="platforms-and-keys"/>
     <w:p>
       <w:pPr>
         <w:pStyle w:val="Heading2"/>
@@ -9482,9 +9581,9 @@
         <w:t xml:space="preserve">shows Width/Height/X/Y of the shape under the cursor in diagram views.</w:t>
       </w:r>
     </w:p>
-    <w:bookmarkEnd w:id="65"/>
-    <w:bookmarkEnd w:id="66"/>
-    <w:bookmarkStart w:id="73" w:name="reference-the-main-tree-view"/>
+    <w:bookmarkEnd w:id="74"/>
+    <w:bookmarkEnd w:id="75"/>
+    <w:bookmarkStart w:id="82" w:name="reference-the-main-tree-view"/>
     <w:p>
       <w:pPr>
         <w:pStyle w:val="Heading1"/>
@@ -9501,7 +9600,7 @@
         <w:t xml:space="preserve">The tree is the master view of a model: every element of the model, shown in its structure. Several models can be open at the same time — each model’s tree gets its own tab in the main window — and like every other view it can also be split off or floated (chapter 5.3).</w:t>
       </w:r>
     </w:p>
-    <w:bookmarkStart w:id="67" w:name="what-the-tree-shows"/>
+    <w:bookmarkStart w:id="76" w:name="what-the-tree-shows"/>
     <w:p>
       <w:pPr>
         <w:pStyle w:val="Heading2"/>
@@ -9576,8 +9675,8 @@
         <w:t xml:space="preserve">in their own folder — visible but owned by the generator. Every node type has its own icon; with Phase Support on, a phase glyph joins it.</w:t>
       </w:r>
     </w:p>
-    <w:bookmarkEnd w:id="67"/>
-    <w:bookmarkStart w:id="68" w:name="the-tree-toolbar"/>
+    <w:bookmarkEnd w:id="76"/>
+    <w:bookmarkStart w:id="77" w:name="the-tree-toolbar"/>
     <w:p>
       <w:pPr>
         <w:pStyle w:val="Heading2"/>
@@ -10514,8 +10613,8 @@
         <w:t xml:space="preserve">set as fallback.</w:t>
       </w:r>
     </w:p>
-    <w:bookmarkEnd w:id="68"/>
-    <w:bookmarkStart w:id="69" w:name="the-context-menu"/>
+    <w:bookmarkEnd w:id="77"/>
+    <w:bookmarkStart w:id="78" w:name="the-context-menu"/>
     <w:p>
       <w:pPr>
         <w:pStyle w:val="Heading2"/>
@@ -10996,8 +11095,8 @@
         <w:t xml:space="preserve">node, with the Add submenu expanded.</w:t>
       </w:r>
     </w:p>
-    <w:bookmarkEnd w:id="69"/>
-    <w:bookmarkStart w:id="70" w:name="filters"/>
+    <w:bookmarkEnd w:id="78"/>
+    <w:bookmarkStart w:id="79" w:name="filters"/>
     <w:p>
       <w:pPr>
         <w:pStyle w:val="Heading2"/>
@@ -11090,8 +11189,8 @@
         <w:t xml:space="preserve">”</w:t>
       </w:r>
     </w:p>
-    <w:bookmarkEnd w:id="70"/>
-    <w:bookmarkStart w:id="71" w:name="delete-multiple"/>
+    <w:bookmarkEnd w:id="79"/>
+    <w:bookmarkStart w:id="80" w:name="delete-multiple"/>
     <w:p>
       <w:pPr>
         <w:pStyle w:val="Heading2"/>
@@ -11180,8 +11279,8 @@
         <w:t xml:space="preserve">”</w:t>
       </w:r>
     </w:p>
-    <w:bookmarkEnd w:id="71"/>
-    <w:bookmarkStart w:id="72" w:name="drag-and-copy-drag"/>
+    <w:bookmarkEnd w:id="80"/>
+    <w:bookmarkStart w:id="81" w:name="drag-and-copy-drag"/>
     <w:p>
       <w:pPr>
         <w:pStyle w:val="Heading2"/>
@@ -11465,9 +11564,9 @@
         <w:t xml:space="preserve">: a class or actor drops as a new lifeline.</w:t>
       </w:r>
     </w:p>
-    <w:bookmarkEnd w:id="72"/>
-    <w:bookmarkEnd w:id="73"/>
-    <w:bookmarkStart w:id="87" w:name="reference-class-diagrams"/>
+    <w:bookmarkEnd w:id="81"/>
+    <w:bookmarkEnd w:id="82"/>
+    <w:bookmarkStart w:id="96" w:name="reference-class-diagrams"/>
     <w:p>
       <w:pPr>
         <w:pStyle w:val="Heading1"/>
@@ -11534,7 +11633,7 @@
         <w:t xml:space="preserve">”</w:t>
       </w:r>
     </w:p>
-    <w:bookmarkStart w:id="74" w:name="reading-the-diagram"/>
+    <w:bookmarkStart w:id="83" w:name="reading-the-diagram"/>
     <w:p>
       <w:pPr>
         <w:pStyle w:val="Heading2"/>
@@ -11761,8 +11860,8 @@
         <w:t xml:space="preserve">: free-text boxes, attachable by connection points to other shapes.</w:t>
       </w:r>
     </w:p>
-    <w:bookmarkEnd w:id="74"/>
-    <w:bookmarkStart w:id="75" w:name="selection"/>
+    <w:bookmarkEnd w:id="83"/>
+    <w:bookmarkStart w:id="84" w:name="selection"/>
     <w:p>
       <w:pPr>
         <w:pStyle w:val="Heading2"/>
@@ -11999,8 +12098,8 @@
         <w:t xml:space="preserve">A right-click on an unselected shape selects it first, then opens the context menu.</w:t>
       </w:r>
     </w:p>
-    <w:bookmarkEnd w:id="75"/>
-    <w:bookmarkStart w:id="76" w:name="moving-and-resizing"/>
+    <w:bookmarkEnd w:id="84"/>
+    <w:bookmarkStart w:id="85" w:name="moving-and-resizing"/>
     <w:p>
       <w:pPr>
         <w:pStyle w:val="Heading2"/>
@@ -12079,8 +12178,8 @@
         <w:t xml:space="preserve">off (re-enable via the context menu).</w:t>
       </w:r>
     </w:p>
-    <w:bookmarkEnd w:id="76"/>
-    <w:bookmarkStart w:id="77" w:name="editing-connection-routing"/>
+    <w:bookmarkEnd w:id="85"/>
+    <w:bookmarkStart w:id="86" w:name="editing-connection-routing"/>
     <w:p>
       <w:pPr>
         <w:pStyle w:val="Heading2"/>
@@ -12255,8 +12354,8 @@
         <w:t xml:space="preserve">(relation role names and multiplicities, dependency name/stereotype) are draggable on a selected connection (four-arrow cursor, snaps to the grid). Once moved, a label stays where you put it.</w:t>
       </w:r>
     </w:p>
-    <w:bookmarkEnd w:id="77"/>
-    <w:bookmarkStart w:id="78" w:name="members-and-methods-inside-the-box"/>
+    <w:bookmarkEnd w:id="86"/>
+    <w:bookmarkStart w:id="87" w:name="members-and-methods-inside-the-box"/>
     <w:p>
       <w:pPr>
         <w:pStyle w:val="Heading2"/>
@@ -12324,8 +12423,8 @@
         <w:t xml:space="preserve">Arrow keys walk the rows of a class (header ↔ members ↔ methods).</w:t>
       </w:r>
     </w:p>
-    <w:bookmarkEnd w:id="78"/>
-    <w:bookmarkStart w:id="79" w:name="notes-and-their-connection-points"/>
+    <w:bookmarkEnd w:id="87"/>
+    <w:bookmarkStart w:id="88" w:name="notes-and-their-connection-points"/>
     <w:p>
       <w:pPr>
         <w:pStyle w:val="Heading2"/>
@@ -12426,8 +12525,8 @@
         <w:t xml:space="preserve">While dragging, a dashed line plus a small square marker previews the geometry.</w:t>
       </w:r>
     </w:p>
-    <w:bookmarkEnd w:id="79"/>
-    <w:bookmarkStart w:id="80" w:name="creating-elements-on-the-canvas"/>
+    <w:bookmarkEnd w:id="88"/>
+    <w:bookmarkStart w:id="89" w:name="creating-elements-on-the-canvas"/>
     <w:p>
       <w:pPr>
         <w:pStyle w:val="Heading2"/>
@@ -12848,8 +12947,8 @@
         <w:t xml:space="preserve">.</w:t>
       </w:r>
     </w:p>
-    <w:bookmarkEnd w:id="80"/>
-    <w:bookmarkStart w:id="81" w:name="align"/>
+    <w:bookmarkEnd w:id="89"/>
+    <w:bookmarkStart w:id="90" w:name="align"/>
     <w:p>
       <w:pPr>
         <w:pStyle w:val="Heading2"/>
@@ -12944,8 +13043,8 @@
         <w:t xml:space="preserve">(≥ 2 classes) auto-lays-out the whole diagram instead.</w:t>
       </w:r>
     </w:p>
-    <w:bookmarkEnd w:id="81"/>
-    <w:bookmarkStart w:id="82" w:name="hiding-per-shape-toggles-colors"/>
+    <w:bookmarkEnd w:id="90"/>
+    <w:bookmarkStart w:id="91" w:name="hiding-per-shape-toggles-colors"/>
     <w:p>
       <w:pPr>
         <w:pStyle w:val="Heading2"/>
@@ -13103,8 +13202,8 @@
         <w:t xml:space="preserve">— class line/text, member text, method text, relation line/critical-relation line/text, inherit line, diagram-only line/text, dependency line/text, note line/text. Each opens a color picker seeded with the current value; the change applies to every diagram of the model (and is undoable).</w:t>
       </w:r>
     </w:p>
-    <w:bookmarkEnd w:id="82"/>
-    <w:bookmarkStart w:id="83" w:name="zoom-and-pan"/>
+    <w:bookmarkEnd w:id="91"/>
+    <w:bookmarkStart w:id="92" w:name="zoom-and-pan"/>
     <w:p>
       <w:pPr>
         <w:pStyle w:val="Heading2"/>
@@ -13364,8 +13463,8 @@
         <w:t xml:space="preserve">Zoom ranges from 0.1× to 32×; the status bar’s X/Y fields track the model coordinates under the cursor.</w:t>
       </w:r>
     </w:p>
-    <w:bookmarkEnd w:id="83"/>
-    <w:bookmarkStart w:id="84" w:name="the-cd-toolbar"/>
+    <w:bookmarkEnd w:id="92"/>
+    <w:bookmarkStart w:id="93" w:name="the-cd-toolbar"/>
     <w:p>
       <w:pPr>
         <w:pStyle w:val="Heading2"/>
@@ -13577,8 +13676,8 @@
         <w:t xml:space="preserve">— cropped strip of the CD toolbar in the order above.</w:t>
       </w:r>
     </w:p>
-    <w:bookmarkEnd w:id="84"/>
-    <w:bookmarkStart w:id="85" w:name="the-cd-context-menu"/>
+    <w:bookmarkEnd w:id="93"/>
+    <w:bookmarkStart w:id="94" w:name="the-cd-context-menu"/>
     <w:p>
       <w:pPr>
         <w:pStyle w:val="Heading2"/>
@@ -13919,8 +14018,8 @@
         <w:t xml:space="preserve">— the context menu open on a selected class shape, with the Add submenu expanded.</w:t>
       </w:r>
     </w:p>
-    <w:bookmarkEnd w:id="85"/>
-    <w:bookmarkStart w:id="86" w:name="canvas-keys"/>
+    <w:bookmarkEnd w:id="94"/>
+    <w:bookmarkStart w:id="95" w:name="canvas-keys"/>
     <w:p>
       <w:pPr>
         <w:pStyle w:val="Heading2"/>
@@ -14239,9 +14338,9 @@
         </w:tc>
       </w:tr>
     </w:tbl>
-    <w:bookmarkEnd w:id="86"/>
-    <w:bookmarkEnd w:id="87"/>
-    <w:bookmarkStart w:id="104" w:name="reference-sequence-diagrams"/>
+    <w:bookmarkEnd w:id="95"/>
+    <w:bookmarkEnd w:id="96"/>
+    <w:bookmarkStart w:id="113" w:name="reference-sequence-diagrams"/>
     <w:p>
       <w:pPr>
         <w:pStyle w:val="Heading1"/>
@@ -14327,18 +14426,18 @@
           <wp:inline>
             <wp:extent cx="5334000" cy="3429000"/>
             <wp:effectExtent b="0" l="0" r="0" t="0"/>
-            <wp:docPr descr="A sequence-diagram view in the shell — its own toolbar (delete, undo/redo, zoom, export SVG) at the top; diagram views dock, tab and float exactly like the trees." title="" id="89" name="Picture"/>
+            <wp:docPr descr="A sequence-diagram view in the shell — its own toolbar (delete, undo/redo, zoom, export SVG) at the top; diagram views dock, tab and float exactly like the trees." title="" id="98" name="Picture"/>
             <a:graphic>
               <a:graphicData uri="http://schemas.openxmlformats.org/drawingml/2006/picture">
                 <pic:pic>
                   <pic:nvPicPr>
-                    <pic:cNvPr descr="images/sd-view.png" id="90" name="Picture"/>
+                    <pic:cNvPr descr="images/sd-view.png" id="99" name="Picture"/>
                     <pic:cNvPicPr>
                       <a:picLocks noChangeArrowheads="1" noChangeAspect="1"/>
                     </pic:cNvPicPr>
                   </pic:nvPicPr>
                   <pic:blipFill>
-                    <a:blip r:embed="rId88"/>
+                    <a:blip r:embed="rId97"/>
                     <a:stretch>
                       <a:fillRect/>
                     </a:stretch>
@@ -14382,24 +14481,24 @@
           <wp:inline>
             <wp:extent cx="5334000" cy="7544589"/>
             <wp:effectExtent b="0" l="0" r="0" t="0"/>
-            <wp:docPr descr="The “Creating a Matrix” sequence diagram (SVG export, generated with add_call_trace): a User triggers Matrix(rows, columns), which constructs the Columns and Rows." title="" id="92" name="Picture"/>
+            <wp:docPr descr="The “Creating a Matrix” sequence diagram (SVG export, generated with add_call_trace): a User triggers Matrix(rows, columns), which constructs the Columns and Rows." title="" id="101" name="Picture"/>
             <a:graphic>
               <a:graphicData uri="http://schemas.openxmlformats.org/drawingml/2006/picture">
                 <pic:pic>
                   <pic:nvPicPr>
-                    <pic:cNvPr descr="images/sd-create.svg" id="93" name="Picture"/>
+                    <pic:cNvPr descr="images/sd-create.svg" id="102" name="Picture"/>
                     <pic:cNvPicPr>
                       <a:picLocks noChangeArrowheads="1" noChangeAspect="1"/>
                     </pic:cNvPicPr>
                   </pic:nvPicPr>
                   <pic:blipFill>
-                    <a:blip r:embed="rId94">
+                    <a:blip r:embed="rId103">
                       <a:extLst>
                         <a:ext uri="{28A0092B-C50C-407E-A947-70E740481C1C}">
                           <a14:useLocalDpi xmlns:a14="http://schemas.microsoft.com/office/drawing/2010/main" val="0"/>
                         </a:ext>
                         <a:ext uri="{96DAC541-7B7A-43D3-8B79-37D633B846F1}">
-                          <asvg:svgBlip xmlns:asvg="http://schemas.microsoft.com/office/drawing/2016/SVG/main" r:embed="rId91"/>
+                          <asvg:svgBlip xmlns:asvg="http://schemas.microsoft.com/office/drawing/2016/SVG/main" r:embed="rId100"/>
                         </a:ext>
                       </a:extLst>
                     </a:blip>
@@ -14455,7 +14554,7 @@
         <w:t xml:space="preserve">sequence diagram (SVG export, generated with add_call_trace): a User triggers Matrix(rows, columns), which constructs the Columns and Rows.</w:t>
       </w:r>
     </w:p>
-    <w:bookmarkStart w:id="95" w:name="building-one"/>
+    <w:bookmarkStart w:id="104" w:name="building-one"/>
     <w:p>
       <w:pPr>
         <w:pStyle w:val="Heading2"/>
@@ -14630,8 +14729,8 @@
         <w:t xml:space="preserve">Notes: free boxes with attach-lines — see below.</w:t>
       </w:r>
     </w:p>
-    <w:bookmarkEnd w:id="95"/>
-    <w:bookmarkStart w:id="96" w:name="what-moves-and-how"/>
+    <w:bookmarkEnd w:id="104"/>
+    <w:bookmarkStart w:id="105" w:name="what-moves-and-how"/>
     <w:p>
       <w:pPr>
         <w:pStyle w:val="Heading2"/>
@@ -15064,8 +15163,8 @@
         <w:t xml:space="preserve">: purely positional, so a point lying on a lifeline or signal travels with it. Dragging a corner point outward spawns a new joint; dragging a point back into the note deletes it. On release, a point near a signal arrow snaps vertically onto it — the line then tracks that signal.</w:t>
       </w:r>
     </w:p>
-    <w:bookmarkEnd w:id="96"/>
-    <w:bookmarkStart w:id="97" w:name="keeping-it-readable"/>
+    <w:bookmarkEnd w:id="105"/>
+    <w:bookmarkStart w:id="106" w:name="keeping-it-readable"/>
     <w:p>
       <w:pPr>
         <w:pStyle w:val="Heading2"/>
@@ -15165,8 +15264,8 @@
         <w:t xml:space="preserve">replaces a selected group of nested activations with a summarizing note — good for hiding boilerplate sub-calls.</w:t>
       </w:r>
     </w:p>
-    <w:bookmarkEnd w:id="97"/>
-    <w:bookmarkStart w:id="98" w:name="toolbar-colors-zoom"/>
+    <w:bookmarkEnd w:id="106"/>
+    <w:bookmarkStart w:id="107" w:name="toolbar-colors-zoom"/>
     <w:p>
       <w:pPr>
         <w:pStyle w:val="Heading2"/>
@@ -15324,8 +15423,8 @@
         <w:t xml:space="preserve">, Fit via toolbar or double-click on empty space, pan with plain scroll / middle-drag / scrollbars, pinch on trackpads).</w:t>
       </w:r>
     </w:p>
-    <w:bookmarkEnd w:id="98"/>
-    <w:bookmarkStart w:id="103" w:name="canvas-keys-1"/>
+    <w:bookmarkEnd w:id="107"/>
+    <w:bookmarkStart w:id="112" w:name="canvas-keys-1"/>
     <w:p>
       <w:pPr>
         <w:pStyle w:val="Heading2"/>
@@ -15725,24 +15824,24 @@
           <wp:inline>
             <wp:extent cx="5334000" cy="7544589"/>
             <wp:effectExtent b="0" l="0" r="0" t="0"/>
-            <wp:docPr descr="A pipe-generated call trace of the Matrix constructor (“Matrix constructor walkthrough”)." title="" id="100" name="Picture"/>
+            <wp:docPr descr="A pipe-generated call trace of the Matrix constructor (“Matrix constructor walkthrough”)." title="" id="109" name="Picture"/>
             <a:graphic>
               <a:graphicData uri="http://schemas.openxmlformats.org/drawingml/2006/picture">
                 <pic:pic>
                   <pic:nvPicPr>
-                    <pic:cNvPr descr="images/sd-ctor-walkthrough.svg" id="101" name="Picture"/>
+                    <pic:cNvPr descr="images/sd-ctor-walkthrough.svg" id="110" name="Picture"/>
                     <pic:cNvPicPr>
                       <a:picLocks noChangeArrowheads="1" noChangeAspect="1"/>
                     </pic:cNvPicPr>
                   </pic:nvPicPr>
                   <pic:blipFill>
-                    <a:blip r:embed="rId102">
+                    <a:blip r:embed="rId111">
                       <a:extLst>
                         <a:ext uri="{28A0092B-C50C-407E-A947-70E740481C1C}">
                           <a14:useLocalDpi xmlns:a14="http://schemas.microsoft.com/office/drawing/2010/main" val="0"/>
                         </a:ext>
                         <a:ext uri="{96DAC541-7B7A-43D3-8B79-37D633B846F1}">
-                          <asvg:svgBlip xmlns:asvg="http://schemas.microsoft.com/office/drawing/2016/SVG/main" r:embed="rId99"/>
+                          <asvg:svgBlip xmlns:asvg="http://schemas.microsoft.com/office/drawing/2016/SVG/main" r:embed="rId108"/>
                         </a:ext>
                       </a:extLst>
                     </a:blip>
@@ -15792,9 +15891,9 @@
         <w:t xml:space="preserve">).</w:t>
       </w:r>
     </w:p>
-    <w:bookmarkEnd w:id="103"/>
-    <w:bookmarkEnd w:id="104"/>
-    <w:bookmarkStart w:id="137" w:name="reference-dialogs"/>
+    <w:bookmarkEnd w:id="112"/>
+    <w:bookmarkEnd w:id="113"/>
+    <w:bookmarkStart w:id="146" w:name="reference-dialogs"/>
     <w:p>
       <w:pPr>
         <w:pStyle w:val="Heading1"/>
@@ -15959,7 +16058,7 @@
         <w:t xml:space="preserve">One screenshot per dialog in this chapter, captured on Windows at 100% scale with realistic content from the Matrix model. Captions are given per dialog below.</w:t>
       </w:r>
     </w:p>
-    <w:bookmarkStart w:id="105" w:name="class"/>
+    <w:bookmarkStart w:id="114" w:name="class"/>
     <w:p>
       <w:pPr>
         <w:pStyle w:val="Heading2"/>
@@ -16174,8 +16273,8 @@
         <w:t xml:space="preserve">the checkbox disables when switching would break the model — most importantly, a class with a Serialize-on subclass cannot turn Serialize off.</w:t>
       </w:r>
     </w:p>
-    <w:bookmarkEnd w:id="105"/>
-    <w:bookmarkStart w:id="106" w:name="external-class"/>
+    <w:bookmarkEnd w:id="114"/>
+    <w:bookmarkStart w:id="115" w:name="external-class"/>
     <w:p>
       <w:pPr>
         <w:pStyle w:val="Heading2"/>
@@ -16254,8 +16353,8 @@
         <w:t xml:space="preserve">(for types that must not be forward-declared, e.g. typedefs), member prefix (used when generated code calls its getters/setters).</w:t>
       </w:r>
     </w:p>
-    <w:bookmarkEnd w:id="106"/>
-    <w:bookmarkStart w:id="107" w:name="member"/>
+    <w:bookmarkEnd w:id="115"/>
+    <w:bookmarkStart w:id="116" w:name="member"/>
     <w:p>
       <w:pPr>
         <w:pStyle w:val="Heading2"/>
@@ -16540,8 +16639,8 @@
         <w:t xml:space="preserve">— changing a key must never be a plain assignment. See chapter 12.7 for the generated code.</w:t>
       </w:r>
     </w:p>
-    <w:bookmarkEnd w:id="107"/>
-    <w:bookmarkStart w:id="108" w:name="method"/>
+    <w:bookmarkEnd w:id="116"/>
+    <w:bookmarkStart w:id="117" w:name="method"/>
     <w:p>
       <w:pPr>
         <w:pStyle w:val="Heading2"/>
@@ -16872,8 +16971,8 @@
         <w:t xml:space="preserve">”</w:t>
       </w:r>
     </w:p>
-    <w:bookmarkEnd w:id="108"/>
-    <w:bookmarkStart w:id="109" w:name="constructor-destructor"/>
+    <w:bookmarkEnd w:id="117"/>
+    <w:bookmarkStart w:id="118" w:name="constructor-destructor"/>
     <w:p>
       <w:pPr>
         <w:pStyle w:val="Heading2"/>
@@ -17032,8 +17131,8 @@
         <w:t xml:space="preserve">). If you edit an initializer by hand in the constructor dialog, your text wins until the next structural change re-derives that entry.</w:t>
       </w:r>
     </w:p>
-    <w:bookmarkEnd w:id="109"/>
-    <w:bookmarkStart w:id="110" w:name="exception-specification"/>
+    <w:bookmarkEnd w:id="118"/>
+    <w:bookmarkStart w:id="119" w:name="exception-specification"/>
     <w:p>
       <w:pPr>
         <w:pStyle w:val="Heading2"/>
@@ -17164,8 +17263,8 @@
         <w:t xml:space="preserve">clause.</w:t>
       </w:r>
     </w:p>
-    <w:bookmarkEnd w:id="110"/>
-    <w:bookmarkStart w:id="111" w:name="argument"/>
+    <w:bookmarkEnd w:id="119"/>
+    <w:bookmarkStart w:id="120" w:name="argument"/>
     <w:p>
       <w:pPr>
         <w:pStyle w:val="Heading2"/>
@@ -17228,8 +17327,8 @@
         <w:t xml:space="preserve">, note. Reorder arguments by drag in the tree.</w:t>
       </w:r>
     </w:p>
-    <w:bookmarkEnd w:id="111"/>
-    <w:bookmarkStart w:id="112" w:name="inheritance"/>
+    <w:bookmarkEnd w:id="120"/>
+    <w:bookmarkStart w:id="121" w:name="inheritance"/>
     <w:p>
       <w:pPr>
         <w:pStyle w:val="Heading2"/>
@@ -17367,8 +17466,8 @@
         <w:t xml:space="preserve">browser.</w:t>
       </w:r>
     </w:p>
-    <w:bookmarkEnd w:id="112"/>
-    <w:bookmarkStart w:id="113" w:name="relation"/>
+    <w:bookmarkEnd w:id="121"/>
+    <w:bookmarkStart w:id="122" w:name="relation"/>
     <w:p>
       <w:pPr>
         <w:pStyle w:val="Heading2"/>
@@ -17832,8 +17931,8 @@
         <w:t xml:space="preserve">(chapter 12.7).</w:t>
       </w:r>
     </w:p>
-    <w:bookmarkEnd w:id="113"/>
-    <w:bookmarkStart w:id="114" w:name="find-method-on-a-relation"/>
+    <w:bookmarkEnd w:id="122"/>
+    <w:bookmarkStart w:id="123" w:name="find-method-on-a-relation"/>
     <w:p>
       <w:pPr>
         <w:pStyle w:val="Heading2"/>
@@ -17979,8 +18078,8 @@
         <w:t xml:space="preserve">is generated instead — callers are identical either way.</w:t>
       </w:r>
     </w:p>
-    <w:bookmarkEnd w:id="114"/>
-    <w:bookmarkStart w:id="115" w:name="dependency"/>
+    <w:bookmarkEnd w:id="123"/>
+    <w:bookmarkStart w:id="124" w:name="dependency"/>
     <w:p>
       <w:pPr>
         <w:pStyle w:val="Heading2"/>
@@ -18100,8 +18199,8 @@
         <w:t xml:space="preserve">. A dependency is modeled — it affects the include/forward-declaration emission for the client — but adds no members or relation code.</w:t>
       </w:r>
     </w:p>
-    <w:bookmarkEnd w:id="115"/>
-    <w:bookmarkStart w:id="116" w:name="relation-diagram-only"/>
+    <w:bookmarkEnd w:id="124"/>
+    <w:bookmarkStart w:id="125" w:name="relation-diagram-only"/>
     <w:p>
       <w:pPr>
         <w:pStyle w:val="Heading2"/>
@@ -18228,8 +18327,8 @@
         <w:t xml:space="preserve">than modeled relations (e.g. Composition).</w:t>
       </w:r>
     </w:p>
-    <w:bookmarkEnd w:id="116"/>
-    <w:bookmarkStart w:id="117" w:name="type"/>
+    <w:bookmarkEnd w:id="125"/>
+    <w:bookmarkStart w:id="126" w:name="type"/>
     <w:p>
       <w:pPr>
         <w:pStyle w:val="Heading2"/>
@@ -18357,8 +18456,8 @@
         <w:t xml:space="preserve">C++ text that gets emitted into the master include.</w:t>
       </w:r>
     </w:p>
-    <w:bookmarkEnd w:id="117"/>
-    <w:bookmarkStart w:id="118" w:name="group-meta-group"/>
+    <w:bookmarkEnd w:id="126"/>
+    <w:bookmarkStart w:id="127" w:name="group-meta-group"/>
     <w:p>
       <w:pPr>
         <w:pStyle w:val="Heading2"/>
@@ -18408,8 +18507,8 @@
         <w:t xml:space="preserve">Name + note. (MemberAndMethodGroups — in-class folders — are created from the class context menu.)</w:t>
       </w:r>
     </w:p>
-    <w:bookmarkEnd w:id="118"/>
-    <w:bookmarkStart w:id="119" w:name="context-define-and-assign"/>
+    <w:bookmarkEnd w:id="127"/>
+    <w:bookmarkStart w:id="128" w:name="context-define-and-assign"/>
     <w:p>
       <w:pPr>
         <w:pStyle w:val="Heading2"/>
@@ -18683,8 +18782,8 @@
         <w:t xml:space="preserve">”</w:t>
       </w:r>
     </w:p>
-    <w:bookmarkEnd w:id="119"/>
-    <w:bookmarkStart w:id="120" w:name="actor"/>
+    <w:bookmarkEnd w:id="128"/>
+    <w:bookmarkStart w:id="129" w:name="actor"/>
     <w:p>
       <w:pPr>
         <w:pStyle w:val="Heading2"/>
@@ -18749,8 +18848,8 @@
         <w:t xml:space="preserve">and go on sequence diagrams as stick figures.</w:t>
       </w:r>
     </w:p>
-    <w:bookmarkEnd w:id="120"/>
-    <w:bookmarkStart w:id="121" w:name="class-diagram"/>
+    <w:bookmarkEnd w:id="129"/>
+    <w:bookmarkStart w:id="130" w:name="class-diagram"/>
     <w:p>
       <w:pPr>
         <w:pStyle w:val="Heading2"/>
@@ -18816,8 +18915,8 @@
         <w:t xml:space="preserve">matrix: which member/method access levels are automatically shown when a class is placed on this diagram (private/protected/public members and methods, plus Get/Set methods).</w:t>
       </w:r>
     </w:p>
-    <w:bookmarkEnd w:id="121"/>
-    <w:bookmarkStart w:id="122" w:name="sequence-diagram"/>
+    <w:bookmarkEnd w:id="130"/>
+    <w:bookmarkStart w:id="131" w:name="sequence-diagram"/>
     <w:p>
       <w:pPr>
         <w:pStyle w:val="Heading2"/>
@@ -18971,8 +19070,8 @@
         <w:t xml:space="preserve">options (argument types, argument names, scope). Per-message overrides exist on each signal’s own dialog.</w:t>
       </w:r>
     </w:p>
-    <w:bookmarkEnd w:id="122"/>
-    <w:bookmarkStart w:id="123" w:name="select-classes"/>
+    <w:bookmarkEnd w:id="131"/>
+    <w:bookmarkStart w:id="132" w:name="select-classes"/>
     <w:p>
       <w:pPr>
         <w:pStyle w:val="Heading2"/>
@@ -19035,8 +19134,8 @@
         <w:t xml:space="preserve">afterwards).</w:t>
       </w:r>
     </w:p>
-    <w:bookmarkEnd w:id="123"/>
-    <w:bookmarkStart w:id="124" w:name="class-shape"/>
+    <w:bookmarkEnd w:id="132"/>
+    <w:bookmarkStart w:id="133" w:name="class-shape"/>
     <w:p>
       <w:pPr>
         <w:pStyle w:val="Heading2"/>
@@ -19149,8 +19248,8 @@
         <w:t xml:space="preserve">shape. The same class can show different features on different diagrams.</w:t>
       </w:r>
     </w:p>
-    <w:bookmarkEnd w:id="124"/>
-    <w:bookmarkStart w:id="125" w:name="select-members-methods"/>
+    <w:bookmarkEnd w:id="133"/>
+    <w:bookmarkStart w:id="134" w:name="select-members-methods"/>
     <w:p>
       <w:pPr>
         <w:pStyle w:val="Heading2"/>
@@ -19201,8 +19300,8 @@
         <w:t xml:space="preserve">on a class shape (within what the diagram’s access-level flags allow). Checkbox lists per section, with Select All / Unselect All. Diagram-wide or per-class, depending on where it was opened.</w:t>
       </w:r>
     </w:p>
-    <w:bookmarkEnd w:id="125"/>
-    <w:bookmarkStart w:id="126" w:name="reorder-members-methods"/>
+    <w:bookmarkEnd w:id="134"/>
+    <w:bookmarkStart w:id="135" w:name="reorder-members-methods"/>
     <w:p>
       <w:pPr>
         <w:pStyle w:val="Heading2"/>
@@ -19250,8 +19349,8 @@
         <w:t xml:space="preserve">: it changes declaration order in the generated file.</w:t>
       </w:r>
     </w:p>
-    <w:bookmarkEnd w:id="126"/>
-    <w:bookmarkStart w:id="127" w:name="signal-message"/>
+    <w:bookmarkEnd w:id="135"/>
+    <w:bookmarkStart w:id="136" w:name="signal-message"/>
     <w:p>
       <w:pPr>
         <w:pStyle w:val="Heading2"/>
@@ -19328,8 +19427,8 @@
         <w:t xml:space="preserve">), return text + show-return-arrow, async flag, per-message argument/scope display, note.</w:t>
       </w:r>
     </w:p>
-    <w:bookmarkEnd w:id="127"/>
-    <w:bookmarkStart w:id="128" w:name="lifeline-note-dialogs"/>
+    <w:bookmarkEnd w:id="136"/>
+    <w:bookmarkStart w:id="137" w:name="lifeline-note-dialogs"/>
     <w:p>
       <w:pPr>
         <w:pStyle w:val="Heading2"/>
@@ -19398,8 +19497,8 @@
         <w:t xml:space="preserve">(apply the size everywhere).</w:t>
       </w:r>
     </w:p>
-    <w:bookmarkEnd w:id="128"/>
-    <w:bookmarkStart w:id="129" w:name="Xb9470c6e63f702dcde05f89c7607c45c6bcf312"/>
+    <w:bookmarkEnd w:id="137"/>
+    <w:bookmarkStart w:id="138" w:name="Xb9470c6e63f702dcde05f89c7607c45c6bcf312"/>
     <w:p>
       <w:pPr>
         <w:pStyle w:val="Heading2"/>
@@ -19831,8 +19930,8 @@
         <w:t xml:space="preserve">(the TODO line seeded into new method bodies); Method Name List / Similar Lines List (name suggestions and the similar-lines tool’s pattern list).</w:t>
       </w:r>
     </w:p>
-    <w:bookmarkEnd w:id="129"/>
-    <w:bookmarkStart w:id="130" w:name="add-serialization-to-project"/>
+    <w:bookmarkEnd w:id="138"/>
+    <w:bookmarkStart w:id="139" w:name="add-serialization-to-project"/>
     <w:p>
       <w:pPr>
         <w:pStyle w:val="Heading2"/>
@@ -19910,8 +20009,8 @@
         <w:t xml:space="preserve">machinery (chapter 13.1). One-way — once a model has Serialize, it keeps it.</w:t>
       </w:r>
     </w:p>
-    <w:bookmarkEnd w:id="130"/>
-    <w:bookmarkStart w:id="131" w:name="find"/>
+    <w:bookmarkEnd w:id="139"/>
+    <w:bookmarkStart w:id="140" w:name="find"/>
     <w:p>
       <w:pPr>
         <w:pStyle w:val="Heading2"/>
@@ -19982,8 +20081,8 @@
         <w:t xml:space="preserve">repeats.</w:t>
       </w:r>
     </w:p>
-    <w:bookmarkEnd w:id="131"/>
-    <w:bookmarkStart w:id="132" w:name="read-source"/>
+    <w:bookmarkEnd w:id="140"/>
+    <w:bookmarkStart w:id="141" w:name="read-source"/>
     <w:p>
       <w:pPr>
         <w:pStyle w:val="Heading2"/>
@@ -20062,8 +20161,8 @@
         <w:t xml:space="preserve">.</w:t>
       </w:r>
     </w:p>
-    <w:bookmarkEnd w:id="132"/>
-    <w:bookmarkStart w:id="133" w:name="save-source"/>
+    <w:bookmarkEnd w:id="141"/>
+    <w:bookmarkStart w:id="142" w:name="save-source"/>
     <w:p>
       <w:pPr>
         <w:pStyle w:val="Heading2"/>
@@ -20189,8 +20288,8 @@
         <w:t xml:space="preserve">block in the header comment). That is where the author initials next to each change line in generated headers come from.</w:t>
       </w:r>
     </w:p>
-    <w:bookmarkEnd w:id="133"/>
-    <w:bookmarkStart w:id="134" w:name="virtual-methods-isclass-methods"/>
+    <w:bookmarkEnd w:id="142"/>
+    <w:bookmarkStart w:id="143" w:name="virtual-methods-isclass-methods"/>
     <w:p>
       <w:pPr>
         <w:pStyle w:val="Heading2"/>
@@ -20297,8 +20396,8 @@
         <w:t xml:space="preserve">, returning a boolean truth value).</w:t>
       </w:r>
     </w:p>
-    <w:bookmarkEnd w:id="134"/>
-    <w:bookmarkStart w:id="135" w:name="user-sections-code-dialogs"/>
+    <w:bookmarkEnd w:id="143"/>
+    <w:bookmarkStart w:id="144" w:name="user-sections-code-dialogs"/>
     <w:p>
       <w:pPr>
         <w:pStyle w:val="Heading2"/>
@@ -20388,8 +20487,8 @@
         <w:t xml:space="preserve">marker bands above and below your text.</w:t>
       </w:r>
     </w:p>
-    <w:bookmarkEnd w:id="135"/>
-    <w:bookmarkStart w:id="136" w:name="code-editing-helper-wizards"/>
+    <w:bookmarkEnd w:id="144"/>
+    <w:bookmarkStart w:id="145" w:name="code-editing-helper-wizards"/>
     <w:p>
       <w:pPr>
         <w:pStyle w:val="Heading2"/>
@@ -20686,9 +20785,9 @@
         <w:t xml:space="preserve">— the member-method wrapper picker.</w:t>
       </w:r>
     </w:p>
-    <w:bookmarkEnd w:id="136"/>
-    <w:bookmarkEnd w:id="137"/>
-    <w:bookmarkStart w:id="141" w:name="reference-the-code-editor"/>
+    <w:bookmarkEnd w:id="145"/>
+    <w:bookmarkEnd w:id="146"/>
+    <w:bookmarkStart w:id="150" w:name="reference-the-code-editor"/>
     <w:p>
       <w:pPr>
         <w:pStyle w:val="Heading1"/>
@@ -20705,7 +20804,7 @@
         <w:t xml:space="preserve">Method bodies, constructor/destructor bodies and the user sections are edited in ClassBuilder’s built-in code editor (a fixed-pitch C++ editor; Consolas 11 pt on Windows).</w:t>
       </w:r>
     </w:p>
-    <w:bookmarkStart w:id="138" w:name="editing-behavior"/>
+    <w:bookmarkStart w:id="147" w:name="editing-behavior"/>
     <w:p>
       <w:pPr>
         <w:pStyle w:val="Heading2"/>
@@ -20907,8 +21006,8 @@
         <w:t xml:space="preserve">No line wrapping; long lines scroll.</w:t>
       </w:r>
     </w:p>
-    <w:bookmarkEnd w:id="138"/>
-    <w:bookmarkStart w:id="139" w:name="code-insertion"/>
+    <w:bookmarkEnd w:id="147"/>
+    <w:bookmarkStart w:id="148" w:name="code-insertion"/>
     <w:p>
       <w:pPr>
         <w:pStyle w:val="Heading2"/>
@@ -21031,8 +21130,8 @@
         <w:t xml:space="preserve">marker already in place — write below the marker (chapter 11.4 for the destructor-order exception).</w:t>
       </w:r>
     </w:p>
-    <w:bookmarkEnd w:id="139"/>
-    <w:bookmarkStart w:id="140" w:name="where-it-appears"/>
+    <w:bookmarkEnd w:id="148"/>
+    <w:bookmarkStart w:id="149" w:name="where-it-appears"/>
     <w:p>
       <w:pPr>
         <w:pStyle w:val="Heading2"/>
@@ -21240,9 +21339,9 @@
         </w:tc>
       </w:tr>
     </w:tbl>
-    <w:bookmarkEnd w:id="140"/>
-    <w:bookmarkEnd w:id="141"/>
-    <w:bookmarkStart w:id="147" w:name="code-generation-in-depth"/>
+    <w:bookmarkEnd w:id="149"/>
+    <w:bookmarkEnd w:id="150"/>
+    <w:bookmarkStart w:id="156" w:name="code-generation-in-depth"/>
     <w:p>
       <w:pPr>
         <w:pStyle w:val="Heading1"/>
@@ -21251,7 +21350,7 @@
         <w:t xml:space="preserve">Code generation in depth</w:t>
       </w:r>
     </w:p>
-    <w:bookmarkStart w:id="142" w:name="files-produced"/>
+    <w:bookmarkStart w:id="151" w:name="files-produced"/>
     <w:p>
       <w:pPr>
         <w:pStyle w:val="Heading2"/>
@@ -21350,8 +21449,8 @@
         <w:t xml:space="preserve">).</w:t>
       </w:r>
     </w:p>
-    <w:bookmarkEnd w:id="142"/>
-    <w:bookmarkStart w:id="143" w:name="anatomy-of-a-generated-file"/>
+    <w:bookmarkEnd w:id="151"/>
+    <w:bookmarkStart w:id="152" w:name="anatomy-of-a-generated-file"/>
     <w:p>
       <w:pPr>
         <w:pStyle w:val="Heading2"/>
@@ -21774,8 +21873,8 @@
         <w:t xml:space="preserve">bodies, relation macros, class declarations or member lists on disk; change the model instead.</w:t>
       </w:r>
     </w:p>
-    <w:bookmarkEnd w:id="143"/>
-    <w:bookmarkStart w:id="144" w:name="the-six-user-sections"/>
+    <w:bookmarkEnd w:id="152"/>
+    <w:bookmarkStart w:id="153" w:name="the-six-user-sections"/>
     <w:p>
       <w:pPr>
         <w:pStyle w:val="Heading2"/>
@@ -21873,8 +21972,8 @@
         <w:t xml:space="preserve">is the place for hand-written members or friend declarations that should live in the class but not in the model.</w:t>
       </w:r>
     </w:p>
-    <w:bookmarkEnd w:id="144"/>
-    <w:bookmarkStart w:id="145" w:name="constructorinclude-destructorinclude"/>
+    <w:bookmarkEnd w:id="153"/>
+    <w:bookmarkStart w:id="154" w:name="constructorinclude-destructorinclude"/>
     <w:p>
       <w:pPr>
         <w:pStyle w:val="Heading2"/>
@@ -22013,8 +22112,8 @@
         <w:t xml:space="preserve">(the generator preserves your body; you own the order inside it).</w:t>
       </w:r>
     </w:p>
-    <w:bookmarkEnd w:id="145"/>
-    <w:bookmarkStart w:id="146" w:name="read-source-the-round-trip"/>
+    <w:bookmarkEnd w:id="154"/>
+    <w:bookmarkStart w:id="155" w:name="read-source-the-round-trip"/>
     <w:p>
       <w:pPr>
         <w:pStyle w:val="Heading2"/>
@@ -22178,9 +22277,9 @@
         <w:t xml:space="preserve">Line endings: bodies are stored with CRLF; keep generated files CRLF (the model’s line-ending setting controls emissions).</w:t>
       </w:r>
     </w:p>
-    <w:bookmarkEnd w:id="146"/>
-    <w:bookmarkEnd w:id="147"/>
-    <w:bookmarkStart w:id="166" w:name="relations-and-the-intrusive-runtime"/>
+    <w:bookmarkEnd w:id="155"/>
+    <w:bookmarkEnd w:id="156"/>
+    <w:bookmarkStart w:id="175" w:name="relations-and-the-intrusive-runtime"/>
     <w:p>
       <w:pPr>
         <w:pStyle w:val="Heading1"/>
@@ -22197,7 +22296,7 @@
         <w:t xml:space="preserve">This chapter is the heart of ClassBuilder. It explains what the relation macros generate, why intrusive linked lists were chosen, and what guarantees you get.</w:t>
       </w:r>
     </w:p>
-    <w:bookmarkStart w:id="152" w:name="what-intrusive-means"/>
+    <w:bookmarkStart w:id="161" w:name="what-intrusive-means"/>
     <w:p>
       <w:pPr>
         <w:pStyle w:val="Heading2"/>
@@ -22233,24 +22332,24 @@
           <wp:inline>
             <wp:extent cx="5334000" cy="3246782"/>
             <wp:effectExtent b="0" l="0" r="0" t="0"/>
-            <wp:docPr descr="One Cell in two lists: all link pointers are members of the Cell itself." title="" id="149" name="Picture"/>
+            <wp:docPr descr="One Cell in two lists: all link pointers are members of the Cell itself." title="" id="158" name="Picture"/>
             <a:graphic>
               <a:graphicData uri="http://schemas.openxmlformats.org/drawingml/2006/picture">
                 <pic:pic>
                   <pic:nvPicPr>
-                    <pic:cNvPr descr="images/fig-intrusive-lists.svg" id="150" name="Picture"/>
+                    <pic:cNvPr descr="images/fig-intrusive-lists.svg" id="159" name="Picture"/>
                     <pic:cNvPicPr>
                       <a:picLocks noChangeArrowheads="1" noChangeAspect="1"/>
                     </pic:cNvPicPr>
                   </pic:nvPicPr>
                   <pic:blipFill>
-                    <a:blip r:embed="rId151">
+                    <a:blip r:embed="rId160">
                       <a:extLst>
                         <a:ext uri="{28A0092B-C50C-407E-A947-70E740481C1C}">
                           <a14:useLocalDpi xmlns:a14="http://schemas.microsoft.com/office/drawing/2010/main" val="0"/>
                         </a:ext>
                         <a:ext uri="{96DAC541-7B7A-43D3-8B79-37D633B846F1}">
-                          <asvg:svgBlip xmlns:asvg="http://schemas.microsoft.com/office/drawing/2016/SVG/main" r:embed="rId148"/>
+                          <asvg:svgBlip xmlns:asvg="http://schemas.microsoft.com/office/drawing/2016/SVG/main" r:embed="rId157"/>
                         </a:ext>
                       </a:extLst>
                     </a:blip>
@@ -22720,8 +22819,8 @@
         <w:t xml:space="preserve">In ClassBuilder a new relation on an existing class is one dialog and a regeneration; existing relations, code and files are untouched.</w:t>
       </w:r>
     </w:p>
-    <w:bookmarkEnd w:id="152"/>
-    <w:bookmarkStart w:id="153" w:name="declaring-relations-the-macro-surface"/>
+    <w:bookmarkEnd w:id="161"/>
+    <w:bookmarkStart w:id="162" w:name="declaring-relations-the-macro-surface"/>
     <w:p>
       <w:pPr>
         <w:pStyle w:val="Heading2"/>
@@ -23423,8 +23522,8 @@
         </w:tc>
       </w:tr>
     </w:tbl>
-    <w:bookmarkEnd w:id="153"/>
-    <w:bookmarkStart w:id="154" w:name="the-generated-api-of-a-multi-relation"/>
+    <w:bookmarkEnd w:id="162"/>
+    <w:bookmarkStart w:id="163" w:name="the-generated-api-of-a-multi-relation"/>
     <w:p>
       <w:pPr>
         <w:pStyle w:val="Heading2"/>
@@ -24352,8 +24451,8 @@
         <w:t xml:space="preserve">, so their exact signatures are always visible.</w:t>
       </w:r>
     </w:p>
-    <w:bookmarkEnd w:id="154"/>
-    <w:bookmarkStart w:id="155" w:name="Xaaa89ef9d7adb0d0fb470691c4808f6f6b0754c"/>
+    <w:bookmarkEnd w:id="163"/>
+    <w:bookmarkStart w:id="164" w:name="Xaaa89ef9d7adb0d0fb470691c4808f6f6b0754c"/>
     <w:p>
       <w:pPr>
         <w:pStyle w:val="Heading2"/>
@@ -24841,8 +24940,8 @@
         <w:t xml:space="preserve">.</w:t>
       </w:r>
     </w:p>
-    <w:bookmarkEnd w:id="155"/>
-    <w:bookmarkStart w:id="160" w:name="ownership-and-cascade-delete"/>
+    <w:bookmarkEnd w:id="164"/>
+    <w:bookmarkStart w:id="169" w:name="ownership-and-cascade-delete"/>
     <w:p>
       <w:pPr>
         <w:pStyle w:val="Heading2"/>
@@ -24860,24 +24959,24 @@
           <wp:inline>
             <wp:extent cx="5334000" cy="2724978"/>
             <wp:effectExtent b="0" l="0" r="0" t="0"/>
-            <wp:docPr descr="delete pMatrix — the cascade frees the entire graph." title="" id="157" name="Picture"/>
+            <wp:docPr descr="delete pMatrix — the cascade frees the entire graph." title="" id="166" name="Picture"/>
             <a:graphic>
               <a:graphicData uri="http://schemas.openxmlformats.org/drawingml/2006/picture">
                 <pic:pic>
                   <pic:nvPicPr>
-                    <pic:cNvPr descr="images/fig-ownership-cascade.svg" id="158" name="Picture"/>
+                    <pic:cNvPr descr="images/fig-ownership-cascade.svg" id="167" name="Picture"/>
                     <pic:cNvPicPr>
                       <a:picLocks noChangeArrowheads="1" noChangeAspect="1"/>
                     </pic:cNvPicPr>
                   </pic:nvPicPr>
                   <pic:blipFill>
-                    <a:blip r:embed="rId159">
+                    <a:blip r:embed="rId168">
                       <a:extLst>
                         <a:ext uri="{28A0092B-C50C-407E-A947-70E740481C1C}">
                           <a14:useLocalDpi xmlns:a14="http://schemas.microsoft.com/office/drawing/2010/main" val="0"/>
                         </a:ext>
                         <a:ext uri="{96DAC541-7B7A-43D3-8B79-37D633B846F1}">
-                          <asvg:svgBlip xmlns:asvg="http://schemas.microsoft.com/office/drawing/2016/SVG/main" r:embed="rId156"/>
+                          <asvg:svgBlip xmlns:asvg="http://schemas.microsoft.com/office/drawing/2016/SVG/main" r:embed="rId165"/>
                         </a:ext>
                       </a:extLst>
                     </a:blip>
@@ -25039,8 +25138,8 @@
         <w:t xml:space="preserve">members, and destructors clear them. In the demo run of chapter 4 this is the last line: every object freed by cascade.</w:t>
       </w:r>
     </w:p>
-    <w:bookmarkEnd w:id="160"/>
-    <w:bookmarkStart w:id="161" w:name="iterators-that-survive-modification"/>
+    <w:bookmarkEnd w:id="169"/>
+    <w:bookmarkStart w:id="170" w:name="iterators-that-survive-modification"/>
     <w:p>
       <w:pPr>
         <w:pStyle w:val="Heading2"/>
@@ -25304,8 +25403,8 @@
         <w:t xml:space="preserve">). Setters may trigger model-side reordering (e.g. in sorted tree relations); the captured pointer stays valid, the iterator re-anchors.</w:t>
       </w:r>
     </w:p>
-    <w:bookmarkEnd w:id="161"/>
-    <w:bookmarkStart w:id="162" w:name="single-static-multi"/>
+    <w:bookmarkEnd w:id="170"/>
+    <w:bookmarkStart w:id="171" w:name="single-static-multi"/>
     <w:p>
       <w:pPr>
         <w:pStyle w:val="Heading2"/>
@@ -25380,8 +25479,8 @@
         <w:t xml:space="preserve">instances of the from-class (class-level registry). Not available for template or serialize classes.</w:t>
       </w:r>
     </w:p>
-    <w:bookmarkEnd w:id="162"/>
-    <w:bookmarkStart w:id="163" w:name="tree-implementations-and-find-methods"/>
+    <w:bookmarkEnd w:id="171"/>
+    <w:bookmarkStart w:id="172" w:name="tree-implementations-and-find-methods"/>
     <w:p>
       <w:pPr>
         <w:pStyle w:val="Heading2"/>
@@ -26134,8 +26233,8 @@
         <w:t xml:space="preserve">— implemented as a loop on a list relation, or as the native tree search when the argument matches the tree key. Design workflow: start with lists; when profiling says a find is hot, flip the relation to a tree — the find method regenerates to the fast path, callers unchanged.</w:t>
       </w:r>
     </w:p>
-    <w:bookmarkEnd w:id="163"/>
-    <w:bookmarkStart w:id="164" w:name="critical-relations-threads"/>
+    <w:bookmarkEnd w:id="172"/>
+    <w:bookmarkStart w:id="173" w:name="critical-relations-threads"/>
     <w:p>
       <w:pPr>
         <w:pStyle w:val="Heading2"/>
@@ -26193,8 +26292,8 @@
         <w:t xml:space="preserve">only — your own data races remain your own; keep cross-thread mutation points few and explicit.</w:t>
       </w:r>
     </w:p>
-    <w:bookmarkEnd w:id="164"/>
-    <w:bookmarkStart w:id="165" w:name="writing-loops-the-generated-way"/>
+    <w:bookmarkEnd w:id="173"/>
+    <w:bookmarkStart w:id="174" w:name="writing-loops-the-generated-way"/>
     <w:p>
       <w:pPr>
         <w:pStyle w:val="Heading2"/>
@@ -26536,9 +26635,9 @@
         <w:t xml:space="preserve">before a loop that deletes — the list is live and your snapshot is not.</w:t>
       </w:r>
     </w:p>
-    <w:bookmarkEnd w:id="165"/>
-    <w:bookmarkEnd w:id="166"/>
-    <w:bookmarkStart w:id="173" w:name="serialization"/>
+    <w:bookmarkEnd w:id="174"/>
+    <w:bookmarkEnd w:id="175"/>
+    <w:bookmarkStart w:id="182" w:name="serialization"/>
     <w:p>
       <w:pPr>
         <w:pStyle w:val="Heading1"/>
@@ -26547,7 +26646,7 @@
         <w:t xml:space="preserve">Serialization</w:t>
       </w:r>
     </w:p>
-    <w:bookmarkStart w:id="167" w:name="what-you-get"/>
+    <w:bookmarkStart w:id="176" w:name="what-you-get"/>
     <w:p>
       <w:pPr>
         <w:pStyle w:val="Heading2"/>
@@ -26787,8 +26886,8 @@
         <w:t xml:space="preserve">registers the factory), then re-links all relations through a pointer table. Shared pointers, back-pointers, multi-ownership — the graph reloads exactly.</w:t>
       </w:r>
     </w:p>
-    <w:bookmarkEnd w:id="167"/>
-    <w:bookmarkStart w:id="168" w:name="cbarchive-and-the-wire-format"/>
+    <w:bookmarkEnd w:id="176"/>
+    <w:bookmarkStart w:id="177" w:name="cbarchive-and-the-wire-format"/>
     <w:p>
       <w:pPr>
         <w:pStyle w:val="Heading2"/>
@@ -26946,8 +27045,8 @@
         <w:t xml:space="preserve">rather than crashing.</w:t>
       </w:r>
     </w:p>
-    <w:bookmarkEnd w:id="168"/>
-    <w:bookmarkStart w:id="169" w:name="cbz-compression-on-the-fly"/>
+    <w:bookmarkEnd w:id="177"/>
+    <w:bookmarkStart w:id="178" w:name="cbz-compression-on-the-fly"/>
     <w:p>
       <w:pPr>
         <w:pStyle w:val="Heading2"/>
@@ -27297,8 +27396,8 @@
         <w:t xml:space="preserve">; the quick start’s whole matrix saved in 114 bytes. Your applications get the same for free — link zstd and use the two wrappers.</w:t>
       </w:r>
     </w:p>
-    <w:bookmarkEnd w:id="169"/>
-    <w:bookmarkStart w:id="170" w:name="Xbded68cf7b5dad621557026fdc0855cc4156113"/>
+    <w:bookmarkEnd w:id="178"/>
+    <w:bookmarkStart w:id="179" w:name="Xbded68cf7b5dad621557026fdc0855cc4156113"/>
     <w:p>
       <w:pPr>
         <w:pStyle w:val="Heading2"/>
@@ -27347,28 +27446,29 @@
           <w:bCs/>
           <w:b/>
         </w:rPr>
-        <w:t xml:space="preserve">document</w:t>
-      </w:r>
-      <w:r>
-        <w:t xml:space="preserve"> </w:t>
-      </w:r>
-      <w:r>
-        <w:t xml:space="preserve">has an</w:t>
-      </w:r>
-      <w:r>
-        <w:t xml:space="preserve"> </w:t>
-      </w:r>
-      <w:r>
-        <w:rPr>
-          <w:rStyle w:val="VerbatimChar"/>
-        </w:rPr>
-        <w:t xml:space="preserve">int _version</w:t>
-      </w:r>
-      <w:r>
-        <w:t xml:space="preserve"> </w:t>
-      </w:r>
-      <w:r>
-        <w:t xml:space="preserve">member, stored first. Set it (constructor initialization) to the model’s current schema version; bump it when the schema grows. On load it is read back and published to every class (</w:t>
+        <w:t xml:space="preserve">document version</w:t>
+      </w:r>
+      <w:r>
+        <w:t xml:space="preserve"> </w:t>
+      </w:r>
+      <w:r>
+        <w:t xml:space="preserve">is the model’s schema version — the</w:t>
+      </w:r>
+      <w:r>
+        <w:t xml:space="preserve"> </w:t>
+      </w:r>
+      <w:r>
+        <w:rPr>
+          <w:iCs/>
+          <w:i/>
+        </w:rPr>
+        <w:t xml:space="preserve">Version</w:t>
+      </w:r>
+      <w:r>
+        <w:t xml:space="preserve"> </w:t>
+      </w:r>
+      <w:r>
+        <w:t xml:space="preserve">field in the DataModel dialog, and that field is the only place you see or touch it. Everything else is generated and invisible: the document writes the version into every save, reads it back before anything else on load, and publishes it to every class (</w:t>
       </w:r>
       <w:r>
         <w:rPr>
@@ -27405,7 +27505,7 @@
         <w:t xml:space="preserve"> </w:t>
       </w:r>
       <w:r>
-        <w:t xml:space="preserve">carries a version (member dialog). Store side writes members unconditionally; load side wraps them in</w:t>
+        <w:t xml:space="preserve">is stamped with the version at which it was added — automatically, as (current document version + 1); the Member dialog shows the stamp. Store side writes members unconditionally; load side wraps them in</w:t>
       </w:r>
       <w:r>
         <w:t xml:space="preserve"> </w:t>
@@ -27437,20 +27537,23 @@
         <w:pStyle w:val="Compact"/>
       </w:pPr>
       <w:r>
-        <w:t xml:space="preserve">Add the member; set its</w:t>
-      </w:r>
-      <w:r>
-        <w:t xml:space="preserve"> </w:t>
-      </w:r>
-      <w:r>
-        <w:rPr>
-          <w:bCs/>
-          <w:b/>
-        </w:rPr>
-        <w:t xml:space="preserve">version to (current document version + 1)</w:t>
-      </w:r>
-      <w:r>
-        <w:t xml:space="preserve">.</w:t>
+        <w:t xml:space="preserve">Add the member — ClassBuilder stamps it</w:t>
+      </w:r>
+      <w:r>
+        <w:t xml:space="preserve"> </w:t>
+      </w:r>
+      <w:r>
+        <w:rPr>
+          <w:bCs/>
+          <w:b/>
+        </w:rPr>
+        <w:t xml:space="preserve">(current document version + 1)</w:t>
+      </w:r>
+      <w:r>
+        <w:t xml:space="preserve"> </w:t>
+      </w:r>
+      <w:r>
+        <w:t xml:space="preserve">by itself.</w:t>
       </w:r>
     </w:p>
     <w:p>
@@ -27462,22 +27565,23 @@
         <w:pStyle w:val="Compact"/>
       </w:pPr>
       <w:r>
-        <w:t xml:space="preserve">Bump the document version (the</w:t>
-      </w:r>
-      <w:r>
-        <w:t xml:space="preserve"> </w:t>
-      </w:r>
-      <w:r>
-        <w:rPr>
-          <w:rStyle w:val="VerbatimChar"/>
-        </w:rPr>
-        <w:t xml:space="preserve">_version</w:t>
-      </w:r>
-      <w:r>
-        <w:t xml:space="preserve"> </w:t>
-      </w:r>
-      <w:r>
-        <w:t xml:space="preserve">initialization) to the same number.</w:t>
+        <w:t xml:space="preserve">Raise</w:t>
+      </w:r>
+      <w:r>
+        <w:t xml:space="preserve"> </w:t>
+      </w:r>
+      <w:r>
+        <w:rPr>
+          <w:iCs/>
+          <w:i/>
+        </w:rPr>
+        <w:t xml:space="preserve">Version</w:t>
+      </w:r>
+      <w:r>
+        <w:t xml:space="preserve"> </w:t>
+      </w:r>
+      <w:r>
+        <w:t xml:space="preserve">in the DataModel dialog to that same number.</w:t>
       </w:r>
     </w:p>
     <w:p>
@@ -27497,19 +27601,7 @@
         <w:pStyle w:val="FirstParagraph"/>
       </w:pPr>
       <w:r>
-        <w:t xml:space="preserve">Old files (smaller stored</w:t>
-      </w:r>
-      <w:r>
-        <w:t xml:space="preserve"> </w:t>
-      </w:r>
-      <w:r>
-        <w:rPr>
-          <w:rStyle w:val="VerbatimChar"/>
-        </w:rPr>
-        <w:t xml:space="preserve">_version</w:t>
-      </w:r>
-      <w:r>
-        <w:t xml:space="preserve">) skip the new field’s read and keep the member’s initial value; new files read it.</w:t>
+        <w:t xml:space="preserve">Old files (written with a smaller version) skip the new field’s read and keep the member’s initial value; new files read it.</w:t>
       </w:r>
       <w:r>
         <w:t xml:space="preserve"> </w:t>
@@ -27525,7 +27617,7 @@
         <w:t xml:space="preserve"> </w:t>
       </w:r>
       <w:r>
-        <w:t xml:space="preserve">if the new member’s version gate is wrong (e.g. left at a value old files already satisfy), load consumes bytes that were never written — the stream misaligns and the</w:t>
+        <w:t xml:space="preserve">if the new member’s version stamp is wrong (e.g. lowered by hand in the Member dialog to a value old files already satisfy), load consumes bytes that were never written — the stream misaligns and the</w:t>
       </w:r>
       <w:r>
         <w:t xml:space="preserve"> </w:t>
@@ -27590,11 +27682,27 @@
         <w:t xml:space="preserve"> </w:t>
       </w:r>
       <w:r>
-        <w:t xml:space="preserve">button (Project Settings) renumbers a long version history down to the minimal equivalent scheme (max used + 1) — cosmetic, but keeps gates readable. Only compact when files older than the compacted scheme no longer need to load.</w:t>
-      </w:r>
-    </w:p>
-    <w:bookmarkEnd w:id="170"/>
-    <w:bookmarkStart w:id="171" w:name="rules-and-properties"/>
+        <w:t xml:space="preserve">button (next to the</w:t>
+      </w:r>
+      <w:r>
+        <w:t xml:space="preserve"> </w:t>
+      </w:r>
+      <w:r>
+        <w:rPr>
+          <w:iCs/>
+          <w:i/>
+        </w:rPr>
+        <w:t xml:space="preserve">Version</w:t>
+      </w:r>
+      <w:r>
+        <w:t xml:space="preserve"> </w:t>
+      </w:r>
+      <w:r>
+        <w:t xml:space="preserve">field in the DataModel dialog) renumbers a long version history down to the minimal equivalent scheme (max used + 1) — cosmetic, but keeps gates readable. Only compact when files older than the compacted scheme no longer need to load.</w:t>
+      </w:r>
+    </w:p>
+    <w:bookmarkEnd w:id="179"/>
+    <w:bookmarkStart w:id="180" w:name="rules-and-properties"/>
     <w:p>
       <w:pPr>
         <w:pStyle w:val="Heading2"/>
@@ -27800,8 +27908,8 @@
         <w:t xml:space="preserve">for streaming (type dialog).</w:t>
       </w:r>
     </w:p>
-    <w:bookmarkEnd w:id="171"/>
-    <w:bookmarkStart w:id="172" w:name="Xe93cc69c5286d8ba9c1392594baf9a373c30c75"/>
+    <w:bookmarkEnd w:id="180"/>
+    <w:bookmarkStart w:id="181" w:name="Xe93cc69c5286d8ba9c1392594baf9a373c30c75"/>
     <w:p>
       <w:pPr>
         <w:pStyle w:val="Heading2"/>
@@ -28011,9 +28119,9 @@
         <w:t xml:space="preserve">Models that already build (like ClassBuilder’s own) are unaffected.</w:t>
       </w:r>
     </w:p>
-    <w:bookmarkEnd w:id="172"/>
-    <w:bookmarkEnd w:id="173"/>
-    <w:bookmarkStart w:id="177" w:name="the-generated-undoredo-framework"/>
+    <w:bookmarkEnd w:id="181"/>
+    <w:bookmarkEnd w:id="182"/>
+    <w:bookmarkStart w:id="186" w:name="the-generated-undoredo-framework"/>
     <w:p>
       <w:pPr>
         <w:pStyle w:val="Heading1"/>
@@ -28022,7 +28130,7 @@
         <w:t xml:space="preserve">The generated Undo/Redo framework</w:t>
       </w:r>
     </w:p>
-    <w:bookmarkStart w:id="174" w:name="what-it-is"/>
+    <w:bookmarkStart w:id="183" w:name="what-it-is"/>
     <w:p>
       <w:pPr>
         <w:pStyle w:val="Heading2"/>
@@ -28071,8 +28179,8 @@
         <w:t xml:space="preserve">generated model — the same machinery ClassBuilder itself uses for its own Edit ▸ Undo/Redo.</w:t>
       </w:r>
     </w:p>
-    <w:bookmarkEnd w:id="174"/>
-    <w:bookmarkStart w:id="175" w:name="how-it-works"/>
+    <w:bookmarkEnd w:id="183"/>
+    <w:bookmarkStart w:id="184" w:name="how-it-works"/>
     <w:p>
       <w:pPr>
         <w:pStyle w:val="Heading2"/>
@@ -28506,8 +28614,8 @@
         <w:t xml:space="preserve">deduplicates: an object already captured in the open step is not snapshotted again.</w:t>
       </w:r>
     </w:p>
-    <w:bookmarkEnd w:id="175"/>
-    <w:bookmarkStart w:id="176" w:name="the-undoreplace-entanglement"/>
+    <w:bookmarkEnd w:id="184"/>
+    <w:bookmarkStart w:id="185" w:name="the-undoreplace-entanglement"/>
     <w:p>
       <w:pPr>
         <w:pStyle w:val="Heading2"/>
@@ -28620,9 +28728,9 @@
         <w:t xml:space="preserve">undos.</w:t>
       </w:r>
     </w:p>
-    <w:bookmarkEnd w:id="176"/>
-    <w:bookmarkEnd w:id="177"/>
-    <w:bookmarkStart w:id="185" w:name="the-replace-constructor"/>
+    <w:bookmarkEnd w:id="185"/>
+    <w:bookmarkEnd w:id="186"/>
+    <w:bookmarkStart w:id="194" w:name="the-replace-constructor"/>
     <w:p>
       <w:pPr>
         <w:pStyle w:val="Heading1"/>
@@ -28631,7 +28739,7 @@
         <w:t xml:space="preserve">The replace constructor</w:t>
       </w:r>
     </w:p>
-    <w:bookmarkStart w:id="182" w:name="the-idea"/>
+    <w:bookmarkStart w:id="191" w:name="the-idea"/>
     <w:p>
       <w:pPr>
         <w:pStyle w:val="Heading2"/>
@@ -28649,24 +28757,24 @@
           <wp:inline>
             <wp:extent cx="5334000" cy="2782956"/>
             <wp:effectExtent b="0" l="0" r="0" t="0"/>
-            <wp:docPr descr="Replace: the new object takes over every relation slot of the old one." title="" id="179" name="Picture"/>
+            <wp:docPr descr="Replace: the new object takes over every relation slot of the old one." title="" id="188" name="Picture"/>
             <a:graphic>
               <a:graphicData uri="http://schemas.openxmlformats.org/drawingml/2006/picture">
                 <pic:pic>
                   <pic:nvPicPr>
-                    <pic:cNvPr descr="images/fig-replace-constructor.svg" id="180" name="Picture"/>
+                    <pic:cNvPr descr="images/fig-replace-constructor.svg" id="189" name="Picture"/>
                     <pic:cNvPicPr>
                       <a:picLocks noChangeArrowheads="1" noChangeAspect="1"/>
                     </pic:cNvPicPr>
                   </pic:nvPicPr>
                   <pic:blipFill>
-                    <a:blip r:embed="rId181">
+                    <a:blip r:embed="rId190">
                       <a:extLst>
                         <a:ext uri="{28A0092B-C50C-407E-A947-70E740481C1C}">
                           <a14:useLocalDpi xmlns:a14="http://schemas.microsoft.com/office/drawing/2010/main" val="0"/>
                         </a:ext>
                         <a:ext uri="{96DAC541-7B7A-43D3-8B79-37D633B846F1}">
-                          <asvg:svgBlip xmlns:asvg="http://schemas.microsoft.com/office/drawing/2016/SVG/main" r:embed="rId178"/>
+                          <asvg:svgBlip xmlns:asvg="http://schemas.microsoft.com/office/drawing/2016/SVG/main" r:embed="rId187"/>
                         </a:ext>
                       </a:extLst>
                     </a:blip>
@@ -28845,8 +28953,8 @@
         <w:t xml:space="preserve">a different class.</w:t>
       </w:r>
     </w:p>
-    <w:bookmarkEnd w:id="182"/>
-    <w:bookmarkStart w:id="183" w:name="why-it-is-more-powerful-than-a-factory"/>
+    <w:bookmarkEnd w:id="191"/>
+    <w:bookmarkStart w:id="192" w:name="why-it-is-more-powerful-than-a-factory"/>
     <w:p>
       <w:pPr>
         <w:pStyle w:val="Heading2"/>
@@ -29510,8 +29618,8 @@
         <w:t xml:space="preserve">is the state — the type system enforces the state chart.</w:t>
       </w:r>
     </w:p>
-    <w:bookmarkEnd w:id="183"/>
-    <w:bookmarkStart w:id="184" w:name="mechanics-and-constraints"/>
+    <w:bookmarkEnd w:id="192"/>
+    <w:bookmarkStart w:id="193" w:name="mechanics-and-constraints"/>
     <w:p>
       <w:pPr>
         <w:pStyle w:val="Heading2"/>
@@ -29614,9 +29722,9 @@
         <w:t xml:space="preserve">: see chapter 14.3 — the undo framework itself replaces objects on restore; mixing both requires redirecting parked undo entries, as ClassBuilder’s own model does.</w:t>
       </w:r>
     </w:p>
-    <w:bookmarkEnd w:id="184"/>
-    <w:bookmarkEnd w:id="185"/>
-    <w:bookmarkStart w:id="191" w:name="the-command-interface"/>
+    <w:bookmarkEnd w:id="193"/>
+    <w:bookmarkEnd w:id="194"/>
+    <w:bookmarkStart w:id="200" w:name="the-command-interface"/>
     <w:p>
       <w:pPr>
         <w:pStyle w:val="Heading1"/>
@@ -29625,7 +29733,7 @@
         <w:t xml:space="preserve">The command interface</w:t>
       </w:r>
     </w:p>
-    <w:bookmarkStart w:id="186" w:name="what-it-is-1"/>
+    <w:bookmarkStart w:id="195" w:name="what-it-is-1"/>
     <w:p>
       <w:pPr>
         <w:pStyle w:val="Heading2"/>
@@ -29828,8 +29936,8 @@
         <w:t xml:space="preserve">; below is the map plus worked examples.</w:t>
       </w:r>
     </w:p>
-    <w:bookmarkEnd w:id="186"/>
-    <w:bookmarkStart w:id="187" w:name="connecting"/>
+    <w:bookmarkEnd w:id="195"/>
+    <w:bookmarkStart w:id="196" w:name="connecting"/>
     <w:p>
       <w:pPr>
         <w:pStyle w:val="Heading2"/>
@@ -30293,8 +30401,8 @@
         <w:t xml:space="preserve">))</w:t>
       </w:r>
     </w:p>
-    <w:bookmarkEnd w:id="187"/>
-    <w:bookmarkStart w:id="188" w:name="the-command-families"/>
+    <w:bookmarkEnd w:id="196"/>
+    <w:bookmarkStart w:id="197" w:name="the-command-families"/>
     <w:p>
       <w:pPr>
         <w:pStyle w:val="Heading2"/>
@@ -31363,8 +31471,8 @@
         </w:tc>
       </w:tr>
     </w:tbl>
-    <w:bookmarkEnd w:id="188"/>
-    <w:bookmarkStart w:id="189" w:name="worked-examples-real-requests"/>
+    <w:bookmarkEnd w:id="197"/>
+    <w:bookmarkStart w:id="198" w:name="worked-examples-real-requests"/>
     <w:p>
       <w:pPr>
         <w:pStyle w:val="Heading2"/>
@@ -32809,7 +32917,7 @@
         <w:rPr>
           <w:rStyle w:val="StringTok"/>
         </w:rPr>
-        <w:t xml:space="preserve">    _version = 2;</w:t>
+        <w:t xml:space="preserve">    for (int c = 0; c &lt; columns; c++)</w:t>
       </w:r>
       <w:r>
         <w:rPr>
@@ -33263,8 +33371,8 @@
         <w:t xml:space="preserve">}}</w:t>
       </w:r>
     </w:p>
-    <w:bookmarkEnd w:id="189"/>
-    <w:bookmarkStart w:id="190" w:name="conventions-and-gotchas"/>
+    <w:bookmarkEnd w:id="198"/>
+    <w:bookmarkStart w:id="199" w:name="conventions-and-gotchas"/>
     <w:p>
       <w:pPr>
         <w:pStyle w:val="Heading2"/>
@@ -33596,9 +33704,9 @@
         <w:t xml:space="preserve">stamp tells you.</w:t>
       </w:r>
     </w:p>
-    <w:bookmarkEnd w:id="190"/>
-    <w:bookmarkEnd w:id="191"/>
-    <w:bookmarkStart w:id="192" w:name="tips-pitfalls-and-best-practices"/>
+    <w:bookmarkEnd w:id="199"/>
+    <w:bookmarkEnd w:id="200"/>
+    <w:bookmarkStart w:id="201" w:name="tips-pitfalls-and-best-practices"/>
     <w:p>
       <w:pPr>
         <w:pStyle w:val="Heading1"/>
@@ -34145,8 +34253,8 @@
         <w:t xml:space="preserve">) for documentation — it is the same renderer as the screen, vector-clean at any size.</w:t>
       </w:r>
     </w:p>
-    <w:bookmarkEnd w:id="192"/>
-    <w:bookmarkStart w:id="196" w:name="appendix"/>
+    <w:bookmarkEnd w:id="201"/>
+    <w:bookmarkStart w:id="205" w:name="appendix"/>
     <w:p>
       <w:pPr>
         <w:pStyle w:val="Heading1"/>
@@ -34155,7 +34263,7 @@
         <w:t xml:space="preserve">Appendix</w:t>
       </w:r>
     </w:p>
-    <w:bookmarkStart w:id="193" w:name="a.-runtime-header-inventory"/>
+    <w:bookmarkStart w:id="202" w:name="a.-runtime-header-inventory"/>
     <w:p>
       <w:pPr>
         <w:pStyle w:val="Heading2"/>
@@ -34706,8 +34814,8 @@
         </w:tc>
       </w:tr>
     </w:tbl>
-    <w:bookmarkEnd w:id="193"/>
-    <w:bookmarkStart w:id="194" w:name="b.-marker-quick-reference"/>
+    <w:bookmarkEnd w:id="202"/>
+    <w:bookmarkStart w:id="203" w:name="b.-marker-quick-reference"/>
     <w:p>
       <w:pPr>
         <w:pStyle w:val="Heading2"/>
@@ -34781,8 +34889,8 @@
         <w:t xml:space="preserve">@INSERT_MODIFICATIONS(* )             per-file change log insertion point</w:t>
       </w:r>
     </w:p>
-    <w:bookmarkEnd w:id="194"/>
-    <w:bookmarkStart w:id="195" w:name="c.-glossary"/>
+    <w:bookmarkEnd w:id="203"/>
+    <w:bookmarkStart w:id="204" w:name="c.-glossary"/>
     <w:p>
       <w:pPr>
         <w:pStyle w:val="Heading2"/>
@@ -35118,8 +35226,8 @@
         </w:tc>
       </w:tr>
     </w:tbl>
-    <w:bookmarkEnd w:id="195"/>
-    <w:bookmarkEnd w:id="196"/>
+    <w:bookmarkEnd w:id="204"/>
+    <w:bookmarkEnd w:id="205"/>
     <w:sectPr/>
   </w:body>
 </w:document>

</xml_diff>

<commit_message>
docs(manual): re-shot Find Method figure without stray condition
JV re-created FindRow and re-captured: the code window with the
leftover `a ==` condition is gone; the shot is now tree + Find Method
dialog. Caption updated to match the new composition.

Co-Authored-By: Claude Fable 5 <noreply@anthropic.com>
</commit_message>
<xml_diff>
--- a/docs/manual/ClassBuilder_Manual.docx
+++ b/docs/manual/ClassBuilder_Manual.docx
@@ -5304,9 +5304,9 @@
       <w:r>
         <w:drawing>
           <wp:inline>
-            <wp:extent cx="5334000" cy="3365899"/>
+            <wp:extent cx="5334000" cy="3242844"/>
             <wp:effectExtent b="0" l="0" r="0" t="0"/>
-            <wp:docPr descr="The Find Method dialog on the Matrix→Row relation: the argument map on the left pairs the method’s arguments with the members to compare — here -&gt;GetId(). Behind it the generated Matrix::FindRow in its code window, and the method in the tree under the class’s Relation methods." title="" id="56" name="Picture"/>
+            <wp:docPr descr="The Find Method dialog on the Matrix→Row relation: the argument map pairs the method’s arguments with the members to compare — here -&gt;GetId(). In the tree behind it, the generated method lands under the class’s Relation methods folder." title="" id="56" name="Picture"/>
             <a:graphic>
               <a:graphicData uri="http://schemas.openxmlformats.org/drawingml/2006/picture">
                 <pic:pic>
@@ -5325,7 +5325,7 @@
                   <pic:spPr bwMode="auto">
                     <a:xfrm>
                       <a:off x="0" y="0"/>
-                      <a:ext cx="5334000" cy="3365899"/>
+                      <a:ext cx="5334000" cy="3242844"/>
                     </a:xfrm>
                     <a:prstGeom prst="rect">
                       <a:avLst/>
@@ -5349,7 +5349,7 @@
         <w:pStyle w:val="ImageCaption"/>
       </w:pPr>
       <w:r>
-        <w:t xml:space="preserve">The Find Method dialog on the Matrix→Row relation: the argument map on the left pairs the method’s arguments with the members to compare — here</w:t>
+        <w:t xml:space="preserve">The Find Method dialog on the Matrix→Row relation: the argument map pairs the method’s arguments with the members to compare — here</w:t>
       </w:r>
       <w:r>
         <w:t xml:space="preserve"> </w:t>
@@ -5361,22 +5361,23 @@
         <w:t xml:space="preserve">-&gt;GetId()</w:t>
       </w:r>
       <w:r>
-        <w:t xml:space="preserve">. Behind it the generated</w:t>
-      </w:r>
-      <w:r>
-        <w:t xml:space="preserve"> </w:t>
-      </w:r>
-      <w:r>
-        <w:rPr>
-          <w:rStyle w:val="VerbatimChar"/>
-        </w:rPr>
-        <w:t xml:space="preserve">Matrix::FindRow</w:t>
-      </w:r>
-      <w:r>
-        <w:t xml:space="preserve"> </w:t>
-      </w:r>
-      <w:r>
-        <w:t xml:space="preserve">in its code window, and the method in the tree under the class’s Relation methods.</w:t>
+        <w:t xml:space="preserve">. In the tree behind it, the generated method lands under the class’s</w:t>
+      </w:r>
+      <w:r>
+        <w:t xml:space="preserve"> </w:t>
+      </w:r>
+      <w:r>
+        <w:rPr>
+          <w:iCs/>
+          <w:i/>
+        </w:rPr>
+        <w:t xml:space="preserve">Relation methods</w:t>
+      </w:r>
+      <w:r>
+        <w:t xml:space="preserve"> </w:t>
+      </w:r>
+      <w:r>
+        <w:t xml:space="preserve">folder.</w:t>
       </w:r>
     </w:p>
     <w:p>

</xml_diff>

<commit_message>
docs(manual): regenerate docx (caption fix, five classes, tight diagram figure)
Co-Authored-By: Claude Fable 5 <noreply@anthropic.com>
</commit_message>
<xml_diff>
--- a/docs/manual/ClassBuilder_Manual.docx
+++ b/docs/manual/ClassBuilder_Manual.docx
@@ -5306,7 +5306,7 @@
           <wp:inline>
             <wp:extent cx="5334000" cy="3242844"/>
             <wp:effectExtent b="0" l="0" r="0" t="0"/>
-            <wp:docPr descr="The Find Method dialog on the Matrix→Row relation: the argument map pairs the method’s arguments with the members to compare — here -&gt;GetId(). In the tree behind it, the generated method lands under the class’s Relation methods folder." title="" id="56" name="Picture"/>
+            <wp:docPr descr="The Find Method dialog on the Matrix→Row relation: the argument map pairs the method’s arguments with the members to compare — here -&gt;GetId(). In the tree behind it, the generated method appears as a child of the Row relation item, as a sibling above its Relation methods folder." title="" id="56" name="Picture"/>
             <a:graphic>
               <a:graphicData uri="http://schemas.openxmlformats.org/drawingml/2006/picture">
                 <pic:pic>
@@ -5361,7 +5361,7 @@
         <w:t xml:space="preserve">-&gt;GetId()</w:t>
       </w:r>
       <w:r>
-        <w:t xml:space="preserve">. In the tree behind it, the generated method lands under the class’s</w:t>
+        <w:t xml:space="preserve">. In the tree behind it, the generated method appears as a child of the</w:t>
       </w:r>
       <w:r>
         <w:t xml:space="preserve"> </w:t>
@@ -5371,6 +5371,22 @@
           <w:iCs/>
           <w:i/>
         </w:rPr>
+        <w:t xml:space="preserve">Row</w:t>
+      </w:r>
+      <w:r>
+        <w:t xml:space="preserve"> </w:t>
+      </w:r>
+      <w:r>
+        <w:t xml:space="preserve">relation item, as a sibling above its</w:t>
+      </w:r>
+      <w:r>
+        <w:t xml:space="preserve"> </w:t>
+      </w:r>
+      <w:r>
+        <w:rPr>
+          <w:iCs/>
+          <w:i/>
+        </w:rPr>
         <w:t xml:space="preserve">Relation methods</w:t>
       </w:r>
       <w:r>
@@ -5761,7 +5777,7 @@
         <w:t xml:space="preserve">Matrix Overview</w:t>
       </w:r>
       <w:r>
-        <w:t xml:space="preserve">, and add the four classes (</w:t>
+        <w:t xml:space="preserve">, and add the five classes (</w:t>
       </w:r>
       <w:r>
         <w:rPr>
@@ -5798,7 +5814,7 @@
       <w:r>
         <w:drawing>
           <wp:inline>
-            <wp:extent cx="5334000" cy="3212933"/>
+            <wp:extent cx="5334000" cy="3170559"/>
             <wp:effectExtent b="0" l="0" r="0" t="0"/>
             <wp:docPr descr="The Matrix Overview class diagram as exported by ClassBuilder (Export SVG). Diamonds mark owned (aggregation) relations; 1/* are the multiplicities." title="" id="60" name="Picture"/>
             <a:graphic>
@@ -5828,7 +5844,7 @@
                   <pic:spPr bwMode="auto">
                     <a:xfrm>
                       <a:off x="0" y="0"/>
-                      <a:ext cx="5334000" cy="3212933"/>
+                      <a:ext cx="5334000" cy="3170559"/>
                     </a:xfrm>
                     <a:prstGeom prst="rect">
                       <a:avLst/>

</xml_diff>

<commit_message>
docs(manual): main + tree toolbar figures; table order matches the real bar
JV''s toolbar strips replace the two [FIGURE] placeholders (files renamed
to underscore names for markdown/pandoc-safe paths). The screenshot
exposed that the tree-toolbar table listed Add Argument/Type in the
wrong position: the real order is Constructor, Type, Virtual Methods,
IsClass Methods, Argument, Actor. Docx regenerated.

Co-Authored-By: Claude Fable 5 <noreply@anthropic.com>
</commit_message>
<xml_diff>
--- a/docs/manual/ClassBuilder_Manual.docx
+++ b/docs/manual/ClassBuilder_Manual.docx
@@ -3046,7 +3046,7 @@
     </w:p>
     <w:bookmarkEnd w:id="33"/>
     <w:bookmarkEnd w:id="34"/>
-    <w:bookmarkStart w:id="70" w:name="quick-start-the-matrix-model"/>
+    <w:bookmarkStart w:id="76" w:name="quick-start-the-matrix-model"/>
     <w:p>
       <w:pPr>
         <w:pStyle w:val="Heading1"/>
@@ -5738,7 +5738,7 @@
       </w:r>
     </w:p>
     <w:bookmarkEnd w:id="58"/>
-    <w:bookmarkStart w:id="66" w:name="step-7-a-class-diagram"/>
+    <w:bookmarkStart w:id="72" w:name="step-7-a-class-diagram"/>
     <w:p>
       <w:pPr>
         <w:pStyle w:val="Heading2"/>
@@ -5880,7 +5880,7 @@
           <wp:inline>
             <wp:extent cx="5334000" cy="3757996"/>
             <wp:effectExtent b="0" l="0" r="0" t="0"/>
-            <wp:docPr descr="A class-diagram view opens as a dockable window over the shell — dock it, tab it, or float it." title="" id="64" name="Picture"/>
+            <wp:docPr descr="A diagram view opens floating over the shell — this is the initial state of every diagram view." title="" id="64" name="Picture"/>
             <a:graphic>
               <a:graphicData uri="http://schemas.openxmlformats.org/drawingml/2006/picture">
                 <pic:pic>
@@ -5923,11 +5923,163 @@
         <w:pStyle w:val="ImageCaption"/>
       </w:pPr>
       <w:r>
-        <w:t xml:space="preserve">A class-diagram view opens as a dockable window over the shell — dock it, tab it, or float it.</w:t>
-      </w:r>
-    </w:p>
-    <w:bookmarkEnd w:id="66"/>
-    <w:bookmarkStart w:id="67" w:name="step-8-generate-the-source"/>
+        <w:t xml:space="preserve">A diagram view opens</w:t>
+      </w:r>
+      <w:r>
+        <w:t xml:space="preserve"> </w:t>
+      </w:r>
+      <w:r>
+        <w:rPr>
+          <w:bCs/>
+          <w:b/>
+        </w:rPr>
+        <w:t xml:space="preserve">floating</w:t>
+      </w:r>
+      <w:r>
+        <w:t xml:space="preserve"> </w:t>
+      </w:r>
+      <w:r>
+        <w:t xml:space="preserve">over the shell — this is the initial state of every diagram view.</w:t>
+      </w:r>
+    </w:p>
+    <w:p>
+      <w:pPr>
+        <w:pStyle w:val="CaptionedFigure"/>
+      </w:pPr>
+      <w:r>
+        <w:drawing>
+          <wp:inline>
+            <wp:extent cx="5334000" cy="4302439"/>
+            <wp:effectExtent b="0" l="0" r="0" t="0"/>
+            <wp:docPr descr="The same view docked: drag it onto an edge of the main window — here the right edge, giving the usual tree-beside-diagram split; the top and bottom edges split horizontally the same way." title="" id="67" name="Picture"/>
+            <a:graphic>
+              <a:graphicData uri="http://schemas.openxmlformats.org/drawingml/2006/picture">
+                <pic:pic>
+                  <pic:nvPicPr>
+                    <pic:cNvPr descr="images/Docked.png" id="68" name="Picture"/>
+                    <pic:cNvPicPr>
+                      <a:picLocks noChangeArrowheads="1" noChangeAspect="1"/>
+                    </pic:cNvPicPr>
+                  </pic:nvPicPr>
+                  <pic:blipFill>
+                    <a:blip r:embed="rId66"/>
+                    <a:stretch>
+                      <a:fillRect/>
+                    </a:stretch>
+                  </pic:blipFill>
+                  <pic:spPr bwMode="auto">
+                    <a:xfrm>
+                      <a:off x="0" y="0"/>
+                      <a:ext cx="5334000" cy="4302439"/>
+                    </a:xfrm>
+                    <a:prstGeom prst="rect">
+                      <a:avLst/>
+                    </a:prstGeom>
+                    <a:noFill/>
+                    <a:ln w="9525">
+                      <a:noFill/>
+                      <a:headEnd/>
+                      <a:tailEnd/>
+                    </a:ln>
+                  </pic:spPr>
+                </pic:pic>
+              </a:graphicData>
+            </a:graphic>
+          </wp:inline>
+        </w:drawing>
+      </w:r>
+    </w:p>
+    <w:p>
+      <w:pPr>
+        <w:pStyle w:val="ImageCaption"/>
+      </w:pPr>
+      <w:r>
+        <w:t xml:space="preserve">The same view</w:t>
+      </w:r>
+      <w:r>
+        <w:t xml:space="preserve"> </w:t>
+      </w:r>
+      <w:r>
+        <w:rPr>
+          <w:bCs/>
+          <w:b/>
+        </w:rPr>
+        <w:t xml:space="preserve">docked</w:t>
+      </w:r>
+      <w:r>
+        <w:t xml:space="preserve">: drag it onto an edge of the main window — here the right edge, giving the usual tree-beside-diagram split; the top and bottom edges split horizontally the same way.</w:t>
+      </w:r>
+    </w:p>
+    <w:p>
+      <w:pPr>
+        <w:pStyle w:val="CaptionedFigure"/>
+      </w:pPr>
+      <w:r>
+        <w:drawing>
+          <wp:inline>
+            <wp:extent cx="5334000" cy="4302439"/>
+            <wp:effectExtent b="0" l="0" r="0" t="0"/>
+            <wp:docPr descr="Or tabbed: drop it onto the tree’s tab bar and the views share the full window, one tab each." title="" id="70" name="Picture"/>
+            <a:graphic>
+              <a:graphicData uri="http://schemas.openxmlformats.org/drawingml/2006/picture">
+                <pic:pic>
+                  <pic:nvPicPr>
+                    <pic:cNvPr descr="images/Tabbed.png" id="71" name="Picture"/>
+                    <pic:cNvPicPr>
+                      <a:picLocks noChangeArrowheads="1" noChangeAspect="1"/>
+                    </pic:cNvPicPr>
+                  </pic:nvPicPr>
+                  <pic:blipFill>
+                    <a:blip r:embed="rId69"/>
+                    <a:stretch>
+                      <a:fillRect/>
+                    </a:stretch>
+                  </pic:blipFill>
+                  <pic:spPr bwMode="auto">
+                    <a:xfrm>
+                      <a:off x="0" y="0"/>
+                      <a:ext cx="5334000" cy="4302439"/>
+                    </a:xfrm>
+                    <a:prstGeom prst="rect">
+                      <a:avLst/>
+                    </a:prstGeom>
+                    <a:noFill/>
+                    <a:ln w="9525">
+                      <a:noFill/>
+                      <a:headEnd/>
+                      <a:tailEnd/>
+                    </a:ln>
+                  </pic:spPr>
+                </pic:pic>
+              </a:graphicData>
+            </a:graphic>
+          </wp:inline>
+        </w:drawing>
+      </w:r>
+    </w:p>
+    <w:p>
+      <w:pPr>
+        <w:pStyle w:val="ImageCaption"/>
+      </w:pPr>
+      <w:r>
+        <w:t xml:space="preserve">Or</w:t>
+      </w:r>
+      <w:r>
+        <w:t xml:space="preserve"> </w:t>
+      </w:r>
+      <w:r>
+        <w:rPr>
+          <w:bCs/>
+          <w:b/>
+        </w:rPr>
+        <w:t xml:space="preserve">tabbed</w:t>
+      </w:r>
+      <w:r>
+        <w:t xml:space="preserve">: drop it onto the tree’s tab bar and the views share the full window, one tab each.</w:t>
+      </w:r>
+    </w:p>
+    <w:bookmarkEnd w:id="72"/>
+    <w:bookmarkStart w:id="73" w:name="step-8-generate-the-source"/>
     <w:p>
       <w:pPr>
         <w:pStyle w:val="Heading2"/>
@@ -7038,8 +7190,8 @@
         <w:t xml:space="preserve">bodies (chapter 11 lists every editable region).</w:t>
       </w:r>
     </w:p>
-    <w:bookmarkEnd w:id="67"/>
-    <w:bookmarkStart w:id="68" w:name="step-9-compile-and-run"/>
+    <w:bookmarkEnd w:id="73"/>
+    <w:bookmarkStart w:id="74" w:name="step-9-compile-and-run"/>
     <w:p>
       <w:pPr>
         <w:pStyle w:val="Heading2"/>
@@ -8575,8 +8727,8 @@
         <w:t xml:space="preserve">— the loop just continued. The whole surviving structure round-tripped through a compressed binary file. That is the value proposition of ClassBuilder in eleven lines of console output.</w:t>
       </w:r>
     </w:p>
-    <w:bookmarkEnd w:id="68"/>
-    <w:bookmarkStart w:id="69" w:name="step-10-the-round-trip"/>
+    <w:bookmarkEnd w:id="74"/>
+    <w:bookmarkStart w:id="75" w:name="step-10-the-round-trip"/>
     <w:p>
       <w:pPr>
         <w:pStyle w:val="Heading2"/>
@@ -8649,9 +8801,9 @@
         <w:t xml:space="preserve">): the model absorbs your edit. If ClassBuilder itself has the file’s model open when the source changes, it offers the read-back automatically — accept it, or your next Write Source will overwrite the edit. Model ↔ source is a two-way street.</w:t>
       </w:r>
     </w:p>
-    <w:bookmarkEnd w:id="69"/>
-    <w:bookmarkEnd w:id="70"/>
-    <w:bookmarkStart w:id="75" w:name="reference-the-application-shell"/>
+    <w:bookmarkEnd w:id="75"/>
+    <w:bookmarkEnd w:id="76"/>
+    <w:bookmarkStart w:id="84" w:name="reference-the-application-shell"/>
     <w:p>
       <w:pPr>
         <w:pStyle w:val="Heading1"/>
@@ -8660,7 +8812,7 @@
         <w:t xml:space="preserve">Reference: the application shell</w:t>
       </w:r>
     </w:p>
-    <w:bookmarkStart w:id="71" w:name="menus"/>
+    <w:bookmarkStart w:id="77" w:name="menus"/>
     <w:p>
       <w:pPr>
         <w:pStyle w:val="Heading2"/>
@@ -8984,8 +9136,8 @@
         <w:t xml:space="preserve">enlarges the whole application — text, icons, dialogs — independently of the operating system’s display scaling: useful on a monitor whose system scaling you don’t want to change, or when ClassBuilder alone should be bigger. It is a per-machine setting (stored per user, not in the model) and takes effect after a restart — picking a scale offers to restart ClassBuilder right away. Not to be confused with the Zoom items, which magnify only the active diagram canvas.</w:t>
       </w:r>
     </w:p>
-    <w:bookmarkEnd w:id="71"/>
-    <w:bookmarkStart w:id="72" w:name="the-main-toolbar"/>
+    <w:bookmarkEnd w:id="77"/>
+    <w:bookmarkStart w:id="81" w:name="the-main-toolbar"/>
     <w:p>
       <w:pPr>
         <w:pStyle w:val="Heading2"/>
@@ -9296,24 +9448,61 @@
     </w:p>
     <w:p>
       <w:pPr>
-        <w:pStyle w:val="BlockText"/>
-      </w:pPr>
-      <w:r>
-        <w:rPr>
-          <w:bCs/>
-          <w:b/>
-        </w:rPr>
-        <w:t xml:space="preserve">[FIGURE: Main toolbar]</w:t>
-      </w:r>
-      <w:r>
-        <w:t xml:space="preserve"> </w:t>
-      </w:r>
-      <w:r>
-        <w:t xml:space="preserve">— cropped strip of the main window toolbar (New / Open / Save / Read Source / Write Source).</w:t>
-      </w:r>
-    </w:p>
-    <w:bookmarkEnd w:id="72"/>
-    <w:bookmarkStart w:id="73" w:name="docking"/>
+        <w:pStyle w:val="CaptionedFigure"/>
+      </w:pPr>
+      <w:r>
+        <w:drawing>
+          <wp:inline>
+            <wp:extent cx="5307773" cy="497603"/>
+            <wp:effectExtent b="0" l="0" r="0" t="0"/>
+            <wp:docPr descr="The main toolbar: New, Open, Save, then Read Source and Write Source." title="" id="79" name="Picture"/>
+            <a:graphic>
+              <a:graphicData uri="http://schemas.openxmlformats.org/drawingml/2006/picture">
+                <pic:pic>
+                  <pic:nvPicPr>
+                    <pic:cNvPr descr="images/Main_Toolbar.png" id="80" name="Picture"/>
+                    <pic:cNvPicPr>
+                      <a:picLocks noChangeArrowheads="1" noChangeAspect="1"/>
+                    </pic:cNvPicPr>
+                  </pic:nvPicPr>
+                  <pic:blipFill>
+                    <a:blip r:embed="rId78"/>
+                    <a:stretch>
+                      <a:fillRect/>
+                    </a:stretch>
+                  </pic:blipFill>
+                  <pic:spPr bwMode="auto">
+                    <a:xfrm>
+                      <a:off x="0" y="0"/>
+                      <a:ext cx="5307773" cy="497603"/>
+                    </a:xfrm>
+                    <a:prstGeom prst="rect">
+                      <a:avLst/>
+                    </a:prstGeom>
+                    <a:noFill/>
+                    <a:ln w="9525">
+                      <a:noFill/>
+                      <a:headEnd/>
+                      <a:tailEnd/>
+                    </a:ln>
+                  </pic:spPr>
+                </pic:pic>
+              </a:graphicData>
+            </a:graphic>
+          </wp:inline>
+        </w:drawing>
+      </w:r>
+    </w:p>
+    <w:p>
+      <w:pPr>
+        <w:pStyle w:val="ImageCaption"/>
+      </w:pPr>
+      <w:r>
+        <w:t xml:space="preserve">The main toolbar: New, Open, Save, then Read Source and Write Source.</w:t>
+      </w:r>
+    </w:p>
+    <w:bookmarkEnd w:id="81"/>
+    <w:bookmarkStart w:id="82" w:name="docking"/>
     <w:p>
       <w:pPr>
         <w:pStyle w:val="Heading2"/>
@@ -9458,8 +9647,8 @@
         <w:t xml:space="preserve">Closing a model’s tab closes the model (with a save prompt when modified).</w:t>
       </w:r>
     </w:p>
-    <w:bookmarkEnd w:id="73"/>
-    <w:bookmarkStart w:id="74" w:name="platforms-and-keys"/>
+    <w:bookmarkEnd w:id="82"/>
+    <w:bookmarkStart w:id="83" w:name="platforms-and-keys"/>
     <w:p>
       <w:pPr>
         <w:pStyle w:val="Heading2"/>
@@ -9598,9 +9787,9 @@
         <w:t xml:space="preserve">shows Width/Height/X/Y of the shape under the cursor in diagram views.</w:t>
       </w:r>
     </w:p>
-    <w:bookmarkEnd w:id="74"/>
-    <w:bookmarkEnd w:id="75"/>
-    <w:bookmarkStart w:id="82" w:name="reference-the-main-tree-view"/>
+    <w:bookmarkEnd w:id="83"/>
+    <w:bookmarkEnd w:id="84"/>
+    <w:bookmarkStart w:id="94" w:name="reference-the-main-tree-view"/>
     <w:p>
       <w:pPr>
         <w:pStyle w:val="Heading1"/>
@@ -9617,7 +9806,7 @@
         <w:t xml:space="preserve">The tree is the master view of a model: every element of the model, shown in its structure. Several models can be open at the same time — each model’s tree gets its own tab in the main window — and like every other view it can also be split off or floated (chapter 5.3).</w:t>
       </w:r>
     </w:p>
-    <w:bookmarkStart w:id="76" w:name="what-the-tree-shows"/>
+    <w:bookmarkStart w:id="85" w:name="what-the-tree-shows"/>
     <w:p>
       <w:pPr>
         <w:pStyle w:val="Heading2"/>
@@ -9692,8 +9881,8 @@
         <w:t xml:space="preserve">in their own folder — visible but owned by the generator. Every node type has its own icon; with Phase Support on, a phase glyph joins it.</w:t>
       </w:r>
     </w:p>
-    <w:bookmarkEnd w:id="76"/>
-    <w:bookmarkStart w:id="77" w:name="the-tree-toolbar"/>
+    <w:bookmarkEnd w:id="85"/>
+    <w:bookmarkStart w:id="89" w:name="the-tree-toolbar"/>
     <w:p>
       <w:pPr>
         <w:pStyle w:val="Heading2"/>
@@ -10048,7 +10237,7 @@
               <w:jc w:val="left"/>
             </w:pPr>
             <w:r>
-              <w:t xml:space="preserve">Add Argument</w:t>
+              <w:t xml:space="preserve">Add Type</w:t>
             </w:r>
           </w:p>
         </w:tc>
@@ -10063,7 +10252,7 @@
               <w:rPr>
                 <w:rStyle w:val="VerbatimChar"/>
               </w:rPr>
-              <w:t xml:space="preserve">Ctrl+Shift+A</w:t>
+              <w:t xml:space="preserve">Ctrl+Shift+Y</w:t>
             </w:r>
           </w:p>
         </w:tc>
@@ -10075,7 +10264,7 @@
               <w:jc w:val="left"/>
             </w:pPr>
             <w:r>
-              <w:t xml:space="preserve">argument</w:t>
+              <w:t xml:space="preserve">type block</w:t>
             </w:r>
           </w:p>
         </w:tc>
@@ -10171,7 +10360,7 @@
               <w:jc w:val="left"/>
             </w:pPr>
             <w:r>
-              <w:t xml:space="preserve">Add Type</w:t>
+              <w:t xml:space="preserve">Add Argument</w:t>
             </w:r>
           </w:p>
         </w:tc>
@@ -10186,7 +10375,7 @@
               <w:rPr>
                 <w:rStyle w:val="VerbatimChar"/>
               </w:rPr>
-              <w:t xml:space="preserve">Ctrl+Shift+Y</w:t>
+              <w:t xml:space="preserve">Ctrl+Shift+A</w:t>
             </w:r>
           </w:p>
         </w:tc>
@@ -10198,7 +10387,7 @@
               <w:jc w:val="left"/>
             </w:pPr>
             <w:r>
-              <w:t xml:space="preserve">type block</w:t>
+              <w:t xml:space="preserve">argument</w:t>
             </w:r>
           </w:p>
         </w:tc>
@@ -10591,25 +10780,62 @@
     </w:p>
     <w:p>
       <w:pPr>
-        <w:pStyle w:val="BlockText"/>
-      </w:pPr>
-      <w:r>
-        <w:rPr>
-          <w:bCs/>
-          <w:b/>
-        </w:rPr>
-        <w:t xml:space="preserve">[FIGURE: Tree toolbar]</w:t>
-      </w:r>
-      <w:r>
-        <w:t xml:space="preserve"> </w:t>
-      </w:r>
-      <w:r>
-        <w:t xml:space="preserve">— cropped strip of the tree toolbar, wide enough to label each button in the caption.</w:t>
-      </w:r>
-    </w:p>
-    <w:p>
-      <w:pPr>
-        <w:pStyle w:val="FirstParagraph"/>
+        <w:pStyle w:val="CaptionedFigure"/>
+      </w:pPr>
+      <w:r>
+        <w:drawing>
+          <wp:inline>
+            <wp:extent cx="5334000" cy="307193"/>
+            <wp:effectExtent b="0" l="0" r="0" t="0"/>
+            <wp:docPr descr="The tree toolbar, in the order of the table above: the Add buttons, then Delete, Filters, Find/Next, and the per-view Undo/Redo." title="" id="87" name="Picture"/>
+            <a:graphic>
+              <a:graphicData uri="http://schemas.openxmlformats.org/drawingml/2006/picture">
+                <pic:pic>
+                  <pic:nvPicPr>
+                    <pic:cNvPr descr="images/Tree_Toolbar.png" id="88" name="Picture"/>
+                    <pic:cNvPicPr>
+                      <a:picLocks noChangeArrowheads="1" noChangeAspect="1"/>
+                    </pic:cNvPicPr>
+                  </pic:nvPicPr>
+                  <pic:blipFill>
+                    <a:blip r:embed="rId86"/>
+                    <a:stretch>
+                      <a:fillRect/>
+                    </a:stretch>
+                  </pic:blipFill>
+                  <pic:spPr bwMode="auto">
+                    <a:xfrm>
+                      <a:off x="0" y="0"/>
+                      <a:ext cx="5334000" cy="307193"/>
+                    </a:xfrm>
+                    <a:prstGeom prst="rect">
+                      <a:avLst/>
+                    </a:prstGeom>
+                    <a:noFill/>
+                    <a:ln w="9525">
+                      <a:noFill/>
+                      <a:headEnd/>
+                      <a:tailEnd/>
+                    </a:ln>
+                  </pic:spPr>
+                </pic:pic>
+              </a:graphicData>
+            </a:graphic>
+          </wp:inline>
+        </w:drawing>
+      </w:r>
+    </w:p>
+    <w:p>
+      <w:pPr>
+        <w:pStyle w:val="ImageCaption"/>
+      </w:pPr>
+      <w:r>
+        <w:t xml:space="preserve">The tree toolbar, in the order of the table above: the Add buttons, then Delete, Filters, Find/Next, and the per-view Undo/Redo.</w:t>
+      </w:r>
+    </w:p>
+    <w:p>
+      <w:pPr>
+        <w:pStyle w:val="BodyText"/>
       </w:pPr>
       <w:r>
         <w:t xml:space="preserve">The element icons themselves (class, member, method, relation…) encode access as color variants (public/protected/private) and state (inline, empty-body); they are the same icons used in the diagrams, drawn from SVG with the legacy</w:t>
@@ -10630,8 +10856,8 @@
         <w:t xml:space="preserve">set as fallback.</w:t>
       </w:r>
     </w:p>
-    <w:bookmarkEnd w:id="77"/>
-    <w:bookmarkStart w:id="78" w:name="the-context-menu"/>
+    <w:bookmarkEnd w:id="89"/>
+    <w:bookmarkStart w:id="90" w:name="the-context-menu"/>
     <w:p>
       <w:pPr>
         <w:pStyle w:val="Heading2"/>
@@ -11112,8 +11338,8 @@
         <w:t xml:space="preserve">node, with the Add submenu expanded.</w:t>
       </w:r>
     </w:p>
-    <w:bookmarkEnd w:id="78"/>
-    <w:bookmarkStart w:id="79" w:name="filters"/>
+    <w:bookmarkEnd w:id="90"/>
+    <w:bookmarkStart w:id="91" w:name="filters"/>
     <w:p>
       <w:pPr>
         <w:pStyle w:val="Heading2"/>
@@ -11206,8 +11432,8 @@
         <w:t xml:space="preserve">”</w:t>
       </w:r>
     </w:p>
-    <w:bookmarkEnd w:id="79"/>
-    <w:bookmarkStart w:id="80" w:name="delete-multiple"/>
+    <w:bookmarkEnd w:id="91"/>
+    <w:bookmarkStart w:id="92" w:name="delete-multiple"/>
     <w:p>
       <w:pPr>
         <w:pStyle w:val="Heading2"/>
@@ -11296,8 +11522,8 @@
         <w:t xml:space="preserve">”</w:t>
       </w:r>
     </w:p>
-    <w:bookmarkEnd w:id="80"/>
-    <w:bookmarkStart w:id="81" w:name="drag-and-copy-drag"/>
+    <w:bookmarkEnd w:id="92"/>
+    <w:bookmarkStart w:id="93" w:name="drag-and-copy-drag"/>
     <w:p>
       <w:pPr>
         <w:pStyle w:val="Heading2"/>
@@ -11581,9 +11807,9 @@
         <w:t xml:space="preserve">: a class or actor drops as a new lifeline.</w:t>
       </w:r>
     </w:p>
-    <w:bookmarkEnd w:id="81"/>
-    <w:bookmarkEnd w:id="82"/>
-    <w:bookmarkStart w:id="96" w:name="reference-class-diagrams"/>
+    <w:bookmarkEnd w:id="93"/>
+    <w:bookmarkEnd w:id="94"/>
+    <w:bookmarkStart w:id="108" w:name="reference-class-diagrams"/>
     <w:p>
       <w:pPr>
         <w:pStyle w:val="Heading1"/>
@@ -11650,7 +11876,7 @@
         <w:t xml:space="preserve">”</w:t>
       </w:r>
     </w:p>
-    <w:bookmarkStart w:id="83" w:name="reading-the-diagram"/>
+    <w:bookmarkStart w:id="95" w:name="reading-the-diagram"/>
     <w:p>
       <w:pPr>
         <w:pStyle w:val="Heading2"/>
@@ -11877,8 +12103,8 @@
         <w:t xml:space="preserve">: free-text boxes, attachable by connection points to other shapes.</w:t>
       </w:r>
     </w:p>
-    <w:bookmarkEnd w:id="83"/>
-    <w:bookmarkStart w:id="84" w:name="selection"/>
+    <w:bookmarkEnd w:id="95"/>
+    <w:bookmarkStart w:id="96" w:name="selection"/>
     <w:p>
       <w:pPr>
         <w:pStyle w:val="Heading2"/>
@@ -12115,8 +12341,8 @@
         <w:t xml:space="preserve">A right-click on an unselected shape selects it first, then opens the context menu.</w:t>
       </w:r>
     </w:p>
-    <w:bookmarkEnd w:id="84"/>
-    <w:bookmarkStart w:id="85" w:name="moving-and-resizing"/>
+    <w:bookmarkEnd w:id="96"/>
+    <w:bookmarkStart w:id="97" w:name="moving-and-resizing"/>
     <w:p>
       <w:pPr>
         <w:pStyle w:val="Heading2"/>
@@ -12195,8 +12421,8 @@
         <w:t xml:space="preserve">off (re-enable via the context menu).</w:t>
       </w:r>
     </w:p>
-    <w:bookmarkEnd w:id="85"/>
-    <w:bookmarkStart w:id="86" w:name="editing-connection-routing"/>
+    <w:bookmarkEnd w:id="97"/>
+    <w:bookmarkStart w:id="98" w:name="editing-connection-routing"/>
     <w:p>
       <w:pPr>
         <w:pStyle w:val="Heading2"/>
@@ -12371,8 +12597,8 @@
         <w:t xml:space="preserve">(relation role names and multiplicities, dependency name/stereotype) are draggable on a selected connection (four-arrow cursor, snaps to the grid). Once moved, a label stays where you put it.</w:t>
       </w:r>
     </w:p>
-    <w:bookmarkEnd w:id="86"/>
-    <w:bookmarkStart w:id="87" w:name="members-and-methods-inside-the-box"/>
+    <w:bookmarkEnd w:id="98"/>
+    <w:bookmarkStart w:id="99" w:name="members-and-methods-inside-the-box"/>
     <w:p>
       <w:pPr>
         <w:pStyle w:val="Heading2"/>
@@ -12440,8 +12666,8 @@
         <w:t xml:space="preserve">Arrow keys walk the rows of a class (header ↔ members ↔ methods).</w:t>
       </w:r>
     </w:p>
-    <w:bookmarkEnd w:id="87"/>
-    <w:bookmarkStart w:id="88" w:name="notes-and-their-connection-points"/>
+    <w:bookmarkEnd w:id="99"/>
+    <w:bookmarkStart w:id="100" w:name="notes-and-their-connection-points"/>
     <w:p>
       <w:pPr>
         <w:pStyle w:val="Heading2"/>
@@ -12542,8 +12768,8 @@
         <w:t xml:space="preserve">While dragging, a dashed line plus a small square marker previews the geometry.</w:t>
       </w:r>
     </w:p>
-    <w:bookmarkEnd w:id="88"/>
-    <w:bookmarkStart w:id="89" w:name="creating-elements-on-the-canvas"/>
+    <w:bookmarkEnd w:id="100"/>
+    <w:bookmarkStart w:id="101" w:name="creating-elements-on-the-canvas"/>
     <w:p>
       <w:pPr>
         <w:pStyle w:val="Heading2"/>
@@ -12964,8 +13190,8 @@
         <w:t xml:space="preserve">.</w:t>
       </w:r>
     </w:p>
-    <w:bookmarkEnd w:id="89"/>
-    <w:bookmarkStart w:id="90" w:name="align"/>
+    <w:bookmarkEnd w:id="101"/>
+    <w:bookmarkStart w:id="102" w:name="align"/>
     <w:p>
       <w:pPr>
         <w:pStyle w:val="Heading2"/>
@@ -13060,8 +13286,8 @@
         <w:t xml:space="preserve">(≥ 2 classes) auto-lays-out the whole diagram instead.</w:t>
       </w:r>
     </w:p>
-    <w:bookmarkEnd w:id="90"/>
-    <w:bookmarkStart w:id="91" w:name="hiding-per-shape-toggles-colors"/>
+    <w:bookmarkEnd w:id="102"/>
+    <w:bookmarkStart w:id="103" w:name="hiding-per-shape-toggles-colors"/>
     <w:p>
       <w:pPr>
         <w:pStyle w:val="Heading2"/>
@@ -13219,8 +13445,8 @@
         <w:t xml:space="preserve">— class line/text, member text, method text, relation line/critical-relation line/text, inherit line, diagram-only line/text, dependency line/text, note line/text. Each opens a color picker seeded with the current value; the change applies to every diagram of the model (and is undoable).</w:t>
       </w:r>
     </w:p>
-    <w:bookmarkEnd w:id="91"/>
-    <w:bookmarkStart w:id="92" w:name="zoom-and-pan"/>
+    <w:bookmarkEnd w:id="103"/>
+    <w:bookmarkStart w:id="104" w:name="zoom-and-pan"/>
     <w:p>
       <w:pPr>
         <w:pStyle w:val="Heading2"/>
@@ -13480,8 +13706,8 @@
         <w:t xml:space="preserve">Zoom ranges from 0.1× to 32×; the status bar’s X/Y fields track the model coordinates under the cursor.</w:t>
       </w:r>
     </w:p>
-    <w:bookmarkEnd w:id="92"/>
-    <w:bookmarkStart w:id="93" w:name="the-cd-toolbar"/>
+    <w:bookmarkEnd w:id="104"/>
+    <w:bookmarkStart w:id="105" w:name="the-cd-toolbar"/>
     <w:p>
       <w:pPr>
         <w:pStyle w:val="Heading2"/>
@@ -13693,8 +13919,8 @@
         <w:t xml:space="preserve">— cropped strip of the CD toolbar in the order above.</w:t>
       </w:r>
     </w:p>
-    <w:bookmarkEnd w:id="93"/>
-    <w:bookmarkStart w:id="94" w:name="the-cd-context-menu"/>
+    <w:bookmarkEnd w:id="105"/>
+    <w:bookmarkStart w:id="106" w:name="the-cd-context-menu"/>
     <w:p>
       <w:pPr>
         <w:pStyle w:val="Heading2"/>
@@ -14035,8 +14261,8 @@
         <w:t xml:space="preserve">— the context menu open on a selected class shape, with the Add submenu expanded.</w:t>
       </w:r>
     </w:p>
-    <w:bookmarkEnd w:id="94"/>
-    <w:bookmarkStart w:id="95" w:name="canvas-keys"/>
+    <w:bookmarkEnd w:id="106"/>
+    <w:bookmarkStart w:id="107" w:name="canvas-keys"/>
     <w:p>
       <w:pPr>
         <w:pStyle w:val="Heading2"/>
@@ -14355,9 +14581,9 @@
         </w:tc>
       </w:tr>
     </w:tbl>
-    <w:bookmarkEnd w:id="95"/>
-    <w:bookmarkEnd w:id="96"/>
-    <w:bookmarkStart w:id="113" w:name="reference-sequence-diagrams"/>
+    <w:bookmarkEnd w:id="107"/>
+    <w:bookmarkEnd w:id="108"/>
+    <w:bookmarkStart w:id="125" w:name="reference-sequence-diagrams"/>
     <w:p>
       <w:pPr>
         <w:pStyle w:val="Heading1"/>
@@ -14443,18 +14669,18 @@
           <wp:inline>
             <wp:extent cx="5334000" cy="3429000"/>
             <wp:effectExtent b="0" l="0" r="0" t="0"/>
-            <wp:docPr descr="A sequence-diagram view in the shell — its own toolbar (delete, undo/redo, zoom, export SVG) at the top; diagram views dock, tab and float exactly like the trees." title="" id="98" name="Picture"/>
+            <wp:docPr descr="A sequence-diagram view in the shell — its own toolbar (delete, undo/redo, zoom, export SVG) at the top; diagram views dock, tab and float exactly like the trees." title="" id="110" name="Picture"/>
             <a:graphic>
               <a:graphicData uri="http://schemas.openxmlformats.org/drawingml/2006/picture">
                 <pic:pic>
                   <pic:nvPicPr>
-                    <pic:cNvPr descr="images/sd-view.png" id="99" name="Picture"/>
+                    <pic:cNvPr descr="images/sd-view.png" id="111" name="Picture"/>
                     <pic:cNvPicPr>
                       <a:picLocks noChangeArrowheads="1" noChangeAspect="1"/>
                     </pic:cNvPicPr>
                   </pic:nvPicPr>
                   <pic:blipFill>
-                    <a:blip r:embed="rId97"/>
+                    <a:blip r:embed="rId109"/>
                     <a:stretch>
                       <a:fillRect/>
                     </a:stretch>
@@ -14498,24 +14724,24 @@
           <wp:inline>
             <wp:extent cx="5334000" cy="7544589"/>
             <wp:effectExtent b="0" l="0" r="0" t="0"/>
-            <wp:docPr descr="The “Creating a Matrix” sequence diagram (SVG export, generated with add_call_trace): a User triggers Matrix(rows, columns), which constructs the Columns and Rows." title="" id="101" name="Picture"/>
+            <wp:docPr descr="The “Creating a Matrix” sequence diagram (SVG export, generated with add_call_trace): a User triggers Matrix(rows, columns), which constructs the Columns and Rows." title="" id="113" name="Picture"/>
             <a:graphic>
               <a:graphicData uri="http://schemas.openxmlformats.org/drawingml/2006/picture">
                 <pic:pic>
                   <pic:nvPicPr>
-                    <pic:cNvPr descr="images/sd-create.svg" id="102" name="Picture"/>
+                    <pic:cNvPr descr="images/sd-create.svg" id="114" name="Picture"/>
                     <pic:cNvPicPr>
                       <a:picLocks noChangeArrowheads="1" noChangeAspect="1"/>
                     </pic:cNvPicPr>
                   </pic:nvPicPr>
                   <pic:blipFill>
-                    <a:blip r:embed="rId103">
+                    <a:blip r:embed="rId115">
                       <a:extLst>
                         <a:ext uri="{28A0092B-C50C-407E-A947-70E740481C1C}">
                           <a14:useLocalDpi xmlns:a14="http://schemas.microsoft.com/office/drawing/2010/main" val="0"/>
                         </a:ext>
                         <a:ext uri="{96DAC541-7B7A-43D3-8B79-37D633B846F1}">
-                          <asvg:svgBlip xmlns:asvg="http://schemas.microsoft.com/office/drawing/2016/SVG/main" r:embed="rId100"/>
+                          <asvg:svgBlip xmlns:asvg="http://schemas.microsoft.com/office/drawing/2016/SVG/main" r:embed="rId112"/>
                         </a:ext>
                       </a:extLst>
                     </a:blip>
@@ -14571,7 +14797,7 @@
         <w:t xml:space="preserve">sequence diagram (SVG export, generated with add_call_trace): a User triggers Matrix(rows, columns), which constructs the Columns and Rows.</w:t>
       </w:r>
     </w:p>
-    <w:bookmarkStart w:id="104" w:name="building-one"/>
+    <w:bookmarkStart w:id="116" w:name="building-one"/>
     <w:p>
       <w:pPr>
         <w:pStyle w:val="Heading2"/>
@@ -14746,8 +14972,8 @@
         <w:t xml:space="preserve">Notes: free boxes with attach-lines — see below.</w:t>
       </w:r>
     </w:p>
-    <w:bookmarkEnd w:id="104"/>
-    <w:bookmarkStart w:id="105" w:name="what-moves-and-how"/>
+    <w:bookmarkEnd w:id="116"/>
+    <w:bookmarkStart w:id="117" w:name="what-moves-and-how"/>
     <w:p>
       <w:pPr>
         <w:pStyle w:val="Heading2"/>
@@ -15180,8 +15406,8 @@
         <w:t xml:space="preserve">: purely positional, so a point lying on a lifeline or signal travels with it. Dragging a corner point outward spawns a new joint; dragging a point back into the note deletes it. On release, a point near a signal arrow snaps vertically onto it — the line then tracks that signal.</w:t>
       </w:r>
     </w:p>
-    <w:bookmarkEnd w:id="105"/>
-    <w:bookmarkStart w:id="106" w:name="keeping-it-readable"/>
+    <w:bookmarkEnd w:id="117"/>
+    <w:bookmarkStart w:id="118" w:name="keeping-it-readable"/>
     <w:p>
       <w:pPr>
         <w:pStyle w:val="Heading2"/>
@@ -15281,8 +15507,8 @@
         <w:t xml:space="preserve">replaces a selected group of nested activations with a summarizing note — good for hiding boilerplate sub-calls.</w:t>
       </w:r>
     </w:p>
-    <w:bookmarkEnd w:id="106"/>
-    <w:bookmarkStart w:id="107" w:name="toolbar-colors-zoom"/>
+    <w:bookmarkEnd w:id="118"/>
+    <w:bookmarkStart w:id="119" w:name="toolbar-colors-zoom"/>
     <w:p>
       <w:pPr>
         <w:pStyle w:val="Heading2"/>
@@ -15440,8 +15666,8 @@
         <w:t xml:space="preserve">, Fit via toolbar or double-click on empty space, pan with plain scroll / middle-drag / scrollbars, pinch on trackpads).</w:t>
       </w:r>
     </w:p>
-    <w:bookmarkEnd w:id="107"/>
-    <w:bookmarkStart w:id="112" w:name="canvas-keys-1"/>
+    <w:bookmarkEnd w:id="119"/>
+    <w:bookmarkStart w:id="124" w:name="canvas-keys-1"/>
     <w:p>
       <w:pPr>
         <w:pStyle w:val="Heading2"/>
@@ -15841,24 +16067,24 @@
           <wp:inline>
             <wp:extent cx="5334000" cy="7544589"/>
             <wp:effectExtent b="0" l="0" r="0" t="0"/>
-            <wp:docPr descr="A pipe-generated call trace of the Matrix constructor (“Matrix constructor walkthrough”)." title="" id="109" name="Picture"/>
+            <wp:docPr descr="A pipe-generated call trace of the Matrix constructor (“Matrix constructor walkthrough”)." title="" id="121" name="Picture"/>
             <a:graphic>
               <a:graphicData uri="http://schemas.openxmlformats.org/drawingml/2006/picture">
                 <pic:pic>
                   <pic:nvPicPr>
-                    <pic:cNvPr descr="images/sd-ctor-walkthrough.svg" id="110" name="Picture"/>
+                    <pic:cNvPr descr="images/sd-ctor-walkthrough.svg" id="122" name="Picture"/>
                     <pic:cNvPicPr>
                       <a:picLocks noChangeArrowheads="1" noChangeAspect="1"/>
                     </pic:cNvPicPr>
                   </pic:nvPicPr>
                   <pic:blipFill>
-                    <a:blip r:embed="rId111">
+                    <a:blip r:embed="rId123">
                       <a:extLst>
                         <a:ext uri="{28A0092B-C50C-407E-A947-70E740481C1C}">
                           <a14:useLocalDpi xmlns:a14="http://schemas.microsoft.com/office/drawing/2010/main" val="0"/>
                         </a:ext>
                         <a:ext uri="{96DAC541-7B7A-43D3-8B79-37D633B846F1}">
-                          <asvg:svgBlip xmlns:asvg="http://schemas.microsoft.com/office/drawing/2016/SVG/main" r:embed="rId108"/>
+                          <asvg:svgBlip xmlns:asvg="http://schemas.microsoft.com/office/drawing/2016/SVG/main" r:embed="rId120"/>
                         </a:ext>
                       </a:extLst>
                     </a:blip>
@@ -15908,9 +16134,9 @@
         <w:t xml:space="preserve">).</w:t>
       </w:r>
     </w:p>
-    <w:bookmarkEnd w:id="112"/>
-    <w:bookmarkEnd w:id="113"/>
-    <w:bookmarkStart w:id="146" w:name="reference-dialogs"/>
+    <w:bookmarkEnd w:id="124"/>
+    <w:bookmarkEnd w:id="125"/>
+    <w:bookmarkStart w:id="158" w:name="reference-dialogs"/>
     <w:p>
       <w:pPr>
         <w:pStyle w:val="Heading1"/>
@@ -16075,7 +16301,7 @@
         <w:t xml:space="preserve">One screenshot per dialog in this chapter, captured on Windows at 100% scale with realistic content from the Matrix model. Captions are given per dialog below.</w:t>
       </w:r>
     </w:p>
-    <w:bookmarkStart w:id="114" w:name="class"/>
+    <w:bookmarkStart w:id="126" w:name="class"/>
     <w:p>
       <w:pPr>
         <w:pStyle w:val="Heading2"/>
@@ -16290,8 +16516,8 @@
         <w:t xml:space="preserve">the checkbox disables when switching would break the model — most importantly, a class with a Serialize-on subclass cannot turn Serialize off.</w:t>
       </w:r>
     </w:p>
-    <w:bookmarkEnd w:id="114"/>
-    <w:bookmarkStart w:id="115" w:name="external-class"/>
+    <w:bookmarkEnd w:id="126"/>
+    <w:bookmarkStart w:id="127" w:name="external-class"/>
     <w:p>
       <w:pPr>
         <w:pStyle w:val="Heading2"/>
@@ -16370,8 +16596,8 @@
         <w:t xml:space="preserve">(for types that must not be forward-declared, e.g. typedefs), member prefix (used when generated code calls its getters/setters).</w:t>
       </w:r>
     </w:p>
-    <w:bookmarkEnd w:id="115"/>
-    <w:bookmarkStart w:id="116" w:name="member"/>
+    <w:bookmarkEnd w:id="127"/>
+    <w:bookmarkStart w:id="128" w:name="member"/>
     <w:p>
       <w:pPr>
         <w:pStyle w:val="Heading2"/>
@@ -16656,8 +16882,8 @@
         <w:t xml:space="preserve">— changing a key must never be a plain assignment. See chapter 12.7 for the generated code.</w:t>
       </w:r>
     </w:p>
-    <w:bookmarkEnd w:id="116"/>
-    <w:bookmarkStart w:id="117" w:name="method"/>
+    <w:bookmarkEnd w:id="128"/>
+    <w:bookmarkStart w:id="129" w:name="method"/>
     <w:p>
       <w:pPr>
         <w:pStyle w:val="Heading2"/>
@@ -16988,8 +17214,8 @@
         <w:t xml:space="preserve">”</w:t>
       </w:r>
     </w:p>
-    <w:bookmarkEnd w:id="117"/>
-    <w:bookmarkStart w:id="118" w:name="constructor-destructor"/>
+    <w:bookmarkEnd w:id="129"/>
+    <w:bookmarkStart w:id="130" w:name="constructor-destructor"/>
     <w:p>
       <w:pPr>
         <w:pStyle w:val="Heading2"/>
@@ -17148,8 +17374,8 @@
         <w:t xml:space="preserve">). If you edit an initializer by hand in the constructor dialog, your text wins until the next structural change re-derives that entry.</w:t>
       </w:r>
     </w:p>
-    <w:bookmarkEnd w:id="118"/>
-    <w:bookmarkStart w:id="119" w:name="exception-specification"/>
+    <w:bookmarkEnd w:id="130"/>
+    <w:bookmarkStart w:id="131" w:name="exception-specification"/>
     <w:p>
       <w:pPr>
         <w:pStyle w:val="Heading2"/>
@@ -17280,8 +17506,8 @@
         <w:t xml:space="preserve">clause.</w:t>
       </w:r>
     </w:p>
-    <w:bookmarkEnd w:id="119"/>
-    <w:bookmarkStart w:id="120" w:name="argument"/>
+    <w:bookmarkEnd w:id="131"/>
+    <w:bookmarkStart w:id="132" w:name="argument"/>
     <w:p>
       <w:pPr>
         <w:pStyle w:val="Heading2"/>
@@ -17344,8 +17570,8 @@
         <w:t xml:space="preserve">, note. Reorder arguments by drag in the tree.</w:t>
       </w:r>
     </w:p>
-    <w:bookmarkEnd w:id="120"/>
-    <w:bookmarkStart w:id="121" w:name="inheritance"/>
+    <w:bookmarkEnd w:id="132"/>
+    <w:bookmarkStart w:id="133" w:name="inheritance"/>
     <w:p>
       <w:pPr>
         <w:pStyle w:val="Heading2"/>
@@ -17483,8 +17709,8 @@
         <w:t xml:space="preserve">browser.</w:t>
       </w:r>
     </w:p>
-    <w:bookmarkEnd w:id="121"/>
-    <w:bookmarkStart w:id="122" w:name="relation"/>
+    <w:bookmarkEnd w:id="133"/>
+    <w:bookmarkStart w:id="134" w:name="relation"/>
     <w:p>
       <w:pPr>
         <w:pStyle w:val="Heading2"/>
@@ -17948,8 +18174,8 @@
         <w:t xml:space="preserve">(chapter 12.7).</w:t>
       </w:r>
     </w:p>
-    <w:bookmarkEnd w:id="122"/>
-    <w:bookmarkStart w:id="123" w:name="find-method-on-a-relation"/>
+    <w:bookmarkEnd w:id="134"/>
+    <w:bookmarkStart w:id="135" w:name="find-method-on-a-relation"/>
     <w:p>
       <w:pPr>
         <w:pStyle w:val="Heading2"/>
@@ -18095,8 +18321,8 @@
         <w:t xml:space="preserve">is generated instead — callers are identical either way.</w:t>
       </w:r>
     </w:p>
-    <w:bookmarkEnd w:id="123"/>
-    <w:bookmarkStart w:id="124" w:name="dependency"/>
+    <w:bookmarkEnd w:id="135"/>
+    <w:bookmarkStart w:id="136" w:name="dependency"/>
     <w:p>
       <w:pPr>
         <w:pStyle w:val="Heading2"/>
@@ -18216,8 +18442,8 @@
         <w:t xml:space="preserve">. A dependency is modeled — it affects the include/forward-declaration emission for the client — but adds no members or relation code.</w:t>
       </w:r>
     </w:p>
-    <w:bookmarkEnd w:id="124"/>
-    <w:bookmarkStart w:id="125" w:name="relation-diagram-only"/>
+    <w:bookmarkEnd w:id="136"/>
+    <w:bookmarkStart w:id="137" w:name="relation-diagram-only"/>
     <w:p>
       <w:pPr>
         <w:pStyle w:val="Heading2"/>
@@ -18344,8 +18570,8 @@
         <w:t xml:space="preserve">than modeled relations (e.g. Composition).</w:t>
       </w:r>
     </w:p>
-    <w:bookmarkEnd w:id="125"/>
-    <w:bookmarkStart w:id="126" w:name="type"/>
+    <w:bookmarkEnd w:id="137"/>
+    <w:bookmarkStart w:id="138" w:name="type"/>
     <w:p>
       <w:pPr>
         <w:pStyle w:val="Heading2"/>
@@ -18473,8 +18699,8 @@
         <w:t xml:space="preserve">C++ text that gets emitted into the master include.</w:t>
       </w:r>
     </w:p>
-    <w:bookmarkEnd w:id="126"/>
-    <w:bookmarkStart w:id="127" w:name="group-meta-group"/>
+    <w:bookmarkEnd w:id="138"/>
+    <w:bookmarkStart w:id="139" w:name="group-meta-group"/>
     <w:p>
       <w:pPr>
         <w:pStyle w:val="Heading2"/>
@@ -18524,8 +18750,8 @@
         <w:t xml:space="preserve">Name + note. (MemberAndMethodGroups — in-class folders — are created from the class context menu.)</w:t>
       </w:r>
     </w:p>
-    <w:bookmarkEnd w:id="127"/>
-    <w:bookmarkStart w:id="128" w:name="context-define-and-assign"/>
+    <w:bookmarkEnd w:id="139"/>
+    <w:bookmarkStart w:id="140" w:name="context-define-and-assign"/>
     <w:p>
       <w:pPr>
         <w:pStyle w:val="Heading2"/>
@@ -18799,8 +19025,8 @@
         <w:t xml:space="preserve">”</w:t>
       </w:r>
     </w:p>
-    <w:bookmarkEnd w:id="128"/>
-    <w:bookmarkStart w:id="129" w:name="actor"/>
+    <w:bookmarkEnd w:id="140"/>
+    <w:bookmarkStart w:id="141" w:name="actor"/>
     <w:p>
       <w:pPr>
         <w:pStyle w:val="Heading2"/>
@@ -18865,8 +19091,8 @@
         <w:t xml:space="preserve">and go on sequence diagrams as stick figures.</w:t>
       </w:r>
     </w:p>
-    <w:bookmarkEnd w:id="129"/>
-    <w:bookmarkStart w:id="130" w:name="class-diagram"/>
+    <w:bookmarkEnd w:id="141"/>
+    <w:bookmarkStart w:id="142" w:name="class-diagram"/>
     <w:p>
       <w:pPr>
         <w:pStyle w:val="Heading2"/>
@@ -18932,8 +19158,8 @@
         <w:t xml:space="preserve">matrix: which member/method access levels are automatically shown when a class is placed on this diagram (private/protected/public members and methods, plus Get/Set methods).</w:t>
       </w:r>
     </w:p>
-    <w:bookmarkEnd w:id="130"/>
-    <w:bookmarkStart w:id="131" w:name="sequence-diagram"/>
+    <w:bookmarkEnd w:id="142"/>
+    <w:bookmarkStart w:id="143" w:name="sequence-diagram"/>
     <w:p>
       <w:pPr>
         <w:pStyle w:val="Heading2"/>
@@ -19087,8 +19313,8 @@
         <w:t xml:space="preserve">options (argument types, argument names, scope). Per-message overrides exist on each signal’s own dialog.</w:t>
       </w:r>
     </w:p>
-    <w:bookmarkEnd w:id="131"/>
-    <w:bookmarkStart w:id="132" w:name="select-classes"/>
+    <w:bookmarkEnd w:id="143"/>
+    <w:bookmarkStart w:id="144" w:name="select-classes"/>
     <w:p>
       <w:pPr>
         <w:pStyle w:val="Heading2"/>
@@ -19151,8 +19377,8 @@
         <w:t xml:space="preserve">afterwards).</w:t>
       </w:r>
     </w:p>
-    <w:bookmarkEnd w:id="132"/>
-    <w:bookmarkStart w:id="133" w:name="class-shape"/>
+    <w:bookmarkEnd w:id="144"/>
+    <w:bookmarkStart w:id="145" w:name="class-shape"/>
     <w:p>
       <w:pPr>
         <w:pStyle w:val="Heading2"/>
@@ -19265,8 +19491,8 @@
         <w:t xml:space="preserve">shape. The same class can show different features on different diagrams.</w:t>
       </w:r>
     </w:p>
-    <w:bookmarkEnd w:id="133"/>
-    <w:bookmarkStart w:id="134" w:name="select-members-methods"/>
+    <w:bookmarkEnd w:id="145"/>
+    <w:bookmarkStart w:id="146" w:name="select-members-methods"/>
     <w:p>
       <w:pPr>
         <w:pStyle w:val="Heading2"/>
@@ -19317,8 +19543,8 @@
         <w:t xml:space="preserve">on a class shape (within what the diagram’s access-level flags allow). Checkbox lists per section, with Select All / Unselect All. Diagram-wide or per-class, depending on where it was opened.</w:t>
       </w:r>
     </w:p>
-    <w:bookmarkEnd w:id="134"/>
-    <w:bookmarkStart w:id="135" w:name="reorder-members-methods"/>
+    <w:bookmarkEnd w:id="146"/>
+    <w:bookmarkStart w:id="147" w:name="reorder-members-methods"/>
     <w:p>
       <w:pPr>
         <w:pStyle w:val="Heading2"/>
@@ -19366,8 +19592,8 @@
         <w:t xml:space="preserve">: it changes declaration order in the generated file.</w:t>
       </w:r>
     </w:p>
-    <w:bookmarkEnd w:id="135"/>
-    <w:bookmarkStart w:id="136" w:name="signal-message"/>
+    <w:bookmarkEnd w:id="147"/>
+    <w:bookmarkStart w:id="148" w:name="signal-message"/>
     <w:p>
       <w:pPr>
         <w:pStyle w:val="Heading2"/>
@@ -19444,8 +19670,8 @@
         <w:t xml:space="preserve">), return text + show-return-arrow, async flag, per-message argument/scope display, note.</w:t>
       </w:r>
     </w:p>
-    <w:bookmarkEnd w:id="136"/>
-    <w:bookmarkStart w:id="137" w:name="lifeline-note-dialogs"/>
+    <w:bookmarkEnd w:id="148"/>
+    <w:bookmarkStart w:id="149" w:name="lifeline-note-dialogs"/>
     <w:p>
       <w:pPr>
         <w:pStyle w:val="Heading2"/>
@@ -19514,8 +19740,8 @@
         <w:t xml:space="preserve">(apply the size everywhere).</w:t>
       </w:r>
     </w:p>
-    <w:bookmarkEnd w:id="137"/>
-    <w:bookmarkStart w:id="138" w:name="Xb9470c6e63f702dcde05f89c7607c45c6bcf312"/>
+    <w:bookmarkEnd w:id="149"/>
+    <w:bookmarkStart w:id="150" w:name="Xb9470c6e63f702dcde05f89c7607c45c6bcf312"/>
     <w:p>
       <w:pPr>
         <w:pStyle w:val="Heading2"/>
@@ -19947,8 +20173,8 @@
         <w:t xml:space="preserve">(the TODO line seeded into new method bodies); Method Name List / Similar Lines List (name suggestions and the similar-lines tool’s pattern list).</w:t>
       </w:r>
     </w:p>
-    <w:bookmarkEnd w:id="138"/>
-    <w:bookmarkStart w:id="139" w:name="add-serialization-to-project"/>
+    <w:bookmarkEnd w:id="150"/>
+    <w:bookmarkStart w:id="151" w:name="add-serialization-to-project"/>
     <w:p>
       <w:pPr>
         <w:pStyle w:val="Heading2"/>
@@ -20026,8 +20252,8 @@
         <w:t xml:space="preserve">machinery (chapter 13.1). One-way — once a model has Serialize, it keeps it.</w:t>
       </w:r>
     </w:p>
-    <w:bookmarkEnd w:id="139"/>
-    <w:bookmarkStart w:id="140" w:name="find"/>
+    <w:bookmarkEnd w:id="151"/>
+    <w:bookmarkStart w:id="152" w:name="find"/>
     <w:p>
       <w:pPr>
         <w:pStyle w:val="Heading2"/>
@@ -20098,8 +20324,8 @@
         <w:t xml:space="preserve">repeats.</w:t>
       </w:r>
     </w:p>
-    <w:bookmarkEnd w:id="140"/>
-    <w:bookmarkStart w:id="141" w:name="read-source"/>
+    <w:bookmarkEnd w:id="152"/>
+    <w:bookmarkStart w:id="153" w:name="read-source"/>
     <w:p>
       <w:pPr>
         <w:pStyle w:val="Heading2"/>
@@ -20178,8 +20404,8 @@
         <w:t xml:space="preserve">.</w:t>
       </w:r>
     </w:p>
-    <w:bookmarkEnd w:id="141"/>
-    <w:bookmarkStart w:id="142" w:name="save-source"/>
+    <w:bookmarkEnd w:id="153"/>
+    <w:bookmarkStart w:id="154" w:name="save-source"/>
     <w:p>
       <w:pPr>
         <w:pStyle w:val="Heading2"/>
@@ -20305,8 +20531,8 @@
         <w:t xml:space="preserve">block in the header comment). That is where the author initials next to each change line in generated headers come from.</w:t>
       </w:r>
     </w:p>
-    <w:bookmarkEnd w:id="142"/>
-    <w:bookmarkStart w:id="143" w:name="virtual-methods-isclass-methods"/>
+    <w:bookmarkEnd w:id="154"/>
+    <w:bookmarkStart w:id="155" w:name="virtual-methods-isclass-methods"/>
     <w:p>
       <w:pPr>
         <w:pStyle w:val="Heading2"/>
@@ -20413,8 +20639,8 @@
         <w:t xml:space="preserve">, returning a boolean truth value).</w:t>
       </w:r>
     </w:p>
-    <w:bookmarkEnd w:id="143"/>
-    <w:bookmarkStart w:id="144" w:name="user-sections-code-dialogs"/>
+    <w:bookmarkEnd w:id="155"/>
+    <w:bookmarkStart w:id="156" w:name="user-sections-code-dialogs"/>
     <w:p>
       <w:pPr>
         <w:pStyle w:val="Heading2"/>
@@ -20504,8 +20730,8 @@
         <w:t xml:space="preserve">marker bands above and below your text.</w:t>
       </w:r>
     </w:p>
-    <w:bookmarkEnd w:id="144"/>
-    <w:bookmarkStart w:id="145" w:name="code-editing-helper-wizards"/>
+    <w:bookmarkEnd w:id="156"/>
+    <w:bookmarkStart w:id="157" w:name="code-editing-helper-wizards"/>
     <w:p>
       <w:pPr>
         <w:pStyle w:val="Heading2"/>
@@ -20802,9 +21028,9 @@
         <w:t xml:space="preserve">— the member-method wrapper picker.</w:t>
       </w:r>
     </w:p>
-    <w:bookmarkEnd w:id="145"/>
-    <w:bookmarkEnd w:id="146"/>
-    <w:bookmarkStart w:id="150" w:name="reference-the-code-editor"/>
+    <w:bookmarkEnd w:id="157"/>
+    <w:bookmarkEnd w:id="158"/>
+    <w:bookmarkStart w:id="162" w:name="reference-the-code-editor"/>
     <w:p>
       <w:pPr>
         <w:pStyle w:val="Heading1"/>
@@ -20821,7 +21047,7 @@
         <w:t xml:space="preserve">Method bodies, constructor/destructor bodies and the user sections are edited in ClassBuilder’s built-in code editor (a fixed-pitch C++ editor; Consolas 11 pt on Windows).</w:t>
       </w:r>
     </w:p>
-    <w:bookmarkStart w:id="147" w:name="editing-behavior"/>
+    <w:bookmarkStart w:id="159" w:name="editing-behavior"/>
     <w:p>
       <w:pPr>
         <w:pStyle w:val="Heading2"/>
@@ -21023,8 +21249,8 @@
         <w:t xml:space="preserve">No line wrapping; long lines scroll.</w:t>
       </w:r>
     </w:p>
-    <w:bookmarkEnd w:id="147"/>
-    <w:bookmarkStart w:id="148" w:name="code-insertion"/>
+    <w:bookmarkEnd w:id="159"/>
+    <w:bookmarkStart w:id="160" w:name="code-insertion"/>
     <w:p>
       <w:pPr>
         <w:pStyle w:val="Heading2"/>
@@ -21147,8 +21373,8 @@
         <w:t xml:space="preserve">marker already in place — write below the marker (chapter 11.4 for the destructor-order exception).</w:t>
       </w:r>
     </w:p>
-    <w:bookmarkEnd w:id="148"/>
-    <w:bookmarkStart w:id="149" w:name="where-it-appears"/>
+    <w:bookmarkEnd w:id="160"/>
+    <w:bookmarkStart w:id="161" w:name="where-it-appears"/>
     <w:p>
       <w:pPr>
         <w:pStyle w:val="Heading2"/>
@@ -21356,9 +21582,9 @@
         </w:tc>
       </w:tr>
     </w:tbl>
-    <w:bookmarkEnd w:id="149"/>
-    <w:bookmarkEnd w:id="150"/>
-    <w:bookmarkStart w:id="156" w:name="code-generation-in-depth"/>
+    <w:bookmarkEnd w:id="161"/>
+    <w:bookmarkEnd w:id="162"/>
+    <w:bookmarkStart w:id="168" w:name="code-generation-in-depth"/>
     <w:p>
       <w:pPr>
         <w:pStyle w:val="Heading1"/>
@@ -21367,7 +21593,7 @@
         <w:t xml:space="preserve">Code generation in depth</w:t>
       </w:r>
     </w:p>
-    <w:bookmarkStart w:id="151" w:name="files-produced"/>
+    <w:bookmarkStart w:id="163" w:name="files-produced"/>
     <w:p>
       <w:pPr>
         <w:pStyle w:val="Heading2"/>
@@ -21466,8 +21692,8 @@
         <w:t xml:space="preserve">).</w:t>
       </w:r>
     </w:p>
-    <w:bookmarkEnd w:id="151"/>
-    <w:bookmarkStart w:id="152" w:name="anatomy-of-a-generated-file"/>
+    <w:bookmarkEnd w:id="163"/>
+    <w:bookmarkStart w:id="164" w:name="anatomy-of-a-generated-file"/>
     <w:p>
       <w:pPr>
         <w:pStyle w:val="Heading2"/>
@@ -21890,8 +22116,8 @@
         <w:t xml:space="preserve">bodies, relation macros, class declarations or member lists on disk; change the model instead.</w:t>
       </w:r>
     </w:p>
-    <w:bookmarkEnd w:id="152"/>
-    <w:bookmarkStart w:id="153" w:name="the-six-user-sections"/>
+    <w:bookmarkEnd w:id="164"/>
+    <w:bookmarkStart w:id="165" w:name="the-six-user-sections"/>
     <w:p>
       <w:pPr>
         <w:pStyle w:val="Heading2"/>
@@ -21989,8 +22215,8 @@
         <w:t xml:space="preserve">is the place for hand-written members or friend declarations that should live in the class but not in the model.</w:t>
       </w:r>
     </w:p>
-    <w:bookmarkEnd w:id="153"/>
-    <w:bookmarkStart w:id="154" w:name="constructorinclude-destructorinclude"/>
+    <w:bookmarkEnd w:id="165"/>
+    <w:bookmarkStart w:id="166" w:name="constructorinclude-destructorinclude"/>
     <w:p>
       <w:pPr>
         <w:pStyle w:val="Heading2"/>
@@ -22129,8 +22355,8 @@
         <w:t xml:space="preserve">(the generator preserves your body; you own the order inside it).</w:t>
       </w:r>
     </w:p>
-    <w:bookmarkEnd w:id="154"/>
-    <w:bookmarkStart w:id="155" w:name="read-source-the-round-trip"/>
+    <w:bookmarkEnd w:id="166"/>
+    <w:bookmarkStart w:id="167" w:name="read-source-the-round-trip"/>
     <w:p>
       <w:pPr>
         <w:pStyle w:val="Heading2"/>
@@ -22294,9 +22520,9 @@
         <w:t xml:space="preserve">Line endings: bodies are stored with CRLF; keep generated files CRLF (the model’s line-ending setting controls emissions).</w:t>
       </w:r>
     </w:p>
-    <w:bookmarkEnd w:id="155"/>
-    <w:bookmarkEnd w:id="156"/>
-    <w:bookmarkStart w:id="175" w:name="relations-and-the-intrusive-runtime"/>
+    <w:bookmarkEnd w:id="167"/>
+    <w:bookmarkEnd w:id="168"/>
+    <w:bookmarkStart w:id="187" w:name="relations-and-the-intrusive-runtime"/>
     <w:p>
       <w:pPr>
         <w:pStyle w:val="Heading1"/>
@@ -22313,7 +22539,7 @@
         <w:t xml:space="preserve">This chapter is the heart of ClassBuilder. It explains what the relation macros generate, why intrusive linked lists were chosen, and what guarantees you get.</w:t>
       </w:r>
     </w:p>
-    <w:bookmarkStart w:id="161" w:name="what-intrusive-means"/>
+    <w:bookmarkStart w:id="173" w:name="what-intrusive-means"/>
     <w:p>
       <w:pPr>
         <w:pStyle w:val="Heading2"/>
@@ -22349,24 +22575,24 @@
           <wp:inline>
             <wp:extent cx="5334000" cy="3246782"/>
             <wp:effectExtent b="0" l="0" r="0" t="0"/>
-            <wp:docPr descr="One Cell in two lists: all link pointers are members of the Cell itself." title="" id="158" name="Picture"/>
+            <wp:docPr descr="One Cell in two lists: all link pointers are members of the Cell itself." title="" id="170" name="Picture"/>
             <a:graphic>
               <a:graphicData uri="http://schemas.openxmlformats.org/drawingml/2006/picture">
                 <pic:pic>
                   <pic:nvPicPr>
-                    <pic:cNvPr descr="images/fig-intrusive-lists.svg" id="159" name="Picture"/>
+                    <pic:cNvPr descr="images/fig-intrusive-lists.svg" id="171" name="Picture"/>
                     <pic:cNvPicPr>
                       <a:picLocks noChangeArrowheads="1" noChangeAspect="1"/>
                     </pic:cNvPicPr>
                   </pic:nvPicPr>
                   <pic:blipFill>
-                    <a:blip r:embed="rId160">
+                    <a:blip r:embed="rId172">
                       <a:extLst>
                         <a:ext uri="{28A0092B-C50C-407E-A947-70E740481C1C}">
                           <a14:useLocalDpi xmlns:a14="http://schemas.microsoft.com/office/drawing/2010/main" val="0"/>
                         </a:ext>
                         <a:ext uri="{96DAC541-7B7A-43D3-8B79-37D633B846F1}">
-                          <asvg:svgBlip xmlns:asvg="http://schemas.microsoft.com/office/drawing/2016/SVG/main" r:embed="rId157"/>
+                          <asvg:svgBlip xmlns:asvg="http://schemas.microsoft.com/office/drawing/2016/SVG/main" r:embed="rId169"/>
                         </a:ext>
                       </a:extLst>
                     </a:blip>
@@ -22836,8 +23062,8 @@
         <w:t xml:space="preserve">In ClassBuilder a new relation on an existing class is one dialog and a regeneration; existing relations, code and files are untouched.</w:t>
       </w:r>
     </w:p>
-    <w:bookmarkEnd w:id="161"/>
-    <w:bookmarkStart w:id="162" w:name="declaring-relations-the-macro-surface"/>
+    <w:bookmarkEnd w:id="173"/>
+    <w:bookmarkStart w:id="174" w:name="declaring-relations-the-macro-surface"/>
     <w:p>
       <w:pPr>
         <w:pStyle w:val="Heading2"/>
@@ -23539,8 +23765,8 @@
         </w:tc>
       </w:tr>
     </w:tbl>
-    <w:bookmarkEnd w:id="162"/>
-    <w:bookmarkStart w:id="163" w:name="the-generated-api-of-a-multi-relation"/>
+    <w:bookmarkEnd w:id="174"/>
+    <w:bookmarkStart w:id="175" w:name="the-generated-api-of-a-multi-relation"/>
     <w:p>
       <w:pPr>
         <w:pStyle w:val="Heading2"/>
@@ -24468,8 +24694,8 @@
         <w:t xml:space="preserve">, so their exact signatures are always visible.</w:t>
       </w:r>
     </w:p>
-    <w:bookmarkEnd w:id="163"/>
-    <w:bookmarkStart w:id="164" w:name="Xaaa89ef9d7adb0d0fb470691c4808f6f6b0754c"/>
+    <w:bookmarkEnd w:id="175"/>
+    <w:bookmarkStart w:id="176" w:name="Xaaa89ef9d7adb0d0fb470691c4808f6f6b0754c"/>
     <w:p>
       <w:pPr>
         <w:pStyle w:val="Heading2"/>
@@ -24957,8 +25183,8 @@
         <w:t xml:space="preserve">.</w:t>
       </w:r>
     </w:p>
-    <w:bookmarkEnd w:id="164"/>
-    <w:bookmarkStart w:id="169" w:name="ownership-and-cascade-delete"/>
+    <w:bookmarkEnd w:id="176"/>
+    <w:bookmarkStart w:id="181" w:name="ownership-and-cascade-delete"/>
     <w:p>
       <w:pPr>
         <w:pStyle w:val="Heading2"/>
@@ -24976,24 +25202,24 @@
           <wp:inline>
             <wp:extent cx="5334000" cy="2724978"/>
             <wp:effectExtent b="0" l="0" r="0" t="0"/>
-            <wp:docPr descr="delete pMatrix — the cascade frees the entire graph." title="" id="166" name="Picture"/>
+            <wp:docPr descr="delete pMatrix — the cascade frees the entire graph." title="" id="178" name="Picture"/>
             <a:graphic>
               <a:graphicData uri="http://schemas.openxmlformats.org/drawingml/2006/picture">
                 <pic:pic>
                   <pic:nvPicPr>
-                    <pic:cNvPr descr="images/fig-ownership-cascade.svg" id="167" name="Picture"/>
+                    <pic:cNvPr descr="images/fig-ownership-cascade.svg" id="179" name="Picture"/>
                     <pic:cNvPicPr>
                       <a:picLocks noChangeArrowheads="1" noChangeAspect="1"/>
                     </pic:cNvPicPr>
                   </pic:nvPicPr>
                   <pic:blipFill>
-                    <a:blip r:embed="rId168">
+                    <a:blip r:embed="rId180">
                       <a:extLst>
                         <a:ext uri="{28A0092B-C50C-407E-A947-70E740481C1C}">
                           <a14:useLocalDpi xmlns:a14="http://schemas.microsoft.com/office/drawing/2010/main" val="0"/>
                         </a:ext>
                         <a:ext uri="{96DAC541-7B7A-43D3-8B79-37D633B846F1}">
-                          <asvg:svgBlip xmlns:asvg="http://schemas.microsoft.com/office/drawing/2016/SVG/main" r:embed="rId165"/>
+                          <asvg:svgBlip xmlns:asvg="http://schemas.microsoft.com/office/drawing/2016/SVG/main" r:embed="rId177"/>
                         </a:ext>
                       </a:extLst>
                     </a:blip>
@@ -25155,8 +25381,8 @@
         <w:t xml:space="preserve">members, and destructors clear them. In the demo run of chapter 4 this is the last line: every object freed by cascade.</w:t>
       </w:r>
     </w:p>
-    <w:bookmarkEnd w:id="169"/>
-    <w:bookmarkStart w:id="170" w:name="iterators-that-survive-modification"/>
+    <w:bookmarkEnd w:id="181"/>
+    <w:bookmarkStart w:id="182" w:name="iterators-that-survive-modification"/>
     <w:p>
       <w:pPr>
         <w:pStyle w:val="Heading2"/>
@@ -25420,8 +25646,8 @@
         <w:t xml:space="preserve">). Setters may trigger model-side reordering (e.g. in sorted tree relations); the captured pointer stays valid, the iterator re-anchors.</w:t>
       </w:r>
     </w:p>
-    <w:bookmarkEnd w:id="170"/>
-    <w:bookmarkStart w:id="171" w:name="single-static-multi"/>
+    <w:bookmarkEnd w:id="182"/>
+    <w:bookmarkStart w:id="183" w:name="single-static-multi"/>
     <w:p>
       <w:pPr>
         <w:pStyle w:val="Heading2"/>
@@ -25496,8 +25722,8 @@
         <w:t xml:space="preserve">instances of the from-class (class-level registry). Not available for template or serialize classes.</w:t>
       </w:r>
     </w:p>
-    <w:bookmarkEnd w:id="171"/>
-    <w:bookmarkStart w:id="172" w:name="tree-implementations-and-find-methods"/>
+    <w:bookmarkEnd w:id="183"/>
+    <w:bookmarkStart w:id="184" w:name="tree-implementations-and-find-methods"/>
     <w:p>
       <w:pPr>
         <w:pStyle w:val="Heading2"/>
@@ -26250,8 +26476,8 @@
         <w:t xml:space="preserve">— implemented as a loop on a list relation, or as the native tree search when the argument matches the tree key. Design workflow: start with lists; when profiling says a find is hot, flip the relation to a tree — the find method regenerates to the fast path, callers unchanged.</w:t>
       </w:r>
     </w:p>
-    <w:bookmarkEnd w:id="172"/>
-    <w:bookmarkStart w:id="173" w:name="critical-relations-threads"/>
+    <w:bookmarkEnd w:id="184"/>
+    <w:bookmarkStart w:id="185" w:name="critical-relations-threads"/>
     <w:p>
       <w:pPr>
         <w:pStyle w:val="Heading2"/>
@@ -26309,8 +26535,8 @@
         <w:t xml:space="preserve">only — your own data races remain your own; keep cross-thread mutation points few and explicit.</w:t>
       </w:r>
     </w:p>
-    <w:bookmarkEnd w:id="173"/>
-    <w:bookmarkStart w:id="174" w:name="writing-loops-the-generated-way"/>
+    <w:bookmarkEnd w:id="185"/>
+    <w:bookmarkStart w:id="186" w:name="writing-loops-the-generated-way"/>
     <w:p>
       <w:pPr>
         <w:pStyle w:val="Heading2"/>
@@ -26652,9 +26878,9 @@
         <w:t xml:space="preserve">before a loop that deletes — the list is live and your snapshot is not.</w:t>
       </w:r>
     </w:p>
-    <w:bookmarkEnd w:id="174"/>
-    <w:bookmarkEnd w:id="175"/>
-    <w:bookmarkStart w:id="182" w:name="serialization"/>
+    <w:bookmarkEnd w:id="186"/>
+    <w:bookmarkEnd w:id="187"/>
+    <w:bookmarkStart w:id="194" w:name="serialization"/>
     <w:p>
       <w:pPr>
         <w:pStyle w:val="Heading1"/>
@@ -26663,7 +26889,7 @@
         <w:t xml:space="preserve">Serialization</w:t>
       </w:r>
     </w:p>
-    <w:bookmarkStart w:id="176" w:name="what-you-get"/>
+    <w:bookmarkStart w:id="188" w:name="what-you-get"/>
     <w:p>
       <w:pPr>
         <w:pStyle w:val="Heading2"/>
@@ -26903,8 +27129,8 @@
         <w:t xml:space="preserve">registers the factory), then re-links all relations through a pointer table. Shared pointers, back-pointers, multi-ownership — the graph reloads exactly.</w:t>
       </w:r>
     </w:p>
-    <w:bookmarkEnd w:id="176"/>
-    <w:bookmarkStart w:id="177" w:name="cbarchive-and-the-wire-format"/>
+    <w:bookmarkEnd w:id="188"/>
+    <w:bookmarkStart w:id="189" w:name="cbarchive-and-the-wire-format"/>
     <w:p>
       <w:pPr>
         <w:pStyle w:val="Heading2"/>
@@ -27062,8 +27288,8 @@
         <w:t xml:space="preserve">rather than crashing.</w:t>
       </w:r>
     </w:p>
-    <w:bookmarkEnd w:id="177"/>
-    <w:bookmarkStart w:id="178" w:name="cbz-compression-on-the-fly"/>
+    <w:bookmarkEnd w:id="189"/>
+    <w:bookmarkStart w:id="190" w:name="cbz-compression-on-the-fly"/>
     <w:p>
       <w:pPr>
         <w:pStyle w:val="Heading2"/>
@@ -27413,8 +27639,8 @@
         <w:t xml:space="preserve">; the quick start’s whole matrix saved in 114 bytes. Your applications get the same for free — link zstd and use the two wrappers.</w:t>
       </w:r>
     </w:p>
-    <w:bookmarkEnd w:id="178"/>
-    <w:bookmarkStart w:id="179" w:name="Xbded68cf7b5dad621557026fdc0855cc4156113"/>
+    <w:bookmarkEnd w:id="190"/>
+    <w:bookmarkStart w:id="191" w:name="Xbded68cf7b5dad621557026fdc0855cc4156113"/>
     <w:p>
       <w:pPr>
         <w:pStyle w:val="Heading2"/>
@@ -27718,8 +27944,8 @@
         <w:t xml:space="preserve">field in the DataModel dialog) renumbers a long version history down to the minimal equivalent scheme (max used + 1) — cosmetic, but keeps gates readable. Only compact when files older than the compacted scheme no longer need to load.</w:t>
       </w:r>
     </w:p>
-    <w:bookmarkEnd w:id="179"/>
-    <w:bookmarkStart w:id="180" w:name="rules-and-properties"/>
+    <w:bookmarkEnd w:id="191"/>
+    <w:bookmarkStart w:id="192" w:name="rules-and-properties"/>
     <w:p>
       <w:pPr>
         <w:pStyle w:val="Heading2"/>
@@ -27925,8 +28151,8 @@
         <w:t xml:space="preserve">for streaming (type dialog).</w:t>
       </w:r>
     </w:p>
-    <w:bookmarkEnd w:id="180"/>
-    <w:bookmarkStart w:id="181" w:name="Xe93cc69c5286d8ba9c1392594baf9a373c30c75"/>
+    <w:bookmarkEnd w:id="192"/>
+    <w:bookmarkStart w:id="193" w:name="Xe93cc69c5286d8ba9c1392594baf9a373c30c75"/>
     <w:p>
       <w:pPr>
         <w:pStyle w:val="Heading2"/>
@@ -28136,9 +28362,9 @@
         <w:t xml:space="preserve">Models that already build (like ClassBuilder’s own) are unaffected.</w:t>
       </w:r>
     </w:p>
-    <w:bookmarkEnd w:id="181"/>
-    <w:bookmarkEnd w:id="182"/>
-    <w:bookmarkStart w:id="186" w:name="the-generated-undoredo-framework"/>
+    <w:bookmarkEnd w:id="193"/>
+    <w:bookmarkEnd w:id="194"/>
+    <w:bookmarkStart w:id="198" w:name="the-generated-undoredo-framework"/>
     <w:p>
       <w:pPr>
         <w:pStyle w:val="Heading1"/>
@@ -28147,7 +28373,7 @@
         <w:t xml:space="preserve">The generated Undo/Redo framework</w:t>
       </w:r>
     </w:p>
-    <w:bookmarkStart w:id="183" w:name="what-it-is"/>
+    <w:bookmarkStart w:id="195" w:name="what-it-is"/>
     <w:p>
       <w:pPr>
         <w:pStyle w:val="Heading2"/>
@@ -28196,8 +28422,8 @@
         <w:t xml:space="preserve">generated model — the same machinery ClassBuilder itself uses for its own Edit ▸ Undo/Redo.</w:t>
       </w:r>
     </w:p>
-    <w:bookmarkEnd w:id="183"/>
-    <w:bookmarkStart w:id="184" w:name="how-it-works"/>
+    <w:bookmarkEnd w:id="195"/>
+    <w:bookmarkStart w:id="196" w:name="how-it-works"/>
     <w:p>
       <w:pPr>
         <w:pStyle w:val="Heading2"/>
@@ -28631,8 +28857,8 @@
         <w:t xml:space="preserve">deduplicates: an object already captured in the open step is not snapshotted again.</w:t>
       </w:r>
     </w:p>
-    <w:bookmarkEnd w:id="184"/>
-    <w:bookmarkStart w:id="185" w:name="the-undoreplace-entanglement"/>
+    <w:bookmarkEnd w:id="196"/>
+    <w:bookmarkStart w:id="197" w:name="the-undoreplace-entanglement"/>
     <w:p>
       <w:pPr>
         <w:pStyle w:val="Heading2"/>
@@ -28745,9 +28971,9 @@
         <w:t xml:space="preserve">undos.</w:t>
       </w:r>
     </w:p>
-    <w:bookmarkEnd w:id="185"/>
-    <w:bookmarkEnd w:id="186"/>
-    <w:bookmarkStart w:id="194" w:name="the-replace-constructor"/>
+    <w:bookmarkEnd w:id="197"/>
+    <w:bookmarkEnd w:id="198"/>
+    <w:bookmarkStart w:id="206" w:name="the-replace-constructor"/>
     <w:p>
       <w:pPr>
         <w:pStyle w:val="Heading1"/>
@@ -28756,7 +28982,7 @@
         <w:t xml:space="preserve">The replace constructor</w:t>
       </w:r>
     </w:p>
-    <w:bookmarkStart w:id="191" w:name="the-idea"/>
+    <w:bookmarkStart w:id="203" w:name="the-idea"/>
     <w:p>
       <w:pPr>
         <w:pStyle w:val="Heading2"/>
@@ -28774,24 +29000,24 @@
           <wp:inline>
             <wp:extent cx="5334000" cy="2782956"/>
             <wp:effectExtent b="0" l="0" r="0" t="0"/>
-            <wp:docPr descr="Replace: the new object takes over every relation slot of the old one." title="" id="188" name="Picture"/>
+            <wp:docPr descr="Replace: the new object takes over every relation slot of the old one." title="" id="200" name="Picture"/>
             <a:graphic>
               <a:graphicData uri="http://schemas.openxmlformats.org/drawingml/2006/picture">
                 <pic:pic>
                   <pic:nvPicPr>
-                    <pic:cNvPr descr="images/fig-replace-constructor.svg" id="189" name="Picture"/>
+                    <pic:cNvPr descr="images/fig-replace-constructor.svg" id="201" name="Picture"/>
                     <pic:cNvPicPr>
                       <a:picLocks noChangeArrowheads="1" noChangeAspect="1"/>
                     </pic:cNvPicPr>
                   </pic:nvPicPr>
                   <pic:blipFill>
-                    <a:blip r:embed="rId190">
+                    <a:blip r:embed="rId202">
                       <a:extLst>
                         <a:ext uri="{28A0092B-C50C-407E-A947-70E740481C1C}">
                           <a14:useLocalDpi xmlns:a14="http://schemas.microsoft.com/office/drawing/2010/main" val="0"/>
                         </a:ext>
                         <a:ext uri="{96DAC541-7B7A-43D3-8B79-37D633B846F1}">
-                          <asvg:svgBlip xmlns:asvg="http://schemas.microsoft.com/office/drawing/2016/SVG/main" r:embed="rId187"/>
+                          <asvg:svgBlip xmlns:asvg="http://schemas.microsoft.com/office/drawing/2016/SVG/main" r:embed="rId199"/>
                         </a:ext>
                       </a:extLst>
                     </a:blip>
@@ -28970,8 +29196,8 @@
         <w:t xml:space="preserve">a different class.</w:t>
       </w:r>
     </w:p>
-    <w:bookmarkEnd w:id="191"/>
-    <w:bookmarkStart w:id="192" w:name="why-it-is-more-powerful-than-a-factory"/>
+    <w:bookmarkEnd w:id="203"/>
+    <w:bookmarkStart w:id="204" w:name="why-it-is-more-powerful-than-a-factory"/>
     <w:p>
       <w:pPr>
         <w:pStyle w:val="Heading2"/>
@@ -29635,8 +29861,8 @@
         <w:t xml:space="preserve">is the state — the type system enforces the state chart.</w:t>
       </w:r>
     </w:p>
-    <w:bookmarkEnd w:id="192"/>
-    <w:bookmarkStart w:id="193" w:name="mechanics-and-constraints"/>
+    <w:bookmarkEnd w:id="204"/>
+    <w:bookmarkStart w:id="205" w:name="mechanics-and-constraints"/>
     <w:p>
       <w:pPr>
         <w:pStyle w:val="Heading2"/>
@@ -29739,9 +29965,9 @@
         <w:t xml:space="preserve">: see chapter 14.3 — the undo framework itself replaces objects on restore; mixing both requires redirecting parked undo entries, as ClassBuilder’s own model does.</w:t>
       </w:r>
     </w:p>
-    <w:bookmarkEnd w:id="193"/>
-    <w:bookmarkEnd w:id="194"/>
-    <w:bookmarkStart w:id="200" w:name="the-command-interface"/>
+    <w:bookmarkEnd w:id="205"/>
+    <w:bookmarkEnd w:id="206"/>
+    <w:bookmarkStart w:id="212" w:name="the-command-interface"/>
     <w:p>
       <w:pPr>
         <w:pStyle w:val="Heading1"/>
@@ -29750,7 +29976,7 @@
         <w:t xml:space="preserve">The command interface</w:t>
       </w:r>
     </w:p>
-    <w:bookmarkStart w:id="195" w:name="what-it-is-1"/>
+    <w:bookmarkStart w:id="207" w:name="what-it-is-1"/>
     <w:p>
       <w:pPr>
         <w:pStyle w:val="Heading2"/>
@@ -29953,8 +30179,8 @@
         <w:t xml:space="preserve">; below is the map plus worked examples.</w:t>
       </w:r>
     </w:p>
-    <w:bookmarkEnd w:id="195"/>
-    <w:bookmarkStart w:id="196" w:name="connecting"/>
+    <w:bookmarkEnd w:id="207"/>
+    <w:bookmarkStart w:id="208" w:name="connecting"/>
     <w:p>
       <w:pPr>
         <w:pStyle w:val="Heading2"/>
@@ -30418,8 +30644,8 @@
         <w:t xml:space="preserve">))</w:t>
       </w:r>
     </w:p>
-    <w:bookmarkEnd w:id="196"/>
-    <w:bookmarkStart w:id="197" w:name="the-command-families"/>
+    <w:bookmarkEnd w:id="208"/>
+    <w:bookmarkStart w:id="209" w:name="the-command-families"/>
     <w:p>
       <w:pPr>
         <w:pStyle w:val="Heading2"/>
@@ -31488,8 +31714,8 @@
         </w:tc>
       </w:tr>
     </w:tbl>
-    <w:bookmarkEnd w:id="197"/>
-    <w:bookmarkStart w:id="198" w:name="worked-examples-real-requests"/>
+    <w:bookmarkEnd w:id="209"/>
+    <w:bookmarkStart w:id="210" w:name="worked-examples-real-requests"/>
     <w:p>
       <w:pPr>
         <w:pStyle w:val="Heading2"/>
@@ -33388,8 +33614,8 @@
         <w:t xml:space="preserve">}}</w:t>
       </w:r>
     </w:p>
-    <w:bookmarkEnd w:id="198"/>
-    <w:bookmarkStart w:id="199" w:name="conventions-and-gotchas"/>
+    <w:bookmarkEnd w:id="210"/>
+    <w:bookmarkStart w:id="211" w:name="conventions-and-gotchas"/>
     <w:p>
       <w:pPr>
         <w:pStyle w:val="Heading2"/>
@@ -33721,9 +33947,9 @@
         <w:t xml:space="preserve">stamp tells you.</w:t>
       </w:r>
     </w:p>
-    <w:bookmarkEnd w:id="199"/>
-    <w:bookmarkEnd w:id="200"/>
-    <w:bookmarkStart w:id="201" w:name="tips-pitfalls-and-best-practices"/>
+    <w:bookmarkEnd w:id="211"/>
+    <w:bookmarkEnd w:id="212"/>
+    <w:bookmarkStart w:id="213" w:name="tips-pitfalls-and-best-practices"/>
     <w:p>
       <w:pPr>
         <w:pStyle w:val="Heading1"/>
@@ -34270,8 +34496,8 @@
         <w:t xml:space="preserve">) for documentation — it is the same renderer as the screen, vector-clean at any size.</w:t>
       </w:r>
     </w:p>
-    <w:bookmarkEnd w:id="201"/>
-    <w:bookmarkStart w:id="205" w:name="appendix"/>
+    <w:bookmarkEnd w:id="213"/>
+    <w:bookmarkStart w:id="217" w:name="appendix"/>
     <w:p>
       <w:pPr>
         <w:pStyle w:val="Heading1"/>
@@ -34280,7 +34506,7 @@
         <w:t xml:space="preserve">Appendix</w:t>
       </w:r>
     </w:p>
-    <w:bookmarkStart w:id="202" w:name="a.-runtime-header-inventory"/>
+    <w:bookmarkStart w:id="214" w:name="a.-runtime-header-inventory"/>
     <w:p>
       <w:pPr>
         <w:pStyle w:val="Heading2"/>
@@ -34831,8 +35057,8 @@
         </w:tc>
       </w:tr>
     </w:tbl>
-    <w:bookmarkEnd w:id="202"/>
-    <w:bookmarkStart w:id="203" w:name="b.-marker-quick-reference"/>
+    <w:bookmarkEnd w:id="214"/>
+    <w:bookmarkStart w:id="215" w:name="b.-marker-quick-reference"/>
     <w:p>
       <w:pPr>
         <w:pStyle w:val="Heading2"/>
@@ -34906,8 +35132,8 @@
         <w:t xml:space="preserve">@INSERT_MODIFICATIONS(* )             per-file change log insertion point</w:t>
       </w:r>
     </w:p>
-    <w:bookmarkEnd w:id="203"/>
-    <w:bookmarkStart w:id="204" w:name="c.-glossary"/>
+    <w:bookmarkEnd w:id="215"/>
+    <w:bookmarkStart w:id="216" w:name="c.-glossary"/>
     <w:p>
       <w:pPr>
         <w:pStyle w:val="Heading2"/>
@@ -35243,8 +35469,8 @@
         </w:tc>
       </w:tr>
     </w:tbl>
-    <w:bookmarkEnd w:id="204"/>
-    <w:bookmarkEnd w:id="205"/>
+    <w:bookmarkEnd w:id="216"/>
+    <w:bookmarkEnd w:id="217"/>
     <w:sectPr/>
   </w:body>
 </w:document>

</xml_diff>

<commit_message>
docs(manual): regenerate docx after cross-machine md edit
Co-Authored-By: Claude Fable 5 <noreply@anthropic.com>
</commit_message>
<xml_diff>
--- a/docs/manual/ClassBuilder_Manual.docx
+++ b/docs/manual/ClassBuilder_Manual.docx
@@ -34,7 +34,7 @@
           <w:sz w:val="24"/>
           <w:szCs w:val="24"/>
         </w:rPr>
-        <w:id w:val="-741172915"/>
+        <w:id w:val="1652566828"/>
         <w:docPartObj>
           <w:docPartGallery w:val="Table of Contents"/>
           <w:docPartUnique/>
@@ -74,7 +74,7 @@
           <w:r>
             <w:fldChar w:fldCharType="separate"/>
           </w:r>
-          <w:hyperlink w:anchor="_Toc234787957" w:history="1">
+          <w:hyperlink w:anchor="_Toc234828193" w:history="1">
             <w:r>
               <w:rPr>
                 <w:rStyle w:val="Hyperlink"/>
@@ -118,7 +118,7 @@
                 <w:noProof/>
                 <w:webHidden/>
               </w:rPr>
-              <w:instrText xml:space="preserve"> PAGEREF _Toc234787957 \h </w:instrText>
+              <w:instrText xml:space="preserve"> PAGEREF _Toc234828193 \h </w:instrText>
             </w:r>
             <w:r>
               <w:rPr>
@@ -164,7 +164,7 @@
               <w14:ligatures w14:val="standardContextual"/>
             </w:rPr>
           </w:pPr>
-          <w:hyperlink w:anchor="_Toc234787958" w:history="1">
+          <w:hyperlink w:anchor="_Toc234828194" w:history="1">
             <w:r>
               <w:rPr>
                 <w:rStyle w:val="Hyperlink"/>
@@ -208,7 +208,7 @@
                 <w:noProof/>
                 <w:webHidden/>
               </w:rPr>
-              <w:instrText xml:space="preserve"> PAGEREF _Toc234787958 \h </w:instrText>
+              <w:instrText xml:space="preserve"> PAGEREF _Toc234828194 \h </w:instrText>
             </w:r>
             <w:r>
               <w:rPr>
@@ -254,7 +254,7 @@
               <w14:ligatures w14:val="standardContextual"/>
             </w:rPr>
           </w:pPr>
-          <w:hyperlink w:anchor="_Toc234787959" w:history="1">
+          <w:hyperlink w:anchor="_Toc234828195" w:history="1">
             <w:r>
               <w:rPr>
                 <w:rStyle w:val="Hyperlink"/>
@@ -298,7 +298,7 @@
                 <w:noProof/>
                 <w:webHidden/>
               </w:rPr>
-              <w:instrText xml:space="preserve"> PAGEREF _Toc234787959 \h </w:instrText>
+              <w:instrText xml:space="preserve"> PAGEREF _Toc234828195 \h </w:instrText>
             </w:r>
             <w:r>
               <w:rPr>
@@ -344,7 +344,7 @@
               <w14:ligatures w14:val="standardContextual"/>
             </w:rPr>
           </w:pPr>
-          <w:hyperlink w:anchor="_Toc234787960" w:history="1">
+          <w:hyperlink w:anchor="_Toc234828196" w:history="1">
             <w:r>
               <w:rPr>
                 <w:rStyle w:val="Hyperlink"/>
@@ -388,7 +388,7 @@
                 <w:noProof/>
                 <w:webHidden/>
               </w:rPr>
-              <w:instrText xml:space="preserve"> PAGEREF _Toc234787960 \h </w:instrText>
+              <w:instrText xml:space="preserve"> PAGEREF _Toc234828196 \h </w:instrText>
             </w:r>
             <w:r>
               <w:rPr>
@@ -434,7 +434,7 @@
               <w14:ligatures w14:val="standardContextual"/>
             </w:rPr>
           </w:pPr>
-          <w:hyperlink w:anchor="_Toc234787961" w:history="1">
+          <w:hyperlink w:anchor="_Toc234828197" w:history="1">
             <w:r>
               <w:rPr>
                 <w:rStyle w:val="Hyperlink"/>
@@ -478,7 +478,7 @@
                 <w:noProof/>
                 <w:webHidden/>
               </w:rPr>
-              <w:instrText xml:space="preserve"> PAGEREF _Toc234787961 \h </w:instrText>
+              <w:instrText xml:space="preserve"> PAGEREF _Toc234828197 \h </w:instrText>
             </w:r>
             <w:r>
               <w:rPr>
@@ -524,7 +524,7 @@
               <w14:ligatures w14:val="standardContextual"/>
             </w:rPr>
           </w:pPr>
-          <w:hyperlink w:anchor="_Toc234787962" w:history="1">
+          <w:hyperlink w:anchor="_Toc234828198" w:history="1">
             <w:r>
               <w:rPr>
                 <w:rStyle w:val="Hyperlink"/>
@@ -568,7 +568,7 @@
                 <w:noProof/>
                 <w:webHidden/>
               </w:rPr>
-              <w:instrText xml:space="preserve"> PAGEREF _Toc234787962 \h </w:instrText>
+              <w:instrText xml:space="preserve"> PAGEREF _Toc234828198 \h </w:instrText>
             </w:r>
             <w:r>
               <w:rPr>
@@ -614,7 +614,7 @@
               <w14:ligatures w14:val="standardContextual"/>
             </w:rPr>
           </w:pPr>
-          <w:hyperlink w:anchor="_Toc234787963" w:history="1">
+          <w:hyperlink w:anchor="_Toc234828199" w:history="1">
             <w:r>
               <w:rPr>
                 <w:rStyle w:val="Hyperlink"/>
@@ -658,7 +658,7 @@
                 <w:noProof/>
                 <w:webHidden/>
               </w:rPr>
-              <w:instrText xml:space="preserve"> PAGEREF _Toc234787963 \h </w:instrText>
+              <w:instrText xml:space="preserve"> PAGEREF _Toc234828199 \h </w:instrText>
             </w:r>
             <w:r>
               <w:rPr>
@@ -704,7 +704,7 @@
               <w14:ligatures w14:val="standardContextual"/>
             </w:rPr>
           </w:pPr>
-          <w:hyperlink w:anchor="_Toc234787964" w:history="1">
+          <w:hyperlink w:anchor="_Toc234828200" w:history="1">
             <w:r>
               <w:rPr>
                 <w:rStyle w:val="Hyperlink"/>
@@ -748,7 +748,7 @@
                 <w:noProof/>
                 <w:webHidden/>
               </w:rPr>
-              <w:instrText xml:space="preserve"> PAGEREF _Toc234787964 \h </w:instrText>
+              <w:instrText xml:space="preserve"> PAGEREF _Toc234828200 \h </w:instrText>
             </w:r>
             <w:r>
               <w:rPr>
@@ -794,7 +794,7 @@
               <w14:ligatures w14:val="standardContextual"/>
             </w:rPr>
           </w:pPr>
-          <w:hyperlink w:anchor="_Toc234787965" w:history="1">
+          <w:hyperlink w:anchor="_Toc234828201" w:history="1">
             <w:r>
               <w:rPr>
                 <w:rStyle w:val="Hyperlink"/>
@@ -838,7 +838,7 @@
                 <w:noProof/>
                 <w:webHidden/>
               </w:rPr>
-              <w:instrText xml:space="preserve"> PAGEREF _Toc234787965 \h </w:instrText>
+              <w:instrText xml:space="preserve"> PAGEREF _Toc234828201 \h </w:instrText>
             </w:r>
             <w:r>
               <w:rPr>
@@ -884,7 +884,7 @@
               <w14:ligatures w14:val="standardContextual"/>
             </w:rPr>
           </w:pPr>
-          <w:hyperlink w:anchor="_Toc234787966" w:history="1">
+          <w:hyperlink w:anchor="_Toc234828202" w:history="1">
             <w:r>
               <w:rPr>
                 <w:rStyle w:val="Hyperlink"/>
@@ -928,7 +928,7 @@
                 <w:noProof/>
                 <w:webHidden/>
               </w:rPr>
-              <w:instrText xml:space="preserve"> PAGEREF _Toc234787966 \h </w:instrText>
+              <w:instrText xml:space="preserve"> PAGEREF _Toc234828202 \h </w:instrText>
             </w:r>
             <w:r>
               <w:rPr>
@@ -974,7 +974,7 @@
               <w14:ligatures w14:val="standardContextual"/>
             </w:rPr>
           </w:pPr>
-          <w:hyperlink w:anchor="_Toc234787967" w:history="1">
+          <w:hyperlink w:anchor="_Toc234828203" w:history="1">
             <w:r>
               <w:rPr>
                 <w:rStyle w:val="Hyperlink"/>
@@ -1018,7 +1018,7 @@
                 <w:noProof/>
                 <w:webHidden/>
               </w:rPr>
-              <w:instrText xml:space="preserve"> PAGEREF _Toc234787967 \h </w:instrText>
+              <w:instrText xml:space="preserve"> PAGEREF _Toc234828203 \h </w:instrText>
             </w:r>
             <w:r>
               <w:rPr>
@@ -1064,7 +1064,7 @@
               <w14:ligatures w14:val="standardContextual"/>
             </w:rPr>
           </w:pPr>
-          <w:hyperlink w:anchor="_Toc234787968" w:history="1">
+          <w:hyperlink w:anchor="_Toc234828204" w:history="1">
             <w:r>
               <w:rPr>
                 <w:rStyle w:val="Hyperlink"/>
@@ -1108,7 +1108,7 @@
                 <w:noProof/>
                 <w:webHidden/>
               </w:rPr>
-              <w:instrText xml:space="preserve"> PAGEREF _Toc234787968 \h </w:instrText>
+              <w:instrText xml:space="preserve"> PAGEREF _Toc234828204 \h </w:instrText>
             </w:r>
             <w:r>
               <w:rPr>
@@ -1154,7 +1154,7 @@
               <w14:ligatures w14:val="standardContextual"/>
             </w:rPr>
           </w:pPr>
-          <w:hyperlink w:anchor="_Toc234787969" w:history="1">
+          <w:hyperlink w:anchor="_Toc234828205" w:history="1">
             <w:r>
               <w:rPr>
                 <w:rStyle w:val="Hyperlink"/>
@@ -1198,7 +1198,7 @@
                 <w:noProof/>
                 <w:webHidden/>
               </w:rPr>
-              <w:instrText xml:space="preserve"> PAGEREF _Toc234787969 \h </w:instrText>
+              <w:instrText xml:space="preserve"> PAGEREF _Toc234828205 \h </w:instrText>
             </w:r>
             <w:r>
               <w:rPr>
@@ -1244,7 +1244,7 @@
               <w14:ligatures w14:val="standardContextual"/>
             </w:rPr>
           </w:pPr>
-          <w:hyperlink w:anchor="_Toc234787970" w:history="1">
+          <w:hyperlink w:anchor="_Toc234828206" w:history="1">
             <w:r>
               <w:rPr>
                 <w:rStyle w:val="Hyperlink"/>
@@ -1288,7 +1288,7 @@
                 <w:noProof/>
                 <w:webHidden/>
               </w:rPr>
-              <w:instrText xml:space="preserve"> PAGEREF _Toc234787970 \h </w:instrText>
+              <w:instrText xml:space="preserve"> PAGEREF _Toc234828206 \h </w:instrText>
             </w:r>
             <w:r>
               <w:rPr>
@@ -1334,7 +1334,7 @@
               <w14:ligatures w14:val="standardContextual"/>
             </w:rPr>
           </w:pPr>
-          <w:hyperlink w:anchor="_Toc234787971" w:history="1">
+          <w:hyperlink w:anchor="_Toc234828207" w:history="1">
             <w:r>
               <w:rPr>
                 <w:rStyle w:val="Hyperlink"/>
@@ -1378,7 +1378,7 @@
                 <w:noProof/>
                 <w:webHidden/>
               </w:rPr>
-              <w:instrText xml:space="preserve"> PAGEREF _Toc234787971 \h </w:instrText>
+              <w:instrText xml:space="preserve"> PAGEREF _Toc234828207 \h </w:instrText>
             </w:r>
             <w:r>
               <w:rPr>
@@ -1424,7 +1424,7 @@
               <w14:ligatures w14:val="standardContextual"/>
             </w:rPr>
           </w:pPr>
-          <w:hyperlink w:anchor="_Toc234787972" w:history="1">
+          <w:hyperlink w:anchor="_Toc234828208" w:history="1">
             <w:r>
               <w:rPr>
                 <w:rStyle w:val="Hyperlink"/>
@@ -1468,7 +1468,7 @@
                 <w:noProof/>
                 <w:webHidden/>
               </w:rPr>
-              <w:instrText xml:space="preserve"> PAGEREF _Toc234787972 \h </w:instrText>
+              <w:instrText xml:space="preserve"> PAGEREF _Toc234828208 \h </w:instrText>
             </w:r>
             <w:r>
               <w:rPr>
@@ -1514,7 +1514,7 @@
               <w14:ligatures w14:val="standardContextual"/>
             </w:rPr>
           </w:pPr>
-          <w:hyperlink w:anchor="_Toc234787973" w:history="1">
+          <w:hyperlink w:anchor="_Toc234828209" w:history="1">
             <w:r>
               <w:rPr>
                 <w:rStyle w:val="Hyperlink"/>
@@ -1558,7 +1558,7 @@
                 <w:noProof/>
                 <w:webHidden/>
               </w:rPr>
-              <w:instrText xml:space="preserve"> PAGEREF _Toc234787973 \h </w:instrText>
+              <w:instrText xml:space="preserve"> PAGEREF _Toc234828209 \h </w:instrText>
             </w:r>
             <w:r>
               <w:rPr>
@@ -1604,7 +1604,7 @@
               <w14:ligatures w14:val="standardContextual"/>
             </w:rPr>
           </w:pPr>
-          <w:hyperlink w:anchor="_Toc234787974" w:history="1">
+          <w:hyperlink w:anchor="_Toc234828210" w:history="1">
             <w:r>
               <w:rPr>
                 <w:rStyle w:val="Hyperlink"/>
@@ -1648,7 +1648,7 @@
                 <w:noProof/>
                 <w:webHidden/>
               </w:rPr>
-              <w:instrText xml:space="preserve"> PAGEREF _Toc234787974 \h </w:instrText>
+              <w:instrText xml:space="preserve"> PAGEREF _Toc234828210 \h </w:instrText>
             </w:r>
             <w:r>
               <w:rPr>
@@ -1694,7 +1694,7 @@
               <w14:ligatures w14:val="standardContextual"/>
             </w:rPr>
           </w:pPr>
-          <w:hyperlink w:anchor="_Toc234787975" w:history="1">
+          <w:hyperlink w:anchor="_Toc234828211" w:history="1">
             <w:r>
               <w:rPr>
                 <w:rStyle w:val="Hyperlink"/>
@@ -1738,7 +1738,7 @@
                 <w:noProof/>
                 <w:webHidden/>
               </w:rPr>
-              <w:instrText xml:space="preserve"> PAGEREF _Toc234787975 \h </w:instrText>
+              <w:instrText xml:space="preserve"> PAGEREF _Toc234828211 \h </w:instrText>
             </w:r>
             <w:r>
               <w:rPr>
@@ -1784,7 +1784,7 @@
               <w14:ligatures w14:val="standardContextual"/>
             </w:rPr>
           </w:pPr>
-          <w:hyperlink w:anchor="_Toc234787976" w:history="1">
+          <w:hyperlink w:anchor="_Toc234828212" w:history="1">
             <w:r>
               <w:rPr>
                 <w:rStyle w:val="Hyperlink"/>
@@ -1828,7 +1828,7 @@
                 <w:noProof/>
                 <w:webHidden/>
               </w:rPr>
-              <w:instrText xml:space="preserve"> PAGEREF _Toc234787976 \h </w:instrText>
+              <w:instrText xml:space="preserve"> PAGEREF _Toc234828212 \h </w:instrText>
             </w:r>
             <w:r>
               <w:rPr>
@@ -1874,7 +1874,7 @@
               <w14:ligatures w14:val="standardContextual"/>
             </w:rPr>
           </w:pPr>
-          <w:hyperlink w:anchor="_Toc234787977" w:history="1">
+          <w:hyperlink w:anchor="_Toc234828213" w:history="1">
             <w:r>
               <w:rPr>
                 <w:rStyle w:val="Hyperlink"/>
@@ -1918,7 +1918,7 @@
                 <w:noProof/>
                 <w:webHidden/>
               </w:rPr>
-              <w:instrText xml:space="preserve"> PAGEREF _Toc234787977 \h </w:instrText>
+              <w:instrText xml:space="preserve"> PAGEREF _Toc234828213 \h </w:instrText>
             </w:r>
             <w:r>
               <w:rPr>
@@ -1964,7 +1964,7 @@
               <w14:ligatures w14:val="standardContextual"/>
             </w:rPr>
           </w:pPr>
-          <w:hyperlink w:anchor="_Toc234787978" w:history="1">
+          <w:hyperlink w:anchor="_Toc234828214" w:history="1">
             <w:r>
               <w:rPr>
                 <w:rStyle w:val="Hyperlink"/>
@@ -2008,7 +2008,7 @@
                 <w:noProof/>
                 <w:webHidden/>
               </w:rPr>
-              <w:instrText xml:space="preserve"> PAGEREF _Toc234787978 \h </w:instrText>
+              <w:instrText xml:space="preserve"> PAGEREF _Toc234828214 \h </w:instrText>
             </w:r>
             <w:r>
               <w:rPr>
@@ -2054,7 +2054,7 @@
               <w14:ligatures w14:val="standardContextual"/>
             </w:rPr>
           </w:pPr>
-          <w:hyperlink w:anchor="_Toc234787979" w:history="1">
+          <w:hyperlink w:anchor="_Toc234828215" w:history="1">
             <w:r>
               <w:rPr>
                 <w:rStyle w:val="Hyperlink"/>
@@ -2098,7 +2098,7 @@
                 <w:noProof/>
                 <w:webHidden/>
               </w:rPr>
-              <w:instrText xml:space="preserve"> PAGEREF _Toc234787979 \h </w:instrText>
+              <w:instrText xml:space="preserve"> PAGEREF _Toc234828215 \h </w:instrText>
             </w:r>
             <w:r>
               <w:rPr>
@@ -2144,7 +2144,7 @@
               <w14:ligatures w14:val="standardContextual"/>
             </w:rPr>
           </w:pPr>
-          <w:hyperlink w:anchor="_Toc234787980" w:history="1">
+          <w:hyperlink w:anchor="_Toc234828216" w:history="1">
             <w:r>
               <w:rPr>
                 <w:rStyle w:val="Hyperlink"/>
@@ -2188,7 +2188,7 @@
                 <w:noProof/>
                 <w:webHidden/>
               </w:rPr>
-              <w:instrText xml:space="preserve"> PAGEREF _Toc234787980 \h </w:instrText>
+              <w:instrText xml:space="preserve"> PAGEREF _Toc234828216 \h </w:instrText>
             </w:r>
             <w:r>
               <w:rPr>
@@ -2234,7 +2234,7 @@
               <w14:ligatures w14:val="standardContextual"/>
             </w:rPr>
           </w:pPr>
-          <w:hyperlink w:anchor="_Toc234787981" w:history="1">
+          <w:hyperlink w:anchor="_Toc234828217" w:history="1">
             <w:r>
               <w:rPr>
                 <w:rStyle w:val="Hyperlink"/>
@@ -2278,7 +2278,7 @@
                 <w:noProof/>
                 <w:webHidden/>
               </w:rPr>
-              <w:instrText xml:space="preserve"> PAGEREF _Toc234787981 \h </w:instrText>
+              <w:instrText xml:space="preserve"> PAGEREF _Toc234828217 \h </w:instrText>
             </w:r>
             <w:r>
               <w:rPr>
@@ -2324,7 +2324,7 @@
               <w14:ligatures w14:val="standardContextual"/>
             </w:rPr>
           </w:pPr>
-          <w:hyperlink w:anchor="_Toc234787982" w:history="1">
+          <w:hyperlink w:anchor="_Toc234828218" w:history="1">
             <w:r>
               <w:rPr>
                 <w:rStyle w:val="Hyperlink"/>
@@ -2368,7 +2368,7 @@
                 <w:noProof/>
                 <w:webHidden/>
               </w:rPr>
-              <w:instrText xml:space="preserve"> PAGEREF _Toc234787982 \h </w:instrText>
+              <w:instrText xml:space="preserve"> PAGEREF _Toc234828218 \h </w:instrText>
             </w:r>
             <w:r>
               <w:rPr>
@@ -2414,7 +2414,7 @@
               <w14:ligatures w14:val="standardContextual"/>
             </w:rPr>
           </w:pPr>
-          <w:hyperlink w:anchor="_Toc234787983" w:history="1">
+          <w:hyperlink w:anchor="_Toc234828219" w:history="1">
             <w:r>
               <w:rPr>
                 <w:rStyle w:val="Hyperlink"/>
@@ -2458,7 +2458,7 @@
                 <w:noProof/>
                 <w:webHidden/>
               </w:rPr>
-              <w:instrText xml:space="preserve"> PAGEREF _Toc234787983 \h </w:instrText>
+              <w:instrText xml:space="preserve"> PAGEREF _Toc234828219 \h </w:instrText>
             </w:r>
             <w:r>
               <w:rPr>
@@ -2504,7 +2504,7 @@
               <w14:ligatures w14:val="standardContextual"/>
             </w:rPr>
           </w:pPr>
-          <w:hyperlink w:anchor="_Toc234787984" w:history="1">
+          <w:hyperlink w:anchor="_Toc234828220" w:history="1">
             <w:r>
               <w:rPr>
                 <w:rStyle w:val="Hyperlink"/>
@@ -2548,7 +2548,7 @@
                 <w:noProof/>
                 <w:webHidden/>
               </w:rPr>
-              <w:instrText xml:space="preserve"> PAGEREF _Toc234787984 \h </w:instrText>
+              <w:instrText xml:space="preserve"> PAGEREF _Toc234828220 \h </w:instrText>
             </w:r>
             <w:r>
               <w:rPr>
@@ -2594,7 +2594,7 @@
               <w14:ligatures w14:val="standardContextual"/>
             </w:rPr>
           </w:pPr>
-          <w:hyperlink w:anchor="_Toc234787985" w:history="1">
+          <w:hyperlink w:anchor="_Toc234828221" w:history="1">
             <w:r>
               <w:rPr>
                 <w:rStyle w:val="Hyperlink"/>
@@ -2638,7 +2638,7 @@
                 <w:noProof/>
                 <w:webHidden/>
               </w:rPr>
-              <w:instrText xml:space="preserve"> PAGEREF _Toc234787985 \h </w:instrText>
+              <w:instrText xml:space="preserve"> PAGEREF _Toc234828221 \h </w:instrText>
             </w:r>
             <w:r>
               <w:rPr>
@@ -2684,7 +2684,7 @@
               <w14:ligatures w14:val="standardContextual"/>
             </w:rPr>
           </w:pPr>
-          <w:hyperlink w:anchor="_Toc234787986" w:history="1">
+          <w:hyperlink w:anchor="_Toc234828222" w:history="1">
             <w:r>
               <w:rPr>
                 <w:rStyle w:val="Hyperlink"/>
@@ -2728,7 +2728,7 @@
                 <w:noProof/>
                 <w:webHidden/>
               </w:rPr>
-              <w:instrText xml:space="preserve"> PAGEREF _Toc234787986 \h </w:instrText>
+              <w:instrText xml:space="preserve"> PAGEREF _Toc234828222 \h </w:instrText>
             </w:r>
             <w:r>
               <w:rPr>
@@ -2774,7 +2774,7 @@
               <w14:ligatures w14:val="standardContextual"/>
             </w:rPr>
           </w:pPr>
-          <w:hyperlink w:anchor="_Toc234787987" w:history="1">
+          <w:hyperlink w:anchor="_Toc234828223" w:history="1">
             <w:r>
               <w:rPr>
                 <w:rStyle w:val="Hyperlink"/>
@@ -2818,7 +2818,7 @@
                 <w:noProof/>
                 <w:webHidden/>
               </w:rPr>
-              <w:instrText xml:space="preserve"> PAGEREF _Toc234787987 \h </w:instrText>
+              <w:instrText xml:space="preserve"> PAGEREF _Toc234828223 \h </w:instrText>
             </w:r>
             <w:r>
               <w:rPr>
@@ -2864,7 +2864,7 @@
               <w14:ligatures w14:val="standardContextual"/>
             </w:rPr>
           </w:pPr>
-          <w:hyperlink w:anchor="_Toc234787988" w:history="1">
+          <w:hyperlink w:anchor="_Toc234828224" w:history="1">
             <w:r>
               <w:rPr>
                 <w:rStyle w:val="Hyperlink"/>
@@ -2908,7 +2908,7 @@
                 <w:noProof/>
                 <w:webHidden/>
               </w:rPr>
-              <w:instrText xml:space="preserve"> PAGEREF _Toc234787988 \h </w:instrText>
+              <w:instrText xml:space="preserve"> PAGEREF _Toc234828224 \h </w:instrText>
             </w:r>
             <w:r>
               <w:rPr>
@@ -2954,7 +2954,7 @@
               <w14:ligatures w14:val="standardContextual"/>
             </w:rPr>
           </w:pPr>
-          <w:hyperlink w:anchor="_Toc234787989" w:history="1">
+          <w:hyperlink w:anchor="_Toc234828225" w:history="1">
             <w:r>
               <w:rPr>
                 <w:rStyle w:val="Hyperlink"/>
@@ -2998,7 +2998,7 @@
                 <w:noProof/>
                 <w:webHidden/>
               </w:rPr>
-              <w:instrText xml:space="preserve"> PAGEREF _Toc234787989 \h </w:instrText>
+              <w:instrText xml:space="preserve"> PAGEREF _Toc234828225 \h </w:instrText>
             </w:r>
             <w:r>
               <w:rPr>
@@ -3044,7 +3044,7 @@
               <w14:ligatures w14:val="standardContextual"/>
             </w:rPr>
           </w:pPr>
-          <w:hyperlink w:anchor="_Toc234787990" w:history="1">
+          <w:hyperlink w:anchor="_Toc234828226" w:history="1">
             <w:r>
               <w:rPr>
                 <w:rStyle w:val="Hyperlink"/>
@@ -3088,7 +3088,7 @@
                 <w:noProof/>
                 <w:webHidden/>
               </w:rPr>
-              <w:instrText xml:space="preserve"> PAGEREF _Toc234787990 \h </w:instrText>
+              <w:instrText xml:space="preserve"> PAGEREF _Toc234828226 \h </w:instrText>
             </w:r>
             <w:r>
               <w:rPr>
@@ -3134,7 +3134,7 @@
               <w14:ligatures w14:val="standardContextual"/>
             </w:rPr>
           </w:pPr>
-          <w:hyperlink w:anchor="_Toc234787991" w:history="1">
+          <w:hyperlink w:anchor="_Toc234828227" w:history="1">
             <w:r>
               <w:rPr>
                 <w:rStyle w:val="Hyperlink"/>
@@ -3178,7 +3178,7 @@
                 <w:noProof/>
                 <w:webHidden/>
               </w:rPr>
-              <w:instrText xml:space="preserve"> PAGEREF _Toc234787991 \h </w:instrText>
+              <w:instrText xml:space="preserve"> PAGEREF _Toc234828227 \h </w:instrText>
             </w:r>
             <w:r>
               <w:rPr>
@@ -3224,7 +3224,7 @@
               <w14:ligatures w14:val="standardContextual"/>
             </w:rPr>
           </w:pPr>
-          <w:hyperlink w:anchor="_Toc234787992" w:history="1">
+          <w:hyperlink w:anchor="_Toc234828228" w:history="1">
             <w:r>
               <w:rPr>
                 <w:rStyle w:val="Hyperlink"/>
@@ -3268,7 +3268,7 @@
                 <w:noProof/>
                 <w:webHidden/>
               </w:rPr>
-              <w:instrText xml:space="preserve"> PAGEREF _Toc234787992 \h </w:instrText>
+              <w:instrText xml:space="preserve"> PAGEREF _Toc234828228 \h </w:instrText>
             </w:r>
             <w:r>
               <w:rPr>
@@ -3314,7 +3314,7 @@
               <w14:ligatures w14:val="standardContextual"/>
             </w:rPr>
           </w:pPr>
-          <w:hyperlink w:anchor="_Toc234787993" w:history="1">
+          <w:hyperlink w:anchor="_Toc234828229" w:history="1">
             <w:r>
               <w:rPr>
                 <w:rStyle w:val="Hyperlink"/>
@@ -3358,7 +3358,7 @@
                 <w:noProof/>
                 <w:webHidden/>
               </w:rPr>
-              <w:instrText xml:space="preserve"> PAGEREF _Toc234787993 \h </w:instrText>
+              <w:instrText xml:space="preserve"> PAGEREF _Toc234828229 \h </w:instrText>
             </w:r>
             <w:r>
               <w:rPr>
@@ -3404,7 +3404,7 @@
               <w14:ligatures w14:val="standardContextual"/>
             </w:rPr>
           </w:pPr>
-          <w:hyperlink w:anchor="_Toc234787994" w:history="1">
+          <w:hyperlink w:anchor="_Toc234828230" w:history="1">
             <w:r>
               <w:rPr>
                 <w:rStyle w:val="Hyperlink"/>
@@ -3448,7 +3448,7 @@
                 <w:noProof/>
                 <w:webHidden/>
               </w:rPr>
-              <w:instrText xml:space="preserve"> PAGEREF _Toc234787994 \h </w:instrText>
+              <w:instrText xml:space="preserve"> PAGEREF _Toc234828230 \h </w:instrText>
             </w:r>
             <w:r>
               <w:rPr>
@@ -3494,7 +3494,7 @@
               <w14:ligatures w14:val="standardContextual"/>
             </w:rPr>
           </w:pPr>
-          <w:hyperlink w:anchor="_Toc234787995" w:history="1">
+          <w:hyperlink w:anchor="_Toc234828231" w:history="1">
             <w:r>
               <w:rPr>
                 <w:rStyle w:val="Hyperlink"/>
@@ -3538,7 +3538,7 @@
                 <w:noProof/>
                 <w:webHidden/>
               </w:rPr>
-              <w:instrText xml:space="preserve"> PAGEREF _Toc234787995 \h </w:instrText>
+              <w:instrText xml:space="preserve"> PAGEREF _Toc234828231 \h </w:instrText>
             </w:r>
             <w:r>
               <w:rPr>
@@ -3584,7 +3584,7 @@
               <w14:ligatures w14:val="standardContextual"/>
             </w:rPr>
           </w:pPr>
-          <w:hyperlink w:anchor="_Toc234787996" w:history="1">
+          <w:hyperlink w:anchor="_Toc234828232" w:history="1">
             <w:r>
               <w:rPr>
                 <w:rStyle w:val="Hyperlink"/>
@@ -3628,7 +3628,7 @@
                 <w:noProof/>
                 <w:webHidden/>
               </w:rPr>
-              <w:instrText xml:space="preserve"> PAGEREF _Toc234787996 \h </w:instrText>
+              <w:instrText xml:space="preserve"> PAGEREF _Toc234828232 \h </w:instrText>
             </w:r>
             <w:r>
               <w:rPr>
@@ -3674,7 +3674,7 @@
               <w14:ligatures w14:val="standardContextual"/>
             </w:rPr>
           </w:pPr>
-          <w:hyperlink w:anchor="_Toc234787997" w:history="1">
+          <w:hyperlink w:anchor="_Toc234828233" w:history="1">
             <w:r>
               <w:rPr>
                 <w:rStyle w:val="Hyperlink"/>
@@ -3718,7 +3718,7 @@
                 <w:noProof/>
                 <w:webHidden/>
               </w:rPr>
-              <w:instrText xml:space="preserve"> PAGEREF _Toc234787997 \h </w:instrText>
+              <w:instrText xml:space="preserve"> PAGEREF _Toc234828233 \h </w:instrText>
             </w:r>
             <w:r>
               <w:rPr>
@@ -3764,7 +3764,7 @@
               <w14:ligatures w14:val="standardContextual"/>
             </w:rPr>
           </w:pPr>
-          <w:hyperlink w:anchor="_Toc234787998" w:history="1">
+          <w:hyperlink w:anchor="_Toc234828234" w:history="1">
             <w:r>
               <w:rPr>
                 <w:rStyle w:val="Hyperlink"/>
@@ -3808,7 +3808,7 @@
                 <w:noProof/>
                 <w:webHidden/>
               </w:rPr>
-              <w:instrText xml:space="preserve"> PAGEREF _Toc234787998 \h </w:instrText>
+              <w:instrText xml:space="preserve"> PAGEREF _Toc234828234 \h </w:instrText>
             </w:r>
             <w:r>
               <w:rPr>
@@ -3854,7 +3854,7 @@
               <w14:ligatures w14:val="standardContextual"/>
             </w:rPr>
           </w:pPr>
-          <w:hyperlink w:anchor="_Toc234787999" w:history="1">
+          <w:hyperlink w:anchor="_Toc234828235" w:history="1">
             <w:r>
               <w:rPr>
                 <w:rStyle w:val="Hyperlink"/>
@@ -3898,7 +3898,7 @@
                 <w:noProof/>
                 <w:webHidden/>
               </w:rPr>
-              <w:instrText xml:space="preserve"> PAGEREF _Toc234787999 \h </w:instrText>
+              <w:instrText xml:space="preserve"> PAGEREF _Toc234828235 \h </w:instrText>
             </w:r>
             <w:r>
               <w:rPr>
@@ -3944,7 +3944,7 @@
               <w14:ligatures w14:val="standardContextual"/>
             </w:rPr>
           </w:pPr>
-          <w:hyperlink w:anchor="_Toc234788000" w:history="1">
+          <w:hyperlink w:anchor="_Toc234828236" w:history="1">
             <w:r>
               <w:rPr>
                 <w:rStyle w:val="Hyperlink"/>
@@ -3988,7 +3988,7 @@
                 <w:noProof/>
                 <w:webHidden/>
               </w:rPr>
-              <w:instrText xml:space="preserve"> PAGEREF _Toc234788000 \h </w:instrText>
+              <w:instrText xml:space="preserve"> PAGEREF _Toc234828236 \h </w:instrText>
             </w:r>
             <w:r>
               <w:rPr>
@@ -4034,7 +4034,7 @@
               <w14:ligatures w14:val="standardContextual"/>
             </w:rPr>
           </w:pPr>
-          <w:hyperlink w:anchor="_Toc234788001" w:history="1">
+          <w:hyperlink w:anchor="_Toc234828237" w:history="1">
             <w:r>
               <w:rPr>
                 <w:rStyle w:val="Hyperlink"/>
@@ -4078,7 +4078,7 @@
                 <w:noProof/>
                 <w:webHidden/>
               </w:rPr>
-              <w:instrText xml:space="preserve"> PAGEREF _Toc234788001 \h </w:instrText>
+              <w:instrText xml:space="preserve"> PAGEREF _Toc234828237 \h </w:instrText>
             </w:r>
             <w:r>
               <w:rPr>
@@ -4124,7 +4124,7 @@
               <w14:ligatures w14:val="standardContextual"/>
             </w:rPr>
           </w:pPr>
-          <w:hyperlink w:anchor="_Toc234788002" w:history="1">
+          <w:hyperlink w:anchor="_Toc234828238" w:history="1">
             <w:r>
               <w:rPr>
                 <w:rStyle w:val="Hyperlink"/>
@@ -4168,7 +4168,7 @@
                 <w:noProof/>
                 <w:webHidden/>
               </w:rPr>
-              <w:instrText xml:space="preserve"> PAGEREF _Toc234788002 \h </w:instrText>
+              <w:instrText xml:space="preserve"> PAGEREF _Toc234828238 \h </w:instrText>
             </w:r>
             <w:r>
               <w:rPr>
@@ -4214,7 +4214,7 @@
               <w14:ligatures w14:val="standardContextual"/>
             </w:rPr>
           </w:pPr>
-          <w:hyperlink w:anchor="_Toc234788003" w:history="1">
+          <w:hyperlink w:anchor="_Toc234828239" w:history="1">
             <w:r>
               <w:rPr>
                 <w:rStyle w:val="Hyperlink"/>
@@ -4258,7 +4258,7 @@
                 <w:noProof/>
                 <w:webHidden/>
               </w:rPr>
-              <w:instrText xml:space="preserve"> PAGEREF _Toc234788003 \h </w:instrText>
+              <w:instrText xml:space="preserve"> PAGEREF _Toc234828239 \h </w:instrText>
             </w:r>
             <w:r>
               <w:rPr>
@@ -4304,7 +4304,7 @@
               <w14:ligatures w14:val="standardContextual"/>
             </w:rPr>
           </w:pPr>
-          <w:hyperlink w:anchor="_Toc234788004" w:history="1">
+          <w:hyperlink w:anchor="_Toc234828240" w:history="1">
             <w:r>
               <w:rPr>
                 <w:rStyle w:val="Hyperlink"/>
@@ -4348,7 +4348,7 @@
                 <w:noProof/>
                 <w:webHidden/>
               </w:rPr>
-              <w:instrText xml:space="preserve"> PAGEREF _Toc234788004 \h </w:instrText>
+              <w:instrText xml:space="preserve"> PAGEREF _Toc234828240 \h </w:instrText>
             </w:r>
             <w:r>
               <w:rPr>
@@ -4394,7 +4394,7 @@
               <w14:ligatures w14:val="standardContextual"/>
             </w:rPr>
           </w:pPr>
-          <w:hyperlink w:anchor="_Toc234788005" w:history="1">
+          <w:hyperlink w:anchor="_Toc234828241" w:history="1">
             <w:r>
               <w:rPr>
                 <w:rStyle w:val="Hyperlink"/>
@@ -4438,7 +4438,7 @@
                 <w:noProof/>
                 <w:webHidden/>
               </w:rPr>
-              <w:instrText xml:space="preserve"> PAGEREF _Toc234788005 \h </w:instrText>
+              <w:instrText xml:space="preserve"> PAGEREF _Toc234828241 \h </w:instrText>
             </w:r>
             <w:r>
               <w:rPr>
@@ -4484,7 +4484,7 @@
               <w14:ligatures w14:val="standardContextual"/>
             </w:rPr>
           </w:pPr>
-          <w:hyperlink w:anchor="_Toc234788006" w:history="1">
+          <w:hyperlink w:anchor="_Toc234828242" w:history="1">
             <w:r>
               <w:rPr>
                 <w:rStyle w:val="Hyperlink"/>
@@ -4528,7 +4528,7 @@
                 <w:noProof/>
                 <w:webHidden/>
               </w:rPr>
-              <w:instrText xml:space="preserve"> PAGEREF _Toc234788006 \h </w:instrText>
+              <w:instrText xml:space="preserve"> PAGEREF _Toc234828242 \h </w:instrText>
             </w:r>
             <w:r>
               <w:rPr>
@@ -4574,7 +4574,7 @@
               <w14:ligatures w14:val="standardContextual"/>
             </w:rPr>
           </w:pPr>
-          <w:hyperlink w:anchor="_Toc234788007" w:history="1">
+          <w:hyperlink w:anchor="_Toc234828243" w:history="1">
             <w:r>
               <w:rPr>
                 <w:rStyle w:val="Hyperlink"/>
@@ -4618,7 +4618,7 @@
                 <w:noProof/>
                 <w:webHidden/>
               </w:rPr>
-              <w:instrText xml:space="preserve"> PAGEREF _Toc234788007 \h </w:instrText>
+              <w:instrText xml:space="preserve"> PAGEREF _Toc234828243 \h </w:instrText>
             </w:r>
             <w:r>
               <w:rPr>
@@ -4664,7 +4664,7 @@
               <w14:ligatures w14:val="standardContextual"/>
             </w:rPr>
           </w:pPr>
-          <w:hyperlink w:anchor="_Toc234788008" w:history="1">
+          <w:hyperlink w:anchor="_Toc234828244" w:history="1">
             <w:r>
               <w:rPr>
                 <w:rStyle w:val="Hyperlink"/>
@@ -4708,7 +4708,7 @@
                 <w:noProof/>
                 <w:webHidden/>
               </w:rPr>
-              <w:instrText xml:space="preserve"> PAGEREF _Toc234788008 \h </w:instrText>
+              <w:instrText xml:space="preserve"> PAGEREF _Toc234828244 \h </w:instrText>
             </w:r>
             <w:r>
               <w:rPr>
@@ -4754,7 +4754,7 @@
               <w14:ligatures w14:val="standardContextual"/>
             </w:rPr>
           </w:pPr>
-          <w:hyperlink w:anchor="_Toc234788009" w:history="1">
+          <w:hyperlink w:anchor="_Toc234828245" w:history="1">
             <w:r>
               <w:rPr>
                 <w:rStyle w:val="Hyperlink"/>
@@ -4798,7 +4798,7 @@
                 <w:noProof/>
                 <w:webHidden/>
               </w:rPr>
-              <w:instrText xml:space="preserve"> PAGEREF _Toc234788009 \h </w:instrText>
+              <w:instrText xml:space="preserve"> PAGEREF _Toc234828245 \h </w:instrText>
             </w:r>
             <w:r>
               <w:rPr>
@@ -4844,7 +4844,7 @@
               <w14:ligatures w14:val="standardContextual"/>
             </w:rPr>
           </w:pPr>
-          <w:hyperlink w:anchor="_Toc234788010" w:history="1">
+          <w:hyperlink w:anchor="_Toc234828246" w:history="1">
             <w:r>
               <w:rPr>
                 <w:rStyle w:val="Hyperlink"/>
@@ -4888,7 +4888,7 @@
                 <w:noProof/>
                 <w:webHidden/>
               </w:rPr>
-              <w:instrText xml:space="preserve"> PAGEREF _Toc234788010 \h </w:instrText>
+              <w:instrText xml:space="preserve"> PAGEREF _Toc234828246 \h </w:instrText>
             </w:r>
             <w:r>
               <w:rPr>
@@ -4934,7 +4934,7 @@
               <w14:ligatures w14:val="standardContextual"/>
             </w:rPr>
           </w:pPr>
-          <w:hyperlink w:anchor="_Toc234788011" w:history="1">
+          <w:hyperlink w:anchor="_Toc234828247" w:history="1">
             <w:r>
               <w:rPr>
                 <w:rStyle w:val="Hyperlink"/>
@@ -4978,7 +4978,7 @@
                 <w:noProof/>
                 <w:webHidden/>
               </w:rPr>
-              <w:instrText xml:space="preserve"> PAGEREF _Toc234788011 \h </w:instrText>
+              <w:instrText xml:space="preserve"> PAGEREF _Toc234828247 \h </w:instrText>
             </w:r>
             <w:r>
               <w:rPr>
@@ -5024,7 +5024,7 @@
               <w14:ligatures w14:val="standardContextual"/>
             </w:rPr>
           </w:pPr>
-          <w:hyperlink w:anchor="_Toc234788012" w:history="1">
+          <w:hyperlink w:anchor="_Toc234828248" w:history="1">
             <w:r>
               <w:rPr>
                 <w:rStyle w:val="Hyperlink"/>
@@ -5068,7 +5068,7 @@
                 <w:noProof/>
                 <w:webHidden/>
               </w:rPr>
-              <w:instrText xml:space="preserve"> PAGEREF _Toc234788012 \h </w:instrText>
+              <w:instrText xml:space="preserve"> PAGEREF _Toc234828248 \h </w:instrText>
             </w:r>
             <w:r>
               <w:rPr>
@@ -5114,7 +5114,7 @@
               <w14:ligatures w14:val="standardContextual"/>
             </w:rPr>
           </w:pPr>
-          <w:hyperlink w:anchor="_Toc234788013" w:history="1">
+          <w:hyperlink w:anchor="_Toc234828249" w:history="1">
             <w:r>
               <w:rPr>
                 <w:rStyle w:val="Hyperlink"/>
@@ -5158,7 +5158,7 @@
                 <w:noProof/>
                 <w:webHidden/>
               </w:rPr>
-              <w:instrText xml:space="preserve"> PAGEREF _Toc234788013 \h </w:instrText>
+              <w:instrText xml:space="preserve"> PAGEREF _Toc234828249 \h </w:instrText>
             </w:r>
             <w:r>
               <w:rPr>
@@ -5204,7 +5204,7 @@
               <w14:ligatures w14:val="standardContextual"/>
             </w:rPr>
           </w:pPr>
-          <w:hyperlink w:anchor="_Toc234788014" w:history="1">
+          <w:hyperlink w:anchor="_Toc234828250" w:history="1">
             <w:r>
               <w:rPr>
                 <w:rStyle w:val="Hyperlink"/>
@@ -5248,7 +5248,7 @@
                 <w:noProof/>
                 <w:webHidden/>
               </w:rPr>
-              <w:instrText xml:space="preserve"> PAGEREF _Toc234788014 \h </w:instrText>
+              <w:instrText xml:space="preserve"> PAGEREF _Toc234828250 \h </w:instrText>
             </w:r>
             <w:r>
               <w:rPr>
@@ -5294,7 +5294,7 @@
               <w14:ligatures w14:val="standardContextual"/>
             </w:rPr>
           </w:pPr>
-          <w:hyperlink w:anchor="_Toc234788015" w:history="1">
+          <w:hyperlink w:anchor="_Toc234828251" w:history="1">
             <w:r>
               <w:rPr>
                 <w:rStyle w:val="Hyperlink"/>
@@ -5338,7 +5338,7 @@
                 <w:noProof/>
                 <w:webHidden/>
               </w:rPr>
-              <w:instrText xml:space="preserve"> PAGEREF _Toc234788015 \h </w:instrText>
+              <w:instrText xml:space="preserve"> PAGEREF _Toc234828251 \h </w:instrText>
             </w:r>
             <w:r>
               <w:rPr>
@@ -5384,7 +5384,7 @@
               <w14:ligatures w14:val="standardContextual"/>
             </w:rPr>
           </w:pPr>
-          <w:hyperlink w:anchor="_Toc234788016" w:history="1">
+          <w:hyperlink w:anchor="_Toc234828252" w:history="1">
             <w:r>
               <w:rPr>
                 <w:rStyle w:val="Hyperlink"/>
@@ -5428,7 +5428,7 @@
                 <w:noProof/>
                 <w:webHidden/>
               </w:rPr>
-              <w:instrText xml:space="preserve"> PAGEREF _Toc234788016 \h </w:instrText>
+              <w:instrText xml:space="preserve"> PAGEREF _Toc234828252 \h </w:instrText>
             </w:r>
             <w:r>
               <w:rPr>
@@ -5474,7 +5474,7 @@
               <w14:ligatures w14:val="standardContextual"/>
             </w:rPr>
           </w:pPr>
-          <w:hyperlink w:anchor="_Toc234788017" w:history="1">
+          <w:hyperlink w:anchor="_Toc234828253" w:history="1">
             <w:r>
               <w:rPr>
                 <w:rStyle w:val="Hyperlink"/>
@@ -5518,7 +5518,7 @@
                 <w:noProof/>
                 <w:webHidden/>
               </w:rPr>
-              <w:instrText xml:space="preserve"> PAGEREF _Toc234788017 \h </w:instrText>
+              <w:instrText xml:space="preserve"> PAGEREF _Toc234828253 \h </w:instrText>
             </w:r>
             <w:r>
               <w:rPr>
@@ -5564,7 +5564,7 @@
               <w14:ligatures w14:val="standardContextual"/>
             </w:rPr>
           </w:pPr>
-          <w:hyperlink w:anchor="_Toc234788018" w:history="1">
+          <w:hyperlink w:anchor="_Toc234828254" w:history="1">
             <w:r>
               <w:rPr>
                 <w:rStyle w:val="Hyperlink"/>
@@ -5608,7 +5608,7 @@
                 <w:noProof/>
                 <w:webHidden/>
               </w:rPr>
-              <w:instrText xml:space="preserve"> PAGEREF _Toc234788018 \h </w:instrText>
+              <w:instrText xml:space="preserve"> PAGEREF _Toc234828254 \h </w:instrText>
             </w:r>
             <w:r>
               <w:rPr>
@@ -5654,7 +5654,7 @@
               <w14:ligatures w14:val="standardContextual"/>
             </w:rPr>
           </w:pPr>
-          <w:hyperlink w:anchor="_Toc234788019" w:history="1">
+          <w:hyperlink w:anchor="_Toc234828255" w:history="1">
             <w:r>
               <w:rPr>
                 <w:rStyle w:val="Hyperlink"/>
@@ -5698,7 +5698,7 @@
                 <w:noProof/>
                 <w:webHidden/>
               </w:rPr>
-              <w:instrText xml:space="preserve"> PAGEREF _Toc234788019 \h </w:instrText>
+              <w:instrText xml:space="preserve"> PAGEREF _Toc234828255 \h </w:instrText>
             </w:r>
             <w:r>
               <w:rPr>
@@ -5744,7 +5744,7 @@
               <w14:ligatures w14:val="standardContextual"/>
             </w:rPr>
           </w:pPr>
-          <w:hyperlink w:anchor="_Toc234788020" w:history="1">
+          <w:hyperlink w:anchor="_Toc234828256" w:history="1">
             <w:r>
               <w:rPr>
                 <w:rStyle w:val="Hyperlink"/>
@@ -5788,7 +5788,7 @@
                 <w:noProof/>
                 <w:webHidden/>
               </w:rPr>
-              <w:instrText xml:space="preserve"> PAGEREF _Toc234788020 \h </w:instrText>
+              <w:instrText xml:space="preserve"> PAGEREF _Toc234828256 \h </w:instrText>
             </w:r>
             <w:r>
               <w:rPr>
@@ -5834,7 +5834,7 @@
               <w14:ligatures w14:val="standardContextual"/>
             </w:rPr>
           </w:pPr>
-          <w:hyperlink w:anchor="_Toc234788021" w:history="1">
+          <w:hyperlink w:anchor="_Toc234828257" w:history="1">
             <w:r>
               <w:rPr>
                 <w:rStyle w:val="Hyperlink"/>
@@ -5878,7 +5878,7 @@
                 <w:noProof/>
                 <w:webHidden/>
               </w:rPr>
-              <w:instrText xml:space="preserve"> PAGEREF _Toc234788021 \h </w:instrText>
+              <w:instrText xml:space="preserve"> PAGEREF _Toc234828257 \h </w:instrText>
             </w:r>
             <w:r>
               <w:rPr>
@@ -5924,7 +5924,7 @@
               <w14:ligatures w14:val="standardContextual"/>
             </w:rPr>
           </w:pPr>
-          <w:hyperlink w:anchor="_Toc234788022" w:history="1">
+          <w:hyperlink w:anchor="_Toc234828258" w:history="1">
             <w:r>
               <w:rPr>
                 <w:rStyle w:val="Hyperlink"/>
@@ -5968,7 +5968,7 @@
                 <w:noProof/>
                 <w:webHidden/>
               </w:rPr>
-              <w:instrText xml:space="preserve"> PAGEREF _Toc234788022 \h </w:instrText>
+              <w:instrText xml:space="preserve"> PAGEREF _Toc234828258 \h </w:instrText>
             </w:r>
             <w:r>
               <w:rPr>
@@ -6014,7 +6014,7 @@
               <w14:ligatures w14:val="standardContextual"/>
             </w:rPr>
           </w:pPr>
-          <w:hyperlink w:anchor="_Toc234788023" w:history="1">
+          <w:hyperlink w:anchor="_Toc234828259" w:history="1">
             <w:r>
               <w:rPr>
                 <w:rStyle w:val="Hyperlink"/>
@@ -6058,7 +6058,7 @@
                 <w:noProof/>
                 <w:webHidden/>
               </w:rPr>
-              <w:instrText xml:space="preserve"> PAGEREF _Toc234788023 \h </w:instrText>
+              <w:instrText xml:space="preserve"> PAGEREF _Toc234828259 \h </w:instrText>
             </w:r>
             <w:r>
               <w:rPr>
@@ -6104,7 +6104,7 @@
               <w14:ligatures w14:val="standardContextual"/>
             </w:rPr>
           </w:pPr>
-          <w:hyperlink w:anchor="_Toc234788024" w:history="1">
+          <w:hyperlink w:anchor="_Toc234828260" w:history="1">
             <w:r>
               <w:rPr>
                 <w:rStyle w:val="Hyperlink"/>
@@ -6148,7 +6148,7 @@
                 <w:noProof/>
                 <w:webHidden/>
               </w:rPr>
-              <w:instrText xml:space="preserve"> PAGEREF _Toc234788024 \h </w:instrText>
+              <w:instrText xml:space="preserve"> PAGEREF _Toc234828260 \h </w:instrText>
             </w:r>
             <w:r>
               <w:rPr>
@@ -6194,7 +6194,7 @@
               <w14:ligatures w14:val="standardContextual"/>
             </w:rPr>
           </w:pPr>
-          <w:hyperlink w:anchor="_Toc234788025" w:history="1">
+          <w:hyperlink w:anchor="_Toc234828261" w:history="1">
             <w:r>
               <w:rPr>
                 <w:rStyle w:val="Hyperlink"/>
@@ -6238,7 +6238,7 @@
                 <w:noProof/>
                 <w:webHidden/>
               </w:rPr>
-              <w:instrText xml:space="preserve"> PAGEREF _Toc234788025 \h </w:instrText>
+              <w:instrText xml:space="preserve"> PAGEREF _Toc234828261 \h </w:instrText>
             </w:r>
             <w:r>
               <w:rPr>
@@ -6284,7 +6284,7 @@
               <w14:ligatures w14:val="standardContextual"/>
             </w:rPr>
           </w:pPr>
-          <w:hyperlink w:anchor="_Toc234788026" w:history="1">
+          <w:hyperlink w:anchor="_Toc234828262" w:history="1">
             <w:r>
               <w:rPr>
                 <w:rStyle w:val="Hyperlink"/>
@@ -6328,7 +6328,7 @@
                 <w:noProof/>
                 <w:webHidden/>
               </w:rPr>
-              <w:instrText xml:space="preserve"> PAGEREF _Toc234788026 \h </w:instrText>
+              <w:instrText xml:space="preserve"> PAGEREF _Toc234828262 \h </w:instrText>
             </w:r>
             <w:r>
               <w:rPr>
@@ -6374,7 +6374,7 @@
               <w14:ligatures w14:val="standardContextual"/>
             </w:rPr>
           </w:pPr>
-          <w:hyperlink w:anchor="_Toc234788027" w:history="1">
+          <w:hyperlink w:anchor="_Toc234828263" w:history="1">
             <w:r>
               <w:rPr>
                 <w:rStyle w:val="Hyperlink"/>
@@ -6418,7 +6418,7 @@
                 <w:noProof/>
                 <w:webHidden/>
               </w:rPr>
-              <w:instrText xml:space="preserve"> PAGEREF _Toc234788027 \h </w:instrText>
+              <w:instrText xml:space="preserve"> PAGEREF _Toc234828263 \h </w:instrText>
             </w:r>
             <w:r>
               <w:rPr>
@@ -6464,7 +6464,7 @@
               <w14:ligatures w14:val="standardContextual"/>
             </w:rPr>
           </w:pPr>
-          <w:hyperlink w:anchor="_Toc234788028" w:history="1">
+          <w:hyperlink w:anchor="_Toc234828264" w:history="1">
             <w:r>
               <w:rPr>
                 <w:rStyle w:val="Hyperlink"/>
@@ -6508,7 +6508,7 @@
                 <w:noProof/>
                 <w:webHidden/>
               </w:rPr>
-              <w:instrText xml:space="preserve"> PAGEREF _Toc234788028 \h </w:instrText>
+              <w:instrText xml:space="preserve"> PAGEREF _Toc234828264 \h </w:instrText>
             </w:r>
             <w:r>
               <w:rPr>
@@ -6554,7 +6554,7 @@
               <w14:ligatures w14:val="standardContextual"/>
             </w:rPr>
           </w:pPr>
-          <w:hyperlink w:anchor="_Toc234788029" w:history="1">
+          <w:hyperlink w:anchor="_Toc234828265" w:history="1">
             <w:r>
               <w:rPr>
                 <w:rStyle w:val="Hyperlink"/>
@@ -6598,7 +6598,7 @@
                 <w:noProof/>
                 <w:webHidden/>
               </w:rPr>
-              <w:instrText xml:space="preserve"> PAGEREF _Toc234788029 \h </w:instrText>
+              <w:instrText xml:space="preserve"> PAGEREF _Toc234828265 \h </w:instrText>
             </w:r>
             <w:r>
               <w:rPr>
@@ -6644,7 +6644,7 @@
               <w14:ligatures w14:val="standardContextual"/>
             </w:rPr>
           </w:pPr>
-          <w:hyperlink w:anchor="_Toc234788030" w:history="1">
+          <w:hyperlink w:anchor="_Toc234828266" w:history="1">
             <w:r>
               <w:rPr>
                 <w:rStyle w:val="Hyperlink"/>
@@ -6688,7 +6688,7 @@
                 <w:noProof/>
                 <w:webHidden/>
               </w:rPr>
-              <w:instrText xml:space="preserve"> PAGEREF _Toc234788030 \h </w:instrText>
+              <w:instrText xml:space="preserve"> PAGEREF _Toc234828266 \h </w:instrText>
             </w:r>
             <w:r>
               <w:rPr>
@@ -6734,7 +6734,7 @@
               <w14:ligatures w14:val="standardContextual"/>
             </w:rPr>
           </w:pPr>
-          <w:hyperlink w:anchor="_Toc234788031" w:history="1">
+          <w:hyperlink w:anchor="_Toc234828267" w:history="1">
             <w:r>
               <w:rPr>
                 <w:rStyle w:val="Hyperlink"/>
@@ -6778,7 +6778,7 @@
                 <w:noProof/>
                 <w:webHidden/>
               </w:rPr>
-              <w:instrText xml:space="preserve"> PAGEREF _Toc234788031 \h </w:instrText>
+              <w:instrText xml:space="preserve"> PAGEREF _Toc234828267 \h </w:instrText>
             </w:r>
             <w:r>
               <w:rPr>
@@ -6824,7 +6824,7 @@
               <w14:ligatures w14:val="standardContextual"/>
             </w:rPr>
           </w:pPr>
-          <w:hyperlink w:anchor="_Toc234788032" w:history="1">
+          <w:hyperlink w:anchor="_Toc234828268" w:history="1">
             <w:r>
               <w:rPr>
                 <w:rStyle w:val="Hyperlink"/>
@@ -6868,7 +6868,7 @@
                 <w:noProof/>
                 <w:webHidden/>
               </w:rPr>
-              <w:instrText xml:space="preserve"> PAGEREF _Toc234788032 \h </w:instrText>
+              <w:instrText xml:space="preserve"> PAGEREF _Toc234828268 \h </w:instrText>
             </w:r>
             <w:r>
               <w:rPr>
@@ -6914,7 +6914,7 @@
               <w14:ligatures w14:val="standardContextual"/>
             </w:rPr>
           </w:pPr>
-          <w:hyperlink w:anchor="_Toc234788033" w:history="1">
+          <w:hyperlink w:anchor="_Toc234828269" w:history="1">
             <w:r>
               <w:rPr>
                 <w:rStyle w:val="Hyperlink"/>
@@ -6958,7 +6958,7 @@
                 <w:noProof/>
                 <w:webHidden/>
               </w:rPr>
-              <w:instrText xml:space="preserve"> PAGEREF _Toc234788033 \h </w:instrText>
+              <w:instrText xml:space="preserve"> PAGEREF _Toc234828269 \h </w:instrText>
             </w:r>
             <w:r>
               <w:rPr>
@@ -7004,7 +7004,7 @@
               <w14:ligatures w14:val="standardContextual"/>
             </w:rPr>
           </w:pPr>
-          <w:hyperlink w:anchor="_Toc234788034" w:history="1">
+          <w:hyperlink w:anchor="_Toc234828270" w:history="1">
             <w:r>
               <w:rPr>
                 <w:rStyle w:val="Hyperlink"/>
@@ -7048,7 +7048,7 @@
                 <w:noProof/>
                 <w:webHidden/>
               </w:rPr>
-              <w:instrText xml:space="preserve"> PAGEREF _Toc234788034 \h </w:instrText>
+              <w:instrText xml:space="preserve"> PAGEREF _Toc234828270 \h </w:instrText>
             </w:r>
             <w:r>
               <w:rPr>
@@ -7094,7 +7094,7 @@
               <w14:ligatures w14:val="standardContextual"/>
             </w:rPr>
           </w:pPr>
-          <w:hyperlink w:anchor="_Toc234788035" w:history="1">
+          <w:hyperlink w:anchor="_Toc234828271" w:history="1">
             <w:r>
               <w:rPr>
                 <w:rStyle w:val="Hyperlink"/>
@@ -7138,7 +7138,7 @@
                 <w:noProof/>
                 <w:webHidden/>
               </w:rPr>
-              <w:instrText xml:space="preserve"> PAGEREF _Toc234788035 \h </w:instrText>
+              <w:instrText xml:space="preserve"> PAGEREF _Toc234828271 \h </w:instrText>
             </w:r>
             <w:r>
               <w:rPr>
@@ -7184,7 +7184,7 @@
               <w14:ligatures w14:val="standardContextual"/>
             </w:rPr>
           </w:pPr>
-          <w:hyperlink w:anchor="_Toc234788036" w:history="1">
+          <w:hyperlink w:anchor="_Toc234828272" w:history="1">
             <w:r>
               <w:rPr>
                 <w:rStyle w:val="Hyperlink"/>
@@ -7228,7 +7228,7 @@
                 <w:noProof/>
                 <w:webHidden/>
               </w:rPr>
-              <w:instrText xml:space="preserve"> PAGEREF _Toc234788036 \h </w:instrText>
+              <w:instrText xml:space="preserve"> PAGEREF _Toc234828272 \h </w:instrText>
             </w:r>
             <w:r>
               <w:rPr>
@@ -7274,7 +7274,7 @@
               <w14:ligatures w14:val="standardContextual"/>
             </w:rPr>
           </w:pPr>
-          <w:hyperlink w:anchor="_Toc234788037" w:history="1">
+          <w:hyperlink w:anchor="_Toc234828273" w:history="1">
             <w:r>
               <w:rPr>
                 <w:rStyle w:val="Hyperlink"/>
@@ -7318,7 +7318,7 @@
                 <w:noProof/>
                 <w:webHidden/>
               </w:rPr>
-              <w:instrText xml:space="preserve"> PAGEREF _Toc234788037 \h </w:instrText>
+              <w:instrText xml:space="preserve"> PAGEREF _Toc234828273 \h </w:instrText>
             </w:r>
             <w:r>
               <w:rPr>
@@ -7364,7 +7364,7 @@
               <w14:ligatures w14:val="standardContextual"/>
             </w:rPr>
           </w:pPr>
-          <w:hyperlink w:anchor="_Toc234788038" w:history="1">
+          <w:hyperlink w:anchor="_Toc234828274" w:history="1">
             <w:r>
               <w:rPr>
                 <w:rStyle w:val="Hyperlink"/>
@@ -7408,7 +7408,7 @@
                 <w:noProof/>
                 <w:webHidden/>
               </w:rPr>
-              <w:instrText xml:space="preserve"> PAGEREF _Toc234788038 \h </w:instrText>
+              <w:instrText xml:space="preserve"> PAGEREF _Toc234828274 \h </w:instrText>
             </w:r>
             <w:r>
               <w:rPr>
@@ -7454,7 +7454,7 @@
               <w14:ligatures w14:val="standardContextual"/>
             </w:rPr>
           </w:pPr>
-          <w:hyperlink w:anchor="_Toc234788039" w:history="1">
+          <w:hyperlink w:anchor="_Toc234828275" w:history="1">
             <w:r>
               <w:rPr>
                 <w:rStyle w:val="Hyperlink"/>
@@ -7498,7 +7498,7 @@
                 <w:noProof/>
                 <w:webHidden/>
               </w:rPr>
-              <w:instrText xml:space="preserve"> PAGEREF _Toc234788039 \h </w:instrText>
+              <w:instrText xml:space="preserve"> PAGEREF _Toc234828275 \h </w:instrText>
             </w:r>
             <w:r>
               <w:rPr>
@@ -7544,7 +7544,7 @@
               <w14:ligatures w14:val="standardContextual"/>
             </w:rPr>
           </w:pPr>
-          <w:hyperlink w:anchor="_Toc234788040" w:history="1">
+          <w:hyperlink w:anchor="_Toc234828276" w:history="1">
             <w:r>
               <w:rPr>
                 <w:rStyle w:val="Hyperlink"/>
@@ -7588,7 +7588,7 @@
                 <w:noProof/>
                 <w:webHidden/>
               </w:rPr>
-              <w:instrText xml:space="preserve"> PAGEREF _Toc234788040 \h </w:instrText>
+              <w:instrText xml:space="preserve"> PAGEREF _Toc234828276 \h </w:instrText>
             </w:r>
             <w:r>
               <w:rPr>
@@ -7634,7 +7634,7 @@
               <w14:ligatures w14:val="standardContextual"/>
             </w:rPr>
           </w:pPr>
-          <w:hyperlink w:anchor="_Toc234788041" w:history="1">
+          <w:hyperlink w:anchor="_Toc234828277" w:history="1">
             <w:r>
               <w:rPr>
                 <w:rStyle w:val="Hyperlink"/>
@@ -7678,7 +7678,7 @@
                 <w:noProof/>
                 <w:webHidden/>
               </w:rPr>
-              <w:instrText xml:space="preserve"> PAGEREF _Toc234788041 \h </w:instrText>
+              <w:instrText xml:space="preserve"> PAGEREF _Toc234828277 \h </w:instrText>
             </w:r>
             <w:r>
               <w:rPr>
@@ -7724,7 +7724,7 @@
               <w14:ligatures w14:val="standardContextual"/>
             </w:rPr>
           </w:pPr>
-          <w:hyperlink w:anchor="_Toc234788042" w:history="1">
+          <w:hyperlink w:anchor="_Toc234828278" w:history="1">
             <w:r>
               <w:rPr>
                 <w:rStyle w:val="Hyperlink"/>
@@ -7768,7 +7768,7 @@
                 <w:noProof/>
                 <w:webHidden/>
               </w:rPr>
-              <w:instrText xml:space="preserve"> PAGEREF _Toc234788042 \h </w:instrText>
+              <w:instrText xml:space="preserve"> PAGEREF _Toc234828278 \h </w:instrText>
             </w:r>
             <w:r>
               <w:rPr>
@@ -7814,7 +7814,7 @@
               <w14:ligatures w14:val="standardContextual"/>
             </w:rPr>
           </w:pPr>
-          <w:hyperlink w:anchor="_Toc234788043" w:history="1">
+          <w:hyperlink w:anchor="_Toc234828279" w:history="1">
             <w:r>
               <w:rPr>
                 <w:rStyle w:val="Hyperlink"/>
@@ -7858,7 +7858,7 @@
                 <w:noProof/>
                 <w:webHidden/>
               </w:rPr>
-              <w:instrText xml:space="preserve"> PAGEREF _Toc234788043 \h </w:instrText>
+              <w:instrText xml:space="preserve"> PAGEREF _Toc234828279 \h </w:instrText>
             </w:r>
             <w:r>
               <w:rPr>
@@ -7904,7 +7904,7 @@
               <w14:ligatures w14:val="standardContextual"/>
             </w:rPr>
           </w:pPr>
-          <w:hyperlink w:anchor="_Toc234788044" w:history="1">
+          <w:hyperlink w:anchor="_Toc234828280" w:history="1">
             <w:r>
               <w:rPr>
                 <w:rStyle w:val="Hyperlink"/>
@@ -7948,7 +7948,7 @@
                 <w:noProof/>
                 <w:webHidden/>
               </w:rPr>
-              <w:instrText xml:space="preserve"> PAGEREF _Toc234788044 \h </w:instrText>
+              <w:instrText xml:space="preserve"> PAGEREF _Toc234828280 \h </w:instrText>
             </w:r>
             <w:r>
               <w:rPr>
@@ -7994,7 +7994,7 @@
               <w14:ligatures w14:val="standardContextual"/>
             </w:rPr>
           </w:pPr>
-          <w:hyperlink w:anchor="_Toc234788045" w:history="1">
+          <w:hyperlink w:anchor="_Toc234828281" w:history="1">
             <w:r>
               <w:rPr>
                 <w:rStyle w:val="Hyperlink"/>
@@ -8038,7 +8038,7 @@
                 <w:noProof/>
                 <w:webHidden/>
               </w:rPr>
-              <w:instrText xml:space="preserve"> PAGEREF _Toc234788045 \h </w:instrText>
+              <w:instrText xml:space="preserve"> PAGEREF _Toc234828281 \h </w:instrText>
             </w:r>
             <w:r>
               <w:rPr>
@@ -8084,7 +8084,7 @@
               <w14:ligatures w14:val="standardContextual"/>
             </w:rPr>
           </w:pPr>
-          <w:hyperlink w:anchor="_Toc234788046" w:history="1">
+          <w:hyperlink w:anchor="_Toc234828282" w:history="1">
             <w:r>
               <w:rPr>
                 <w:rStyle w:val="Hyperlink"/>
@@ -8128,7 +8128,7 @@
                 <w:noProof/>
                 <w:webHidden/>
               </w:rPr>
-              <w:instrText xml:space="preserve"> PAGEREF _Toc234788046 \h </w:instrText>
+              <w:instrText xml:space="preserve"> PAGEREF _Toc234828282 \h </w:instrText>
             </w:r>
             <w:r>
               <w:rPr>
@@ -8174,7 +8174,7 @@
               <w14:ligatures w14:val="standardContextual"/>
             </w:rPr>
           </w:pPr>
-          <w:hyperlink w:anchor="_Toc234788047" w:history="1">
+          <w:hyperlink w:anchor="_Toc234828283" w:history="1">
             <w:r>
               <w:rPr>
                 <w:rStyle w:val="Hyperlink"/>
@@ -8218,7 +8218,7 @@
                 <w:noProof/>
                 <w:webHidden/>
               </w:rPr>
-              <w:instrText xml:space="preserve"> PAGEREF _Toc234788047 \h </w:instrText>
+              <w:instrText xml:space="preserve"> PAGEREF _Toc234828283 \h </w:instrText>
             </w:r>
             <w:r>
               <w:rPr>
@@ -8264,7 +8264,7 @@
               <w14:ligatures w14:val="standardContextual"/>
             </w:rPr>
           </w:pPr>
-          <w:hyperlink w:anchor="_Toc234788048" w:history="1">
+          <w:hyperlink w:anchor="_Toc234828284" w:history="1">
             <w:r>
               <w:rPr>
                 <w:rStyle w:val="Hyperlink"/>
@@ -8308,7 +8308,7 @@
                 <w:noProof/>
                 <w:webHidden/>
               </w:rPr>
-              <w:instrText xml:space="preserve"> PAGEREF _Toc234788048 \h </w:instrText>
+              <w:instrText xml:space="preserve"> PAGEREF _Toc234828284 \h </w:instrText>
             </w:r>
             <w:r>
               <w:rPr>
@@ -8354,7 +8354,7 @@
               <w14:ligatures w14:val="standardContextual"/>
             </w:rPr>
           </w:pPr>
-          <w:hyperlink w:anchor="_Toc234788049" w:history="1">
+          <w:hyperlink w:anchor="_Toc234828285" w:history="1">
             <w:r>
               <w:rPr>
                 <w:rStyle w:val="Hyperlink"/>
@@ -8398,7 +8398,7 @@
                 <w:noProof/>
                 <w:webHidden/>
               </w:rPr>
-              <w:instrText xml:space="preserve"> PAGEREF _Toc234788049 \h </w:instrText>
+              <w:instrText xml:space="preserve"> PAGEREF _Toc234828285 \h </w:instrText>
             </w:r>
             <w:r>
               <w:rPr>
@@ -8444,7 +8444,7 @@
               <w14:ligatures w14:val="standardContextual"/>
             </w:rPr>
           </w:pPr>
-          <w:hyperlink w:anchor="_Toc234788050" w:history="1">
+          <w:hyperlink w:anchor="_Toc234828286" w:history="1">
             <w:r>
               <w:rPr>
                 <w:rStyle w:val="Hyperlink"/>
@@ -8488,7 +8488,7 @@
                 <w:noProof/>
                 <w:webHidden/>
               </w:rPr>
-              <w:instrText xml:space="preserve"> PAGEREF _Toc234788050 \h </w:instrText>
+              <w:instrText xml:space="preserve"> PAGEREF _Toc234828286 \h </w:instrText>
             </w:r>
             <w:r>
               <w:rPr>
@@ -8534,7 +8534,7 @@
               <w14:ligatures w14:val="standardContextual"/>
             </w:rPr>
           </w:pPr>
-          <w:hyperlink w:anchor="_Toc234788051" w:history="1">
+          <w:hyperlink w:anchor="_Toc234828287" w:history="1">
             <w:r>
               <w:rPr>
                 <w:rStyle w:val="Hyperlink"/>
@@ -8578,7 +8578,7 @@
                 <w:noProof/>
                 <w:webHidden/>
               </w:rPr>
-              <w:instrText xml:space="preserve"> PAGEREF _Toc234788051 \h </w:instrText>
+              <w:instrText xml:space="preserve"> PAGEREF _Toc234828287 \h </w:instrText>
             </w:r>
             <w:r>
               <w:rPr>
@@ -8624,7 +8624,7 @@
               <w14:ligatures w14:val="standardContextual"/>
             </w:rPr>
           </w:pPr>
-          <w:hyperlink w:anchor="_Toc234788052" w:history="1">
+          <w:hyperlink w:anchor="_Toc234828288" w:history="1">
             <w:r>
               <w:rPr>
                 <w:rStyle w:val="Hyperlink"/>
@@ -8668,7 +8668,7 @@
                 <w:noProof/>
                 <w:webHidden/>
               </w:rPr>
-              <w:instrText xml:space="preserve"> PAGEREF _Toc234788052 \h </w:instrText>
+              <w:instrText xml:space="preserve"> PAGEREF _Toc234828288 \h </w:instrText>
             </w:r>
             <w:r>
               <w:rPr>
@@ -8714,7 +8714,7 @@
               <w14:ligatures w14:val="standardContextual"/>
             </w:rPr>
           </w:pPr>
-          <w:hyperlink w:anchor="_Toc234788053" w:history="1">
+          <w:hyperlink w:anchor="_Toc234828289" w:history="1">
             <w:r>
               <w:rPr>
                 <w:rStyle w:val="Hyperlink"/>
@@ -8758,7 +8758,7 @@
                 <w:noProof/>
                 <w:webHidden/>
               </w:rPr>
-              <w:instrText xml:space="preserve"> PAGEREF _Toc234788053 \h </w:instrText>
+              <w:instrText xml:space="preserve"> PAGEREF _Toc234828289 \h </w:instrText>
             </w:r>
             <w:r>
               <w:rPr>
@@ -8804,7 +8804,7 @@
               <w14:ligatures w14:val="standardContextual"/>
             </w:rPr>
           </w:pPr>
-          <w:hyperlink w:anchor="_Toc234788054" w:history="1">
+          <w:hyperlink w:anchor="_Toc234828290" w:history="1">
             <w:r>
               <w:rPr>
                 <w:rStyle w:val="Hyperlink"/>
@@ -8848,7 +8848,7 @@
                 <w:noProof/>
                 <w:webHidden/>
               </w:rPr>
-              <w:instrText xml:space="preserve"> PAGEREF _Toc234788054 \h </w:instrText>
+              <w:instrText xml:space="preserve"> PAGEREF _Toc234828290 \h </w:instrText>
             </w:r>
             <w:r>
               <w:rPr>
@@ -8894,7 +8894,7 @@
               <w14:ligatures w14:val="standardContextual"/>
             </w:rPr>
           </w:pPr>
-          <w:hyperlink w:anchor="_Toc234788055" w:history="1">
+          <w:hyperlink w:anchor="_Toc234828291" w:history="1">
             <w:r>
               <w:rPr>
                 <w:rStyle w:val="Hyperlink"/>
@@ -8938,7 +8938,7 @@
                 <w:noProof/>
                 <w:webHidden/>
               </w:rPr>
-              <w:instrText xml:space="preserve"> PAGEREF _Toc234788055 \h </w:instrText>
+              <w:instrText xml:space="preserve"> PAGEREF _Toc234828291 \h </w:instrText>
             </w:r>
             <w:r>
               <w:rPr>
@@ -8984,7 +8984,7 @@
               <w14:ligatures w14:val="standardContextual"/>
             </w:rPr>
           </w:pPr>
-          <w:hyperlink w:anchor="_Toc234788056" w:history="1">
+          <w:hyperlink w:anchor="_Toc234828292" w:history="1">
             <w:r>
               <w:rPr>
                 <w:rStyle w:val="Hyperlink"/>
@@ -9028,7 +9028,7 @@
                 <w:noProof/>
                 <w:webHidden/>
               </w:rPr>
-              <w:instrText xml:space="preserve"> PAGEREF _Toc234788056 \h </w:instrText>
+              <w:instrText xml:space="preserve"> PAGEREF _Toc234828292 \h </w:instrText>
             </w:r>
             <w:r>
               <w:rPr>
@@ -9074,7 +9074,7 @@
               <w14:ligatures w14:val="standardContextual"/>
             </w:rPr>
           </w:pPr>
-          <w:hyperlink w:anchor="_Toc234788057" w:history="1">
+          <w:hyperlink w:anchor="_Toc234828293" w:history="1">
             <w:r>
               <w:rPr>
                 <w:rStyle w:val="Hyperlink"/>
@@ -9118,7 +9118,7 @@
                 <w:noProof/>
                 <w:webHidden/>
               </w:rPr>
-              <w:instrText xml:space="preserve"> PAGEREF _Toc234788057 \h </w:instrText>
+              <w:instrText xml:space="preserve"> PAGEREF _Toc234828293 \h </w:instrText>
             </w:r>
             <w:r>
               <w:rPr>
@@ -9164,7 +9164,7 @@
               <w14:ligatures w14:val="standardContextual"/>
             </w:rPr>
           </w:pPr>
-          <w:hyperlink w:anchor="_Toc234788058" w:history="1">
+          <w:hyperlink w:anchor="_Toc234828294" w:history="1">
             <w:r>
               <w:rPr>
                 <w:rStyle w:val="Hyperlink"/>
@@ -9208,7 +9208,7 @@
                 <w:noProof/>
                 <w:webHidden/>
               </w:rPr>
-              <w:instrText xml:space="preserve"> PAGEREF _Toc234788058 \h </w:instrText>
+              <w:instrText xml:space="preserve"> PAGEREF _Toc234828294 \h </w:instrText>
             </w:r>
             <w:r>
               <w:rPr>
@@ -9254,7 +9254,7 @@
               <w14:ligatures w14:val="standardContextual"/>
             </w:rPr>
           </w:pPr>
-          <w:hyperlink w:anchor="_Toc234788059" w:history="1">
+          <w:hyperlink w:anchor="_Toc234828295" w:history="1">
             <w:r>
               <w:rPr>
                 <w:rStyle w:val="Hyperlink"/>
@@ -9298,7 +9298,7 @@
                 <w:noProof/>
                 <w:webHidden/>
               </w:rPr>
-              <w:instrText xml:space="preserve"> PAGEREF _Toc234788059 \h </w:instrText>
+              <w:instrText xml:space="preserve"> PAGEREF _Toc234828295 \h </w:instrText>
             </w:r>
             <w:r>
               <w:rPr>
@@ -9344,7 +9344,7 @@
               <w14:ligatures w14:val="standardContextual"/>
             </w:rPr>
           </w:pPr>
-          <w:hyperlink w:anchor="_Toc234788060" w:history="1">
+          <w:hyperlink w:anchor="_Toc234828296" w:history="1">
             <w:r>
               <w:rPr>
                 <w:rStyle w:val="Hyperlink"/>
@@ -9388,7 +9388,7 @@
                 <w:noProof/>
                 <w:webHidden/>
               </w:rPr>
-              <w:instrText xml:space="preserve"> PAGEREF _Toc234788060 \h </w:instrText>
+              <w:instrText xml:space="preserve"> PAGEREF _Toc234828296 \h </w:instrText>
             </w:r>
             <w:r>
               <w:rPr>
@@ -9434,7 +9434,7 @@
               <w14:ligatures w14:val="standardContextual"/>
             </w:rPr>
           </w:pPr>
-          <w:hyperlink w:anchor="_Toc234788061" w:history="1">
+          <w:hyperlink w:anchor="_Toc234828297" w:history="1">
             <w:r>
               <w:rPr>
                 <w:rStyle w:val="Hyperlink"/>
@@ -9478,7 +9478,7 @@
                 <w:noProof/>
                 <w:webHidden/>
               </w:rPr>
-              <w:instrText xml:space="preserve"> PAGEREF _Toc234788061 \h </w:instrText>
+              <w:instrText xml:space="preserve"> PAGEREF _Toc234828297 \h </w:instrText>
             </w:r>
             <w:r>
               <w:rPr>
@@ -9524,7 +9524,7 @@
               <w14:ligatures w14:val="standardContextual"/>
             </w:rPr>
           </w:pPr>
-          <w:hyperlink w:anchor="_Toc234788062" w:history="1">
+          <w:hyperlink w:anchor="_Toc234828298" w:history="1">
             <w:r>
               <w:rPr>
                 <w:rStyle w:val="Hyperlink"/>
@@ -9568,7 +9568,7 @@
                 <w:noProof/>
                 <w:webHidden/>
               </w:rPr>
-              <w:instrText xml:space="preserve"> PAGEREF _Toc234788062 \h </w:instrText>
+              <w:instrText xml:space="preserve"> PAGEREF _Toc234828298 \h </w:instrText>
             </w:r>
             <w:r>
               <w:rPr>
@@ -9614,7 +9614,7 @@
               <w14:ligatures w14:val="standardContextual"/>
             </w:rPr>
           </w:pPr>
-          <w:hyperlink w:anchor="_Toc234788063" w:history="1">
+          <w:hyperlink w:anchor="_Toc234828299" w:history="1">
             <w:r>
               <w:rPr>
                 <w:rStyle w:val="Hyperlink"/>
@@ -9658,7 +9658,7 @@
                 <w:noProof/>
                 <w:webHidden/>
               </w:rPr>
-              <w:instrText xml:space="preserve"> PAGEREF _Toc234788063 \h </w:instrText>
+              <w:instrText xml:space="preserve"> PAGEREF _Toc234828299 \h </w:instrText>
             </w:r>
             <w:r>
               <w:rPr>
@@ -9704,7 +9704,7 @@
               <w14:ligatures w14:val="standardContextual"/>
             </w:rPr>
           </w:pPr>
-          <w:hyperlink w:anchor="_Toc234788064" w:history="1">
+          <w:hyperlink w:anchor="_Toc234828300" w:history="1">
             <w:r>
               <w:rPr>
                 <w:rStyle w:val="Hyperlink"/>
@@ -9748,7 +9748,7 @@
                 <w:noProof/>
                 <w:webHidden/>
               </w:rPr>
-              <w:instrText xml:space="preserve"> PAGEREF _Toc234788064 \h </w:instrText>
+              <w:instrText xml:space="preserve"> PAGEREF _Toc234828300 \h </w:instrText>
             </w:r>
             <w:r>
               <w:rPr>
@@ -9794,7 +9794,7 @@
               <w14:ligatures w14:val="standardContextual"/>
             </w:rPr>
           </w:pPr>
-          <w:hyperlink w:anchor="_Toc234788065" w:history="1">
+          <w:hyperlink w:anchor="_Toc234828301" w:history="1">
             <w:r>
               <w:rPr>
                 <w:rStyle w:val="Hyperlink"/>
@@ -9838,7 +9838,7 @@
                 <w:noProof/>
                 <w:webHidden/>
               </w:rPr>
-              <w:instrText xml:space="preserve"> PAGEREF _Toc234788065 \h </w:instrText>
+              <w:instrText xml:space="preserve"> PAGEREF _Toc234828301 \h </w:instrText>
             </w:r>
             <w:r>
               <w:rPr>
@@ -9884,7 +9884,7 @@
               <w14:ligatures w14:val="standardContextual"/>
             </w:rPr>
           </w:pPr>
-          <w:hyperlink w:anchor="_Toc234788066" w:history="1">
+          <w:hyperlink w:anchor="_Toc234828302" w:history="1">
             <w:r>
               <w:rPr>
                 <w:rStyle w:val="Hyperlink"/>
@@ -9928,7 +9928,7 @@
                 <w:noProof/>
                 <w:webHidden/>
               </w:rPr>
-              <w:instrText xml:space="preserve"> PAGEREF _Toc234788066 \h </w:instrText>
+              <w:instrText xml:space="preserve"> PAGEREF _Toc234828302 \h </w:instrText>
             </w:r>
             <w:r>
               <w:rPr>
@@ -9974,7 +9974,7 @@
               <w14:ligatures w14:val="standardContextual"/>
             </w:rPr>
           </w:pPr>
-          <w:hyperlink w:anchor="_Toc234788067" w:history="1">
+          <w:hyperlink w:anchor="_Toc234828303" w:history="1">
             <w:r>
               <w:rPr>
                 <w:rStyle w:val="Hyperlink"/>
@@ -10018,7 +10018,7 @@
                 <w:noProof/>
                 <w:webHidden/>
               </w:rPr>
-              <w:instrText xml:space="preserve"> PAGEREF _Toc234788067 \h </w:instrText>
+              <w:instrText xml:space="preserve"> PAGEREF _Toc234828303 \h </w:instrText>
             </w:r>
             <w:r>
               <w:rPr>
@@ -10064,7 +10064,7 @@
               <w14:ligatures w14:val="standardContextual"/>
             </w:rPr>
           </w:pPr>
-          <w:hyperlink w:anchor="_Toc234788068" w:history="1">
+          <w:hyperlink w:anchor="_Toc234828304" w:history="1">
             <w:r>
               <w:rPr>
                 <w:rStyle w:val="Hyperlink"/>
@@ -10108,7 +10108,7 @@
                 <w:noProof/>
                 <w:webHidden/>
               </w:rPr>
-              <w:instrText xml:space="preserve"> PAGEREF _Toc234788068 \h </w:instrText>
+              <w:instrText xml:space="preserve"> PAGEREF _Toc234828304 \h </w:instrText>
             </w:r>
             <w:r>
               <w:rPr>
@@ -10154,7 +10154,7 @@
               <w14:ligatures w14:val="standardContextual"/>
             </w:rPr>
           </w:pPr>
-          <w:hyperlink w:anchor="_Toc234788069" w:history="1">
+          <w:hyperlink w:anchor="_Toc234828305" w:history="1">
             <w:r>
               <w:rPr>
                 <w:rStyle w:val="Hyperlink"/>
@@ -10198,7 +10198,7 @@
                 <w:noProof/>
                 <w:webHidden/>
               </w:rPr>
-              <w:instrText xml:space="preserve"> PAGEREF _Toc234788069 \h </w:instrText>
+              <w:instrText xml:space="preserve"> PAGEREF _Toc234828305 \h </w:instrText>
             </w:r>
             <w:r>
               <w:rPr>
@@ -10244,7 +10244,7 @@
               <w14:ligatures w14:val="standardContextual"/>
             </w:rPr>
           </w:pPr>
-          <w:hyperlink w:anchor="_Toc234788070" w:history="1">
+          <w:hyperlink w:anchor="_Toc234828306" w:history="1">
             <w:r>
               <w:rPr>
                 <w:rStyle w:val="Hyperlink"/>
@@ -10288,7 +10288,7 @@
                 <w:noProof/>
                 <w:webHidden/>
               </w:rPr>
-              <w:instrText xml:space="preserve"> PAGEREF _Toc234788070 \h </w:instrText>
+              <w:instrText xml:space="preserve"> PAGEREF _Toc234828306 \h </w:instrText>
             </w:r>
             <w:r>
               <w:rPr>
@@ -10334,7 +10334,7 @@
               <w14:ligatures w14:val="standardContextual"/>
             </w:rPr>
           </w:pPr>
-          <w:hyperlink w:anchor="_Toc234788071" w:history="1">
+          <w:hyperlink w:anchor="_Toc234828307" w:history="1">
             <w:r>
               <w:rPr>
                 <w:rStyle w:val="Hyperlink"/>
@@ -10378,7 +10378,7 @@
                 <w:noProof/>
                 <w:webHidden/>
               </w:rPr>
-              <w:instrText xml:space="preserve"> PAGEREF _Toc234788071 \h </w:instrText>
+              <w:instrText xml:space="preserve"> PAGEREF _Toc234828307 \h </w:instrText>
             </w:r>
             <w:r>
               <w:rPr>
@@ -10424,7 +10424,7 @@
               <w14:ligatures w14:val="standardContextual"/>
             </w:rPr>
           </w:pPr>
-          <w:hyperlink w:anchor="_Toc234788072" w:history="1">
+          <w:hyperlink w:anchor="_Toc234828308" w:history="1">
             <w:r>
               <w:rPr>
                 <w:rStyle w:val="Hyperlink"/>
@@ -10468,7 +10468,7 @@
                 <w:noProof/>
                 <w:webHidden/>
               </w:rPr>
-              <w:instrText xml:space="preserve"> PAGEREF _Toc234788072 \h </w:instrText>
+              <w:instrText xml:space="preserve"> PAGEREF _Toc234828308 \h </w:instrText>
             </w:r>
             <w:r>
               <w:rPr>
@@ -10514,7 +10514,7 @@
               <w14:ligatures w14:val="standardContextual"/>
             </w:rPr>
           </w:pPr>
-          <w:hyperlink w:anchor="_Toc234788073" w:history="1">
+          <w:hyperlink w:anchor="_Toc234828309" w:history="1">
             <w:r>
               <w:rPr>
                 <w:rStyle w:val="Hyperlink"/>
@@ -10558,7 +10558,7 @@
                 <w:noProof/>
                 <w:webHidden/>
               </w:rPr>
-              <w:instrText xml:space="preserve"> PAGEREF _Toc234788073 \h </w:instrText>
+              <w:instrText xml:space="preserve"> PAGEREF _Toc234828309 \h </w:instrText>
             </w:r>
             <w:r>
               <w:rPr>
@@ -10604,7 +10604,7 @@
               <w14:ligatures w14:val="standardContextual"/>
             </w:rPr>
           </w:pPr>
-          <w:hyperlink w:anchor="_Toc234788074" w:history="1">
+          <w:hyperlink w:anchor="_Toc234828310" w:history="1">
             <w:r>
               <w:rPr>
                 <w:rStyle w:val="Hyperlink"/>
@@ -10648,7 +10648,7 @@
                 <w:noProof/>
                 <w:webHidden/>
               </w:rPr>
-              <w:instrText xml:space="preserve"> PAGEREF _Toc234788074 \h </w:instrText>
+              <w:instrText xml:space="preserve"> PAGEREF _Toc234828310 \h </w:instrText>
             </w:r>
             <w:r>
               <w:rPr>
@@ -10694,7 +10694,7 @@
               <w14:ligatures w14:val="standardContextual"/>
             </w:rPr>
           </w:pPr>
-          <w:hyperlink w:anchor="_Toc234788075" w:history="1">
+          <w:hyperlink w:anchor="_Toc234828311" w:history="1">
             <w:r>
               <w:rPr>
                 <w:rStyle w:val="Hyperlink"/>
@@ -10738,7 +10738,7 @@
                 <w:noProof/>
                 <w:webHidden/>
               </w:rPr>
-              <w:instrText xml:space="preserve"> PAGEREF _Toc234788075 \h </w:instrText>
+              <w:instrText xml:space="preserve"> PAGEREF _Toc234828311 \h </w:instrText>
             </w:r>
             <w:r>
               <w:rPr>
@@ -10784,7 +10784,7 @@
               <w14:ligatures w14:val="standardContextual"/>
             </w:rPr>
           </w:pPr>
-          <w:hyperlink w:anchor="_Toc234788076" w:history="1">
+          <w:hyperlink w:anchor="_Toc234828312" w:history="1">
             <w:r>
               <w:rPr>
                 <w:rStyle w:val="Hyperlink"/>
@@ -10828,7 +10828,7 @@
                 <w:noProof/>
                 <w:webHidden/>
               </w:rPr>
-              <w:instrText xml:space="preserve"> PAGEREF _Toc234788076 \h </w:instrText>
+              <w:instrText xml:space="preserve"> PAGEREF _Toc234828312 \h </w:instrText>
             </w:r>
             <w:r>
               <w:rPr>
@@ -10874,7 +10874,7 @@
               <w14:ligatures w14:val="standardContextual"/>
             </w:rPr>
           </w:pPr>
-          <w:hyperlink w:anchor="_Toc234788077" w:history="1">
+          <w:hyperlink w:anchor="_Toc234828313" w:history="1">
             <w:r>
               <w:rPr>
                 <w:rStyle w:val="Hyperlink"/>
@@ -10918,7 +10918,7 @@
                 <w:noProof/>
                 <w:webHidden/>
               </w:rPr>
-              <w:instrText xml:space="preserve"> PAGEREF _Toc234788077 \h </w:instrText>
+              <w:instrText xml:space="preserve"> PAGEREF _Toc234828313 \h </w:instrText>
             </w:r>
             <w:r>
               <w:rPr>
@@ -10964,7 +10964,7 @@
               <w14:ligatures w14:val="standardContextual"/>
             </w:rPr>
           </w:pPr>
-          <w:hyperlink w:anchor="_Toc234788078" w:history="1">
+          <w:hyperlink w:anchor="_Toc234828314" w:history="1">
             <w:r>
               <w:rPr>
                 <w:rStyle w:val="Hyperlink"/>
@@ -11008,7 +11008,7 @@
                 <w:noProof/>
                 <w:webHidden/>
               </w:rPr>
-              <w:instrText xml:space="preserve"> PAGEREF _Toc234788078 \h </w:instrText>
+              <w:instrText xml:space="preserve"> PAGEREF _Toc234828314 \h </w:instrText>
             </w:r>
             <w:r>
               <w:rPr>
@@ -11054,7 +11054,7 @@
               <w14:ligatures w14:val="standardContextual"/>
             </w:rPr>
           </w:pPr>
-          <w:hyperlink w:anchor="_Toc234788079" w:history="1">
+          <w:hyperlink w:anchor="_Toc234828315" w:history="1">
             <w:r>
               <w:rPr>
                 <w:rStyle w:val="Hyperlink"/>
@@ -11098,7 +11098,7 @@
                 <w:noProof/>
                 <w:webHidden/>
               </w:rPr>
-              <w:instrText xml:space="preserve"> PAGEREF _Toc234788079 \h </w:instrText>
+              <w:instrText xml:space="preserve"> PAGEREF _Toc234828315 \h </w:instrText>
             </w:r>
             <w:r>
               <w:rPr>
@@ -11144,7 +11144,7 @@
               <w14:ligatures w14:val="standardContextual"/>
             </w:rPr>
           </w:pPr>
-          <w:hyperlink w:anchor="_Toc234788080" w:history="1">
+          <w:hyperlink w:anchor="_Toc234828316" w:history="1">
             <w:r>
               <w:rPr>
                 <w:rStyle w:val="Hyperlink"/>
@@ -11188,7 +11188,7 @@
                 <w:noProof/>
                 <w:webHidden/>
               </w:rPr>
-              <w:instrText xml:space="preserve"> PAGEREF _Toc234788080 \h </w:instrText>
+              <w:instrText xml:space="preserve"> PAGEREF _Toc234828316 \h </w:instrText>
             </w:r>
             <w:r>
               <w:rPr>
@@ -11234,7 +11234,7 @@
               <w14:ligatures w14:val="standardContextual"/>
             </w:rPr>
           </w:pPr>
-          <w:hyperlink w:anchor="_Toc234788081" w:history="1">
+          <w:hyperlink w:anchor="_Toc234828317" w:history="1">
             <w:r>
               <w:rPr>
                 <w:rStyle w:val="Hyperlink"/>
@@ -11278,7 +11278,7 @@
                 <w:noProof/>
                 <w:webHidden/>
               </w:rPr>
-              <w:instrText xml:space="preserve"> PAGEREF _Toc234788081 \h </w:instrText>
+              <w:instrText xml:space="preserve"> PAGEREF _Toc234828317 \h </w:instrText>
             </w:r>
             <w:r>
               <w:rPr>
@@ -11324,7 +11324,7 @@
               <w14:ligatures w14:val="standardContextual"/>
             </w:rPr>
           </w:pPr>
-          <w:hyperlink w:anchor="_Toc234788082" w:history="1">
+          <w:hyperlink w:anchor="_Toc234828318" w:history="1">
             <w:r>
               <w:rPr>
                 <w:rStyle w:val="Hyperlink"/>
@@ -11368,7 +11368,7 @@
                 <w:noProof/>
                 <w:webHidden/>
               </w:rPr>
-              <w:instrText xml:space="preserve"> PAGEREF _Toc234788082 \h </w:instrText>
+              <w:instrText xml:space="preserve"> PAGEREF _Toc234828318 \h </w:instrText>
             </w:r>
             <w:r>
               <w:rPr>
@@ -11414,7 +11414,7 @@
               <w14:ligatures w14:val="standardContextual"/>
             </w:rPr>
           </w:pPr>
-          <w:hyperlink w:anchor="_Toc234788083" w:history="1">
+          <w:hyperlink w:anchor="_Toc234828319" w:history="1">
             <w:r>
               <w:rPr>
                 <w:rStyle w:val="Hyperlink"/>
@@ -11458,7 +11458,7 @@
                 <w:noProof/>
                 <w:webHidden/>
               </w:rPr>
-              <w:instrText xml:space="preserve"> PAGEREF _Toc234788083 \h </w:instrText>
+              <w:instrText xml:space="preserve"> PAGEREF _Toc234828319 \h </w:instrText>
             </w:r>
             <w:r>
               <w:rPr>
@@ -11504,7 +11504,7 @@
               <w14:ligatures w14:val="standardContextual"/>
             </w:rPr>
           </w:pPr>
-          <w:hyperlink w:anchor="_Toc234788084" w:history="1">
+          <w:hyperlink w:anchor="_Toc234828320" w:history="1">
             <w:r>
               <w:rPr>
                 <w:rStyle w:val="Hyperlink"/>
@@ -11548,7 +11548,7 @@
                 <w:noProof/>
                 <w:webHidden/>
               </w:rPr>
-              <w:instrText xml:space="preserve"> PAGEREF _Toc234788084 \h </w:instrText>
+              <w:instrText xml:space="preserve"> PAGEREF _Toc234828320 \h </w:instrText>
             </w:r>
             <w:r>
               <w:rPr>
@@ -11594,7 +11594,7 @@
               <w14:ligatures w14:val="standardContextual"/>
             </w:rPr>
           </w:pPr>
-          <w:hyperlink w:anchor="_Toc234788085" w:history="1">
+          <w:hyperlink w:anchor="_Toc234828321" w:history="1">
             <w:r>
               <w:rPr>
                 <w:rStyle w:val="Hyperlink"/>
@@ -11638,7 +11638,7 @@
                 <w:noProof/>
                 <w:webHidden/>
               </w:rPr>
-              <w:instrText xml:space="preserve"> PAGEREF _Toc234788085 \h </w:instrText>
+              <w:instrText xml:space="preserve"> PAGEREF _Toc234828321 \h </w:instrText>
             </w:r>
             <w:r>
               <w:rPr>
@@ -11684,7 +11684,7 @@
               <w14:ligatures w14:val="standardContextual"/>
             </w:rPr>
           </w:pPr>
-          <w:hyperlink w:anchor="_Toc234788086" w:history="1">
+          <w:hyperlink w:anchor="_Toc234828322" w:history="1">
             <w:r>
               <w:rPr>
                 <w:rStyle w:val="Hyperlink"/>
@@ -11728,7 +11728,7 @@
                 <w:noProof/>
                 <w:webHidden/>
               </w:rPr>
-              <w:instrText xml:space="preserve"> PAGEREF _Toc234788086 \h </w:instrText>
+              <w:instrText xml:space="preserve"> PAGEREF _Toc234828322 \h </w:instrText>
             </w:r>
             <w:r>
               <w:rPr>
@@ -11774,7 +11774,7 @@
               <w14:ligatures w14:val="standardContextual"/>
             </w:rPr>
           </w:pPr>
-          <w:hyperlink w:anchor="_Toc234788087" w:history="1">
+          <w:hyperlink w:anchor="_Toc234828323" w:history="1">
             <w:r>
               <w:rPr>
                 <w:rStyle w:val="Hyperlink"/>
@@ -11818,7 +11818,7 @@
                 <w:noProof/>
                 <w:webHidden/>
               </w:rPr>
-              <w:instrText xml:space="preserve"> PAGEREF _Toc234788087 \h </w:instrText>
+              <w:instrText xml:space="preserve"> PAGEREF _Toc234828323 \h </w:instrText>
             </w:r>
             <w:r>
               <w:rPr>
@@ -11864,7 +11864,7 @@
               <w14:ligatures w14:val="standardContextual"/>
             </w:rPr>
           </w:pPr>
-          <w:hyperlink w:anchor="_Toc234788088" w:history="1">
+          <w:hyperlink w:anchor="_Toc234828324" w:history="1">
             <w:r>
               <w:rPr>
                 <w:rStyle w:val="Hyperlink"/>
@@ -11908,7 +11908,7 @@
                 <w:noProof/>
                 <w:webHidden/>
               </w:rPr>
-              <w:instrText xml:space="preserve"> PAGEREF _Toc234788088 \h </w:instrText>
+              <w:instrText xml:space="preserve"> PAGEREF _Toc234828324 \h </w:instrText>
             </w:r>
             <w:r>
               <w:rPr>
@@ -11954,7 +11954,7 @@
               <w14:ligatures w14:val="standardContextual"/>
             </w:rPr>
           </w:pPr>
-          <w:hyperlink w:anchor="_Toc234788089" w:history="1">
+          <w:hyperlink w:anchor="_Toc234828325" w:history="1">
             <w:r>
               <w:rPr>
                 <w:rStyle w:val="Hyperlink"/>
@@ -11998,7 +11998,7 @@
                 <w:noProof/>
                 <w:webHidden/>
               </w:rPr>
-              <w:instrText xml:space="preserve"> PAGEREF _Toc234788089 \h </w:instrText>
+              <w:instrText xml:space="preserve"> PAGEREF _Toc234828325 \h </w:instrText>
             </w:r>
             <w:r>
               <w:rPr>
@@ -12044,7 +12044,7 @@
               <w14:ligatures w14:val="standardContextual"/>
             </w:rPr>
           </w:pPr>
-          <w:hyperlink w:anchor="_Toc234788090" w:history="1">
+          <w:hyperlink w:anchor="_Toc234828326" w:history="1">
             <w:r>
               <w:rPr>
                 <w:rStyle w:val="Hyperlink"/>
@@ -12088,7 +12088,7 @@
                 <w:noProof/>
                 <w:webHidden/>
               </w:rPr>
-              <w:instrText xml:space="preserve"> PAGEREF _Toc234788090 \h </w:instrText>
+              <w:instrText xml:space="preserve"> PAGEREF _Toc234828326 \h </w:instrText>
             </w:r>
             <w:r>
               <w:rPr>
@@ -12134,7 +12134,7 @@
               <w14:ligatures w14:val="standardContextual"/>
             </w:rPr>
           </w:pPr>
-          <w:hyperlink w:anchor="_Toc234788091" w:history="1">
+          <w:hyperlink w:anchor="_Toc234828327" w:history="1">
             <w:r>
               <w:rPr>
                 <w:rStyle w:val="Hyperlink"/>
@@ -12178,7 +12178,7 @@
                 <w:noProof/>
                 <w:webHidden/>
               </w:rPr>
-              <w:instrText xml:space="preserve"> PAGEREF _Toc234788091 \h </w:instrText>
+              <w:instrText xml:space="preserve"> PAGEREF _Toc234828327 \h </w:instrText>
             </w:r>
             <w:r>
               <w:rPr>
@@ -12224,7 +12224,7 @@
               <w14:ligatures w14:val="standardContextual"/>
             </w:rPr>
           </w:pPr>
-          <w:hyperlink w:anchor="_Toc234788092" w:history="1">
+          <w:hyperlink w:anchor="_Toc234828328" w:history="1">
             <w:r>
               <w:rPr>
                 <w:rStyle w:val="Hyperlink"/>
@@ -12268,7 +12268,7 @@
                 <w:noProof/>
                 <w:webHidden/>
               </w:rPr>
-              <w:instrText xml:space="preserve"> PAGEREF _Toc234788092 \h </w:instrText>
+              <w:instrText xml:space="preserve"> PAGEREF _Toc234828328 \h </w:instrText>
             </w:r>
             <w:r>
               <w:rPr>
@@ -12314,7 +12314,7 @@
               <w14:ligatures w14:val="standardContextual"/>
             </w:rPr>
           </w:pPr>
-          <w:hyperlink w:anchor="_Toc234788093" w:history="1">
+          <w:hyperlink w:anchor="_Toc234828329" w:history="1">
             <w:r>
               <w:rPr>
                 <w:rStyle w:val="Hyperlink"/>
@@ -12358,7 +12358,7 @@
                 <w:noProof/>
                 <w:webHidden/>
               </w:rPr>
-              <w:instrText xml:space="preserve"> PAGEREF _Toc234788093 \h </w:instrText>
+              <w:instrText xml:space="preserve"> PAGEREF _Toc234828329 \h </w:instrText>
             </w:r>
             <w:r>
               <w:rPr>
@@ -12404,7 +12404,7 @@
               <w14:ligatures w14:val="standardContextual"/>
             </w:rPr>
           </w:pPr>
-          <w:hyperlink w:anchor="_Toc234788094" w:history="1">
+          <w:hyperlink w:anchor="_Toc234828330" w:history="1">
             <w:r>
               <w:rPr>
                 <w:rStyle w:val="Hyperlink"/>
@@ -12448,7 +12448,7 @@
                 <w:noProof/>
                 <w:webHidden/>
               </w:rPr>
-              <w:instrText xml:space="preserve"> PAGEREF _Toc234788094 \h </w:instrText>
+              <w:instrText xml:space="preserve"> PAGEREF _Toc234828330 \h </w:instrText>
             </w:r>
             <w:r>
               <w:rPr>
@@ -12491,7 +12491,7 @@
         <w:pStyle w:val="Heading1"/>
       </w:pPr>
       <w:bookmarkStart w:id="0" w:name="introduction"/>
-      <w:bookmarkStart w:id="1" w:name="_Toc234787957"/>
+      <w:bookmarkStart w:id="1" w:name="_Toc234828193"/>
       <w:r>
         <w:rPr>
           <w:rStyle w:val="SectionNumber"/>
@@ -12509,7 +12509,7 @@
         <w:pStyle w:val="Heading2"/>
       </w:pPr>
       <w:bookmarkStart w:id="2" w:name="what-classbuilder-is"/>
-      <w:bookmarkStart w:id="3" w:name="_Toc234787958"/>
+      <w:bookmarkStart w:id="3" w:name="_Toc234828194"/>
       <w:r>
         <w:rPr>
           <w:rStyle w:val="SectionNumber"/>
@@ -12844,7 +12844,7 @@
         <w:pStyle w:val="Heading2"/>
       </w:pPr>
       <w:bookmarkStart w:id="4" w:name="the-pieces"/>
-      <w:bookmarkStart w:id="5" w:name="_Toc234787959"/>
+      <w:bookmarkStart w:id="5" w:name="_Toc234828195"/>
       <w:bookmarkEnd w:id="2"/>
       <w:r>
         <w:rPr>
@@ -13085,7 +13085,7 @@
         <w:pStyle w:val="Heading2"/>
       </w:pPr>
       <w:bookmarkStart w:id="6" w:name="about-this-manual"/>
-      <w:bookmarkStart w:id="7" w:name="_Toc234787960"/>
+      <w:bookmarkStart w:id="7" w:name="_Toc234828196"/>
       <w:bookmarkEnd w:id="4"/>
       <w:r>
         <w:rPr>
@@ -13176,7 +13176,7 @@
         <w:pStyle w:val="Heading2"/>
       </w:pPr>
       <w:bookmarkStart w:id="8" w:name="notation-keyboard-shortcuts-per-platform"/>
-      <w:bookmarkStart w:id="9" w:name="_Toc234787961"/>
+      <w:bookmarkStart w:id="9" w:name="_Toc234828197"/>
       <w:bookmarkEnd w:id="6"/>
       <w:r>
         <w:rPr>
@@ -13656,7 +13656,7 @@
         <w:pStyle w:val="Heading1"/>
       </w:pPr>
       <w:bookmarkStart w:id="10" w:name="concepts-and-terminology"/>
-      <w:bookmarkStart w:id="11" w:name="_Toc234787962"/>
+      <w:bookmarkStart w:id="11" w:name="_Toc234828198"/>
       <w:bookmarkEnd w:id="0"/>
       <w:bookmarkEnd w:id="8"/>
       <w:r>
@@ -13676,7 +13676,7 @@
         <w:pStyle w:val="Heading2"/>
       </w:pPr>
       <w:bookmarkStart w:id="12" w:name="the-model"/>
-      <w:bookmarkStart w:id="13" w:name="_Toc234787963"/>
+      <w:bookmarkStart w:id="13" w:name="_Toc234828199"/>
       <w:r>
         <w:rPr>
           <w:rStyle w:val="SectionNumber"/>
@@ -14007,7 +14007,7 @@
         <w:pStyle w:val="Heading2"/>
       </w:pPr>
       <w:bookmarkStart w:id="14" w:name="class-features"/>
-      <w:bookmarkStart w:id="15" w:name="_Toc234787964"/>
+      <w:bookmarkStart w:id="15" w:name="_Toc234828200"/>
       <w:bookmarkEnd w:id="12"/>
       <w:r>
         <w:rPr>
@@ -14233,7 +14233,7 @@
         <w:pStyle w:val="Heading2"/>
       </w:pPr>
       <w:bookmarkStart w:id="16" w:name="phases"/>
-      <w:bookmarkStart w:id="17" w:name="_Toc234787965"/>
+      <w:bookmarkStart w:id="17" w:name="_Toc234828201"/>
       <w:bookmarkEnd w:id="14"/>
       <w:r>
         <w:rPr>
@@ -14280,7 +14280,7 @@
         <w:pStyle w:val="Heading2"/>
       </w:pPr>
       <w:bookmarkStart w:id="18" w:name="generated-vs.-user-code"/>
-      <w:bookmarkStart w:id="19" w:name="_Toc234787966"/>
+      <w:bookmarkStart w:id="19" w:name="_Toc234828202"/>
       <w:bookmarkEnd w:id="16"/>
       <w:r>
         <w:rPr>
@@ -14404,7 +14404,7 @@
         <w:pStyle w:val="Heading1"/>
       </w:pPr>
       <w:bookmarkStart w:id="20" w:name="installation-and-project-files"/>
-      <w:bookmarkStart w:id="21" w:name="_Toc234787967"/>
+      <w:bookmarkStart w:id="21" w:name="_Toc234828203"/>
       <w:bookmarkEnd w:id="10"/>
       <w:bookmarkEnd w:id="18"/>
       <w:r>
@@ -14424,7 +14424,7 @@
         <w:pStyle w:val="Heading2"/>
       </w:pPr>
       <w:bookmarkStart w:id="22" w:name="the-application"/>
-      <w:bookmarkStart w:id="23" w:name="_Toc234787968"/>
+      <w:bookmarkStart w:id="23" w:name="_Toc234828204"/>
       <w:r>
         <w:rPr>
           <w:rStyle w:val="SectionNumber"/>
@@ -14465,7 +14465,7 @@
         <w:pStyle w:val="Heading2"/>
       </w:pPr>
       <w:bookmarkStart w:id="24" w:name="X3666ad84e793a543abb57792ece33f71c988788"/>
-      <w:bookmarkStart w:id="25" w:name="_Toc234787969"/>
+      <w:bookmarkStart w:id="25" w:name="_Toc234828205"/>
       <w:bookmarkEnd w:id="22"/>
       <w:r>
         <w:rPr>
@@ -14837,7 +14837,7 @@
         <w:pStyle w:val="Heading2"/>
       </w:pPr>
       <w:bookmarkStart w:id="26" w:name="stdafx.h-the-one-file-you-write"/>
-      <w:bookmarkStart w:id="27" w:name="_Toc234787970"/>
+      <w:bookmarkStart w:id="27" w:name="_Toc234828206"/>
       <w:bookmarkEnd w:id="24"/>
       <w:r>
         <w:rPr>
@@ -15111,7 +15111,7 @@
         <w:pStyle w:val="Heading2"/>
       </w:pPr>
       <w:bookmarkStart w:id="28" w:name="output-locations"/>
-      <w:bookmarkStart w:id="29" w:name="_Toc234787971"/>
+      <w:bookmarkStart w:id="29" w:name="_Toc234828207"/>
       <w:bookmarkEnd w:id="26"/>
       <w:r>
         <w:rPr>
@@ -15184,7 +15184,7 @@
         <w:pStyle w:val="Heading1"/>
       </w:pPr>
       <w:bookmarkStart w:id="30" w:name="quick-start-the-matrix-model"/>
-      <w:bookmarkStart w:id="31" w:name="_Toc234787972"/>
+      <w:bookmarkStart w:id="31" w:name="_Toc234828208"/>
       <w:bookmarkEnd w:id="20"/>
       <w:bookmarkEnd w:id="28"/>
       <w:r>
@@ -15299,7 +15299,7 @@
           <w:noProof/>
         </w:rPr>
         <w:drawing>
-          <wp:inline distT="0" distB="0" distL="0" distR="0" wp14:anchorId="402066CE" wp14:editId="3614C879">
+          <wp:inline distT="0" distB="0" distL="0" distR="0" wp14:anchorId="69903B83" wp14:editId="5D480DB8">
             <wp:extent cx="5334000" cy="4712710"/>
             <wp:effectExtent l="0" t="0" r="0" b="0"/>
             <wp:docPr id="36" name="Picture" descr="The ClassBuilder shell with the Matrix model open: menu bar, toolbar, and the model tree (diagrams, classes, members, methods, relation methods)."/>
@@ -15354,7 +15354,7 @@
         <w:pStyle w:val="Heading2"/>
       </w:pPr>
       <w:bookmarkStart w:id="32" w:name="step-1-create-the-model"/>
-      <w:bookmarkStart w:id="33" w:name="_Toc234787973"/>
+      <w:bookmarkStart w:id="33" w:name="_Toc234828209"/>
       <w:r>
         <w:rPr>
           <w:rStyle w:val="SectionNumber"/>
@@ -15390,7 +15390,7 @@
           <w:noProof/>
         </w:rPr>
         <w:drawing>
-          <wp:inline distT="0" distB="0" distL="0" distR="0" wp14:anchorId="565BA96A" wp14:editId="157F3116">
+          <wp:inline distT="0" distB="0" distL="0" distR="0" wp14:anchorId="304332B9" wp14:editId="1CFDA5BF">
             <wp:extent cx="5334000" cy="4578112"/>
             <wp:effectExtent l="0" t="0" r="0" b="0"/>
             <wp:docPr id="39" name="Picture" descr="Creating a serialize-enabled model: DataModel name “Matrix”, master include file “MatrixInclude.h”, document class “Matrix”. The master include cannot be named Matrix.h — the Matrix class itself generates that file. Tick Serialize here: it is a one-off choice, made at creation — in the Project ▸ Settings dialog of an existing model the checkbox shows locked."/>
@@ -15549,7 +15549,7 @@
         <w:pStyle w:val="Heading2"/>
       </w:pPr>
       <w:bookmarkStart w:id="34" w:name="step-2-add-the-classes"/>
-      <w:bookmarkStart w:id="35" w:name="_Toc234787974"/>
+      <w:bookmarkStart w:id="35" w:name="_Toc234828210"/>
       <w:bookmarkEnd w:id="32"/>
       <w:r>
         <w:rPr>
@@ -15634,7 +15634,7 @@
           <w:noProof/>
         </w:rPr>
         <w:drawing>
-          <wp:inline distT="0" distB="0" distL="0" distR="0" wp14:anchorId="4B8AC9D8" wp14:editId="266E4DCB">
+          <wp:inline distT="0" distB="0" distL="0" distR="0" wp14:anchorId="49CC4F40" wp14:editId="3E09334D">
             <wp:extent cx="4993049" cy="4495445"/>
             <wp:effectExtent l="0" t="0" r="0" b="0"/>
             <wp:docPr id="43" name="Picture" descr="The Class dialog. With Serialize ticked, the class inherits the model’s document-object root automatically."/>
@@ -15689,7 +15689,7 @@
         <w:pStyle w:val="Heading2"/>
       </w:pPr>
       <w:bookmarkStart w:id="36" w:name="step-3-add-members"/>
-      <w:bookmarkStart w:id="37" w:name="_Toc234787975"/>
+      <w:bookmarkStart w:id="37" w:name="_Toc234828211"/>
       <w:bookmarkEnd w:id="34"/>
       <w:r>
         <w:rPr>
@@ -15907,7 +15907,7 @@
           <w:noProof/>
         </w:rPr>
         <w:drawing>
-          <wp:inline distT="0" distB="0" distL="0" distR="0" wp14:anchorId="70AB34EB" wp14:editId="731A02D8">
+          <wp:inline distT="0" distB="0" distL="0" distR="0" wp14:anchorId="0201DDC7" wp14:editId="1CA5D5BD">
             <wp:extent cx="5334000" cy="6093588"/>
             <wp:effectExtent l="0" t="0" r="0" b="0"/>
             <wp:docPr id="47" name="Picture" descr="The Member dialog. Getter/setter generation and the serialize flag are per-member choices."/>
@@ -15962,7 +15962,7 @@
         <w:pStyle w:val="Heading2"/>
       </w:pPr>
       <w:bookmarkStart w:id="38" w:name="step-4-add-the-relations"/>
-      <w:bookmarkStart w:id="39" w:name="_Toc234787976"/>
+      <w:bookmarkStart w:id="39" w:name="_Toc234828212"/>
       <w:bookmarkEnd w:id="36"/>
       <w:r>
         <w:rPr>
@@ -16312,7 +16312,7 @@
           <w:noProof/>
         </w:rPr>
         <w:drawing>
-          <wp:inline distT="0" distB="0" distL="0" distR="0" wp14:anchorId="47EC12D4" wp14:editId="469B1A52">
+          <wp:inline distT="0" distB="0" distL="0" distR="0" wp14:anchorId="21058137" wp14:editId="6B3AE562">
             <wp:extent cx="5184435" cy="5069603"/>
             <wp:effectExtent l="0" t="0" r="0" b="0"/>
             <wp:docPr id="51" name="Picture" descr="A relation: kind, ownership, thread-safety, and container implementation are all declared here — the code is generated."/>
@@ -16367,7 +16367,7 @@
         <w:pStyle w:val="Heading2"/>
       </w:pPr>
       <w:bookmarkStart w:id="40" w:name="X267736c760e32dc6d865ac46fc2c6b29b8f25a5"/>
-      <w:bookmarkStart w:id="41" w:name="_Toc234787977"/>
+      <w:bookmarkStart w:id="41" w:name="_Toc234828213"/>
       <w:bookmarkEnd w:id="38"/>
       <w:r>
         <w:rPr>
@@ -17120,7 +17120,7 @@
         <w:pStyle w:val="Heading2"/>
       </w:pPr>
       <w:bookmarkStart w:id="42" w:name="step-6-a-find-method"/>
-      <w:bookmarkStart w:id="43" w:name="_Toc234787978"/>
+      <w:bookmarkStart w:id="43" w:name="_Toc234828214"/>
       <w:bookmarkEnd w:id="40"/>
       <w:r>
         <w:rPr>
@@ -17188,7 +17188,7 @@
           <w:noProof/>
         </w:rPr>
         <w:drawing>
-          <wp:inline distT="0" distB="0" distL="0" distR="0" wp14:anchorId="474D8452" wp14:editId="03DA110A">
+          <wp:inline distT="0" distB="0" distL="0" distR="0" wp14:anchorId="4D7EC89A" wp14:editId="13E29A48">
             <wp:extent cx="5334000" cy="3242844"/>
             <wp:effectExtent l="0" t="0" r="0" b="0"/>
             <wp:docPr id="56" name="Picture" descr="The Find Method dialog on the Matrix→Row relation: the argument map pairs the method’s arguments with the members to compare — here -&gt;GetId(). In the tree behind it, the generated method appears as a child of the Row relation item, as a sibling above its Relation methods folder."/>
@@ -17611,7 +17611,7 @@
         <w:pStyle w:val="Heading2"/>
       </w:pPr>
       <w:bookmarkStart w:id="44" w:name="step-7-a-class-diagram"/>
-      <w:bookmarkStart w:id="45" w:name="_Toc234787979"/>
+      <w:bookmarkStart w:id="45" w:name="_Toc234828215"/>
       <w:bookmarkEnd w:id="42"/>
       <w:r>
         <w:rPr>
@@ -17681,7 +17681,7 @@
           <w:noProof/>
         </w:rPr>
         <w:drawing>
-          <wp:inline distT="0" distB="0" distL="0" distR="0" wp14:anchorId="5FCC588A" wp14:editId="3D6D90E8">
+          <wp:inline distT="0" distB="0" distL="0" distR="0" wp14:anchorId="774589EE" wp14:editId="41C95E21">
             <wp:extent cx="5334000" cy="3170559"/>
             <wp:effectExtent l="0" t="0" r="0" b="0"/>
             <wp:docPr id="60" name="Picture" descr="The Matrix Overview class diagram as exported by ClassBuilder (Export SVG). Diamonds mark owned (aggregation) relations; 1/* are the multiplicities."/>
@@ -17749,7 +17749,7 @@
           <w:noProof/>
         </w:rPr>
         <w:drawing>
-          <wp:inline distT="0" distB="0" distL="0" distR="0" wp14:anchorId="2F5CE7E7" wp14:editId="1A3957AC">
+          <wp:inline distT="0" distB="0" distL="0" distR="0" wp14:anchorId="652CFCC4" wp14:editId="09E9D0CF">
             <wp:extent cx="5334000" cy="3757996"/>
             <wp:effectExtent l="0" t="0" r="0" b="0"/>
             <wp:docPr id="64" name="Picture" descr="A diagram view opens floating over the shell — this is the initial state of every diagram view."/>
@@ -17818,7 +17818,7 @@
           <w:noProof/>
         </w:rPr>
         <w:drawing>
-          <wp:inline distT="0" distB="0" distL="0" distR="0" wp14:anchorId="24E5114A" wp14:editId="02D51961">
+          <wp:inline distT="0" distB="0" distL="0" distR="0" wp14:anchorId="69FC545D" wp14:editId="103D5259">
             <wp:extent cx="5334000" cy="4302439"/>
             <wp:effectExtent l="0" t="0" r="0" b="0"/>
             <wp:docPr id="67" name="Picture" descr="The same view docked: drag it onto an edge of the main window — here the right edge, giving the usual tree-beside-diagram split; the top and bottom edges split horizontally the same way."/>
@@ -17887,7 +17887,7 @@
           <w:noProof/>
         </w:rPr>
         <w:drawing>
-          <wp:inline distT="0" distB="0" distL="0" distR="0" wp14:anchorId="443B5B61" wp14:editId="342D7A79">
+          <wp:inline distT="0" distB="0" distL="0" distR="0" wp14:anchorId="1B8CDCA7" wp14:editId="05F9AE9D">
             <wp:extent cx="5334000" cy="4302439"/>
             <wp:effectExtent l="0" t="0" r="0" b="0"/>
             <wp:docPr id="70" name="Picture" descr="Or tabbed: drop it onto the tree’s tab bar and the views share the full window, one tab each."/>
@@ -17952,7 +17952,7 @@
         <w:pStyle w:val="Heading2"/>
       </w:pPr>
       <w:bookmarkStart w:id="46" w:name="step-8-generate-the-source"/>
-      <w:bookmarkStart w:id="47" w:name="_Toc234787980"/>
+      <w:bookmarkStart w:id="47" w:name="_Toc234828216"/>
       <w:bookmarkEnd w:id="44"/>
       <w:r>
         <w:rPr>
@@ -19025,7 +19025,7 @@
         <w:pStyle w:val="Heading2"/>
       </w:pPr>
       <w:bookmarkStart w:id="48" w:name="step-9-compile-and-run"/>
-      <w:bookmarkStart w:id="49" w:name="_Toc234787981"/>
+      <w:bookmarkStart w:id="49" w:name="_Toc234828217"/>
       <w:bookmarkEnd w:id="46"/>
       <w:r>
         <w:rPr>
@@ -20544,7 +20544,7 @@
         <w:pStyle w:val="Heading2"/>
       </w:pPr>
       <w:bookmarkStart w:id="50" w:name="step-10-the-round-trip"/>
-      <w:bookmarkStart w:id="51" w:name="_Toc234787982"/>
+      <w:bookmarkStart w:id="51" w:name="_Toc234828218"/>
       <w:bookmarkEnd w:id="48"/>
       <w:r>
         <w:rPr>
@@ -20609,7 +20609,7 @@
         <w:pStyle w:val="Heading1"/>
       </w:pPr>
       <w:bookmarkStart w:id="52" w:name="reference-the-application-shell"/>
-      <w:bookmarkStart w:id="53" w:name="_Toc234787983"/>
+      <w:bookmarkStart w:id="53" w:name="_Toc234828219"/>
       <w:bookmarkEnd w:id="30"/>
       <w:bookmarkEnd w:id="50"/>
       <w:r>
@@ -20629,7 +20629,7 @@
         <w:pStyle w:val="Heading2"/>
       </w:pPr>
       <w:bookmarkStart w:id="54" w:name="menus"/>
-      <w:bookmarkStart w:id="55" w:name="_Toc234787984"/>
+      <w:bookmarkStart w:id="55" w:name="_Toc234828220"/>
       <w:r>
         <w:rPr>
           <w:rStyle w:val="SectionNumber"/>
@@ -20965,7 +20965,7 @@
         <w:pStyle w:val="Heading2"/>
       </w:pPr>
       <w:bookmarkStart w:id="56" w:name="the-main-toolbar"/>
-      <w:bookmarkStart w:id="57" w:name="_Toc234787985"/>
+      <w:bookmarkStart w:id="57" w:name="_Toc234828221"/>
       <w:bookmarkEnd w:id="54"/>
       <w:r>
         <w:rPr>
@@ -21288,7 +21288,7 @@
           <w:noProof/>
         </w:rPr>
         <w:drawing>
-          <wp:inline distT="0" distB="0" distL="0" distR="0" wp14:anchorId="4FC04375" wp14:editId="1DE8AEA1">
+          <wp:inline distT="0" distB="0" distL="0" distR="0" wp14:anchorId="56AC7C80" wp14:editId="32310E92">
             <wp:extent cx="5307773" cy="497603"/>
             <wp:effectExtent l="0" t="0" r="0" b="0"/>
             <wp:docPr id="79" name="Picture" descr="The main toolbar: New, Open, Save, then Read Source and Write Source."/>
@@ -21343,7 +21343,7 @@
         <w:pStyle w:val="Heading2"/>
       </w:pPr>
       <w:bookmarkStart w:id="58" w:name="docking"/>
-      <w:bookmarkStart w:id="59" w:name="_Toc234787986"/>
+      <w:bookmarkStart w:id="59" w:name="_Toc234828222"/>
       <w:bookmarkEnd w:id="56"/>
       <w:r>
         <w:rPr>
@@ -21491,7 +21491,7 @@
         <w:pStyle w:val="Heading2"/>
       </w:pPr>
       <w:bookmarkStart w:id="60" w:name="platforms-and-keys"/>
-      <w:bookmarkStart w:id="61" w:name="_Toc234787987"/>
+      <w:bookmarkStart w:id="61" w:name="_Toc234828223"/>
       <w:bookmarkEnd w:id="58"/>
       <w:r>
         <w:rPr>
@@ -21625,7 +21625,7 @@
         <w:pStyle w:val="Heading1"/>
       </w:pPr>
       <w:bookmarkStart w:id="62" w:name="reference-the-main-tree-view"/>
-      <w:bookmarkStart w:id="63" w:name="_Toc234787988"/>
+      <w:bookmarkStart w:id="63" w:name="_Toc234828224"/>
       <w:bookmarkEnd w:id="52"/>
       <w:bookmarkEnd w:id="60"/>
       <w:r>
@@ -21653,7 +21653,7 @@
         <w:pStyle w:val="Heading2"/>
       </w:pPr>
       <w:bookmarkStart w:id="64" w:name="what-the-tree-shows"/>
-      <w:bookmarkStart w:id="65" w:name="_Toc234787989"/>
+      <w:bookmarkStart w:id="65" w:name="_Toc234828225"/>
       <w:r>
         <w:rPr>
           <w:rStyle w:val="SectionNumber"/>
@@ -21719,7 +21719,7 @@
         <w:pStyle w:val="Heading2"/>
       </w:pPr>
       <w:bookmarkStart w:id="66" w:name="the-tree-toolbar"/>
-      <w:bookmarkStart w:id="67" w:name="_Toc234787990"/>
+      <w:bookmarkStart w:id="67" w:name="_Toc234828226"/>
       <w:bookmarkEnd w:id="64"/>
       <w:r>
         <w:rPr>
@@ -22650,7 +22650,7 @@
           <w:noProof/>
         </w:rPr>
         <w:drawing>
-          <wp:inline distT="0" distB="0" distL="0" distR="0" wp14:anchorId="02802923" wp14:editId="09B6E49B">
+          <wp:inline distT="0" distB="0" distL="0" distR="0" wp14:anchorId="1F08C93D" wp14:editId="2F1CE69A">
             <wp:extent cx="5334000" cy="307193"/>
             <wp:effectExtent l="0" t="0" r="0" b="0"/>
             <wp:docPr id="87" name="Picture" descr="The tree toolbar, in the order of the table above: the Add buttons, then Delete, Filters, Find/Next, and the per-view Undo/Redo."/>
@@ -22762,7 +22762,7 @@
         <w:pStyle w:val="Heading2"/>
       </w:pPr>
       <w:bookmarkStart w:id="68" w:name="the-context-menu"/>
-      <w:bookmarkStart w:id="69" w:name="_Toc234787991"/>
+      <w:bookmarkStart w:id="69" w:name="_Toc234828227"/>
       <w:bookmarkEnd w:id="66"/>
       <w:r>
         <w:rPr>
@@ -23161,7 +23161,7 @@
         <w:pStyle w:val="Heading2"/>
       </w:pPr>
       <w:bookmarkStart w:id="70" w:name="filters"/>
-      <w:bookmarkStart w:id="71" w:name="_Toc234787992"/>
+      <w:bookmarkStart w:id="71" w:name="_Toc234828228"/>
       <w:bookmarkEnd w:id="68"/>
       <w:r>
         <w:rPr>
@@ -23209,7 +23209,7 @@
           <w:noProof/>
         </w:rPr>
         <w:drawing>
-          <wp:inline distT="0" distB="0" distL="0" distR="0" wp14:anchorId="486CCD53" wp14:editId="110DD0C6">
+          <wp:inline distT="0" distB="0" distL="0" distR="0" wp14:anchorId="02C779B1" wp14:editId="39942350">
             <wp:extent cx="2611356" cy="6800584"/>
             <wp:effectExtent l="0" t="0" r="0" b="0"/>
             <wp:docPr id="92" name="Picture" descr="Tree filters: what you hide here is hidden in this tree view — diagrams keep their own selection. The Phases group greys out when the model has no Phase Support."/>
@@ -23264,7 +23264,7 @@
         <w:pStyle w:val="Heading2"/>
       </w:pPr>
       <w:bookmarkStart w:id="72" w:name="delete-multiple"/>
-      <w:bookmarkStart w:id="73" w:name="_Toc234787993"/>
+      <w:bookmarkStart w:id="73" w:name="_Toc234828229"/>
       <w:bookmarkEnd w:id="70"/>
       <w:r>
         <w:rPr>
@@ -23314,7 +23314,7 @@
           <w:noProof/>
         </w:rPr>
         <w:drawing>
-          <wp:inline distT="0" distB="0" distL="0" distR="0" wp14:anchorId="5A0EE823" wp14:editId="08EC6700">
+          <wp:inline distT="0" distB="0" distL="0" distR="0" wp14:anchorId="031B8DC2" wp14:editId="5319FFDA">
             <wp:extent cx="5334000" cy="4034433"/>
             <wp:effectExtent l="0" t="0" r="0" b="0"/>
             <wp:docPr id="96" name="Picture" descr="Bulk delete: the Show checkboxes narrow the tree by kind, ticking a parent includes its contents, and the whole deletion is a single undo step."/>
@@ -23369,7 +23369,7 @@
         <w:pStyle w:val="Heading2"/>
       </w:pPr>
       <w:bookmarkStart w:id="74" w:name="drag-and-copy-drag"/>
-      <w:bookmarkStart w:id="75" w:name="_Toc234787994"/>
+      <w:bookmarkStart w:id="75" w:name="_Toc234828230"/>
       <w:bookmarkEnd w:id="72"/>
       <w:r>
         <w:rPr>
@@ -23609,7 +23609,7 @@
         <w:pStyle w:val="Heading1"/>
       </w:pPr>
       <w:bookmarkStart w:id="76" w:name="reference-class-diagrams"/>
-      <w:bookmarkStart w:id="77" w:name="_Toc234787995"/>
+      <w:bookmarkStart w:id="77" w:name="_Toc234828231"/>
       <w:bookmarkEnd w:id="62"/>
       <w:bookmarkEnd w:id="74"/>
       <w:r>
@@ -23659,7 +23659,7 @@
         <w:pStyle w:val="Heading2"/>
       </w:pPr>
       <w:bookmarkStart w:id="78" w:name="reading-the-diagram"/>
-      <w:bookmarkStart w:id="79" w:name="_Toc234787996"/>
+      <w:bookmarkStart w:id="79" w:name="_Toc234828232"/>
       <w:r>
         <w:rPr>
           <w:rStyle w:val="SectionNumber"/>
@@ -23859,7 +23859,7 @@
         <w:pStyle w:val="Heading2"/>
       </w:pPr>
       <w:bookmarkStart w:id="80" w:name="selection"/>
-      <w:bookmarkStart w:id="81" w:name="_Toc234787997"/>
+      <w:bookmarkStart w:id="81" w:name="_Toc234828233"/>
       <w:bookmarkEnd w:id="78"/>
       <w:r>
         <w:rPr>
@@ -24073,7 +24073,7 @@
         <w:pStyle w:val="Heading2"/>
       </w:pPr>
       <w:bookmarkStart w:id="82" w:name="moving-and-resizing"/>
-      <w:bookmarkStart w:id="83" w:name="_Toc234787998"/>
+      <w:bookmarkStart w:id="83" w:name="_Toc234828234"/>
       <w:bookmarkEnd w:id="80"/>
       <w:r>
         <w:rPr>
@@ -24153,7 +24153,7 @@
         <w:pStyle w:val="Heading2"/>
       </w:pPr>
       <w:bookmarkStart w:id="84" w:name="editing-connection-routing"/>
-      <w:bookmarkStart w:id="85" w:name="_Toc234787999"/>
+      <w:bookmarkStart w:id="85" w:name="_Toc234828235"/>
       <w:bookmarkEnd w:id="82"/>
       <w:r>
         <w:rPr>
@@ -24307,7 +24307,7 @@
         <w:pStyle w:val="Heading2"/>
       </w:pPr>
       <w:bookmarkStart w:id="86" w:name="members-and-methods-inside-the-box"/>
-      <w:bookmarkStart w:id="87" w:name="_Toc234788000"/>
+      <w:bookmarkStart w:id="87" w:name="_Toc234828236"/>
       <w:bookmarkEnd w:id="84"/>
       <w:r>
         <w:rPr>
@@ -24381,7 +24381,7 @@
         <w:pStyle w:val="Heading2"/>
       </w:pPr>
       <w:bookmarkStart w:id="88" w:name="notes-and-their-connection-points"/>
-      <w:bookmarkStart w:id="89" w:name="_Toc234788001"/>
+      <w:bookmarkStart w:id="89" w:name="_Toc234828237"/>
       <w:bookmarkEnd w:id="86"/>
       <w:r>
         <w:rPr>
@@ -24462,7 +24462,7 @@
         <w:pStyle w:val="Heading2"/>
       </w:pPr>
       <w:bookmarkStart w:id="90" w:name="creating-elements-on-the-canvas"/>
-      <w:bookmarkStart w:id="91" w:name="_Toc234788002"/>
+      <w:bookmarkStart w:id="91" w:name="_Toc234828238"/>
       <w:bookmarkEnd w:id="88"/>
       <w:r>
         <w:rPr>
@@ -24549,7 +24549,7 @@
           <w:b/>
           <w:bCs/>
         </w:rPr>
-        <w:t>from derived to base</w:t>
+        <w:t>from base to derived</w:t>
       </w:r>
       <w:r>
         <w:t>)</w:t>
@@ -24806,7 +24806,7 @@
         <w:pStyle w:val="Heading2"/>
       </w:pPr>
       <w:bookmarkStart w:id="92" w:name="align"/>
-      <w:bookmarkStart w:id="93" w:name="_Toc234788003"/>
+      <w:bookmarkStart w:id="93" w:name="_Toc234828239"/>
       <w:bookmarkEnd w:id="90"/>
       <w:r>
         <w:rPr>
@@ -24881,7 +24881,7 @@
         <w:pStyle w:val="Heading2"/>
       </w:pPr>
       <w:bookmarkStart w:id="94" w:name="hiding-per-shape-toggles-colors"/>
-      <w:bookmarkStart w:id="95" w:name="_Toc234788004"/>
+      <w:bookmarkStart w:id="95" w:name="_Toc234828240"/>
       <w:bookmarkEnd w:id="92"/>
       <w:r>
         <w:rPr>
@@ -25019,7 +25019,7 @@
         <w:pStyle w:val="Heading2"/>
       </w:pPr>
       <w:bookmarkStart w:id="96" w:name="zoom-and-pan"/>
-      <w:bookmarkStart w:id="97" w:name="_Toc234788005"/>
+      <w:bookmarkStart w:id="97" w:name="_Toc234828241"/>
       <w:bookmarkEnd w:id="94"/>
       <w:r>
         <w:rPr>
@@ -25288,7 +25288,7 @@
         <w:pStyle w:val="Heading2"/>
       </w:pPr>
       <w:bookmarkStart w:id="98" w:name="the-cd-toolbar"/>
-      <w:bookmarkStart w:id="99" w:name="_Toc234788006"/>
+      <w:bookmarkStart w:id="99" w:name="_Toc234828242"/>
       <w:bookmarkEnd w:id="96"/>
       <w:r>
         <w:rPr>
@@ -25453,7 +25453,7 @@
         <w:pStyle w:val="Heading2"/>
       </w:pPr>
       <w:bookmarkStart w:id="100" w:name="the-cd-context-menu"/>
-      <w:bookmarkStart w:id="101" w:name="_Toc234788007"/>
+      <w:bookmarkStart w:id="101" w:name="_Toc234828243"/>
       <w:bookmarkEnd w:id="98"/>
       <w:r>
         <w:rPr>
@@ -25681,7 +25681,7 @@
         <w:pStyle w:val="Heading2"/>
       </w:pPr>
       <w:bookmarkStart w:id="102" w:name="canvas-keys"/>
-      <w:bookmarkStart w:id="103" w:name="_Toc234788008"/>
+      <w:bookmarkStart w:id="103" w:name="_Toc234828244"/>
       <w:bookmarkEnd w:id="100"/>
       <w:r>
         <w:rPr>
@@ -25999,7 +25999,7 @@
         <w:pStyle w:val="Heading1"/>
       </w:pPr>
       <w:bookmarkStart w:id="104" w:name="reference-sequence-diagrams"/>
-      <w:bookmarkStart w:id="105" w:name="_Toc234788009"/>
+      <w:bookmarkStart w:id="105" w:name="_Toc234828245"/>
       <w:bookmarkEnd w:id="76"/>
       <w:bookmarkEnd w:id="102"/>
       <w:r>
@@ -26073,7 +26073,7 @@
           <w:noProof/>
         </w:rPr>
         <w:drawing>
-          <wp:inline distT="0" distB="0" distL="0" distR="0" wp14:anchorId="70382E22" wp14:editId="364EC4F7">
+          <wp:inline distT="0" distB="0" distL="0" distR="0" wp14:anchorId="277926C4" wp14:editId="6DD0EC24">
             <wp:extent cx="5334000" cy="3429000"/>
             <wp:effectExtent l="0" t="0" r="0" b="0"/>
             <wp:docPr id="116" name="Picture" descr="A sequence-diagram view in the shell — its own toolbar (delete, undo/redo, zoom, export SVG) at the top; diagram views dock, tab and float exactly like the trees."/>
@@ -26132,7 +26132,7 @@
           <w:noProof/>
         </w:rPr>
         <w:drawing>
-          <wp:inline distT="0" distB="0" distL="0" distR="0" wp14:anchorId="06E6FFE4" wp14:editId="66F37E3B">
+          <wp:inline distT="0" distB="0" distL="0" distR="0" wp14:anchorId="0300111A" wp14:editId="349CB4D7">
             <wp:extent cx="5334000" cy="7544589"/>
             <wp:effectExtent l="0" t="0" r="0" b="0"/>
             <wp:docPr id="119" name="Picture" descr="The “Creating a Matrix” sequence diagram (SVG export, generated with add_call_trace): a User triggers Matrix(rows, columns), which constructs the Columns and Rows."/>
@@ -26199,7 +26199,7 @@
         <w:pStyle w:val="Heading2"/>
       </w:pPr>
       <w:bookmarkStart w:id="106" w:name="building-one"/>
-      <w:bookmarkStart w:id="107" w:name="_Toc234788010"/>
+      <w:bookmarkStart w:id="107" w:name="_Toc234828246"/>
       <w:r>
         <w:rPr>
           <w:rStyle w:val="SectionNumber"/>
@@ -26356,7 +26356,7 @@
         <w:pStyle w:val="Heading2"/>
       </w:pPr>
       <w:bookmarkStart w:id="108" w:name="what-moves-and-how"/>
-      <w:bookmarkStart w:id="109" w:name="_Toc234788011"/>
+      <w:bookmarkStart w:id="109" w:name="_Toc234828247"/>
       <w:bookmarkEnd w:id="106"/>
       <w:r>
         <w:rPr>
@@ -26790,7 +26790,7 @@
         <w:pStyle w:val="Heading2"/>
       </w:pPr>
       <w:bookmarkStart w:id="110" w:name="keeping-it-readable"/>
-      <w:bookmarkStart w:id="111" w:name="_Toc234788012"/>
+      <w:bookmarkStart w:id="111" w:name="_Toc234828248"/>
       <w:bookmarkEnd w:id="108"/>
       <w:r>
         <w:rPr>
@@ -26891,7 +26891,7 @@
         <w:pStyle w:val="Heading2"/>
       </w:pPr>
       <w:bookmarkStart w:id="112" w:name="toolbar-colors-zoom"/>
-      <w:bookmarkStart w:id="113" w:name="_Toc234788013"/>
+      <w:bookmarkStart w:id="113" w:name="_Toc234828249"/>
       <w:bookmarkEnd w:id="110"/>
       <w:r>
         <w:rPr>
@@ -27023,7 +27023,7 @@
         <w:pStyle w:val="Heading2"/>
       </w:pPr>
       <w:bookmarkStart w:id="114" w:name="canvas-keys-1"/>
-      <w:bookmarkStart w:id="115" w:name="_Toc234788014"/>
+      <w:bookmarkStart w:id="115" w:name="_Toc234828250"/>
       <w:bookmarkEnd w:id="112"/>
       <w:r>
         <w:rPr>
@@ -27416,7 +27416,7 @@
           <w:noProof/>
         </w:rPr>
         <w:drawing>
-          <wp:inline distT="0" distB="0" distL="0" distR="0" wp14:anchorId="263E8450" wp14:editId="4766B399">
+          <wp:inline distT="0" distB="0" distL="0" distR="0" wp14:anchorId="7AD25DE4" wp14:editId="7368F71A">
             <wp:extent cx="5334000" cy="7544589"/>
             <wp:effectExtent l="0" t="0" r="0" b="0"/>
             <wp:docPr id="127" name="Picture" descr="A pipe-generated call trace of the Matrix constructor (“Matrix constructor walkthrough”)."/>
@@ -27480,7 +27480,7 @@
         <w:pStyle w:val="Heading1"/>
       </w:pPr>
       <w:bookmarkStart w:id="116" w:name="reference-dialogs"/>
-      <w:bookmarkStart w:id="117" w:name="_Toc234788015"/>
+      <w:bookmarkStart w:id="117" w:name="_Toc234828251"/>
       <w:bookmarkEnd w:id="104"/>
       <w:bookmarkEnd w:id="114"/>
       <w:r>
@@ -27609,7 +27609,7 @@
         <w:pStyle w:val="Heading2"/>
       </w:pPr>
       <w:bookmarkStart w:id="118" w:name="class"/>
-      <w:bookmarkStart w:id="119" w:name="_Toc234788016"/>
+      <w:bookmarkStart w:id="119" w:name="_Toc234828252"/>
       <w:r>
         <w:rPr>
           <w:rStyle w:val="SectionNumber"/>
@@ -27773,7 +27773,7 @@
         <w:pStyle w:val="Heading2"/>
       </w:pPr>
       <w:bookmarkStart w:id="120" w:name="external-class"/>
-      <w:bookmarkStart w:id="121" w:name="_Toc234788017"/>
+      <w:bookmarkStart w:id="121" w:name="_Toc234828253"/>
       <w:bookmarkEnd w:id="118"/>
       <w:r>
         <w:rPr>
@@ -27835,7 +27835,7 @@
         <w:pStyle w:val="Heading2"/>
       </w:pPr>
       <w:bookmarkStart w:id="122" w:name="member"/>
-      <w:bookmarkStart w:id="123" w:name="_Toc234788018"/>
+      <w:bookmarkStart w:id="123" w:name="_Toc234828254"/>
       <w:bookmarkEnd w:id="120"/>
       <w:r>
         <w:rPr>
@@ -28043,7 +28043,7 @@
         <w:pStyle w:val="Heading2"/>
       </w:pPr>
       <w:bookmarkStart w:id="124" w:name="method"/>
-      <w:bookmarkStart w:id="125" w:name="_Toc234788019"/>
+      <w:bookmarkStart w:id="125" w:name="_Toc234828255"/>
       <w:bookmarkEnd w:id="122"/>
       <w:r>
         <w:rPr>
@@ -28273,7 +28273,7 @@
         <w:pStyle w:val="Heading2"/>
       </w:pPr>
       <w:bookmarkStart w:id="126" w:name="constructor-destructor"/>
-      <w:bookmarkStart w:id="127" w:name="_Toc234788020"/>
+      <w:bookmarkStart w:id="127" w:name="_Toc234828256"/>
       <w:bookmarkEnd w:id="124"/>
       <w:r>
         <w:rPr>
@@ -28382,7 +28382,7 @@
         <w:pStyle w:val="Heading2"/>
       </w:pPr>
       <w:bookmarkStart w:id="128" w:name="exception-specification"/>
-      <w:bookmarkStart w:id="129" w:name="_Toc234788021"/>
+      <w:bookmarkStart w:id="129" w:name="_Toc234828257"/>
       <w:bookmarkEnd w:id="126"/>
       <w:r>
         <w:rPr>
@@ -28473,7 +28473,7 @@
         <w:pStyle w:val="Heading2"/>
       </w:pPr>
       <w:bookmarkStart w:id="130" w:name="argument"/>
-      <w:bookmarkStart w:id="131" w:name="_Toc234788022"/>
+      <w:bookmarkStart w:id="131" w:name="_Toc234828258"/>
       <w:bookmarkEnd w:id="128"/>
       <w:r>
         <w:rPr>
@@ -28525,7 +28525,7 @@
         <w:pStyle w:val="Heading2"/>
       </w:pPr>
       <w:bookmarkStart w:id="132" w:name="inheritance"/>
-      <w:bookmarkStart w:id="133" w:name="_Toc234788023"/>
+      <w:bookmarkStart w:id="133" w:name="_Toc234828259"/>
       <w:bookmarkEnd w:id="130"/>
       <w:r>
         <w:rPr>
@@ -28619,7 +28619,7 @@
         <w:pStyle w:val="Heading2"/>
       </w:pPr>
       <w:bookmarkStart w:id="134" w:name="relation"/>
-      <w:bookmarkStart w:id="135" w:name="_Toc234788024"/>
+      <w:bookmarkStart w:id="135" w:name="_Toc234828260"/>
       <w:bookmarkEnd w:id="132"/>
       <w:r>
         <w:rPr>
@@ -28958,7 +28958,7 @@
         <w:pStyle w:val="Heading2"/>
       </w:pPr>
       <w:bookmarkStart w:id="136" w:name="find-method-on-a-relation"/>
-      <w:bookmarkStart w:id="137" w:name="_Toc234788025"/>
+      <w:bookmarkStart w:id="137" w:name="_Toc234828261"/>
       <w:bookmarkEnd w:id="134"/>
       <w:r>
         <w:rPr>
@@ -29072,7 +29072,7 @@
         <w:pStyle w:val="Heading2"/>
       </w:pPr>
       <w:bookmarkStart w:id="138" w:name="dependency"/>
-      <w:bookmarkStart w:id="139" w:name="_Toc234788026"/>
+      <w:bookmarkStart w:id="139" w:name="_Toc234828262"/>
       <w:bookmarkEnd w:id="136"/>
       <w:r>
         <w:rPr>
@@ -29160,7 +29160,7 @@
         <w:pStyle w:val="Heading2"/>
       </w:pPr>
       <w:bookmarkStart w:id="140" w:name="relation-diagram-only"/>
-      <w:bookmarkStart w:id="141" w:name="_Toc234788027"/>
+      <w:bookmarkStart w:id="141" w:name="_Toc234828263"/>
       <w:bookmarkEnd w:id="138"/>
       <w:r>
         <w:rPr>
@@ -29255,7 +29255,7 @@
         <w:pStyle w:val="Heading2"/>
       </w:pPr>
       <w:bookmarkStart w:id="142" w:name="type"/>
-      <w:bookmarkStart w:id="143" w:name="_Toc234788028"/>
+      <w:bookmarkStart w:id="143" w:name="_Toc234828264"/>
       <w:bookmarkEnd w:id="140"/>
       <w:r>
         <w:rPr>
@@ -29354,7 +29354,7 @@
         <w:pStyle w:val="Heading2"/>
       </w:pPr>
       <w:bookmarkStart w:id="144" w:name="group-meta-group"/>
-      <w:bookmarkStart w:id="145" w:name="_Toc234788029"/>
+      <w:bookmarkStart w:id="145" w:name="_Toc234828265"/>
       <w:bookmarkEnd w:id="142"/>
       <w:r>
         <w:rPr>
@@ -29396,7 +29396,7 @@
         <w:pStyle w:val="Heading2"/>
       </w:pPr>
       <w:bookmarkStart w:id="146" w:name="context-define-and-assign"/>
-      <w:bookmarkStart w:id="147" w:name="_Toc234788030"/>
+      <w:bookmarkStart w:id="147" w:name="_Toc234828266"/>
       <w:bookmarkEnd w:id="144"/>
       <w:r>
         <w:rPr>
@@ -29602,7 +29602,7 @@
         <w:pStyle w:val="Heading2"/>
       </w:pPr>
       <w:bookmarkStart w:id="148" w:name="actor"/>
-      <w:bookmarkStart w:id="149" w:name="_Toc234788031"/>
+      <w:bookmarkStart w:id="149" w:name="_Toc234828267"/>
       <w:bookmarkEnd w:id="146"/>
       <w:r>
         <w:rPr>
@@ -29653,7 +29653,7 @@
         <w:pStyle w:val="Heading2"/>
       </w:pPr>
       <w:bookmarkStart w:id="150" w:name="class-diagram"/>
-      <w:bookmarkStart w:id="151" w:name="_Toc234788032"/>
+      <w:bookmarkStart w:id="151" w:name="_Toc234828268"/>
       <w:bookmarkEnd w:id="148"/>
       <w:r>
         <w:rPr>
@@ -29707,7 +29707,7 @@
         <w:pStyle w:val="Heading2"/>
       </w:pPr>
       <w:bookmarkStart w:id="152" w:name="sequence-diagram"/>
-      <w:bookmarkStart w:id="153" w:name="_Toc234788033"/>
+      <w:bookmarkStart w:id="153" w:name="_Toc234828269"/>
       <w:bookmarkEnd w:id="150"/>
       <w:r>
         <w:rPr>
@@ -29823,7 +29823,7 @@
         <w:pStyle w:val="Heading2"/>
       </w:pPr>
       <w:bookmarkStart w:id="154" w:name="select-classes"/>
-      <w:bookmarkStart w:id="155" w:name="_Toc234788034"/>
+      <w:bookmarkStart w:id="155" w:name="_Toc234828270"/>
       <w:bookmarkEnd w:id="152"/>
       <w:r>
         <w:rPr>
@@ -29884,7 +29884,7 @@
         <w:pStyle w:val="Heading2"/>
       </w:pPr>
       <w:bookmarkStart w:id="156" w:name="class-shape"/>
-      <w:bookmarkStart w:id="157" w:name="_Toc234788035"/>
+      <w:bookmarkStart w:id="157" w:name="_Toc234828271"/>
       <w:bookmarkEnd w:id="154"/>
       <w:r>
         <w:rPr>
@@ -29965,7 +29965,7 @@
         <w:pStyle w:val="Heading2"/>
       </w:pPr>
       <w:bookmarkStart w:id="158" w:name="select-members-methods"/>
-      <w:bookmarkStart w:id="159" w:name="_Toc234788036"/>
+      <w:bookmarkStart w:id="159" w:name="_Toc234828272"/>
       <w:bookmarkEnd w:id="156"/>
       <w:r>
         <w:rPr>
@@ -30017,7 +30017,7 @@
         <w:pStyle w:val="Heading2"/>
       </w:pPr>
       <w:bookmarkStart w:id="160" w:name="reorder-members-methods"/>
-      <w:bookmarkStart w:id="161" w:name="_Toc234788037"/>
+      <w:bookmarkStart w:id="161" w:name="_Toc234828273"/>
       <w:bookmarkEnd w:id="158"/>
       <w:r>
         <w:rPr>
@@ -30069,7 +30069,7 @@
         <w:pStyle w:val="Heading2"/>
       </w:pPr>
       <w:bookmarkStart w:id="162" w:name="signal-message"/>
-      <w:bookmarkStart w:id="163" w:name="_Toc234788038"/>
+      <w:bookmarkStart w:id="163" w:name="_Toc234828274"/>
       <w:bookmarkEnd w:id="160"/>
       <w:r>
         <w:rPr>
@@ -30129,7 +30129,7 @@
         <w:pStyle w:val="Heading2"/>
       </w:pPr>
       <w:bookmarkStart w:id="164" w:name="lifeline-note-dialogs"/>
-      <w:bookmarkStart w:id="165" w:name="_Toc234788039"/>
+      <w:bookmarkStart w:id="165" w:name="_Toc234828275"/>
       <w:bookmarkEnd w:id="162"/>
       <w:r>
         <w:rPr>
@@ -30183,7 +30183,7 @@
         <w:pStyle w:val="Heading2"/>
       </w:pPr>
       <w:bookmarkStart w:id="166" w:name="Xb9470c6e63f702dcde05f89c7607c45c6bcf312"/>
-      <w:bookmarkStart w:id="167" w:name="_Toc234788040"/>
+      <w:bookmarkStart w:id="167" w:name="_Toc234828276"/>
       <w:bookmarkEnd w:id="164"/>
       <w:r>
         <w:rPr>
@@ -30469,7 +30469,7 @@
         <w:pStyle w:val="Heading2"/>
       </w:pPr>
       <w:bookmarkStart w:id="168" w:name="add-serialization-to-project"/>
-      <w:bookmarkStart w:id="169" w:name="_Toc234788041"/>
+      <w:bookmarkStart w:id="169" w:name="_Toc234828277"/>
       <w:bookmarkEnd w:id="166"/>
       <w:r>
         <w:rPr>
@@ -30542,7 +30542,7 @@
         <w:pStyle w:val="Heading2"/>
       </w:pPr>
       <w:bookmarkStart w:id="170" w:name="find"/>
-      <w:bookmarkStart w:id="171" w:name="_Toc234788042"/>
+      <w:bookmarkStart w:id="171" w:name="_Toc234828278"/>
       <w:bookmarkEnd w:id="168"/>
       <w:r>
         <w:rPr>
@@ -30599,7 +30599,7 @@
         <w:pStyle w:val="Heading2"/>
       </w:pPr>
       <w:bookmarkStart w:id="172" w:name="read-source"/>
-      <w:bookmarkStart w:id="173" w:name="_Toc234788043"/>
+      <w:bookmarkStart w:id="173" w:name="_Toc234828279"/>
       <w:bookmarkEnd w:id="170"/>
       <w:r>
         <w:rPr>
@@ -30661,7 +30661,7 @@
         <w:pStyle w:val="Heading2"/>
       </w:pPr>
       <w:bookmarkStart w:id="174" w:name="save-source"/>
-      <w:bookmarkStart w:id="175" w:name="_Toc234788044"/>
+      <w:bookmarkStart w:id="175" w:name="_Toc234828280"/>
       <w:bookmarkEnd w:id="172"/>
       <w:r>
         <w:rPr>
@@ -30755,7 +30755,7 @@
         <w:pStyle w:val="Heading2"/>
       </w:pPr>
       <w:bookmarkStart w:id="176" w:name="virtual-methods-isclass-methods"/>
-      <w:bookmarkStart w:id="177" w:name="_Toc234788045"/>
+      <w:bookmarkStart w:id="177" w:name="_Toc234828281"/>
       <w:bookmarkEnd w:id="174"/>
       <w:r>
         <w:rPr>
@@ -30845,7 +30845,7 @@
         <w:pStyle w:val="Heading2"/>
       </w:pPr>
       <w:bookmarkStart w:id="178" w:name="user-sections-code-dialogs"/>
-      <w:bookmarkStart w:id="179" w:name="_Toc234788046"/>
+      <w:bookmarkStart w:id="179" w:name="_Toc234828282"/>
       <w:bookmarkEnd w:id="176"/>
       <w:r>
         <w:rPr>
@@ -30924,7 +30924,7 @@
         <w:pStyle w:val="Heading2"/>
       </w:pPr>
       <w:bookmarkStart w:id="180" w:name="code-editing-helper-wizards"/>
-      <w:bookmarkStart w:id="181" w:name="_Toc234788047"/>
+      <w:bookmarkStart w:id="181" w:name="_Toc234828283"/>
       <w:bookmarkEnd w:id="178"/>
       <w:r>
         <w:rPr>
@@ -31159,7 +31159,7 @@
         <w:pStyle w:val="Heading1"/>
       </w:pPr>
       <w:bookmarkStart w:id="182" w:name="reference-the-code-editor"/>
-      <w:bookmarkStart w:id="183" w:name="_Toc234788048"/>
+      <w:bookmarkStart w:id="183" w:name="_Toc234828284"/>
       <w:bookmarkEnd w:id="116"/>
       <w:bookmarkEnd w:id="180"/>
       <w:r>
@@ -31187,7 +31187,7 @@
         <w:pStyle w:val="Heading2"/>
       </w:pPr>
       <w:bookmarkStart w:id="184" w:name="editing-behavior"/>
-      <w:bookmarkStart w:id="185" w:name="_Toc234788049"/>
+      <w:bookmarkStart w:id="185" w:name="_Toc234828285"/>
       <w:r>
         <w:rPr>
           <w:rStyle w:val="SectionNumber"/>
@@ -31347,7 +31347,7 @@
         <w:pStyle w:val="Heading2"/>
       </w:pPr>
       <w:bookmarkStart w:id="186" w:name="code-insertion"/>
-      <w:bookmarkStart w:id="187" w:name="_Toc234788050"/>
+      <w:bookmarkStart w:id="187" w:name="_Toc234828286"/>
       <w:bookmarkEnd w:id="184"/>
       <w:r>
         <w:rPr>
@@ -31459,7 +31459,7 @@
         <w:pStyle w:val="Heading2"/>
       </w:pPr>
       <w:bookmarkStart w:id="188" w:name="where-it-appears"/>
-      <w:bookmarkStart w:id="189" w:name="_Toc234788051"/>
+      <w:bookmarkStart w:id="189" w:name="_Toc234828287"/>
       <w:bookmarkEnd w:id="186"/>
       <w:r>
         <w:rPr>
@@ -31666,7 +31666,7 @@
         <w:pStyle w:val="Heading1"/>
       </w:pPr>
       <w:bookmarkStart w:id="190" w:name="code-generation-in-depth"/>
-      <w:bookmarkStart w:id="191" w:name="_Toc234788052"/>
+      <w:bookmarkStart w:id="191" w:name="_Toc234828288"/>
       <w:bookmarkEnd w:id="182"/>
       <w:bookmarkEnd w:id="188"/>
       <w:r>
@@ -31686,7 +31686,7 @@
         <w:pStyle w:val="Heading2"/>
       </w:pPr>
       <w:bookmarkStart w:id="192" w:name="files-produced"/>
-      <w:bookmarkStart w:id="193" w:name="_Toc234788053"/>
+      <w:bookmarkStart w:id="193" w:name="_Toc234828289"/>
       <w:r>
         <w:rPr>
           <w:rStyle w:val="SectionNumber"/>
@@ -31770,7 +31770,7 @@
         <w:pStyle w:val="Heading2"/>
       </w:pPr>
       <w:bookmarkStart w:id="194" w:name="anatomy-of-a-generated-file"/>
-      <w:bookmarkStart w:id="195" w:name="_Toc234788054"/>
+      <w:bookmarkStart w:id="195" w:name="_Toc234828290"/>
       <w:bookmarkEnd w:id="192"/>
       <w:r>
         <w:rPr>
@@ -32199,7 +32199,7 @@
         <w:pStyle w:val="Heading2"/>
       </w:pPr>
       <w:bookmarkStart w:id="196" w:name="the-six-user-sections"/>
-      <w:bookmarkStart w:id="197" w:name="_Toc234788055"/>
+      <w:bookmarkStart w:id="197" w:name="_Toc234828291"/>
       <w:bookmarkEnd w:id="194"/>
       <w:r>
         <w:rPr>
@@ -32274,7 +32274,7 @@
         <w:pStyle w:val="Heading2"/>
       </w:pPr>
       <w:bookmarkStart w:id="198" w:name="constructorinclude-destructorinclude"/>
-      <w:bookmarkStart w:id="199" w:name="_Toc234788056"/>
+      <w:bookmarkStart w:id="199" w:name="_Toc234828292"/>
       <w:bookmarkEnd w:id="196"/>
       <w:r>
         <w:rPr>
@@ -32384,7 +32384,7 @@
         <w:pStyle w:val="Heading2"/>
       </w:pPr>
       <w:bookmarkStart w:id="200" w:name="read-source-the-round-trip"/>
-      <w:bookmarkStart w:id="201" w:name="_Toc234788057"/>
+      <w:bookmarkStart w:id="201" w:name="_Toc234828293"/>
       <w:bookmarkEnd w:id="198"/>
       <w:r>
         <w:rPr>
@@ -32519,7 +32519,7 @@
         <w:pStyle w:val="Heading1"/>
       </w:pPr>
       <w:bookmarkStart w:id="202" w:name="relations-and-the-intrusive-runtime"/>
-      <w:bookmarkStart w:id="203" w:name="_Toc234788058"/>
+      <w:bookmarkStart w:id="203" w:name="_Toc234828294"/>
       <w:bookmarkEnd w:id="190"/>
       <w:bookmarkEnd w:id="200"/>
       <w:r>
@@ -32547,7 +32547,7 @@
         <w:pStyle w:val="Heading2"/>
       </w:pPr>
       <w:bookmarkStart w:id="204" w:name="what-intrusive-means"/>
-      <w:bookmarkStart w:id="205" w:name="_Toc234788059"/>
+      <w:bookmarkStart w:id="205" w:name="_Toc234828295"/>
       <w:r>
         <w:rPr>
           <w:rStyle w:val="SectionNumber"/>
@@ -32569,7 +32569,7 @@
           <w:noProof/>
         </w:rPr>
         <w:drawing>
-          <wp:inline distT="0" distB="0" distL="0" distR="0" wp14:anchorId="4A04D9CF" wp14:editId="3724C340">
+          <wp:inline distT="0" distB="0" distL="0" distR="0" wp14:anchorId="1CDC8347" wp14:editId="52A504BF">
             <wp:extent cx="5334000" cy="3246782"/>
             <wp:effectExtent l="0" t="0" r="0" b="0"/>
             <wp:docPr id="176" name="Picture" descr="One Cell in two lists: all link pointers are members of the Cell itself."/>
@@ -32936,7 +32936,7 @@
         <w:pStyle w:val="Heading2"/>
       </w:pPr>
       <w:bookmarkStart w:id="206" w:name="declaring-relations-the-macro-surface"/>
-      <w:bookmarkStart w:id="207" w:name="_Toc234788060"/>
+      <w:bookmarkStart w:id="207" w:name="_Toc234828296"/>
       <w:bookmarkEnd w:id="204"/>
       <w:r>
         <w:rPr>
@@ -33581,7 +33581,7 @@
         <w:pStyle w:val="Heading2"/>
       </w:pPr>
       <w:bookmarkStart w:id="208" w:name="the-generated-api-of-a-multi-relation"/>
-      <w:bookmarkStart w:id="209" w:name="_Toc234788061"/>
+      <w:bookmarkStart w:id="209" w:name="_Toc234828297"/>
       <w:bookmarkEnd w:id="206"/>
       <w:r>
         <w:rPr>
@@ -34498,7 +34498,7 @@
         <w:pStyle w:val="Heading2"/>
       </w:pPr>
       <w:bookmarkStart w:id="210" w:name="Xaaa89ef9d7adb0d0fb470691c4808f6f6b0754c"/>
-      <w:bookmarkStart w:id="211" w:name="_Toc234788062"/>
+      <w:bookmarkStart w:id="211" w:name="_Toc234828298"/>
       <w:bookmarkEnd w:id="208"/>
       <w:r>
         <w:rPr>
@@ -34861,7 +34861,7 @@
         <w:pStyle w:val="Heading2"/>
       </w:pPr>
       <w:bookmarkStart w:id="212" w:name="ownership-and-cascade-delete"/>
-      <w:bookmarkStart w:id="213" w:name="_Toc234788063"/>
+      <w:bookmarkStart w:id="213" w:name="_Toc234828299"/>
       <w:bookmarkEnd w:id="210"/>
       <w:r>
         <w:rPr>
@@ -34884,7 +34884,7 @@
           <w:noProof/>
         </w:rPr>
         <w:drawing>
-          <wp:inline distT="0" distB="0" distL="0" distR="0" wp14:anchorId="18633B0E" wp14:editId="31DD4288">
+          <wp:inline distT="0" distB="0" distL="0" distR="0" wp14:anchorId="1FB3F7F1" wp14:editId="563BA93F">
             <wp:extent cx="5334000" cy="2724978"/>
             <wp:effectExtent l="0" t="0" r="0" b="0"/>
             <wp:docPr id="184" name="Picture" descr="delete pMatrix — the cascade frees the entire graph."/>
@@ -35039,7 +35039,7 @@
         <w:pStyle w:val="Heading2"/>
       </w:pPr>
       <w:bookmarkStart w:id="214" w:name="iterators-that-survive-modification"/>
-      <w:bookmarkStart w:id="215" w:name="_Toc234788064"/>
+      <w:bookmarkStart w:id="215" w:name="_Toc234828300"/>
       <w:bookmarkEnd w:id="212"/>
       <w:r>
         <w:rPr>
@@ -35247,7 +35247,7 @@
         <w:pStyle w:val="Heading2"/>
       </w:pPr>
       <w:bookmarkStart w:id="216" w:name="single-static-multi"/>
-      <w:bookmarkStart w:id="217" w:name="_Toc234788065"/>
+      <w:bookmarkStart w:id="217" w:name="_Toc234828301"/>
       <w:bookmarkEnd w:id="214"/>
       <w:r>
         <w:rPr>
@@ -35323,7 +35323,7 @@
         <w:pStyle w:val="Heading2"/>
       </w:pPr>
       <w:bookmarkStart w:id="218" w:name="tree-implementations-and-find-methods"/>
-      <w:bookmarkStart w:id="219" w:name="_Toc234788066"/>
+      <w:bookmarkStart w:id="219" w:name="_Toc234828302"/>
       <w:bookmarkEnd w:id="216"/>
       <w:r>
         <w:rPr>
@@ -35979,7 +35979,7 @@
         <w:pStyle w:val="Heading2"/>
       </w:pPr>
       <w:bookmarkStart w:id="220" w:name="critical-relations-threads"/>
-      <w:bookmarkStart w:id="221" w:name="_Toc234788067"/>
+      <w:bookmarkStart w:id="221" w:name="_Toc234828303"/>
       <w:bookmarkEnd w:id="218"/>
       <w:r>
         <w:rPr>
@@ -36035,7 +36035,7 @@
         <w:pStyle w:val="Heading2"/>
       </w:pPr>
       <w:bookmarkStart w:id="222" w:name="writing-loops-the-generated-way"/>
-      <w:bookmarkStart w:id="223" w:name="_Toc234788068"/>
+      <w:bookmarkStart w:id="223" w:name="_Toc234828304"/>
       <w:bookmarkEnd w:id="220"/>
       <w:r>
         <w:rPr>
@@ -36381,7 +36381,7 @@
         <w:pStyle w:val="Heading1"/>
       </w:pPr>
       <w:bookmarkStart w:id="224" w:name="serialization"/>
-      <w:bookmarkStart w:id="225" w:name="_Toc234788069"/>
+      <w:bookmarkStart w:id="225" w:name="_Toc234828305"/>
       <w:bookmarkEnd w:id="202"/>
       <w:bookmarkEnd w:id="222"/>
       <w:r>
@@ -36401,7 +36401,7 @@
         <w:pStyle w:val="Heading2"/>
       </w:pPr>
       <w:bookmarkStart w:id="226" w:name="what-you-get"/>
-      <w:bookmarkStart w:id="227" w:name="_Toc234788070"/>
+      <w:bookmarkStart w:id="227" w:name="_Toc234828306"/>
       <w:r>
         <w:rPr>
           <w:rStyle w:val="SectionNumber"/>
@@ -36602,7 +36602,7 @@
         <w:pStyle w:val="Heading2"/>
       </w:pPr>
       <w:bookmarkStart w:id="228" w:name="cbarchive-and-the-wire-format"/>
-      <w:bookmarkStart w:id="229" w:name="_Toc234788071"/>
+      <w:bookmarkStart w:id="229" w:name="_Toc234828307"/>
       <w:bookmarkEnd w:id="226"/>
       <w:r>
         <w:rPr>
@@ -36725,7 +36725,7 @@
         <w:pStyle w:val="Heading2"/>
       </w:pPr>
       <w:bookmarkStart w:id="230" w:name="cbz-compression-on-the-fly"/>
-      <w:bookmarkStart w:id="231" w:name="_Toc234788072"/>
+      <w:bookmarkStart w:id="231" w:name="_Toc234828308"/>
       <w:bookmarkEnd w:id="228"/>
       <w:r>
         <w:rPr>
@@ -37058,7 +37058,7 @@
         <w:pStyle w:val="Heading2"/>
       </w:pPr>
       <w:bookmarkStart w:id="232" w:name="Xbded68cf7b5dad621557026fdc0855cc4156113"/>
-      <w:bookmarkStart w:id="233" w:name="_Toc234788073"/>
+      <w:bookmarkStart w:id="233" w:name="_Toc234828309"/>
       <w:bookmarkEnd w:id="230"/>
       <w:r>
         <w:rPr>
@@ -37315,7 +37315,7 @@
         <w:pStyle w:val="Heading2"/>
       </w:pPr>
       <w:bookmarkStart w:id="234" w:name="rules-and-properties"/>
-      <w:bookmarkStart w:id="235" w:name="_Toc234788074"/>
+      <w:bookmarkStart w:id="235" w:name="_Toc234828310"/>
       <w:bookmarkEnd w:id="232"/>
       <w:r>
         <w:rPr>
@@ -37489,7 +37489,7 @@
         <w:pStyle w:val="Heading2"/>
       </w:pPr>
       <w:bookmarkStart w:id="236" w:name="Xe93cc69c5286d8ba9c1392594baf9a373c30c75"/>
-      <w:bookmarkStart w:id="237" w:name="_Toc234788075"/>
+      <w:bookmarkStart w:id="237" w:name="_Toc234828311"/>
       <w:bookmarkEnd w:id="234"/>
       <w:r>
         <w:rPr>
@@ -37661,7 +37661,7 @@
         <w:pStyle w:val="Heading1"/>
       </w:pPr>
       <w:bookmarkStart w:id="238" w:name="the-generated-undoredo-framework"/>
-      <w:bookmarkStart w:id="239" w:name="_Toc234788076"/>
+      <w:bookmarkStart w:id="239" w:name="_Toc234828312"/>
       <w:bookmarkEnd w:id="224"/>
       <w:bookmarkEnd w:id="236"/>
       <w:r>
@@ -37681,7 +37681,7 @@
         <w:pStyle w:val="Heading2"/>
       </w:pPr>
       <w:bookmarkStart w:id="240" w:name="what-it-is"/>
-      <w:bookmarkStart w:id="241" w:name="_Toc234788077"/>
+      <w:bookmarkStart w:id="241" w:name="_Toc234828313"/>
       <w:r>
         <w:rPr>
           <w:rStyle w:val="SectionNumber"/>
@@ -37730,7 +37730,7 @@
         <w:pStyle w:val="Heading2"/>
       </w:pPr>
       <w:bookmarkStart w:id="242" w:name="how-it-works"/>
-      <w:bookmarkStart w:id="243" w:name="_Toc234788078"/>
+      <w:bookmarkStart w:id="243" w:name="_Toc234828314"/>
       <w:bookmarkEnd w:id="240"/>
       <w:r>
         <w:rPr>
@@ -38103,7 +38103,7 @@
         <w:pStyle w:val="Heading2"/>
       </w:pPr>
       <w:bookmarkStart w:id="244" w:name="the-undoreplace-entanglement"/>
-      <w:bookmarkStart w:id="245" w:name="_Toc234788079"/>
+      <w:bookmarkStart w:id="245" w:name="_Toc234828315"/>
       <w:bookmarkEnd w:id="242"/>
       <w:r>
         <w:rPr>
@@ -38196,7 +38196,7 @@
         <w:pStyle w:val="Heading1"/>
       </w:pPr>
       <w:bookmarkStart w:id="246" w:name="the-replace-constructor"/>
-      <w:bookmarkStart w:id="247" w:name="_Toc234788080"/>
+      <w:bookmarkStart w:id="247" w:name="_Toc234828316"/>
       <w:bookmarkEnd w:id="238"/>
       <w:bookmarkEnd w:id="244"/>
       <w:r>
@@ -38218,7 +38218,7 @@
         <w:pStyle w:val="Heading2"/>
       </w:pPr>
       <w:bookmarkStart w:id="248" w:name="the-idea"/>
-      <w:bookmarkStart w:id="249" w:name="_Toc234788081"/>
+      <w:bookmarkStart w:id="249" w:name="_Toc234828317"/>
       <w:r>
         <w:rPr>
           <w:rStyle w:val="SectionNumber"/>
@@ -38240,7 +38240,7 @@
           <w:noProof/>
         </w:rPr>
         <w:drawing>
-          <wp:inline distT="0" distB="0" distL="0" distR="0" wp14:anchorId="104E28F6" wp14:editId="218618C5">
+          <wp:inline distT="0" distB="0" distL="0" distR="0" wp14:anchorId="49D8C7C7" wp14:editId="1C74FABB">
             <wp:extent cx="5334000" cy="2782956"/>
             <wp:effectExtent l="0" t="0" r="0" b="0"/>
             <wp:docPr id="206" name="Picture" descr="Replace: the new object takes over every relation slot of the old one."/>
@@ -38430,7 +38430,7 @@
         <w:pStyle w:val="Heading2"/>
       </w:pPr>
       <w:bookmarkStart w:id="250" w:name="why-it-is-more-powerful-than-a-factory"/>
-      <w:bookmarkStart w:id="251" w:name="_Toc234788082"/>
+      <w:bookmarkStart w:id="251" w:name="_Toc234828318"/>
       <w:bookmarkEnd w:id="248"/>
       <w:r>
         <w:rPr>
@@ -38981,7 +38981,7 @@
         <w:pStyle w:val="Heading2"/>
       </w:pPr>
       <w:bookmarkStart w:id="252" w:name="mechanics-and-constraints"/>
-      <w:bookmarkStart w:id="253" w:name="_Toc234788083"/>
+      <w:bookmarkStart w:id="253" w:name="_Toc234828319"/>
       <w:bookmarkEnd w:id="250"/>
       <w:r>
         <w:rPr>
@@ -39082,7 +39082,7 @@
         <w:pStyle w:val="Heading1"/>
       </w:pPr>
       <w:bookmarkStart w:id="254" w:name="the-command-interface"/>
-      <w:bookmarkStart w:id="255" w:name="_Toc234788084"/>
+      <w:bookmarkStart w:id="255" w:name="_Toc234828320"/>
       <w:bookmarkEnd w:id="246"/>
       <w:bookmarkEnd w:id="252"/>
       <w:r>
@@ -39104,7 +39104,7 @@
         <w:pStyle w:val="Heading2"/>
       </w:pPr>
       <w:bookmarkStart w:id="256" w:name="what-it-is-1"/>
-      <w:bookmarkStart w:id="257" w:name="_Toc234788085"/>
+      <w:bookmarkStart w:id="257" w:name="_Toc234828321"/>
       <w:r>
         <w:rPr>
           <w:rStyle w:val="SectionNumber"/>
@@ -39268,7 +39268,7 @@
         <w:pStyle w:val="Heading2"/>
       </w:pPr>
       <w:bookmarkStart w:id="258" w:name="connecting"/>
-      <w:bookmarkStart w:id="259" w:name="_Toc234788086"/>
+      <w:bookmarkStart w:id="259" w:name="_Toc234828322"/>
       <w:bookmarkEnd w:id="256"/>
       <w:r>
         <w:rPr>
@@ -39739,7 +39739,7 @@
         <w:pStyle w:val="Heading2"/>
       </w:pPr>
       <w:bookmarkStart w:id="260" w:name="the-command-families"/>
-      <w:bookmarkStart w:id="261" w:name="_Toc234788087"/>
+      <w:bookmarkStart w:id="261" w:name="_Toc234828323"/>
       <w:bookmarkEnd w:id="258"/>
       <w:r>
         <w:rPr>
@@ -40655,7 +40655,7 @@
         <w:pStyle w:val="Heading2"/>
       </w:pPr>
       <w:bookmarkStart w:id="262" w:name="worked-examples-real-requests"/>
-      <w:bookmarkStart w:id="263" w:name="_Toc234788088"/>
+      <w:bookmarkStart w:id="263" w:name="_Toc234828324"/>
       <w:bookmarkEnd w:id="260"/>
       <w:r>
         <w:rPr>
@@ -42558,7 +42558,7 @@
         <w:pStyle w:val="Heading2"/>
       </w:pPr>
       <w:bookmarkStart w:id="264" w:name="conventions-and-gotchas"/>
-      <w:bookmarkStart w:id="265" w:name="_Toc234788089"/>
+      <w:bookmarkStart w:id="265" w:name="_Toc234828325"/>
       <w:bookmarkEnd w:id="262"/>
       <w:r>
         <w:rPr>
@@ -42822,7 +42822,7 @@
         <w:pStyle w:val="Heading1"/>
       </w:pPr>
       <w:bookmarkStart w:id="266" w:name="tips-pitfalls-and-best-practices"/>
-      <w:bookmarkStart w:id="267" w:name="_Toc234788090"/>
+      <w:bookmarkStart w:id="267" w:name="_Toc234828326"/>
       <w:bookmarkEnd w:id="254"/>
       <w:bookmarkEnd w:id="264"/>
       <w:r>
@@ -43301,7 +43301,7 @@
         <w:pStyle w:val="Heading1"/>
       </w:pPr>
       <w:bookmarkStart w:id="268" w:name="appendix"/>
-      <w:bookmarkStart w:id="269" w:name="_Toc234788091"/>
+      <w:bookmarkStart w:id="269" w:name="_Toc234828327"/>
       <w:bookmarkEnd w:id="266"/>
       <w:r>
         <w:rPr>
@@ -43320,7 +43320,7 @@
         <w:pStyle w:val="Heading2"/>
       </w:pPr>
       <w:bookmarkStart w:id="270" w:name="a.-runtime-header-inventory"/>
-      <w:bookmarkStart w:id="271" w:name="_Toc234788092"/>
+      <w:bookmarkStart w:id="271" w:name="_Toc234828328"/>
       <w:r>
         <w:rPr>
           <w:rStyle w:val="SectionNumber"/>
@@ -43831,7 +43831,7 @@
         <w:pStyle w:val="Heading2"/>
       </w:pPr>
       <w:bookmarkStart w:id="272" w:name="b.-marker-quick-reference"/>
-      <w:bookmarkStart w:id="273" w:name="_Toc234788093"/>
+      <w:bookmarkStart w:id="273" w:name="_Toc234828329"/>
       <w:bookmarkEnd w:id="270"/>
       <w:r>
         <w:rPr>
@@ -43915,7 +43915,7 @@
         <w:pStyle w:val="Heading2"/>
       </w:pPr>
       <w:bookmarkStart w:id="274" w:name="c.-glossary"/>
-      <w:bookmarkStart w:id="275" w:name="_Toc234788094"/>
+      <w:bookmarkStart w:id="275" w:name="_Toc234828330"/>
       <w:bookmarkEnd w:id="272"/>
       <w:r>
         <w:rPr>
@@ -44341,7 +44341,7 @@
   <w:abstractNum w:abstractNumId="0" w15:restartNumberingAfterBreak="0">
     <w:nsid w:val="0000A990"/>
     <w:multiLevelType w:val="multilevel"/>
-    <w:tmpl w:val="94A64DDC"/>
+    <w:tmpl w:val="5924119E"/>
     <w:lvl w:ilvl="0">
       <w:numFmt w:val="bullet"/>
       <w:lvlText w:val=" "/>
@@ -44418,7 +44418,7 @@
   <w:abstractNum w:abstractNumId="1" w15:restartNumberingAfterBreak="0">
     <w:nsid w:val="0000A991"/>
     <w:multiLevelType w:val="multilevel"/>
-    <w:tmpl w:val="F94A2568"/>
+    <w:tmpl w:val="A2A63A88"/>
     <w:lvl w:ilvl="0">
       <w:numFmt w:val="bullet"/>
       <w:lvlText w:val="•"/>
@@ -44495,7 +44495,7 @@
   <w:abstractNum w:abstractNumId="2" w15:restartNumberingAfterBreak="0">
     <w:nsid w:val="00A99411"/>
     <w:multiLevelType w:val="multilevel"/>
-    <w:tmpl w:val="184202A2"/>
+    <w:tmpl w:val="E10C2334"/>
     <w:lvl w:ilvl="0">
       <w:start w:val="1"/>
       <w:numFmt w:val="decimal"/>
@@ -44578,31 +44578,31 @@
       </w:pPr>
     </w:lvl>
   </w:abstractNum>
-  <w:num w:numId="1" w16cid:durableId="137960512">
+  <w:num w:numId="1" w16cid:durableId="834800039">
     <w:abstractNumId w:val="0"/>
   </w:num>
-  <w:num w:numId="2" w16cid:durableId="435639801">
+  <w:num w:numId="2" w16cid:durableId="1554580864">
     <w:abstractNumId w:val="1"/>
   </w:num>
-  <w:num w:numId="3" w16cid:durableId="699277859">
+  <w:num w:numId="3" w16cid:durableId="258955837">
     <w:abstractNumId w:val="1"/>
   </w:num>
-  <w:num w:numId="4" w16cid:durableId="858588694">
+  <w:num w:numId="4" w16cid:durableId="1450124307">
     <w:abstractNumId w:val="1"/>
   </w:num>
-  <w:num w:numId="5" w16cid:durableId="1318534557">
+  <w:num w:numId="5" w16cid:durableId="91173337">
     <w:abstractNumId w:val="1"/>
   </w:num>
-  <w:num w:numId="6" w16cid:durableId="300119439">
+  <w:num w:numId="6" w16cid:durableId="71702057">
     <w:abstractNumId w:val="1"/>
   </w:num>
-  <w:num w:numId="7" w16cid:durableId="225603721">
+  <w:num w:numId="7" w16cid:durableId="101581296">
     <w:abstractNumId w:val="1"/>
   </w:num>
-  <w:num w:numId="8" w16cid:durableId="1577786322">
+  <w:num w:numId="8" w16cid:durableId="2123646173">
     <w:abstractNumId w:val="1"/>
   </w:num>
-  <w:num w:numId="9" w16cid:durableId="1082796719">
+  <w:num w:numId="9" w16cid:durableId="167257770">
     <w:abstractNumId w:val="2"/>
     <w:lvlOverride w:ilvl="0">
       <w:startOverride w:val="1"/>
@@ -44632,40 +44632,40 @@
       <w:startOverride w:val="1"/>
     </w:lvlOverride>
   </w:num>
-  <w:num w:numId="10" w16cid:durableId="1547569083">
+  <w:num w:numId="10" w16cid:durableId="719331225">
     <w:abstractNumId w:val="1"/>
   </w:num>
-  <w:num w:numId="11" w16cid:durableId="611018429">
+  <w:num w:numId="11" w16cid:durableId="461776153">
     <w:abstractNumId w:val="1"/>
   </w:num>
-  <w:num w:numId="12" w16cid:durableId="1090933003">
+  <w:num w:numId="12" w16cid:durableId="1500466320">
     <w:abstractNumId w:val="1"/>
   </w:num>
-  <w:num w:numId="13" w16cid:durableId="2075929268">
+  <w:num w:numId="13" w16cid:durableId="1051152730">
     <w:abstractNumId w:val="1"/>
   </w:num>
-  <w:num w:numId="14" w16cid:durableId="268660643">
+  <w:num w:numId="14" w16cid:durableId="446972924">
     <w:abstractNumId w:val="1"/>
   </w:num>
-  <w:num w:numId="15" w16cid:durableId="1891846544">
+  <w:num w:numId="15" w16cid:durableId="1127817403">
     <w:abstractNumId w:val="1"/>
   </w:num>
-  <w:num w:numId="16" w16cid:durableId="1487822725">
+  <w:num w:numId="16" w16cid:durableId="2009091917">
     <w:abstractNumId w:val="1"/>
   </w:num>
-  <w:num w:numId="17" w16cid:durableId="1289780856">
+  <w:num w:numId="17" w16cid:durableId="2134321646">
     <w:abstractNumId w:val="1"/>
   </w:num>
-  <w:num w:numId="18" w16cid:durableId="2129738613">
+  <w:num w:numId="18" w16cid:durableId="33775670">
     <w:abstractNumId w:val="1"/>
   </w:num>
-  <w:num w:numId="19" w16cid:durableId="153568242">
+  <w:num w:numId="19" w16cid:durableId="2083258821">
     <w:abstractNumId w:val="1"/>
   </w:num>
-  <w:num w:numId="20" w16cid:durableId="1639188230">
+  <w:num w:numId="20" w16cid:durableId="742918889">
     <w:abstractNumId w:val="1"/>
   </w:num>
-  <w:num w:numId="21" w16cid:durableId="1053042631">
+  <w:num w:numId="21" w16cid:durableId="1072432497">
     <w:abstractNumId w:val="2"/>
     <w:lvlOverride w:ilvl="0">
       <w:startOverride w:val="1"/>
@@ -44695,49 +44695,49 @@
       <w:startOverride w:val="1"/>
     </w:lvlOverride>
   </w:num>
-  <w:num w:numId="22" w16cid:durableId="173611169">
+  <w:num w:numId="22" w16cid:durableId="948009438">
     <w:abstractNumId w:val="1"/>
   </w:num>
-  <w:num w:numId="23" w16cid:durableId="691226334">
+  <w:num w:numId="23" w16cid:durableId="2026713916">
     <w:abstractNumId w:val="1"/>
   </w:num>
-  <w:num w:numId="24" w16cid:durableId="889537488">
+  <w:num w:numId="24" w16cid:durableId="1750997635">
     <w:abstractNumId w:val="1"/>
   </w:num>
-  <w:num w:numId="25" w16cid:durableId="1183130328">
+  <w:num w:numId="25" w16cid:durableId="1346319580">
     <w:abstractNumId w:val="1"/>
   </w:num>
-  <w:num w:numId="26" w16cid:durableId="1696154037">
+  <w:num w:numId="26" w16cid:durableId="1162502768">
     <w:abstractNumId w:val="1"/>
   </w:num>
-  <w:num w:numId="27" w16cid:durableId="1415861687">
+  <w:num w:numId="27" w16cid:durableId="1607732672">
     <w:abstractNumId w:val="1"/>
   </w:num>
-  <w:num w:numId="28" w16cid:durableId="1754740499">
+  <w:num w:numId="28" w16cid:durableId="1114715571">
     <w:abstractNumId w:val="1"/>
   </w:num>
-  <w:num w:numId="29" w16cid:durableId="956837102">
+  <w:num w:numId="29" w16cid:durableId="507519681">
     <w:abstractNumId w:val="1"/>
   </w:num>
-  <w:num w:numId="30" w16cid:durableId="1107043135">
+  <w:num w:numId="30" w16cid:durableId="732705673">
     <w:abstractNumId w:val="1"/>
   </w:num>
-  <w:num w:numId="31" w16cid:durableId="55669706">
+  <w:num w:numId="31" w16cid:durableId="1168255730">
     <w:abstractNumId w:val="1"/>
   </w:num>
-  <w:num w:numId="32" w16cid:durableId="481580859">
+  <w:num w:numId="32" w16cid:durableId="1226987875">
     <w:abstractNumId w:val="1"/>
   </w:num>
-  <w:num w:numId="33" w16cid:durableId="2088336239">
+  <w:num w:numId="33" w16cid:durableId="158694496">
     <w:abstractNumId w:val="1"/>
   </w:num>
-  <w:num w:numId="34" w16cid:durableId="375392413">
+  <w:num w:numId="34" w16cid:durableId="882329237">
     <w:abstractNumId w:val="1"/>
   </w:num>
-  <w:num w:numId="35" w16cid:durableId="1986009011">
+  <w:num w:numId="35" w16cid:durableId="1188986136">
     <w:abstractNumId w:val="1"/>
   </w:num>
-  <w:num w:numId="36" w16cid:durableId="629557978">
+  <w:num w:numId="36" w16cid:durableId="1918048314">
     <w:abstractNumId w:val="2"/>
     <w:lvlOverride w:ilvl="0">
       <w:startOverride w:val="1"/>
@@ -44767,10 +44767,10 @@
       <w:startOverride w:val="1"/>
     </w:lvlOverride>
   </w:num>
-  <w:num w:numId="37" w16cid:durableId="434517506">
+  <w:num w:numId="37" w16cid:durableId="1364328984">
     <w:abstractNumId w:val="1"/>
   </w:num>
-  <w:num w:numId="38" w16cid:durableId="503979484">
+  <w:num w:numId="38" w16cid:durableId="279535069">
     <w:abstractNumId w:val="2"/>
     <w:lvlOverride w:ilvl="0">
       <w:startOverride w:val="1"/>
@@ -44800,28 +44800,28 @@
       <w:startOverride w:val="1"/>
     </w:lvlOverride>
   </w:num>
-  <w:num w:numId="39" w16cid:durableId="1151603157">
+  <w:num w:numId="39" w16cid:durableId="1944650774">
     <w:abstractNumId w:val="1"/>
   </w:num>
-  <w:num w:numId="40" w16cid:durableId="1326975496">
+  <w:num w:numId="40" w16cid:durableId="1285310397">
     <w:abstractNumId w:val="1"/>
   </w:num>
-  <w:num w:numId="41" w16cid:durableId="1616868533">
+  <w:num w:numId="41" w16cid:durableId="1714815392">
     <w:abstractNumId w:val="1"/>
   </w:num>
-  <w:num w:numId="42" w16cid:durableId="511653014">
+  <w:num w:numId="42" w16cid:durableId="625283349">
     <w:abstractNumId w:val="1"/>
   </w:num>
-  <w:num w:numId="43" w16cid:durableId="102649099">
+  <w:num w:numId="43" w16cid:durableId="352654757">
     <w:abstractNumId w:val="1"/>
   </w:num>
-  <w:num w:numId="44" w16cid:durableId="117116184">
+  <w:num w:numId="44" w16cid:durableId="472529041">
     <w:abstractNumId w:val="1"/>
   </w:num>
-  <w:num w:numId="45" w16cid:durableId="1472559025">
+  <w:num w:numId="45" w16cid:durableId="780343268">
     <w:abstractNumId w:val="1"/>
   </w:num>
-  <w:num w:numId="46" w16cid:durableId="1688367210">
+  <w:num w:numId="46" w16cid:durableId="2119175801">
     <w:abstractNumId w:val="1"/>
   </w:num>
 </w:numbering>
@@ -45877,7 +45877,7 @@
     <w:next w:val="Normal"/>
     <w:autoRedefine/>
     <w:uiPriority w:val="39"/>
-    <w:rsid w:val="00ED636F"/>
+    <w:rsid w:val="00E93BDE"/>
     <w:pPr>
       <w:spacing w:after="100"/>
     </w:pPr>
@@ -45888,7 +45888,7 @@
     <w:next w:val="Normal"/>
     <w:autoRedefine/>
     <w:uiPriority w:val="39"/>
-    <w:rsid w:val="00ED636F"/>
+    <w:rsid w:val="00E93BDE"/>
     <w:pPr>
       <w:spacing w:after="100"/>
       <w:ind w:left="240"/>
@@ -45901,7 +45901,7 @@
     <w:autoRedefine/>
     <w:uiPriority w:val="39"/>
     <w:unhideWhenUsed/>
-    <w:rsid w:val="00ED636F"/>
+    <w:rsid w:val="00E93BDE"/>
     <w:pPr>
       <w:spacing w:after="100" w:line="278" w:lineRule="auto"/>
       <w:ind w:left="480"/>
@@ -45919,7 +45919,7 @@
     <w:autoRedefine/>
     <w:uiPriority w:val="39"/>
     <w:unhideWhenUsed/>
-    <w:rsid w:val="00ED636F"/>
+    <w:rsid w:val="00E93BDE"/>
     <w:pPr>
       <w:spacing w:after="100" w:line="278" w:lineRule="auto"/>
       <w:ind w:left="720"/>
@@ -45937,7 +45937,7 @@
     <w:autoRedefine/>
     <w:uiPriority w:val="39"/>
     <w:unhideWhenUsed/>
-    <w:rsid w:val="00ED636F"/>
+    <w:rsid w:val="00E93BDE"/>
     <w:pPr>
       <w:spacing w:after="100" w:line="278" w:lineRule="auto"/>
       <w:ind w:left="960"/>
@@ -45955,7 +45955,7 @@
     <w:autoRedefine/>
     <w:uiPriority w:val="39"/>
     <w:unhideWhenUsed/>
-    <w:rsid w:val="00ED636F"/>
+    <w:rsid w:val="00E93BDE"/>
     <w:pPr>
       <w:spacing w:after="100" w:line="278" w:lineRule="auto"/>
       <w:ind w:left="1200"/>
@@ -45973,7 +45973,7 @@
     <w:autoRedefine/>
     <w:uiPriority w:val="39"/>
     <w:unhideWhenUsed/>
-    <w:rsid w:val="00ED636F"/>
+    <w:rsid w:val="00E93BDE"/>
     <w:pPr>
       <w:spacing w:after="100" w:line="278" w:lineRule="auto"/>
       <w:ind w:left="1440"/>
@@ -45991,7 +45991,7 @@
     <w:autoRedefine/>
     <w:uiPriority w:val="39"/>
     <w:unhideWhenUsed/>
-    <w:rsid w:val="00ED636F"/>
+    <w:rsid w:val="00E93BDE"/>
     <w:pPr>
       <w:spacing w:after="100" w:line="278" w:lineRule="auto"/>
       <w:ind w:left="1680"/>
@@ -46009,7 +46009,7 @@
     <w:autoRedefine/>
     <w:uiPriority w:val="39"/>
     <w:unhideWhenUsed/>
-    <w:rsid w:val="00ED636F"/>
+    <w:rsid w:val="00E93BDE"/>
     <w:pPr>
       <w:spacing w:after="100" w:line="278" w:lineRule="auto"/>
       <w:ind w:left="1920"/>
@@ -46026,7 +46026,7 @@
     <w:uiPriority w:val="99"/>
     <w:semiHidden/>
     <w:unhideWhenUsed/>
-    <w:rsid w:val="00ED636F"/>
+    <w:rsid w:val="00E93BDE"/>
     <w:rPr>
       <w:color w:val="605E5C"/>
       <w:shd w:val="clear" w:color="auto" w:fill="E1DFDD"/>

</xml_diff>

<commit_message>
docs(manual): regenerate docx (single-rail diagram icon, caption fix)
Co-Authored-By: Claude Fable 5 <noreply@anthropic.com>
</commit_message>
<xml_diff>
--- a/docs/manual/ClassBuilder_Manual.docx
+++ b/docs/manual/ClassBuilder_Manual.docx
@@ -34,7 +34,7 @@
           <w:sz w:val="24"/>
           <w:szCs w:val="24"/>
         </w:rPr>
-        <w:id w:val="1365096062"/>
+        <w:id w:val="-1994779833"/>
         <w:docPartObj>
           <w:docPartGallery w:val="Table of Contents"/>
           <w:docPartUnique/>
@@ -74,7 +74,7 @@
           <w:r>
             <w:fldChar w:fldCharType="separate"/>
           </w:r>
-          <w:hyperlink w:anchor="_Toc234841623" w:history="1">
+          <w:hyperlink w:anchor="_Toc234848147" w:history="1">
             <w:r>
               <w:rPr>
                 <w:rStyle w:val="Hyperlink"/>
@@ -118,7 +118,7 @@
                 <w:noProof/>
                 <w:webHidden/>
               </w:rPr>
-              <w:instrText xml:space="preserve"> PAGEREF _Toc234841623 \h </w:instrText>
+              <w:instrText xml:space="preserve"> PAGEREF _Toc234848147 \h </w:instrText>
             </w:r>
             <w:r>
               <w:rPr>
@@ -164,7 +164,7 @@
               <w14:ligatures w14:val="standardContextual"/>
             </w:rPr>
           </w:pPr>
-          <w:hyperlink w:anchor="_Toc234841624" w:history="1">
+          <w:hyperlink w:anchor="_Toc234848148" w:history="1">
             <w:r>
               <w:rPr>
                 <w:rStyle w:val="Hyperlink"/>
@@ -208,7 +208,7 @@
                 <w:noProof/>
                 <w:webHidden/>
               </w:rPr>
-              <w:instrText xml:space="preserve"> PAGEREF _Toc234841624 \h </w:instrText>
+              <w:instrText xml:space="preserve"> PAGEREF _Toc234848148 \h </w:instrText>
             </w:r>
             <w:r>
               <w:rPr>
@@ -254,7 +254,7 @@
               <w14:ligatures w14:val="standardContextual"/>
             </w:rPr>
           </w:pPr>
-          <w:hyperlink w:anchor="_Toc234841625" w:history="1">
+          <w:hyperlink w:anchor="_Toc234848149" w:history="1">
             <w:r>
               <w:rPr>
                 <w:rStyle w:val="Hyperlink"/>
@@ -298,7 +298,7 @@
                 <w:noProof/>
                 <w:webHidden/>
               </w:rPr>
-              <w:instrText xml:space="preserve"> PAGEREF _Toc234841625 \h </w:instrText>
+              <w:instrText xml:space="preserve"> PAGEREF _Toc234848149 \h </w:instrText>
             </w:r>
             <w:r>
               <w:rPr>
@@ -344,7 +344,7 @@
               <w14:ligatures w14:val="standardContextual"/>
             </w:rPr>
           </w:pPr>
-          <w:hyperlink w:anchor="_Toc234841626" w:history="1">
+          <w:hyperlink w:anchor="_Toc234848150" w:history="1">
             <w:r>
               <w:rPr>
                 <w:rStyle w:val="Hyperlink"/>
@@ -388,7 +388,7 @@
                 <w:noProof/>
                 <w:webHidden/>
               </w:rPr>
-              <w:instrText xml:space="preserve"> PAGEREF _Toc234841626 \h </w:instrText>
+              <w:instrText xml:space="preserve"> PAGEREF _Toc234848150 \h </w:instrText>
             </w:r>
             <w:r>
               <w:rPr>
@@ -434,7 +434,7 @@
               <w14:ligatures w14:val="standardContextual"/>
             </w:rPr>
           </w:pPr>
-          <w:hyperlink w:anchor="_Toc234841627" w:history="1">
+          <w:hyperlink w:anchor="_Toc234848151" w:history="1">
             <w:r>
               <w:rPr>
                 <w:rStyle w:val="Hyperlink"/>
@@ -478,7 +478,7 @@
                 <w:noProof/>
                 <w:webHidden/>
               </w:rPr>
-              <w:instrText xml:space="preserve"> PAGEREF _Toc234841627 \h </w:instrText>
+              <w:instrText xml:space="preserve"> PAGEREF _Toc234848151 \h </w:instrText>
             </w:r>
             <w:r>
               <w:rPr>
@@ -524,7 +524,7 @@
               <w14:ligatures w14:val="standardContextual"/>
             </w:rPr>
           </w:pPr>
-          <w:hyperlink w:anchor="_Toc234841628" w:history="1">
+          <w:hyperlink w:anchor="_Toc234848152" w:history="1">
             <w:r>
               <w:rPr>
                 <w:rStyle w:val="Hyperlink"/>
@@ -568,7 +568,7 @@
                 <w:noProof/>
                 <w:webHidden/>
               </w:rPr>
-              <w:instrText xml:space="preserve"> PAGEREF _Toc234841628 \h </w:instrText>
+              <w:instrText xml:space="preserve"> PAGEREF _Toc234848152 \h </w:instrText>
             </w:r>
             <w:r>
               <w:rPr>
@@ -614,7 +614,7 @@
               <w14:ligatures w14:val="standardContextual"/>
             </w:rPr>
           </w:pPr>
-          <w:hyperlink w:anchor="_Toc234841629" w:history="1">
+          <w:hyperlink w:anchor="_Toc234848153" w:history="1">
             <w:r>
               <w:rPr>
                 <w:rStyle w:val="Hyperlink"/>
@@ -658,7 +658,7 @@
                 <w:noProof/>
                 <w:webHidden/>
               </w:rPr>
-              <w:instrText xml:space="preserve"> PAGEREF _Toc234841629 \h </w:instrText>
+              <w:instrText xml:space="preserve"> PAGEREF _Toc234848153 \h </w:instrText>
             </w:r>
             <w:r>
               <w:rPr>
@@ -704,7 +704,7 @@
               <w14:ligatures w14:val="standardContextual"/>
             </w:rPr>
           </w:pPr>
-          <w:hyperlink w:anchor="_Toc234841630" w:history="1">
+          <w:hyperlink w:anchor="_Toc234848154" w:history="1">
             <w:r>
               <w:rPr>
                 <w:rStyle w:val="Hyperlink"/>
@@ -748,7 +748,7 @@
                 <w:noProof/>
                 <w:webHidden/>
               </w:rPr>
-              <w:instrText xml:space="preserve"> PAGEREF _Toc234841630 \h </w:instrText>
+              <w:instrText xml:space="preserve"> PAGEREF _Toc234848154 \h </w:instrText>
             </w:r>
             <w:r>
               <w:rPr>
@@ -794,7 +794,7 @@
               <w14:ligatures w14:val="standardContextual"/>
             </w:rPr>
           </w:pPr>
-          <w:hyperlink w:anchor="_Toc234841631" w:history="1">
+          <w:hyperlink w:anchor="_Toc234848155" w:history="1">
             <w:r>
               <w:rPr>
                 <w:rStyle w:val="Hyperlink"/>
@@ -838,7 +838,7 @@
                 <w:noProof/>
                 <w:webHidden/>
               </w:rPr>
-              <w:instrText xml:space="preserve"> PAGEREF _Toc234841631 \h </w:instrText>
+              <w:instrText xml:space="preserve"> PAGEREF _Toc234848155 \h </w:instrText>
             </w:r>
             <w:r>
               <w:rPr>
@@ -884,7 +884,7 @@
               <w14:ligatures w14:val="standardContextual"/>
             </w:rPr>
           </w:pPr>
-          <w:hyperlink w:anchor="_Toc234841632" w:history="1">
+          <w:hyperlink w:anchor="_Toc234848156" w:history="1">
             <w:r>
               <w:rPr>
                 <w:rStyle w:val="Hyperlink"/>
@@ -928,7 +928,7 @@
                 <w:noProof/>
                 <w:webHidden/>
               </w:rPr>
-              <w:instrText xml:space="preserve"> PAGEREF _Toc234841632 \h </w:instrText>
+              <w:instrText xml:space="preserve"> PAGEREF _Toc234848156 \h </w:instrText>
             </w:r>
             <w:r>
               <w:rPr>
@@ -974,7 +974,7 @@
               <w14:ligatures w14:val="standardContextual"/>
             </w:rPr>
           </w:pPr>
-          <w:hyperlink w:anchor="_Toc234841633" w:history="1">
+          <w:hyperlink w:anchor="_Toc234848157" w:history="1">
             <w:r>
               <w:rPr>
                 <w:rStyle w:val="Hyperlink"/>
@@ -1018,7 +1018,7 @@
                 <w:noProof/>
                 <w:webHidden/>
               </w:rPr>
-              <w:instrText xml:space="preserve"> PAGEREF _Toc234841633 \h </w:instrText>
+              <w:instrText xml:space="preserve"> PAGEREF _Toc234848157 \h </w:instrText>
             </w:r>
             <w:r>
               <w:rPr>
@@ -1064,7 +1064,7 @@
               <w14:ligatures w14:val="standardContextual"/>
             </w:rPr>
           </w:pPr>
-          <w:hyperlink w:anchor="_Toc234841634" w:history="1">
+          <w:hyperlink w:anchor="_Toc234848158" w:history="1">
             <w:r>
               <w:rPr>
                 <w:rStyle w:val="Hyperlink"/>
@@ -1108,7 +1108,7 @@
                 <w:noProof/>
                 <w:webHidden/>
               </w:rPr>
-              <w:instrText xml:space="preserve"> PAGEREF _Toc234841634 \h </w:instrText>
+              <w:instrText xml:space="preserve"> PAGEREF _Toc234848158 \h </w:instrText>
             </w:r>
             <w:r>
               <w:rPr>
@@ -1154,7 +1154,7 @@
               <w14:ligatures w14:val="standardContextual"/>
             </w:rPr>
           </w:pPr>
-          <w:hyperlink w:anchor="_Toc234841635" w:history="1">
+          <w:hyperlink w:anchor="_Toc234848159" w:history="1">
             <w:r>
               <w:rPr>
                 <w:rStyle w:val="Hyperlink"/>
@@ -1198,7 +1198,7 @@
                 <w:noProof/>
                 <w:webHidden/>
               </w:rPr>
-              <w:instrText xml:space="preserve"> PAGEREF _Toc234841635 \h </w:instrText>
+              <w:instrText xml:space="preserve"> PAGEREF _Toc234848159 \h </w:instrText>
             </w:r>
             <w:r>
               <w:rPr>
@@ -1244,7 +1244,7 @@
               <w14:ligatures w14:val="standardContextual"/>
             </w:rPr>
           </w:pPr>
-          <w:hyperlink w:anchor="_Toc234841636" w:history="1">
+          <w:hyperlink w:anchor="_Toc234848160" w:history="1">
             <w:r>
               <w:rPr>
                 <w:rStyle w:val="Hyperlink"/>
@@ -1288,7 +1288,7 @@
                 <w:noProof/>
                 <w:webHidden/>
               </w:rPr>
-              <w:instrText xml:space="preserve"> PAGEREF _Toc234841636 \h </w:instrText>
+              <w:instrText xml:space="preserve"> PAGEREF _Toc234848160 \h </w:instrText>
             </w:r>
             <w:r>
               <w:rPr>
@@ -1334,7 +1334,7 @@
               <w14:ligatures w14:val="standardContextual"/>
             </w:rPr>
           </w:pPr>
-          <w:hyperlink w:anchor="_Toc234841637" w:history="1">
+          <w:hyperlink w:anchor="_Toc234848161" w:history="1">
             <w:r>
               <w:rPr>
                 <w:rStyle w:val="Hyperlink"/>
@@ -1378,7 +1378,7 @@
                 <w:noProof/>
                 <w:webHidden/>
               </w:rPr>
-              <w:instrText xml:space="preserve"> PAGEREF _Toc234841637 \h </w:instrText>
+              <w:instrText xml:space="preserve"> PAGEREF _Toc234848161 \h </w:instrText>
             </w:r>
             <w:r>
               <w:rPr>
@@ -1424,7 +1424,7 @@
               <w14:ligatures w14:val="standardContextual"/>
             </w:rPr>
           </w:pPr>
-          <w:hyperlink w:anchor="_Toc234841638" w:history="1">
+          <w:hyperlink w:anchor="_Toc234848162" w:history="1">
             <w:r>
               <w:rPr>
                 <w:rStyle w:val="Hyperlink"/>
@@ -1468,7 +1468,7 @@
                 <w:noProof/>
                 <w:webHidden/>
               </w:rPr>
-              <w:instrText xml:space="preserve"> PAGEREF _Toc234841638 \h </w:instrText>
+              <w:instrText xml:space="preserve"> PAGEREF _Toc234848162 \h </w:instrText>
             </w:r>
             <w:r>
               <w:rPr>
@@ -1514,7 +1514,7 @@
               <w14:ligatures w14:val="standardContextual"/>
             </w:rPr>
           </w:pPr>
-          <w:hyperlink w:anchor="_Toc234841639" w:history="1">
+          <w:hyperlink w:anchor="_Toc234848163" w:history="1">
             <w:r>
               <w:rPr>
                 <w:rStyle w:val="Hyperlink"/>
@@ -1558,7 +1558,7 @@
                 <w:noProof/>
                 <w:webHidden/>
               </w:rPr>
-              <w:instrText xml:space="preserve"> PAGEREF _Toc234841639 \h </w:instrText>
+              <w:instrText xml:space="preserve"> PAGEREF _Toc234848163 \h </w:instrText>
             </w:r>
             <w:r>
               <w:rPr>
@@ -1604,7 +1604,7 @@
               <w14:ligatures w14:val="standardContextual"/>
             </w:rPr>
           </w:pPr>
-          <w:hyperlink w:anchor="_Toc234841640" w:history="1">
+          <w:hyperlink w:anchor="_Toc234848164" w:history="1">
             <w:r>
               <w:rPr>
                 <w:rStyle w:val="Hyperlink"/>
@@ -1648,7 +1648,7 @@
                 <w:noProof/>
                 <w:webHidden/>
               </w:rPr>
-              <w:instrText xml:space="preserve"> PAGEREF _Toc234841640 \h </w:instrText>
+              <w:instrText xml:space="preserve"> PAGEREF _Toc234848164 \h </w:instrText>
             </w:r>
             <w:r>
               <w:rPr>
@@ -1694,7 +1694,7 @@
               <w14:ligatures w14:val="standardContextual"/>
             </w:rPr>
           </w:pPr>
-          <w:hyperlink w:anchor="_Toc234841641" w:history="1">
+          <w:hyperlink w:anchor="_Toc234848165" w:history="1">
             <w:r>
               <w:rPr>
                 <w:rStyle w:val="Hyperlink"/>
@@ -1738,7 +1738,7 @@
                 <w:noProof/>
                 <w:webHidden/>
               </w:rPr>
-              <w:instrText xml:space="preserve"> PAGEREF _Toc234841641 \h </w:instrText>
+              <w:instrText xml:space="preserve"> PAGEREF _Toc234848165 \h </w:instrText>
             </w:r>
             <w:r>
               <w:rPr>
@@ -1784,7 +1784,7 @@
               <w14:ligatures w14:val="standardContextual"/>
             </w:rPr>
           </w:pPr>
-          <w:hyperlink w:anchor="_Toc234841642" w:history="1">
+          <w:hyperlink w:anchor="_Toc234848166" w:history="1">
             <w:r>
               <w:rPr>
                 <w:rStyle w:val="Hyperlink"/>
@@ -1828,7 +1828,7 @@
                 <w:noProof/>
                 <w:webHidden/>
               </w:rPr>
-              <w:instrText xml:space="preserve"> PAGEREF _Toc234841642 \h </w:instrText>
+              <w:instrText xml:space="preserve"> PAGEREF _Toc234848166 \h </w:instrText>
             </w:r>
             <w:r>
               <w:rPr>
@@ -1874,7 +1874,7 @@
               <w14:ligatures w14:val="standardContextual"/>
             </w:rPr>
           </w:pPr>
-          <w:hyperlink w:anchor="_Toc234841643" w:history="1">
+          <w:hyperlink w:anchor="_Toc234848167" w:history="1">
             <w:r>
               <w:rPr>
                 <w:rStyle w:val="Hyperlink"/>
@@ -1918,7 +1918,7 @@
                 <w:noProof/>
                 <w:webHidden/>
               </w:rPr>
-              <w:instrText xml:space="preserve"> PAGEREF _Toc234841643 \h </w:instrText>
+              <w:instrText xml:space="preserve"> PAGEREF _Toc234848167 \h </w:instrText>
             </w:r>
             <w:r>
               <w:rPr>
@@ -1964,7 +1964,7 @@
               <w14:ligatures w14:val="standardContextual"/>
             </w:rPr>
           </w:pPr>
-          <w:hyperlink w:anchor="_Toc234841644" w:history="1">
+          <w:hyperlink w:anchor="_Toc234848168" w:history="1">
             <w:r>
               <w:rPr>
                 <w:rStyle w:val="Hyperlink"/>
@@ -2008,7 +2008,7 @@
                 <w:noProof/>
                 <w:webHidden/>
               </w:rPr>
-              <w:instrText xml:space="preserve"> PAGEREF _Toc234841644 \h </w:instrText>
+              <w:instrText xml:space="preserve"> PAGEREF _Toc234848168 \h </w:instrText>
             </w:r>
             <w:r>
               <w:rPr>
@@ -2054,7 +2054,7 @@
               <w14:ligatures w14:val="standardContextual"/>
             </w:rPr>
           </w:pPr>
-          <w:hyperlink w:anchor="_Toc234841645" w:history="1">
+          <w:hyperlink w:anchor="_Toc234848169" w:history="1">
             <w:r>
               <w:rPr>
                 <w:rStyle w:val="Hyperlink"/>
@@ -2098,7 +2098,7 @@
                 <w:noProof/>
                 <w:webHidden/>
               </w:rPr>
-              <w:instrText xml:space="preserve"> PAGEREF _Toc234841645 \h </w:instrText>
+              <w:instrText xml:space="preserve"> PAGEREF _Toc234848169 \h </w:instrText>
             </w:r>
             <w:r>
               <w:rPr>
@@ -2144,7 +2144,7 @@
               <w14:ligatures w14:val="standardContextual"/>
             </w:rPr>
           </w:pPr>
-          <w:hyperlink w:anchor="_Toc234841646" w:history="1">
+          <w:hyperlink w:anchor="_Toc234848170" w:history="1">
             <w:r>
               <w:rPr>
                 <w:rStyle w:val="Hyperlink"/>
@@ -2188,7 +2188,7 @@
                 <w:noProof/>
                 <w:webHidden/>
               </w:rPr>
-              <w:instrText xml:space="preserve"> PAGEREF _Toc234841646 \h </w:instrText>
+              <w:instrText xml:space="preserve"> PAGEREF _Toc234848170 \h </w:instrText>
             </w:r>
             <w:r>
               <w:rPr>
@@ -2234,7 +2234,7 @@
               <w14:ligatures w14:val="standardContextual"/>
             </w:rPr>
           </w:pPr>
-          <w:hyperlink w:anchor="_Toc234841647" w:history="1">
+          <w:hyperlink w:anchor="_Toc234848171" w:history="1">
             <w:r>
               <w:rPr>
                 <w:rStyle w:val="Hyperlink"/>
@@ -2278,7 +2278,7 @@
                 <w:noProof/>
                 <w:webHidden/>
               </w:rPr>
-              <w:instrText xml:space="preserve"> PAGEREF _Toc234841647 \h </w:instrText>
+              <w:instrText xml:space="preserve"> PAGEREF _Toc234848171 \h </w:instrText>
             </w:r>
             <w:r>
               <w:rPr>
@@ -2324,7 +2324,7 @@
               <w14:ligatures w14:val="standardContextual"/>
             </w:rPr>
           </w:pPr>
-          <w:hyperlink w:anchor="_Toc234841648" w:history="1">
+          <w:hyperlink w:anchor="_Toc234848172" w:history="1">
             <w:r>
               <w:rPr>
                 <w:rStyle w:val="Hyperlink"/>
@@ -2368,7 +2368,7 @@
                 <w:noProof/>
                 <w:webHidden/>
               </w:rPr>
-              <w:instrText xml:space="preserve"> PAGEREF _Toc234841648 \h </w:instrText>
+              <w:instrText xml:space="preserve"> PAGEREF _Toc234848172 \h </w:instrText>
             </w:r>
             <w:r>
               <w:rPr>
@@ -2414,7 +2414,7 @@
               <w14:ligatures w14:val="standardContextual"/>
             </w:rPr>
           </w:pPr>
-          <w:hyperlink w:anchor="_Toc234841649" w:history="1">
+          <w:hyperlink w:anchor="_Toc234848173" w:history="1">
             <w:r>
               <w:rPr>
                 <w:rStyle w:val="Hyperlink"/>
@@ -2458,7 +2458,7 @@
                 <w:noProof/>
                 <w:webHidden/>
               </w:rPr>
-              <w:instrText xml:space="preserve"> PAGEREF _Toc234841649 \h </w:instrText>
+              <w:instrText xml:space="preserve"> PAGEREF _Toc234848173 \h </w:instrText>
             </w:r>
             <w:r>
               <w:rPr>
@@ -2504,7 +2504,7 @@
               <w14:ligatures w14:val="standardContextual"/>
             </w:rPr>
           </w:pPr>
-          <w:hyperlink w:anchor="_Toc234841650" w:history="1">
+          <w:hyperlink w:anchor="_Toc234848174" w:history="1">
             <w:r>
               <w:rPr>
                 <w:rStyle w:val="Hyperlink"/>
@@ -2548,7 +2548,7 @@
                 <w:noProof/>
                 <w:webHidden/>
               </w:rPr>
-              <w:instrText xml:space="preserve"> PAGEREF _Toc234841650 \h </w:instrText>
+              <w:instrText xml:space="preserve"> PAGEREF _Toc234848174 \h </w:instrText>
             </w:r>
             <w:r>
               <w:rPr>
@@ -2594,7 +2594,7 @@
               <w14:ligatures w14:val="standardContextual"/>
             </w:rPr>
           </w:pPr>
-          <w:hyperlink w:anchor="_Toc234841651" w:history="1">
+          <w:hyperlink w:anchor="_Toc234848175" w:history="1">
             <w:r>
               <w:rPr>
                 <w:rStyle w:val="Hyperlink"/>
@@ -2638,7 +2638,7 @@
                 <w:noProof/>
                 <w:webHidden/>
               </w:rPr>
-              <w:instrText xml:space="preserve"> PAGEREF _Toc234841651 \h </w:instrText>
+              <w:instrText xml:space="preserve"> PAGEREF _Toc234848175 \h </w:instrText>
             </w:r>
             <w:r>
               <w:rPr>
@@ -2684,7 +2684,7 @@
               <w14:ligatures w14:val="standardContextual"/>
             </w:rPr>
           </w:pPr>
-          <w:hyperlink w:anchor="_Toc234841652" w:history="1">
+          <w:hyperlink w:anchor="_Toc234848176" w:history="1">
             <w:r>
               <w:rPr>
                 <w:rStyle w:val="Hyperlink"/>
@@ -2728,7 +2728,7 @@
                 <w:noProof/>
                 <w:webHidden/>
               </w:rPr>
-              <w:instrText xml:space="preserve"> PAGEREF _Toc234841652 \h </w:instrText>
+              <w:instrText xml:space="preserve"> PAGEREF _Toc234848176 \h </w:instrText>
             </w:r>
             <w:r>
               <w:rPr>
@@ -2774,7 +2774,7 @@
               <w14:ligatures w14:val="standardContextual"/>
             </w:rPr>
           </w:pPr>
-          <w:hyperlink w:anchor="_Toc234841653" w:history="1">
+          <w:hyperlink w:anchor="_Toc234848177" w:history="1">
             <w:r>
               <w:rPr>
                 <w:rStyle w:val="Hyperlink"/>
@@ -2818,7 +2818,7 @@
                 <w:noProof/>
                 <w:webHidden/>
               </w:rPr>
-              <w:instrText xml:space="preserve"> PAGEREF _Toc234841653 \h </w:instrText>
+              <w:instrText xml:space="preserve"> PAGEREF _Toc234848177 \h </w:instrText>
             </w:r>
             <w:r>
               <w:rPr>
@@ -2864,7 +2864,7 @@
               <w14:ligatures w14:val="standardContextual"/>
             </w:rPr>
           </w:pPr>
-          <w:hyperlink w:anchor="_Toc234841654" w:history="1">
+          <w:hyperlink w:anchor="_Toc234848178" w:history="1">
             <w:r>
               <w:rPr>
                 <w:rStyle w:val="Hyperlink"/>
@@ -2908,7 +2908,7 @@
                 <w:noProof/>
                 <w:webHidden/>
               </w:rPr>
-              <w:instrText xml:space="preserve"> PAGEREF _Toc234841654 \h </w:instrText>
+              <w:instrText xml:space="preserve"> PAGEREF _Toc234848178 \h </w:instrText>
             </w:r>
             <w:r>
               <w:rPr>
@@ -2954,7 +2954,7 @@
               <w14:ligatures w14:val="standardContextual"/>
             </w:rPr>
           </w:pPr>
-          <w:hyperlink w:anchor="_Toc234841655" w:history="1">
+          <w:hyperlink w:anchor="_Toc234848179" w:history="1">
             <w:r>
               <w:rPr>
                 <w:rStyle w:val="Hyperlink"/>
@@ -2998,7 +2998,7 @@
                 <w:noProof/>
                 <w:webHidden/>
               </w:rPr>
-              <w:instrText xml:space="preserve"> PAGEREF _Toc234841655 \h </w:instrText>
+              <w:instrText xml:space="preserve"> PAGEREF _Toc234848179 \h </w:instrText>
             </w:r>
             <w:r>
               <w:rPr>
@@ -3044,7 +3044,7 @@
               <w14:ligatures w14:val="standardContextual"/>
             </w:rPr>
           </w:pPr>
-          <w:hyperlink w:anchor="_Toc234841656" w:history="1">
+          <w:hyperlink w:anchor="_Toc234848180" w:history="1">
             <w:r>
               <w:rPr>
                 <w:rStyle w:val="Hyperlink"/>
@@ -3088,7 +3088,7 @@
                 <w:noProof/>
                 <w:webHidden/>
               </w:rPr>
-              <w:instrText xml:space="preserve"> PAGEREF _Toc234841656 \h </w:instrText>
+              <w:instrText xml:space="preserve"> PAGEREF _Toc234848180 \h </w:instrText>
             </w:r>
             <w:r>
               <w:rPr>
@@ -3134,7 +3134,7 @@
               <w14:ligatures w14:val="standardContextual"/>
             </w:rPr>
           </w:pPr>
-          <w:hyperlink w:anchor="_Toc234841657" w:history="1">
+          <w:hyperlink w:anchor="_Toc234848181" w:history="1">
             <w:r>
               <w:rPr>
                 <w:rStyle w:val="Hyperlink"/>
@@ -3178,7 +3178,7 @@
                 <w:noProof/>
                 <w:webHidden/>
               </w:rPr>
-              <w:instrText xml:space="preserve"> PAGEREF _Toc234841657 \h </w:instrText>
+              <w:instrText xml:space="preserve"> PAGEREF _Toc234848181 \h </w:instrText>
             </w:r>
             <w:r>
               <w:rPr>
@@ -3224,7 +3224,7 @@
               <w14:ligatures w14:val="standardContextual"/>
             </w:rPr>
           </w:pPr>
-          <w:hyperlink w:anchor="_Toc234841658" w:history="1">
+          <w:hyperlink w:anchor="_Toc234848182" w:history="1">
             <w:r>
               <w:rPr>
                 <w:rStyle w:val="Hyperlink"/>
@@ -3268,7 +3268,7 @@
                 <w:noProof/>
                 <w:webHidden/>
               </w:rPr>
-              <w:instrText xml:space="preserve"> PAGEREF _Toc234841658 \h </w:instrText>
+              <w:instrText xml:space="preserve"> PAGEREF _Toc234848182 \h </w:instrText>
             </w:r>
             <w:r>
               <w:rPr>
@@ -3314,7 +3314,7 @@
               <w14:ligatures w14:val="standardContextual"/>
             </w:rPr>
           </w:pPr>
-          <w:hyperlink w:anchor="_Toc234841659" w:history="1">
+          <w:hyperlink w:anchor="_Toc234848183" w:history="1">
             <w:r>
               <w:rPr>
                 <w:rStyle w:val="Hyperlink"/>
@@ -3358,7 +3358,7 @@
                 <w:noProof/>
                 <w:webHidden/>
               </w:rPr>
-              <w:instrText xml:space="preserve"> PAGEREF _Toc234841659 \h </w:instrText>
+              <w:instrText xml:space="preserve"> PAGEREF _Toc234848183 \h </w:instrText>
             </w:r>
             <w:r>
               <w:rPr>
@@ -3404,7 +3404,7 @@
               <w14:ligatures w14:val="standardContextual"/>
             </w:rPr>
           </w:pPr>
-          <w:hyperlink w:anchor="_Toc234841660" w:history="1">
+          <w:hyperlink w:anchor="_Toc234848184" w:history="1">
             <w:r>
               <w:rPr>
                 <w:rStyle w:val="Hyperlink"/>
@@ -3448,7 +3448,7 @@
                 <w:noProof/>
                 <w:webHidden/>
               </w:rPr>
-              <w:instrText xml:space="preserve"> PAGEREF _Toc234841660 \h </w:instrText>
+              <w:instrText xml:space="preserve"> PAGEREF _Toc234848184 \h </w:instrText>
             </w:r>
             <w:r>
               <w:rPr>
@@ -3494,7 +3494,7 @@
               <w14:ligatures w14:val="standardContextual"/>
             </w:rPr>
           </w:pPr>
-          <w:hyperlink w:anchor="_Toc234841661" w:history="1">
+          <w:hyperlink w:anchor="_Toc234848185" w:history="1">
             <w:r>
               <w:rPr>
                 <w:rStyle w:val="Hyperlink"/>
@@ -3538,7 +3538,7 @@
                 <w:noProof/>
                 <w:webHidden/>
               </w:rPr>
-              <w:instrText xml:space="preserve"> PAGEREF _Toc234841661 \h </w:instrText>
+              <w:instrText xml:space="preserve"> PAGEREF _Toc234848185 \h </w:instrText>
             </w:r>
             <w:r>
               <w:rPr>
@@ -3584,7 +3584,7 @@
               <w14:ligatures w14:val="standardContextual"/>
             </w:rPr>
           </w:pPr>
-          <w:hyperlink w:anchor="_Toc234841662" w:history="1">
+          <w:hyperlink w:anchor="_Toc234848186" w:history="1">
             <w:r>
               <w:rPr>
                 <w:rStyle w:val="Hyperlink"/>
@@ -3628,7 +3628,7 @@
                 <w:noProof/>
                 <w:webHidden/>
               </w:rPr>
-              <w:instrText xml:space="preserve"> PAGEREF _Toc234841662 \h </w:instrText>
+              <w:instrText xml:space="preserve"> PAGEREF _Toc234848186 \h </w:instrText>
             </w:r>
             <w:r>
               <w:rPr>
@@ -3674,7 +3674,7 @@
               <w14:ligatures w14:val="standardContextual"/>
             </w:rPr>
           </w:pPr>
-          <w:hyperlink w:anchor="_Toc234841663" w:history="1">
+          <w:hyperlink w:anchor="_Toc234848187" w:history="1">
             <w:r>
               <w:rPr>
                 <w:rStyle w:val="Hyperlink"/>
@@ -3718,7 +3718,7 @@
                 <w:noProof/>
                 <w:webHidden/>
               </w:rPr>
-              <w:instrText xml:space="preserve"> PAGEREF _Toc234841663 \h </w:instrText>
+              <w:instrText xml:space="preserve"> PAGEREF _Toc234848187 \h </w:instrText>
             </w:r>
             <w:r>
               <w:rPr>
@@ -3764,7 +3764,7 @@
               <w14:ligatures w14:val="standardContextual"/>
             </w:rPr>
           </w:pPr>
-          <w:hyperlink w:anchor="_Toc234841664" w:history="1">
+          <w:hyperlink w:anchor="_Toc234848188" w:history="1">
             <w:r>
               <w:rPr>
                 <w:rStyle w:val="Hyperlink"/>
@@ -3808,7 +3808,7 @@
                 <w:noProof/>
                 <w:webHidden/>
               </w:rPr>
-              <w:instrText xml:space="preserve"> PAGEREF _Toc234841664 \h </w:instrText>
+              <w:instrText xml:space="preserve"> PAGEREF _Toc234848188 \h </w:instrText>
             </w:r>
             <w:r>
               <w:rPr>
@@ -3854,7 +3854,7 @@
               <w14:ligatures w14:val="standardContextual"/>
             </w:rPr>
           </w:pPr>
-          <w:hyperlink w:anchor="_Toc234841665" w:history="1">
+          <w:hyperlink w:anchor="_Toc234848189" w:history="1">
             <w:r>
               <w:rPr>
                 <w:rStyle w:val="Hyperlink"/>
@@ -3898,7 +3898,7 @@
                 <w:noProof/>
                 <w:webHidden/>
               </w:rPr>
-              <w:instrText xml:space="preserve"> PAGEREF _Toc234841665 \h </w:instrText>
+              <w:instrText xml:space="preserve"> PAGEREF _Toc234848189 \h </w:instrText>
             </w:r>
             <w:r>
               <w:rPr>
@@ -3944,7 +3944,7 @@
               <w14:ligatures w14:val="standardContextual"/>
             </w:rPr>
           </w:pPr>
-          <w:hyperlink w:anchor="_Toc234841666" w:history="1">
+          <w:hyperlink w:anchor="_Toc234848190" w:history="1">
             <w:r>
               <w:rPr>
                 <w:rStyle w:val="Hyperlink"/>
@@ -3988,7 +3988,7 @@
                 <w:noProof/>
                 <w:webHidden/>
               </w:rPr>
-              <w:instrText xml:space="preserve"> PAGEREF _Toc234841666 \h </w:instrText>
+              <w:instrText xml:space="preserve"> PAGEREF _Toc234848190 \h </w:instrText>
             </w:r>
             <w:r>
               <w:rPr>
@@ -4034,7 +4034,7 @@
               <w14:ligatures w14:val="standardContextual"/>
             </w:rPr>
           </w:pPr>
-          <w:hyperlink w:anchor="_Toc234841667" w:history="1">
+          <w:hyperlink w:anchor="_Toc234848191" w:history="1">
             <w:r>
               <w:rPr>
                 <w:rStyle w:val="Hyperlink"/>
@@ -4078,7 +4078,7 @@
                 <w:noProof/>
                 <w:webHidden/>
               </w:rPr>
-              <w:instrText xml:space="preserve"> PAGEREF _Toc234841667 \h </w:instrText>
+              <w:instrText xml:space="preserve"> PAGEREF _Toc234848191 \h </w:instrText>
             </w:r>
             <w:r>
               <w:rPr>
@@ -4124,7 +4124,7 @@
               <w14:ligatures w14:val="standardContextual"/>
             </w:rPr>
           </w:pPr>
-          <w:hyperlink w:anchor="_Toc234841668" w:history="1">
+          <w:hyperlink w:anchor="_Toc234848192" w:history="1">
             <w:r>
               <w:rPr>
                 <w:rStyle w:val="Hyperlink"/>
@@ -4168,7 +4168,7 @@
                 <w:noProof/>
                 <w:webHidden/>
               </w:rPr>
-              <w:instrText xml:space="preserve"> PAGEREF _Toc234841668 \h </w:instrText>
+              <w:instrText xml:space="preserve"> PAGEREF _Toc234848192 \h </w:instrText>
             </w:r>
             <w:r>
               <w:rPr>
@@ -4214,7 +4214,7 @@
               <w14:ligatures w14:val="standardContextual"/>
             </w:rPr>
           </w:pPr>
-          <w:hyperlink w:anchor="_Toc234841669" w:history="1">
+          <w:hyperlink w:anchor="_Toc234848193" w:history="1">
             <w:r>
               <w:rPr>
                 <w:rStyle w:val="Hyperlink"/>
@@ -4258,7 +4258,7 @@
                 <w:noProof/>
                 <w:webHidden/>
               </w:rPr>
-              <w:instrText xml:space="preserve"> PAGEREF _Toc234841669 \h </w:instrText>
+              <w:instrText xml:space="preserve"> PAGEREF _Toc234848193 \h </w:instrText>
             </w:r>
             <w:r>
               <w:rPr>
@@ -4304,7 +4304,7 @@
               <w14:ligatures w14:val="standardContextual"/>
             </w:rPr>
           </w:pPr>
-          <w:hyperlink w:anchor="_Toc234841670" w:history="1">
+          <w:hyperlink w:anchor="_Toc234848194" w:history="1">
             <w:r>
               <w:rPr>
                 <w:rStyle w:val="Hyperlink"/>
@@ -4348,7 +4348,7 @@
                 <w:noProof/>
                 <w:webHidden/>
               </w:rPr>
-              <w:instrText xml:space="preserve"> PAGEREF _Toc234841670 \h </w:instrText>
+              <w:instrText xml:space="preserve"> PAGEREF _Toc234848194 \h </w:instrText>
             </w:r>
             <w:r>
               <w:rPr>
@@ -4394,7 +4394,7 @@
               <w14:ligatures w14:val="standardContextual"/>
             </w:rPr>
           </w:pPr>
-          <w:hyperlink w:anchor="_Toc234841671" w:history="1">
+          <w:hyperlink w:anchor="_Toc234848195" w:history="1">
             <w:r>
               <w:rPr>
                 <w:rStyle w:val="Hyperlink"/>
@@ -4438,7 +4438,7 @@
                 <w:noProof/>
                 <w:webHidden/>
               </w:rPr>
-              <w:instrText xml:space="preserve"> PAGEREF _Toc234841671 \h </w:instrText>
+              <w:instrText xml:space="preserve"> PAGEREF _Toc234848195 \h </w:instrText>
             </w:r>
             <w:r>
               <w:rPr>
@@ -4484,7 +4484,7 @@
               <w14:ligatures w14:val="standardContextual"/>
             </w:rPr>
           </w:pPr>
-          <w:hyperlink w:anchor="_Toc234841672" w:history="1">
+          <w:hyperlink w:anchor="_Toc234848196" w:history="1">
             <w:r>
               <w:rPr>
                 <w:rStyle w:val="Hyperlink"/>
@@ -4528,7 +4528,7 @@
                 <w:noProof/>
                 <w:webHidden/>
               </w:rPr>
-              <w:instrText xml:space="preserve"> PAGEREF _Toc234841672 \h </w:instrText>
+              <w:instrText xml:space="preserve"> PAGEREF _Toc234848196 \h </w:instrText>
             </w:r>
             <w:r>
               <w:rPr>
@@ -4574,7 +4574,7 @@
               <w14:ligatures w14:val="standardContextual"/>
             </w:rPr>
           </w:pPr>
-          <w:hyperlink w:anchor="_Toc234841673" w:history="1">
+          <w:hyperlink w:anchor="_Toc234848197" w:history="1">
             <w:r>
               <w:rPr>
                 <w:rStyle w:val="Hyperlink"/>
@@ -4618,7 +4618,7 @@
                 <w:noProof/>
                 <w:webHidden/>
               </w:rPr>
-              <w:instrText xml:space="preserve"> PAGEREF _Toc234841673 \h </w:instrText>
+              <w:instrText xml:space="preserve"> PAGEREF _Toc234848197 \h </w:instrText>
             </w:r>
             <w:r>
               <w:rPr>
@@ -4664,7 +4664,7 @@
               <w14:ligatures w14:val="standardContextual"/>
             </w:rPr>
           </w:pPr>
-          <w:hyperlink w:anchor="_Toc234841674" w:history="1">
+          <w:hyperlink w:anchor="_Toc234848198" w:history="1">
             <w:r>
               <w:rPr>
                 <w:rStyle w:val="Hyperlink"/>
@@ -4708,7 +4708,7 @@
                 <w:noProof/>
                 <w:webHidden/>
               </w:rPr>
-              <w:instrText xml:space="preserve"> PAGEREF _Toc234841674 \h </w:instrText>
+              <w:instrText xml:space="preserve"> PAGEREF _Toc234848198 \h </w:instrText>
             </w:r>
             <w:r>
               <w:rPr>
@@ -4754,7 +4754,7 @@
               <w14:ligatures w14:val="standardContextual"/>
             </w:rPr>
           </w:pPr>
-          <w:hyperlink w:anchor="_Toc234841675" w:history="1">
+          <w:hyperlink w:anchor="_Toc234848199" w:history="1">
             <w:r>
               <w:rPr>
                 <w:rStyle w:val="Hyperlink"/>
@@ -4798,7 +4798,7 @@
                 <w:noProof/>
                 <w:webHidden/>
               </w:rPr>
-              <w:instrText xml:space="preserve"> PAGEREF _Toc234841675 \h </w:instrText>
+              <w:instrText xml:space="preserve"> PAGEREF _Toc234848199 \h </w:instrText>
             </w:r>
             <w:r>
               <w:rPr>
@@ -4844,7 +4844,7 @@
               <w14:ligatures w14:val="standardContextual"/>
             </w:rPr>
           </w:pPr>
-          <w:hyperlink w:anchor="_Toc234841676" w:history="1">
+          <w:hyperlink w:anchor="_Toc234848200" w:history="1">
             <w:r>
               <w:rPr>
                 <w:rStyle w:val="Hyperlink"/>
@@ -4888,7 +4888,7 @@
                 <w:noProof/>
                 <w:webHidden/>
               </w:rPr>
-              <w:instrText xml:space="preserve"> PAGEREF _Toc234841676 \h </w:instrText>
+              <w:instrText xml:space="preserve"> PAGEREF _Toc234848200 \h </w:instrText>
             </w:r>
             <w:r>
               <w:rPr>
@@ -4934,7 +4934,7 @@
               <w14:ligatures w14:val="standardContextual"/>
             </w:rPr>
           </w:pPr>
-          <w:hyperlink w:anchor="_Toc234841677" w:history="1">
+          <w:hyperlink w:anchor="_Toc234848201" w:history="1">
             <w:r>
               <w:rPr>
                 <w:rStyle w:val="Hyperlink"/>
@@ -4978,7 +4978,7 @@
                 <w:noProof/>
                 <w:webHidden/>
               </w:rPr>
-              <w:instrText xml:space="preserve"> PAGEREF _Toc234841677 \h </w:instrText>
+              <w:instrText xml:space="preserve"> PAGEREF _Toc234848201 \h </w:instrText>
             </w:r>
             <w:r>
               <w:rPr>
@@ -5024,7 +5024,7 @@
               <w14:ligatures w14:val="standardContextual"/>
             </w:rPr>
           </w:pPr>
-          <w:hyperlink w:anchor="_Toc234841678" w:history="1">
+          <w:hyperlink w:anchor="_Toc234848202" w:history="1">
             <w:r>
               <w:rPr>
                 <w:rStyle w:val="Hyperlink"/>
@@ -5068,7 +5068,7 @@
                 <w:noProof/>
                 <w:webHidden/>
               </w:rPr>
-              <w:instrText xml:space="preserve"> PAGEREF _Toc234841678 \h </w:instrText>
+              <w:instrText xml:space="preserve"> PAGEREF _Toc234848202 \h </w:instrText>
             </w:r>
             <w:r>
               <w:rPr>
@@ -5114,7 +5114,7 @@
               <w14:ligatures w14:val="standardContextual"/>
             </w:rPr>
           </w:pPr>
-          <w:hyperlink w:anchor="_Toc234841679" w:history="1">
+          <w:hyperlink w:anchor="_Toc234848203" w:history="1">
             <w:r>
               <w:rPr>
                 <w:rStyle w:val="Hyperlink"/>
@@ -5158,7 +5158,7 @@
                 <w:noProof/>
                 <w:webHidden/>
               </w:rPr>
-              <w:instrText xml:space="preserve"> PAGEREF _Toc234841679 \h </w:instrText>
+              <w:instrText xml:space="preserve"> PAGEREF _Toc234848203 \h </w:instrText>
             </w:r>
             <w:r>
               <w:rPr>
@@ -5204,7 +5204,7 @@
               <w14:ligatures w14:val="standardContextual"/>
             </w:rPr>
           </w:pPr>
-          <w:hyperlink w:anchor="_Toc234841680" w:history="1">
+          <w:hyperlink w:anchor="_Toc234848204" w:history="1">
             <w:r>
               <w:rPr>
                 <w:rStyle w:val="Hyperlink"/>
@@ -5248,7 +5248,7 @@
                 <w:noProof/>
                 <w:webHidden/>
               </w:rPr>
-              <w:instrText xml:space="preserve"> PAGEREF _Toc234841680 \h </w:instrText>
+              <w:instrText xml:space="preserve"> PAGEREF _Toc234848204 \h </w:instrText>
             </w:r>
             <w:r>
               <w:rPr>
@@ -5294,7 +5294,7 @@
               <w14:ligatures w14:val="standardContextual"/>
             </w:rPr>
           </w:pPr>
-          <w:hyperlink w:anchor="_Toc234841681" w:history="1">
+          <w:hyperlink w:anchor="_Toc234848205" w:history="1">
             <w:r>
               <w:rPr>
                 <w:rStyle w:val="Hyperlink"/>
@@ -5338,7 +5338,7 @@
                 <w:noProof/>
                 <w:webHidden/>
               </w:rPr>
-              <w:instrText xml:space="preserve"> PAGEREF _Toc234841681 \h </w:instrText>
+              <w:instrText xml:space="preserve"> PAGEREF _Toc234848205 \h </w:instrText>
             </w:r>
             <w:r>
               <w:rPr>
@@ -5384,7 +5384,7 @@
               <w14:ligatures w14:val="standardContextual"/>
             </w:rPr>
           </w:pPr>
-          <w:hyperlink w:anchor="_Toc234841682" w:history="1">
+          <w:hyperlink w:anchor="_Toc234848206" w:history="1">
             <w:r>
               <w:rPr>
                 <w:rStyle w:val="Hyperlink"/>
@@ -5428,7 +5428,7 @@
                 <w:noProof/>
                 <w:webHidden/>
               </w:rPr>
-              <w:instrText xml:space="preserve"> PAGEREF _Toc234841682 \h </w:instrText>
+              <w:instrText xml:space="preserve"> PAGEREF _Toc234848206 \h </w:instrText>
             </w:r>
             <w:r>
               <w:rPr>
@@ -5474,7 +5474,7 @@
               <w14:ligatures w14:val="standardContextual"/>
             </w:rPr>
           </w:pPr>
-          <w:hyperlink w:anchor="_Toc234841683" w:history="1">
+          <w:hyperlink w:anchor="_Toc234848207" w:history="1">
             <w:r>
               <w:rPr>
                 <w:rStyle w:val="Hyperlink"/>
@@ -5518,7 +5518,7 @@
                 <w:noProof/>
                 <w:webHidden/>
               </w:rPr>
-              <w:instrText xml:space="preserve"> PAGEREF _Toc234841683 \h </w:instrText>
+              <w:instrText xml:space="preserve"> PAGEREF _Toc234848207 \h </w:instrText>
             </w:r>
             <w:r>
               <w:rPr>
@@ -5564,7 +5564,7 @@
               <w14:ligatures w14:val="standardContextual"/>
             </w:rPr>
           </w:pPr>
-          <w:hyperlink w:anchor="_Toc234841684" w:history="1">
+          <w:hyperlink w:anchor="_Toc234848208" w:history="1">
             <w:r>
               <w:rPr>
                 <w:rStyle w:val="Hyperlink"/>
@@ -5608,7 +5608,7 @@
                 <w:noProof/>
                 <w:webHidden/>
               </w:rPr>
-              <w:instrText xml:space="preserve"> PAGEREF _Toc234841684 \h </w:instrText>
+              <w:instrText xml:space="preserve"> PAGEREF _Toc234848208 \h </w:instrText>
             </w:r>
             <w:r>
               <w:rPr>
@@ -5654,7 +5654,7 @@
               <w14:ligatures w14:val="standardContextual"/>
             </w:rPr>
           </w:pPr>
-          <w:hyperlink w:anchor="_Toc234841685" w:history="1">
+          <w:hyperlink w:anchor="_Toc234848209" w:history="1">
             <w:r>
               <w:rPr>
                 <w:rStyle w:val="Hyperlink"/>
@@ -5698,7 +5698,7 @@
                 <w:noProof/>
                 <w:webHidden/>
               </w:rPr>
-              <w:instrText xml:space="preserve"> PAGEREF _Toc234841685 \h </w:instrText>
+              <w:instrText xml:space="preserve"> PAGEREF _Toc234848209 \h </w:instrText>
             </w:r>
             <w:r>
               <w:rPr>
@@ -5744,7 +5744,7 @@
               <w14:ligatures w14:val="standardContextual"/>
             </w:rPr>
           </w:pPr>
-          <w:hyperlink w:anchor="_Toc234841686" w:history="1">
+          <w:hyperlink w:anchor="_Toc234848210" w:history="1">
             <w:r>
               <w:rPr>
                 <w:rStyle w:val="Hyperlink"/>
@@ -5788,7 +5788,7 @@
                 <w:noProof/>
                 <w:webHidden/>
               </w:rPr>
-              <w:instrText xml:space="preserve"> PAGEREF _Toc234841686 \h </w:instrText>
+              <w:instrText xml:space="preserve"> PAGEREF _Toc234848210 \h </w:instrText>
             </w:r>
             <w:r>
               <w:rPr>
@@ -5834,7 +5834,7 @@
               <w14:ligatures w14:val="standardContextual"/>
             </w:rPr>
           </w:pPr>
-          <w:hyperlink w:anchor="_Toc234841687" w:history="1">
+          <w:hyperlink w:anchor="_Toc234848211" w:history="1">
             <w:r>
               <w:rPr>
                 <w:rStyle w:val="Hyperlink"/>
@@ -5878,7 +5878,7 @@
                 <w:noProof/>
                 <w:webHidden/>
               </w:rPr>
-              <w:instrText xml:space="preserve"> PAGEREF _Toc234841687 \h </w:instrText>
+              <w:instrText xml:space="preserve"> PAGEREF _Toc234848211 \h </w:instrText>
             </w:r>
             <w:r>
               <w:rPr>
@@ -5924,7 +5924,7 @@
               <w14:ligatures w14:val="standardContextual"/>
             </w:rPr>
           </w:pPr>
-          <w:hyperlink w:anchor="_Toc234841688" w:history="1">
+          <w:hyperlink w:anchor="_Toc234848212" w:history="1">
             <w:r>
               <w:rPr>
                 <w:rStyle w:val="Hyperlink"/>
@@ -5968,7 +5968,7 @@
                 <w:noProof/>
                 <w:webHidden/>
               </w:rPr>
-              <w:instrText xml:space="preserve"> PAGEREF _Toc234841688 \h </w:instrText>
+              <w:instrText xml:space="preserve"> PAGEREF _Toc234848212 \h </w:instrText>
             </w:r>
             <w:r>
               <w:rPr>
@@ -6014,7 +6014,7 @@
               <w14:ligatures w14:val="standardContextual"/>
             </w:rPr>
           </w:pPr>
-          <w:hyperlink w:anchor="_Toc234841689" w:history="1">
+          <w:hyperlink w:anchor="_Toc234848213" w:history="1">
             <w:r>
               <w:rPr>
                 <w:rStyle w:val="Hyperlink"/>
@@ -6058,7 +6058,7 @@
                 <w:noProof/>
                 <w:webHidden/>
               </w:rPr>
-              <w:instrText xml:space="preserve"> PAGEREF _Toc234841689 \h </w:instrText>
+              <w:instrText xml:space="preserve"> PAGEREF _Toc234848213 \h </w:instrText>
             </w:r>
             <w:r>
               <w:rPr>
@@ -6104,7 +6104,7 @@
               <w14:ligatures w14:val="standardContextual"/>
             </w:rPr>
           </w:pPr>
-          <w:hyperlink w:anchor="_Toc234841690" w:history="1">
+          <w:hyperlink w:anchor="_Toc234848214" w:history="1">
             <w:r>
               <w:rPr>
                 <w:rStyle w:val="Hyperlink"/>
@@ -6148,7 +6148,7 @@
                 <w:noProof/>
                 <w:webHidden/>
               </w:rPr>
-              <w:instrText xml:space="preserve"> PAGEREF _Toc234841690 \h </w:instrText>
+              <w:instrText xml:space="preserve"> PAGEREF _Toc234848214 \h </w:instrText>
             </w:r>
             <w:r>
               <w:rPr>
@@ -6194,7 +6194,7 @@
               <w14:ligatures w14:val="standardContextual"/>
             </w:rPr>
           </w:pPr>
-          <w:hyperlink w:anchor="_Toc234841691" w:history="1">
+          <w:hyperlink w:anchor="_Toc234848215" w:history="1">
             <w:r>
               <w:rPr>
                 <w:rStyle w:val="Hyperlink"/>
@@ -6238,7 +6238,7 @@
                 <w:noProof/>
                 <w:webHidden/>
               </w:rPr>
-              <w:instrText xml:space="preserve"> PAGEREF _Toc234841691 \h </w:instrText>
+              <w:instrText xml:space="preserve"> PAGEREF _Toc234848215 \h </w:instrText>
             </w:r>
             <w:r>
               <w:rPr>
@@ -6284,7 +6284,7 @@
               <w14:ligatures w14:val="standardContextual"/>
             </w:rPr>
           </w:pPr>
-          <w:hyperlink w:anchor="_Toc234841692" w:history="1">
+          <w:hyperlink w:anchor="_Toc234848216" w:history="1">
             <w:r>
               <w:rPr>
                 <w:rStyle w:val="Hyperlink"/>
@@ -6328,7 +6328,7 @@
                 <w:noProof/>
                 <w:webHidden/>
               </w:rPr>
-              <w:instrText xml:space="preserve"> PAGEREF _Toc234841692 \h </w:instrText>
+              <w:instrText xml:space="preserve"> PAGEREF _Toc234848216 \h </w:instrText>
             </w:r>
             <w:r>
               <w:rPr>
@@ -6374,7 +6374,7 @@
               <w14:ligatures w14:val="standardContextual"/>
             </w:rPr>
           </w:pPr>
-          <w:hyperlink w:anchor="_Toc234841693" w:history="1">
+          <w:hyperlink w:anchor="_Toc234848217" w:history="1">
             <w:r>
               <w:rPr>
                 <w:rStyle w:val="Hyperlink"/>
@@ -6418,7 +6418,7 @@
                 <w:noProof/>
                 <w:webHidden/>
               </w:rPr>
-              <w:instrText xml:space="preserve"> PAGEREF _Toc234841693 \h </w:instrText>
+              <w:instrText xml:space="preserve"> PAGEREF _Toc234848217 \h </w:instrText>
             </w:r>
             <w:r>
               <w:rPr>
@@ -6464,7 +6464,7 @@
               <w14:ligatures w14:val="standardContextual"/>
             </w:rPr>
           </w:pPr>
-          <w:hyperlink w:anchor="_Toc234841694" w:history="1">
+          <w:hyperlink w:anchor="_Toc234848218" w:history="1">
             <w:r>
               <w:rPr>
                 <w:rStyle w:val="Hyperlink"/>
@@ -6508,7 +6508,7 @@
                 <w:noProof/>
                 <w:webHidden/>
               </w:rPr>
-              <w:instrText xml:space="preserve"> PAGEREF _Toc234841694 \h </w:instrText>
+              <w:instrText xml:space="preserve"> PAGEREF _Toc234848218 \h </w:instrText>
             </w:r>
             <w:r>
               <w:rPr>
@@ -6554,7 +6554,7 @@
               <w14:ligatures w14:val="standardContextual"/>
             </w:rPr>
           </w:pPr>
-          <w:hyperlink w:anchor="_Toc234841695" w:history="1">
+          <w:hyperlink w:anchor="_Toc234848219" w:history="1">
             <w:r>
               <w:rPr>
                 <w:rStyle w:val="Hyperlink"/>
@@ -6598,7 +6598,7 @@
                 <w:noProof/>
                 <w:webHidden/>
               </w:rPr>
-              <w:instrText xml:space="preserve"> PAGEREF _Toc234841695 \h </w:instrText>
+              <w:instrText xml:space="preserve"> PAGEREF _Toc234848219 \h </w:instrText>
             </w:r>
             <w:r>
               <w:rPr>
@@ -6644,7 +6644,7 @@
               <w14:ligatures w14:val="standardContextual"/>
             </w:rPr>
           </w:pPr>
-          <w:hyperlink w:anchor="_Toc234841696" w:history="1">
+          <w:hyperlink w:anchor="_Toc234848220" w:history="1">
             <w:r>
               <w:rPr>
                 <w:rStyle w:val="Hyperlink"/>
@@ -6688,7 +6688,7 @@
                 <w:noProof/>
                 <w:webHidden/>
               </w:rPr>
-              <w:instrText xml:space="preserve"> PAGEREF _Toc234841696 \h </w:instrText>
+              <w:instrText xml:space="preserve"> PAGEREF _Toc234848220 \h </w:instrText>
             </w:r>
             <w:r>
               <w:rPr>
@@ -6734,7 +6734,7 @@
               <w14:ligatures w14:val="standardContextual"/>
             </w:rPr>
           </w:pPr>
-          <w:hyperlink w:anchor="_Toc234841697" w:history="1">
+          <w:hyperlink w:anchor="_Toc234848221" w:history="1">
             <w:r>
               <w:rPr>
                 <w:rStyle w:val="Hyperlink"/>
@@ -6778,7 +6778,7 @@
                 <w:noProof/>
                 <w:webHidden/>
               </w:rPr>
-              <w:instrText xml:space="preserve"> PAGEREF _Toc234841697 \h </w:instrText>
+              <w:instrText xml:space="preserve"> PAGEREF _Toc234848221 \h </w:instrText>
             </w:r>
             <w:r>
               <w:rPr>
@@ -6824,7 +6824,7 @@
               <w14:ligatures w14:val="standardContextual"/>
             </w:rPr>
           </w:pPr>
-          <w:hyperlink w:anchor="_Toc234841698" w:history="1">
+          <w:hyperlink w:anchor="_Toc234848222" w:history="1">
             <w:r>
               <w:rPr>
                 <w:rStyle w:val="Hyperlink"/>
@@ -6868,7 +6868,7 @@
                 <w:noProof/>
                 <w:webHidden/>
               </w:rPr>
-              <w:instrText xml:space="preserve"> PAGEREF _Toc234841698 \h </w:instrText>
+              <w:instrText xml:space="preserve"> PAGEREF _Toc234848222 \h </w:instrText>
             </w:r>
             <w:r>
               <w:rPr>
@@ -6914,7 +6914,7 @@
               <w14:ligatures w14:val="standardContextual"/>
             </w:rPr>
           </w:pPr>
-          <w:hyperlink w:anchor="_Toc234841699" w:history="1">
+          <w:hyperlink w:anchor="_Toc234848223" w:history="1">
             <w:r>
               <w:rPr>
                 <w:rStyle w:val="Hyperlink"/>
@@ -6958,7 +6958,7 @@
                 <w:noProof/>
                 <w:webHidden/>
               </w:rPr>
-              <w:instrText xml:space="preserve"> PAGEREF _Toc234841699 \h </w:instrText>
+              <w:instrText xml:space="preserve"> PAGEREF _Toc234848223 \h </w:instrText>
             </w:r>
             <w:r>
               <w:rPr>
@@ -7004,7 +7004,7 @@
               <w14:ligatures w14:val="standardContextual"/>
             </w:rPr>
           </w:pPr>
-          <w:hyperlink w:anchor="_Toc234841700" w:history="1">
+          <w:hyperlink w:anchor="_Toc234848224" w:history="1">
             <w:r>
               <w:rPr>
                 <w:rStyle w:val="Hyperlink"/>
@@ -7048,7 +7048,7 @@
                 <w:noProof/>
                 <w:webHidden/>
               </w:rPr>
-              <w:instrText xml:space="preserve"> PAGEREF _Toc234841700 \h </w:instrText>
+              <w:instrText xml:space="preserve"> PAGEREF _Toc234848224 \h </w:instrText>
             </w:r>
             <w:r>
               <w:rPr>
@@ -7094,7 +7094,7 @@
               <w14:ligatures w14:val="standardContextual"/>
             </w:rPr>
           </w:pPr>
-          <w:hyperlink w:anchor="_Toc234841701" w:history="1">
+          <w:hyperlink w:anchor="_Toc234848225" w:history="1">
             <w:r>
               <w:rPr>
                 <w:rStyle w:val="Hyperlink"/>
@@ -7138,7 +7138,7 @@
                 <w:noProof/>
                 <w:webHidden/>
               </w:rPr>
-              <w:instrText xml:space="preserve"> PAGEREF _Toc234841701 \h </w:instrText>
+              <w:instrText xml:space="preserve"> PAGEREF _Toc234848225 \h </w:instrText>
             </w:r>
             <w:r>
               <w:rPr>
@@ -7184,7 +7184,7 @@
               <w14:ligatures w14:val="standardContextual"/>
             </w:rPr>
           </w:pPr>
-          <w:hyperlink w:anchor="_Toc234841702" w:history="1">
+          <w:hyperlink w:anchor="_Toc234848226" w:history="1">
             <w:r>
               <w:rPr>
                 <w:rStyle w:val="Hyperlink"/>
@@ -7228,7 +7228,7 @@
                 <w:noProof/>
                 <w:webHidden/>
               </w:rPr>
-              <w:instrText xml:space="preserve"> PAGEREF _Toc234841702 \h </w:instrText>
+              <w:instrText xml:space="preserve"> PAGEREF _Toc234848226 \h </w:instrText>
             </w:r>
             <w:r>
               <w:rPr>
@@ -7274,7 +7274,7 @@
               <w14:ligatures w14:val="standardContextual"/>
             </w:rPr>
           </w:pPr>
-          <w:hyperlink w:anchor="_Toc234841703" w:history="1">
+          <w:hyperlink w:anchor="_Toc234848227" w:history="1">
             <w:r>
               <w:rPr>
                 <w:rStyle w:val="Hyperlink"/>
@@ -7318,7 +7318,7 @@
                 <w:noProof/>
                 <w:webHidden/>
               </w:rPr>
-              <w:instrText xml:space="preserve"> PAGEREF _Toc234841703 \h </w:instrText>
+              <w:instrText xml:space="preserve"> PAGEREF _Toc234848227 \h </w:instrText>
             </w:r>
             <w:r>
               <w:rPr>
@@ -7364,7 +7364,7 @@
               <w14:ligatures w14:val="standardContextual"/>
             </w:rPr>
           </w:pPr>
-          <w:hyperlink w:anchor="_Toc234841704" w:history="1">
+          <w:hyperlink w:anchor="_Toc234848228" w:history="1">
             <w:r>
               <w:rPr>
                 <w:rStyle w:val="Hyperlink"/>
@@ -7408,7 +7408,7 @@
                 <w:noProof/>
                 <w:webHidden/>
               </w:rPr>
-              <w:instrText xml:space="preserve"> PAGEREF _Toc234841704 \h </w:instrText>
+              <w:instrText xml:space="preserve"> PAGEREF _Toc234848228 \h </w:instrText>
             </w:r>
             <w:r>
               <w:rPr>
@@ -7454,7 +7454,7 @@
               <w14:ligatures w14:val="standardContextual"/>
             </w:rPr>
           </w:pPr>
-          <w:hyperlink w:anchor="_Toc234841705" w:history="1">
+          <w:hyperlink w:anchor="_Toc234848229" w:history="1">
             <w:r>
               <w:rPr>
                 <w:rStyle w:val="Hyperlink"/>
@@ -7498,7 +7498,7 @@
                 <w:noProof/>
                 <w:webHidden/>
               </w:rPr>
-              <w:instrText xml:space="preserve"> PAGEREF _Toc234841705 \h </w:instrText>
+              <w:instrText xml:space="preserve"> PAGEREF _Toc234848229 \h </w:instrText>
             </w:r>
             <w:r>
               <w:rPr>
@@ -7544,7 +7544,7 @@
               <w14:ligatures w14:val="standardContextual"/>
             </w:rPr>
           </w:pPr>
-          <w:hyperlink w:anchor="_Toc234841706" w:history="1">
+          <w:hyperlink w:anchor="_Toc234848230" w:history="1">
             <w:r>
               <w:rPr>
                 <w:rStyle w:val="Hyperlink"/>
@@ -7588,7 +7588,7 @@
                 <w:noProof/>
                 <w:webHidden/>
               </w:rPr>
-              <w:instrText xml:space="preserve"> PAGEREF _Toc234841706 \h </w:instrText>
+              <w:instrText xml:space="preserve"> PAGEREF _Toc234848230 \h </w:instrText>
             </w:r>
             <w:r>
               <w:rPr>
@@ -7634,7 +7634,7 @@
               <w14:ligatures w14:val="standardContextual"/>
             </w:rPr>
           </w:pPr>
-          <w:hyperlink w:anchor="_Toc234841707" w:history="1">
+          <w:hyperlink w:anchor="_Toc234848231" w:history="1">
             <w:r>
               <w:rPr>
                 <w:rStyle w:val="Hyperlink"/>
@@ -7678,7 +7678,7 @@
                 <w:noProof/>
                 <w:webHidden/>
               </w:rPr>
-              <w:instrText xml:space="preserve"> PAGEREF _Toc234841707 \h </w:instrText>
+              <w:instrText xml:space="preserve"> PAGEREF _Toc234848231 \h </w:instrText>
             </w:r>
             <w:r>
               <w:rPr>
@@ -7724,7 +7724,7 @@
               <w14:ligatures w14:val="standardContextual"/>
             </w:rPr>
           </w:pPr>
-          <w:hyperlink w:anchor="_Toc234841708" w:history="1">
+          <w:hyperlink w:anchor="_Toc234848232" w:history="1">
             <w:r>
               <w:rPr>
                 <w:rStyle w:val="Hyperlink"/>
@@ -7768,7 +7768,7 @@
                 <w:noProof/>
                 <w:webHidden/>
               </w:rPr>
-              <w:instrText xml:space="preserve"> PAGEREF _Toc234841708 \h </w:instrText>
+              <w:instrText xml:space="preserve"> PAGEREF _Toc234848232 \h </w:instrText>
             </w:r>
             <w:r>
               <w:rPr>
@@ -7814,7 +7814,7 @@
               <w14:ligatures w14:val="standardContextual"/>
             </w:rPr>
           </w:pPr>
-          <w:hyperlink w:anchor="_Toc234841709" w:history="1">
+          <w:hyperlink w:anchor="_Toc234848233" w:history="1">
             <w:r>
               <w:rPr>
                 <w:rStyle w:val="Hyperlink"/>
@@ -7858,7 +7858,7 @@
                 <w:noProof/>
                 <w:webHidden/>
               </w:rPr>
-              <w:instrText xml:space="preserve"> PAGEREF _Toc234841709 \h </w:instrText>
+              <w:instrText xml:space="preserve"> PAGEREF _Toc234848233 \h </w:instrText>
             </w:r>
             <w:r>
               <w:rPr>
@@ -7904,7 +7904,7 @@
               <w14:ligatures w14:val="standardContextual"/>
             </w:rPr>
           </w:pPr>
-          <w:hyperlink w:anchor="_Toc234841710" w:history="1">
+          <w:hyperlink w:anchor="_Toc234848234" w:history="1">
             <w:r>
               <w:rPr>
                 <w:rStyle w:val="Hyperlink"/>
@@ -7948,7 +7948,7 @@
                 <w:noProof/>
                 <w:webHidden/>
               </w:rPr>
-              <w:instrText xml:space="preserve"> PAGEREF _Toc234841710 \h </w:instrText>
+              <w:instrText xml:space="preserve"> PAGEREF _Toc234848234 \h </w:instrText>
             </w:r>
             <w:r>
               <w:rPr>
@@ -7994,7 +7994,7 @@
               <w14:ligatures w14:val="standardContextual"/>
             </w:rPr>
           </w:pPr>
-          <w:hyperlink w:anchor="_Toc234841711" w:history="1">
+          <w:hyperlink w:anchor="_Toc234848235" w:history="1">
             <w:r>
               <w:rPr>
                 <w:rStyle w:val="Hyperlink"/>
@@ -8038,7 +8038,7 @@
                 <w:noProof/>
                 <w:webHidden/>
               </w:rPr>
-              <w:instrText xml:space="preserve"> PAGEREF _Toc234841711 \h </w:instrText>
+              <w:instrText xml:space="preserve"> PAGEREF _Toc234848235 \h </w:instrText>
             </w:r>
             <w:r>
               <w:rPr>
@@ -8084,7 +8084,7 @@
               <w14:ligatures w14:val="standardContextual"/>
             </w:rPr>
           </w:pPr>
-          <w:hyperlink w:anchor="_Toc234841712" w:history="1">
+          <w:hyperlink w:anchor="_Toc234848236" w:history="1">
             <w:r>
               <w:rPr>
                 <w:rStyle w:val="Hyperlink"/>
@@ -8128,7 +8128,7 @@
                 <w:noProof/>
                 <w:webHidden/>
               </w:rPr>
-              <w:instrText xml:space="preserve"> PAGEREF _Toc234841712 \h </w:instrText>
+              <w:instrText xml:space="preserve"> PAGEREF _Toc234848236 \h </w:instrText>
             </w:r>
             <w:r>
               <w:rPr>
@@ -8174,7 +8174,7 @@
               <w14:ligatures w14:val="standardContextual"/>
             </w:rPr>
           </w:pPr>
-          <w:hyperlink w:anchor="_Toc234841713" w:history="1">
+          <w:hyperlink w:anchor="_Toc234848237" w:history="1">
             <w:r>
               <w:rPr>
                 <w:rStyle w:val="Hyperlink"/>
@@ -8218,7 +8218,7 @@
                 <w:noProof/>
                 <w:webHidden/>
               </w:rPr>
-              <w:instrText xml:space="preserve"> PAGEREF _Toc234841713 \h </w:instrText>
+              <w:instrText xml:space="preserve"> PAGEREF _Toc234848237 \h </w:instrText>
             </w:r>
             <w:r>
               <w:rPr>
@@ -8264,7 +8264,7 @@
               <w14:ligatures w14:val="standardContextual"/>
             </w:rPr>
           </w:pPr>
-          <w:hyperlink w:anchor="_Toc234841714" w:history="1">
+          <w:hyperlink w:anchor="_Toc234848238" w:history="1">
             <w:r>
               <w:rPr>
                 <w:rStyle w:val="Hyperlink"/>
@@ -8308,7 +8308,7 @@
                 <w:noProof/>
                 <w:webHidden/>
               </w:rPr>
-              <w:instrText xml:space="preserve"> PAGEREF _Toc234841714 \h </w:instrText>
+              <w:instrText xml:space="preserve"> PAGEREF _Toc234848238 \h </w:instrText>
             </w:r>
             <w:r>
               <w:rPr>
@@ -8354,7 +8354,7 @@
               <w14:ligatures w14:val="standardContextual"/>
             </w:rPr>
           </w:pPr>
-          <w:hyperlink w:anchor="_Toc234841715" w:history="1">
+          <w:hyperlink w:anchor="_Toc234848239" w:history="1">
             <w:r>
               <w:rPr>
                 <w:rStyle w:val="Hyperlink"/>
@@ -8398,7 +8398,7 @@
                 <w:noProof/>
                 <w:webHidden/>
               </w:rPr>
-              <w:instrText xml:space="preserve"> PAGEREF _Toc234841715 \h </w:instrText>
+              <w:instrText xml:space="preserve"> PAGEREF _Toc234848239 \h </w:instrText>
             </w:r>
             <w:r>
               <w:rPr>
@@ -8444,7 +8444,7 @@
               <w14:ligatures w14:val="standardContextual"/>
             </w:rPr>
           </w:pPr>
-          <w:hyperlink w:anchor="_Toc234841716" w:history="1">
+          <w:hyperlink w:anchor="_Toc234848240" w:history="1">
             <w:r>
               <w:rPr>
                 <w:rStyle w:val="Hyperlink"/>
@@ -8488,7 +8488,7 @@
                 <w:noProof/>
                 <w:webHidden/>
               </w:rPr>
-              <w:instrText xml:space="preserve"> PAGEREF _Toc234841716 \h </w:instrText>
+              <w:instrText xml:space="preserve"> PAGEREF _Toc234848240 \h </w:instrText>
             </w:r>
             <w:r>
               <w:rPr>
@@ -8534,7 +8534,7 @@
               <w14:ligatures w14:val="standardContextual"/>
             </w:rPr>
           </w:pPr>
-          <w:hyperlink w:anchor="_Toc234841717" w:history="1">
+          <w:hyperlink w:anchor="_Toc234848241" w:history="1">
             <w:r>
               <w:rPr>
                 <w:rStyle w:val="Hyperlink"/>
@@ -8578,7 +8578,7 @@
                 <w:noProof/>
                 <w:webHidden/>
               </w:rPr>
-              <w:instrText xml:space="preserve"> PAGEREF _Toc234841717 \h </w:instrText>
+              <w:instrText xml:space="preserve"> PAGEREF _Toc234848241 \h </w:instrText>
             </w:r>
             <w:r>
               <w:rPr>
@@ -8624,7 +8624,7 @@
               <w14:ligatures w14:val="standardContextual"/>
             </w:rPr>
           </w:pPr>
-          <w:hyperlink w:anchor="_Toc234841718" w:history="1">
+          <w:hyperlink w:anchor="_Toc234848242" w:history="1">
             <w:r>
               <w:rPr>
                 <w:rStyle w:val="Hyperlink"/>
@@ -8668,7 +8668,7 @@
                 <w:noProof/>
                 <w:webHidden/>
               </w:rPr>
-              <w:instrText xml:space="preserve"> PAGEREF _Toc234841718 \h </w:instrText>
+              <w:instrText xml:space="preserve"> PAGEREF _Toc234848242 \h </w:instrText>
             </w:r>
             <w:r>
               <w:rPr>
@@ -8714,7 +8714,7 @@
               <w14:ligatures w14:val="standardContextual"/>
             </w:rPr>
           </w:pPr>
-          <w:hyperlink w:anchor="_Toc234841719" w:history="1">
+          <w:hyperlink w:anchor="_Toc234848243" w:history="1">
             <w:r>
               <w:rPr>
                 <w:rStyle w:val="Hyperlink"/>
@@ -8758,7 +8758,7 @@
                 <w:noProof/>
                 <w:webHidden/>
               </w:rPr>
-              <w:instrText xml:space="preserve"> PAGEREF _Toc234841719 \h </w:instrText>
+              <w:instrText xml:space="preserve"> PAGEREF _Toc234848243 \h </w:instrText>
             </w:r>
             <w:r>
               <w:rPr>
@@ -8804,7 +8804,7 @@
               <w14:ligatures w14:val="standardContextual"/>
             </w:rPr>
           </w:pPr>
-          <w:hyperlink w:anchor="_Toc234841720" w:history="1">
+          <w:hyperlink w:anchor="_Toc234848244" w:history="1">
             <w:r>
               <w:rPr>
                 <w:rStyle w:val="Hyperlink"/>
@@ -8848,7 +8848,7 @@
                 <w:noProof/>
                 <w:webHidden/>
               </w:rPr>
-              <w:instrText xml:space="preserve"> PAGEREF _Toc234841720 \h </w:instrText>
+              <w:instrText xml:space="preserve"> PAGEREF _Toc234848244 \h </w:instrText>
             </w:r>
             <w:r>
               <w:rPr>
@@ -8894,7 +8894,7 @@
               <w14:ligatures w14:val="standardContextual"/>
             </w:rPr>
           </w:pPr>
-          <w:hyperlink w:anchor="_Toc234841721" w:history="1">
+          <w:hyperlink w:anchor="_Toc234848245" w:history="1">
             <w:r>
               <w:rPr>
                 <w:rStyle w:val="Hyperlink"/>
@@ -8938,7 +8938,7 @@
                 <w:noProof/>
                 <w:webHidden/>
               </w:rPr>
-              <w:instrText xml:space="preserve"> PAGEREF _Toc234841721 \h </w:instrText>
+              <w:instrText xml:space="preserve"> PAGEREF _Toc234848245 \h </w:instrText>
             </w:r>
             <w:r>
               <w:rPr>
@@ -8984,7 +8984,7 @@
               <w14:ligatures w14:val="standardContextual"/>
             </w:rPr>
           </w:pPr>
-          <w:hyperlink w:anchor="_Toc234841722" w:history="1">
+          <w:hyperlink w:anchor="_Toc234848246" w:history="1">
             <w:r>
               <w:rPr>
                 <w:rStyle w:val="Hyperlink"/>
@@ -9028,7 +9028,7 @@
                 <w:noProof/>
                 <w:webHidden/>
               </w:rPr>
-              <w:instrText xml:space="preserve"> PAGEREF _Toc234841722 \h </w:instrText>
+              <w:instrText xml:space="preserve"> PAGEREF _Toc234848246 \h </w:instrText>
             </w:r>
             <w:r>
               <w:rPr>
@@ -9074,7 +9074,7 @@
               <w14:ligatures w14:val="standardContextual"/>
             </w:rPr>
           </w:pPr>
-          <w:hyperlink w:anchor="_Toc234841723" w:history="1">
+          <w:hyperlink w:anchor="_Toc234848247" w:history="1">
             <w:r>
               <w:rPr>
                 <w:rStyle w:val="Hyperlink"/>
@@ -9118,7 +9118,7 @@
                 <w:noProof/>
                 <w:webHidden/>
               </w:rPr>
-              <w:instrText xml:space="preserve"> PAGEREF _Toc234841723 \h </w:instrText>
+              <w:instrText xml:space="preserve"> PAGEREF _Toc234848247 \h </w:instrText>
             </w:r>
             <w:r>
               <w:rPr>
@@ -9164,7 +9164,7 @@
               <w14:ligatures w14:val="standardContextual"/>
             </w:rPr>
           </w:pPr>
-          <w:hyperlink w:anchor="_Toc234841724" w:history="1">
+          <w:hyperlink w:anchor="_Toc234848248" w:history="1">
             <w:r>
               <w:rPr>
                 <w:rStyle w:val="Hyperlink"/>
@@ -9208,7 +9208,7 @@
                 <w:noProof/>
                 <w:webHidden/>
               </w:rPr>
-              <w:instrText xml:space="preserve"> PAGEREF _Toc234841724 \h </w:instrText>
+              <w:instrText xml:space="preserve"> PAGEREF _Toc234848248 \h </w:instrText>
             </w:r>
             <w:r>
               <w:rPr>
@@ -9254,7 +9254,7 @@
               <w14:ligatures w14:val="standardContextual"/>
             </w:rPr>
           </w:pPr>
-          <w:hyperlink w:anchor="_Toc234841725" w:history="1">
+          <w:hyperlink w:anchor="_Toc234848249" w:history="1">
             <w:r>
               <w:rPr>
                 <w:rStyle w:val="Hyperlink"/>
@@ -9298,7 +9298,7 @@
                 <w:noProof/>
                 <w:webHidden/>
               </w:rPr>
-              <w:instrText xml:space="preserve"> PAGEREF _Toc234841725 \h </w:instrText>
+              <w:instrText xml:space="preserve"> PAGEREF _Toc234848249 \h </w:instrText>
             </w:r>
             <w:r>
               <w:rPr>
@@ -9344,7 +9344,7 @@
               <w14:ligatures w14:val="standardContextual"/>
             </w:rPr>
           </w:pPr>
-          <w:hyperlink w:anchor="_Toc234841726" w:history="1">
+          <w:hyperlink w:anchor="_Toc234848250" w:history="1">
             <w:r>
               <w:rPr>
                 <w:rStyle w:val="Hyperlink"/>
@@ -9388,7 +9388,7 @@
                 <w:noProof/>
                 <w:webHidden/>
               </w:rPr>
-              <w:instrText xml:space="preserve"> PAGEREF _Toc234841726 \h </w:instrText>
+              <w:instrText xml:space="preserve"> PAGEREF _Toc234848250 \h </w:instrText>
             </w:r>
             <w:r>
               <w:rPr>
@@ -9434,7 +9434,7 @@
               <w14:ligatures w14:val="standardContextual"/>
             </w:rPr>
           </w:pPr>
-          <w:hyperlink w:anchor="_Toc234841727" w:history="1">
+          <w:hyperlink w:anchor="_Toc234848251" w:history="1">
             <w:r>
               <w:rPr>
                 <w:rStyle w:val="Hyperlink"/>
@@ -9478,7 +9478,7 @@
                 <w:noProof/>
                 <w:webHidden/>
               </w:rPr>
-              <w:instrText xml:space="preserve"> PAGEREF _Toc234841727 \h </w:instrText>
+              <w:instrText xml:space="preserve"> PAGEREF _Toc234848251 \h </w:instrText>
             </w:r>
             <w:r>
               <w:rPr>
@@ -9524,7 +9524,7 @@
               <w14:ligatures w14:val="standardContextual"/>
             </w:rPr>
           </w:pPr>
-          <w:hyperlink w:anchor="_Toc234841728" w:history="1">
+          <w:hyperlink w:anchor="_Toc234848252" w:history="1">
             <w:r>
               <w:rPr>
                 <w:rStyle w:val="Hyperlink"/>
@@ -9568,7 +9568,7 @@
                 <w:noProof/>
                 <w:webHidden/>
               </w:rPr>
-              <w:instrText xml:space="preserve"> PAGEREF _Toc234841728 \h </w:instrText>
+              <w:instrText xml:space="preserve"> PAGEREF _Toc234848252 \h </w:instrText>
             </w:r>
             <w:r>
               <w:rPr>
@@ -9614,7 +9614,7 @@
               <w14:ligatures w14:val="standardContextual"/>
             </w:rPr>
           </w:pPr>
-          <w:hyperlink w:anchor="_Toc234841729" w:history="1">
+          <w:hyperlink w:anchor="_Toc234848253" w:history="1">
             <w:r>
               <w:rPr>
                 <w:rStyle w:val="Hyperlink"/>
@@ -9658,7 +9658,7 @@
                 <w:noProof/>
                 <w:webHidden/>
               </w:rPr>
-              <w:instrText xml:space="preserve"> PAGEREF _Toc234841729 \h </w:instrText>
+              <w:instrText xml:space="preserve"> PAGEREF _Toc234848253 \h </w:instrText>
             </w:r>
             <w:r>
               <w:rPr>
@@ -9704,7 +9704,7 @@
               <w14:ligatures w14:val="standardContextual"/>
             </w:rPr>
           </w:pPr>
-          <w:hyperlink w:anchor="_Toc234841730" w:history="1">
+          <w:hyperlink w:anchor="_Toc234848254" w:history="1">
             <w:r>
               <w:rPr>
                 <w:rStyle w:val="Hyperlink"/>
@@ -9748,7 +9748,7 @@
                 <w:noProof/>
                 <w:webHidden/>
               </w:rPr>
-              <w:instrText xml:space="preserve"> PAGEREF _Toc234841730 \h </w:instrText>
+              <w:instrText xml:space="preserve"> PAGEREF _Toc234848254 \h </w:instrText>
             </w:r>
             <w:r>
               <w:rPr>
@@ -9794,7 +9794,7 @@
               <w14:ligatures w14:val="standardContextual"/>
             </w:rPr>
           </w:pPr>
-          <w:hyperlink w:anchor="_Toc234841731" w:history="1">
+          <w:hyperlink w:anchor="_Toc234848255" w:history="1">
             <w:r>
               <w:rPr>
                 <w:rStyle w:val="Hyperlink"/>
@@ -9838,7 +9838,7 @@
                 <w:noProof/>
                 <w:webHidden/>
               </w:rPr>
-              <w:instrText xml:space="preserve"> PAGEREF _Toc234841731 \h </w:instrText>
+              <w:instrText xml:space="preserve"> PAGEREF _Toc234848255 \h </w:instrText>
             </w:r>
             <w:r>
               <w:rPr>
@@ -9884,7 +9884,7 @@
               <w14:ligatures w14:val="standardContextual"/>
             </w:rPr>
           </w:pPr>
-          <w:hyperlink w:anchor="_Toc234841732" w:history="1">
+          <w:hyperlink w:anchor="_Toc234848256" w:history="1">
             <w:r>
               <w:rPr>
                 <w:rStyle w:val="Hyperlink"/>
@@ -9928,7 +9928,7 @@
                 <w:noProof/>
                 <w:webHidden/>
               </w:rPr>
-              <w:instrText xml:space="preserve"> PAGEREF _Toc234841732 \h </w:instrText>
+              <w:instrText xml:space="preserve"> PAGEREF _Toc234848256 \h </w:instrText>
             </w:r>
             <w:r>
               <w:rPr>
@@ -9974,7 +9974,7 @@
               <w14:ligatures w14:val="standardContextual"/>
             </w:rPr>
           </w:pPr>
-          <w:hyperlink w:anchor="_Toc234841733" w:history="1">
+          <w:hyperlink w:anchor="_Toc234848257" w:history="1">
             <w:r>
               <w:rPr>
                 <w:rStyle w:val="Hyperlink"/>
@@ -10018,7 +10018,7 @@
                 <w:noProof/>
                 <w:webHidden/>
               </w:rPr>
-              <w:instrText xml:space="preserve"> PAGEREF _Toc234841733 \h </w:instrText>
+              <w:instrText xml:space="preserve"> PAGEREF _Toc234848257 \h </w:instrText>
             </w:r>
             <w:r>
               <w:rPr>
@@ -10064,7 +10064,7 @@
               <w14:ligatures w14:val="standardContextual"/>
             </w:rPr>
           </w:pPr>
-          <w:hyperlink w:anchor="_Toc234841734" w:history="1">
+          <w:hyperlink w:anchor="_Toc234848258" w:history="1">
             <w:r>
               <w:rPr>
                 <w:rStyle w:val="Hyperlink"/>
@@ -10108,7 +10108,7 @@
                 <w:noProof/>
                 <w:webHidden/>
               </w:rPr>
-              <w:instrText xml:space="preserve"> PAGEREF _Toc234841734 \h </w:instrText>
+              <w:instrText xml:space="preserve"> PAGEREF _Toc234848258 \h </w:instrText>
             </w:r>
             <w:r>
               <w:rPr>
@@ -10154,7 +10154,7 @@
               <w14:ligatures w14:val="standardContextual"/>
             </w:rPr>
           </w:pPr>
-          <w:hyperlink w:anchor="_Toc234841735" w:history="1">
+          <w:hyperlink w:anchor="_Toc234848259" w:history="1">
             <w:r>
               <w:rPr>
                 <w:rStyle w:val="Hyperlink"/>
@@ -10198,7 +10198,7 @@
                 <w:noProof/>
                 <w:webHidden/>
               </w:rPr>
-              <w:instrText xml:space="preserve"> PAGEREF _Toc234841735 \h </w:instrText>
+              <w:instrText xml:space="preserve"> PAGEREF _Toc234848259 \h </w:instrText>
             </w:r>
             <w:r>
               <w:rPr>
@@ -10244,7 +10244,7 @@
               <w14:ligatures w14:val="standardContextual"/>
             </w:rPr>
           </w:pPr>
-          <w:hyperlink w:anchor="_Toc234841736" w:history="1">
+          <w:hyperlink w:anchor="_Toc234848260" w:history="1">
             <w:r>
               <w:rPr>
                 <w:rStyle w:val="Hyperlink"/>
@@ -10288,7 +10288,7 @@
                 <w:noProof/>
                 <w:webHidden/>
               </w:rPr>
-              <w:instrText xml:space="preserve"> PAGEREF _Toc234841736 \h </w:instrText>
+              <w:instrText xml:space="preserve"> PAGEREF _Toc234848260 \h </w:instrText>
             </w:r>
             <w:r>
               <w:rPr>
@@ -10334,7 +10334,7 @@
               <w14:ligatures w14:val="standardContextual"/>
             </w:rPr>
           </w:pPr>
-          <w:hyperlink w:anchor="_Toc234841737" w:history="1">
+          <w:hyperlink w:anchor="_Toc234848261" w:history="1">
             <w:r>
               <w:rPr>
                 <w:rStyle w:val="Hyperlink"/>
@@ -10378,7 +10378,7 @@
                 <w:noProof/>
                 <w:webHidden/>
               </w:rPr>
-              <w:instrText xml:space="preserve"> PAGEREF _Toc234841737 \h </w:instrText>
+              <w:instrText xml:space="preserve"> PAGEREF _Toc234848261 \h </w:instrText>
             </w:r>
             <w:r>
               <w:rPr>
@@ -10424,7 +10424,7 @@
               <w14:ligatures w14:val="standardContextual"/>
             </w:rPr>
           </w:pPr>
-          <w:hyperlink w:anchor="_Toc234841738" w:history="1">
+          <w:hyperlink w:anchor="_Toc234848262" w:history="1">
             <w:r>
               <w:rPr>
                 <w:rStyle w:val="Hyperlink"/>
@@ -10468,7 +10468,7 @@
                 <w:noProof/>
                 <w:webHidden/>
               </w:rPr>
-              <w:instrText xml:space="preserve"> PAGEREF _Toc234841738 \h </w:instrText>
+              <w:instrText xml:space="preserve"> PAGEREF _Toc234848262 \h </w:instrText>
             </w:r>
             <w:r>
               <w:rPr>
@@ -10514,7 +10514,7 @@
               <w14:ligatures w14:val="standardContextual"/>
             </w:rPr>
           </w:pPr>
-          <w:hyperlink w:anchor="_Toc234841739" w:history="1">
+          <w:hyperlink w:anchor="_Toc234848263" w:history="1">
             <w:r>
               <w:rPr>
                 <w:rStyle w:val="Hyperlink"/>
@@ -10558,7 +10558,7 @@
                 <w:noProof/>
                 <w:webHidden/>
               </w:rPr>
-              <w:instrText xml:space="preserve"> PAGEREF _Toc234841739 \h </w:instrText>
+              <w:instrText xml:space="preserve"> PAGEREF _Toc234848263 \h </w:instrText>
             </w:r>
             <w:r>
               <w:rPr>
@@ -10604,7 +10604,7 @@
               <w14:ligatures w14:val="standardContextual"/>
             </w:rPr>
           </w:pPr>
-          <w:hyperlink w:anchor="_Toc234841740" w:history="1">
+          <w:hyperlink w:anchor="_Toc234848264" w:history="1">
             <w:r>
               <w:rPr>
                 <w:rStyle w:val="Hyperlink"/>
@@ -10648,7 +10648,7 @@
                 <w:noProof/>
                 <w:webHidden/>
               </w:rPr>
-              <w:instrText xml:space="preserve"> PAGEREF _Toc234841740 \h </w:instrText>
+              <w:instrText xml:space="preserve"> PAGEREF _Toc234848264 \h </w:instrText>
             </w:r>
             <w:r>
               <w:rPr>
@@ -10694,7 +10694,7 @@
               <w14:ligatures w14:val="standardContextual"/>
             </w:rPr>
           </w:pPr>
-          <w:hyperlink w:anchor="_Toc234841741" w:history="1">
+          <w:hyperlink w:anchor="_Toc234848265" w:history="1">
             <w:r>
               <w:rPr>
                 <w:rStyle w:val="Hyperlink"/>
@@ -10738,7 +10738,7 @@
                 <w:noProof/>
                 <w:webHidden/>
               </w:rPr>
-              <w:instrText xml:space="preserve"> PAGEREF _Toc234841741 \h </w:instrText>
+              <w:instrText xml:space="preserve"> PAGEREF _Toc234848265 \h </w:instrText>
             </w:r>
             <w:r>
               <w:rPr>
@@ -10784,7 +10784,7 @@
               <w14:ligatures w14:val="standardContextual"/>
             </w:rPr>
           </w:pPr>
-          <w:hyperlink w:anchor="_Toc234841742" w:history="1">
+          <w:hyperlink w:anchor="_Toc234848266" w:history="1">
             <w:r>
               <w:rPr>
                 <w:rStyle w:val="Hyperlink"/>
@@ -10828,7 +10828,7 @@
                 <w:noProof/>
                 <w:webHidden/>
               </w:rPr>
-              <w:instrText xml:space="preserve"> PAGEREF _Toc234841742 \h </w:instrText>
+              <w:instrText xml:space="preserve"> PAGEREF _Toc234848266 \h </w:instrText>
             </w:r>
             <w:r>
               <w:rPr>
@@ -10874,7 +10874,7 @@
               <w14:ligatures w14:val="standardContextual"/>
             </w:rPr>
           </w:pPr>
-          <w:hyperlink w:anchor="_Toc234841743" w:history="1">
+          <w:hyperlink w:anchor="_Toc234848267" w:history="1">
             <w:r>
               <w:rPr>
                 <w:rStyle w:val="Hyperlink"/>
@@ -10918,7 +10918,7 @@
                 <w:noProof/>
                 <w:webHidden/>
               </w:rPr>
-              <w:instrText xml:space="preserve"> PAGEREF _Toc234841743 \h </w:instrText>
+              <w:instrText xml:space="preserve"> PAGEREF _Toc234848267 \h </w:instrText>
             </w:r>
             <w:r>
               <w:rPr>
@@ -10964,7 +10964,7 @@
               <w14:ligatures w14:val="standardContextual"/>
             </w:rPr>
           </w:pPr>
-          <w:hyperlink w:anchor="_Toc234841744" w:history="1">
+          <w:hyperlink w:anchor="_Toc234848268" w:history="1">
             <w:r>
               <w:rPr>
                 <w:rStyle w:val="Hyperlink"/>
@@ -11008,7 +11008,7 @@
                 <w:noProof/>
                 <w:webHidden/>
               </w:rPr>
-              <w:instrText xml:space="preserve"> PAGEREF _Toc234841744 \h </w:instrText>
+              <w:instrText xml:space="preserve"> PAGEREF _Toc234848268 \h </w:instrText>
             </w:r>
             <w:r>
               <w:rPr>
@@ -11054,7 +11054,7 @@
               <w14:ligatures w14:val="standardContextual"/>
             </w:rPr>
           </w:pPr>
-          <w:hyperlink w:anchor="_Toc234841745" w:history="1">
+          <w:hyperlink w:anchor="_Toc234848269" w:history="1">
             <w:r>
               <w:rPr>
                 <w:rStyle w:val="Hyperlink"/>
@@ -11098,7 +11098,7 @@
                 <w:noProof/>
                 <w:webHidden/>
               </w:rPr>
-              <w:instrText xml:space="preserve"> PAGEREF _Toc234841745 \h </w:instrText>
+              <w:instrText xml:space="preserve"> PAGEREF _Toc234848269 \h </w:instrText>
             </w:r>
             <w:r>
               <w:rPr>
@@ -11144,7 +11144,7 @@
               <w14:ligatures w14:val="standardContextual"/>
             </w:rPr>
           </w:pPr>
-          <w:hyperlink w:anchor="_Toc234841746" w:history="1">
+          <w:hyperlink w:anchor="_Toc234848270" w:history="1">
             <w:r>
               <w:rPr>
                 <w:rStyle w:val="Hyperlink"/>
@@ -11188,7 +11188,7 @@
                 <w:noProof/>
                 <w:webHidden/>
               </w:rPr>
-              <w:instrText xml:space="preserve"> PAGEREF _Toc234841746 \h </w:instrText>
+              <w:instrText xml:space="preserve"> PAGEREF _Toc234848270 \h </w:instrText>
             </w:r>
             <w:r>
               <w:rPr>
@@ -11234,7 +11234,7 @@
               <w14:ligatures w14:val="standardContextual"/>
             </w:rPr>
           </w:pPr>
-          <w:hyperlink w:anchor="_Toc234841747" w:history="1">
+          <w:hyperlink w:anchor="_Toc234848271" w:history="1">
             <w:r>
               <w:rPr>
                 <w:rStyle w:val="Hyperlink"/>
@@ -11278,7 +11278,7 @@
                 <w:noProof/>
                 <w:webHidden/>
               </w:rPr>
-              <w:instrText xml:space="preserve"> PAGEREF _Toc234841747 \h </w:instrText>
+              <w:instrText xml:space="preserve"> PAGEREF _Toc234848271 \h </w:instrText>
             </w:r>
             <w:r>
               <w:rPr>
@@ -11324,7 +11324,7 @@
               <w14:ligatures w14:val="standardContextual"/>
             </w:rPr>
           </w:pPr>
-          <w:hyperlink w:anchor="_Toc234841748" w:history="1">
+          <w:hyperlink w:anchor="_Toc234848272" w:history="1">
             <w:r>
               <w:rPr>
                 <w:rStyle w:val="Hyperlink"/>
@@ -11368,7 +11368,7 @@
                 <w:noProof/>
                 <w:webHidden/>
               </w:rPr>
-              <w:instrText xml:space="preserve"> PAGEREF _Toc234841748 \h </w:instrText>
+              <w:instrText xml:space="preserve"> PAGEREF _Toc234848272 \h </w:instrText>
             </w:r>
             <w:r>
               <w:rPr>
@@ -11414,7 +11414,7 @@
               <w14:ligatures w14:val="standardContextual"/>
             </w:rPr>
           </w:pPr>
-          <w:hyperlink w:anchor="_Toc234841749" w:history="1">
+          <w:hyperlink w:anchor="_Toc234848273" w:history="1">
             <w:r>
               <w:rPr>
                 <w:rStyle w:val="Hyperlink"/>
@@ -11458,7 +11458,7 @@
                 <w:noProof/>
                 <w:webHidden/>
               </w:rPr>
-              <w:instrText xml:space="preserve"> PAGEREF _Toc234841749 \h </w:instrText>
+              <w:instrText xml:space="preserve"> PAGEREF _Toc234848273 \h </w:instrText>
             </w:r>
             <w:r>
               <w:rPr>
@@ -11504,7 +11504,7 @@
               <w14:ligatures w14:val="standardContextual"/>
             </w:rPr>
           </w:pPr>
-          <w:hyperlink w:anchor="_Toc234841750" w:history="1">
+          <w:hyperlink w:anchor="_Toc234848274" w:history="1">
             <w:r>
               <w:rPr>
                 <w:rStyle w:val="Hyperlink"/>
@@ -11548,7 +11548,7 @@
                 <w:noProof/>
                 <w:webHidden/>
               </w:rPr>
-              <w:instrText xml:space="preserve"> PAGEREF _Toc234841750 \h </w:instrText>
+              <w:instrText xml:space="preserve"> PAGEREF _Toc234848274 \h </w:instrText>
             </w:r>
             <w:r>
               <w:rPr>
@@ -11594,7 +11594,7 @@
               <w14:ligatures w14:val="standardContextual"/>
             </w:rPr>
           </w:pPr>
-          <w:hyperlink w:anchor="_Toc234841751" w:history="1">
+          <w:hyperlink w:anchor="_Toc234848275" w:history="1">
             <w:r>
               <w:rPr>
                 <w:rStyle w:val="Hyperlink"/>
@@ -11638,7 +11638,7 @@
                 <w:noProof/>
                 <w:webHidden/>
               </w:rPr>
-              <w:instrText xml:space="preserve"> PAGEREF _Toc234841751 \h </w:instrText>
+              <w:instrText xml:space="preserve"> PAGEREF _Toc234848275 \h </w:instrText>
             </w:r>
             <w:r>
               <w:rPr>
@@ -11684,7 +11684,7 @@
               <w14:ligatures w14:val="standardContextual"/>
             </w:rPr>
           </w:pPr>
-          <w:hyperlink w:anchor="_Toc234841752" w:history="1">
+          <w:hyperlink w:anchor="_Toc234848276" w:history="1">
             <w:r>
               <w:rPr>
                 <w:rStyle w:val="Hyperlink"/>
@@ -11728,7 +11728,7 @@
                 <w:noProof/>
                 <w:webHidden/>
               </w:rPr>
-              <w:instrText xml:space="preserve"> PAGEREF _Toc234841752 \h </w:instrText>
+              <w:instrText xml:space="preserve"> PAGEREF _Toc234848276 \h </w:instrText>
             </w:r>
             <w:r>
               <w:rPr>
@@ -11774,7 +11774,7 @@
               <w14:ligatures w14:val="standardContextual"/>
             </w:rPr>
           </w:pPr>
-          <w:hyperlink w:anchor="_Toc234841753" w:history="1">
+          <w:hyperlink w:anchor="_Toc234848277" w:history="1">
             <w:r>
               <w:rPr>
                 <w:rStyle w:val="Hyperlink"/>
@@ -11818,7 +11818,7 @@
                 <w:noProof/>
                 <w:webHidden/>
               </w:rPr>
-              <w:instrText xml:space="preserve"> PAGEREF _Toc234841753 \h </w:instrText>
+              <w:instrText xml:space="preserve"> PAGEREF _Toc234848277 \h </w:instrText>
             </w:r>
             <w:r>
               <w:rPr>
@@ -11864,7 +11864,7 @@
               <w14:ligatures w14:val="standardContextual"/>
             </w:rPr>
           </w:pPr>
-          <w:hyperlink w:anchor="_Toc234841754" w:history="1">
+          <w:hyperlink w:anchor="_Toc234848278" w:history="1">
             <w:r>
               <w:rPr>
                 <w:rStyle w:val="Hyperlink"/>
@@ -11908,7 +11908,7 @@
                 <w:noProof/>
                 <w:webHidden/>
               </w:rPr>
-              <w:instrText xml:space="preserve"> PAGEREF _Toc234841754 \h </w:instrText>
+              <w:instrText xml:space="preserve"> PAGEREF _Toc234848278 \h </w:instrText>
             </w:r>
             <w:r>
               <w:rPr>
@@ -11954,7 +11954,7 @@
               <w14:ligatures w14:val="standardContextual"/>
             </w:rPr>
           </w:pPr>
-          <w:hyperlink w:anchor="_Toc234841755" w:history="1">
+          <w:hyperlink w:anchor="_Toc234848279" w:history="1">
             <w:r>
               <w:rPr>
                 <w:rStyle w:val="Hyperlink"/>
@@ -11998,7 +11998,7 @@
                 <w:noProof/>
                 <w:webHidden/>
               </w:rPr>
-              <w:instrText xml:space="preserve"> PAGEREF _Toc234841755 \h </w:instrText>
+              <w:instrText xml:space="preserve"> PAGEREF _Toc234848279 \h </w:instrText>
             </w:r>
             <w:r>
               <w:rPr>
@@ -12044,7 +12044,7 @@
               <w14:ligatures w14:val="standardContextual"/>
             </w:rPr>
           </w:pPr>
-          <w:hyperlink w:anchor="_Toc234841756" w:history="1">
+          <w:hyperlink w:anchor="_Toc234848280" w:history="1">
             <w:r>
               <w:rPr>
                 <w:rStyle w:val="Hyperlink"/>
@@ -12088,7 +12088,7 @@
                 <w:noProof/>
                 <w:webHidden/>
               </w:rPr>
-              <w:instrText xml:space="preserve"> PAGEREF _Toc234841756 \h </w:instrText>
+              <w:instrText xml:space="preserve"> PAGEREF _Toc234848280 \h </w:instrText>
             </w:r>
             <w:r>
               <w:rPr>
@@ -12134,7 +12134,7 @@
               <w14:ligatures w14:val="standardContextual"/>
             </w:rPr>
           </w:pPr>
-          <w:hyperlink w:anchor="_Toc234841757" w:history="1">
+          <w:hyperlink w:anchor="_Toc234848281" w:history="1">
             <w:r>
               <w:rPr>
                 <w:rStyle w:val="Hyperlink"/>
@@ -12178,7 +12178,7 @@
                 <w:noProof/>
                 <w:webHidden/>
               </w:rPr>
-              <w:instrText xml:space="preserve"> PAGEREF _Toc234841757 \h </w:instrText>
+              <w:instrText xml:space="preserve"> PAGEREF _Toc234848281 \h </w:instrText>
             </w:r>
             <w:r>
               <w:rPr>
@@ -12224,7 +12224,7 @@
               <w14:ligatures w14:val="standardContextual"/>
             </w:rPr>
           </w:pPr>
-          <w:hyperlink w:anchor="_Toc234841758" w:history="1">
+          <w:hyperlink w:anchor="_Toc234848282" w:history="1">
             <w:r>
               <w:rPr>
                 <w:rStyle w:val="Hyperlink"/>
@@ -12268,7 +12268,7 @@
                 <w:noProof/>
                 <w:webHidden/>
               </w:rPr>
-              <w:instrText xml:space="preserve"> PAGEREF _Toc234841758 \h </w:instrText>
+              <w:instrText xml:space="preserve"> PAGEREF _Toc234848282 \h </w:instrText>
             </w:r>
             <w:r>
               <w:rPr>
@@ -12314,7 +12314,7 @@
               <w14:ligatures w14:val="standardContextual"/>
             </w:rPr>
           </w:pPr>
-          <w:hyperlink w:anchor="_Toc234841759" w:history="1">
+          <w:hyperlink w:anchor="_Toc234848283" w:history="1">
             <w:r>
               <w:rPr>
                 <w:rStyle w:val="Hyperlink"/>
@@ -12358,7 +12358,7 @@
                 <w:noProof/>
                 <w:webHidden/>
               </w:rPr>
-              <w:instrText xml:space="preserve"> PAGEREF _Toc234841759 \h </w:instrText>
+              <w:instrText xml:space="preserve"> PAGEREF _Toc234848283 \h </w:instrText>
             </w:r>
             <w:r>
               <w:rPr>
@@ -12404,7 +12404,7 @@
               <w14:ligatures w14:val="standardContextual"/>
             </w:rPr>
           </w:pPr>
-          <w:hyperlink w:anchor="_Toc234841760" w:history="1">
+          <w:hyperlink w:anchor="_Toc234848284" w:history="1">
             <w:r>
               <w:rPr>
                 <w:rStyle w:val="Hyperlink"/>
@@ -12448,7 +12448,7 @@
                 <w:noProof/>
                 <w:webHidden/>
               </w:rPr>
-              <w:instrText xml:space="preserve"> PAGEREF _Toc234841760 \h </w:instrText>
+              <w:instrText xml:space="preserve"> PAGEREF _Toc234848284 \h </w:instrText>
             </w:r>
             <w:r>
               <w:rPr>
@@ -12494,7 +12494,7 @@
               <w14:ligatures w14:val="standardContextual"/>
             </w:rPr>
           </w:pPr>
-          <w:hyperlink w:anchor="_Toc234841761" w:history="1">
+          <w:hyperlink w:anchor="_Toc234848285" w:history="1">
             <w:r>
               <w:rPr>
                 <w:rStyle w:val="Hyperlink"/>
@@ -12538,7 +12538,7 @@
                 <w:noProof/>
                 <w:webHidden/>
               </w:rPr>
-              <w:instrText xml:space="preserve"> PAGEREF _Toc234841761 \h </w:instrText>
+              <w:instrText xml:space="preserve"> PAGEREF _Toc234848285 \h </w:instrText>
             </w:r>
             <w:r>
               <w:rPr>
@@ -12581,7 +12581,7 @@
         <w:pStyle w:val="Heading1"/>
       </w:pPr>
       <w:bookmarkStart w:id="0" w:name="introduction"/>
-      <w:bookmarkStart w:id="1" w:name="_Toc234841623"/>
+      <w:bookmarkStart w:id="1" w:name="_Toc234848147"/>
       <w:r>
         <w:rPr>
           <w:rStyle w:val="SectionNumber"/>
@@ -12599,7 +12599,7 @@
         <w:pStyle w:val="Heading2"/>
       </w:pPr>
       <w:bookmarkStart w:id="2" w:name="what-classbuilder-is"/>
-      <w:bookmarkStart w:id="3" w:name="_Toc234841624"/>
+      <w:bookmarkStart w:id="3" w:name="_Toc234848148"/>
       <w:r>
         <w:rPr>
           <w:rStyle w:val="SectionNumber"/>
@@ -12934,7 +12934,7 @@
         <w:pStyle w:val="Heading2"/>
       </w:pPr>
       <w:bookmarkStart w:id="4" w:name="the-pieces"/>
-      <w:bookmarkStart w:id="5" w:name="_Toc234841625"/>
+      <w:bookmarkStart w:id="5" w:name="_Toc234848149"/>
       <w:bookmarkEnd w:id="2"/>
       <w:r>
         <w:rPr>
@@ -13175,7 +13175,7 @@
         <w:pStyle w:val="Heading2"/>
       </w:pPr>
       <w:bookmarkStart w:id="6" w:name="about-this-manual"/>
-      <w:bookmarkStart w:id="7" w:name="_Toc234841626"/>
+      <w:bookmarkStart w:id="7" w:name="_Toc234848150"/>
       <w:bookmarkEnd w:id="4"/>
       <w:r>
         <w:rPr>
@@ -13266,7 +13266,7 @@
         <w:pStyle w:val="Heading2"/>
       </w:pPr>
       <w:bookmarkStart w:id="8" w:name="notation-keyboard-shortcuts-per-platform"/>
-      <w:bookmarkStart w:id="9" w:name="_Toc234841627"/>
+      <w:bookmarkStart w:id="9" w:name="_Toc234848151"/>
       <w:bookmarkEnd w:id="6"/>
       <w:r>
         <w:rPr>
@@ -13746,7 +13746,7 @@
         <w:pStyle w:val="Heading1"/>
       </w:pPr>
       <w:bookmarkStart w:id="10" w:name="concepts-and-terminology"/>
-      <w:bookmarkStart w:id="11" w:name="_Toc234841628"/>
+      <w:bookmarkStart w:id="11" w:name="_Toc234848152"/>
       <w:bookmarkEnd w:id="0"/>
       <w:bookmarkEnd w:id="8"/>
       <w:r>
@@ -13766,7 +13766,7 @@
         <w:pStyle w:val="Heading2"/>
       </w:pPr>
       <w:bookmarkStart w:id="12" w:name="the-model"/>
-      <w:bookmarkStart w:id="13" w:name="_Toc234841629"/>
+      <w:bookmarkStart w:id="13" w:name="_Toc234848153"/>
       <w:r>
         <w:rPr>
           <w:rStyle w:val="SectionNumber"/>
@@ -14097,7 +14097,7 @@
         <w:pStyle w:val="Heading2"/>
       </w:pPr>
       <w:bookmarkStart w:id="14" w:name="class-features"/>
-      <w:bookmarkStart w:id="15" w:name="_Toc234841630"/>
+      <w:bookmarkStart w:id="15" w:name="_Toc234848154"/>
       <w:bookmarkEnd w:id="12"/>
       <w:r>
         <w:rPr>
@@ -14323,7 +14323,7 @@
         <w:pStyle w:val="Heading2"/>
       </w:pPr>
       <w:bookmarkStart w:id="16" w:name="phases"/>
-      <w:bookmarkStart w:id="17" w:name="_Toc234841631"/>
+      <w:bookmarkStart w:id="17" w:name="_Toc234848155"/>
       <w:bookmarkEnd w:id="14"/>
       <w:r>
         <w:rPr>
@@ -14370,7 +14370,7 @@
         <w:pStyle w:val="Heading2"/>
       </w:pPr>
       <w:bookmarkStart w:id="18" w:name="generated-vs.-user-code"/>
-      <w:bookmarkStart w:id="19" w:name="_Toc234841632"/>
+      <w:bookmarkStart w:id="19" w:name="_Toc234848156"/>
       <w:bookmarkEnd w:id="16"/>
       <w:r>
         <w:rPr>
@@ -14494,7 +14494,7 @@
         <w:pStyle w:val="Heading1"/>
       </w:pPr>
       <w:bookmarkStart w:id="20" w:name="installation-and-project-files"/>
-      <w:bookmarkStart w:id="21" w:name="_Toc234841633"/>
+      <w:bookmarkStart w:id="21" w:name="_Toc234848157"/>
       <w:bookmarkEnd w:id="10"/>
       <w:bookmarkEnd w:id="18"/>
       <w:r>
@@ -14514,7 +14514,7 @@
         <w:pStyle w:val="Heading2"/>
       </w:pPr>
       <w:bookmarkStart w:id="22" w:name="the-application"/>
-      <w:bookmarkStart w:id="23" w:name="_Toc234841634"/>
+      <w:bookmarkStart w:id="23" w:name="_Toc234848158"/>
       <w:r>
         <w:rPr>
           <w:rStyle w:val="SectionNumber"/>
@@ -14555,7 +14555,7 @@
         <w:pStyle w:val="Heading2"/>
       </w:pPr>
       <w:bookmarkStart w:id="24" w:name="X3666ad84e793a543abb57792ece33f71c988788"/>
-      <w:bookmarkStart w:id="25" w:name="_Toc234841635"/>
+      <w:bookmarkStart w:id="25" w:name="_Toc234848159"/>
       <w:bookmarkEnd w:id="22"/>
       <w:r>
         <w:rPr>
@@ -14927,7 +14927,7 @@
         <w:pStyle w:val="Heading2"/>
       </w:pPr>
       <w:bookmarkStart w:id="26" w:name="stdafx.h-the-one-file-you-write"/>
-      <w:bookmarkStart w:id="27" w:name="_Toc234841636"/>
+      <w:bookmarkStart w:id="27" w:name="_Toc234848160"/>
       <w:bookmarkEnd w:id="24"/>
       <w:r>
         <w:rPr>
@@ -15201,7 +15201,7 @@
         <w:pStyle w:val="Heading2"/>
       </w:pPr>
       <w:bookmarkStart w:id="28" w:name="output-locations"/>
-      <w:bookmarkStart w:id="29" w:name="_Toc234841637"/>
+      <w:bookmarkStart w:id="29" w:name="_Toc234848161"/>
       <w:bookmarkEnd w:id="26"/>
       <w:r>
         <w:rPr>
@@ -15274,7 +15274,7 @@
         <w:pStyle w:val="Heading1"/>
       </w:pPr>
       <w:bookmarkStart w:id="30" w:name="quick-start-the-matrix-model"/>
-      <w:bookmarkStart w:id="31" w:name="_Toc234841638"/>
+      <w:bookmarkStart w:id="31" w:name="_Toc234848162"/>
       <w:bookmarkEnd w:id="20"/>
       <w:bookmarkEnd w:id="28"/>
       <w:r>
@@ -15389,7 +15389,7 @@
           <w:noProof/>
         </w:rPr>
         <w:drawing>
-          <wp:inline distT="0" distB="0" distL="0" distR="0" wp14:anchorId="74287C28" wp14:editId="502FFB4C">
+          <wp:inline distT="0" distB="0" distL="0" distR="0" wp14:anchorId="78987C88" wp14:editId="0CEE6B5D">
             <wp:extent cx="5334000" cy="4712710"/>
             <wp:effectExtent l="0" t="0" r="0" b="0"/>
             <wp:docPr id="36" name="Picture" descr="The ClassBuilder shell with the Matrix model open: menu bar, toolbar, and the model tree (diagrams, classes, members, methods, relation methods)."/>
@@ -15444,7 +15444,7 @@
         <w:pStyle w:val="Heading2"/>
       </w:pPr>
       <w:bookmarkStart w:id="32" w:name="step-1-create-the-model"/>
-      <w:bookmarkStart w:id="33" w:name="_Toc234841639"/>
+      <w:bookmarkStart w:id="33" w:name="_Toc234848163"/>
       <w:r>
         <w:rPr>
           <w:rStyle w:val="SectionNumber"/>
@@ -15480,7 +15480,7 @@
           <w:noProof/>
         </w:rPr>
         <w:drawing>
-          <wp:inline distT="0" distB="0" distL="0" distR="0" wp14:anchorId="5BC87AAF" wp14:editId="351770E1">
+          <wp:inline distT="0" distB="0" distL="0" distR="0" wp14:anchorId="31998F4D" wp14:editId="6B1B3F82">
             <wp:extent cx="5334000" cy="4578112"/>
             <wp:effectExtent l="0" t="0" r="0" b="0"/>
             <wp:docPr id="39" name="Picture" descr="Creating a serialize-enabled model: DataModel name “Matrix”, master include file “MatrixInclude.h”, document class “Matrix”. The master include cannot be named Matrix.h — the Matrix class itself generates that file. Tick Serialize here: it is a one-off choice, made at creation — in the Project ▸ Settings dialog of an existing model the checkbox shows locked."/>
@@ -15639,7 +15639,7 @@
         <w:pStyle w:val="Heading2"/>
       </w:pPr>
       <w:bookmarkStart w:id="34" w:name="step-2-add-the-classes"/>
-      <w:bookmarkStart w:id="35" w:name="_Toc234841640"/>
+      <w:bookmarkStart w:id="35" w:name="_Toc234848164"/>
       <w:bookmarkEnd w:id="32"/>
       <w:r>
         <w:rPr>
@@ -15724,7 +15724,7 @@
           <w:noProof/>
         </w:rPr>
         <w:drawing>
-          <wp:inline distT="0" distB="0" distL="0" distR="0" wp14:anchorId="5F523164" wp14:editId="6F3DB85F">
+          <wp:inline distT="0" distB="0" distL="0" distR="0" wp14:anchorId="0F604375" wp14:editId="7B08A243">
             <wp:extent cx="4993049" cy="4495445"/>
             <wp:effectExtent l="0" t="0" r="0" b="0"/>
             <wp:docPr id="43" name="Picture" descr="The Class dialog. With Serialize ticked, the class inherits the model’s document-object root automatically."/>
@@ -15779,7 +15779,7 @@
         <w:pStyle w:val="Heading2"/>
       </w:pPr>
       <w:bookmarkStart w:id="36" w:name="step-3-add-members"/>
-      <w:bookmarkStart w:id="37" w:name="_Toc234841641"/>
+      <w:bookmarkStart w:id="37" w:name="_Toc234848165"/>
       <w:bookmarkEnd w:id="34"/>
       <w:r>
         <w:rPr>
@@ -15997,7 +15997,7 @@
           <w:noProof/>
         </w:rPr>
         <w:drawing>
-          <wp:inline distT="0" distB="0" distL="0" distR="0" wp14:anchorId="2DD6F5B2" wp14:editId="2A9C77C5">
+          <wp:inline distT="0" distB="0" distL="0" distR="0" wp14:anchorId="1545DE7A" wp14:editId="3474A4CB">
             <wp:extent cx="5334000" cy="6093588"/>
             <wp:effectExtent l="0" t="0" r="0" b="0"/>
             <wp:docPr id="47" name="Picture" descr="The Member dialog. Getter/setter generation and the serialize flag are per-member choices."/>
@@ -16052,7 +16052,7 @@
         <w:pStyle w:val="Heading2"/>
       </w:pPr>
       <w:bookmarkStart w:id="38" w:name="step-4-add-the-relations"/>
-      <w:bookmarkStart w:id="39" w:name="_Toc234841642"/>
+      <w:bookmarkStart w:id="39" w:name="_Toc234848166"/>
       <w:bookmarkEnd w:id="36"/>
       <w:r>
         <w:rPr>
@@ -16402,7 +16402,7 @@
           <w:noProof/>
         </w:rPr>
         <w:drawing>
-          <wp:inline distT="0" distB="0" distL="0" distR="0" wp14:anchorId="4FAB8CB1" wp14:editId="03415120">
+          <wp:inline distT="0" distB="0" distL="0" distR="0" wp14:anchorId="79E2DB9B" wp14:editId="0F0FBDAD">
             <wp:extent cx="5184435" cy="5069603"/>
             <wp:effectExtent l="0" t="0" r="0" b="0"/>
             <wp:docPr id="51" name="Picture" descr="A relation: kind, ownership, thread-safety, and container implementation are all declared here — the code is generated."/>
@@ -16457,7 +16457,7 @@
         <w:pStyle w:val="Heading2"/>
       </w:pPr>
       <w:bookmarkStart w:id="40" w:name="X267736c760e32dc6d865ac46fc2c6b29b8f25a5"/>
-      <w:bookmarkStart w:id="41" w:name="_Toc234841643"/>
+      <w:bookmarkStart w:id="41" w:name="_Toc234848167"/>
       <w:bookmarkEnd w:id="38"/>
       <w:r>
         <w:rPr>
@@ -17210,7 +17210,7 @@
         <w:pStyle w:val="Heading2"/>
       </w:pPr>
       <w:bookmarkStart w:id="42" w:name="step-6-a-find-method"/>
-      <w:bookmarkStart w:id="43" w:name="_Toc234841644"/>
+      <w:bookmarkStart w:id="43" w:name="_Toc234848168"/>
       <w:bookmarkEnd w:id="40"/>
       <w:r>
         <w:rPr>
@@ -17278,7 +17278,7 @@
           <w:noProof/>
         </w:rPr>
         <w:drawing>
-          <wp:inline distT="0" distB="0" distL="0" distR="0" wp14:anchorId="7BD1DE89" wp14:editId="3D532A87">
+          <wp:inline distT="0" distB="0" distL="0" distR="0" wp14:anchorId="69EC4CC5" wp14:editId="294A00E0">
             <wp:extent cx="5334000" cy="3242844"/>
             <wp:effectExtent l="0" t="0" r="0" b="0"/>
             <wp:docPr id="56" name="Picture" descr="The Find Method dialog on the Matrix→Row relation: the argument map pairs the method’s arguments with the members to compare — here -&gt;GetId(). In the tree behind it, the generated method appears as a child of the Row relation item, as a sibling above its Relation methods folder."/>
@@ -17701,7 +17701,7 @@
         <w:pStyle w:val="Heading2"/>
       </w:pPr>
       <w:bookmarkStart w:id="44" w:name="step-7-a-class-diagram"/>
-      <w:bookmarkStart w:id="45" w:name="_Toc234841645"/>
+      <w:bookmarkStart w:id="45" w:name="_Toc234848169"/>
       <w:bookmarkEnd w:id="42"/>
       <w:r>
         <w:rPr>
@@ -17771,7 +17771,7 @@
           <w:noProof/>
         </w:rPr>
         <w:drawing>
-          <wp:inline distT="0" distB="0" distL="0" distR="0" wp14:anchorId="3A935815" wp14:editId="41A6EBB4">
+          <wp:inline distT="0" distB="0" distL="0" distR="0" wp14:anchorId="17106D04" wp14:editId="6C32EB8C">
             <wp:extent cx="5334000" cy="3170559"/>
             <wp:effectExtent l="0" t="0" r="0" b="0"/>
             <wp:docPr id="60" name="Picture" descr="The Matrix Overview class diagram as exported by ClassBuilder (Export SVG). Diamonds mark owned (aggregation) relations; 1/* are the multiplicities."/>
@@ -17839,7 +17839,7 @@
           <w:noProof/>
         </w:rPr>
         <w:drawing>
-          <wp:inline distT="0" distB="0" distL="0" distR="0" wp14:anchorId="3BAD3C92" wp14:editId="7FF98141">
+          <wp:inline distT="0" distB="0" distL="0" distR="0" wp14:anchorId="7883436E" wp14:editId="5EBED09D">
             <wp:extent cx="5334000" cy="3757996"/>
             <wp:effectExtent l="0" t="0" r="0" b="0"/>
             <wp:docPr id="64" name="Picture" descr="A diagram view opens floating over the shell — this is the initial state of every diagram view."/>
@@ -17908,7 +17908,7 @@
           <w:noProof/>
         </w:rPr>
         <w:drawing>
-          <wp:inline distT="0" distB="0" distL="0" distR="0" wp14:anchorId="21E0A11D" wp14:editId="41918ACF">
+          <wp:inline distT="0" distB="0" distL="0" distR="0" wp14:anchorId="59560867" wp14:editId="548D2A70">
             <wp:extent cx="5334000" cy="4302439"/>
             <wp:effectExtent l="0" t="0" r="0" b="0"/>
             <wp:docPr id="67" name="Picture" descr="The same view docked: drag it onto an edge of the main window — here the right edge, giving the usual tree-beside-diagram split; the top and bottom edges split horizontally the same way."/>
@@ -17977,7 +17977,7 @@
           <w:noProof/>
         </w:rPr>
         <w:drawing>
-          <wp:inline distT="0" distB="0" distL="0" distR="0" wp14:anchorId="078706A9" wp14:editId="6217449A">
+          <wp:inline distT="0" distB="0" distL="0" distR="0" wp14:anchorId="46A1EE6B" wp14:editId="4D444FA5">
             <wp:extent cx="5334000" cy="4302439"/>
             <wp:effectExtent l="0" t="0" r="0" b="0"/>
             <wp:docPr id="70" name="Picture" descr="Or tabbed: drop it onto the tree’s tab bar and the views share the full window, one tab each."/>
@@ -18042,7 +18042,7 @@
         <w:pStyle w:val="Heading2"/>
       </w:pPr>
       <w:bookmarkStart w:id="46" w:name="step-8-generate-the-source"/>
-      <w:bookmarkStart w:id="47" w:name="_Toc234841646"/>
+      <w:bookmarkStart w:id="47" w:name="_Toc234848170"/>
       <w:bookmarkEnd w:id="44"/>
       <w:r>
         <w:rPr>
@@ -19115,7 +19115,7 @@
         <w:pStyle w:val="Heading2"/>
       </w:pPr>
       <w:bookmarkStart w:id="48" w:name="step-9-compile-and-run"/>
-      <w:bookmarkStart w:id="49" w:name="_Toc234841647"/>
+      <w:bookmarkStart w:id="49" w:name="_Toc234848171"/>
       <w:bookmarkEnd w:id="46"/>
       <w:r>
         <w:rPr>
@@ -20634,7 +20634,7 @@
         <w:pStyle w:val="Heading2"/>
       </w:pPr>
       <w:bookmarkStart w:id="50" w:name="step-10-the-round-trip"/>
-      <w:bookmarkStart w:id="51" w:name="_Toc234841648"/>
+      <w:bookmarkStart w:id="51" w:name="_Toc234848172"/>
       <w:bookmarkEnd w:id="48"/>
       <w:r>
         <w:rPr>
@@ -20699,7 +20699,7 @@
         <w:pStyle w:val="Heading1"/>
       </w:pPr>
       <w:bookmarkStart w:id="52" w:name="reference-the-application-shell"/>
-      <w:bookmarkStart w:id="53" w:name="_Toc234841649"/>
+      <w:bookmarkStart w:id="53" w:name="_Toc234848173"/>
       <w:bookmarkEnd w:id="30"/>
       <w:bookmarkEnd w:id="50"/>
       <w:r>
@@ -20719,7 +20719,7 @@
         <w:pStyle w:val="Heading2"/>
       </w:pPr>
       <w:bookmarkStart w:id="54" w:name="menus"/>
-      <w:bookmarkStart w:id="55" w:name="_Toc234841650"/>
+      <w:bookmarkStart w:id="55" w:name="_Toc234848174"/>
       <w:r>
         <w:rPr>
           <w:rStyle w:val="SectionNumber"/>
@@ -21055,7 +21055,7 @@
         <w:pStyle w:val="Heading2"/>
       </w:pPr>
       <w:bookmarkStart w:id="56" w:name="the-main-toolbar"/>
-      <w:bookmarkStart w:id="57" w:name="_Toc234841651"/>
+      <w:bookmarkStart w:id="57" w:name="_Toc234848175"/>
       <w:bookmarkEnd w:id="54"/>
       <w:r>
         <w:rPr>
@@ -21378,7 +21378,7 @@
           <w:noProof/>
         </w:rPr>
         <w:drawing>
-          <wp:inline distT="0" distB="0" distL="0" distR="0" wp14:anchorId="31AFC587" wp14:editId="3F399001">
+          <wp:inline distT="0" distB="0" distL="0" distR="0" wp14:anchorId="50B03F70" wp14:editId="147E8501">
             <wp:extent cx="5307773" cy="497603"/>
             <wp:effectExtent l="0" t="0" r="0" b="0"/>
             <wp:docPr id="79" name="Picture" descr="The main toolbar: New, Open, Save, then Read Source and Write Source."/>
@@ -21433,7 +21433,7 @@
         <w:pStyle w:val="Heading2"/>
       </w:pPr>
       <w:bookmarkStart w:id="58" w:name="docking"/>
-      <w:bookmarkStart w:id="59" w:name="_Toc234841652"/>
+      <w:bookmarkStart w:id="59" w:name="_Toc234848176"/>
       <w:bookmarkEnd w:id="56"/>
       <w:r>
         <w:rPr>
@@ -21581,7 +21581,7 @@
         <w:pStyle w:val="Heading2"/>
       </w:pPr>
       <w:bookmarkStart w:id="60" w:name="platforms-and-keys"/>
-      <w:bookmarkStart w:id="61" w:name="_Toc234841653"/>
+      <w:bookmarkStart w:id="61" w:name="_Toc234848177"/>
       <w:bookmarkEnd w:id="58"/>
       <w:r>
         <w:rPr>
@@ -21715,7 +21715,7 @@
         <w:pStyle w:val="Heading1"/>
       </w:pPr>
       <w:bookmarkStart w:id="62" w:name="reference-the-main-tree-view"/>
-      <w:bookmarkStart w:id="63" w:name="_Toc234841654"/>
+      <w:bookmarkStart w:id="63" w:name="_Toc234848178"/>
       <w:bookmarkEnd w:id="52"/>
       <w:bookmarkEnd w:id="60"/>
       <w:r>
@@ -21743,7 +21743,7 @@
         <w:pStyle w:val="Heading2"/>
       </w:pPr>
       <w:bookmarkStart w:id="64" w:name="what-the-tree-shows"/>
-      <w:bookmarkStart w:id="65" w:name="_Toc234841655"/>
+      <w:bookmarkStart w:id="65" w:name="_Toc234848179"/>
       <w:r>
         <w:rPr>
           <w:rStyle w:val="SectionNumber"/>
@@ -21809,7 +21809,7 @@
         <w:pStyle w:val="Heading2"/>
       </w:pPr>
       <w:bookmarkStart w:id="66" w:name="the-tree-toolbar"/>
-      <w:bookmarkStart w:id="67" w:name="_Toc234841656"/>
+      <w:bookmarkStart w:id="67" w:name="_Toc234848180"/>
       <w:bookmarkEnd w:id="64"/>
       <w:r>
         <w:rPr>
@@ -22740,7 +22740,7 @@
           <w:noProof/>
         </w:rPr>
         <w:drawing>
-          <wp:inline distT="0" distB="0" distL="0" distR="0" wp14:anchorId="1E56468A" wp14:editId="6EDCDD3E">
+          <wp:inline distT="0" distB="0" distL="0" distR="0" wp14:anchorId="54C13E9F" wp14:editId="148C29A3">
             <wp:extent cx="5334000" cy="307193"/>
             <wp:effectExtent l="0" t="0" r="0" b="0"/>
             <wp:docPr id="87" name="Picture" descr="The tree toolbar, in the order of the table above: the Add buttons, then Delete, Filters, Find/Next, and the per-view Undo/Redo."/>
@@ -22795,7 +22795,7 @@
         <w:pStyle w:val="Heading2"/>
       </w:pPr>
       <w:bookmarkStart w:id="68" w:name="the-element-icons"/>
-      <w:bookmarkStart w:id="69" w:name="_Toc234841657"/>
+      <w:bookmarkStart w:id="69" w:name="_Toc234848181"/>
       <w:bookmarkEnd w:id="66"/>
       <w:r>
         <w:rPr>
@@ -22922,7 +22922,7 @@
                 <w:noProof/>
               </w:rPr>
               <w:drawing>
-                <wp:inline distT="0" distB="0" distL="0" distR="0" wp14:anchorId="2A208DCF" wp14:editId="3DED0276">
+                <wp:inline distT="0" distB="0" distL="0" distR="0" wp14:anchorId="60261DD1" wp14:editId="3152BF55">
                   <wp:extent cx="152400" cy="152400"/>
                   <wp:effectExtent l="0" t="0" r="0" b="0"/>
                   <wp:docPr id="91" name="Picture"/>
@@ -23000,7 +23000,7 @@
                 <w:noProof/>
               </w:rPr>
               <w:drawing>
-                <wp:inline distT="0" distB="0" distL="0" distR="0" wp14:anchorId="48842E8D" wp14:editId="11FAAE38">
+                <wp:inline distT="0" distB="0" distL="0" distR="0" wp14:anchorId="4E82E2A4" wp14:editId="0E3D815A">
                   <wp:extent cx="152400" cy="152400"/>
                   <wp:effectExtent l="0" t="0" r="0" b="0"/>
                   <wp:docPr id="94" name="Picture"/>
@@ -23080,7 +23080,7 @@
                 <w:noProof/>
               </w:rPr>
               <w:drawing>
-                <wp:inline distT="0" distB="0" distL="0" distR="0" wp14:anchorId="58FA4966" wp14:editId="14DEAA98">
+                <wp:inline distT="0" distB="0" distL="0" distR="0" wp14:anchorId="68981004" wp14:editId="2CAB5DBE">
                   <wp:extent cx="152400" cy="152400"/>
                   <wp:effectExtent l="0" t="0" r="0" b="0"/>
                   <wp:docPr id="97" name="Picture"/>
@@ -23158,7 +23158,7 @@
                 <w:noProof/>
               </w:rPr>
               <w:drawing>
-                <wp:inline distT="0" distB="0" distL="0" distR="0" wp14:anchorId="3D434935" wp14:editId="595C54BD">
+                <wp:inline distT="0" distB="0" distL="0" distR="0" wp14:anchorId="45381844" wp14:editId="1407C52B">
                   <wp:extent cx="152400" cy="152400"/>
                   <wp:effectExtent l="0" t="0" r="0" b="0"/>
                   <wp:docPr id="100" name="Picture"/>
@@ -23238,7 +23238,7 @@
                 <w:noProof/>
               </w:rPr>
               <w:drawing>
-                <wp:inline distT="0" distB="0" distL="0" distR="0" wp14:anchorId="462BB25F" wp14:editId="1566CCF1">
+                <wp:inline distT="0" distB="0" distL="0" distR="0" wp14:anchorId="0923BBA5" wp14:editId="3AE2652F">
                   <wp:extent cx="152400" cy="152400"/>
                   <wp:effectExtent l="0" t="0" r="0" b="0"/>
                   <wp:docPr id="103" name="Picture"/>
@@ -23316,7 +23316,7 @@
                 <w:noProof/>
               </w:rPr>
               <w:drawing>
-                <wp:inline distT="0" distB="0" distL="0" distR="0" wp14:anchorId="23D0F8A4" wp14:editId="22DF832C">
+                <wp:inline distT="0" distB="0" distL="0" distR="0" wp14:anchorId="1A50976A" wp14:editId="20CD8118">
                   <wp:extent cx="152400" cy="152400"/>
                   <wp:effectExtent l="0" t="0" r="0" b="0"/>
                   <wp:docPr id="106" name="Picture"/>
@@ -23396,7 +23396,7 @@
                 <w:noProof/>
               </w:rPr>
               <w:drawing>
-                <wp:inline distT="0" distB="0" distL="0" distR="0" wp14:anchorId="73B7EF6B" wp14:editId="7268E42A">
+                <wp:inline distT="0" distB="0" distL="0" distR="0" wp14:anchorId="06DE496B" wp14:editId="18B33D3A">
                   <wp:extent cx="152400" cy="152400"/>
                   <wp:effectExtent l="0" t="0" r="0" b="0"/>
                   <wp:docPr id="109" name="Picture"/>
@@ -23474,7 +23474,7 @@
                 <w:noProof/>
               </w:rPr>
               <w:drawing>
-                <wp:inline distT="0" distB="0" distL="0" distR="0" wp14:anchorId="3D0608AF" wp14:editId="2B87EAEE">
+                <wp:inline distT="0" distB="0" distL="0" distR="0" wp14:anchorId="2F40AC1E" wp14:editId="5F17D0C4">
                   <wp:extent cx="152400" cy="152400"/>
                   <wp:effectExtent l="0" t="0" r="0" b="0"/>
                   <wp:docPr id="112" name="Picture"/>
@@ -23554,7 +23554,7 @@
                 <w:noProof/>
               </w:rPr>
               <w:drawing>
-                <wp:inline distT="0" distB="0" distL="0" distR="0" wp14:anchorId="184C7FA2" wp14:editId="49C93527">
+                <wp:inline distT="0" distB="0" distL="0" distR="0" wp14:anchorId="2FB0CF30" wp14:editId="2D093211">
                   <wp:extent cx="152400" cy="152400"/>
                   <wp:effectExtent l="0" t="0" r="0" b="0"/>
                   <wp:docPr id="115" name="Picture"/>
@@ -23632,7 +23632,7 @@
                 <w:noProof/>
               </w:rPr>
               <w:drawing>
-                <wp:inline distT="0" distB="0" distL="0" distR="0" wp14:anchorId="47090810" wp14:editId="4087210F">
+                <wp:inline distT="0" distB="0" distL="0" distR="0" wp14:anchorId="54D2708B" wp14:editId="28347172">
                   <wp:extent cx="152400" cy="152400"/>
                   <wp:effectExtent l="0" t="0" r="0" b="0"/>
                   <wp:docPr id="118" name="Picture"/>
@@ -23711,7 +23711,7 @@
           <w:noProof/>
         </w:rPr>
         <w:drawing>
-          <wp:inline distT="0" distB="0" distL="0" distR="0" wp14:anchorId="1B0C0EB9" wp14:editId="389D939E">
+          <wp:inline distT="0" distB="0" distL="0" distR="0" wp14:anchorId="7EF0D9EF" wp14:editId="78E59683">
             <wp:extent cx="152400" cy="152400"/>
             <wp:effectExtent l="0" t="0" r="0" b="0"/>
             <wp:docPr id="121" name="Picture"/>
@@ -23769,7 +23769,7 @@
           <w:noProof/>
         </w:rPr>
         <w:drawing>
-          <wp:inline distT="0" distB="0" distL="0" distR="0" wp14:anchorId="1034E806" wp14:editId="58B5D691">
+          <wp:inline distT="0" distB="0" distL="0" distR="0" wp14:anchorId="1ACC26FD" wp14:editId="25007414">
             <wp:extent cx="152400" cy="152400"/>
             <wp:effectExtent l="0" t="0" r="0" b="0"/>
             <wp:docPr id="124" name="Picture"/>
@@ -23827,7 +23827,7 @@
           <w:noProof/>
         </w:rPr>
         <w:drawing>
-          <wp:inline distT="0" distB="0" distL="0" distR="0" wp14:anchorId="52F54ED8" wp14:editId="27DE89F7">
+          <wp:inline distT="0" distB="0" distL="0" distR="0" wp14:anchorId="1D71F7A3" wp14:editId="3835EFEC">
             <wp:extent cx="152400" cy="152400"/>
             <wp:effectExtent l="0" t="0" r="0" b="0"/>
             <wp:docPr id="126" name="Picture"/>
@@ -23936,7 +23936,7 @@
                 <w:noProof/>
               </w:rPr>
               <w:drawing>
-                <wp:inline distT="0" distB="0" distL="0" distR="0" wp14:anchorId="1F5F85E0" wp14:editId="2E9F9E3E">
+                <wp:inline distT="0" distB="0" distL="0" distR="0" wp14:anchorId="0842040F" wp14:editId="67A26653">
                   <wp:extent cx="152400" cy="152400"/>
                   <wp:effectExtent l="0" t="0" r="0" b="0"/>
                   <wp:docPr id="129" name="Picture"/>
@@ -24001,7 +24001,7 @@
                 <w:noProof/>
               </w:rPr>
               <w:drawing>
-                <wp:inline distT="0" distB="0" distL="0" distR="0" wp14:anchorId="3C868F62" wp14:editId="11377ACC">
+                <wp:inline distT="0" distB="0" distL="0" distR="0" wp14:anchorId="5C3C64CD" wp14:editId="13F406D5">
                   <wp:extent cx="152400" cy="152400"/>
                   <wp:effectExtent l="0" t="0" r="0" b="0"/>
                   <wp:docPr id="132" name="Picture"/>
@@ -24066,7 +24066,7 @@
                 <w:noProof/>
               </w:rPr>
               <w:drawing>
-                <wp:inline distT="0" distB="0" distL="0" distR="0" wp14:anchorId="186E8F92" wp14:editId="64869500">
+                <wp:inline distT="0" distB="0" distL="0" distR="0" wp14:anchorId="13B6E49C" wp14:editId="6A6CF63B">
                   <wp:extent cx="152400" cy="152400"/>
                   <wp:effectExtent l="0" t="0" r="0" b="0"/>
                   <wp:docPr id="135" name="Picture"/>
@@ -24131,7 +24131,7 @@
                 <w:noProof/>
               </w:rPr>
               <w:drawing>
-                <wp:inline distT="0" distB="0" distL="0" distR="0" wp14:anchorId="1A0F0D59" wp14:editId="4E7FDBD5">
+                <wp:inline distT="0" distB="0" distL="0" distR="0" wp14:anchorId="712F3329" wp14:editId="3ACAA428">
                   <wp:extent cx="152400" cy="152400"/>
                   <wp:effectExtent l="0" t="0" r="0" b="0"/>
                   <wp:docPr id="138" name="Picture"/>
@@ -24276,7 +24276,7 @@
                 <w:noProof/>
               </w:rPr>
               <w:drawing>
-                <wp:inline distT="0" distB="0" distL="0" distR="0" wp14:anchorId="1A2165AE" wp14:editId="0E467BE3">
+                <wp:inline distT="0" distB="0" distL="0" distR="0" wp14:anchorId="0B085A8A" wp14:editId="5A8628F6">
                   <wp:extent cx="152400" cy="152400"/>
                   <wp:effectExtent l="0" t="0" r="0" b="0"/>
                   <wp:docPr id="140" name="Picture"/>
@@ -24341,7 +24341,7 @@
                 <w:noProof/>
               </w:rPr>
               <w:drawing>
-                <wp:inline distT="0" distB="0" distL="0" distR="0" wp14:anchorId="410B655E" wp14:editId="6D3C9FF0">
+                <wp:inline distT="0" distB="0" distL="0" distR="0" wp14:anchorId="67DE547C" wp14:editId="575C0132">
                   <wp:extent cx="152400" cy="152400"/>
                   <wp:effectExtent l="0" t="0" r="0" b="0"/>
                   <wp:docPr id="143" name="Picture"/>
@@ -24406,7 +24406,7 @@
                 <w:noProof/>
               </w:rPr>
               <w:drawing>
-                <wp:inline distT="0" distB="0" distL="0" distR="0" wp14:anchorId="49D09D64" wp14:editId="6332F20C">
+                <wp:inline distT="0" distB="0" distL="0" distR="0" wp14:anchorId="7FA6C76F" wp14:editId="3C3DD939">
                   <wp:extent cx="152400" cy="152400"/>
                   <wp:effectExtent l="0" t="0" r="0" b="0"/>
                   <wp:docPr id="146" name="Picture"/>
@@ -24539,7 +24539,7 @@
                 <w:noProof/>
               </w:rPr>
               <w:drawing>
-                <wp:inline distT="0" distB="0" distL="0" distR="0" wp14:anchorId="347CA5B4" wp14:editId="2CEDC116">
+                <wp:inline distT="0" distB="0" distL="0" distR="0" wp14:anchorId="2BC328C4" wp14:editId="78FF9E7F">
                   <wp:extent cx="152400" cy="152400"/>
                   <wp:effectExtent l="0" t="0" r="0" b="0"/>
                   <wp:docPr id="148" name="Picture"/>
@@ -24604,7 +24604,7 @@
                 <w:noProof/>
               </w:rPr>
               <w:drawing>
-                <wp:inline distT="0" distB="0" distL="0" distR="0" wp14:anchorId="3815228A" wp14:editId="1DDACECB">
+                <wp:inline distT="0" distB="0" distL="0" distR="0" wp14:anchorId="0170704B" wp14:editId="51908DFD">
                   <wp:extent cx="152400" cy="152400"/>
                   <wp:effectExtent l="0" t="0" r="0" b="0"/>
                   <wp:docPr id="151" name="Picture"/>
@@ -24669,7 +24669,7 @@
                 <w:noProof/>
               </w:rPr>
               <w:drawing>
-                <wp:inline distT="0" distB="0" distL="0" distR="0" wp14:anchorId="6E3C003C" wp14:editId="0EE1EA5F">
+                <wp:inline distT="0" distB="0" distL="0" distR="0" wp14:anchorId="31A40B36" wp14:editId="7D4EF5EC">
                   <wp:extent cx="152400" cy="152400"/>
                   <wp:effectExtent l="0" t="0" r="0" b="0"/>
                   <wp:docPr id="154" name="Picture"/>
@@ -24734,7 +24734,7 @@
                 <w:noProof/>
               </w:rPr>
               <w:drawing>
-                <wp:inline distT="0" distB="0" distL="0" distR="0" wp14:anchorId="0BE8F9A2" wp14:editId="03BD7B65">
+                <wp:inline distT="0" distB="0" distL="0" distR="0" wp14:anchorId="593D60BC" wp14:editId="22B4EBD5">
                   <wp:extent cx="152400" cy="152400"/>
                   <wp:effectExtent l="0" t="0" r="0" b="0"/>
                   <wp:docPr id="157" name="Picture"/>
@@ -24972,7 +24972,7 @@
                 <w:noProof/>
               </w:rPr>
               <w:drawing>
-                <wp:inline distT="0" distB="0" distL="0" distR="0" wp14:anchorId="1733865E" wp14:editId="2EB6923A">
+                <wp:inline distT="0" distB="0" distL="0" distR="0" wp14:anchorId="11C81490" wp14:editId="43C9850B">
                   <wp:extent cx="152400" cy="152400"/>
                   <wp:effectExtent l="0" t="0" r="0" b="0"/>
                   <wp:docPr id="160" name="Picture"/>
@@ -25030,7 +25030,7 @@
                 <w:noProof/>
               </w:rPr>
               <w:drawing>
-                <wp:inline distT="0" distB="0" distL="0" distR="0" wp14:anchorId="2D1478E3" wp14:editId="056E70B0">
+                <wp:inline distT="0" distB="0" distL="0" distR="0" wp14:anchorId="2501E1B2" wp14:editId="543C3651">
                   <wp:extent cx="152400" cy="152400"/>
                   <wp:effectExtent l="0" t="0" r="0" b="0"/>
                   <wp:docPr id="163" name="Picture"/>
@@ -25095,7 +25095,7 @@
                 <w:noProof/>
               </w:rPr>
               <w:drawing>
-                <wp:inline distT="0" distB="0" distL="0" distR="0" wp14:anchorId="78E5C9B4" wp14:editId="22780052">
+                <wp:inline distT="0" distB="0" distL="0" distR="0" wp14:anchorId="24FC944C" wp14:editId="08D1FD68">
                   <wp:extent cx="152400" cy="152400"/>
                   <wp:effectExtent l="0" t="0" r="0" b="0"/>
                   <wp:docPr id="166" name="Picture"/>
@@ -25153,7 +25153,7 @@
                 <w:noProof/>
               </w:rPr>
               <w:drawing>
-                <wp:inline distT="0" distB="0" distL="0" distR="0" wp14:anchorId="70B0FC10" wp14:editId="50C2ED72">
+                <wp:inline distT="0" distB="0" distL="0" distR="0" wp14:anchorId="7AF3316E" wp14:editId="5EBC4112">
                   <wp:extent cx="152400" cy="152400"/>
                   <wp:effectExtent l="0" t="0" r="0" b="0"/>
                   <wp:docPr id="169" name="Picture"/>
@@ -25218,7 +25218,7 @@
                 <w:noProof/>
               </w:rPr>
               <w:drawing>
-                <wp:inline distT="0" distB="0" distL="0" distR="0" wp14:anchorId="611BFD29" wp14:editId="09CC0A6E">
+                <wp:inline distT="0" distB="0" distL="0" distR="0" wp14:anchorId="77192FF8" wp14:editId="1C523488">
                   <wp:extent cx="152400" cy="152400"/>
                   <wp:effectExtent l="0" t="0" r="0" b="0"/>
                   <wp:docPr id="172" name="Picture"/>
@@ -25276,7 +25276,7 @@
                 <w:noProof/>
               </w:rPr>
               <w:drawing>
-                <wp:inline distT="0" distB="0" distL="0" distR="0" wp14:anchorId="73B8CD17" wp14:editId="13A0CEDD">
+                <wp:inline distT="0" distB="0" distL="0" distR="0" wp14:anchorId="18B60D91" wp14:editId="1B332415">
                   <wp:extent cx="152400" cy="152400"/>
                   <wp:effectExtent l="0" t="0" r="0" b="0"/>
                   <wp:docPr id="175" name="Picture"/>
@@ -25341,7 +25341,7 @@
                 <w:noProof/>
               </w:rPr>
               <w:drawing>
-                <wp:inline distT="0" distB="0" distL="0" distR="0" wp14:anchorId="1B2CB028" wp14:editId="1C6EA708">
+                <wp:inline distT="0" distB="0" distL="0" distR="0" wp14:anchorId="13FBFA25" wp14:editId="44B81FFA">
                   <wp:extent cx="152400" cy="152400"/>
                   <wp:effectExtent l="0" t="0" r="0" b="0"/>
                   <wp:docPr id="178" name="Picture"/>
@@ -25399,7 +25399,7 @@
                 <w:noProof/>
               </w:rPr>
               <w:drawing>
-                <wp:inline distT="0" distB="0" distL="0" distR="0" wp14:anchorId="5C0A8FBB" wp14:editId="1C38F11F">
+                <wp:inline distT="0" distB="0" distL="0" distR="0" wp14:anchorId="66AF9F0C" wp14:editId="7A757868">
                   <wp:extent cx="152400" cy="152400"/>
                   <wp:effectExtent l="0" t="0" r="0" b="0"/>
                   <wp:docPr id="181" name="Picture"/>
@@ -25464,7 +25464,7 @@
                 <w:noProof/>
               </w:rPr>
               <w:drawing>
-                <wp:inline distT="0" distB="0" distL="0" distR="0" wp14:anchorId="4F86F339" wp14:editId="072DBE0F">
+                <wp:inline distT="0" distB="0" distL="0" distR="0" wp14:anchorId="079920F3" wp14:editId="1891C4CD">
                   <wp:extent cx="152400" cy="152400"/>
                   <wp:effectExtent l="0" t="0" r="0" b="0"/>
                   <wp:docPr id="184" name="Picture"/>
@@ -25522,7 +25522,7 @@
                 <w:noProof/>
               </w:rPr>
               <w:drawing>
-                <wp:inline distT="0" distB="0" distL="0" distR="0" wp14:anchorId="00E0EB98" wp14:editId="4FBAC4CA">
+                <wp:inline distT="0" distB="0" distL="0" distR="0" wp14:anchorId="2B379AA1" wp14:editId="0F33E822">
                   <wp:extent cx="152400" cy="152400"/>
                   <wp:effectExtent l="0" t="0" r="0" b="0"/>
                   <wp:docPr id="187" name="Picture"/>
@@ -25587,7 +25587,7 @@
                 <w:noProof/>
               </w:rPr>
               <w:drawing>
-                <wp:inline distT="0" distB="0" distL="0" distR="0" wp14:anchorId="4B1C576B" wp14:editId="1952879A">
+                <wp:inline distT="0" distB="0" distL="0" distR="0" wp14:anchorId="555D2B6E" wp14:editId="7257F4F2">
                   <wp:extent cx="152400" cy="152400"/>
                   <wp:effectExtent l="0" t="0" r="0" b="0"/>
                   <wp:docPr id="190" name="Picture"/>
@@ -25645,7 +25645,7 @@
                 <w:noProof/>
               </w:rPr>
               <w:drawing>
-                <wp:inline distT="0" distB="0" distL="0" distR="0" wp14:anchorId="0E28EFB9" wp14:editId="53813857">
+                <wp:inline distT="0" distB="0" distL="0" distR="0" wp14:anchorId="335CEDE3" wp14:editId="0F1EEE9E">
                   <wp:extent cx="152400" cy="152400"/>
                   <wp:effectExtent l="0" t="0" r="0" b="0"/>
                   <wp:docPr id="193" name="Picture"/>
@@ -25710,7 +25710,7 @@
                 <w:noProof/>
               </w:rPr>
               <w:drawing>
-                <wp:inline distT="0" distB="0" distL="0" distR="0" wp14:anchorId="1F5B3AEC" wp14:editId="09F036FF">
+                <wp:inline distT="0" distB="0" distL="0" distR="0" wp14:anchorId="30B4CC03" wp14:editId="230353CD">
                   <wp:extent cx="152400" cy="152400"/>
                   <wp:effectExtent l="0" t="0" r="0" b="0"/>
                   <wp:docPr id="196" name="Picture"/>
@@ -25768,7 +25768,7 @@
                 <w:noProof/>
               </w:rPr>
               <w:drawing>
-                <wp:inline distT="0" distB="0" distL="0" distR="0" wp14:anchorId="5F7A7E25" wp14:editId="79464367">
+                <wp:inline distT="0" distB="0" distL="0" distR="0" wp14:anchorId="51B2A89A" wp14:editId="4DFB0093">
                   <wp:extent cx="152400" cy="152400"/>
                   <wp:effectExtent l="0" t="0" r="0" b="0"/>
                   <wp:docPr id="199" name="Picture"/>
@@ -25961,7 +25961,7 @@
                 <w:noProof/>
               </w:rPr>
               <w:drawing>
-                <wp:inline distT="0" distB="0" distL="0" distR="0" wp14:anchorId="1794D130" wp14:editId="4329E133">
+                <wp:inline distT="0" distB="0" distL="0" distR="0" wp14:anchorId="3151DF12" wp14:editId="2CE77CF2">
                   <wp:extent cx="152400" cy="152400"/>
                   <wp:effectExtent l="0" t="0" r="0" b="0"/>
                   <wp:docPr id="202" name="Picture"/>
@@ -26026,7 +26026,7 @@
                 <w:noProof/>
               </w:rPr>
               <w:drawing>
-                <wp:inline distT="0" distB="0" distL="0" distR="0" wp14:anchorId="38B1354C" wp14:editId="0156814D">
+                <wp:inline distT="0" distB="0" distL="0" distR="0" wp14:anchorId="47B12DB9" wp14:editId="7333FBEE">
                   <wp:extent cx="152400" cy="152400"/>
                   <wp:effectExtent l="0" t="0" r="0" b="0"/>
                   <wp:docPr id="205" name="Picture"/>
@@ -26091,7 +26091,7 @@
                 <w:noProof/>
               </w:rPr>
               <w:drawing>
-                <wp:inline distT="0" distB="0" distL="0" distR="0" wp14:anchorId="6EAB0E88" wp14:editId="33597404">
+                <wp:inline distT="0" distB="0" distL="0" distR="0" wp14:anchorId="2C54BE9E" wp14:editId="4A216F44">
                   <wp:extent cx="152400" cy="152400"/>
                   <wp:effectExtent l="0" t="0" r="0" b="0"/>
                   <wp:docPr id="208" name="Picture"/>
@@ -26156,7 +26156,7 @@
                 <w:noProof/>
               </w:rPr>
               <w:drawing>
-                <wp:inline distT="0" distB="0" distL="0" distR="0" wp14:anchorId="09C47F2B" wp14:editId="524F538F">
+                <wp:inline distT="0" distB="0" distL="0" distR="0" wp14:anchorId="7FB6628F" wp14:editId="12F00682">
                   <wp:extent cx="152400" cy="152400"/>
                   <wp:effectExtent l="0" t="0" r="0" b="0"/>
                   <wp:docPr id="211" name="Picture"/>
@@ -26221,7 +26221,7 @@
                 <w:noProof/>
               </w:rPr>
               <w:drawing>
-                <wp:inline distT="0" distB="0" distL="0" distR="0" wp14:anchorId="484584F8" wp14:editId="2E0AE6C7">
+                <wp:inline distT="0" distB="0" distL="0" distR="0" wp14:anchorId="1D3654C3" wp14:editId="485E84C5">
                   <wp:extent cx="152400" cy="152400"/>
                   <wp:effectExtent l="0" t="0" r="0" b="0"/>
                   <wp:docPr id="214" name="Picture"/>
@@ -26347,7 +26347,7 @@
         <w:pStyle w:val="Heading2"/>
       </w:pPr>
       <w:bookmarkStart w:id="70" w:name="the-context-menu"/>
-      <w:bookmarkStart w:id="71" w:name="_Toc234841658"/>
+      <w:bookmarkStart w:id="71" w:name="_Toc234848182"/>
       <w:bookmarkEnd w:id="68"/>
       <w:r>
         <w:rPr>
@@ -26733,7 +26733,7 @@
           <w:noProof/>
         </w:rPr>
         <w:drawing>
-          <wp:inline distT="0" distB="0" distL="0" distR="0" wp14:anchorId="73441B1C" wp14:editId="16D0F191">
+          <wp:inline distT="0" distB="0" distL="0" distR="0" wp14:anchorId="6D1861CA" wp14:editId="5B6C759F">
             <wp:extent cx="5334000" cy="5999971"/>
             <wp:effectExtent l="0" t="0" r="0" b="0"/>
             <wp:docPr id="218" name="Picture"/>
@@ -26780,7 +26780,7 @@
         <w:pStyle w:val="Heading2"/>
       </w:pPr>
       <w:bookmarkStart w:id="72" w:name="filters"/>
-      <w:bookmarkStart w:id="73" w:name="_Toc234841659"/>
+      <w:bookmarkStart w:id="73" w:name="_Toc234848183"/>
       <w:bookmarkEnd w:id="70"/>
       <w:r>
         <w:rPr>
@@ -26831,7 +26831,7 @@
           <w:noProof/>
         </w:rPr>
         <w:drawing>
-          <wp:inline distT="0" distB="0" distL="0" distR="0" wp14:anchorId="68D00CD5" wp14:editId="10893A52">
+          <wp:inline distT="0" distB="0" distL="0" distR="0" wp14:anchorId="6AE93CAF" wp14:editId="10CA034F">
             <wp:extent cx="2611356" cy="6800584"/>
             <wp:effectExtent l="0" t="0" r="0" b="0"/>
             <wp:docPr id="222" name="Picture" descr="Tree filters: what you hide here is hidden in this tree view — diagrams keep their own selection. The Phases group greys out when the model has no Phase Support."/>
@@ -26886,7 +26886,7 @@
         <w:pStyle w:val="Heading2"/>
       </w:pPr>
       <w:bookmarkStart w:id="74" w:name="delete-multiple"/>
-      <w:bookmarkStart w:id="75" w:name="_Toc234841660"/>
+      <w:bookmarkStart w:id="75" w:name="_Toc234848184"/>
       <w:bookmarkEnd w:id="72"/>
       <w:r>
         <w:rPr>
@@ -26933,7 +26933,7 @@
           <w:noProof/>
         </w:rPr>
         <w:drawing>
-          <wp:inline distT="0" distB="0" distL="0" distR="0" wp14:anchorId="7B8F27B0" wp14:editId="3DF28B37">
+          <wp:inline distT="0" distB="0" distL="0" distR="0" wp14:anchorId="30ED9962" wp14:editId="26221A79">
             <wp:extent cx="5334000" cy="4034433"/>
             <wp:effectExtent l="0" t="0" r="0" b="0"/>
             <wp:docPr id="226" name="Picture" descr="Bulk delete: the Show checkboxes narrow the tree by kind, ticking a parent includes its contents, and the whole deletion is a single undo step."/>
@@ -26988,7 +26988,7 @@
         <w:pStyle w:val="Heading2"/>
       </w:pPr>
       <w:bookmarkStart w:id="76" w:name="drag-and-copy-drag"/>
-      <w:bookmarkStart w:id="77" w:name="_Toc234841661"/>
+      <w:bookmarkStart w:id="77" w:name="_Toc234848185"/>
       <w:bookmarkEnd w:id="74"/>
       <w:r>
         <w:rPr>
@@ -27231,7 +27231,7 @@
         <w:pStyle w:val="Heading1"/>
       </w:pPr>
       <w:bookmarkStart w:id="78" w:name="reference-class-diagrams"/>
-      <w:bookmarkStart w:id="79" w:name="_Toc234841662"/>
+      <w:bookmarkStart w:id="79" w:name="_Toc234848186"/>
       <w:bookmarkEnd w:id="62"/>
       <w:bookmarkEnd w:id="76"/>
       <w:r>
@@ -27263,7 +27263,7 @@
           <w:noProof/>
         </w:rPr>
         <w:drawing>
-          <wp:inline distT="0" distB="0" distL="0" distR="0" wp14:anchorId="1CD395A0" wp14:editId="7C1FCA07">
+          <wp:inline distT="0" distB="0" distL="0" distR="0" wp14:anchorId="055E4D95" wp14:editId="0DD2F465">
             <wp:extent cx="5334000" cy="4666357"/>
             <wp:effectExtent l="0" t="0" r="0" b="0"/>
             <wp:docPr id="232" name="Picture" descr="The class-diagram view with its toolbar. Row and Column are selected (translucent accent, resize handles); the darker frame on Column marks the align anchor — the last-selected shape."/>
@@ -27318,7 +27318,7 @@
         <w:pStyle w:val="Heading2"/>
       </w:pPr>
       <w:bookmarkStart w:id="80" w:name="reading-the-diagram"/>
-      <w:bookmarkStart w:id="81" w:name="_Toc234841663"/>
+      <w:bookmarkStart w:id="81" w:name="_Toc234848187"/>
       <w:r>
         <w:rPr>
           <w:rStyle w:val="SectionNumber"/>
@@ -27518,7 +27518,7 @@
         <w:pStyle w:val="Heading2"/>
       </w:pPr>
       <w:bookmarkStart w:id="82" w:name="selection"/>
-      <w:bookmarkStart w:id="83" w:name="_Toc234841664"/>
+      <w:bookmarkStart w:id="83" w:name="_Toc234848188"/>
       <w:bookmarkEnd w:id="80"/>
       <w:r>
         <w:rPr>
@@ -27729,7 +27729,7 @@
         <w:pStyle w:val="Heading2"/>
       </w:pPr>
       <w:bookmarkStart w:id="84" w:name="moving-and-resizing"/>
-      <w:bookmarkStart w:id="85" w:name="_Toc234841665"/>
+      <w:bookmarkStart w:id="85" w:name="_Toc234848189"/>
       <w:bookmarkEnd w:id="82"/>
       <w:r>
         <w:rPr>
@@ -27806,7 +27806,7 @@
         <w:pStyle w:val="Heading2"/>
       </w:pPr>
       <w:bookmarkStart w:id="86" w:name="editing-connection-routing"/>
-      <w:bookmarkStart w:id="87" w:name="_Toc234841666"/>
+      <w:bookmarkStart w:id="87" w:name="_Toc234848190"/>
       <w:bookmarkEnd w:id="84"/>
       <w:r>
         <w:rPr>
@@ -27960,7 +27960,7 @@
         <w:pStyle w:val="Heading2"/>
       </w:pPr>
       <w:bookmarkStart w:id="88" w:name="members-and-methods-inside-the-box"/>
-      <w:bookmarkStart w:id="89" w:name="_Toc234841667"/>
+      <w:bookmarkStart w:id="89" w:name="_Toc234848191"/>
       <w:bookmarkEnd w:id="86"/>
       <w:r>
         <w:rPr>
@@ -28032,7 +28032,7 @@
         <w:pStyle w:val="Heading2"/>
       </w:pPr>
       <w:bookmarkStart w:id="90" w:name="notes-and-their-connection-points"/>
-      <w:bookmarkStart w:id="91" w:name="_Toc234841668"/>
+      <w:bookmarkStart w:id="91" w:name="_Toc234848192"/>
       <w:bookmarkEnd w:id="88"/>
       <w:r>
         <w:rPr>
@@ -28116,7 +28116,7 @@
         <w:pStyle w:val="Heading2"/>
       </w:pPr>
       <w:bookmarkStart w:id="92" w:name="creating-elements-on-the-canvas"/>
-      <w:bookmarkStart w:id="93" w:name="_Toc234841669"/>
+      <w:bookmarkStart w:id="93" w:name="_Toc234848193"/>
       <w:bookmarkEnd w:id="90"/>
       <w:r>
         <w:rPr>
@@ -28460,7 +28460,7 @@
         <w:pStyle w:val="Heading2"/>
       </w:pPr>
       <w:bookmarkStart w:id="94" w:name="align"/>
-      <w:bookmarkStart w:id="95" w:name="_Toc234841670"/>
+      <w:bookmarkStart w:id="95" w:name="_Toc234848194"/>
       <w:bookmarkEnd w:id="92"/>
       <w:r>
         <w:rPr>
@@ -28535,7 +28535,7 @@
         <w:pStyle w:val="Heading2"/>
       </w:pPr>
       <w:bookmarkStart w:id="96" w:name="hiding-per-shape-toggles-colors"/>
-      <w:bookmarkStart w:id="97" w:name="_Toc234841671"/>
+      <w:bookmarkStart w:id="97" w:name="_Toc234848195"/>
       <w:bookmarkEnd w:id="94"/>
       <w:r>
         <w:rPr>
@@ -28673,7 +28673,7 @@
         <w:pStyle w:val="Heading2"/>
       </w:pPr>
       <w:bookmarkStart w:id="98" w:name="zoom-and-pan"/>
-      <w:bookmarkStart w:id="99" w:name="_Toc234841672"/>
+      <w:bookmarkStart w:id="99" w:name="_Toc234848196"/>
       <w:bookmarkEnd w:id="96"/>
       <w:r>
         <w:rPr>
@@ -28948,7 +28948,7 @@
         <w:pStyle w:val="Heading2"/>
       </w:pPr>
       <w:bookmarkStart w:id="100" w:name="the-cd-toolbar"/>
-      <w:bookmarkStart w:id="101" w:name="_Toc234841673"/>
+      <w:bookmarkStart w:id="101" w:name="_Toc234848197"/>
       <w:bookmarkEnd w:id="98"/>
       <w:r>
         <w:rPr>
@@ -29102,7 +29102,7 @@
           <w:noProof/>
         </w:rPr>
         <w:drawing>
-          <wp:inline distT="0" distB="0" distL="0" distR="0" wp14:anchorId="6A966381" wp14:editId="26743A89">
+          <wp:inline distT="0" distB="0" distL="0" distR="0" wp14:anchorId="70F6810F" wp14:editId="3BC20965">
             <wp:extent cx="5334000" cy="232022"/>
             <wp:effectExtent l="0" t="0" r="0" b="0"/>
             <wp:docPr id="245" name="Picture" descr="The CD toolbar: the Add buttons (greyed when not legal on the selection), the align dropdown, Delete, Undo/Redo, zoom in/out/fit, and Export SVG."/>
@@ -29157,7 +29157,7 @@
         <w:pStyle w:val="Heading2"/>
       </w:pPr>
       <w:bookmarkStart w:id="102" w:name="the-cd-context-menu"/>
-      <w:bookmarkStart w:id="103" w:name="_Toc234841674"/>
+      <w:bookmarkStart w:id="103" w:name="_Toc234848198"/>
       <w:bookmarkEnd w:id="100"/>
       <w:r>
         <w:rPr>
@@ -29198,7 +29198,7 @@
           <w:noProof/>
         </w:rPr>
         <w:drawing>
-          <wp:inline distT="0" distB="0" distL="0" distR="0" wp14:anchorId="53F6581C" wp14:editId="2C9F08CF">
+          <wp:inline distT="0" distB="0" distL="0" distR="0" wp14:anchorId="1DEF45BB" wp14:editId="7F52C8D5">
             <wp:extent cx="5334000" cy="5760720"/>
             <wp:effectExtent l="0" t="0" r="0" b="0"/>
             <wp:docPr id="249" name="Picture"/>
@@ -29245,7 +29245,7 @@
         <w:pStyle w:val="Heading2"/>
       </w:pPr>
       <w:bookmarkStart w:id="104" w:name="canvas-keys"/>
-      <w:bookmarkStart w:id="105" w:name="_Toc234841675"/>
+      <w:bookmarkStart w:id="105" w:name="_Toc234848199"/>
       <w:bookmarkEnd w:id="102"/>
       <w:r>
         <w:rPr>
@@ -29563,7 +29563,7 @@
         <w:pStyle w:val="Heading1"/>
       </w:pPr>
       <w:bookmarkStart w:id="106" w:name="reference-sequence-diagrams"/>
-      <w:bookmarkStart w:id="107" w:name="_Toc234841676"/>
+      <w:bookmarkStart w:id="107" w:name="_Toc234848200"/>
       <w:bookmarkEnd w:id="78"/>
       <w:bookmarkEnd w:id="104"/>
       <w:r>
@@ -29637,7 +29637,7 @@
           <w:noProof/>
         </w:rPr>
         <w:drawing>
-          <wp:inline distT="0" distB="0" distL="0" distR="0" wp14:anchorId="6C21B07C" wp14:editId="637C633B">
+          <wp:inline distT="0" distB="0" distL="0" distR="0" wp14:anchorId="25EF9289" wp14:editId="72D54EAF">
             <wp:extent cx="5334000" cy="3482788"/>
             <wp:effectExtent l="0" t="0" r="0" b="0"/>
             <wp:docPr id="255" name="Picture" descr="A sequence-diagram view in the shell — its own toolbar (delete, undo/redo, zoom, export SVG) at the top; diagram views dock, tab and float exactly like the trees."/>
@@ -29692,7 +29692,7 @@
         <w:pStyle w:val="Heading2"/>
       </w:pPr>
       <w:bookmarkStart w:id="108" w:name="building-one"/>
-      <w:bookmarkStart w:id="109" w:name="_Toc234841677"/>
+      <w:bookmarkStart w:id="109" w:name="_Toc234848201"/>
       <w:r>
         <w:rPr>
           <w:rStyle w:val="SectionNumber"/>
@@ -29761,7 +29761,7 @@
           <w:noProof/>
         </w:rPr>
         <w:drawing>
-          <wp:inline distT="0" distB="0" distL="0" distR="0" wp14:anchorId="35F7B4B6" wp14:editId="7ADC81A1">
+          <wp:inline distT="0" distB="0" distL="0" distR="0" wp14:anchorId="7C388343" wp14:editId="1F108C91">
             <wp:extent cx="5334000" cy="3999784"/>
             <wp:effectExtent l="0" t="0" r="0" b="0"/>
             <wp:docPr id="258" name="Picture"/>
@@ -29896,7 +29896,7 @@
         <w:pStyle w:val="Heading2"/>
       </w:pPr>
       <w:bookmarkStart w:id="110" w:name="what-moves-and-how"/>
-      <w:bookmarkStart w:id="111" w:name="_Toc234841678"/>
+      <w:bookmarkStart w:id="111" w:name="_Toc234848202"/>
       <w:bookmarkEnd w:id="108"/>
       <w:r>
         <w:rPr>
@@ -30330,7 +30330,7 @@
         <w:pStyle w:val="Heading2"/>
       </w:pPr>
       <w:bookmarkStart w:id="112" w:name="keeping-it-readable"/>
-      <w:bookmarkStart w:id="113" w:name="_Toc234841679"/>
+      <w:bookmarkStart w:id="113" w:name="_Toc234848203"/>
       <w:bookmarkEnd w:id="110"/>
       <w:r>
         <w:rPr>
@@ -30428,7 +30428,7 @@
         <w:pStyle w:val="Heading2"/>
       </w:pPr>
       <w:bookmarkStart w:id="114" w:name="toolbar-colors-zoom"/>
-      <w:bookmarkStart w:id="115" w:name="_Toc234841680"/>
+      <w:bookmarkStart w:id="115" w:name="_Toc234848204"/>
       <w:bookmarkEnd w:id="112"/>
       <w:r>
         <w:rPr>
@@ -30470,7 +30470,7 @@
           <w:noProof/>
         </w:rPr>
         <w:drawing>
-          <wp:inline distT="0" distB="0" distL="0" distR="0" wp14:anchorId="786603AF" wp14:editId="7CA836B3">
+          <wp:inline distT="0" distB="0" distL="0" distR="0" wp14:anchorId="58ED4774" wp14:editId="21DB107F">
             <wp:extent cx="4648554" cy="429555"/>
             <wp:effectExtent l="0" t="0" r="0" b="0"/>
             <wp:docPr id="264" name="Picture"/>
@@ -30622,7 +30622,7 @@
           <w:noProof/>
         </w:rPr>
         <w:drawing>
-          <wp:inline distT="0" distB="0" distL="0" distR="0" wp14:anchorId="5C47610B" wp14:editId="3962D21E">
+          <wp:inline distT="0" distB="0" distL="0" distR="0" wp14:anchorId="6C14AC6E" wp14:editId="7027DF0F">
             <wp:extent cx="5334000" cy="3813757"/>
             <wp:effectExtent l="0" t="0" r="0" b="0"/>
             <wp:docPr id="267" name="Picture"/>
@@ -30669,7 +30669,7 @@
         <w:pStyle w:val="Heading2"/>
       </w:pPr>
       <w:bookmarkStart w:id="116" w:name="canvas-keys-1"/>
-      <w:bookmarkStart w:id="117" w:name="_Toc234841681"/>
+      <w:bookmarkStart w:id="117" w:name="_Toc234848205"/>
       <w:bookmarkEnd w:id="114"/>
       <w:r>
         <w:rPr>
@@ -31047,7 +31047,7 @@
         <w:pStyle w:val="Heading1"/>
       </w:pPr>
       <w:bookmarkStart w:id="118" w:name="reference-dialogs"/>
-      <w:bookmarkStart w:id="119" w:name="_Toc234841682"/>
+      <w:bookmarkStart w:id="119" w:name="_Toc234848206"/>
       <w:bookmarkEnd w:id="106"/>
       <w:bookmarkEnd w:id="116"/>
       <w:r>
@@ -31075,7 +31075,7 @@
         <w:pStyle w:val="Heading2"/>
       </w:pPr>
       <w:bookmarkStart w:id="120" w:name="class"/>
-      <w:bookmarkStart w:id="121" w:name="_Toc234841683"/>
+      <w:bookmarkStart w:id="121" w:name="_Toc234848207"/>
       <w:r>
         <w:rPr>
           <w:rStyle w:val="SectionNumber"/>
@@ -31097,7 +31097,7 @@
           <w:noProof/>
         </w:rPr>
         <w:drawing>
-          <wp:inline distT="0" distB="0" distL="0" distR="0" wp14:anchorId="1F238AB0" wp14:editId="318C47D9">
+          <wp:inline distT="0" distB="0" distL="0" distR="0" wp14:anchorId="44A54041" wp14:editId="129ED68E">
             <wp:extent cx="5334000" cy="4744969"/>
             <wp:effectExtent l="0" t="0" r="0" b="0"/>
             <wp:docPr id="273" name="Picture"/>
@@ -31287,7 +31287,7 @@
         <w:pStyle w:val="Heading2"/>
       </w:pPr>
       <w:bookmarkStart w:id="122" w:name="external-class"/>
-      <w:bookmarkStart w:id="123" w:name="_Toc234841684"/>
+      <w:bookmarkStart w:id="123" w:name="_Toc234848208"/>
       <w:bookmarkEnd w:id="120"/>
       <w:r>
         <w:rPr>
@@ -31310,7 +31310,7 @@
           <w:noProof/>
         </w:rPr>
         <w:drawing>
-          <wp:inline distT="0" distB="0" distL="0" distR="0" wp14:anchorId="6DAD155D" wp14:editId="24198035">
+          <wp:inline distT="0" distB="0" distL="0" distR="0" wp14:anchorId="7299D05D" wp14:editId="11DB6444">
             <wp:extent cx="5334000" cy="3242315"/>
             <wp:effectExtent l="0" t="0" r="0" b="0"/>
             <wp:docPr id="277" name="Picture"/>
@@ -31388,7 +31388,7 @@
         <w:pStyle w:val="Heading2"/>
       </w:pPr>
       <w:bookmarkStart w:id="124" w:name="member"/>
-      <w:bookmarkStart w:id="125" w:name="_Toc234841685"/>
+      <w:bookmarkStart w:id="125" w:name="_Toc234848209"/>
       <w:bookmarkEnd w:id="122"/>
       <w:r>
         <w:rPr>
@@ -31411,7 +31411,7 @@
           <w:noProof/>
         </w:rPr>
         <w:drawing>
-          <wp:inline distT="0" distB="0" distL="0" distR="0" wp14:anchorId="015828A1" wp14:editId="2E1B64E2">
+          <wp:inline distT="0" distB="0" distL="0" distR="0" wp14:anchorId="28A24E82" wp14:editId="75AAA7D7">
             <wp:extent cx="5334000" cy="6040020"/>
             <wp:effectExtent l="0" t="0" r="0" b="0"/>
             <wp:docPr id="281" name="Picture"/>
@@ -31629,7 +31629,7 @@
         <w:pStyle w:val="Heading2"/>
       </w:pPr>
       <w:bookmarkStart w:id="126" w:name="method"/>
-      <w:bookmarkStart w:id="127" w:name="_Toc234841686"/>
+      <w:bookmarkStart w:id="127" w:name="_Toc234848210"/>
       <w:bookmarkEnd w:id="124"/>
       <w:r>
         <w:rPr>
@@ -31652,7 +31652,7 @@
           <w:noProof/>
         </w:rPr>
         <w:drawing>
-          <wp:inline distT="0" distB="0" distL="0" distR="0" wp14:anchorId="6BF9F503" wp14:editId="6F39614C">
+          <wp:inline distT="0" distB="0" distL="0" distR="0" wp14:anchorId="2EF5E269" wp14:editId="29FBA100">
             <wp:extent cx="5334000" cy="4824502"/>
             <wp:effectExtent l="0" t="0" r="0" b="0"/>
             <wp:docPr id="285" name="Picture"/>
@@ -31881,10 +31881,10 @@
           <w:noProof/>
         </w:rPr>
         <w:drawing>
-          <wp:inline distT="0" distB="0" distL="0" distR="0" wp14:anchorId="075683BE" wp14:editId="1D08CF7D">
+          <wp:inline distT="0" distB="0" distL="0" distR="0" wp14:anchorId="355C4216" wp14:editId="2F600B9A">
             <wp:extent cx="5334000" cy="3146155"/>
             <wp:effectExtent l="0" t="0" r="0" b="0"/>
-            <wp:docPr id="288" name="Picture" descr="Renaming a method offers to update every call site stored in the model — with a code preview per hit."/>
+            <wp:docPr id="288" name="Picture" descr="Renaming a method offers to update every call site stored in the model — with the possibility to view the code."/>
             <wp:cNvGraphicFramePr/>
             <a:graphic xmlns:a="http://schemas.openxmlformats.org/drawingml/2006/main">
               <a:graphicData uri="http://schemas.openxmlformats.org/drawingml/2006/picture">
@@ -31928,7 +31928,7 @@
         <w:pStyle w:val="ImageCaption"/>
       </w:pPr>
       <w:r>
-        <w:t>Renaming a method offers to update every call site stored in the model — with a code preview per hit.</w:t>
+        <w:t>Renaming a method offers to update every call site stored in the model — with the possibility to view the code.</w:t>
       </w:r>
     </w:p>
     <w:p>
@@ -31936,7 +31936,7 @@
         <w:pStyle w:val="Heading2"/>
       </w:pPr>
       <w:bookmarkStart w:id="128" w:name="constructor-destructor"/>
-      <w:bookmarkStart w:id="129" w:name="_Toc234841687"/>
+      <w:bookmarkStart w:id="129" w:name="_Toc234848211"/>
       <w:bookmarkEnd w:id="126"/>
       <w:r>
         <w:rPr>
@@ -31959,7 +31959,7 @@
           <w:noProof/>
         </w:rPr>
         <w:drawing>
-          <wp:inline distT="0" distB="0" distL="0" distR="0" wp14:anchorId="760CC27A" wp14:editId="628DBAE1">
+          <wp:inline distT="0" distB="0" distL="0" distR="0" wp14:anchorId="12A9E2F9" wp14:editId="1A751DA3">
             <wp:extent cx="5334000" cy="3217383"/>
             <wp:effectExtent l="0" t="0" r="0" b="0"/>
             <wp:docPr id="292" name="Picture"/>
@@ -32010,7 +32010,7 @@
           <w:noProof/>
         </w:rPr>
         <w:drawing>
-          <wp:inline distT="0" distB="0" distL="0" distR="0" wp14:anchorId="72472D9D" wp14:editId="2FADE51C">
+          <wp:inline distT="0" distB="0" distL="0" distR="0" wp14:anchorId="19FEAC04" wp14:editId="5A19D8F6">
             <wp:extent cx="5334000" cy="3259666"/>
             <wp:effectExtent l="0" t="0" r="0" b="0"/>
             <wp:docPr id="295" name="Picture"/>
@@ -32125,7 +32125,7 @@
         <w:pStyle w:val="Heading2"/>
       </w:pPr>
       <w:bookmarkStart w:id="130" w:name="exception-specification"/>
-      <w:bookmarkStart w:id="131" w:name="_Toc234841688"/>
+      <w:bookmarkStart w:id="131" w:name="_Toc234848212"/>
       <w:bookmarkEnd w:id="128"/>
       <w:r>
         <w:rPr>
@@ -32148,7 +32148,7 @@
           <w:noProof/>
         </w:rPr>
         <w:drawing>
-          <wp:inline distT="0" distB="0" distL="0" distR="0" wp14:anchorId="3D3B2D6D" wp14:editId="224A88AA">
+          <wp:inline distT="0" distB="0" distL="0" distR="0" wp14:anchorId="2CA54875" wp14:editId="5BD98A57">
             <wp:extent cx="5334000" cy="4570499"/>
             <wp:effectExtent l="0" t="0" r="0" b="0"/>
             <wp:docPr id="299" name="Picture"/>
@@ -32252,7 +32252,7 @@
         <w:pStyle w:val="Heading2"/>
       </w:pPr>
       <w:bookmarkStart w:id="132" w:name="argument"/>
-      <w:bookmarkStart w:id="133" w:name="_Toc234841689"/>
+      <w:bookmarkStart w:id="133" w:name="_Toc234848213"/>
       <w:bookmarkEnd w:id="130"/>
       <w:r>
         <w:rPr>
@@ -32275,7 +32275,7 @@
           <w:noProof/>
         </w:rPr>
         <w:drawing>
-          <wp:inline distT="0" distB="0" distL="0" distR="0" wp14:anchorId="2069A1F9" wp14:editId="0F779A7D">
+          <wp:inline distT="0" distB="0" distL="0" distR="0" wp14:anchorId="439D23A4" wp14:editId="7E6D23F7">
             <wp:extent cx="5334000" cy="4645497"/>
             <wp:effectExtent l="0" t="0" r="0" b="0"/>
             <wp:docPr id="303" name="Picture"/>
@@ -32340,7 +32340,7 @@
         <w:pStyle w:val="Heading2"/>
       </w:pPr>
       <w:bookmarkStart w:id="134" w:name="inheritance"/>
-      <w:bookmarkStart w:id="135" w:name="_Toc234841690"/>
+      <w:bookmarkStart w:id="135" w:name="_Toc234848214"/>
       <w:bookmarkEnd w:id="132"/>
       <w:r>
         <w:rPr>
@@ -32363,7 +32363,7 @@
           <w:noProof/>
         </w:rPr>
         <w:drawing>
-          <wp:inline distT="0" distB="0" distL="0" distR="0" wp14:anchorId="7A6E5665" wp14:editId="75F5483D">
+          <wp:inline distT="0" distB="0" distL="0" distR="0" wp14:anchorId="3C09AF52" wp14:editId="5A97A88A">
             <wp:extent cx="5334000" cy="3869987"/>
             <wp:effectExtent l="0" t="0" r="0" b="0"/>
             <wp:docPr id="307" name="Picture"/>
@@ -32478,7 +32478,7 @@
                 <w:noProof/>
               </w:rPr>
               <w:drawing>
-                <wp:inline distT="0" distB="0" distL="0" distR="0" wp14:anchorId="5DE14D8F" wp14:editId="27695B77">
+                <wp:inline distT="0" distB="0" distL="0" distR="0" wp14:anchorId="0729A87A" wp14:editId="64310AD6">
                   <wp:extent cx="4325324" cy="1939378"/>
                   <wp:effectExtent l="0" t="0" r="0" b="0"/>
                   <wp:docPr id="310" name="Picture"/>
@@ -32534,7 +32534,7 @@
                 <w:noProof/>
               </w:rPr>
               <w:drawing>
-                <wp:inline distT="0" distB="0" distL="0" distR="0" wp14:anchorId="0FE6A905" wp14:editId="1EEECE8E">
+                <wp:inline distT="0" distB="0" distL="0" distR="0" wp14:anchorId="4879AEA0" wp14:editId="7F2D05C4">
                   <wp:extent cx="4325324" cy="2534801"/>
                   <wp:effectExtent l="0" t="0" r="0" b="0"/>
                   <wp:docPr id="313" name="Picture"/>
@@ -32596,7 +32596,7 @@
         <w:pStyle w:val="Heading2"/>
       </w:pPr>
       <w:bookmarkStart w:id="136" w:name="relation"/>
-      <w:bookmarkStart w:id="137" w:name="_Toc234841691"/>
+      <w:bookmarkStart w:id="137" w:name="_Toc234848215"/>
       <w:bookmarkEnd w:id="134"/>
       <w:r>
         <w:rPr>
@@ -32619,7 +32619,7 @@
           <w:noProof/>
         </w:rPr>
         <w:drawing>
-          <wp:inline distT="0" distB="0" distL="0" distR="0" wp14:anchorId="4A76D7BB" wp14:editId="4C3EF8F9">
+          <wp:inline distT="0" distB="0" distL="0" distR="0" wp14:anchorId="7D4321A4" wp14:editId="136E9115">
             <wp:extent cx="5334000" cy="5158885"/>
             <wp:effectExtent l="0" t="0" r="0" b="0"/>
             <wp:docPr id="317" name="Picture"/>
@@ -32977,7 +32977,7 @@
         <w:pStyle w:val="Heading2"/>
       </w:pPr>
       <w:bookmarkStart w:id="138" w:name="find-method-on-a-relation"/>
-      <w:bookmarkStart w:id="139" w:name="_Toc234841692"/>
+      <w:bookmarkStart w:id="139" w:name="_Toc234848216"/>
       <w:bookmarkEnd w:id="136"/>
       <w:r>
         <w:rPr>
@@ -33000,7 +33000,7 @@
           <w:noProof/>
         </w:rPr>
         <w:drawing>
-          <wp:inline distT="0" distB="0" distL="0" distR="0" wp14:anchorId="26E252B5" wp14:editId="538BB2F5">
+          <wp:inline distT="0" distB="0" distL="0" distR="0" wp14:anchorId="13C099E4" wp14:editId="5EDC6956">
             <wp:extent cx="5334000" cy="4823297"/>
             <wp:effectExtent l="0" t="0" r="0" b="0"/>
             <wp:docPr id="321" name="Picture"/>
@@ -33127,7 +33127,7 @@
         <w:pStyle w:val="Heading2"/>
       </w:pPr>
       <w:bookmarkStart w:id="140" w:name="dependency"/>
-      <w:bookmarkStart w:id="141" w:name="_Toc234841693"/>
+      <w:bookmarkStart w:id="141" w:name="_Toc234848217"/>
       <w:bookmarkEnd w:id="138"/>
       <w:r>
         <w:rPr>
@@ -33150,7 +33150,7 @@
           <w:noProof/>
         </w:rPr>
         <w:drawing>
-          <wp:inline distT="0" distB="0" distL="0" distR="0" wp14:anchorId="315D4C9A" wp14:editId="6350837D">
+          <wp:inline distT="0" distB="0" distL="0" distR="0" wp14:anchorId="48C1FA35" wp14:editId="54A8A7A8">
             <wp:extent cx="4563493" cy="2628368"/>
             <wp:effectExtent l="0" t="0" r="0" b="0"/>
             <wp:docPr id="325" name="Picture"/>
@@ -33251,7 +33251,7 @@
         <w:pStyle w:val="Heading2"/>
       </w:pPr>
       <w:bookmarkStart w:id="142" w:name="relation-diagram-only"/>
-      <w:bookmarkStart w:id="143" w:name="_Toc234841694"/>
+      <w:bookmarkStart w:id="143" w:name="_Toc234848218"/>
       <w:bookmarkEnd w:id="140"/>
       <w:r>
         <w:rPr>
@@ -33274,7 +33274,7 @@
           <w:noProof/>
         </w:rPr>
         <w:drawing>
-          <wp:inline distT="0" distB="0" distL="0" distR="0" wp14:anchorId="22D1408F" wp14:editId="50A661E0">
+          <wp:inline distT="0" distB="0" distL="0" distR="0" wp14:anchorId="6534C127" wp14:editId="33E2EF4D">
             <wp:extent cx="4563493" cy="5673533"/>
             <wp:effectExtent l="0" t="0" r="0" b="0"/>
             <wp:docPr id="329" name="Picture"/>
@@ -33379,7 +33379,7 @@
         <w:pStyle w:val="Heading2"/>
       </w:pPr>
       <w:bookmarkStart w:id="144" w:name="type"/>
-      <w:bookmarkStart w:id="145" w:name="_Toc234841695"/>
+      <w:bookmarkStart w:id="145" w:name="_Toc234848219"/>
       <w:bookmarkEnd w:id="142"/>
       <w:r>
         <w:rPr>
@@ -33402,7 +33402,7 @@
           <w:noProof/>
         </w:rPr>
         <w:drawing>
-          <wp:inline distT="0" distB="0" distL="0" distR="0" wp14:anchorId="1A05A37F" wp14:editId="655DFFCC">
+          <wp:inline distT="0" distB="0" distL="0" distR="0" wp14:anchorId="240339A9" wp14:editId="2AC7D652">
             <wp:extent cx="4563493" cy="3874504"/>
             <wp:effectExtent l="0" t="0" r="0" b="0"/>
             <wp:docPr id="333" name="Picture"/>
@@ -33514,7 +33514,7 @@
         <w:pStyle w:val="Heading2"/>
       </w:pPr>
       <w:bookmarkStart w:id="146" w:name="group-meta-group"/>
-      <w:bookmarkStart w:id="147" w:name="_Toc234841696"/>
+      <w:bookmarkStart w:id="147" w:name="_Toc234848220"/>
       <w:bookmarkEnd w:id="144"/>
       <w:r>
         <w:rPr>
@@ -33537,7 +33537,7 @@
           <w:noProof/>
         </w:rPr>
         <w:drawing>
-          <wp:inline distT="0" distB="0" distL="0" distR="0" wp14:anchorId="622B2BF2" wp14:editId="2D41BFE7">
+          <wp:inline distT="0" distB="0" distL="0" distR="0" wp14:anchorId="4F75DE08" wp14:editId="77D3B55D">
             <wp:extent cx="5334000" cy="3513536"/>
             <wp:effectExtent l="0" t="0" r="0" b="0"/>
             <wp:docPr id="337" name="Picture"/>
@@ -33592,7 +33592,7 @@
         <w:pStyle w:val="Heading2"/>
       </w:pPr>
       <w:bookmarkStart w:id="148" w:name="context-define-and-assign"/>
-      <w:bookmarkStart w:id="149" w:name="_Toc234841697"/>
+      <w:bookmarkStart w:id="149" w:name="_Toc234848221"/>
       <w:bookmarkEnd w:id="146"/>
       <w:r>
         <w:rPr>
@@ -33798,7 +33798,7 @@
         <w:pStyle w:val="Heading2"/>
       </w:pPr>
       <w:bookmarkStart w:id="150" w:name="actor"/>
-      <w:bookmarkStart w:id="151" w:name="_Toc234841698"/>
+      <w:bookmarkStart w:id="151" w:name="_Toc234848222"/>
       <w:bookmarkEnd w:id="148"/>
       <w:r>
         <w:rPr>
@@ -33849,7 +33849,7 @@
         <w:pStyle w:val="Heading2"/>
       </w:pPr>
       <w:bookmarkStart w:id="152" w:name="class-diagram"/>
-      <w:bookmarkStart w:id="153" w:name="_Toc234841699"/>
+      <w:bookmarkStart w:id="153" w:name="_Toc234848223"/>
       <w:bookmarkEnd w:id="150"/>
       <w:r>
         <w:rPr>
@@ -33874,7 +33874,7 @@
           <w:noProof/>
         </w:rPr>
         <w:drawing>
-          <wp:inline distT="0" distB="0" distL="0" distR="0" wp14:anchorId="4E6BC45A" wp14:editId="17589CD2">
+          <wp:inline distT="0" distB="0" distL="0" distR="0" wp14:anchorId="0FE1B689" wp14:editId="61246216">
             <wp:extent cx="5334000" cy="3838614"/>
             <wp:effectExtent l="0" t="0" r="0" b="0"/>
             <wp:docPr id="343" name="Picture"/>
@@ -33939,7 +33939,7 @@
         <w:pStyle w:val="Heading2"/>
       </w:pPr>
       <w:bookmarkStart w:id="154" w:name="sequence-diagram"/>
-      <w:bookmarkStart w:id="155" w:name="_Toc234841700"/>
+      <w:bookmarkStart w:id="155" w:name="_Toc234848224"/>
       <w:bookmarkEnd w:id="152"/>
       <w:r>
         <w:rPr>
@@ -33962,7 +33962,7 @@
           <w:noProof/>
         </w:rPr>
         <w:drawing>
-          <wp:inline distT="0" distB="0" distL="0" distR="0" wp14:anchorId="3D84DBE3" wp14:editId="2CF464C3">
+          <wp:inline distT="0" distB="0" distL="0" distR="0" wp14:anchorId="4BD3C84C" wp14:editId="16B7F171">
             <wp:extent cx="5334000" cy="3999784"/>
             <wp:effectExtent l="0" t="0" r="0" b="0"/>
             <wp:docPr id="346" name="Picture"/>
@@ -34094,7 +34094,7 @@
         <w:pStyle w:val="Heading2"/>
       </w:pPr>
       <w:bookmarkStart w:id="156" w:name="select-classes"/>
-      <w:bookmarkStart w:id="157" w:name="_Toc234841701"/>
+      <w:bookmarkStart w:id="157" w:name="_Toc234848225"/>
       <w:bookmarkEnd w:id="154"/>
       <w:r>
         <w:rPr>
@@ -34155,7 +34155,7 @@
         <w:pStyle w:val="Heading2"/>
       </w:pPr>
       <w:bookmarkStart w:id="158" w:name="class-shape"/>
-      <w:bookmarkStart w:id="159" w:name="_Toc234841702"/>
+      <w:bookmarkStart w:id="159" w:name="_Toc234848226"/>
       <w:bookmarkEnd w:id="156"/>
       <w:r>
         <w:rPr>
@@ -34239,7 +34239,7 @@
         <w:pStyle w:val="Heading2"/>
       </w:pPr>
       <w:bookmarkStart w:id="160" w:name="select-members-methods"/>
-      <w:bookmarkStart w:id="161" w:name="_Toc234841703"/>
+      <w:bookmarkStart w:id="161" w:name="_Toc234848227"/>
       <w:bookmarkEnd w:id="158"/>
       <w:r>
         <w:rPr>
@@ -34294,7 +34294,7 @@
         <w:pStyle w:val="Heading2"/>
       </w:pPr>
       <w:bookmarkStart w:id="162" w:name="reorder-members-methods"/>
-      <w:bookmarkStart w:id="163" w:name="_Toc234841704"/>
+      <w:bookmarkStart w:id="163" w:name="_Toc234848228"/>
       <w:bookmarkEnd w:id="160"/>
       <w:r>
         <w:rPr>
@@ -34346,7 +34346,7 @@
         <w:pStyle w:val="Heading2"/>
       </w:pPr>
       <w:bookmarkStart w:id="164" w:name="signal-message"/>
-      <w:bookmarkStart w:id="165" w:name="_Toc234841705"/>
+      <w:bookmarkStart w:id="165" w:name="_Toc234848229"/>
       <w:bookmarkEnd w:id="162"/>
       <w:r>
         <w:rPr>
@@ -34406,7 +34406,7 @@
         <w:pStyle w:val="Heading2"/>
       </w:pPr>
       <w:bookmarkStart w:id="166" w:name="lifeline-note-dialogs"/>
-      <w:bookmarkStart w:id="167" w:name="_Toc234841706"/>
+      <w:bookmarkStart w:id="167" w:name="_Toc234848230"/>
       <w:bookmarkEnd w:id="164"/>
       <w:r>
         <w:rPr>
@@ -34458,7 +34458,7 @@
         <w:pStyle w:val="Heading2"/>
       </w:pPr>
       <w:bookmarkStart w:id="168" w:name="Xb9470c6e63f702dcde05f89c7607c45c6bcf312"/>
-      <w:bookmarkStart w:id="169" w:name="_Toc234841707"/>
+      <w:bookmarkStart w:id="169" w:name="_Toc234848231"/>
       <w:bookmarkEnd w:id="166"/>
       <w:r>
         <w:rPr>
@@ -34741,7 +34741,7 @@
         <w:pStyle w:val="Heading2"/>
       </w:pPr>
       <w:bookmarkStart w:id="170" w:name="add-serialization-to-project"/>
-      <w:bookmarkStart w:id="171" w:name="_Toc234841708"/>
+      <w:bookmarkStart w:id="171" w:name="_Toc234848232"/>
       <w:bookmarkEnd w:id="168"/>
       <w:r>
         <w:rPr>
@@ -34811,7 +34811,7 @@
         <w:pStyle w:val="Heading2"/>
       </w:pPr>
       <w:bookmarkStart w:id="172" w:name="find"/>
-      <w:bookmarkStart w:id="173" w:name="_Toc234841709"/>
+      <w:bookmarkStart w:id="173" w:name="_Toc234848233"/>
       <w:bookmarkEnd w:id="170"/>
       <w:r>
         <w:rPr>
@@ -34868,7 +34868,7 @@
         <w:pStyle w:val="Heading2"/>
       </w:pPr>
       <w:bookmarkStart w:id="174" w:name="read-source"/>
-      <w:bookmarkStart w:id="175" w:name="_Toc234841710"/>
+      <w:bookmarkStart w:id="175" w:name="_Toc234848234"/>
       <w:bookmarkEnd w:id="172"/>
       <w:r>
         <w:rPr>
@@ -34930,7 +34930,7 @@
         <w:pStyle w:val="Heading2"/>
       </w:pPr>
       <w:bookmarkStart w:id="176" w:name="save-source"/>
-      <w:bookmarkStart w:id="177" w:name="_Toc234841711"/>
+      <w:bookmarkStart w:id="177" w:name="_Toc234848235"/>
       <w:bookmarkEnd w:id="174"/>
       <w:r>
         <w:rPr>
@@ -35024,7 +35024,7 @@
         <w:pStyle w:val="Heading2"/>
       </w:pPr>
       <w:bookmarkStart w:id="178" w:name="virtual-methods-isclass-methods"/>
-      <w:bookmarkStart w:id="179" w:name="_Toc234841712"/>
+      <w:bookmarkStart w:id="179" w:name="_Toc234848236"/>
       <w:bookmarkEnd w:id="176"/>
       <w:r>
         <w:rPr>
@@ -35114,7 +35114,7 @@
         <w:pStyle w:val="Heading2"/>
       </w:pPr>
       <w:bookmarkStart w:id="180" w:name="user-sections-code-dialogs"/>
-      <w:bookmarkStart w:id="181" w:name="_Toc234841713"/>
+      <w:bookmarkStart w:id="181" w:name="_Toc234848237"/>
       <w:bookmarkEnd w:id="178"/>
       <w:r>
         <w:rPr>
@@ -35196,7 +35196,7 @@
         <w:pStyle w:val="Heading2"/>
       </w:pPr>
       <w:bookmarkStart w:id="182" w:name="code-editing-helper-wizards"/>
-      <w:bookmarkStart w:id="183" w:name="_Toc234841714"/>
+      <w:bookmarkStart w:id="183" w:name="_Toc234848238"/>
       <w:bookmarkEnd w:id="180"/>
       <w:r>
         <w:rPr>
@@ -35431,7 +35431,7 @@
         <w:pStyle w:val="Heading1"/>
       </w:pPr>
       <w:bookmarkStart w:id="184" w:name="reference-the-code-editor"/>
-      <w:bookmarkStart w:id="185" w:name="_Toc234841715"/>
+      <w:bookmarkStart w:id="185" w:name="_Toc234848239"/>
       <w:bookmarkEnd w:id="118"/>
       <w:bookmarkEnd w:id="182"/>
       <w:r>
@@ -35459,7 +35459,7 @@
         <w:pStyle w:val="Heading2"/>
       </w:pPr>
       <w:bookmarkStart w:id="186" w:name="editing-behavior"/>
-      <w:bookmarkStart w:id="187" w:name="_Toc234841716"/>
+      <w:bookmarkStart w:id="187" w:name="_Toc234848240"/>
       <w:r>
         <w:rPr>
           <w:rStyle w:val="SectionNumber"/>
@@ -35619,7 +35619,7 @@
         <w:pStyle w:val="Heading2"/>
       </w:pPr>
       <w:bookmarkStart w:id="188" w:name="code-insertion"/>
-      <w:bookmarkStart w:id="189" w:name="_Toc234841717"/>
+      <w:bookmarkStart w:id="189" w:name="_Toc234848241"/>
       <w:bookmarkEnd w:id="186"/>
       <w:r>
         <w:rPr>
@@ -35731,7 +35731,7 @@
         <w:pStyle w:val="Heading2"/>
       </w:pPr>
       <w:bookmarkStart w:id="190" w:name="where-it-appears"/>
-      <w:bookmarkStart w:id="191" w:name="_Toc234841718"/>
+      <w:bookmarkStart w:id="191" w:name="_Toc234848242"/>
       <w:bookmarkEnd w:id="188"/>
       <w:r>
         <w:rPr>
@@ -35938,7 +35938,7 @@
         <w:pStyle w:val="Heading1"/>
       </w:pPr>
       <w:bookmarkStart w:id="192" w:name="code-generation-in-depth"/>
-      <w:bookmarkStart w:id="193" w:name="_Toc234841719"/>
+      <w:bookmarkStart w:id="193" w:name="_Toc234848243"/>
       <w:bookmarkEnd w:id="184"/>
       <w:bookmarkEnd w:id="190"/>
       <w:r>
@@ -35958,7 +35958,7 @@
         <w:pStyle w:val="Heading2"/>
       </w:pPr>
       <w:bookmarkStart w:id="194" w:name="files-produced"/>
-      <w:bookmarkStart w:id="195" w:name="_Toc234841720"/>
+      <w:bookmarkStart w:id="195" w:name="_Toc234848244"/>
       <w:r>
         <w:rPr>
           <w:rStyle w:val="SectionNumber"/>
@@ -36042,7 +36042,7 @@
         <w:pStyle w:val="Heading2"/>
       </w:pPr>
       <w:bookmarkStart w:id="196" w:name="anatomy-of-a-generated-file"/>
-      <w:bookmarkStart w:id="197" w:name="_Toc234841721"/>
+      <w:bookmarkStart w:id="197" w:name="_Toc234848245"/>
       <w:bookmarkEnd w:id="194"/>
       <w:r>
         <w:rPr>
@@ -36471,7 +36471,7 @@
         <w:pStyle w:val="Heading2"/>
       </w:pPr>
       <w:bookmarkStart w:id="198" w:name="the-six-user-sections"/>
-      <w:bookmarkStart w:id="199" w:name="_Toc234841722"/>
+      <w:bookmarkStart w:id="199" w:name="_Toc234848246"/>
       <w:bookmarkEnd w:id="196"/>
       <w:r>
         <w:rPr>
@@ -36546,7 +36546,7 @@
         <w:pStyle w:val="Heading2"/>
       </w:pPr>
       <w:bookmarkStart w:id="200" w:name="constructorinclude-destructorinclude"/>
-      <w:bookmarkStart w:id="201" w:name="_Toc234841723"/>
+      <w:bookmarkStart w:id="201" w:name="_Toc234848247"/>
       <w:bookmarkEnd w:id="198"/>
       <w:r>
         <w:rPr>
@@ -36656,7 +36656,7 @@
         <w:pStyle w:val="Heading2"/>
       </w:pPr>
       <w:bookmarkStart w:id="202" w:name="read-source-the-round-trip"/>
-      <w:bookmarkStart w:id="203" w:name="_Toc234841724"/>
+      <w:bookmarkStart w:id="203" w:name="_Toc234848248"/>
       <w:bookmarkEnd w:id="200"/>
       <w:r>
         <w:rPr>
@@ -36791,7 +36791,7 @@
         <w:pStyle w:val="Heading1"/>
       </w:pPr>
       <w:bookmarkStart w:id="204" w:name="relations-and-the-intrusive-runtime"/>
-      <w:bookmarkStart w:id="205" w:name="_Toc234841725"/>
+      <w:bookmarkStart w:id="205" w:name="_Toc234848249"/>
       <w:bookmarkEnd w:id="192"/>
       <w:bookmarkEnd w:id="202"/>
       <w:r>
@@ -36819,7 +36819,7 @@
         <w:pStyle w:val="Heading2"/>
       </w:pPr>
       <w:bookmarkStart w:id="206" w:name="what-intrusive-means"/>
-      <w:bookmarkStart w:id="207" w:name="_Toc234841726"/>
+      <w:bookmarkStart w:id="207" w:name="_Toc234848250"/>
       <w:r>
         <w:rPr>
           <w:rStyle w:val="SectionNumber"/>
@@ -36841,7 +36841,7 @@
           <w:noProof/>
         </w:rPr>
         <w:drawing>
-          <wp:inline distT="0" distB="0" distL="0" distR="0" wp14:anchorId="36CA69C0" wp14:editId="0E47CD95">
+          <wp:inline distT="0" distB="0" distL="0" distR="0" wp14:anchorId="29B629C2" wp14:editId="4C6CC9AC">
             <wp:extent cx="5334000" cy="3246782"/>
             <wp:effectExtent l="0" t="0" r="0" b="0"/>
             <wp:docPr id="375" name="Picture" descr="One Cell in two lists: all link pointers are members of the Cell itself."/>
@@ -37208,7 +37208,7 @@
         <w:pStyle w:val="Heading2"/>
       </w:pPr>
       <w:bookmarkStart w:id="208" w:name="declaring-relations-the-macro-surface"/>
-      <w:bookmarkStart w:id="209" w:name="_Toc234841727"/>
+      <w:bookmarkStart w:id="209" w:name="_Toc234848251"/>
       <w:bookmarkEnd w:id="206"/>
       <w:r>
         <w:rPr>
@@ -37853,7 +37853,7 @@
         <w:pStyle w:val="Heading2"/>
       </w:pPr>
       <w:bookmarkStart w:id="210" w:name="the-generated-api-of-a-multi-relation"/>
-      <w:bookmarkStart w:id="211" w:name="_Toc234841728"/>
+      <w:bookmarkStart w:id="211" w:name="_Toc234848252"/>
       <w:bookmarkEnd w:id="208"/>
       <w:r>
         <w:rPr>
@@ -38770,7 +38770,7 @@
         <w:pStyle w:val="Heading2"/>
       </w:pPr>
       <w:bookmarkStart w:id="212" w:name="Xaaa89ef9d7adb0d0fb470691c4808f6f6b0754c"/>
-      <w:bookmarkStart w:id="213" w:name="_Toc234841729"/>
+      <w:bookmarkStart w:id="213" w:name="_Toc234848253"/>
       <w:bookmarkEnd w:id="210"/>
       <w:r>
         <w:rPr>
@@ -39133,7 +39133,7 @@
         <w:pStyle w:val="Heading2"/>
       </w:pPr>
       <w:bookmarkStart w:id="214" w:name="ownership-and-cascade-delete"/>
-      <w:bookmarkStart w:id="215" w:name="_Toc234841730"/>
+      <w:bookmarkStart w:id="215" w:name="_Toc234848254"/>
       <w:bookmarkEnd w:id="212"/>
       <w:r>
         <w:rPr>
@@ -39156,7 +39156,7 @@
           <w:noProof/>
         </w:rPr>
         <w:drawing>
-          <wp:inline distT="0" distB="0" distL="0" distR="0" wp14:anchorId="73A69701" wp14:editId="58FC0550">
+          <wp:inline distT="0" distB="0" distL="0" distR="0" wp14:anchorId="0481AF4B" wp14:editId="7E2E819F">
             <wp:extent cx="5334000" cy="2724978"/>
             <wp:effectExtent l="0" t="0" r="0" b="0"/>
             <wp:docPr id="383" name="Picture" descr="delete pMatrix — the cascade frees the entire graph."/>
@@ -39311,7 +39311,7 @@
         <w:pStyle w:val="Heading2"/>
       </w:pPr>
       <w:bookmarkStart w:id="216" w:name="iterators-that-survive-modification"/>
-      <w:bookmarkStart w:id="217" w:name="_Toc234841731"/>
+      <w:bookmarkStart w:id="217" w:name="_Toc234848255"/>
       <w:bookmarkEnd w:id="214"/>
       <w:r>
         <w:rPr>
@@ -39519,7 +39519,7 @@
         <w:pStyle w:val="Heading2"/>
       </w:pPr>
       <w:bookmarkStart w:id="218" w:name="single-static-multi"/>
-      <w:bookmarkStart w:id="219" w:name="_Toc234841732"/>
+      <w:bookmarkStart w:id="219" w:name="_Toc234848256"/>
       <w:bookmarkEnd w:id="216"/>
       <w:r>
         <w:rPr>
@@ -39595,7 +39595,7 @@
         <w:pStyle w:val="Heading2"/>
       </w:pPr>
       <w:bookmarkStart w:id="220" w:name="tree-implementations-and-find-methods"/>
-      <w:bookmarkStart w:id="221" w:name="_Toc234841733"/>
+      <w:bookmarkStart w:id="221" w:name="_Toc234848257"/>
       <w:bookmarkEnd w:id="218"/>
       <w:r>
         <w:rPr>
@@ -40251,7 +40251,7 @@
         <w:pStyle w:val="Heading2"/>
       </w:pPr>
       <w:bookmarkStart w:id="222" w:name="critical-relations-threads"/>
-      <w:bookmarkStart w:id="223" w:name="_Toc234841734"/>
+      <w:bookmarkStart w:id="223" w:name="_Toc234848258"/>
       <w:bookmarkEnd w:id="220"/>
       <w:r>
         <w:rPr>
@@ -40307,7 +40307,7 @@
         <w:pStyle w:val="Heading2"/>
       </w:pPr>
       <w:bookmarkStart w:id="224" w:name="writing-loops-the-generated-way"/>
-      <w:bookmarkStart w:id="225" w:name="_Toc234841735"/>
+      <w:bookmarkStart w:id="225" w:name="_Toc234848259"/>
       <w:bookmarkEnd w:id="222"/>
       <w:r>
         <w:rPr>
@@ -40653,7 +40653,7 @@
         <w:pStyle w:val="Heading1"/>
       </w:pPr>
       <w:bookmarkStart w:id="226" w:name="serialization"/>
-      <w:bookmarkStart w:id="227" w:name="_Toc234841736"/>
+      <w:bookmarkStart w:id="227" w:name="_Toc234848260"/>
       <w:bookmarkEnd w:id="204"/>
       <w:bookmarkEnd w:id="224"/>
       <w:r>
@@ -40673,7 +40673,7 @@
         <w:pStyle w:val="Heading2"/>
       </w:pPr>
       <w:bookmarkStart w:id="228" w:name="what-you-get"/>
-      <w:bookmarkStart w:id="229" w:name="_Toc234841737"/>
+      <w:bookmarkStart w:id="229" w:name="_Toc234848261"/>
       <w:r>
         <w:rPr>
           <w:rStyle w:val="SectionNumber"/>
@@ -40874,7 +40874,7 @@
         <w:pStyle w:val="Heading2"/>
       </w:pPr>
       <w:bookmarkStart w:id="230" w:name="cbarchive-and-the-wire-format"/>
-      <w:bookmarkStart w:id="231" w:name="_Toc234841738"/>
+      <w:bookmarkStart w:id="231" w:name="_Toc234848262"/>
       <w:bookmarkEnd w:id="228"/>
       <w:r>
         <w:rPr>
@@ -40997,7 +40997,7 @@
         <w:pStyle w:val="Heading2"/>
       </w:pPr>
       <w:bookmarkStart w:id="232" w:name="cbz-compression-on-the-fly"/>
-      <w:bookmarkStart w:id="233" w:name="_Toc234841739"/>
+      <w:bookmarkStart w:id="233" w:name="_Toc234848263"/>
       <w:bookmarkEnd w:id="230"/>
       <w:r>
         <w:rPr>
@@ -41330,7 +41330,7 @@
         <w:pStyle w:val="Heading2"/>
       </w:pPr>
       <w:bookmarkStart w:id="234" w:name="Xbded68cf7b5dad621557026fdc0855cc4156113"/>
-      <w:bookmarkStart w:id="235" w:name="_Toc234841740"/>
+      <w:bookmarkStart w:id="235" w:name="_Toc234848264"/>
       <w:bookmarkEnd w:id="232"/>
       <w:r>
         <w:rPr>
@@ -41587,7 +41587,7 @@
         <w:pStyle w:val="Heading2"/>
       </w:pPr>
       <w:bookmarkStart w:id="236" w:name="rules-and-properties"/>
-      <w:bookmarkStart w:id="237" w:name="_Toc234841741"/>
+      <w:bookmarkStart w:id="237" w:name="_Toc234848265"/>
       <w:bookmarkEnd w:id="234"/>
       <w:r>
         <w:rPr>
@@ -41761,7 +41761,7 @@
         <w:pStyle w:val="Heading2"/>
       </w:pPr>
       <w:bookmarkStart w:id="238" w:name="Xe93cc69c5286d8ba9c1392594baf9a373c30c75"/>
-      <w:bookmarkStart w:id="239" w:name="_Toc234841742"/>
+      <w:bookmarkStart w:id="239" w:name="_Toc234848266"/>
       <w:bookmarkEnd w:id="236"/>
       <w:r>
         <w:rPr>
@@ -41933,7 +41933,7 @@
         <w:pStyle w:val="Heading1"/>
       </w:pPr>
       <w:bookmarkStart w:id="240" w:name="the-generated-undoredo-framework"/>
-      <w:bookmarkStart w:id="241" w:name="_Toc234841743"/>
+      <w:bookmarkStart w:id="241" w:name="_Toc234848267"/>
       <w:bookmarkEnd w:id="226"/>
       <w:bookmarkEnd w:id="238"/>
       <w:r>
@@ -41953,7 +41953,7 @@
         <w:pStyle w:val="Heading2"/>
       </w:pPr>
       <w:bookmarkStart w:id="242" w:name="what-it-is"/>
-      <w:bookmarkStart w:id="243" w:name="_Toc234841744"/>
+      <w:bookmarkStart w:id="243" w:name="_Toc234848268"/>
       <w:r>
         <w:rPr>
           <w:rStyle w:val="SectionNumber"/>
@@ -42002,7 +42002,7 @@
         <w:pStyle w:val="Heading2"/>
       </w:pPr>
       <w:bookmarkStart w:id="244" w:name="how-it-works"/>
-      <w:bookmarkStart w:id="245" w:name="_Toc234841745"/>
+      <w:bookmarkStart w:id="245" w:name="_Toc234848269"/>
       <w:bookmarkEnd w:id="242"/>
       <w:r>
         <w:rPr>
@@ -42375,7 +42375,7 @@
         <w:pStyle w:val="Heading2"/>
       </w:pPr>
       <w:bookmarkStart w:id="246" w:name="the-undoreplace-entanglement"/>
-      <w:bookmarkStart w:id="247" w:name="_Toc234841746"/>
+      <w:bookmarkStart w:id="247" w:name="_Toc234848270"/>
       <w:bookmarkEnd w:id="244"/>
       <w:r>
         <w:rPr>
@@ -42468,7 +42468,7 @@
         <w:pStyle w:val="Heading1"/>
       </w:pPr>
       <w:bookmarkStart w:id="248" w:name="the-replace-constructor"/>
-      <w:bookmarkStart w:id="249" w:name="_Toc234841747"/>
+      <w:bookmarkStart w:id="249" w:name="_Toc234848271"/>
       <w:bookmarkEnd w:id="240"/>
       <w:bookmarkEnd w:id="246"/>
       <w:r>
@@ -42490,7 +42490,7 @@
         <w:pStyle w:val="Heading2"/>
       </w:pPr>
       <w:bookmarkStart w:id="250" w:name="the-idea"/>
-      <w:bookmarkStart w:id="251" w:name="_Toc234841748"/>
+      <w:bookmarkStart w:id="251" w:name="_Toc234848272"/>
       <w:r>
         <w:rPr>
           <w:rStyle w:val="SectionNumber"/>
@@ -42512,7 +42512,7 @@
           <w:noProof/>
         </w:rPr>
         <w:drawing>
-          <wp:inline distT="0" distB="0" distL="0" distR="0" wp14:anchorId="5764A2F5" wp14:editId="4ACC6320">
+          <wp:inline distT="0" distB="0" distL="0" distR="0" wp14:anchorId="592FA580" wp14:editId="13ECF958">
             <wp:extent cx="5334000" cy="2782956"/>
             <wp:effectExtent l="0" t="0" r="0" b="0"/>
             <wp:docPr id="405" name="Picture" descr="Replace: the new object takes over every relation slot of the old one."/>
@@ -42702,7 +42702,7 @@
         <w:pStyle w:val="Heading2"/>
       </w:pPr>
       <w:bookmarkStart w:id="252" w:name="why-it-is-more-powerful-than-a-factory"/>
-      <w:bookmarkStart w:id="253" w:name="_Toc234841749"/>
+      <w:bookmarkStart w:id="253" w:name="_Toc234848273"/>
       <w:bookmarkEnd w:id="250"/>
       <w:r>
         <w:rPr>
@@ -43253,7 +43253,7 @@
         <w:pStyle w:val="Heading2"/>
       </w:pPr>
       <w:bookmarkStart w:id="254" w:name="mechanics-and-constraints"/>
-      <w:bookmarkStart w:id="255" w:name="_Toc234841750"/>
+      <w:bookmarkStart w:id="255" w:name="_Toc234848274"/>
       <w:bookmarkEnd w:id="252"/>
       <w:r>
         <w:rPr>
@@ -43354,7 +43354,7 @@
         <w:pStyle w:val="Heading1"/>
       </w:pPr>
       <w:bookmarkStart w:id="256" w:name="the-command-interface"/>
-      <w:bookmarkStart w:id="257" w:name="_Toc234841751"/>
+      <w:bookmarkStart w:id="257" w:name="_Toc234848275"/>
       <w:bookmarkEnd w:id="248"/>
       <w:bookmarkEnd w:id="254"/>
       <w:r>
@@ -43376,7 +43376,7 @@
         <w:pStyle w:val="Heading2"/>
       </w:pPr>
       <w:bookmarkStart w:id="258" w:name="what-it-is-1"/>
-      <w:bookmarkStart w:id="259" w:name="_Toc234841752"/>
+      <w:bookmarkStart w:id="259" w:name="_Toc234848276"/>
       <w:r>
         <w:rPr>
           <w:rStyle w:val="SectionNumber"/>
@@ -43540,7 +43540,7 @@
         <w:pStyle w:val="Heading2"/>
       </w:pPr>
       <w:bookmarkStart w:id="260" w:name="connecting"/>
-      <w:bookmarkStart w:id="261" w:name="_Toc234841753"/>
+      <w:bookmarkStart w:id="261" w:name="_Toc234848277"/>
       <w:bookmarkEnd w:id="258"/>
       <w:r>
         <w:rPr>
@@ -44011,7 +44011,7 @@
         <w:pStyle w:val="Heading2"/>
       </w:pPr>
       <w:bookmarkStart w:id="262" w:name="the-command-families"/>
-      <w:bookmarkStart w:id="263" w:name="_Toc234841754"/>
+      <w:bookmarkStart w:id="263" w:name="_Toc234848278"/>
       <w:bookmarkEnd w:id="260"/>
       <w:r>
         <w:rPr>
@@ -44927,7 +44927,7 @@
         <w:pStyle w:val="Heading2"/>
       </w:pPr>
       <w:bookmarkStart w:id="264" w:name="worked-examples-real-requests"/>
-      <w:bookmarkStart w:id="265" w:name="_Toc234841755"/>
+      <w:bookmarkStart w:id="265" w:name="_Toc234848279"/>
       <w:bookmarkEnd w:id="262"/>
       <w:r>
         <w:rPr>
@@ -46878,7 +46878,7 @@
         <w:pStyle w:val="Heading2"/>
       </w:pPr>
       <w:bookmarkStart w:id="266" w:name="conventions-and-gotchas"/>
-      <w:bookmarkStart w:id="267" w:name="_Toc234841756"/>
+      <w:bookmarkStart w:id="267" w:name="_Toc234848280"/>
       <w:bookmarkEnd w:id="264"/>
       <w:r>
         <w:rPr>
@@ -47145,7 +47145,7 @@
         <w:pStyle w:val="Heading1"/>
       </w:pPr>
       <w:bookmarkStart w:id="268" w:name="tips-pitfalls-and-best-practices"/>
-      <w:bookmarkStart w:id="269" w:name="_Toc234841757"/>
+      <w:bookmarkStart w:id="269" w:name="_Toc234848281"/>
       <w:bookmarkEnd w:id="256"/>
       <w:bookmarkEnd w:id="266"/>
       <w:r>
@@ -47622,7 +47622,7 @@
         <w:pStyle w:val="Heading1"/>
       </w:pPr>
       <w:bookmarkStart w:id="270" w:name="appendix"/>
-      <w:bookmarkStart w:id="271" w:name="_Toc234841758"/>
+      <w:bookmarkStart w:id="271" w:name="_Toc234848282"/>
       <w:bookmarkEnd w:id="268"/>
       <w:r>
         <w:rPr>
@@ -47641,7 +47641,7 @@
         <w:pStyle w:val="Heading2"/>
       </w:pPr>
       <w:bookmarkStart w:id="272" w:name="a.-runtime-header-inventory"/>
-      <w:bookmarkStart w:id="273" w:name="_Toc234841759"/>
+      <w:bookmarkStart w:id="273" w:name="_Toc234848283"/>
       <w:r>
         <w:rPr>
           <w:rStyle w:val="SectionNumber"/>
@@ -48152,7 +48152,7 @@
         <w:pStyle w:val="Heading2"/>
       </w:pPr>
       <w:bookmarkStart w:id="274" w:name="b.-marker-quick-reference"/>
-      <w:bookmarkStart w:id="275" w:name="_Toc234841760"/>
+      <w:bookmarkStart w:id="275" w:name="_Toc234848284"/>
       <w:bookmarkEnd w:id="272"/>
       <w:r>
         <w:rPr>
@@ -48236,7 +48236,7 @@
         <w:pStyle w:val="Heading2"/>
       </w:pPr>
       <w:bookmarkStart w:id="276" w:name="c.-glossary"/>
-      <w:bookmarkStart w:id="277" w:name="_Toc234841761"/>
+      <w:bookmarkStart w:id="277" w:name="_Toc234848285"/>
       <w:bookmarkEnd w:id="274"/>
       <w:r>
         <w:rPr>
@@ -48662,7 +48662,7 @@
   <w:abstractNum w:abstractNumId="0" w15:restartNumberingAfterBreak="0">
     <w:nsid w:val="0000A990"/>
     <w:multiLevelType w:val="multilevel"/>
-    <w:tmpl w:val="87EE2EBE"/>
+    <w:tmpl w:val="CEE0FD0A"/>
     <w:lvl w:ilvl="0">
       <w:numFmt w:val="bullet"/>
       <w:lvlText w:val=" "/>
@@ -48739,7 +48739,7 @@
   <w:abstractNum w:abstractNumId="1" w15:restartNumberingAfterBreak="0">
     <w:nsid w:val="0000A991"/>
     <w:multiLevelType w:val="multilevel"/>
-    <w:tmpl w:val="E050F2CC"/>
+    <w:tmpl w:val="ED4AD6FA"/>
     <w:lvl w:ilvl="0">
       <w:numFmt w:val="bullet"/>
       <w:lvlText w:val="•"/>
@@ -48816,7 +48816,7 @@
   <w:abstractNum w:abstractNumId="2" w15:restartNumberingAfterBreak="0">
     <w:nsid w:val="00A99411"/>
     <w:multiLevelType w:val="multilevel"/>
-    <w:tmpl w:val="C99CD95A"/>
+    <w:tmpl w:val="0C683A92"/>
     <w:lvl w:ilvl="0">
       <w:start w:val="1"/>
       <w:numFmt w:val="decimal"/>
@@ -48899,31 +48899,31 @@
       </w:pPr>
     </w:lvl>
   </w:abstractNum>
-  <w:num w:numId="1" w16cid:durableId="407266341">
+  <w:num w:numId="1" w16cid:durableId="2050913901">
     <w:abstractNumId w:val="0"/>
   </w:num>
-  <w:num w:numId="2" w16cid:durableId="1223952909">
+  <w:num w:numId="2" w16cid:durableId="1429346019">
     <w:abstractNumId w:val="1"/>
   </w:num>
-  <w:num w:numId="3" w16cid:durableId="528224234">
+  <w:num w:numId="3" w16cid:durableId="1031490013">
     <w:abstractNumId w:val="1"/>
   </w:num>
-  <w:num w:numId="4" w16cid:durableId="1168059853">
+  <w:num w:numId="4" w16cid:durableId="194854166">
     <w:abstractNumId w:val="1"/>
   </w:num>
-  <w:num w:numId="5" w16cid:durableId="550188993">
+  <w:num w:numId="5" w16cid:durableId="1105659690">
     <w:abstractNumId w:val="1"/>
   </w:num>
-  <w:num w:numId="6" w16cid:durableId="644512465">
+  <w:num w:numId="6" w16cid:durableId="828905634">
     <w:abstractNumId w:val="1"/>
   </w:num>
-  <w:num w:numId="7" w16cid:durableId="1323464892">
+  <w:num w:numId="7" w16cid:durableId="907115306">
     <w:abstractNumId w:val="1"/>
   </w:num>
-  <w:num w:numId="8" w16cid:durableId="291862204">
+  <w:num w:numId="8" w16cid:durableId="426846964">
     <w:abstractNumId w:val="1"/>
   </w:num>
-  <w:num w:numId="9" w16cid:durableId="540938605">
+  <w:num w:numId="9" w16cid:durableId="1899584869">
     <w:abstractNumId w:val="2"/>
     <w:lvlOverride w:ilvl="0">
       <w:startOverride w:val="1"/>
@@ -48953,40 +48953,40 @@
       <w:startOverride w:val="1"/>
     </w:lvlOverride>
   </w:num>
-  <w:num w:numId="10" w16cid:durableId="2031838340">
+  <w:num w:numId="10" w16cid:durableId="1022054438">
     <w:abstractNumId w:val="1"/>
   </w:num>
-  <w:num w:numId="11" w16cid:durableId="666858713">
+  <w:num w:numId="11" w16cid:durableId="816267158">
     <w:abstractNumId w:val="1"/>
   </w:num>
-  <w:num w:numId="12" w16cid:durableId="1430540234">
+  <w:num w:numId="12" w16cid:durableId="632444353">
     <w:abstractNumId w:val="1"/>
   </w:num>
-  <w:num w:numId="13" w16cid:durableId="210385137">
+  <w:num w:numId="13" w16cid:durableId="65541410">
     <w:abstractNumId w:val="1"/>
   </w:num>
-  <w:num w:numId="14" w16cid:durableId="212351788">
+  <w:num w:numId="14" w16cid:durableId="982122758">
     <w:abstractNumId w:val="1"/>
   </w:num>
-  <w:num w:numId="15" w16cid:durableId="1517235944">
+  <w:num w:numId="15" w16cid:durableId="1340500682">
     <w:abstractNumId w:val="1"/>
   </w:num>
-  <w:num w:numId="16" w16cid:durableId="1070542018">
+  <w:num w:numId="16" w16cid:durableId="2055110117">
     <w:abstractNumId w:val="1"/>
   </w:num>
-  <w:num w:numId="17" w16cid:durableId="1115711318">
+  <w:num w:numId="17" w16cid:durableId="1728915162">
     <w:abstractNumId w:val="1"/>
   </w:num>
-  <w:num w:numId="18" w16cid:durableId="1697005946">
+  <w:num w:numId="18" w16cid:durableId="207450560">
     <w:abstractNumId w:val="1"/>
   </w:num>
-  <w:num w:numId="19" w16cid:durableId="325594865">
+  <w:num w:numId="19" w16cid:durableId="1954366257">
     <w:abstractNumId w:val="1"/>
   </w:num>
-  <w:num w:numId="20" w16cid:durableId="261887857">
+  <w:num w:numId="20" w16cid:durableId="766199756">
     <w:abstractNumId w:val="1"/>
   </w:num>
-  <w:num w:numId="21" w16cid:durableId="150294356">
+  <w:num w:numId="21" w16cid:durableId="530922830">
     <w:abstractNumId w:val="2"/>
     <w:lvlOverride w:ilvl="0">
       <w:startOverride w:val="1"/>
@@ -49016,52 +49016,52 @@
       <w:startOverride w:val="1"/>
     </w:lvlOverride>
   </w:num>
-  <w:num w:numId="22" w16cid:durableId="1257203438">
+  <w:num w:numId="22" w16cid:durableId="377314814">
     <w:abstractNumId w:val="1"/>
   </w:num>
-  <w:num w:numId="23" w16cid:durableId="1584871389">
+  <w:num w:numId="23" w16cid:durableId="884636535">
     <w:abstractNumId w:val="1"/>
   </w:num>
-  <w:num w:numId="24" w16cid:durableId="1138306163">
+  <w:num w:numId="24" w16cid:durableId="229073095">
     <w:abstractNumId w:val="1"/>
   </w:num>
-  <w:num w:numId="25" w16cid:durableId="1165899764">
+  <w:num w:numId="25" w16cid:durableId="876813755">
     <w:abstractNumId w:val="1"/>
   </w:num>
-  <w:num w:numId="26" w16cid:durableId="428936055">
+  <w:num w:numId="26" w16cid:durableId="1817335706">
     <w:abstractNumId w:val="1"/>
   </w:num>
-  <w:num w:numId="27" w16cid:durableId="1985162321">
+  <w:num w:numId="27" w16cid:durableId="2083527629">
     <w:abstractNumId w:val="1"/>
   </w:num>
-  <w:num w:numId="28" w16cid:durableId="779372911">
+  <w:num w:numId="28" w16cid:durableId="1631520070">
     <w:abstractNumId w:val="1"/>
   </w:num>
-  <w:num w:numId="29" w16cid:durableId="417676604">
+  <w:num w:numId="29" w16cid:durableId="1648046965">
     <w:abstractNumId w:val="1"/>
   </w:num>
-  <w:num w:numId="30" w16cid:durableId="1307933068">
+  <w:num w:numId="30" w16cid:durableId="107700253">
     <w:abstractNumId w:val="1"/>
   </w:num>
-  <w:num w:numId="31" w16cid:durableId="1391079681">
+  <w:num w:numId="31" w16cid:durableId="466893453">
     <w:abstractNumId w:val="1"/>
   </w:num>
-  <w:num w:numId="32" w16cid:durableId="48237658">
+  <w:num w:numId="32" w16cid:durableId="1022048192">
     <w:abstractNumId w:val="1"/>
   </w:num>
-  <w:num w:numId="33" w16cid:durableId="1389912443">
+  <w:num w:numId="33" w16cid:durableId="2136488395">
     <w:abstractNumId w:val="1"/>
   </w:num>
-  <w:num w:numId="34" w16cid:durableId="364674363">
+  <w:num w:numId="34" w16cid:durableId="1078094952">
     <w:abstractNumId w:val="1"/>
   </w:num>
-  <w:num w:numId="35" w16cid:durableId="1603369356">
+  <w:num w:numId="35" w16cid:durableId="450318388">
     <w:abstractNumId w:val="1"/>
   </w:num>
-  <w:num w:numId="36" w16cid:durableId="1767575798">
+  <w:num w:numId="36" w16cid:durableId="2128155317">
     <w:abstractNumId w:val="1"/>
   </w:num>
-  <w:num w:numId="37" w16cid:durableId="1377437764">
+  <w:num w:numId="37" w16cid:durableId="1938711697">
     <w:abstractNumId w:val="2"/>
     <w:lvlOverride w:ilvl="0">
       <w:startOverride w:val="1"/>
@@ -49091,10 +49091,10 @@
       <w:startOverride w:val="1"/>
     </w:lvlOverride>
   </w:num>
-  <w:num w:numId="38" w16cid:durableId="1035546933">
+  <w:num w:numId="38" w16cid:durableId="1537304660">
     <w:abstractNumId w:val="1"/>
   </w:num>
-  <w:num w:numId="39" w16cid:durableId="1098140315">
+  <w:num w:numId="39" w16cid:durableId="1626040138">
     <w:abstractNumId w:val="2"/>
     <w:lvlOverride w:ilvl="0">
       <w:startOverride w:val="1"/>
@@ -49124,28 +49124,28 @@
       <w:startOverride w:val="1"/>
     </w:lvlOverride>
   </w:num>
-  <w:num w:numId="40" w16cid:durableId="1774864676">
+  <w:num w:numId="40" w16cid:durableId="1778403938">
     <w:abstractNumId w:val="1"/>
   </w:num>
-  <w:num w:numId="41" w16cid:durableId="1309437573">
+  <w:num w:numId="41" w16cid:durableId="1439179800">
     <w:abstractNumId w:val="1"/>
   </w:num>
-  <w:num w:numId="42" w16cid:durableId="1839612266">
+  <w:num w:numId="42" w16cid:durableId="213857906">
     <w:abstractNumId w:val="1"/>
   </w:num>
-  <w:num w:numId="43" w16cid:durableId="337925202">
+  <w:num w:numId="43" w16cid:durableId="544022186">
     <w:abstractNumId w:val="1"/>
   </w:num>
-  <w:num w:numId="44" w16cid:durableId="1078134516">
+  <w:num w:numId="44" w16cid:durableId="1516842724">
     <w:abstractNumId w:val="1"/>
   </w:num>
-  <w:num w:numId="45" w16cid:durableId="225772866">
+  <w:num w:numId="45" w16cid:durableId="1489982498">
     <w:abstractNumId w:val="1"/>
   </w:num>
-  <w:num w:numId="46" w16cid:durableId="1631596342">
+  <w:num w:numId="46" w16cid:durableId="1697925985">
     <w:abstractNumId w:val="1"/>
   </w:num>
-  <w:num w:numId="47" w16cid:durableId="1286540906">
+  <w:num w:numId="47" w16cid:durableId="183593403">
     <w:abstractNumId w:val="1"/>
   </w:num>
 </w:numbering>
@@ -50201,7 +50201,7 @@
     <w:next w:val="Normal"/>
     <w:autoRedefine/>
     <w:uiPriority w:val="39"/>
-    <w:rsid w:val="00B35B5C"/>
+    <w:rsid w:val="009F521C"/>
     <w:pPr>
       <w:spacing w:after="100"/>
     </w:pPr>
@@ -50212,7 +50212,7 @@
     <w:next w:val="Normal"/>
     <w:autoRedefine/>
     <w:uiPriority w:val="39"/>
-    <w:rsid w:val="00B35B5C"/>
+    <w:rsid w:val="009F521C"/>
     <w:pPr>
       <w:spacing w:after="100"/>
       <w:ind w:left="240"/>
@@ -50225,7 +50225,7 @@
     <w:autoRedefine/>
     <w:uiPriority w:val="39"/>
     <w:unhideWhenUsed/>
-    <w:rsid w:val="00B35B5C"/>
+    <w:rsid w:val="009F521C"/>
     <w:pPr>
       <w:spacing w:after="100" w:line="278" w:lineRule="auto"/>
       <w:ind w:left="480"/>
@@ -50243,7 +50243,7 @@
     <w:autoRedefine/>
     <w:uiPriority w:val="39"/>
     <w:unhideWhenUsed/>
-    <w:rsid w:val="00B35B5C"/>
+    <w:rsid w:val="009F521C"/>
     <w:pPr>
       <w:spacing w:after="100" w:line="278" w:lineRule="auto"/>
       <w:ind w:left="720"/>
@@ -50261,7 +50261,7 @@
     <w:autoRedefine/>
     <w:uiPriority w:val="39"/>
     <w:unhideWhenUsed/>
-    <w:rsid w:val="00B35B5C"/>
+    <w:rsid w:val="009F521C"/>
     <w:pPr>
       <w:spacing w:after="100" w:line="278" w:lineRule="auto"/>
       <w:ind w:left="960"/>
@@ -50279,7 +50279,7 @@
     <w:autoRedefine/>
     <w:uiPriority w:val="39"/>
     <w:unhideWhenUsed/>
-    <w:rsid w:val="00B35B5C"/>
+    <w:rsid w:val="009F521C"/>
     <w:pPr>
       <w:spacing w:after="100" w:line="278" w:lineRule="auto"/>
       <w:ind w:left="1200"/>
@@ -50297,7 +50297,7 @@
     <w:autoRedefine/>
     <w:uiPriority w:val="39"/>
     <w:unhideWhenUsed/>
-    <w:rsid w:val="00B35B5C"/>
+    <w:rsid w:val="009F521C"/>
     <w:pPr>
       <w:spacing w:after="100" w:line="278" w:lineRule="auto"/>
       <w:ind w:left="1440"/>
@@ -50315,7 +50315,7 @@
     <w:autoRedefine/>
     <w:uiPriority w:val="39"/>
     <w:unhideWhenUsed/>
-    <w:rsid w:val="00B35B5C"/>
+    <w:rsid w:val="009F521C"/>
     <w:pPr>
       <w:spacing w:after="100" w:line="278" w:lineRule="auto"/>
       <w:ind w:left="1680"/>
@@ -50333,7 +50333,7 @@
     <w:autoRedefine/>
     <w:uiPriority w:val="39"/>
     <w:unhideWhenUsed/>
-    <w:rsid w:val="00B35B5C"/>
+    <w:rsid w:val="009F521C"/>
     <w:pPr>
       <w:spacing w:after="100" w:line="278" w:lineRule="auto"/>
       <w:ind w:left="1920"/>
@@ -50350,7 +50350,7 @@
     <w:uiPriority w:val="99"/>
     <w:semiHidden/>
     <w:unhideWhenUsed/>
-    <w:rsid w:val="00B35B5C"/>
+    <w:rsid w:val="009F521C"/>
     <w:rPr>
       <w:color w:val="605E5C"/>
       <w:shd w:val="clear" w:color="auto" w:fill="E1DFDD"/>

</xml_diff>

<commit_message>
docs(manual): base/derived browser shots at equal height; docx regenerated
Co-Authored-By: Claude Fable 5 <noreply@anthropic.com>
</commit_message>
<xml_diff>
--- a/docs/manual/ClassBuilder_Manual.docx
+++ b/docs/manual/ClassBuilder_Manual.docx
@@ -34,7 +34,7 @@
           <w:sz w:val="24"/>
           <w:szCs w:val="24"/>
         </w:rPr>
-        <w:id w:val="-1994779833"/>
+        <w:id w:val="1046717454"/>
         <w:docPartObj>
           <w:docPartGallery w:val="Table of Contents"/>
           <w:docPartUnique/>
@@ -74,7 +74,7 @@
           <w:r>
             <w:fldChar w:fldCharType="separate"/>
           </w:r>
-          <w:hyperlink w:anchor="_Toc234848147" w:history="1">
+          <w:hyperlink w:anchor="_Toc234848979" w:history="1">
             <w:r>
               <w:rPr>
                 <w:rStyle w:val="Hyperlink"/>
@@ -118,7 +118,7 @@
                 <w:noProof/>
                 <w:webHidden/>
               </w:rPr>
-              <w:instrText xml:space="preserve"> PAGEREF _Toc234848147 \h </w:instrText>
+              <w:instrText xml:space="preserve"> PAGEREF _Toc234848979 \h </w:instrText>
             </w:r>
             <w:r>
               <w:rPr>
@@ -164,7 +164,7 @@
               <w14:ligatures w14:val="standardContextual"/>
             </w:rPr>
           </w:pPr>
-          <w:hyperlink w:anchor="_Toc234848148" w:history="1">
+          <w:hyperlink w:anchor="_Toc234848980" w:history="1">
             <w:r>
               <w:rPr>
                 <w:rStyle w:val="Hyperlink"/>
@@ -208,7 +208,7 @@
                 <w:noProof/>
                 <w:webHidden/>
               </w:rPr>
-              <w:instrText xml:space="preserve"> PAGEREF _Toc234848148 \h </w:instrText>
+              <w:instrText xml:space="preserve"> PAGEREF _Toc234848980 \h </w:instrText>
             </w:r>
             <w:r>
               <w:rPr>
@@ -254,7 +254,7 @@
               <w14:ligatures w14:val="standardContextual"/>
             </w:rPr>
           </w:pPr>
-          <w:hyperlink w:anchor="_Toc234848149" w:history="1">
+          <w:hyperlink w:anchor="_Toc234848981" w:history="1">
             <w:r>
               <w:rPr>
                 <w:rStyle w:val="Hyperlink"/>
@@ -298,7 +298,7 @@
                 <w:noProof/>
                 <w:webHidden/>
               </w:rPr>
-              <w:instrText xml:space="preserve"> PAGEREF _Toc234848149 \h </w:instrText>
+              <w:instrText xml:space="preserve"> PAGEREF _Toc234848981 \h </w:instrText>
             </w:r>
             <w:r>
               <w:rPr>
@@ -344,7 +344,7 @@
               <w14:ligatures w14:val="standardContextual"/>
             </w:rPr>
           </w:pPr>
-          <w:hyperlink w:anchor="_Toc234848150" w:history="1">
+          <w:hyperlink w:anchor="_Toc234848982" w:history="1">
             <w:r>
               <w:rPr>
                 <w:rStyle w:val="Hyperlink"/>
@@ -388,7 +388,7 @@
                 <w:noProof/>
                 <w:webHidden/>
               </w:rPr>
-              <w:instrText xml:space="preserve"> PAGEREF _Toc234848150 \h </w:instrText>
+              <w:instrText xml:space="preserve"> PAGEREF _Toc234848982 \h </w:instrText>
             </w:r>
             <w:r>
               <w:rPr>
@@ -434,7 +434,7 @@
               <w14:ligatures w14:val="standardContextual"/>
             </w:rPr>
           </w:pPr>
-          <w:hyperlink w:anchor="_Toc234848151" w:history="1">
+          <w:hyperlink w:anchor="_Toc234848983" w:history="1">
             <w:r>
               <w:rPr>
                 <w:rStyle w:val="Hyperlink"/>
@@ -478,7 +478,7 @@
                 <w:noProof/>
                 <w:webHidden/>
               </w:rPr>
-              <w:instrText xml:space="preserve"> PAGEREF _Toc234848151 \h </w:instrText>
+              <w:instrText xml:space="preserve"> PAGEREF _Toc234848983 \h </w:instrText>
             </w:r>
             <w:r>
               <w:rPr>
@@ -524,7 +524,7 @@
               <w14:ligatures w14:val="standardContextual"/>
             </w:rPr>
           </w:pPr>
-          <w:hyperlink w:anchor="_Toc234848152" w:history="1">
+          <w:hyperlink w:anchor="_Toc234848984" w:history="1">
             <w:r>
               <w:rPr>
                 <w:rStyle w:val="Hyperlink"/>
@@ -568,7 +568,7 @@
                 <w:noProof/>
                 <w:webHidden/>
               </w:rPr>
-              <w:instrText xml:space="preserve"> PAGEREF _Toc234848152 \h </w:instrText>
+              <w:instrText xml:space="preserve"> PAGEREF _Toc234848984 \h </w:instrText>
             </w:r>
             <w:r>
               <w:rPr>
@@ -614,7 +614,7 @@
               <w14:ligatures w14:val="standardContextual"/>
             </w:rPr>
           </w:pPr>
-          <w:hyperlink w:anchor="_Toc234848153" w:history="1">
+          <w:hyperlink w:anchor="_Toc234848985" w:history="1">
             <w:r>
               <w:rPr>
                 <w:rStyle w:val="Hyperlink"/>
@@ -658,7 +658,7 @@
                 <w:noProof/>
                 <w:webHidden/>
               </w:rPr>
-              <w:instrText xml:space="preserve"> PAGEREF _Toc234848153 \h </w:instrText>
+              <w:instrText xml:space="preserve"> PAGEREF _Toc234848985 \h </w:instrText>
             </w:r>
             <w:r>
               <w:rPr>
@@ -704,7 +704,7 @@
               <w14:ligatures w14:val="standardContextual"/>
             </w:rPr>
           </w:pPr>
-          <w:hyperlink w:anchor="_Toc234848154" w:history="1">
+          <w:hyperlink w:anchor="_Toc234848986" w:history="1">
             <w:r>
               <w:rPr>
                 <w:rStyle w:val="Hyperlink"/>
@@ -748,7 +748,7 @@
                 <w:noProof/>
                 <w:webHidden/>
               </w:rPr>
-              <w:instrText xml:space="preserve"> PAGEREF _Toc234848154 \h </w:instrText>
+              <w:instrText xml:space="preserve"> PAGEREF _Toc234848986 \h </w:instrText>
             </w:r>
             <w:r>
               <w:rPr>
@@ -794,7 +794,7 @@
               <w14:ligatures w14:val="standardContextual"/>
             </w:rPr>
           </w:pPr>
-          <w:hyperlink w:anchor="_Toc234848155" w:history="1">
+          <w:hyperlink w:anchor="_Toc234848987" w:history="1">
             <w:r>
               <w:rPr>
                 <w:rStyle w:val="Hyperlink"/>
@@ -838,7 +838,7 @@
                 <w:noProof/>
                 <w:webHidden/>
               </w:rPr>
-              <w:instrText xml:space="preserve"> PAGEREF _Toc234848155 \h </w:instrText>
+              <w:instrText xml:space="preserve"> PAGEREF _Toc234848987 \h </w:instrText>
             </w:r>
             <w:r>
               <w:rPr>
@@ -884,7 +884,7 @@
               <w14:ligatures w14:val="standardContextual"/>
             </w:rPr>
           </w:pPr>
-          <w:hyperlink w:anchor="_Toc234848156" w:history="1">
+          <w:hyperlink w:anchor="_Toc234848988" w:history="1">
             <w:r>
               <w:rPr>
                 <w:rStyle w:val="Hyperlink"/>
@@ -928,7 +928,7 @@
                 <w:noProof/>
                 <w:webHidden/>
               </w:rPr>
-              <w:instrText xml:space="preserve"> PAGEREF _Toc234848156 \h </w:instrText>
+              <w:instrText xml:space="preserve"> PAGEREF _Toc234848988 \h </w:instrText>
             </w:r>
             <w:r>
               <w:rPr>
@@ -974,7 +974,7 @@
               <w14:ligatures w14:val="standardContextual"/>
             </w:rPr>
           </w:pPr>
-          <w:hyperlink w:anchor="_Toc234848157" w:history="1">
+          <w:hyperlink w:anchor="_Toc234848989" w:history="1">
             <w:r>
               <w:rPr>
                 <w:rStyle w:val="Hyperlink"/>
@@ -1018,7 +1018,7 @@
                 <w:noProof/>
                 <w:webHidden/>
               </w:rPr>
-              <w:instrText xml:space="preserve"> PAGEREF _Toc234848157 \h </w:instrText>
+              <w:instrText xml:space="preserve"> PAGEREF _Toc234848989 \h </w:instrText>
             </w:r>
             <w:r>
               <w:rPr>
@@ -1064,7 +1064,7 @@
               <w14:ligatures w14:val="standardContextual"/>
             </w:rPr>
           </w:pPr>
-          <w:hyperlink w:anchor="_Toc234848158" w:history="1">
+          <w:hyperlink w:anchor="_Toc234848990" w:history="1">
             <w:r>
               <w:rPr>
                 <w:rStyle w:val="Hyperlink"/>
@@ -1108,7 +1108,7 @@
                 <w:noProof/>
                 <w:webHidden/>
               </w:rPr>
-              <w:instrText xml:space="preserve"> PAGEREF _Toc234848158 \h </w:instrText>
+              <w:instrText xml:space="preserve"> PAGEREF _Toc234848990 \h </w:instrText>
             </w:r>
             <w:r>
               <w:rPr>
@@ -1154,7 +1154,7 @@
               <w14:ligatures w14:val="standardContextual"/>
             </w:rPr>
           </w:pPr>
-          <w:hyperlink w:anchor="_Toc234848159" w:history="1">
+          <w:hyperlink w:anchor="_Toc234848991" w:history="1">
             <w:r>
               <w:rPr>
                 <w:rStyle w:val="Hyperlink"/>
@@ -1198,7 +1198,7 @@
                 <w:noProof/>
                 <w:webHidden/>
               </w:rPr>
-              <w:instrText xml:space="preserve"> PAGEREF _Toc234848159 \h </w:instrText>
+              <w:instrText xml:space="preserve"> PAGEREF _Toc234848991 \h </w:instrText>
             </w:r>
             <w:r>
               <w:rPr>
@@ -1244,7 +1244,7 @@
               <w14:ligatures w14:val="standardContextual"/>
             </w:rPr>
           </w:pPr>
-          <w:hyperlink w:anchor="_Toc234848160" w:history="1">
+          <w:hyperlink w:anchor="_Toc234848992" w:history="1">
             <w:r>
               <w:rPr>
                 <w:rStyle w:val="Hyperlink"/>
@@ -1288,7 +1288,7 @@
                 <w:noProof/>
                 <w:webHidden/>
               </w:rPr>
-              <w:instrText xml:space="preserve"> PAGEREF _Toc234848160 \h </w:instrText>
+              <w:instrText xml:space="preserve"> PAGEREF _Toc234848992 \h </w:instrText>
             </w:r>
             <w:r>
               <w:rPr>
@@ -1334,7 +1334,7 @@
               <w14:ligatures w14:val="standardContextual"/>
             </w:rPr>
           </w:pPr>
-          <w:hyperlink w:anchor="_Toc234848161" w:history="1">
+          <w:hyperlink w:anchor="_Toc234848993" w:history="1">
             <w:r>
               <w:rPr>
                 <w:rStyle w:val="Hyperlink"/>
@@ -1378,7 +1378,7 @@
                 <w:noProof/>
                 <w:webHidden/>
               </w:rPr>
-              <w:instrText xml:space="preserve"> PAGEREF _Toc234848161 \h </w:instrText>
+              <w:instrText xml:space="preserve"> PAGEREF _Toc234848993 \h </w:instrText>
             </w:r>
             <w:r>
               <w:rPr>
@@ -1424,7 +1424,7 @@
               <w14:ligatures w14:val="standardContextual"/>
             </w:rPr>
           </w:pPr>
-          <w:hyperlink w:anchor="_Toc234848162" w:history="1">
+          <w:hyperlink w:anchor="_Toc234848994" w:history="1">
             <w:r>
               <w:rPr>
                 <w:rStyle w:val="Hyperlink"/>
@@ -1468,7 +1468,7 @@
                 <w:noProof/>
                 <w:webHidden/>
               </w:rPr>
-              <w:instrText xml:space="preserve"> PAGEREF _Toc234848162 \h </w:instrText>
+              <w:instrText xml:space="preserve"> PAGEREF _Toc234848994 \h </w:instrText>
             </w:r>
             <w:r>
               <w:rPr>
@@ -1514,7 +1514,7 @@
               <w14:ligatures w14:val="standardContextual"/>
             </w:rPr>
           </w:pPr>
-          <w:hyperlink w:anchor="_Toc234848163" w:history="1">
+          <w:hyperlink w:anchor="_Toc234848995" w:history="1">
             <w:r>
               <w:rPr>
                 <w:rStyle w:val="Hyperlink"/>
@@ -1558,7 +1558,7 @@
                 <w:noProof/>
                 <w:webHidden/>
               </w:rPr>
-              <w:instrText xml:space="preserve"> PAGEREF _Toc234848163 \h </w:instrText>
+              <w:instrText xml:space="preserve"> PAGEREF _Toc234848995 \h </w:instrText>
             </w:r>
             <w:r>
               <w:rPr>
@@ -1604,7 +1604,7 @@
               <w14:ligatures w14:val="standardContextual"/>
             </w:rPr>
           </w:pPr>
-          <w:hyperlink w:anchor="_Toc234848164" w:history="1">
+          <w:hyperlink w:anchor="_Toc234848996" w:history="1">
             <w:r>
               <w:rPr>
                 <w:rStyle w:val="Hyperlink"/>
@@ -1648,7 +1648,7 @@
                 <w:noProof/>
                 <w:webHidden/>
               </w:rPr>
-              <w:instrText xml:space="preserve"> PAGEREF _Toc234848164 \h </w:instrText>
+              <w:instrText xml:space="preserve"> PAGEREF _Toc234848996 \h </w:instrText>
             </w:r>
             <w:r>
               <w:rPr>
@@ -1694,7 +1694,7 @@
               <w14:ligatures w14:val="standardContextual"/>
             </w:rPr>
           </w:pPr>
-          <w:hyperlink w:anchor="_Toc234848165" w:history="1">
+          <w:hyperlink w:anchor="_Toc234848997" w:history="1">
             <w:r>
               <w:rPr>
                 <w:rStyle w:val="Hyperlink"/>
@@ -1738,7 +1738,7 @@
                 <w:noProof/>
                 <w:webHidden/>
               </w:rPr>
-              <w:instrText xml:space="preserve"> PAGEREF _Toc234848165 \h </w:instrText>
+              <w:instrText xml:space="preserve"> PAGEREF _Toc234848997 \h </w:instrText>
             </w:r>
             <w:r>
               <w:rPr>
@@ -1784,7 +1784,7 @@
               <w14:ligatures w14:val="standardContextual"/>
             </w:rPr>
           </w:pPr>
-          <w:hyperlink w:anchor="_Toc234848166" w:history="1">
+          <w:hyperlink w:anchor="_Toc234848998" w:history="1">
             <w:r>
               <w:rPr>
                 <w:rStyle w:val="Hyperlink"/>
@@ -1828,7 +1828,7 @@
                 <w:noProof/>
                 <w:webHidden/>
               </w:rPr>
-              <w:instrText xml:space="preserve"> PAGEREF _Toc234848166 \h </w:instrText>
+              <w:instrText xml:space="preserve"> PAGEREF _Toc234848998 \h </w:instrText>
             </w:r>
             <w:r>
               <w:rPr>
@@ -1874,7 +1874,7 @@
               <w14:ligatures w14:val="standardContextual"/>
             </w:rPr>
           </w:pPr>
-          <w:hyperlink w:anchor="_Toc234848167" w:history="1">
+          <w:hyperlink w:anchor="_Toc234848999" w:history="1">
             <w:r>
               <w:rPr>
                 <w:rStyle w:val="Hyperlink"/>
@@ -1918,7 +1918,7 @@
                 <w:noProof/>
                 <w:webHidden/>
               </w:rPr>
-              <w:instrText xml:space="preserve"> PAGEREF _Toc234848167 \h </w:instrText>
+              <w:instrText xml:space="preserve"> PAGEREF _Toc234848999 \h </w:instrText>
             </w:r>
             <w:r>
               <w:rPr>
@@ -1964,7 +1964,7 @@
               <w14:ligatures w14:val="standardContextual"/>
             </w:rPr>
           </w:pPr>
-          <w:hyperlink w:anchor="_Toc234848168" w:history="1">
+          <w:hyperlink w:anchor="_Toc234849000" w:history="1">
             <w:r>
               <w:rPr>
                 <w:rStyle w:val="Hyperlink"/>
@@ -2008,7 +2008,7 @@
                 <w:noProof/>
                 <w:webHidden/>
               </w:rPr>
-              <w:instrText xml:space="preserve"> PAGEREF _Toc234848168 \h </w:instrText>
+              <w:instrText xml:space="preserve"> PAGEREF _Toc234849000 \h </w:instrText>
             </w:r>
             <w:r>
               <w:rPr>
@@ -2054,7 +2054,7 @@
               <w14:ligatures w14:val="standardContextual"/>
             </w:rPr>
           </w:pPr>
-          <w:hyperlink w:anchor="_Toc234848169" w:history="1">
+          <w:hyperlink w:anchor="_Toc234849001" w:history="1">
             <w:r>
               <w:rPr>
                 <w:rStyle w:val="Hyperlink"/>
@@ -2098,7 +2098,7 @@
                 <w:noProof/>
                 <w:webHidden/>
               </w:rPr>
-              <w:instrText xml:space="preserve"> PAGEREF _Toc234848169 \h </w:instrText>
+              <w:instrText xml:space="preserve"> PAGEREF _Toc234849001 \h </w:instrText>
             </w:r>
             <w:r>
               <w:rPr>
@@ -2144,7 +2144,7 @@
               <w14:ligatures w14:val="standardContextual"/>
             </w:rPr>
           </w:pPr>
-          <w:hyperlink w:anchor="_Toc234848170" w:history="1">
+          <w:hyperlink w:anchor="_Toc234849002" w:history="1">
             <w:r>
               <w:rPr>
                 <w:rStyle w:val="Hyperlink"/>
@@ -2188,7 +2188,7 @@
                 <w:noProof/>
                 <w:webHidden/>
               </w:rPr>
-              <w:instrText xml:space="preserve"> PAGEREF _Toc234848170 \h </w:instrText>
+              <w:instrText xml:space="preserve"> PAGEREF _Toc234849002 \h </w:instrText>
             </w:r>
             <w:r>
               <w:rPr>
@@ -2234,7 +2234,7 @@
               <w14:ligatures w14:val="standardContextual"/>
             </w:rPr>
           </w:pPr>
-          <w:hyperlink w:anchor="_Toc234848171" w:history="1">
+          <w:hyperlink w:anchor="_Toc234849003" w:history="1">
             <w:r>
               <w:rPr>
                 <w:rStyle w:val="Hyperlink"/>
@@ -2278,7 +2278,7 @@
                 <w:noProof/>
                 <w:webHidden/>
               </w:rPr>
-              <w:instrText xml:space="preserve"> PAGEREF _Toc234848171 \h </w:instrText>
+              <w:instrText xml:space="preserve"> PAGEREF _Toc234849003 \h </w:instrText>
             </w:r>
             <w:r>
               <w:rPr>
@@ -2324,7 +2324,7 @@
               <w14:ligatures w14:val="standardContextual"/>
             </w:rPr>
           </w:pPr>
-          <w:hyperlink w:anchor="_Toc234848172" w:history="1">
+          <w:hyperlink w:anchor="_Toc234849004" w:history="1">
             <w:r>
               <w:rPr>
                 <w:rStyle w:val="Hyperlink"/>
@@ -2368,7 +2368,7 @@
                 <w:noProof/>
                 <w:webHidden/>
               </w:rPr>
-              <w:instrText xml:space="preserve"> PAGEREF _Toc234848172 \h </w:instrText>
+              <w:instrText xml:space="preserve"> PAGEREF _Toc234849004 \h </w:instrText>
             </w:r>
             <w:r>
               <w:rPr>
@@ -2414,7 +2414,7 @@
               <w14:ligatures w14:val="standardContextual"/>
             </w:rPr>
           </w:pPr>
-          <w:hyperlink w:anchor="_Toc234848173" w:history="1">
+          <w:hyperlink w:anchor="_Toc234849005" w:history="1">
             <w:r>
               <w:rPr>
                 <w:rStyle w:val="Hyperlink"/>
@@ -2458,7 +2458,7 @@
                 <w:noProof/>
                 <w:webHidden/>
               </w:rPr>
-              <w:instrText xml:space="preserve"> PAGEREF _Toc234848173 \h </w:instrText>
+              <w:instrText xml:space="preserve"> PAGEREF _Toc234849005 \h </w:instrText>
             </w:r>
             <w:r>
               <w:rPr>
@@ -2504,7 +2504,7 @@
               <w14:ligatures w14:val="standardContextual"/>
             </w:rPr>
           </w:pPr>
-          <w:hyperlink w:anchor="_Toc234848174" w:history="1">
+          <w:hyperlink w:anchor="_Toc234849006" w:history="1">
             <w:r>
               <w:rPr>
                 <w:rStyle w:val="Hyperlink"/>
@@ -2548,7 +2548,7 @@
                 <w:noProof/>
                 <w:webHidden/>
               </w:rPr>
-              <w:instrText xml:space="preserve"> PAGEREF _Toc234848174 \h </w:instrText>
+              <w:instrText xml:space="preserve"> PAGEREF _Toc234849006 \h </w:instrText>
             </w:r>
             <w:r>
               <w:rPr>
@@ -2594,7 +2594,7 @@
               <w14:ligatures w14:val="standardContextual"/>
             </w:rPr>
           </w:pPr>
-          <w:hyperlink w:anchor="_Toc234848175" w:history="1">
+          <w:hyperlink w:anchor="_Toc234849007" w:history="1">
             <w:r>
               <w:rPr>
                 <w:rStyle w:val="Hyperlink"/>
@@ -2638,7 +2638,7 @@
                 <w:noProof/>
                 <w:webHidden/>
               </w:rPr>
-              <w:instrText xml:space="preserve"> PAGEREF _Toc234848175 \h </w:instrText>
+              <w:instrText xml:space="preserve"> PAGEREF _Toc234849007 \h </w:instrText>
             </w:r>
             <w:r>
               <w:rPr>
@@ -2684,7 +2684,7 @@
               <w14:ligatures w14:val="standardContextual"/>
             </w:rPr>
           </w:pPr>
-          <w:hyperlink w:anchor="_Toc234848176" w:history="1">
+          <w:hyperlink w:anchor="_Toc234849008" w:history="1">
             <w:r>
               <w:rPr>
                 <w:rStyle w:val="Hyperlink"/>
@@ -2728,7 +2728,7 @@
                 <w:noProof/>
                 <w:webHidden/>
               </w:rPr>
-              <w:instrText xml:space="preserve"> PAGEREF _Toc234848176 \h </w:instrText>
+              <w:instrText xml:space="preserve"> PAGEREF _Toc234849008 \h </w:instrText>
             </w:r>
             <w:r>
               <w:rPr>
@@ -2774,7 +2774,7 @@
               <w14:ligatures w14:val="standardContextual"/>
             </w:rPr>
           </w:pPr>
-          <w:hyperlink w:anchor="_Toc234848177" w:history="1">
+          <w:hyperlink w:anchor="_Toc234849009" w:history="1">
             <w:r>
               <w:rPr>
                 <w:rStyle w:val="Hyperlink"/>
@@ -2818,7 +2818,7 @@
                 <w:noProof/>
                 <w:webHidden/>
               </w:rPr>
-              <w:instrText xml:space="preserve"> PAGEREF _Toc234848177 \h </w:instrText>
+              <w:instrText xml:space="preserve"> PAGEREF _Toc234849009 \h </w:instrText>
             </w:r>
             <w:r>
               <w:rPr>
@@ -2864,7 +2864,7 @@
               <w14:ligatures w14:val="standardContextual"/>
             </w:rPr>
           </w:pPr>
-          <w:hyperlink w:anchor="_Toc234848178" w:history="1">
+          <w:hyperlink w:anchor="_Toc234849010" w:history="1">
             <w:r>
               <w:rPr>
                 <w:rStyle w:val="Hyperlink"/>
@@ -2908,7 +2908,7 @@
                 <w:noProof/>
                 <w:webHidden/>
               </w:rPr>
-              <w:instrText xml:space="preserve"> PAGEREF _Toc234848178 \h </w:instrText>
+              <w:instrText xml:space="preserve"> PAGEREF _Toc234849010 \h </w:instrText>
             </w:r>
             <w:r>
               <w:rPr>
@@ -2954,7 +2954,7 @@
               <w14:ligatures w14:val="standardContextual"/>
             </w:rPr>
           </w:pPr>
-          <w:hyperlink w:anchor="_Toc234848179" w:history="1">
+          <w:hyperlink w:anchor="_Toc234849011" w:history="1">
             <w:r>
               <w:rPr>
                 <w:rStyle w:val="Hyperlink"/>
@@ -2998,7 +2998,7 @@
                 <w:noProof/>
                 <w:webHidden/>
               </w:rPr>
-              <w:instrText xml:space="preserve"> PAGEREF _Toc234848179 \h </w:instrText>
+              <w:instrText xml:space="preserve"> PAGEREF _Toc234849011 \h </w:instrText>
             </w:r>
             <w:r>
               <w:rPr>
@@ -3044,7 +3044,7 @@
               <w14:ligatures w14:val="standardContextual"/>
             </w:rPr>
           </w:pPr>
-          <w:hyperlink w:anchor="_Toc234848180" w:history="1">
+          <w:hyperlink w:anchor="_Toc234849012" w:history="1">
             <w:r>
               <w:rPr>
                 <w:rStyle w:val="Hyperlink"/>
@@ -3088,7 +3088,7 @@
                 <w:noProof/>
                 <w:webHidden/>
               </w:rPr>
-              <w:instrText xml:space="preserve"> PAGEREF _Toc234848180 \h </w:instrText>
+              <w:instrText xml:space="preserve"> PAGEREF _Toc234849012 \h </w:instrText>
             </w:r>
             <w:r>
               <w:rPr>
@@ -3134,7 +3134,7 @@
               <w14:ligatures w14:val="standardContextual"/>
             </w:rPr>
           </w:pPr>
-          <w:hyperlink w:anchor="_Toc234848181" w:history="1">
+          <w:hyperlink w:anchor="_Toc234849013" w:history="1">
             <w:r>
               <w:rPr>
                 <w:rStyle w:val="Hyperlink"/>
@@ -3178,7 +3178,7 @@
                 <w:noProof/>
                 <w:webHidden/>
               </w:rPr>
-              <w:instrText xml:space="preserve"> PAGEREF _Toc234848181 \h </w:instrText>
+              <w:instrText xml:space="preserve"> PAGEREF _Toc234849013 \h </w:instrText>
             </w:r>
             <w:r>
               <w:rPr>
@@ -3224,7 +3224,7 @@
               <w14:ligatures w14:val="standardContextual"/>
             </w:rPr>
           </w:pPr>
-          <w:hyperlink w:anchor="_Toc234848182" w:history="1">
+          <w:hyperlink w:anchor="_Toc234849014" w:history="1">
             <w:r>
               <w:rPr>
                 <w:rStyle w:val="Hyperlink"/>
@@ -3268,7 +3268,7 @@
                 <w:noProof/>
                 <w:webHidden/>
               </w:rPr>
-              <w:instrText xml:space="preserve"> PAGEREF _Toc234848182 \h </w:instrText>
+              <w:instrText xml:space="preserve"> PAGEREF _Toc234849014 \h </w:instrText>
             </w:r>
             <w:r>
               <w:rPr>
@@ -3314,7 +3314,7 @@
               <w14:ligatures w14:val="standardContextual"/>
             </w:rPr>
           </w:pPr>
-          <w:hyperlink w:anchor="_Toc234848183" w:history="1">
+          <w:hyperlink w:anchor="_Toc234849015" w:history="1">
             <w:r>
               <w:rPr>
                 <w:rStyle w:val="Hyperlink"/>
@@ -3358,7 +3358,7 @@
                 <w:noProof/>
                 <w:webHidden/>
               </w:rPr>
-              <w:instrText xml:space="preserve"> PAGEREF _Toc234848183 \h </w:instrText>
+              <w:instrText xml:space="preserve"> PAGEREF _Toc234849015 \h </w:instrText>
             </w:r>
             <w:r>
               <w:rPr>
@@ -3404,7 +3404,7 @@
               <w14:ligatures w14:val="standardContextual"/>
             </w:rPr>
           </w:pPr>
-          <w:hyperlink w:anchor="_Toc234848184" w:history="1">
+          <w:hyperlink w:anchor="_Toc234849016" w:history="1">
             <w:r>
               <w:rPr>
                 <w:rStyle w:val="Hyperlink"/>
@@ -3448,7 +3448,7 @@
                 <w:noProof/>
                 <w:webHidden/>
               </w:rPr>
-              <w:instrText xml:space="preserve"> PAGEREF _Toc234848184 \h </w:instrText>
+              <w:instrText xml:space="preserve"> PAGEREF _Toc234849016 \h </w:instrText>
             </w:r>
             <w:r>
               <w:rPr>
@@ -3494,7 +3494,7 @@
               <w14:ligatures w14:val="standardContextual"/>
             </w:rPr>
           </w:pPr>
-          <w:hyperlink w:anchor="_Toc234848185" w:history="1">
+          <w:hyperlink w:anchor="_Toc234849017" w:history="1">
             <w:r>
               <w:rPr>
                 <w:rStyle w:val="Hyperlink"/>
@@ -3538,7 +3538,7 @@
                 <w:noProof/>
                 <w:webHidden/>
               </w:rPr>
-              <w:instrText xml:space="preserve"> PAGEREF _Toc234848185 \h </w:instrText>
+              <w:instrText xml:space="preserve"> PAGEREF _Toc234849017 \h </w:instrText>
             </w:r>
             <w:r>
               <w:rPr>
@@ -3584,7 +3584,7 @@
               <w14:ligatures w14:val="standardContextual"/>
             </w:rPr>
           </w:pPr>
-          <w:hyperlink w:anchor="_Toc234848186" w:history="1">
+          <w:hyperlink w:anchor="_Toc234849018" w:history="1">
             <w:r>
               <w:rPr>
                 <w:rStyle w:val="Hyperlink"/>
@@ -3628,7 +3628,7 @@
                 <w:noProof/>
                 <w:webHidden/>
               </w:rPr>
-              <w:instrText xml:space="preserve"> PAGEREF _Toc234848186 \h </w:instrText>
+              <w:instrText xml:space="preserve"> PAGEREF _Toc234849018 \h </w:instrText>
             </w:r>
             <w:r>
               <w:rPr>
@@ -3674,7 +3674,7 @@
               <w14:ligatures w14:val="standardContextual"/>
             </w:rPr>
           </w:pPr>
-          <w:hyperlink w:anchor="_Toc234848187" w:history="1">
+          <w:hyperlink w:anchor="_Toc234849019" w:history="1">
             <w:r>
               <w:rPr>
                 <w:rStyle w:val="Hyperlink"/>
@@ -3718,7 +3718,7 @@
                 <w:noProof/>
                 <w:webHidden/>
               </w:rPr>
-              <w:instrText xml:space="preserve"> PAGEREF _Toc234848187 \h </w:instrText>
+              <w:instrText xml:space="preserve"> PAGEREF _Toc234849019 \h </w:instrText>
             </w:r>
             <w:r>
               <w:rPr>
@@ -3764,7 +3764,7 @@
               <w14:ligatures w14:val="standardContextual"/>
             </w:rPr>
           </w:pPr>
-          <w:hyperlink w:anchor="_Toc234848188" w:history="1">
+          <w:hyperlink w:anchor="_Toc234849020" w:history="1">
             <w:r>
               <w:rPr>
                 <w:rStyle w:val="Hyperlink"/>
@@ -3808,7 +3808,7 @@
                 <w:noProof/>
                 <w:webHidden/>
               </w:rPr>
-              <w:instrText xml:space="preserve"> PAGEREF _Toc234848188 \h </w:instrText>
+              <w:instrText xml:space="preserve"> PAGEREF _Toc234849020 \h </w:instrText>
             </w:r>
             <w:r>
               <w:rPr>
@@ -3854,7 +3854,7 @@
               <w14:ligatures w14:val="standardContextual"/>
             </w:rPr>
           </w:pPr>
-          <w:hyperlink w:anchor="_Toc234848189" w:history="1">
+          <w:hyperlink w:anchor="_Toc234849021" w:history="1">
             <w:r>
               <w:rPr>
                 <w:rStyle w:val="Hyperlink"/>
@@ -3898,7 +3898,7 @@
                 <w:noProof/>
                 <w:webHidden/>
               </w:rPr>
-              <w:instrText xml:space="preserve"> PAGEREF _Toc234848189 \h </w:instrText>
+              <w:instrText xml:space="preserve"> PAGEREF _Toc234849021 \h </w:instrText>
             </w:r>
             <w:r>
               <w:rPr>
@@ -3944,7 +3944,7 @@
               <w14:ligatures w14:val="standardContextual"/>
             </w:rPr>
           </w:pPr>
-          <w:hyperlink w:anchor="_Toc234848190" w:history="1">
+          <w:hyperlink w:anchor="_Toc234849022" w:history="1">
             <w:r>
               <w:rPr>
                 <w:rStyle w:val="Hyperlink"/>
@@ -3988,7 +3988,7 @@
                 <w:noProof/>
                 <w:webHidden/>
               </w:rPr>
-              <w:instrText xml:space="preserve"> PAGEREF _Toc234848190 \h </w:instrText>
+              <w:instrText xml:space="preserve"> PAGEREF _Toc234849022 \h </w:instrText>
             </w:r>
             <w:r>
               <w:rPr>
@@ -4034,7 +4034,7 @@
               <w14:ligatures w14:val="standardContextual"/>
             </w:rPr>
           </w:pPr>
-          <w:hyperlink w:anchor="_Toc234848191" w:history="1">
+          <w:hyperlink w:anchor="_Toc234849023" w:history="1">
             <w:r>
               <w:rPr>
                 <w:rStyle w:val="Hyperlink"/>
@@ -4078,7 +4078,7 @@
                 <w:noProof/>
                 <w:webHidden/>
               </w:rPr>
-              <w:instrText xml:space="preserve"> PAGEREF _Toc234848191 \h </w:instrText>
+              <w:instrText xml:space="preserve"> PAGEREF _Toc234849023 \h </w:instrText>
             </w:r>
             <w:r>
               <w:rPr>
@@ -4124,7 +4124,7 @@
               <w14:ligatures w14:val="standardContextual"/>
             </w:rPr>
           </w:pPr>
-          <w:hyperlink w:anchor="_Toc234848192" w:history="1">
+          <w:hyperlink w:anchor="_Toc234849024" w:history="1">
             <w:r>
               <w:rPr>
                 <w:rStyle w:val="Hyperlink"/>
@@ -4168,7 +4168,7 @@
                 <w:noProof/>
                 <w:webHidden/>
               </w:rPr>
-              <w:instrText xml:space="preserve"> PAGEREF _Toc234848192 \h </w:instrText>
+              <w:instrText xml:space="preserve"> PAGEREF _Toc234849024 \h </w:instrText>
             </w:r>
             <w:r>
               <w:rPr>
@@ -4214,7 +4214,7 @@
               <w14:ligatures w14:val="standardContextual"/>
             </w:rPr>
           </w:pPr>
-          <w:hyperlink w:anchor="_Toc234848193" w:history="1">
+          <w:hyperlink w:anchor="_Toc234849025" w:history="1">
             <w:r>
               <w:rPr>
                 <w:rStyle w:val="Hyperlink"/>
@@ -4258,7 +4258,7 @@
                 <w:noProof/>
                 <w:webHidden/>
               </w:rPr>
-              <w:instrText xml:space="preserve"> PAGEREF _Toc234848193 \h </w:instrText>
+              <w:instrText xml:space="preserve"> PAGEREF _Toc234849025 \h </w:instrText>
             </w:r>
             <w:r>
               <w:rPr>
@@ -4304,7 +4304,7 @@
               <w14:ligatures w14:val="standardContextual"/>
             </w:rPr>
           </w:pPr>
-          <w:hyperlink w:anchor="_Toc234848194" w:history="1">
+          <w:hyperlink w:anchor="_Toc234849026" w:history="1">
             <w:r>
               <w:rPr>
                 <w:rStyle w:val="Hyperlink"/>
@@ -4348,7 +4348,7 @@
                 <w:noProof/>
                 <w:webHidden/>
               </w:rPr>
-              <w:instrText xml:space="preserve"> PAGEREF _Toc234848194 \h </w:instrText>
+              <w:instrText xml:space="preserve"> PAGEREF _Toc234849026 \h </w:instrText>
             </w:r>
             <w:r>
               <w:rPr>
@@ -4394,7 +4394,7 @@
               <w14:ligatures w14:val="standardContextual"/>
             </w:rPr>
           </w:pPr>
-          <w:hyperlink w:anchor="_Toc234848195" w:history="1">
+          <w:hyperlink w:anchor="_Toc234849027" w:history="1">
             <w:r>
               <w:rPr>
                 <w:rStyle w:val="Hyperlink"/>
@@ -4438,7 +4438,7 @@
                 <w:noProof/>
                 <w:webHidden/>
               </w:rPr>
-              <w:instrText xml:space="preserve"> PAGEREF _Toc234848195 \h </w:instrText>
+              <w:instrText xml:space="preserve"> PAGEREF _Toc234849027 \h </w:instrText>
             </w:r>
             <w:r>
               <w:rPr>
@@ -4484,7 +4484,7 @@
               <w14:ligatures w14:val="standardContextual"/>
             </w:rPr>
           </w:pPr>
-          <w:hyperlink w:anchor="_Toc234848196" w:history="1">
+          <w:hyperlink w:anchor="_Toc234849028" w:history="1">
             <w:r>
               <w:rPr>
                 <w:rStyle w:val="Hyperlink"/>
@@ -4528,7 +4528,7 @@
                 <w:noProof/>
                 <w:webHidden/>
               </w:rPr>
-              <w:instrText xml:space="preserve"> PAGEREF _Toc234848196 \h </w:instrText>
+              <w:instrText xml:space="preserve"> PAGEREF _Toc234849028 \h </w:instrText>
             </w:r>
             <w:r>
               <w:rPr>
@@ -4574,7 +4574,7 @@
               <w14:ligatures w14:val="standardContextual"/>
             </w:rPr>
           </w:pPr>
-          <w:hyperlink w:anchor="_Toc234848197" w:history="1">
+          <w:hyperlink w:anchor="_Toc234849029" w:history="1">
             <w:r>
               <w:rPr>
                 <w:rStyle w:val="Hyperlink"/>
@@ -4618,7 +4618,7 @@
                 <w:noProof/>
                 <w:webHidden/>
               </w:rPr>
-              <w:instrText xml:space="preserve"> PAGEREF _Toc234848197 \h </w:instrText>
+              <w:instrText xml:space="preserve"> PAGEREF _Toc234849029 \h </w:instrText>
             </w:r>
             <w:r>
               <w:rPr>
@@ -4664,7 +4664,7 @@
               <w14:ligatures w14:val="standardContextual"/>
             </w:rPr>
           </w:pPr>
-          <w:hyperlink w:anchor="_Toc234848198" w:history="1">
+          <w:hyperlink w:anchor="_Toc234849030" w:history="1">
             <w:r>
               <w:rPr>
                 <w:rStyle w:val="Hyperlink"/>
@@ -4708,7 +4708,7 @@
                 <w:noProof/>
                 <w:webHidden/>
               </w:rPr>
-              <w:instrText xml:space="preserve"> PAGEREF _Toc234848198 \h </w:instrText>
+              <w:instrText xml:space="preserve"> PAGEREF _Toc234849030 \h </w:instrText>
             </w:r>
             <w:r>
               <w:rPr>
@@ -4754,7 +4754,7 @@
               <w14:ligatures w14:val="standardContextual"/>
             </w:rPr>
           </w:pPr>
-          <w:hyperlink w:anchor="_Toc234848199" w:history="1">
+          <w:hyperlink w:anchor="_Toc234849031" w:history="1">
             <w:r>
               <w:rPr>
                 <w:rStyle w:val="Hyperlink"/>
@@ -4798,7 +4798,7 @@
                 <w:noProof/>
                 <w:webHidden/>
               </w:rPr>
-              <w:instrText xml:space="preserve"> PAGEREF _Toc234848199 \h </w:instrText>
+              <w:instrText xml:space="preserve"> PAGEREF _Toc234849031 \h </w:instrText>
             </w:r>
             <w:r>
               <w:rPr>
@@ -4844,7 +4844,7 @@
               <w14:ligatures w14:val="standardContextual"/>
             </w:rPr>
           </w:pPr>
-          <w:hyperlink w:anchor="_Toc234848200" w:history="1">
+          <w:hyperlink w:anchor="_Toc234849032" w:history="1">
             <w:r>
               <w:rPr>
                 <w:rStyle w:val="Hyperlink"/>
@@ -4888,7 +4888,7 @@
                 <w:noProof/>
                 <w:webHidden/>
               </w:rPr>
-              <w:instrText xml:space="preserve"> PAGEREF _Toc234848200 \h </w:instrText>
+              <w:instrText xml:space="preserve"> PAGEREF _Toc234849032 \h </w:instrText>
             </w:r>
             <w:r>
               <w:rPr>
@@ -4934,7 +4934,7 @@
               <w14:ligatures w14:val="standardContextual"/>
             </w:rPr>
           </w:pPr>
-          <w:hyperlink w:anchor="_Toc234848201" w:history="1">
+          <w:hyperlink w:anchor="_Toc234849033" w:history="1">
             <w:r>
               <w:rPr>
                 <w:rStyle w:val="Hyperlink"/>
@@ -4978,7 +4978,7 @@
                 <w:noProof/>
                 <w:webHidden/>
               </w:rPr>
-              <w:instrText xml:space="preserve"> PAGEREF _Toc234848201 \h </w:instrText>
+              <w:instrText xml:space="preserve"> PAGEREF _Toc234849033 \h </w:instrText>
             </w:r>
             <w:r>
               <w:rPr>
@@ -5024,7 +5024,7 @@
               <w14:ligatures w14:val="standardContextual"/>
             </w:rPr>
           </w:pPr>
-          <w:hyperlink w:anchor="_Toc234848202" w:history="1">
+          <w:hyperlink w:anchor="_Toc234849034" w:history="1">
             <w:r>
               <w:rPr>
                 <w:rStyle w:val="Hyperlink"/>
@@ -5068,7 +5068,7 @@
                 <w:noProof/>
                 <w:webHidden/>
               </w:rPr>
-              <w:instrText xml:space="preserve"> PAGEREF _Toc234848202 \h </w:instrText>
+              <w:instrText xml:space="preserve"> PAGEREF _Toc234849034 \h </w:instrText>
             </w:r>
             <w:r>
               <w:rPr>
@@ -5114,7 +5114,7 @@
               <w14:ligatures w14:val="standardContextual"/>
             </w:rPr>
           </w:pPr>
-          <w:hyperlink w:anchor="_Toc234848203" w:history="1">
+          <w:hyperlink w:anchor="_Toc234849035" w:history="1">
             <w:r>
               <w:rPr>
                 <w:rStyle w:val="Hyperlink"/>
@@ -5158,7 +5158,7 @@
                 <w:noProof/>
                 <w:webHidden/>
               </w:rPr>
-              <w:instrText xml:space="preserve"> PAGEREF _Toc234848203 \h </w:instrText>
+              <w:instrText xml:space="preserve"> PAGEREF _Toc234849035 \h </w:instrText>
             </w:r>
             <w:r>
               <w:rPr>
@@ -5204,7 +5204,7 @@
               <w14:ligatures w14:val="standardContextual"/>
             </w:rPr>
           </w:pPr>
-          <w:hyperlink w:anchor="_Toc234848204" w:history="1">
+          <w:hyperlink w:anchor="_Toc234849036" w:history="1">
             <w:r>
               <w:rPr>
                 <w:rStyle w:val="Hyperlink"/>
@@ -5248,7 +5248,7 @@
                 <w:noProof/>
                 <w:webHidden/>
               </w:rPr>
-              <w:instrText xml:space="preserve"> PAGEREF _Toc234848204 \h </w:instrText>
+              <w:instrText xml:space="preserve"> PAGEREF _Toc234849036 \h </w:instrText>
             </w:r>
             <w:r>
               <w:rPr>
@@ -5294,7 +5294,7 @@
               <w14:ligatures w14:val="standardContextual"/>
             </w:rPr>
           </w:pPr>
-          <w:hyperlink w:anchor="_Toc234848205" w:history="1">
+          <w:hyperlink w:anchor="_Toc234849037" w:history="1">
             <w:r>
               <w:rPr>
                 <w:rStyle w:val="Hyperlink"/>
@@ -5338,7 +5338,7 @@
                 <w:noProof/>
                 <w:webHidden/>
               </w:rPr>
-              <w:instrText xml:space="preserve"> PAGEREF _Toc234848205 \h </w:instrText>
+              <w:instrText xml:space="preserve"> PAGEREF _Toc234849037 \h </w:instrText>
             </w:r>
             <w:r>
               <w:rPr>
@@ -5384,7 +5384,7 @@
               <w14:ligatures w14:val="standardContextual"/>
             </w:rPr>
           </w:pPr>
-          <w:hyperlink w:anchor="_Toc234848206" w:history="1">
+          <w:hyperlink w:anchor="_Toc234849038" w:history="1">
             <w:r>
               <w:rPr>
                 <w:rStyle w:val="Hyperlink"/>
@@ -5428,7 +5428,7 @@
                 <w:noProof/>
                 <w:webHidden/>
               </w:rPr>
-              <w:instrText xml:space="preserve"> PAGEREF _Toc234848206 \h </w:instrText>
+              <w:instrText xml:space="preserve"> PAGEREF _Toc234849038 \h </w:instrText>
             </w:r>
             <w:r>
               <w:rPr>
@@ -5474,7 +5474,7 @@
               <w14:ligatures w14:val="standardContextual"/>
             </w:rPr>
           </w:pPr>
-          <w:hyperlink w:anchor="_Toc234848207" w:history="1">
+          <w:hyperlink w:anchor="_Toc234849039" w:history="1">
             <w:r>
               <w:rPr>
                 <w:rStyle w:val="Hyperlink"/>
@@ -5518,7 +5518,7 @@
                 <w:noProof/>
                 <w:webHidden/>
               </w:rPr>
-              <w:instrText xml:space="preserve"> PAGEREF _Toc234848207 \h </w:instrText>
+              <w:instrText xml:space="preserve"> PAGEREF _Toc234849039 \h </w:instrText>
             </w:r>
             <w:r>
               <w:rPr>
@@ -5564,7 +5564,7 @@
               <w14:ligatures w14:val="standardContextual"/>
             </w:rPr>
           </w:pPr>
-          <w:hyperlink w:anchor="_Toc234848208" w:history="1">
+          <w:hyperlink w:anchor="_Toc234849040" w:history="1">
             <w:r>
               <w:rPr>
                 <w:rStyle w:val="Hyperlink"/>
@@ -5608,7 +5608,7 @@
                 <w:noProof/>
                 <w:webHidden/>
               </w:rPr>
-              <w:instrText xml:space="preserve"> PAGEREF _Toc234848208 \h </w:instrText>
+              <w:instrText xml:space="preserve"> PAGEREF _Toc234849040 \h </w:instrText>
             </w:r>
             <w:r>
               <w:rPr>
@@ -5654,7 +5654,7 @@
               <w14:ligatures w14:val="standardContextual"/>
             </w:rPr>
           </w:pPr>
-          <w:hyperlink w:anchor="_Toc234848209" w:history="1">
+          <w:hyperlink w:anchor="_Toc234849041" w:history="1">
             <w:r>
               <w:rPr>
                 <w:rStyle w:val="Hyperlink"/>
@@ -5698,7 +5698,7 @@
                 <w:noProof/>
                 <w:webHidden/>
               </w:rPr>
-              <w:instrText xml:space="preserve"> PAGEREF _Toc234848209 \h </w:instrText>
+              <w:instrText xml:space="preserve"> PAGEREF _Toc234849041 \h </w:instrText>
             </w:r>
             <w:r>
               <w:rPr>
@@ -5744,7 +5744,7 @@
               <w14:ligatures w14:val="standardContextual"/>
             </w:rPr>
           </w:pPr>
-          <w:hyperlink w:anchor="_Toc234848210" w:history="1">
+          <w:hyperlink w:anchor="_Toc234849042" w:history="1">
             <w:r>
               <w:rPr>
                 <w:rStyle w:val="Hyperlink"/>
@@ -5788,7 +5788,7 @@
                 <w:noProof/>
                 <w:webHidden/>
               </w:rPr>
-              <w:instrText xml:space="preserve"> PAGEREF _Toc234848210 \h </w:instrText>
+              <w:instrText xml:space="preserve"> PAGEREF _Toc234849042 \h </w:instrText>
             </w:r>
             <w:r>
               <w:rPr>
@@ -5834,7 +5834,7 @@
               <w14:ligatures w14:val="standardContextual"/>
             </w:rPr>
           </w:pPr>
-          <w:hyperlink w:anchor="_Toc234848211" w:history="1">
+          <w:hyperlink w:anchor="_Toc234849043" w:history="1">
             <w:r>
               <w:rPr>
                 <w:rStyle w:val="Hyperlink"/>
@@ -5878,7 +5878,7 @@
                 <w:noProof/>
                 <w:webHidden/>
               </w:rPr>
-              <w:instrText xml:space="preserve"> PAGEREF _Toc234848211 \h </w:instrText>
+              <w:instrText xml:space="preserve"> PAGEREF _Toc234849043 \h </w:instrText>
             </w:r>
             <w:r>
               <w:rPr>
@@ -5924,7 +5924,7 @@
               <w14:ligatures w14:val="standardContextual"/>
             </w:rPr>
           </w:pPr>
-          <w:hyperlink w:anchor="_Toc234848212" w:history="1">
+          <w:hyperlink w:anchor="_Toc234849044" w:history="1">
             <w:r>
               <w:rPr>
                 <w:rStyle w:val="Hyperlink"/>
@@ -5968,7 +5968,7 @@
                 <w:noProof/>
                 <w:webHidden/>
               </w:rPr>
-              <w:instrText xml:space="preserve"> PAGEREF _Toc234848212 \h </w:instrText>
+              <w:instrText xml:space="preserve"> PAGEREF _Toc234849044 \h </w:instrText>
             </w:r>
             <w:r>
               <w:rPr>
@@ -6014,7 +6014,7 @@
               <w14:ligatures w14:val="standardContextual"/>
             </w:rPr>
           </w:pPr>
-          <w:hyperlink w:anchor="_Toc234848213" w:history="1">
+          <w:hyperlink w:anchor="_Toc234849045" w:history="1">
             <w:r>
               <w:rPr>
                 <w:rStyle w:val="Hyperlink"/>
@@ -6058,7 +6058,7 @@
                 <w:noProof/>
                 <w:webHidden/>
               </w:rPr>
-              <w:instrText xml:space="preserve"> PAGEREF _Toc234848213 \h </w:instrText>
+              <w:instrText xml:space="preserve"> PAGEREF _Toc234849045 \h </w:instrText>
             </w:r>
             <w:r>
               <w:rPr>
@@ -6104,7 +6104,7 @@
               <w14:ligatures w14:val="standardContextual"/>
             </w:rPr>
           </w:pPr>
-          <w:hyperlink w:anchor="_Toc234848214" w:history="1">
+          <w:hyperlink w:anchor="_Toc234849046" w:history="1">
             <w:r>
               <w:rPr>
                 <w:rStyle w:val="Hyperlink"/>
@@ -6148,7 +6148,7 @@
                 <w:noProof/>
                 <w:webHidden/>
               </w:rPr>
-              <w:instrText xml:space="preserve"> PAGEREF _Toc234848214 \h </w:instrText>
+              <w:instrText xml:space="preserve"> PAGEREF _Toc234849046 \h </w:instrText>
             </w:r>
             <w:r>
               <w:rPr>
@@ -6194,7 +6194,7 @@
               <w14:ligatures w14:val="standardContextual"/>
             </w:rPr>
           </w:pPr>
-          <w:hyperlink w:anchor="_Toc234848215" w:history="1">
+          <w:hyperlink w:anchor="_Toc234849047" w:history="1">
             <w:r>
               <w:rPr>
                 <w:rStyle w:val="Hyperlink"/>
@@ -6238,7 +6238,7 @@
                 <w:noProof/>
                 <w:webHidden/>
               </w:rPr>
-              <w:instrText xml:space="preserve"> PAGEREF _Toc234848215 \h </w:instrText>
+              <w:instrText xml:space="preserve"> PAGEREF _Toc234849047 \h </w:instrText>
             </w:r>
             <w:r>
               <w:rPr>
@@ -6284,7 +6284,7 @@
               <w14:ligatures w14:val="standardContextual"/>
             </w:rPr>
           </w:pPr>
-          <w:hyperlink w:anchor="_Toc234848216" w:history="1">
+          <w:hyperlink w:anchor="_Toc234849048" w:history="1">
             <w:r>
               <w:rPr>
                 <w:rStyle w:val="Hyperlink"/>
@@ -6328,7 +6328,7 @@
                 <w:noProof/>
                 <w:webHidden/>
               </w:rPr>
-              <w:instrText xml:space="preserve"> PAGEREF _Toc234848216 \h </w:instrText>
+              <w:instrText xml:space="preserve"> PAGEREF _Toc234849048 \h </w:instrText>
             </w:r>
             <w:r>
               <w:rPr>
@@ -6374,7 +6374,7 @@
               <w14:ligatures w14:val="standardContextual"/>
             </w:rPr>
           </w:pPr>
-          <w:hyperlink w:anchor="_Toc234848217" w:history="1">
+          <w:hyperlink w:anchor="_Toc234849049" w:history="1">
             <w:r>
               <w:rPr>
                 <w:rStyle w:val="Hyperlink"/>
@@ -6418,7 +6418,7 @@
                 <w:noProof/>
                 <w:webHidden/>
               </w:rPr>
-              <w:instrText xml:space="preserve"> PAGEREF _Toc234848217 \h </w:instrText>
+              <w:instrText xml:space="preserve"> PAGEREF _Toc234849049 \h </w:instrText>
             </w:r>
             <w:r>
               <w:rPr>
@@ -6464,7 +6464,7 @@
               <w14:ligatures w14:val="standardContextual"/>
             </w:rPr>
           </w:pPr>
-          <w:hyperlink w:anchor="_Toc234848218" w:history="1">
+          <w:hyperlink w:anchor="_Toc234849050" w:history="1">
             <w:r>
               <w:rPr>
                 <w:rStyle w:val="Hyperlink"/>
@@ -6508,7 +6508,7 @@
                 <w:noProof/>
                 <w:webHidden/>
               </w:rPr>
-              <w:instrText xml:space="preserve"> PAGEREF _Toc234848218 \h </w:instrText>
+              <w:instrText xml:space="preserve"> PAGEREF _Toc234849050 \h </w:instrText>
             </w:r>
             <w:r>
               <w:rPr>
@@ -6554,7 +6554,7 @@
               <w14:ligatures w14:val="standardContextual"/>
             </w:rPr>
           </w:pPr>
-          <w:hyperlink w:anchor="_Toc234848219" w:history="1">
+          <w:hyperlink w:anchor="_Toc234849051" w:history="1">
             <w:r>
               <w:rPr>
                 <w:rStyle w:val="Hyperlink"/>
@@ -6598,7 +6598,7 @@
                 <w:noProof/>
                 <w:webHidden/>
               </w:rPr>
-              <w:instrText xml:space="preserve"> PAGEREF _Toc234848219 \h </w:instrText>
+              <w:instrText xml:space="preserve"> PAGEREF _Toc234849051 \h </w:instrText>
             </w:r>
             <w:r>
               <w:rPr>
@@ -6644,7 +6644,7 @@
               <w14:ligatures w14:val="standardContextual"/>
             </w:rPr>
           </w:pPr>
-          <w:hyperlink w:anchor="_Toc234848220" w:history="1">
+          <w:hyperlink w:anchor="_Toc234849052" w:history="1">
             <w:r>
               <w:rPr>
                 <w:rStyle w:val="Hyperlink"/>
@@ -6688,7 +6688,7 @@
                 <w:noProof/>
                 <w:webHidden/>
               </w:rPr>
-              <w:instrText xml:space="preserve"> PAGEREF _Toc234848220 \h </w:instrText>
+              <w:instrText xml:space="preserve"> PAGEREF _Toc234849052 \h </w:instrText>
             </w:r>
             <w:r>
               <w:rPr>
@@ -6734,7 +6734,7 @@
               <w14:ligatures w14:val="standardContextual"/>
             </w:rPr>
           </w:pPr>
-          <w:hyperlink w:anchor="_Toc234848221" w:history="1">
+          <w:hyperlink w:anchor="_Toc234849053" w:history="1">
             <w:r>
               <w:rPr>
                 <w:rStyle w:val="Hyperlink"/>
@@ -6778,7 +6778,7 @@
                 <w:noProof/>
                 <w:webHidden/>
               </w:rPr>
-              <w:instrText xml:space="preserve"> PAGEREF _Toc234848221 \h </w:instrText>
+              <w:instrText xml:space="preserve"> PAGEREF _Toc234849053 \h </w:instrText>
             </w:r>
             <w:r>
               <w:rPr>
@@ -6824,7 +6824,7 @@
               <w14:ligatures w14:val="standardContextual"/>
             </w:rPr>
           </w:pPr>
-          <w:hyperlink w:anchor="_Toc234848222" w:history="1">
+          <w:hyperlink w:anchor="_Toc234849054" w:history="1">
             <w:r>
               <w:rPr>
                 <w:rStyle w:val="Hyperlink"/>
@@ -6868,7 +6868,7 @@
                 <w:noProof/>
                 <w:webHidden/>
               </w:rPr>
-              <w:instrText xml:space="preserve"> PAGEREF _Toc234848222 \h </w:instrText>
+              <w:instrText xml:space="preserve"> PAGEREF _Toc234849054 \h </w:instrText>
             </w:r>
             <w:r>
               <w:rPr>
@@ -6914,7 +6914,7 @@
               <w14:ligatures w14:val="standardContextual"/>
             </w:rPr>
           </w:pPr>
-          <w:hyperlink w:anchor="_Toc234848223" w:history="1">
+          <w:hyperlink w:anchor="_Toc234849055" w:history="1">
             <w:r>
               <w:rPr>
                 <w:rStyle w:val="Hyperlink"/>
@@ -6958,7 +6958,7 @@
                 <w:noProof/>
                 <w:webHidden/>
               </w:rPr>
-              <w:instrText xml:space="preserve"> PAGEREF _Toc234848223 \h </w:instrText>
+              <w:instrText xml:space="preserve"> PAGEREF _Toc234849055 \h </w:instrText>
             </w:r>
             <w:r>
               <w:rPr>
@@ -7004,7 +7004,7 @@
               <w14:ligatures w14:val="standardContextual"/>
             </w:rPr>
           </w:pPr>
-          <w:hyperlink w:anchor="_Toc234848224" w:history="1">
+          <w:hyperlink w:anchor="_Toc234849056" w:history="1">
             <w:r>
               <w:rPr>
                 <w:rStyle w:val="Hyperlink"/>
@@ -7048,7 +7048,7 @@
                 <w:noProof/>
                 <w:webHidden/>
               </w:rPr>
-              <w:instrText xml:space="preserve"> PAGEREF _Toc234848224 \h </w:instrText>
+              <w:instrText xml:space="preserve"> PAGEREF _Toc234849056 \h </w:instrText>
             </w:r>
             <w:r>
               <w:rPr>
@@ -7094,7 +7094,7 @@
               <w14:ligatures w14:val="standardContextual"/>
             </w:rPr>
           </w:pPr>
-          <w:hyperlink w:anchor="_Toc234848225" w:history="1">
+          <w:hyperlink w:anchor="_Toc234849057" w:history="1">
             <w:r>
               <w:rPr>
                 <w:rStyle w:val="Hyperlink"/>
@@ -7138,7 +7138,7 @@
                 <w:noProof/>
                 <w:webHidden/>
               </w:rPr>
-              <w:instrText xml:space="preserve"> PAGEREF _Toc234848225 \h </w:instrText>
+              <w:instrText xml:space="preserve"> PAGEREF _Toc234849057 \h </w:instrText>
             </w:r>
             <w:r>
               <w:rPr>
@@ -7184,7 +7184,7 @@
               <w14:ligatures w14:val="standardContextual"/>
             </w:rPr>
           </w:pPr>
-          <w:hyperlink w:anchor="_Toc234848226" w:history="1">
+          <w:hyperlink w:anchor="_Toc234849058" w:history="1">
             <w:r>
               <w:rPr>
                 <w:rStyle w:val="Hyperlink"/>
@@ -7228,7 +7228,7 @@
                 <w:noProof/>
                 <w:webHidden/>
               </w:rPr>
-              <w:instrText xml:space="preserve"> PAGEREF _Toc234848226 \h </w:instrText>
+              <w:instrText xml:space="preserve"> PAGEREF _Toc234849058 \h </w:instrText>
             </w:r>
             <w:r>
               <w:rPr>
@@ -7274,7 +7274,7 @@
               <w14:ligatures w14:val="standardContextual"/>
             </w:rPr>
           </w:pPr>
-          <w:hyperlink w:anchor="_Toc234848227" w:history="1">
+          <w:hyperlink w:anchor="_Toc234849059" w:history="1">
             <w:r>
               <w:rPr>
                 <w:rStyle w:val="Hyperlink"/>
@@ -7318,7 +7318,7 @@
                 <w:noProof/>
                 <w:webHidden/>
               </w:rPr>
-              <w:instrText xml:space="preserve"> PAGEREF _Toc234848227 \h </w:instrText>
+              <w:instrText xml:space="preserve"> PAGEREF _Toc234849059 \h </w:instrText>
             </w:r>
             <w:r>
               <w:rPr>
@@ -7364,7 +7364,7 @@
               <w14:ligatures w14:val="standardContextual"/>
             </w:rPr>
           </w:pPr>
-          <w:hyperlink w:anchor="_Toc234848228" w:history="1">
+          <w:hyperlink w:anchor="_Toc234849060" w:history="1">
             <w:r>
               <w:rPr>
                 <w:rStyle w:val="Hyperlink"/>
@@ -7408,7 +7408,7 @@
                 <w:noProof/>
                 <w:webHidden/>
               </w:rPr>
-              <w:instrText xml:space="preserve"> PAGEREF _Toc234848228 \h </w:instrText>
+              <w:instrText xml:space="preserve"> PAGEREF _Toc234849060 \h </w:instrText>
             </w:r>
             <w:r>
               <w:rPr>
@@ -7454,7 +7454,7 @@
               <w14:ligatures w14:val="standardContextual"/>
             </w:rPr>
           </w:pPr>
-          <w:hyperlink w:anchor="_Toc234848229" w:history="1">
+          <w:hyperlink w:anchor="_Toc234849061" w:history="1">
             <w:r>
               <w:rPr>
                 <w:rStyle w:val="Hyperlink"/>
@@ -7498,7 +7498,7 @@
                 <w:noProof/>
                 <w:webHidden/>
               </w:rPr>
-              <w:instrText xml:space="preserve"> PAGEREF _Toc234848229 \h </w:instrText>
+              <w:instrText xml:space="preserve"> PAGEREF _Toc234849061 \h </w:instrText>
             </w:r>
             <w:r>
               <w:rPr>
@@ -7544,7 +7544,7 @@
               <w14:ligatures w14:val="standardContextual"/>
             </w:rPr>
           </w:pPr>
-          <w:hyperlink w:anchor="_Toc234848230" w:history="1">
+          <w:hyperlink w:anchor="_Toc234849062" w:history="1">
             <w:r>
               <w:rPr>
                 <w:rStyle w:val="Hyperlink"/>
@@ -7588,7 +7588,7 @@
                 <w:noProof/>
                 <w:webHidden/>
               </w:rPr>
-              <w:instrText xml:space="preserve"> PAGEREF _Toc234848230 \h </w:instrText>
+              <w:instrText xml:space="preserve"> PAGEREF _Toc234849062 \h </w:instrText>
             </w:r>
             <w:r>
               <w:rPr>
@@ -7634,7 +7634,7 @@
               <w14:ligatures w14:val="standardContextual"/>
             </w:rPr>
           </w:pPr>
-          <w:hyperlink w:anchor="_Toc234848231" w:history="1">
+          <w:hyperlink w:anchor="_Toc234849063" w:history="1">
             <w:r>
               <w:rPr>
                 <w:rStyle w:val="Hyperlink"/>
@@ -7678,7 +7678,7 @@
                 <w:noProof/>
                 <w:webHidden/>
               </w:rPr>
-              <w:instrText xml:space="preserve"> PAGEREF _Toc234848231 \h </w:instrText>
+              <w:instrText xml:space="preserve"> PAGEREF _Toc234849063 \h </w:instrText>
             </w:r>
             <w:r>
               <w:rPr>
@@ -7724,7 +7724,7 @@
               <w14:ligatures w14:val="standardContextual"/>
             </w:rPr>
           </w:pPr>
-          <w:hyperlink w:anchor="_Toc234848232" w:history="1">
+          <w:hyperlink w:anchor="_Toc234849064" w:history="1">
             <w:r>
               <w:rPr>
                 <w:rStyle w:val="Hyperlink"/>
@@ -7768,7 +7768,7 @@
                 <w:noProof/>
                 <w:webHidden/>
               </w:rPr>
-              <w:instrText xml:space="preserve"> PAGEREF _Toc234848232 \h </w:instrText>
+              <w:instrText xml:space="preserve"> PAGEREF _Toc234849064 \h </w:instrText>
             </w:r>
             <w:r>
               <w:rPr>
@@ -7814,7 +7814,7 @@
               <w14:ligatures w14:val="standardContextual"/>
             </w:rPr>
           </w:pPr>
-          <w:hyperlink w:anchor="_Toc234848233" w:history="1">
+          <w:hyperlink w:anchor="_Toc234849065" w:history="1">
             <w:r>
               <w:rPr>
                 <w:rStyle w:val="Hyperlink"/>
@@ -7858,7 +7858,7 @@
                 <w:noProof/>
                 <w:webHidden/>
               </w:rPr>
-              <w:instrText xml:space="preserve"> PAGEREF _Toc234848233 \h </w:instrText>
+              <w:instrText xml:space="preserve"> PAGEREF _Toc234849065 \h </w:instrText>
             </w:r>
             <w:r>
               <w:rPr>
@@ -7904,7 +7904,7 @@
               <w14:ligatures w14:val="standardContextual"/>
             </w:rPr>
           </w:pPr>
-          <w:hyperlink w:anchor="_Toc234848234" w:history="1">
+          <w:hyperlink w:anchor="_Toc234849066" w:history="1">
             <w:r>
               <w:rPr>
                 <w:rStyle w:val="Hyperlink"/>
@@ -7948,7 +7948,7 @@
                 <w:noProof/>
                 <w:webHidden/>
               </w:rPr>
-              <w:instrText xml:space="preserve"> PAGEREF _Toc234848234 \h </w:instrText>
+              <w:instrText xml:space="preserve"> PAGEREF _Toc234849066 \h </w:instrText>
             </w:r>
             <w:r>
               <w:rPr>
@@ -7994,7 +7994,7 @@
               <w14:ligatures w14:val="standardContextual"/>
             </w:rPr>
           </w:pPr>
-          <w:hyperlink w:anchor="_Toc234848235" w:history="1">
+          <w:hyperlink w:anchor="_Toc234849067" w:history="1">
             <w:r>
               <w:rPr>
                 <w:rStyle w:val="Hyperlink"/>
@@ -8038,7 +8038,7 @@
                 <w:noProof/>
                 <w:webHidden/>
               </w:rPr>
-              <w:instrText xml:space="preserve"> PAGEREF _Toc234848235 \h </w:instrText>
+              <w:instrText xml:space="preserve"> PAGEREF _Toc234849067 \h </w:instrText>
             </w:r>
             <w:r>
               <w:rPr>
@@ -8084,7 +8084,7 @@
               <w14:ligatures w14:val="standardContextual"/>
             </w:rPr>
           </w:pPr>
-          <w:hyperlink w:anchor="_Toc234848236" w:history="1">
+          <w:hyperlink w:anchor="_Toc234849068" w:history="1">
             <w:r>
               <w:rPr>
                 <w:rStyle w:val="Hyperlink"/>
@@ -8128,7 +8128,7 @@
                 <w:noProof/>
                 <w:webHidden/>
               </w:rPr>
-              <w:instrText xml:space="preserve"> PAGEREF _Toc234848236 \h </w:instrText>
+              <w:instrText xml:space="preserve"> PAGEREF _Toc234849068 \h </w:instrText>
             </w:r>
             <w:r>
               <w:rPr>
@@ -8174,7 +8174,7 @@
               <w14:ligatures w14:val="standardContextual"/>
             </w:rPr>
           </w:pPr>
-          <w:hyperlink w:anchor="_Toc234848237" w:history="1">
+          <w:hyperlink w:anchor="_Toc234849069" w:history="1">
             <w:r>
               <w:rPr>
                 <w:rStyle w:val="Hyperlink"/>
@@ -8218,7 +8218,7 @@
                 <w:noProof/>
                 <w:webHidden/>
               </w:rPr>
-              <w:instrText xml:space="preserve"> PAGEREF _Toc234848237 \h </w:instrText>
+              <w:instrText xml:space="preserve"> PAGEREF _Toc234849069 \h </w:instrText>
             </w:r>
             <w:r>
               <w:rPr>
@@ -8264,7 +8264,7 @@
               <w14:ligatures w14:val="standardContextual"/>
             </w:rPr>
           </w:pPr>
-          <w:hyperlink w:anchor="_Toc234848238" w:history="1">
+          <w:hyperlink w:anchor="_Toc234849070" w:history="1">
             <w:r>
               <w:rPr>
                 <w:rStyle w:val="Hyperlink"/>
@@ -8308,7 +8308,7 @@
                 <w:noProof/>
                 <w:webHidden/>
               </w:rPr>
-              <w:instrText xml:space="preserve"> PAGEREF _Toc234848238 \h </w:instrText>
+              <w:instrText xml:space="preserve"> PAGEREF _Toc234849070 \h </w:instrText>
             </w:r>
             <w:r>
               <w:rPr>
@@ -8354,7 +8354,7 @@
               <w14:ligatures w14:val="standardContextual"/>
             </w:rPr>
           </w:pPr>
-          <w:hyperlink w:anchor="_Toc234848239" w:history="1">
+          <w:hyperlink w:anchor="_Toc234849071" w:history="1">
             <w:r>
               <w:rPr>
                 <w:rStyle w:val="Hyperlink"/>
@@ -8398,7 +8398,7 @@
                 <w:noProof/>
                 <w:webHidden/>
               </w:rPr>
-              <w:instrText xml:space="preserve"> PAGEREF _Toc234848239 \h </w:instrText>
+              <w:instrText xml:space="preserve"> PAGEREF _Toc234849071 \h </w:instrText>
             </w:r>
             <w:r>
               <w:rPr>
@@ -8444,7 +8444,7 @@
               <w14:ligatures w14:val="standardContextual"/>
             </w:rPr>
           </w:pPr>
-          <w:hyperlink w:anchor="_Toc234848240" w:history="1">
+          <w:hyperlink w:anchor="_Toc234849072" w:history="1">
             <w:r>
               <w:rPr>
                 <w:rStyle w:val="Hyperlink"/>
@@ -8488,7 +8488,7 @@
                 <w:noProof/>
                 <w:webHidden/>
               </w:rPr>
-              <w:instrText xml:space="preserve"> PAGEREF _Toc234848240 \h </w:instrText>
+              <w:instrText xml:space="preserve"> PAGEREF _Toc234849072 \h </w:instrText>
             </w:r>
             <w:r>
               <w:rPr>
@@ -8534,7 +8534,7 @@
               <w14:ligatures w14:val="standardContextual"/>
             </w:rPr>
           </w:pPr>
-          <w:hyperlink w:anchor="_Toc234848241" w:history="1">
+          <w:hyperlink w:anchor="_Toc234849073" w:history="1">
             <w:r>
               <w:rPr>
                 <w:rStyle w:val="Hyperlink"/>
@@ -8578,7 +8578,7 @@
                 <w:noProof/>
                 <w:webHidden/>
               </w:rPr>
-              <w:instrText xml:space="preserve"> PAGEREF _Toc234848241 \h </w:instrText>
+              <w:instrText xml:space="preserve"> PAGEREF _Toc234849073 \h </w:instrText>
             </w:r>
             <w:r>
               <w:rPr>
@@ -8624,7 +8624,7 @@
               <w14:ligatures w14:val="standardContextual"/>
             </w:rPr>
           </w:pPr>
-          <w:hyperlink w:anchor="_Toc234848242" w:history="1">
+          <w:hyperlink w:anchor="_Toc234849074" w:history="1">
             <w:r>
               <w:rPr>
                 <w:rStyle w:val="Hyperlink"/>
@@ -8668,7 +8668,7 @@
                 <w:noProof/>
                 <w:webHidden/>
               </w:rPr>
-              <w:instrText xml:space="preserve"> PAGEREF _Toc234848242 \h </w:instrText>
+              <w:instrText xml:space="preserve"> PAGEREF _Toc234849074 \h </w:instrText>
             </w:r>
             <w:r>
               <w:rPr>
@@ -8714,7 +8714,7 @@
               <w14:ligatures w14:val="standardContextual"/>
             </w:rPr>
           </w:pPr>
-          <w:hyperlink w:anchor="_Toc234848243" w:history="1">
+          <w:hyperlink w:anchor="_Toc234849075" w:history="1">
             <w:r>
               <w:rPr>
                 <w:rStyle w:val="Hyperlink"/>
@@ -8758,7 +8758,7 @@
                 <w:noProof/>
                 <w:webHidden/>
               </w:rPr>
-              <w:instrText xml:space="preserve"> PAGEREF _Toc234848243 \h </w:instrText>
+              <w:instrText xml:space="preserve"> PAGEREF _Toc234849075 \h </w:instrText>
             </w:r>
             <w:r>
               <w:rPr>
@@ -8804,7 +8804,7 @@
               <w14:ligatures w14:val="standardContextual"/>
             </w:rPr>
           </w:pPr>
-          <w:hyperlink w:anchor="_Toc234848244" w:history="1">
+          <w:hyperlink w:anchor="_Toc234849076" w:history="1">
             <w:r>
               <w:rPr>
                 <w:rStyle w:val="Hyperlink"/>
@@ -8848,7 +8848,7 @@
                 <w:noProof/>
                 <w:webHidden/>
               </w:rPr>
-              <w:instrText xml:space="preserve"> PAGEREF _Toc234848244 \h </w:instrText>
+              <w:instrText xml:space="preserve"> PAGEREF _Toc234849076 \h </w:instrText>
             </w:r>
             <w:r>
               <w:rPr>
@@ -8894,7 +8894,7 @@
               <w14:ligatures w14:val="standardContextual"/>
             </w:rPr>
           </w:pPr>
-          <w:hyperlink w:anchor="_Toc234848245" w:history="1">
+          <w:hyperlink w:anchor="_Toc234849077" w:history="1">
             <w:r>
               <w:rPr>
                 <w:rStyle w:val="Hyperlink"/>
@@ -8938,7 +8938,7 @@
                 <w:noProof/>
                 <w:webHidden/>
               </w:rPr>
-              <w:instrText xml:space="preserve"> PAGEREF _Toc234848245 \h </w:instrText>
+              <w:instrText xml:space="preserve"> PAGEREF _Toc234849077 \h </w:instrText>
             </w:r>
             <w:r>
               <w:rPr>
@@ -8984,7 +8984,7 @@
               <w14:ligatures w14:val="standardContextual"/>
             </w:rPr>
           </w:pPr>
-          <w:hyperlink w:anchor="_Toc234848246" w:history="1">
+          <w:hyperlink w:anchor="_Toc234849078" w:history="1">
             <w:r>
               <w:rPr>
                 <w:rStyle w:val="Hyperlink"/>
@@ -9028,7 +9028,7 @@
                 <w:noProof/>
                 <w:webHidden/>
               </w:rPr>
-              <w:instrText xml:space="preserve"> PAGEREF _Toc234848246 \h </w:instrText>
+              <w:instrText xml:space="preserve"> PAGEREF _Toc234849078 \h </w:instrText>
             </w:r>
             <w:r>
               <w:rPr>
@@ -9074,7 +9074,7 @@
               <w14:ligatures w14:val="standardContextual"/>
             </w:rPr>
           </w:pPr>
-          <w:hyperlink w:anchor="_Toc234848247" w:history="1">
+          <w:hyperlink w:anchor="_Toc234849079" w:history="1">
             <w:r>
               <w:rPr>
                 <w:rStyle w:val="Hyperlink"/>
@@ -9118,7 +9118,7 @@
                 <w:noProof/>
                 <w:webHidden/>
               </w:rPr>
-              <w:instrText xml:space="preserve"> PAGEREF _Toc234848247 \h </w:instrText>
+              <w:instrText xml:space="preserve"> PAGEREF _Toc234849079 \h </w:instrText>
             </w:r>
             <w:r>
               <w:rPr>
@@ -9164,7 +9164,7 @@
               <w14:ligatures w14:val="standardContextual"/>
             </w:rPr>
           </w:pPr>
-          <w:hyperlink w:anchor="_Toc234848248" w:history="1">
+          <w:hyperlink w:anchor="_Toc234849080" w:history="1">
             <w:r>
               <w:rPr>
                 <w:rStyle w:val="Hyperlink"/>
@@ -9208,7 +9208,7 @@
                 <w:noProof/>
                 <w:webHidden/>
               </w:rPr>
-              <w:instrText xml:space="preserve"> PAGEREF _Toc234848248 \h </w:instrText>
+              <w:instrText xml:space="preserve"> PAGEREF _Toc234849080 \h </w:instrText>
             </w:r>
             <w:r>
               <w:rPr>
@@ -9254,7 +9254,7 @@
               <w14:ligatures w14:val="standardContextual"/>
             </w:rPr>
           </w:pPr>
-          <w:hyperlink w:anchor="_Toc234848249" w:history="1">
+          <w:hyperlink w:anchor="_Toc234849081" w:history="1">
             <w:r>
               <w:rPr>
                 <w:rStyle w:val="Hyperlink"/>
@@ -9298,7 +9298,7 @@
                 <w:noProof/>
                 <w:webHidden/>
               </w:rPr>
-              <w:instrText xml:space="preserve"> PAGEREF _Toc234848249 \h </w:instrText>
+              <w:instrText xml:space="preserve"> PAGEREF _Toc234849081 \h </w:instrText>
             </w:r>
             <w:r>
               <w:rPr>
@@ -9344,7 +9344,7 @@
               <w14:ligatures w14:val="standardContextual"/>
             </w:rPr>
           </w:pPr>
-          <w:hyperlink w:anchor="_Toc234848250" w:history="1">
+          <w:hyperlink w:anchor="_Toc234849082" w:history="1">
             <w:r>
               <w:rPr>
                 <w:rStyle w:val="Hyperlink"/>
@@ -9388,7 +9388,7 @@
                 <w:noProof/>
                 <w:webHidden/>
               </w:rPr>
-              <w:instrText xml:space="preserve"> PAGEREF _Toc234848250 \h </w:instrText>
+              <w:instrText xml:space="preserve"> PAGEREF _Toc234849082 \h </w:instrText>
             </w:r>
             <w:r>
               <w:rPr>
@@ -9434,7 +9434,7 @@
               <w14:ligatures w14:val="standardContextual"/>
             </w:rPr>
           </w:pPr>
-          <w:hyperlink w:anchor="_Toc234848251" w:history="1">
+          <w:hyperlink w:anchor="_Toc234849083" w:history="1">
             <w:r>
               <w:rPr>
                 <w:rStyle w:val="Hyperlink"/>
@@ -9478,7 +9478,7 @@
                 <w:noProof/>
                 <w:webHidden/>
               </w:rPr>
-              <w:instrText xml:space="preserve"> PAGEREF _Toc234848251 \h </w:instrText>
+              <w:instrText xml:space="preserve"> PAGEREF _Toc234849083 \h </w:instrText>
             </w:r>
             <w:r>
               <w:rPr>
@@ -9524,7 +9524,7 @@
               <w14:ligatures w14:val="standardContextual"/>
             </w:rPr>
           </w:pPr>
-          <w:hyperlink w:anchor="_Toc234848252" w:history="1">
+          <w:hyperlink w:anchor="_Toc234849084" w:history="1">
             <w:r>
               <w:rPr>
                 <w:rStyle w:val="Hyperlink"/>
@@ -9568,7 +9568,7 @@
                 <w:noProof/>
                 <w:webHidden/>
               </w:rPr>
-              <w:instrText xml:space="preserve"> PAGEREF _Toc234848252 \h </w:instrText>
+              <w:instrText xml:space="preserve"> PAGEREF _Toc234849084 \h </w:instrText>
             </w:r>
             <w:r>
               <w:rPr>
@@ -9614,7 +9614,7 @@
               <w14:ligatures w14:val="standardContextual"/>
             </w:rPr>
           </w:pPr>
-          <w:hyperlink w:anchor="_Toc234848253" w:history="1">
+          <w:hyperlink w:anchor="_Toc234849085" w:history="1">
             <w:r>
               <w:rPr>
                 <w:rStyle w:val="Hyperlink"/>
@@ -9658,7 +9658,7 @@
                 <w:noProof/>
                 <w:webHidden/>
               </w:rPr>
-              <w:instrText xml:space="preserve"> PAGEREF _Toc234848253 \h </w:instrText>
+              <w:instrText xml:space="preserve"> PAGEREF _Toc234849085 \h </w:instrText>
             </w:r>
             <w:r>
               <w:rPr>
@@ -9704,7 +9704,7 @@
               <w14:ligatures w14:val="standardContextual"/>
             </w:rPr>
           </w:pPr>
-          <w:hyperlink w:anchor="_Toc234848254" w:history="1">
+          <w:hyperlink w:anchor="_Toc234849086" w:history="1">
             <w:r>
               <w:rPr>
                 <w:rStyle w:val="Hyperlink"/>
@@ -9748,7 +9748,7 @@
                 <w:noProof/>
                 <w:webHidden/>
               </w:rPr>
-              <w:instrText xml:space="preserve"> PAGEREF _Toc234848254 \h </w:instrText>
+              <w:instrText xml:space="preserve"> PAGEREF _Toc234849086 \h </w:instrText>
             </w:r>
             <w:r>
               <w:rPr>
@@ -9794,7 +9794,7 @@
               <w14:ligatures w14:val="standardContextual"/>
             </w:rPr>
           </w:pPr>
-          <w:hyperlink w:anchor="_Toc234848255" w:history="1">
+          <w:hyperlink w:anchor="_Toc234849087" w:history="1">
             <w:r>
               <w:rPr>
                 <w:rStyle w:val="Hyperlink"/>
@@ -9838,7 +9838,7 @@
                 <w:noProof/>
                 <w:webHidden/>
               </w:rPr>
-              <w:instrText xml:space="preserve"> PAGEREF _Toc234848255 \h </w:instrText>
+              <w:instrText xml:space="preserve"> PAGEREF _Toc234849087 \h </w:instrText>
             </w:r>
             <w:r>
               <w:rPr>
@@ -9884,7 +9884,7 @@
               <w14:ligatures w14:val="standardContextual"/>
             </w:rPr>
           </w:pPr>
-          <w:hyperlink w:anchor="_Toc234848256" w:history="1">
+          <w:hyperlink w:anchor="_Toc234849088" w:history="1">
             <w:r>
               <w:rPr>
                 <w:rStyle w:val="Hyperlink"/>
@@ -9928,7 +9928,7 @@
                 <w:noProof/>
                 <w:webHidden/>
               </w:rPr>
-              <w:instrText xml:space="preserve"> PAGEREF _Toc234848256 \h </w:instrText>
+              <w:instrText xml:space="preserve"> PAGEREF _Toc234849088 \h </w:instrText>
             </w:r>
             <w:r>
               <w:rPr>
@@ -9974,7 +9974,7 @@
               <w14:ligatures w14:val="standardContextual"/>
             </w:rPr>
           </w:pPr>
-          <w:hyperlink w:anchor="_Toc234848257" w:history="1">
+          <w:hyperlink w:anchor="_Toc234849089" w:history="1">
             <w:r>
               <w:rPr>
                 <w:rStyle w:val="Hyperlink"/>
@@ -10018,7 +10018,7 @@
                 <w:noProof/>
                 <w:webHidden/>
               </w:rPr>
-              <w:instrText xml:space="preserve"> PAGEREF _Toc234848257 \h </w:instrText>
+              <w:instrText xml:space="preserve"> PAGEREF _Toc234849089 \h </w:instrText>
             </w:r>
             <w:r>
               <w:rPr>
@@ -10064,7 +10064,7 @@
               <w14:ligatures w14:val="standardContextual"/>
             </w:rPr>
           </w:pPr>
-          <w:hyperlink w:anchor="_Toc234848258" w:history="1">
+          <w:hyperlink w:anchor="_Toc234849090" w:history="1">
             <w:r>
               <w:rPr>
                 <w:rStyle w:val="Hyperlink"/>
@@ -10108,7 +10108,7 @@
                 <w:noProof/>
                 <w:webHidden/>
               </w:rPr>
-              <w:instrText xml:space="preserve"> PAGEREF _Toc234848258 \h </w:instrText>
+              <w:instrText xml:space="preserve"> PAGEREF _Toc234849090 \h </w:instrText>
             </w:r>
             <w:r>
               <w:rPr>
@@ -10154,7 +10154,7 @@
               <w14:ligatures w14:val="standardContextual"/>
             </w:rPr>
           </w:pPr>
-          <w:hyperlink w:anchor="_Toc234848259" w:history="1">
+          <w:hyperlink w:anchor="_Toc234849091" w:history="1">
             <w:r>
               <w:rPr>
                 <w:rStyle w:val="Hyperlink"/>
@@ -10198,7 +10198,7 @@
                 <w:noProof/>
                 <w:webHidden/>
               </w:rPr>
-              <w:instrText xml:space="preserve"> PAGEREF _Toc234848259 \h </w:instrText>
+              <w:instrText xml:space="preserve"> PAGEREF _Toc234849091 \h </w:instrText>
             </w:r>
             <w:r>
               <w:rPr>
@@ -10244,7 +10244,7 @@
               <w14:ligatures w14:val="standardContextual"/>
             </w:rPr>
           </w:pPr>
-          <w:hyperlink w:anchor="_Toc234848260" w:history="1">
+          <w:hyperlink w:anchor="_Toc234849092" w:history="1">
             <w:r>
               <w:rPr>
                 <w:rStyle w:val="Hyperlink"/>
@@ -10288,7 +10288,7 @@
                 <w:noProof/>
                 <w:webHidden/>
               </w:rPr>
-              <w:instrText xml:space="preserve"> PAGEREF _Toc234848260 \h </w:instrText>
+              <w:instrText xml:space="preserve"> PAGEREF _Toc234849092 \h </w:instrText>
             </w:r>
             <w:r>
               <w:rPr>
@@ -10334,7 +10334,7 @@
               <w14:ligatures w14:val="standardContextual"/>
             </w:rPr>
           </w:pPr>
-          <w:hyperlink w:anchor="_Toc234848261" w:history="1">
+          <w:hyperlink w:anchor="_Toc234849093" w:history="1">
             <w:r>
               <w:rPr>
                 <w:rStyle w:val="Hyperlink"/>
@@ -10378,7 +10378,7 @@
                 <w:noProof/>
                 <w:webHidden/>
               </w:rPr>
-              <w:instrText xml:space="preserve"> PAGEREF _Toc234848261 \h </w:instrText>
+              <w:instrText xml:space="preserve"> PAGEREF _Toc234849093 \h </w:instrText>
             </w:r>
             <w:r>
               <w:rPr>
@@ -10424,7 +10424,7 @@
               <w14:ligatures w14:val="standardContextual"/>
             </w:rPr>
           </w:pPr>
-          <w:hyperlink w:anchor="_Toc234848262" w:history="1">
+          <w:hyperlink w:anchor="_Toc234849094" w:history="1">
             <w:r>
               <w:rPr>
                 <w:rStyle w:val="Hyperlink"/>
@@ -10468,7 +10468,7 @@
                 <w:noProof/>
                 <w:webHidden/>
               </w:rPr>
-              <w:instrText xml:space="preserve"> PAGEREF _Toc234848262 \h </w:instrText>
+              <w:instrText xml:space="preserve"> PAGEREF _Toc234849094 \h </w:instrText>
             </w:r>
             <w:r>
               <w:rPr>
@@ -10514,7 +10514,7 @@
               <w14:ligatures w14:val="standardContextual"/>
             </w:rPr>
           </w:pPr>
-          <w:hyperlink w:anchor="_Toc234848263" w:history="1">
+          <w:hyperlink w:anchor="_Toc234849095" w:history="1">
             <w:r>
               <w:rPr>
                 <w:rStyle w:val="Hyperlink"/>
@@ -10558,7 +10558,7 @@
                 <w:noProof/>
                 <w:webHidden/>
               </w:rPr>
-              <w:instrText xml:space="preserve"> PAGEREF _Toc234848263 \h </w:instrText>
+              <w:instrText xml:space="preserve"> PAGEREF _Toc234849095 \h </w:instrText>
             </w:r>
             <w:r>
               <w:rPr>
@@ -10604,7 +10604,7 @@
               <w14:ligatures w14:val="standardContextual"/>
             </w:rPr>
           </w:pPr>
-          <w:hyperlink w:anchor="_Toc234848264" w:history="1">
+          <w:hyperlink w:anchor="_Toc234849096" w:history="1">
             <w:r>
               <w:rPr>
                 <w:rStyle w:val="Hyperlink"/>
@@ -10648,7 +10648,7 @@
                 <w:noProof/>
                 <w:webHidden/>
               </w:rPr>
-              <w:instrText xml:space="preserve"> PAGEREF _Toc234848264 \h </w:instrText>
+              <w:instrText xml:space="preserve"> PAGEREF _Toc234849096 \h </w:instrText>
             </w:r>
             <w:r>
               <w:rPr>
@@ -10694,7 +10694,7 @@
               <w14:ligatures w14:val="standardContextual"/>
             </w:rPr>
           </w:pPr>
-          <w:hyperlink w:anchor="_Toc234848265" w:history="1">
+          <w:hyperlink w:anchor="_Toc234849097" w:history="1">
             <w:r>
               <w:rPr>
                 <w:rStyle w:val="Hyperlink"/>
@@ -10738,7 +10738,7 @@
                 <w:noProof/>
                 <w:webHidden/>
               </w:rPr>
-              <w:instrText xml:space="preserve"> PAGEREF _Toc234848265 \h </w:instrText>
+              <w:instrText xml:space="preserve"> PAGEREF _Toc234849097 \h </w:instrText>
             </w:r>
             <w:r>
               <w:rPr>
@@ -10784,7 +10784,7 @@
               <w14:ligatures w14:val="standardContextual"/>
             </w:rPr>
           </w:pPr>
-          <w:hyperlink w:anchor="_Toc234848266" w:history="1">
+          <w:hyperlink w:anchor="_Toc234849098" w:history="1">
             <w:r>
               <w:rPr>
                 <w:rStyle w:val="Hyperlink"/>
@@ -10828,7 +10828,7 @@
                 <w:noProof/>
                 <w:webHidden/>
               </w:rPr>
-              <w:instrText xml:space="preserve"> PAGEREF _Toc234848266 \h </w:instrText>
+              <w:instrText xml:space="preserve"> PAGEREF _Toc234849098 \h </w:instrText>
             </w:r>
             <w:r>
               <w:rPr>
@@ -10874,7 +10874,7 @@
               <w14:ligatures w14:val="standardContextual"/>
             </w:rPr>
           </w:pPr>
-          <w:hyperlink w:anchor="_Toc234848267" w:history="1">
+          <w:hyperlink w:anchor="_Toc234849099" w:history="1">
             <w:r>
               <w:rPr>
                 <w:rStyle w:val="Hyperlink"/>
@@ -10918,7 +10918,7 @@
                 <w:noProof/>
                 <w:webHidden/>
               </w:rPr>
-              <w:instrText xml:space="preserve"> PAGEREF _Toc234848267 \h </w:instrText>
+              <w:instrText xml:space="preserve"> PAGEREF _Toc234849099 \h </w:instrText>
             </w:r>
             <w:r>
               <w:rPr>
@@ -10964,7 +10964,7 @@
               <w14:ligatures w14:val="standardContextual"/>
             </w:rPr>
           </w:pPr>
-          <w:hyperlink w:anchor="_Toc234848268" w:history="1">
+          <w:hyperlink w:anchor="_Toc234849100" w:history="1">
             <w:r>
               <w:rPr>
                 <w:rStyle w:val="Hyperlink"/>
@@ -11008,7 +11008,7 @@
                 <w:noProof/>
                 <w:webHidden/>
               </w:rPr>
-              <w:instrText xml:space="preserve"> PAGEREF _Toc234848268 \h </w:instrText>
+              <w:instrText xml:space="preserve"> PAGEREF _Toc234849100 \h </w:instrText>
             </w:r>
             <w:r>
               <w:rPr>
@@ -11054,7 +11054,7 @@
               <w14:ligatures w14:val="standardContextual"/>
             </w:rPr>
           </w:pPr>
-          <w:hyperlink w:anchor="_Toc234848269" w:history="1">
+          <w:hyperlink w:anchor="_Toc234849101" w:history="1">
             <w:r>
               <w:rPr>
                 <w:rStyle w:val="Hyperlink"/>
@@ -11098,7 +11098,7 @@
                 <w:noProof/>
                 <w:webHidden/>
               </w:rPr>
-              <w:instrText xml:space="preserve"> PAGEREF _Toc234848269 \h </w:instrText>
+              <w:instrText xml:space="preserve"> PAGEREF _Toc234849101 \h </w:instrText>
             </w:r>
             <w:r>
               <w:rPr>
@@ -11144,7 +11144,7 @@
               <w14:ligatures w14:val="standardContextual"/>
             </w:rPr>
           </w:pPr>
-          <w:hyperlink w:anchor="_Toc234848270" w:history="1">
+          <w:hyperlink w:anchor="_Toc234849102" w:history="1">
             <w:r>
               <w:rPr>
                 <w:rStyle w:val="Hyperlink"/>
@@ -11188,7 +11188,7 @@
                 <w:noProof/>
                 <w:webHidden/>
               </w:rPr>
-              <w:instrText xml:space="preserve"> PAGEREF _Toc234848270 \h </w:instrText>
+              <w:instrText xml:space="preserve"> PAGEREF _Toc234849102 \h </w:instrText>
             </w:r>
             <w:r>
               <w:rPr>
@@ -11234,7 +11234,7 @@
               <w14:ligatures w14:val="standardContextual"/>
             </w:rPr>
           </w:pPr>
-          <w:hyperlink w:anchor="_Toc234848271" w:history="1">
+          <w:hyperlink w:anchor="_Toc234849103" w:history="1">
             <w:r>
               <w:rPr>
                 <w:rStyle w:val="Hyperlink"/>
@@ -11278,7 +11278,7 @@
                 <w:noProof/>
                 <w:webHidden/>
               </w:rPr>
-              <w:instrText xml:space="preserve"> PAGEREF _Toc234848271 \h </w:instrText>
+              <w:instrText xml:space="preserve"> PAGEREF _Toc234849103 \h </w:instrText>
             </w:r>
             <w:r>
               <w:rPr>
@@ -11324,7 +11324,7 @@
               <w14:ligatures w14:val="standardContextual"/>
             </w:rPr>
           </w:pPr>
-          <w:hyperlink w:anchor="_Toc234848272" w:history="1">
+          <w:hyperlink w:anchor="_Toc234849104" w:history="1">
             <w:r>
               <w:rPr>
                 <w:rStyle w:val="Hyperlink"/>
@@ -11368,7 +11368,7 @@
                 <w:noProof/>
                 <w:webHidden/>
               </w:rPr>
-              <w:instrText xml:space="preserve"> PAGEREF _Toc234848272 \h </w:instrText>
+              <w:instrText xml:space="preserve"> PAGEREF _Toc234849104 \h </w:instrText>
             </w:r>
             <w:r>
               <w:rPr>
@@ -11414,7 +11414,7 @@
               <w14:ligatures w14:val="standardContextual"/>
             </w:rPr>
           </w:pPr>
-          <w:hyperlink w:anchor="_Toc234848273" w:history="1">
+          <w:hyperlink w:anchor="_Toc234849105" w:history="1">
             <w:r>
               <w:rPr>
                 <w:rStyle w:val="Hyperlink"/>
@@ -11458,7 +11458,7 @@
                 <w:noProof/>
                 <w:webHidden/>
               </w:rPr>
-              <w:instrText xml:space="preserve"> PAGEREF _Toc234848273 \h </w:instrText>
+              <w:instrText xml:space="preserve"> PAGEREF _Toc234849105 \h </w:instrText>
             </w:r>
             <w:r>
               <w:rPr>
@@ -11504,7 +11504,7 @@
               <w14:ligatures w14:val="standardContextual"/>
             </w:rPr>
           </w:pPr>
-          <w:hyperlink w:anchor="_Toc234848274" w:history="1">
+          <w:hyperlink w:anchor="_Toc234849106" w:history="1">
             <w:r>
               <w:rPr>
                 <w:rStyle w:val="Hyperlink"/>
@@ -11548,7 +11548,7 @@
                 <w:noProof/>
                 <w:webHidden/>
               </w:rPr>
-              <w:instrText xml:space="preserve"> PAGEREF _Toc234848274 \h </w:instrText>
+              <w:instrText xml:space="preserve"> PAGEREF _Toc234849106 \h </w:instrText>
             </w:r>
             <w:r>
               <w:rPr>
@@ -11594,7 +11594,7 @@
               <w14:ligatures w14:val="standardContextual"/>
             </w:rPr>
           </w:pPr>
-          <w:hyperlink w:anchor="_Toc234848275" w:history="1">
+          <w:hyperlink w:anchor="_Toc234849107" w:history="1">
             <w:r>
               <w:rPr>
                 <w:rStyle w:val="Hyperlink"/>
@@ -11638,7 +11638,7 @@
                 <w:noProof/>
                 <w:webHidden/>
               </w:rPr>
-              <w:instrText xml:space="preserve"> PAGEREF _Toc234848275 \h </w:instrText>
+              <w:instrText xml:space="preserve"> PAGEREF _Toc234849107 \h </w:instrText>
             </w:r>
             <w:r>
               <w:rPr>
@@ -11684,7 +11684,7 @@
               <w14:ligatures w14:val="standardContextual"/>
             </w:rPr>
           </w:pPr>
-          <w:hyperlink w:anchor="_Toc234848276" w:history="1">
+          <w:hyperlink w:anchor="_Toc234849108" w:history="1">
             <w:r>
               <w:rPr>
                 <w:rStyle w:val="Hyperlink"/>
@@ -11728,7 +11728,7 @@
                 <w:noProof/>
                 <w:webHidden/>
               </w:rPr>
-              <w:instrText xml:space="preserve"> PAGEREF _Toc234848276 \h </w:instrText>
+              <w:instrText xml:space="preserve"> PAGEREF _Toc234849108 \h </w:instrText>
             </w:r>
             <w:r>
               <w:rPr>
@@ -11774,7 +11774,7 @@
               <w14:ligatures w14:val="standardContextual"/>
             </w:rPr>
           </w:pPr>
-          <w:hyperlink w:anchor="_Toc234848277" w:history="1">
+          <w:hyperlink w:anchor="_Toc234849109" w:history="1">
             <w:r>
               <w:rPr>
                 <w:rStyle w:val="Hyperlink"/>
@@ -11818,7 +11818,7 @@
                 <w:noProof/>
                 <w:webHidden/>
               </w:rPr>
-              <w:instrText xml:space="preserve"> PAGEREF _Toc234848277 \h </w:instrText>
+              <w:instrText xml:space="preserve"> PAGEREF _Toc234849109 \h </w:instrText>
             </w:r>
             <w:r>
               <w:rPr>
@@ -11864,7 +11864,7 @@
               <w14:ligatures w14:val="standardContextual"/>
             </w:rPr>
           </w:pPr>
-          <w:hyperlink w:anchor="_Toc234848278" w:history="1">
+          <w:hyperlink w:anchor="_Toc234849110" w:history="1">
             <w:r>
               <w:rPr>
                 <w:rStyle w:val="Hyperlink"/>
@@ -11908,7 +11908,7 @@
                 <w:noProof/>
                 <w:webHidden/>
               </w:rPr>
-              <w:instrText xml:space="preserve"> PAGEREF _Toc234848278 \h </w:instrText>
+              <w:instrText xml:space="preserve"> PAGEREF _Toc234849110 \h </w:instrText>
             </w:r>
             <w:r>
               <w:rPr>
@@ -11954,7 +11954,7 @@
               <w14:ligatures w14:val="standardContextual"/>
             </w:rPr>
           </w:pPr>
-          <w:hyperlink w:anchor="_Toc234848279" w:history="1">
+          <w:hyperlink w:anchor="_Toc234849111" w:history="1">
             <w:r>
               <w:rPr>
                 <w:rStyle w:val="Hyperlink"/>
@@ -11998,7 +11998,7 @@
                 <w:noProof/>
                 <w:webHidden/>
               </w:rPr>
-              <w:instrText xml:space="preserve"> PAGEREF _Toc234848279 \h </w:instrText>
+              <w:instrText xml:space="preserve"> PAGEREF _Toc234849111 \h </w:instrText>
             </w:r>
             <w:r>
               <w:rPr>
@@ -12044,7 +12044,7 @@
               <w14:ligatures w14:val="standardContextual"/>
             </w:rPr>
           </w:pPr>
-          <w:hyperlink w:anchor="_Toc234848280" w:history="1">
+          <w:hyperlink w:anchor="_Toc234849112" w:history="1">
             <w:r>
               <w:rPr>
                 <w:rStyle w:val="Hyperlink"/>
@@ -12088,7 +12088,7 @@
                 <w:noProof/>
                 <w:webHidden/>
               </w:rPr>
-              <w:instrText xml:space="preserve"> PAGEREF _Toc234848280 \h </w:instrText>
+              <w:instrText xml:space="preserve"> PAGEREF _Toc234849112 \h </w:instrText>
             </w:r>
             <w:r>
               <w:rPr>
@@ -12134,7 +12134,7 @@
               <w14:ligatures w14:val="standardContextual"/>
             </w:rPr>
           </w:pPr>
-          <w:hyperlink w:anchor="_Toc234848281" w:history="1">
+          <w:hyperlink w:anchor="_Toc234849113" w:history="1">
             <w:r>
               <w:rPr>
                 <w:rStyle w:val="Hyperlink"/>
@@ -12178,7 +12178,7 @@
                 <w:noProof/>
                 <w:webHidden/>
               </w:rPr>
-              <w:instrText xml:space="preserve"> PAGEREF _Toc234848281 \h </w:instrText>
+              <w:instrText xml:space="preserve"> PAGEREF _Toc234849113 \h </w:instrText>
             </w:r>
             <w:r>
               <w:rPr>
@@ -12224,7 +12224,7 @@
               <w14:ligatures w14:val="standardContextual"/>
             </w:rPr>
           </w:pPr>
-          <w:hyperlink w:anchor="_Toc234848282" w:history="1">
+          <w:hyperlink w:anchor="_Toc234849114" w:history="1">
             <w:r>
               <w:rPr>
                 <w:rStyle w:val="Hyperlink"/>
@@ -12268,7 +12268,7 @@
                 <w:noProof/>
                 <w:webHidden/>
               </w:rPr>
-              <w:instrText xml:space="preserve"> PAGEREF _Toc234848282 \h </w:instrText>
+              <w:instrText xml:space="preserve"> PAGEREF _Toc234849114 \h </w:instrText>
             </w:r>
             <w:r>
               <w:rPr>
@@ -12314,7 +12314,7 @@
               <w14:ligatures w14:val="standardContextual"/>
             </w:rPr>
           </w:pPr>
-          <w:hyperlink w:anchor="_Toc234848283" w:history="1">
+          <w:hyperlink w:anchor="_Toc234849115" w:history="1">
             <w:r>
               <w:rPr>
                 <w:rStyle w:val="Hyperlink"/>
@@ -12358,7 +12358,7 @@
                 <w:noProof/>
                 <w:webHidden/>
               </w:rPr>
-              <w:instrText xml:space="preserve"> PAGEREF _Toc234848283 \h </w:instrText>
+              <w:instrText xml:space="preserve"> PAGEREF _Toc234849115 \h </w:instrText>
             </w:r>
             <w:r>
               <w:rPr>
@@ -12404,7 +12404,7 @@
               <w14:ligatures w14:val="standardContextual"/>
             </w:rPr>
           </w:pPr>
-          <w:hyperlink w:anchor="_Toc234848284" w:history="1">
+          <w:hyperlink w:anchor="_Toc234849116" w:history="1">
             <w:r>
               <w:rPr>
                 <w:rStyle w:val="Hyperlink"/>
@@ -12448,7 +12448,7 @@
                 <w:noProof/>
                 <w:webHidden/>
               </w:rPr>
-              <w:instrText xml:space="preserve"> PAGEREF _Toc234848284 \h </w:instrText>
+              <w:instrText xml:space="preserve"> PAGEREF _Toc234849116 \h </w:instrText>
             </w:r>
             <w:r>
               <w:rPr>
@@ -12494,7 +12494,7 @@
               <w14:ligatures w14:val="standardContextual"/>
             </w:rPr>
           </w:pPr>
-          <w:hyperlink w:anchor="_Toc234848285" w:history="1">
+          <w:hyperlink w:anchor="_Toc234849117" w:history="1">
             <w:r>
               <w:rPr>
                 <w:rStyle w:val="Hyperlink"/>
@@ -12538,7 +12538,7 @@
                 <w:noProof/>
                 <w:webHidden/>
               </w:rPr>
-              <w:instrText xml:space="preserve"> PAGEREF _Toc234848285 \h </w:instrText>
+              <w:instrText xml:space="preserve"> PAGEREF _Toc234849117 \h </w:instrText>
             </w:r>
             <w:r>
               <w:rPr>
@@ -12581,7 +12581,7 @@
         <w:pStyle w:val="Heading1"/>
       </w:pPr>
       <w:bookmarkStart w:id="0" w:name="introduction"/>
-      <w:bookmarkStart w:id="1" w:name="_Toc234848147"/>
+      <w:bookmarkStart w:id="1" w:name="_Toc234848979"/>
       <w:r>
         <w:rPr>
           <w:rStyle w:val="SectionNumber"/>
@@ -12599,7 +12599,7 @@
         <w:pStyle w:val="Heading2"/>
       </w:pPr>
       <w:bookmarkStart w:id="2" w:name="what-classbuilder-is"/>
-      <w:bookmarkStart w:id="3" w:name="_Toc234848148"/>
+      <w:bookmarkStart w:id="3" w:name="_Toc234848980"/>
       <w:r>
         <w:rPr>
           <w:rStyle w:val="SectionNumber"/>
@@ -12934,7 +12934,7 @@
         <w:pStyle w:val="Heading2"/>
       </w:pPr>
       <w:bookmarkStart w:id="4" w:name="the-pieces"/>
-      <w:bookmarkStart w:id="5" w:name="_Toc234848149"/>
+      <w:bookmarkStart w:id="5" w:name="_Toc234848981"/>
       <w:bookmarkEnd w:id="2"/>
       <w:r>
         <w:rPr>
@@ -13175,7 +13175,7 @@
         <w:pStyle w:val="Heading2"/>
       </w:pPr>
       <w:bookmarkStart w:id="6" w:name="about-this-manual"/>
-      <w:bookmarkStart w:id="7" w:name="_Toc234848150"/>
+      <w:bookmarkStart w:id="7" w:name="_Toc234848982"/>
       <w:bookmarkEnd w:id="4"/>
       <w:r>
         <w:rPr>
@@ -13266,7 +13266,7 @@
         <w:pStyle w:val="Heading2"/>
       </w:pPr>
       <w:bookmarkStart w:id="8" w:name="notation-keyboard-shortcuts-per-platform"/>
-      <w:bookmarkStart w:id="9" w:name="_Toc234848151"/>
+      <w:bookmarkStart w:id="9" w:name="_Toc234848983"/>
       <w:bookmarkEnd w:id="6"/>
       <w:r>
         <w:rPr>
@@ -13746,7 +13746,7 @@
         <w:pStyle w:val="Heading1"/>
       </w:pPr>
       <w:bookmarkStart w:id="10" w:name="concepts-and-terminology"/>
-      <w:bookmarkStart w:id="11" w:name="_Toc234848152"/>
+      <w:bookmarkStart w:id="11" w:name="_Toc234848984"/>
       <w:bookmarkEnd w:id="0"/>
       <w:bookmarkEnd w:id="8"/>
       <w:r>
@@ -13766,7 +13766,7 @@
         <w:pStyle w:val="Heading2"/>
       </w:pPr>
       <w:bookmarkStart w:id="12" w:name="the-model"/>
-      <w:bookmarkStart w:id="13" w:name="_Toc234848153"/>
+      <w:bookmarkStart w:id="13" w:name="_Toc234848985"/>
       <w:r>
         <w:rPr>
           <w:rStyle w:val="SectionNumber"/>
@@ -14097,7 +14097,7 @@
         <w:pStyle w:val="Heading2"/>
       </w:pPr>
       <w:bookmarkStart w:id="14" w:name="class-features"/>
-      <w:bookmarkStart w:id="15" w:name="_Toc234848154"/>
+      <w:bookmarkStart w:id="15" w:name="_Toc234848986"/>
       <w:bookmarkEnd w:id="12"/>
       <w:r>
         <w:rPr>
@@ -14323,7 +14323,7 @@
         <w:pStyle w:val="Heading2"/>
       </w:pPr>
       <w:bookmarkStart w:id="16" w:name="phases"/>
-      <w:bookmarkStart w:id="17" w:name="_Toc234848155"/>
+      <w:bookmarkStart w:id="17" w:name="_Toc234848987"/>
       <w:bookmarkEnd w:id="14"/>
       <w:r>
         <w:rPr>
@@ -14370,7 +14370,7 @@
         <w:pStyle w:val="Heading2"/>
       </w:pPr>
       <w:bookmarkStart w:id="18" w:name="generated-vs.-user-code"/>
-      <w:bookmarkStart w:id="19" w:name="_Toc234848156"/>
+      <w:bookmarkStart w:id="19" w:name="_Toc234848988"/>
       <w:bookmarkEnd w:id="16"/>
       <w:r>
         <w:rPr>
@@ -14494,7 +14494,7 @@
         <w:pStyle w:val="Heading1"/>
       </w:pPr>
       <w:bookmarkStart w:id="20" w:name="installation-and-project-files"/>
-      <w:bookmarkStart w:id="21" w:name="_Toc234848157"/>
+      <w:bookmarkStart w:id="21" w:name="_Toc234848989"/>
       <w:bookmarkEnd w:id="10"/>
       <w:bookmarkEnd w:id="18"/>
       <w:r>
@@ -14514,7 +14514,7 @@
         <w:pStyle w:val="Heading2"/>
       </w:pPr>
       <w:bookmarkStart w:id="22" w:name="the-application"/>
-      <w:bookmarkStart w:id="23" w:name="_Toc234848158"/>
+      <w:bookmarkStart w:id="23" w:name="_Toc234848990"/>
       <w:r>
         <w:rPr>
           <w:rStyle w:val="SectionNumber"/>
@@ -14555,7 +14555,7 @@
         <w:pStyle w:val="Heading2"/>
       </w:pPr>
       <w:bookmarkStart w:id="24" w:name="X3666ad84e793a543abb57792ece33f71c988788"/>
-      <w:bookmarkStart w:id="25" w:name="_Toc234848159"/>
+      <w:bookmarkStart w:id="25" w:name="_Toc234848991"/>
       <w:bookmarkEnd w:id="22"/>
       <w:r>
         <w:rPr>
@@ -14927,7 +14927,7 @@
         <w:pStyle w:val="Heading2"/>
       </w:pPr>
       <w:bookmarkStart w:id="26" w:name="stdafx.h-the-one-file-you-write"/>
-      <w:bookmarkStart w:id="27" w:name="_Toc234848160"/>
+      <w:bookmarkStart w:id="27" w:name="_Toc234848992"/>
       <w:bookmarkEnd w:id="24"/>
       <w:r>
         <w:rPr>
@@ -15201,7 +15201,7 @@
         <w:pStyle w:val="Heading2"/>
       </w:pPr>
       <w:bookmarkStart w:id="28" w:name="output-locations"/>
-      <w:bookmarkStart w:id="29" w:name="_Toc234848161"/>
+      <w:bookmarkStart w:id="29" w:name="_Toc234848993"/>
       <w:bookmarkEnd w:id="26"/>
       <w:r>
         <w:rPr>
@@ -15274,7 +15274,7 @@
         <w:pStyle w:val="Heading1"/>
       </w:pPr>
       <w:bookmarkStart w:id="30" w:name="quick-start-the-matrix-model"/>
-      <w:bookmarkStart w:id="31" w:name="_Toc234848162"/>
+      <w:bookmarkStart w:id="31" w:name="_Toc234848994"/>
       <w:bookmarkEnd w:id="20"/>
       <w:bookmarkEnd w:id="28"/>
       <w:r>
@@ -15389,7 +15389,7 @@
           <w:noProof/>
         </w:rPr>
         <w:drawing>
-          <wp:inline distT="0" distB="0" distL="0" distR="0" wp14:anchorId="78987C88" wp14:editId="0CEE6B5D">
+          <wp:inline distT="0" distB="0" distL="0" distR="0" wp14:anchorId="639BE9DC" wp14:editId="6F678C43">
             <wp:extent cx="5334000" cy="4712710"/>
             <wp:effectExtent l="0" t="0" r="0" b="0"/>
             <wp:docPr id="36" name="Picture" descr="The ClassBuilder shell with the Matrix model open: menu bar, toolbar, and the model tree (diagrams, classes, members, methods, relation methods)."/>
@@ -15444,7 +15444,7 @@
         <w:pStyle w:val="Heading2"/>
       </w:pPr>
       <w:bookmarkStart w:id="32" w:name="step-1-create-the-model"/>
-      <w:bookmarkStart w:id="33" w:name="_Toc234848163"/>
+      <w:bookmarkStart w:id="33" w:name="_Toc234848995"/>
       <w:r>
         <w:rPr>
           <w:rStyle w:val="SectionNumber"/>
@@ -15480,7 +15480,7 @@
           <w:noProof/>
         </w:rPr>
         <w:drawing>
-          <wp:inline distT="0" distB="0" distL="0" distR="0" wp14:anchorId="31998F4D" wp14:editId="6B1B3F82">
+          <wp:inline distT="0" distB="0" distL="0" distR="0" wp14:anchorId="727CE364" wp14:editId="3C2C79AD">
             <wp:extent cx="5334000" cy="4578112"/>
             <wp:effectExtent l="0" t="0" r="0" b="0"/>
             <wp:docPr id="39" name="Picture" descr="Creating a serialize-enabled model: DataModel name “Matrix”, master include file “MatrixInclude.h”, document class “Matrix”. The master include cannot be named Matrix.h — the Matrix class itself generates that file. Tick Serialize here: it is a one-off choice, made at creation — in the Project ▸ Settings dialog of an existing model the checkbox shows locked."/>
@@ -15639,7 +15639,7 @@
         <w:pStyle w:val="Heading2"/>
       </w:pPr>
       <w:bookmarkStart w:id="34" w:name="step-2-add-the-classes"/>
-      <w:bookmarkStart w:id="35" w:name="_Toc234848164"/>
+      <w:bookmarkStart w:id="35" w:name="_Toc234848996"/>
       <w:bookmarkEnd w:id="32"/>
       <w:r>
         <w:rPr>
@@ -15724,7 +15724,7 @@
           <w:noProof/>
         </w:rPr>
         <w:drawing>
-          <wp:inline distT="0" distB="0" distL="0" distR="0" wp14:anchorId="0F604375" wp14:editId="7B08A243">
+          <wp:inline distT="0" distB="0" distL="0" distR="0" wp14:anchorId="1144AF8D" wp14:editId="130F7590">
             <wp:extent cx="4993049" cy="4495445"/>
             <wp:effectExtent l="0" t="0" r="0" b="0"/>
             <wp:docPr id="43" name="Picture" descr="The Class dialog. With Serialize ticked, the class inherits the model’s document-object root automatically."/>
@@ -15779,7 +15779,7 @@
         <w:pStyle w:val="Heading2"/>
       </w:pPr>
       <w:bookmarkStart w:id="36" w:name="step-3-add-members"/>
-      <w:bookmarkStart w:id="37" w:name="_Toc234848165"/>
+      <w:bookmarkStart w:id="37" w:name="_Toc234848997"/>
       <w:bookmarkEnd w:id="34"/>
       <w:r>
         <w:rPr>
@@ -15997,7 +15997,7 @@
           <w:noProof/>
         </w:rPr>
         <w:drawing>
-          <wp:inline distT="0" distB="0" distL="0" distR="0" wp14:anchorId="1545DE7A" wp14:editId="3474A4CB">
+          <wp:inline distT="0" distB="0" distL="0" distR="0" wp14:anchorId="531DD7C6" wp14:editId="3AEBA531">
             <wp:extent cx="5334000" cy="6093588"/>
             <wp:effectExtent l="0" t="0" r="0" b="0"/>
             <wp:docPr id="47" name="Picture" descr="The Member dialog. Getter/setter generation and the serialize flag are per-member choices."/>
@@ -16052,7 +16052,7 @@
         <w:pStyle w:val="Heading2"/>
       </w:pPr>
       <w:bookmarkStart w:id="38" w:name="step-4-add-the-relations"/>
-      <w:bookmarkStart w:id="39" w:name="_Toc234848166"/>
+      <w:bookmarkStart w:id="39" w:name="_Toc234848998"/>
       <w:bookmarkEnd w:id="36"/>
       <w:r>
         <w:rPr>
@@ -16402,7 +16402,7 @@
           <w:noProof/>
         </w:rPr>
         <w:drawing>
-          <wp:inline distT="0" distB="0" distL="0" distR="0" wp14:anchorId="79E2DB9B" wp14:editId="0F0FBDAD">
+          <wp:inline distT="0" distB="0" distL="0" distR="0" wp14:anchorId="7D2D0F9B" wp14:editId="44BCA019">
             <wp:extent cx="5184435" cy="5069603"/>
             <wp:effectExtent l="0" t="0" r="0" b="0"/>
             <wp:docPr id="51" name="Picture" descr="A relation: kind, ownership, thread-safety, and container implementation are all declared here — the code is generated."/>
@@ -16457,7 +16457,7 @@
         <w:pStyle w:val="Heading2"/>
       </w:pPr>
       <w:bookmarkStart w:id="40" w:name="X267736c760e32dc6d865ac46fc2c6b29b8f25a5"/>
-      <w:bookmarkStart w:id="41" w:name="_Toc234848167"/>
+      <w:bookmarkStart w:id="41" w:name="_Toc234848999"/>
       <w:bookmarkEnd w:id="38"/>
       <w:r>
         <w:rPr>
@@ -17210,7 +17210,7 @@
         <w:pStyle w:val="Heading2"/>
       </w:pPr>
       <w:bookmarkStart w:id="42" w:name="step-6-a-find-method"/>
-      <w:bookmarkStart w:id="43" w:name="_Toc234848168"/>
+      <w:bookmarkStart w:id="43" w:name="_Toc234849000"/>
       <w:bookmarkEnd w:id="40"/>
       <w:r>
         <w:rPr>
@@ -17278,7 +17278,7 @@
           <w:noProof/>
         </w:rPr>
         <w:drawing>
-          <wp:inline distT="0" distB="0" distL="0" distR="0" wp14:anchorId="69EC4CC5" wp14:editId="294A00E0">
+          <wp:inline distT="0" distB="0" distL="0" distR="0" wp14:anchorId="1356C36A" wp14:editId="0293754E">
             <wp:extent cx="5334000" cy="3242844"/>
             <wp:effectExtent l="0" t="0" r="0" b="0"/>
             <wp:docPr id="56" name="Picture" descr="The Find Method dialog on the Matrix→Row relation: the argument map pairs the method’s arguments with the members to compare — here -&gt;GetId(). In the tree behind it, the generated method appears as a child of the Row relation item, as a sibling above its Relation methods folder."/>
@@ -17701,7 +17701,7 @@
         <w:pStyle w:val="Heading2"/>
       </w:pPr>
       <w:bookmarkStart w:id="44" w:name="step-7-a-class-diagram"/>
-      <w:bookmarkStart w:id="45" w:name="_Toc234848169"/>
+      <w:bookmarkStart w:id="45" w:name="_Toc234849001"/>
       <w:bookmarkEnd w:id="42"/>
       <w:r>
         <w:rPr>
@@ -17771,7 +17771,7 @@
           <w:noProof/>
         </w:rPr>
         <w:drawing>
-          <wp:inline distT="0" distB="0" distL="0" distR="0" wp14:anchorId="17106D04" wp14:editId="6C32EB8C">
+          <wp:inline distT="0" distB="0" distL="0" distR="0" wp14:anchorId="6E07E2DC" wp14:editId="3F971499">
             <wp:extent cx="5334000" cy="3170559"/>
             <wp:effectExtent l="0" t="0" r="0" b="0"/>
             <wp:docPr id="60" name="Picture" descr="The Matrix Overview class diagram as exported by ClassBuilder (Export SVG). Diamonds mark owned (aggregation) relations; 1/* are the multiplicities."/>
@@ -17839,7 +17839,7 @@
           <w:noProof/>
         </w:rPr>
         <w:drawing>
-          <wp:inline distT="0" distB="0" distL="0" distR="0" wp14:anchorId="7883436E" wp14:editId="5EBED09D">
+          <wp:inline distT="0" distB="0" distL="0" distR="0" wp14:anchorId="21FE1A1C" wp14:editId="2C3C668F">
             <wp:extent cx="5334000" cy="3757996"/>
             <wp:effectExtent l="0" t="0" r="0" b="0"/>
             <wp:docPr id="64" name="Picture" descr="A diagram view opens floating over the shell — this is the initial state of every diagram view."/>
@@ -17908,7 +17908,7 @@
           <w:noProof/>
         </w:rPr>
         <w:drawing>
-          <wp:inline distT="0" distB="0" distL="0" distR="0" wp14:anchorId="59560867" wp14:editId="548D2A70">
+          <wp:inline distT="0" distB="0" distL="0" distR="0" wp14:anchorId="2437533E" wp14:editId="79813C73">
             <wp:extent cx="5334000" cy="4302439"/>
             <wp:effectExtent l="0" t="0" r="0" b="0"/>
             <wp:docPr id="67" name="Picture" descr="The same view docked: drag it onto an edge of the main window — here the right edge, giving the usual tree-beside-diagram split; the top and bottom edges split horizontally the same way."/>
@@ -17977,7 +17977,7 @@
           <w:noProof/>
         </w:rPr>
         <w:drawing>
-          <wp:inline distT="0" distB="0" distL="0" distR="0" wp14:anchorId="46A1EE6B" wp14:editId="4D444FA5">
+          <wp:inline distT="0" distB="0" distL="0" distR="0" wp14:anchorId="6DF8FA31" wp14:editId="03A311BB">
             <wp:extent cx="5334000" cy="4302439"/>
             <wp:effectExtent l="0" t="0" r="0" b="0"/>
             <wp:docPr id="70" name="Picture" descr="Or tabbed: drop it onto the tree’s tab bar and the views share the full window, one tab each."/>
@@ -18042,7 +18042,7 @@
         <w:pStyle w:val="Heading2"/>
       </w:pPr>
       <w:bookmarkStart w:id="46" w:name="step-8-generate-the-source"/>
-      <w:bookmarkStart w:id="47" w:name="_Toc234848170"/>
+      <w:bookmarkStart w:id="47" w:name="_Toc234849002"/>
       <w:bookmarkEnd w:id="44"/>
       <w:r>
         <w:rPr>
@@ -19115,7 +19115,7 @@
         <w:pStyle w:val="Heading2"/>
       </w:pPr>
       <w:bookmarkStart w:id="48" w:name="step-9-compile-and-run"/>
-      <w:bookmarkStart w:id="49" w:name="_Toc234848171"/>
+      <w:bookmarkStart w:id="49" w:name="_Toc234849003"/>
       <w:bookmarkEnd w:id="46"/>
       <w:r>
         <w:rPr>
@@ -20634,7 +20634,7 @@
         <w:pStyle w:val="Heading2"/>
       </w:pPr>
       <w:bookmarkStart w:id="50" w:name="step-10-the-round-trip"/>
-      <w:bookmarkStart w:id="51" w:name="_Toc234848172"/>
+      <w:bookmarkStart w:id="51" w:name="_Toc234849004"/>
       <w:bookmarkEnd w:id="48"/>
       <w:r>
         <w:rPr>
@@ -20699,7 +20699,7 @@
         <w:pStyle w:val="Heading1"/>
       </w:pPr>
       <w:bookmarkStart w:id="52" w:name="reference-the-application-shell"/>
-      <w:bookmarkStart w:id="53" w:name="_Toc234848173"/>
+      <w:bookmarkStart w:id="53" w:name="_Toc234849005"/>
       <w:bookmarkEnd w:id="30"/>
       <w:bookmarkEnd w:id="50"/>
       <w:r>
@@ -20719,7 +20719,7 @@
         <w:pStyle w:val="Heading2"/>
       </w:pPr>
       <w:bookmarkStart w:id="54" w:name="menus"/>
-      <w:bookmarkStart w:id="55" w:name="_Toc234848174"/>
+      <w:bookmarkStart w:id="55" w:name="_Toc234849006"/>
       <w:r>
         <w:rPr>
           <w:rStyle w:val="SectionNumber"/>
@@ -21055,7 +21055,7 @@
         <w:pStyle w:val="Heading2"/>
       </w:pPr>
       <w:bookmarkStart w:id="56" w:name="the-main-toolbar"/>
-      <w:bookmarkStart w:id="57" w:name="_Toc234848175"/>
+      <w:bookmarkStart w:id="57" w:name="_Toc234849007"/>
       <w:bookmarkEnd w:id="54"/>
       <w:r>
         <w:rPr>
@@ -21378,7 +21378,7 @@
           <w:noProof/>
         </w:rPr>
         <w:drawing>
-          <wp:inline distT="0" distB="0" distL="0" distR="0" wp14:anchorId="50B03F70" wp14:editId="147E8501">
+          <wp:inline distT="0" distB="0" distL="0" distR="0" wp14:anchorId="21EBE404" wp14:editId="71971FF4">
             <wp:extent cx="5307773" cy="497603"/>
             <wp:effectExtent l="0" t="0" r="0" b="0"/>
             <wp:docPr id="79" name="Picture" descr="The main toolbar: New, Open, Save, then Read Source and Write Source."/>
@@ -21433,7 +21433,7 @@
         <w:pStyle w:val="Heading2"/>
       </w:pPr>
       <w:bookmarkStart w:id="58" w:name="docking"/>
-      <w:bookmarkStart w:id="59" w:name="_Toc234848176"/>
+      <w:bookmarkStart w:id="59" w:name="_Toc234849008"/>
       <w:bookmarkEnd w:id="56"/>
       <w:r>
         <w:rPr>
@@ -21581,7 +21581,7 @@
         <w:pStyle w:val="Heading2"/>
       </w:pPr>
       <w:bookmarkStart w:id="60" w:name="platforms-and-keys"/>
-      <w:bookmarkStart w:id="61" w:name="_Toc234848177"/>
+      <w:bookmarkStart w:id="61" w:name="_Toc234849009"/>
       <w:bookmarkEnd w:id="58"/>
       <w:r>
         <w:rPr>
@@ -21715,7 +21715,7 @@
         <w:pStyle w:val="Heading1"/>
       </w:pPr>
       <w:bookmarkStart w:id="62" w:name="reference-the-main-tree-view"/>
-      <w:bookmarkStart w:id="63" w:name="_Toc234848178"/>
+      <w:bookmarkStart w:id="63" w:name="_Toc234849010"/>
       <w:bookmarkEnd w:id="52"/>
       <w:bookmarkEnd w:id="60"/>
       <w:r>
@@ -21743,7 +21743,7 @@
         <w:pStyle w:val="Heading2"/>
       </w:pPr>
       <w:bookmarkStart w:id="64" w:name="what-the-tree-shows"/>
-      <w:bookmarkStart w:id="65" w:name="_Toc234848179"/>
+      <w:bookmarkStart w:id="65" w:name="_Toc234849011"/>
       <w:r>
         <w:rPr>
           <w:rStyle w:val="SectionNumber"/>
@@ -21809,7 +21809,7 @@
         <w:pStyle w:val="Heading2"/>
       </w:pPr>
       <w:bookmarkStart w:id="66" w:name="the-tree-toolbar"/>
-      <w:bookmarkStart w:id="67" w:name="_Toc234848180"/>
+      <w:bookmarkStart w:id="67" w:name="_Toc234849012"/>
       <w:bookmarkEnd w:id="64"/>
       <w:r>
         <w:rPr>
@@ -22740,7 +22740,7 @@
           <w:noProof/>
         </w:rPr>
         <w:drawing>
-          <wp:inline distT="0" distB="0" distL="0" distR="0" wp14:anchorId="54C13E9F" wp14:editId="148C29A3">
+          <wp:inline distT="0" distB="0" distL="0" distR="0" wp14:anchorId="4DB1BDD0" wp14:editId="36CBBD3D">
             <wp:extent cx="5334000" cy="307193"/>
             <wp:effectExtent l="0" t="0" r="0" b="0"/>
             <wp:docPr id="87" name="Picture" descr="The tree toolbar, in the order of the table above: the Add buttons, then Delete, Filters, Find/Next, and the per-view Undo/Redo."/>
@@ -22795,7 +22795,7 @@
         <w:pStyle w:val="Heading2"/>
       </w:pPr>
       <w:bookmarkStart w:id="68" w:name="the-element-icons"/>
-      <w:bookmarkStart w:id="69" w:name="_Toc234848181"/>
+      <w:bookmarkStart w:id="69" w:name="_Toc234849013"/>
       <w:bookmarkEnd w:id="66"/>
       <w:r>
         <w:rPr>
@@ -22922,7 +22922,7 @@
                 <w:noProof/>
               </w:rPr>
               <w:drawing>
-                <wp:inline distT="0" distB="0" distL="0" distR="0" wp14:anchorId="60261DD1" wp14:editId="3152BF55">
+                <wp:inline distT="0" distB="0" distL="0" distR="0" wp14:anchorId="41279D7C" wp14:editId="27D16D19">
                   <wp:extent cx="152400" cy="152400"/>
                   <wp:effectExtent l="0" t="0" r="0" b="0"/>
                   <wp:docPr id="91" name="Picture"/>
@@ -23000,7 +23000,7 @@
                 <w:noProof/>
               </w:rPr>
               <w:drawing>
-                <wp:inline distT="0" distB="0" distL="0" distR="0" wp14:anchorId="4E82E2A4" wp14:editId="0E3D815A">
+                <wp:inline distT="0" distB="0" distL="0" distR="0" wp14:anchorId="285323C3" wp14:editId="188FB4DA">
                   <wp:extent cx="152400" cy="152400"/>
                   <wp:effectExtent l="0" t="0" r="0" b="0"/>
                   <wp:docPr id="94" name="Picture"/>
@@ -23080,7 +23080,7 @@
                 <w:noProof/>
               </w:rPr>
               <w:drawing>
-                <wp:inline distT="0" distB="0" distL="0" distR="0" wp14:anchorId="68981004" wp14:editId="2CAB5DBE">
+                <wp:inline distT="0" distB="0" distL="0" distR="0" wp14:anchorId="5C19CDD5" wp14:editId="64FA5EE2">
                   <wp:extent cx="152400" cy="152400"/>
                   <wp:effectExtent l="0" t="0" r="0" b="0"/>
                   <wp:docPr id="97" name="Picture"/>
@@ -23158,7 +23158,7 @@
                 <w:noProof/>
               </w:rPr>
               <w:drawing>
-                <wp:inline distT="0" distB="0" distL="0" distR="0" wp14:anchorId="45381844" wp14:editId="1407C52B">
+                <wp:inline distT="0" distB="0" distL="0" distR="0" wp14:anchorId="741703A0" wp14:editId="31F3172C">
                   <wp:extent cx="152400" cy="152400"/>
                   <wp:effectExtent l="0" t="0" r="0" b="0"/>
                   <wp:docPr id="100" name="Picture"/>
@@ -23238,7 +23238,7 @@
                 <w:noProof/>
               </w:rPr>
               <w:drawing>
-                <wp:inline distT="0" distB="0" distL="0" distR="0" wp14:anchorId="0923BBA5" wp14:editId="3AE2652F">
+                <wp:inline distT="0" distB="0" distL="0" distR="0" wp14:anchorId="55CCCB2D" wp14:editId="2C9B4F2C">
                   <wp:extent cx="152400" cy="152400"/>
                   <wp:effectExtent l="0" t="0" r="0" b="0"/>
                   <wp:docPr id="103" name="Picture"/>
@@ -23316,7 +23316,7 @@
                 <w:noProof/>
               </w:rPr>
               <w:drawing>
-                <wp:inline distT="0" distB="0" distL="0" distR="0" wp14:anchorId="1A50976A" wp14:editId="20CD8118">
+                <wp:inline distT="0" distB="0" distL="0" distR="0" wp14:anchorId="5D390BF2" wp14:editId="708C2F42">
                   <wp:extent cx="152400" cy="152400"/>
                   <wp:effectExtent l="0" t="0" r="0" b="0"/>
                   <wp:docPr id="106" name="Picture"/>
@@ -23396,7 +23396,7 @@
                 <w:noProof/>
               </w:rPr>
               <w:drawing>
-                <wp:inline distT="0" distB="0" distL="0" distR="0" wp14:anchorId="06DE496B" wp14:editId="18B33D3A">
+                <wp:inline distT="0" distB="0" distL="0" distR="0" wp14:anchorId="4CFDE9D7" wp14:editId="4400C87A">
                   <wp:extent cx="152400" cy="152400"/>
                   <wp:effectExtent l="0" t="0" r="0" b="0"/>
                   <wp:docPr id="109" name="Picture"/>
@@ -23474,7 +23474,7 @@
                 <w:noProof/>
               </w:rPr>
               <w:drawing>
-                <wp:inline distT="0" distB="0" distL="0" distR="0" wp14:anchorId="2F40AC1E" wp14:editId="5F17D0C4">
+                <wp:inline distT="0" distB="0" distL="0" distR="0" wp14:anchorId="6D17D552" wp14:editId="465FA54C">
                   <wp:extent cx="152400" cy="152400"/>
                   <wp:effectExtent l="0" t="0" r="0" b="0"/>
                   <wp:docPr id="112" name="Picture"/>
@@ -23554,7 +23554,7 @@
                 <w:noProof/>
               </w:rPr>
               <w:drawing>
-                <wp:inline distT="0" distB="0" distL="0" distR="0" wp14:anchorId="2FB0CF30" wp14:editId="2D093211">
+                <wp:inline distT="0" distB="0" distL="0" distR="0" wp14:anchorId="5E552DD9" wp14:editId="04CCC47D">
                   <wp:extent cx="152400" cy="152400"/>
                   <wp:effectExtent l="0" t="0" r="0" b="0"/>
                   <wp:docPr id="115" name="Picture"/>
@@ -23632,7 +23632,7 @@
                 <w:noProof/>
               </w:rPr>
               <w:drawing>
-                <wp:inline distT="0" distB="0" distL="0" distR="0" wp14:anchorId="54D2708B" wp14:editId="28347172">
+                <wp:inline distT="0" distB="0" distL="0" distR="0" wp14:anchorId="3E9A9D0B" wp14:editId="4C877A39">
                   <wp:extent cx="152400" cy="152400"/>
                   <wp:effectExtent l="0" t="0" r="0" b="0"/>
                   <wp:docPr id="118" name="Picture"/>
@@ -23711,7 +23711,7 @@
           <w:noProof/>
         </w:rPr>
         <w:drawing>
-          <wp:inline distT="0" distB="0" distL="0" distR="0" wp14:anchorId="7EF0D9EF" wp14:editId="78E59683">
+          <wp:inline distT="0" distB="0" distL="0" distR="0" wp14:anchorId="0468C4A3" wp14:editId="424C5238">
             <wp:extent cx="152400" cy="152400"/>
             <wp:effectExtent l="0" t="0" r="0" b="0"/>
             <wp:docPr id="121" name="Picture"/>
@@ -23769,7 +23769,7 @@
           <w:noProof/>
         </w:rPr>
         <w:drawing>
-          <wp:inline distT="0" distB="0" distL="0" distR="0" wp14:anchorId="1ACC26FD" wp14:editId="25007414">
+          <wp:inline distT="0" distB="0" distL="0" distR="0" wp14:anchorId="04FB003F" wp14:editId="2C451275">
             <wp:extent cx="152400" cy="152400"/>
             <wp:effectExtent l="0" t="0" r="0" b="0"/>
             <wp:docPr id="124" name="Picture"/>
@@ -23827,7 +23827,7 @@
           <w:noProof/>
         </w:rPr>
         <w:drawing>
-          <wp:inline distT="0" distB="0" distL="0" distR="0" wp14:anchorId="1D71F7A3" wp14:editId="3835EFEC">
+          <wp:inline distT="0" distB="0" distL="0" distR="0" wp14:anchorId="70E1D45D" wp14:editId="229CE707">
             <wp:extent cx="152400" cy="152400"/>
             <wp:effectExtent l="0" t="0" r="0" b="0"/>
             <wp:docPr id="126" name="Picture"/>
@@ -23936,7 +23936,7 @@
                 <w:noProof/>
               </w:rPr>
               <w:drawing>
-                <wp:inline distT="0" distB="0" distL="0" distR="0" wp14:anchorId="0842040F" wp14:editId="67A26653">
+                <wp:inline distT="0" distB="0" distL="0" distR="0" wp14:anchorId="7857B91A" wp14:editId="5865182D">
                   <wp:extent cx="152400" cy="152400"/>
                   <wp:effectExtent l="0" t="0" r="0" b="0"/>
                   <wp:docPr id="129" name="Picture"/>
@@ -24001,7 +24001,7 @@
                 <w:noProof/>
               </w:rPr>
               <w:drawing>
-                <wp:inline distT="0" distB="0" distL="0" distR="0" wp14:anchorId="5C3C64CD" wp14:editId="13F406D5">
+                <wp:inline distT="0" distB="0" distL="0" distR="0" wp14:anchorId="395D4865" wp14:editId="4AAF208F">
                   <wp:extent cx="152400" cy="152400"/>
                   <wp:effectExtent l="0" t="0" r="0" b="0"/>
                   <wp:docPr id="132" name="Picture"/>
@@ -24066,7 +24066,7 @@
                 <w:noProof/>
               </w:rPr>
               <w:drawing>
-                <wp:inline distT="0" distB="0" distL="0" distR="0" wp14:anchorId="13B6E49C" wp14:editId="6A6CF63B">
+                <wp:inline distT="0" distB="0" distL="0" distR="0" wp14:anchorId="3B80EDEF" wp14:editId="5C34B773">
                   <wp:extent cx="152400" cy="152400"/>
                   <wp:effectExtent l="0" t="0" r="0" b="0"/>
                   <wp:docPr id="135" name="Picture"/>
@@ -24131,7 +24131,7 @@
                 <w:noProof/>
               </w:rPr>
               <w:drawing>
-                <wp:inline distT="0" distB="0" distL="0" distR="0" wp14:anchorId="712F3329" wp14:editId="3ACAA428">
+                <wp:inline distT="0" distB="0" distL="0" distR="0" wp14:anchorId="6D6E9782" wp14:editId="46B7432C">
                   <wp:extent cx="152400" cy="152400"/>
                   <wp:effectExtent l="0" t="0" r="0" b="0"/>
                   <wp:docPr id="138" name="Picture"/>
@@ -24276,7 +24276,7 @@
                 <w:noProof/>
               </w:rPr>
               <w:drawing>
-                <wp:inline distT="0" distB="0" distL="0" distR="0" wp14:anchorId="0B085A8A" wp14:editId="5A8628F6">
+                <wp:inline distT="0" distB="0" distL="0" distR="0" wp14:anchorId="7F98CD04" wp14:editId="23FE1116">
                   <wp:extent cx="152400" cy="152400"/>
                   <wp:effectExtent l="0" t="0" r="0" b="0"/>
                   <wp:docPr id="140" name="Picture"/>
@@ -24341,7 +24341,7 @@
                 <w:noProof/>
               </w:rPr>
               <w:drawing>
-                <wp:inline distT="0" distB="0" distL="0" distR="0" wp14:anchorId="67DE547C" wp14:editId="575C0132">
+                <wp:inline distT="0" distB="0" distL="0" distR="0" wp14:anchorId="64E22B91" wp14:editId="53AE4AD1">
                   <wp:extent cx="152400" cy="152400"/>
                   <wp:effectExtent l="0" t="0" r="0" b="0"/>
                   <wp:docPr id="143" name="Picture"/>
@@ -24406,7 +24406,7 @@
                 <w:noProof/>
               </w:rPr>
               <w:drawing>
-                <wp:inline distT="0" distB="0" distL="0" distR="0" wp14:anchorId="7FA6C76F" wp14:editId="3C3DD939">
+                <wp:inline distT="0" distB="0" distL="0" distR="0" wp14:anchorId="60791867" wp14:editId="20AA1783">
                   <wp:extent cx="152400" cy="152400"/>
                   <wp:effectExtent l="0" t="0" r="0" b="0"/>
                   <wp:docPr id="146" name="Picture"/>
@@ -24539,7 +24539,7 @@
                 <w:noProof/>
               </w:rPr>
               <w:drawing>
-                <wp:inline distT="0" distB="0" distL="0" distR="0" wp14:anchorId="2BC328C4" wp14:editId="78FF9E7F">
+                <wp:inline distT="0" distB="0" distL="0" distR="0" wp14:anchorId="3854CC3D" wp14:editId="282C1D39">
                   <wp:extent cx="152400" cy="152400"/>
                   <wp:effectExtent l="0" t="0" r="0" b="0"/>
                   <wp:docPr id="148" name="Picture"/>
@@ -24604,7 +24604,7 @@
                 <w:noProof/>
               </w:rPr>
               <w:drawing>
-                <wp:inline distT="0" distB="0" distL="0" distR="0" wp14:anchorId="0170704B" wp14:editId="51908DFD">
+                <wp:inline distT="0" distB="0" distL="0" distR="0" wp14:anchorId="3F69DE1C" wp14:editId="5B7AC02C">
                   <wp:extent cx="152400" cy="152400"/>
                   <wp:effectExtent l="0" t="0" r="0" b="0"/>
                   <wp:docPr id="151" name="Picture"/>
@@ -24669,7 +24669,7 @@
                 <w:noProof/>
               </w:rPr>
               <w:drawing>
-                <wp:inline distT="0" distB="0" distL="0" distR="0" wp14:anchorId="31A40B36" wp14:editId="7D4EF5EC">
+                <wp:inline distT="0" distB="0" distL="0" distR="0" wp14:anchorId="0F2B3653" wp14:editId="07CFB592">
                   <wp:extent cx="152400" cy="152400"/>
                   <wp:effectExtent l="0" t="0" r="0" b="0"/>
                   <wp:docPr id="154" name="Picture"/>
@@ -24734,7 +24734,7 @@
                 <w:noProof/>
               </w:rPr>
               <w:drawing>
-                <wp:inline distT="0" distB="0" distL="0" distR="0" wp14:anchorId="593D60BC" wp14:editId="22B4EBD5">
+                <wp:inline distT="0" distB="0" distL="0" distR="0" wp14:anchorId="467543FB" wp14:editId="1BBDD8E4">
                   <wp:extent cx="152400" cy="152400"/>
                   <wp:effectExtent l="0" t="0" r="0" b="0"/>
                   <wp:docPr id="157" name="Picture"/>
@@ -24972,7 +24972,7 @@
                 <w:noProof/>
               </w:rPr>
               <w:drawing>
-                <wp:inline distT="0" distB="0" distL="0" distR="0" wp14:anchorId="11C81490" wp14:editId="43C9850B">
+                <wp:inline distT="0" distB="0" distL="0" distR="0" wp14:anchorId="5D365B19" wp14:editId="0951B7BC">
                   <wp:extent cx="152400" cy="152400"/>
                   <wp:effectExtent l="0" t="0" r="0" b="0"/>
                   <wp:docPr id="160" name="Picture"/>
@@ -25030,7 +25030,7 @@
                 <w:noProof/>
               </w:rPr>
               <w:drawing>
-                <wp:inline distT="0" distB="0" distL="0" distR="0" wp14:anchorId="2501E1B2" wp14:editId="543C3651">
+                <wp:inline distT="0" distB="0" distL="0" distR="0" wp14:anchorId="1F025F1F" wp14:editId="3907E81A">
                   <wp:extent cx="152400" cy="152400"/>
                   <wp:effectExtent l="0" t="0" r="0" b="0"/>
                   <wp:docPr id="163" name="Picture"/>
@@ -25095,7 +25095,7 @@
                 <w:noProof/>
               </w:rPr>
               <w:drawing>
-                <wp:inline distT="0" distB="0" distL="0" distR="0" wp14:anchorId="24FC944C" wp14:editId="08D1FD68">
+                <wp:inline distT="0" distB="0" distL="0" distR="0" wp14:anchorId="7F5FFDFD" wp14:editId="209FDD3B">
                   <wp:extent cx="152400" cy="152400"/>
                   <wp:effectExtent l="0" t="0" r="0" b="0"/>
                   <wp:docPr id="166" name="Picture"/>
@@ -25153,7 +25153,7 @@
                 <w:noProof/>
               </w:rPr>
               <w:drawing>
-                <wp:inline distT="0" distB="0" distL="0" distR="0" wp14:anchorId="7AF3316E" wp14:editId="5EBC4112">
+                <wp:inline distT="0" distB="0" distL="0" distR="0" wp14:anchorId="2FF6DFE6" wp14:editId="2CF84EA0">
                   <wp:extent cx="152400" cy="152400"/>
                   <wp:effectExtent l="0" t="0" r="0" b="0"/>
                   <wp:docPr id="169" name="Picture"/>
@@ -25218,7 +25218,7 @@
                 <w:noProof/>
               </w:rPr>
               <w:drawing>
-                <wp:inline distT="0" distB="0" distL="0" distR="0" wp14:anchorId="77192FF8" wp14:editId="1C523488">
+                <wp:inline distT="0" distB="0" distL="0" distR="0" wp14:anchorId="4CED2252" wp14:editId="404A8798">
                   <wp:extent cx="152400" cy="152400"/>
                   <wp:effectExtent l="0" t="0" r="0" b="0"/>
                   <wp:docPr id="172" name="Picture"/>
@@ -25276,7 +25276,7 @@
                 <w:noProof/>
               </w:rPr>
               <w:drawing>
-                <wp:inline distT="0" distB="0" distL="0" distR="0" wp14:anchorId="18B60D91" wp14:editId="1B332415">
+                <wp:inline distT="0" distB="0" distL="0" distR="0" wp14:anchorId="0640A9F7" wp14:editId="79C510BD">
                   <wp:extent cx="152400" cy="152400"/>
                   <wp:effectExtent l="0" t="0" r="0" b="0"/>
                   <wp:docPr id="175" name="Picture"/>
@@ -25341,7 +25341,7 @@
                 <w:noProof/>
               </w:rPr>
               <w:drawing>
-                <wp:inline distT="0" distB="0" distL="0" distR="0" wp14:anchorId="13FBFA25" wp14:editId="44B81FFA">
+                <wp:inline distT="0" distB="0" distL="0" distR="0" wp14:anchorId="182022B7" wp14:editId="23E08A4B">
                   <wp:extent cx="152400" cy="152400"/>
                   <wp:effectExtent l="0" t="0" r="0" b="0"/>
                   <wp:docPr id="178" name="Picture"/>
@@ -25399,7 +25399,7 @@
                 <w:noProof/>
               </w:rPr>
               <w:drawing>
-                <wp:inline distT="0" distB="0" distL="0" distR="0" wp14:anchorId="66AF9F0C" wp14:editId="7A757868">
+                <wp:inline distT="0" distB="0" distL="0" distR="0" wp14:anchorId="7826217B" wp14:editId="69DF5B66">
                   <wp:extent cx="152400" cy="152400"/>
                   <wp:effectExtent l="0" t="0" r="0" b="0"/>
                   <wp:docPr id="181" name="Picture"/>
@@ -25464,7 +25464,7 @@
                 <w:noProof/>
               </w:rPr>
               <w:drawing>
-                <wp:inline distT="0" distB="0" distL="0" distR="0" wp14:anchorId="079920F3" wp14:editId="1891C4CD">
+                <wp:inline distT="0" distB="0" distL="0" distR="0" wp14:anchorId="38C251AA" wp14:editId="11C3B908">
                   <wp:extent cx="152400" cy="152400"/>
                   <wp:effectExtent l="0" t="0" r="0" b="0"/>
                   <wp:docPr id="184" name="Picture"/>
@@ -25522,7 +25522,7 @@
                 <w:noProof/>
               </w:rPr>
               <w:drawing>
-                <wp:inline distT="0" distB="0" distL="0" distR="0" wp14:anchorId="2B379AA1" wp14:editId="0F33E822">
+                <wp:inline distT="0" distB="0" distL="0" distR="0" wp14:anchorId="1C9E2C51" wp14:editId="7B16F30B">
                   <wp:extent cx="152400" cy="152400"/>
                   <wp:effectExtent l="0" t="0" r="0" b="0"/>
                   <wp:docPr id="187" name="Picture"/>
@@ -25587,7 +25587,7 @@
                 <w:noProof/>
               </w:rPr>
               <w:drawing>
-                <wp:inline distT="0" distB="0" distL="0" distR="0" wp14:anchorId="555D2B6E" wp14:editId="7257F4F2">
+                <wp:inline distT="0" distB="0" distL="0" distR="0" wp14:anchorId="3A76E21C" wp14:editId="7DCD2269">
                   <wp:extent cx="152400" cy="152400"/>
                   <wp:effectExtent l="0" t="0" r="0" b="0"/>
                   <wp:docPr id="190" name="Picture"/>
@@ -25645,7 +25645,7 @@
                 <w:noProof/>
               </w:rPr>
               <w:drawing>
-                <wp:inline distT="0" distB="0" distL="0" distR="0" wp14:anchorId="335CEDE3" wp14:editId="0F1EEE9E">
+                <wp:inline distT="0" distB="0" distL="0" distR="0" wp14:anchorId="41AE18F8" wp14:editId="4F00C1A0">
                   <wp:extent cx="152400" cy="152400"/>
                   <wp:effectExtent l="0" t="0" r="0" b="0"/>
                   <wp:docPr id="193" name="Picture"/>
@@ -25710,7 +25710,7 @@
                 <w:noProof/>
               </w:rPr>
               <w:drawing>
-                <wp:inline distT="0" distB="0" distL="0" distR="0" wp14:anchorId="30B4CC03" wp14:editId="230353CD">
+                <wp:inline distT="0" distB="0" distL="0" distR="0" wp14:anchorId="6B1107AA" wp14:editId="075FFE38">
                   <wp:extent cx="152400" cy="152400"/>
                   <wp:effectExtent l="0" t="0" r="0" b="0"/>
                   <wp:docPr id="196" name="Picture"/>
@@ -25768,7 +25768,7 @@
                 <w:noProof/>
               </w:rPr>
               <w:drawing>
-                <wp:inline distT="0" distB="0" distL="0" distR="0" wp14:anchorId="51B2A89A" wp14:editId="4DFB0093">
+                <wp:inline distT="0" distB="0" distL="0" distR="0" wp14:anchorId="08A86EC2" wp14:editId="40ADB5BC">
                   <wp:extent cx="152400" cy="152400"/>
                   <wp:effectExtent l="0" t="0" r="0" b="0"/>
                   <wp:docPr id="199" name="Picture"/>
@@ -25961,7 +25961,7 @@
                 <w:noProof/>
               </w:rPr>
               <w:drawing>
-                <wp:inline distT="0" distB="0" distL="0" distR="0" wp14:anchorId="3151DF12" wp14:editId="2CE77CF2">
+                <wp:inline distT="0" distB="0" distL="0" distR="0" wp14:anchorId="6321BC0B" wp14:editId="2037EE87">
                   <wp:extent cx="152400" cy="152400"/>
                   <wp:effectExtent l="0" t="0" r="0" b="0"/>
                   <wp:docPr id="202" name="Picture"/>
@@ -26026,7 +26026,7 @@
                 <w:noProof/>
               </w:rPr>
               <w:drawing>
-                <wp:inline distT="0" distB="0" distL="0" distR="0" wp14:anchorId="47B12DB9" wp14:editId="7333FBEE">
+                <wp:inline distT="0" distB="0" distL="0" distR="0" wp14:anchorId="1CC6868A" wp14:editId="07241947">
                   <wp:extent cx="152400" cy="152400"/>
                   <wp:effectExtent l="0" t="0" r="0" b="0"/>
                   <wp:docPr id="205" name="Picture"/>
@@ -26091,7 +26091,7 @@
                 <w:noProof/>
               </w:rPr>
               <w:drawing>
-                <wp:inline distT="0" distB="0" distL="0" distR="0" wp14:anchorId="2C54BE9E" wp14:editId="4A216F44">
+                <wp:inline distT="0" distB="0" distL="0" distR="0" wp14:anchorId="0EEA74AA" wp14:editId="538A5641">
                   <wp:extent cx="152400" cy="152400"/>
                   <wp:effectExtent l="0" t="0" r="0" b="0"/>
                   <wp:docPr id="208" name="Picture"/>
@@ -26156,7 +26156,7 @@
                 <w:noProof/>
               </w:rPr>
               <w:drawing>
-                <wp:inline distT="0" distB="0" distL="0" distR="0" wp14:anchorId="7FB6628F" wp14:editId="12F00682">
+                <wp:inline distT="0" distB="0" distL="0" distR="0" wp14:anchorId="7D1BD3CD" wp14:editId="2F9957A9">
                   <wp:extent cx="152400" cy="152400"/>
                   <wp:effectExtent l="0" t="0" r="0" b="0"/>
                   <wp:docPr id="211" name="Picture"/>
@@ -26221,7 +26221,7 @@
                 <w:noProof/>
               </w:rPr>
               <w:drawing>
-                <wp:inline distT="0" distB="0" distL="0" distR="0" wp14:anchorId="1D3654C3" wp14:editId="485E84C5">
+                <wp:inline distT="0" distB="0" distL="0" distR="0" wp14:anchorId="28C4AF5C" wp14:editId="1C882268">
                   <wp:extent cx="152400" cy="152400"/>
                   <wp:effectExtent l="0" t="0" r="0" b="0"/>
                   <wp:docPr id="214" name="Picture"/>
@@ -26347,7 +26347,7 @@
         <w:pStyle w:val="Heading2"/>
       </w:pPr>
       <w:bookmarkStart w:id="70" w:name="the-context-menu"/>
-      <w:bookmarkStart w:id="71" w:name="_Toc234848182"/>
+      <w:bookmarkStart w:id="71" w:name="_Toc234849014"/>
       <w:bookmarkEnd w:id="68"/>
       <w:r>
         <w:rPr>
@@ -26733,7 +26733,7 @@
           <w:noProof/>
         </w:rPr>
         <w:drawing>
-          <wp:inline distT="0" distB="0" distL="0" distR="0" wp14:anchorId="6D1861CA" wp14:editId="5B6C759F">
+          <wp:inline distT="0" distB="0" distL="0" distR="0" wp14:anchorId="2D9CBC49" wp14:editId="70F00173">
             <wp:extent cx="5334000" cy="5999971"/>
             <wp:effectExtent l="0" t="0" r="0" b="0"/>
             <wp:docPr id="218" name="Picture"/>
@@ -26780,7 +26780,7 @@
         <w:pStyle w:val="Heading2"/>
       </w:pPr>
       <w:bookmarkStart w:id="72" w:name="filters"/>
-      <w:bookmarkStart w:id="73" w:name="_Toc234848183"/>
+      <w:bookmarkStart w:id="73" w:name="_Toc234849015"/>
       <w:bookmarkEnd w:id="70"/>
       <w:r>
         <w:rPr>
@@ -26831,7 +26831,7 @@
           <w:noProof/>
         </w:rPr>
         <w:drawing>
-          <wp:inline distT="0" distB="0" distL="0" distR="0" wp14:anchorId="6AE93CAF" wp14:editId="10CA034F">
+          <wp:inline distT="0" distB="0" distL="0" distR="0" wp14:anchorId="42749D2D" wp14:editId="0EBE9FB1">
             <wp:extent cx="2611356" cy="6800584"/>
             <wp:effectExtent l="0" t="0" r="0" b="0"/>
             <wp:docPr id="222" name="Picture" descr="Tree filters: what you hide here is hidden in this tree view — diagrams keep their own selection. The Phases group greys out when the model has no Phase Support."/>
@@ -26886,7 +26886,7 @@
         <w:pStyle w:val="Heading2"/>
       </w:pPr>
       <w:bookmarkStart w:id="74" w:name="delete-multiple"/>
-      <w:bookmarkStart w:id="75" w:name="_Toc234848184"/>
+      <w:bookmarkStart w:id="75" w:name="_Toc234849016"/>
       <w:bookmarkEnd w:id="72"/>
       <w:r>
         <w:rPr>
@@ -26933,7 +26933,7 @@
           <w:noProof/>
         </w:rPr>
         <w:drawing>
-          <wp:inline distT="0" distB="0" distL="0" distR="0" wp14:anchorId="30ED9962" wp14:editId="26221A79">
+          <wp:inline distT="0" distB="0" distL="0" distR="0" wp14:anchorId="420102B2" wp14:editId="3BD145C0">
             <wp:extent cx="5334000" cy="4034433"/>
             <wp:effectExtent l="0" t="0" r="0" b="0"/>
             <wp:docPr id="226" name="Picture" descr="Bulk delete: the Show checkboxes narrow the tree by kind, ticking a parent includes its contents, and the whole deletion is a single undo step."/>
@@ -26988,7 +26988,7 @@
         <w:pStyle w:val="Heading2"/>
       </w:pPr>
       <w:bookmarkStart w:id="76" w:name="drag-and-copy-drag"/>
-      <w:bookmarkStart w:id="77" w:name="_Toc234848185"/>
+      <w:bookmarkStart w:id="77" w:name="_Toc234849017"/>
       <w:bookmarkEnd w:id="74"/>
       <w:r>
         <w:rPr>
@@ -27231,7 +27231,7 @@
         <w:pStyle w:val="Heading1"/>
       </w:pPr>
       <w:bookmarkStart w:id="78" w:name="reference-class-diagrams"/>
-      <w:bookmarkStart w:id="79" w:name="_Toc234848186"/>
+      <w:bookmarkStart w:id="79" w:name="_Toc234849018"/>
       <w:bookmarkEnd w:id="62"/>
       <w:bookmarkEnd w:id="76"/>
       <w:r>
@@ -27263,7 +27263,7 @@
           <w:noProof/>
         </w:rPr>
         <w:drawing>
-          <wp:inline distT="0" distB="0" distL="0" distR="0" wp14:anchorId="055E4D95" wp14:editId="0DD2F465">
+          <wp:inline distT="0" distB="0" distL="0" distR="0" wp14:anchorId="666D9D7B" wp14:editId="163F6382">
             <wp:extent cx="5334000" cy="4666357"/>
             <wp:effectExtent l="0" t="0" r="0" b="0"/>
             <wp:docPr id="232" name="Picture" descr="The class-diagram view with its toolbar. Row and Column are selected (translucent accent, resize handles); the darker frame on Column marks the align anchor — the last-selected shape."/>
@@ -27318,7 +27318,7 @@
         <w:pStyle w:val="Heading2"/>
       </w:pPr>
       <w:bookmarkStart w:id="80" w:name="reading-the-diagram"/>
-      <w:bookmarkStart w:id="81" w:name="_Toc234848187"/>
+      <w:bookmarkStart w:id="81" w:name="_Toc234849019"/>
       <w:r>
         <w:rPr>
           <w:rStyle w:val="SectionNumber"/>
@@ -27518,7 +27518,7 @@
         <w:pStyle w:val="Heading2"/>
       </w:pPr>
       <w:bookmarkStart w:id="82" w:name="selection"/>
-      <w:bookmarkStart w:id="83" w:name="_Toc234848188"/>
+      <w:bookmarkStart w:id="83" w:name="_Toc234849020"/>
       <w:bookmarkEnd w:id="80"/>
       <w:r>
         <w:rPr>
@@ -27729,7 +27729,7 @@
         <w:pStyle w:val="Heading2"/>
       </w:pPr>
       <w:bookmarkStart w:id="84" w:name="moving-and-resizing"/>
-      <w:bookmarkStart w:id="85" w:name="_Toc234848189"/>
+      <w:bookmarkStart w:id="85" w:name="_Toc234849021"/>
       <w:bookmarkEnd w:id="82"/>
       <w:r>
         <w:rPr>
@@ -27806,7 +27806,7 @@
         <w:pStyle w:val="Heading2"/>
       </w:pPr>
       <w:bookmarkStart w:id="86" w:name="editing-connection-routing"/>
-      <w:bookmarkStart w:id="87" w:name="_Toc234848190"/>
+      <w:bookmarkStart w:id="87" w:name="_Toc234849022"/>
       <w:bookmarkEnd w:id="84"/>
       <w:r>
         <w:rPr>
@@ -27960,7 +27960,7 @@
         <w:pStyle w:val="Heading2"/>
       </w:pPr>
       <w:bookmarkStart w:id="88" w:name="members-and-methods-inside-the-box"/>
-      <w:bookmarkStart w:id="89" w:name="_Toc234848191"/>
+      <w:bookmarkStart w:id="89" w:name="_Toc234849023"/>
       <w:bookmarkEnd w:id="86"/>
       <w:r>
         <w:rPr>
@@ -28032,7 +28032,7 @@
         <w:pStyle w:val="Heading2"/>
       </w:pPr>
       <w:bookmarkStart w:id="90" w:name="notes-and-their-connection-points"/>
-      <w:bookmarkStart w:id="91" w:name="_Toc234848192"/>
+      <w:bookmarkStart w:id="91" w:name="_Toc234849024"/>
       <w:bookmarkEnd w:id="88"/>
       <w:r>
         <w:rPr>
@@ -28116,7 +28116,7 @@
         <w:pStyle w:val="Heading2"/>
       </w:pPr>
       <w:bookmarkStart w:id="92" w:name="creating-elements-on-the-canvas"/>
-      <w:bookmarkStart w:id="93" w:name="_Toc234848193"/>
+      <w:bookmarkStart w:id="93" w:name="_Toc234849025"/>
       <w:bookmarkEnd w:id="90"/>
       <w:r>
         <w:rPr>
@@ -28460,7 +28460,7 @@
         <w:pStyle w:val="Heading2"/>
       </w:pPr>
       <w:bookmarkStart w:id="94" w:name="align"/>
-      <w:bookmarkStart w:id="95" w:name="_Toc234848194"/>
+      <w:bookmarkStart w:id="95" w:name="_Toc234849026"/>
       <w:bookmarkEnd w:id="92"/>
       <w:r>
         <w:rPr>
@@ -28535,7 +28535,7 @@
         <w:pStyle w:val="Heading2"/>
       </w:pPr>
       <w:bookmarkStart w:id="96" w:name="hiding-per-shape-toggles-colors"/>
-      <w:bookmarkStart w:id="97" w:name="_Toc234848195"/>
+      <w:bookmarkStart w:id="97" w:name="_Toc234849027"/>
       <w:bookmarkEnd w:id="94"/>
       <w:r>
         <w:rPr>
@@ -28673,7 +28673,7 @@
         <w:pStyle w:val="Heading2"/>
       </w:pPr>
       <w:bookmarkStart w:id="98" w:name="zoom-and-pan"/>
-      <w:bookmarkStart w:id="99" w:name="_Toc234848196"/>
+      <w:bookmarkStart w:id="99" w:name="_Toc234849028"/>
       <w:bookmarkEnd w:id="96"/>
       <w:r>
         <w:rPr>
@@ -28948,7 +28948,7 @@
         <w:pStyle w:val="Heading2"/>
       </w:pPr>
       <w:bookmarkStart w:id="100" w:name="the-cd-toolbar"/>
-      <w:bookmarkStart w:id="101" w:name="_Toc234848197"/>
+      <w:bookmarkStart w:id="101" w:name="_Toc234849029"/>
       <w:bookmarkEnd w:id="98"/>
       <w:r>
         <w:rPr>
@@ -29102,7 +29102,7 @@
           <w:noProof/>
         </w:rPr>
         <w:drawing>
-          <wp:inline distT="0" distB="0" distL="0" distR="0" wp14:anchorId="70F6810F" wp14:editId="3BC20965">
+          <wp:inline distT="0" distB="0" distL="0" distR="0" wp14:anchorId="18D93451" wp14:editId="5FB8C2D8">
             <wp:extent cx="5334000" cy="232022"/>
             <wp:effectExtent l="0" t="0" r="0" b="0"/>
             <wp:docPr id="245" name="Picture" descr="The CD toolbar: the Add buttons (greyed when not legal on the selection), the align dropdown, Delete, Undo/Redo, zoom in/out/fit, and Export SVG."/>
@@ -29157,7 +29157,7 @@
         <w:pStyle w:val="Heading2"/>
       </w:pPr>
       <w:bookmarkStart w:id="102" w:name="the-cd-context-menu"/>
-      <w:bookmarkStart w:id="103" w:name="_Toc234848198"/>
+      <w:bookmarkStart w:id="103" w:name="_Toc234849030"/>
       <w:bookmarkEnd w:id="100"/>
       <w:r>
         <w:rPr>
@@ -29198,7 +29198,7 @@
           <w:noProof/>
         </w:rPr>
         <w:drawing>
-          <wp:inline distT="0" distB="0" distL="0" distR="0" wp14:anchorId="1DEF45BB" wp14:editId="7F52C8D5">
+          <wp:inline distT="0" distB="0" distL="0" distR="0" wp14:anchorId="4E17B3E1" wp14:editId="7E5CAFA7">
             <wp:extent cx="5334000" cy="5760720"/>
             <wp:effectExtent l="0" t="0" r="0" b="0"/>
             <wp:docPr id="249" name="Picture"/>
@@ -29245,7 +29245,7 @@
         <w:pStyle w:val="Heading2"/>
       </w:pPr>
       <w:bookmarkStart w:id="104" w:name="canvas-keys"/>
-      <w:bookmarkStart w:id="105" w:name="_Toc234848199"/>
+      <w:bookmarkStart w:id="105" w:name="_Toc234849031"/>
       <w:bookmarkEnd w:id="102"/>
       <w:r>
         <w:rPr>
@@ -29563,7 +29563,7 @@
         <w:pStyle w:val="Heading1"/>
       </w:pPr>
       <w:bookmarkStart w:id="106" w:name="reference-sequence-diagrams"/>
-      <w:bookmarkStart w:id="107" w:name="_Toc234848200"/>
+      <w:bookmarkStart w:id="107" w:name="_Toc234849032"/>
       <w:bookmarkEnd w:id="78"/>
       <w:bookmarkEnd w:id="104"/>
       <w:r>
@@ -29637,7 +29637,7 @@
           <w:noProof/>
         </w:rPr>
         <w:drawing>
-          <wp:inline distT="0" distB="0" distL="0" distR="0" wp14:anchorId="25EF9289" wp14:editId="72D54EAF">
+          <wp:inline distT="0" distB="0" distL="0" distR="0" wp14:anchorId="44CB8F9B" wp14:editId="5051038D">
             <wp:extent cx="5334000" cy="3482788"/>
             <wp:effectExtent l="0" t="0" r="0" b="0"/>
             <wp:docPr id="255" name="Picture" descr="A sequence-diagram view in the shell — its own toolbar (delete, undo/redo, zoom, export SVG) at the top; diagram views dock, tab and float exactly like the trees."/>
@@ -29692,7 +29692,7 @@
         <w:pStyle w:val="Heading2"/>
       </w:pPr>
       <w:bookmarkStart w:id="108" w:name="building-one"/>
-      <w:bookmarkStart w:id="109" w:name="_Toc234848201"/>
+      <w:bookmarkStart w:id="109" w:name="_Toc234849033"/>
       <w:r>
         <w:rPr>
           <w:rStyle w:val="SectionNumber"/>
@@ -29761,7 +29761,7 @@
           <w:noProof/>
         </w:rPr>
         <w:drawing>
-          <wp:inline distT="0" distB="0" distL="0" distR="0" wp14:anchorId="7C388343" wp14:editId="1F108C91">
+          <wp:inline distT="0" distB="0" distL="0" distR="0" wp14:anchorId="4F0214AF" wp14:editId="1DE05CF6">
             <wp:extent cx="5334000" cy="3999784"/>
             <wp:effectExtent l="0" t="0" r="0" b="0"/>
             <wp:docPr id="258" name="Picture"/>
@@ -29896,7 +29896,7 @@
         <w:pStyle w:val="Heading2"/>
       </w:pPr>
       <w:bookmarkStart w:id="110" w:name="what-moves-and-how"/>
-      <w:bookmarkStart w:id="111" w:name="_Toc234848202"/>
+      <w:bookmarkStart w:id="111" w:name="_Toc234849034"/>
       <w:bookmarkEnd w:id="108"/>
       <w:r>
         <w:rPr>
@@ -30330,7 +30330,7 @@
         <w:pStyle w:val="Heading2"/>
       </w:pPr>
       <w:bookmarkStart w:id="112" w:name="keeping-it-readable"/>
-      <w:bookmarkStart w:id="113" w:name="_Toc234848203"/>
+      <w:bookmarkStart w:id="113" w:name="_Toc234849035"/>
       <w:bookmarkEnd w:id="110"/>
       <w:r>
         <w:rPr>
@@ -30428,7 +30428,7 @@
         <w:pStyle w:val="Heading2"/>
       </w:pPr>
       <w:bookmarkStart w:id="114" w:name="toolbar-colors-zoom"/>
-      <w:bookmarkStart w:id="115" w:name="_Toc234848204"/>
+      <w:bookmarkStart w:id="115" w:name="_Toc234849036"/>
       <w:bookmarkEnd w:id="112"/>
       <w:r>
         <w:rPr>
@@ -30470,7 +30470,7 @@
           <w:noProof/>
         </w:rPr>
         <w:drawing>
-          <wp:inline distT="0" distB="0" distL="0" distR="0" wp14:anchorId="58ED4774" wp14:editId="21DB107F">
+          <wp:inline distT="0" distB="0" distL="0" distR="0" wp14:anchorId="435B059C" wp14:editId="15F30D03">
             <wp:extent cx="4648554" cy="429555"/>
             <wp:effectExtent l="0" t="0" r="0" b="0"/>
             <wp:docPr id="264" name="Picture"/>
@@ -30622,7 +30622,7 @@
           <w:noProof/>
         </w:rPr>
         <w:drawing>
-          <wp:inline distT="0" distB="0" distL="0" distR="0" wp14:anchorId="6C14AC6E" wp14:editId="7027DF0F">
+          <wp:inline distT="0" distB="0" distL="0" distR="0" wp14:anchorId="2846EFAD" wp14:editId="4465938B">
             <wp:extent cx="5334000" cy="3813757"/>
             <wp:effectExtent l="0" t="0" r="0" b="0"/>
             <wp:docPr id="267" name="Picture"/>
@@ -30669,7 +30669,7 @@
         <w:pStyle w:val="Heading2"/>
       </w:pPr>
       <w:bookmarkStart w:id="116" w:name="canvas-keys-1"/>
-      <w:bookmarkStart w:id="117" w:name="_Toc234848205"/>
+      <w:bookmarkStart w:id="117" w:name="_Toc234849037"/>
       <w:bookmarkEnd w:id="114"/>
       <w:r>
         <w:rPr>
@@ -31047,7 +31047,7 @@
         <w:pStyle w:val="Heading1"/>
       </w:pPr>
       <w:bookmarkStart w:id="118" w:name="reference-dialogs"/>
-      <w:bookmarkStart w:id="119" w:name="_Toc234848206"/>
+      <w:bookmarkStart w:id="119" w:name="_Toc234849038"/>
       <w:bookmarkEnd w:id="106"/>
       <w:bookmarkEnd w:id="116"/>
       <w:r>
@@ -31075,7 +31075,7 @@
         <w:pStyle w:val="Heading2"/>
       </w:pPr>
       <w:bookmarkStart w:id="120" w:name="class"/>
-      <w:bookmarkStart w:id="121" w:name="_Toc234848207"/>
+      <w:bookmarkStart w:id="121" w:name="_Toc234849039"/>
       <w:r>
         <w:rPr>
           <w:rStyle w:val="SectionNumber"/>
@@ -31097,7 +31097,7 @@
           <w:noProof/>
         </w:rPr>
         <w:drawing>
-          <wp:inline distT="0" distB="0" distL="0" distR="0" wp14:anchorId="44A54041" wp14:editId="129ED68E">
+          <wp:inline distT="0" distB="0" distL="0" distR="0" wp14:anchorId="07DA1138" wp14:editId="53D33D07">
             <wp:extent cx="5334000" cy="4744969"/>
             <wp:effectExtent l="0" t="0" r="0" b="0"/>
             <wp:docPr id="273" name="Picture"/>
@@ -31287,7 +31287,7 @@
         <w:pStyle w:val="Heading2"/>
       </w:pPr>
       <w:bookmarkStart w:id="122" w:name="external-class"/>
-      <w:bookmarkStart w:id="123" w:name="_Toc234848208"/>
+      <w:bookmarkStart w:id="123" w:name="_Toc234849040"/>
       <w:bookmarkEnd w:id="120"/>
       <w:r>
         <w:rPr>
@@ -31310,7 +31310,7 @@
           <w:noProof/>
         </w:rPr>
         <w:drawing>
-          <wp:inline distT="0" distB="0" distL="0" distR="0" wp14:anchorId="7299D05D" wp14:editId="11DB6444">
+          <wp:inline distT="0" distB="0" distL="0" distR="0" wp14:anchorId="69D90B69" wp14:editId="46979B21">
             <wp:extent cx="5334000" cy="3242315"/>
             <wp:effectExtent l="0" t="0" r="0" b="0"/>
             <wp:docPr id="277" name="Picture"/>
@@ -31388,7 +31388,7 @@
         <w:pStyle w:val="Heading2"/>
       </w:pPr>
       <w:bookmarkStart w:id="124" w:name="member"/>
-      <w:bookmarkStart w:id="125" w:name="_Toc234848209"/>
+      <w:bookmarkStart w:id="125" w:name="_Toc234849041"/>
       <w:bookmarkEnd w:id="122"/>
       <w:r>
         <w:rPr>
@@ -31411,7 +31411,7 @@
           <w:noProof/>
         </w:rPr>
         <w:drawing>
-          <wp:inline distT="0" distB="0" distL="0" distR="0" wp14:anchorId="28A24E82" wp14:editId="75AAA7D7">
+          <wp:inline distT="0" distB="0" distL="0" distR="0" wp14:anchorId="41270E9D" wp14:editId="12687DC5">
             <wp:extent cx="5334000" cy="6040020"/>
             <wp:effectExtent l="0" t="0" r="0" b="0"/>
             <wp:docPr id="281" name="Picture"/>
@@ -31629,7 +31629,7 @@
         <w:pStyle w:val="Heading2"/>
       </w:pPr>
       <w:bookmarkStart w:id="126" w:name="method"/>
-      <w:bookmarkStart w:id="127" w:name="_Toc234848210"/>
+      <w:bookmarkStart w:id="127" w:name="_Toc234849042"/>
       <w:bookmarkEnd w:id="124"/>
       <w:r>
         <w:rPr>
@@ -31652,7 +31652,7 @@
           <w:noProof/>
         </w:rPr>
         <w:drawing>
-          <wp:inline distT="0" distB="0" distL="0" distR="0" wp14:anchorId="2EF5E269" wp14:editId="29FBA100">
+          <wp:inline distT="0" distB="0" distL="0" distR="0" wp14:anchorId="4DADB526" wp14:editId="1C0B50B1">
             <wp:extent cx="5334000" cy="4824502"/>
             <wp:effectExtent l="0" t="0" r="0" b="0"/>
             <wp:docPr id="285" name="Picture"/>
@@ -31881,7 +31881,7 @@
           <w:noProof/>
         </w:rPr>
         <w:drawing>
-          <wp:inline distT="0" distB="0" distL="0" distR="0" wp14:anchorId="355C4216" wp14:editId="2F600B9A">
+          <wp:inline distT="0" distB="0" distL="0" distR="0" wp14:anchorId="792360A0" wp14:editId="5D3EE185">
             <wp:extent cx="5334000" cy="3146155"/>
             <wp:effectExtent l="0" t="0" r="0" b="0"/>
             <wp:docPr id="288" name="Picture" descr="Renaming a method offers to update every call site stored in the model — with the possibility to view the code."/>
@@ -31936,7 +31936,7 @@
         <w:pStyle w:val="Heading2"/>
       </w:pPr>
       <w:bookmarkStart w:id="128" w:name="constructor-destructor"/>
-      <w:bookmarkStart w:id="129" w:name="_Toc234848211"/>
+      <w:bookmarkStart w:id="129" w:name="_Toc234849043"/>
       <w:bookmarkEnd w:id="126"/>
       <w:r>
         <w:rPr>
@@ -31959,7 +31959,7 @@
           <w:noProof/>
         </w:rPr>
         <w:drawing>
-          <wp:inline distT="0" distB="0" distL="0" distR="0" wp14:anchorId="12A9E2F9" wp14:editId="1A751DA3">
+          <wp:inline distT="0" distB="0" distL="0" distR="0" wp14:anchorId="505E8DD9" wp14:editId="56749233">
             <wp:extent cx="5334000" cy="3217383"/>
             <wp:effectExtent l="0" t="0" r="0" b="0"/>
             <wp:docPr id="292" name="Picture"/>
@@ -32010,7 +32010,7 @@
           <w:noProof/>
         </w:rPr>
         <w:drawing>
-          <wp:inline distT="0" distB="0" distL="0" distR="0" wp14:anchorId="19FEAC04" wp14:editId="5A19D8F6">
+          <wp:inline distT="0" distB="0" distL="0" distR="0" wp14:anchorId="51199C99" wp14:editId="5E996CE7">
             <wp:extent cx="5334000" cy="3259666"/>
             <wp:effectExtent l="0" t="0" r="0" b="0"/>
             <wp:docPr id="295" name="Picture"/>
@@ -32125,7 +32125,7 @@
         <w:pStyle w:val="Heading2"/>
       </w:pPr>
       <w:bookmarkStart w:id="130" w:name="exception-specification"/>
-      <w:bookmarkStart w:id="131" w:name="_Toc234848212"/>
+      <w:bookmarkStart w:id="131" w:name="_Toc234849044"/>
       <w:bookmarkEnd w:id="128"/>
       <w:r>
         <w:rPr>
@@ -32148,7 +32148,7 @@
           <w:noProof/>
         </w:rPr>
         <w:drawing>
-          <wp:inline distT="0" distB="0" distL="0" distR="0" wp14:anchorId="2CA54875" wp14:editId="5BD98A57">
+          <wp:inline distT="0" distB="0" distL="0" distR="0" wp14:anchorId="3EF3B328" wp14:editId="262CEC2F">
             <wp:extent cx="5334000" cy="4570499"/>
             <wp:effectExtent l="0" t="0" r="0" b="0"/>
             <wp:docPr id="299" name="Picture"/>
@@ -32252,7 +32252,7 @@
         <w:pStyle w:val="Heading2"/>
       </w:pPr>
       <w:bookmarkStart w:id="132" w:name="argument"/>
-      <w:bookmarkStart w:id="133" w:name="_Toc234848213"/>
+      <w:bookmarkStart w:id="133" w:name="_Toc234849045"/>
       <w:bookmarkEnd w:id="130"/>
       <w:r>
         <w:rPr>
@@ -32275,7 +32275,7 @@
           <w:noProof/>
         </w:rPr>
         <w:drawing>
-          <wp:inline distT="0" distB="0" distL="0" distR="0" wp14:anchorId="439D23A4" wp14:editId="7E6D23F7">
+          <wp:inline distT="0" distB="0" distL="0" distR="0" wp14:anchorId="246D9B12" wp14:editId="1BE2CCC5">
             <wp:extent cx="5334000" cy="4645497"/>
             <wp:effectExtent l="0" t="0" r="0" b="0"/>
             <wp:docPr id="303" name="Picture"/>
@@ -32340,7 +32340,7 @@
         <w:pStyle w:val="Heading2"/>
       </w:pPr>
       <w:bookmarkStart w:id="134" w:name="inheritance"/>
-      <w:bookmarkStart w:id="135" w:name="_Toc234848214"/>
+      <w:bookmarkStart w:id="135" w:name="_Toc234849046"/>
       <w:bookmarkEnd w:id="132"/>
       <w:r>
         <w:rPr>
@@ -32363,7 +32363,7 @@
           <w:noProof/>
         </w:rPr>
         <w:drawing>
-          <wp:inline distT="0" distB="0" distL="0" distR="0" wp14:anchorId="3C09AF52" wp14:editId="5A97A88A">
+          <wp:inline distT="0" distB="0" distL="0" distR="0" wp14:anchorId="66D66320" wp14:editId="49A5C05B">
             <wp:extent cx="5334000" cy="3869987"/>
             <wp:effectExtent l="0" t="0" r="0" b="0"/>
             <wp:docPr id="307" name="Picture"/>
@@ -32478,8 +32478,8 @@
                 <w:noProof/>
               </w:rPr>
               <w:drawing>
-                <wp:inline distT="0" distB="0" distL="0" distR="0" wp14:anchorId="0729A87A" wp14:editId="64310AD6">
-                  <wp:extent cx="4325324" cy="1939378"/>
+                <wp:inline distT="0" distB="0" distL="0" distR="0" wp14:anchorId="76D134F4" wp14:editId="52E962EF">
+                  <wp:extent cx="4325324" cy="2909067"/>
                   <wp:effectExtent l="0" t="0" r="0" b="0"/>
                   <wp:docPr id="310" name="Picture"/>
                   <wp:cNvGraphicFramePr/>
@@ -32501,7 +32501,7 @@
                         <pic:spPr bwMode="auto">
                           <a:xfrm>
                             <a:off x="0" y="0"/>
-                            <a:ext cx="4325324" cy="1939378"/>
+                            <a:ext cx="4325324" cy="2909067"/>
                           </a:xfrm>
                           <a:prstGeom prst="rect">
                             <a:avLst/>
@@ -32534,8 +32534,8 @@
                 <w:noProof/>
               </w:rPr>
               <w:drawing>
-                <wp:inline distT="0" distB="0" distL="0" distR="0" wp14:anchorId="4879AEA0" wp14:editId="7F2D05C4">
-                  <wp:extent cx="4325324" cy="2534801"/>
+                <wp:inline distT="0" distB="0" distL="0" distR="0" wp14:anchorId="5E85530C" wp14:editId="3BCFE69A">
+                  <wp:extent cx="4325324" cy="2917573"/>
                   <wp:effectExtent l="0" t="0" r="0" b="0"/>
                   <wp:docPr id="313" name="Picture"/>
                   <wp:cNvGraphicFramePr/>
@@ -32557,7 +32557,7 @@
                         <pic:spPr bwMode="auto">
                           <a:xfrm>
                             <a:off x="0" y="0"/>
-                            <a:ext cx="4325324" cy="2534801"/>
+                            <a:ext cx="4325324" cy="2917573"/>
                           </a:xfrm>
                           <a:prstGeom prst="rect">
                             <a:avLst/>
@@ -32596,7 +32596,7 @@
         <w:pStyle w:val="Heading2"/>
       </w:pPr>
       <w:bookmarkStart w:id="136" w:name="relation"/>
-      <w:bookmarkStart w:id="137" w:name="_Toc234848215"/>
+      <w:bookmarkStart w:id="137" w:name="_Toc234849047"/>
       <w:bookmarkEnd w:id="134"/>
       <w:r>
         <w:rPr>
@@ -32619,7 +32619,7 @@
           <w:noProof/>
         </w:rPr>
         <w:drawing>
-          <wp:inline distT="0" distB="0" distL="0" distR="0" wp14:anchorId="7D4321A4" wp14:editId="136E9115">
+          <wp:inline distT="0" distB="0" distL="0" distR="0" wp14:anchorId="31CE635C" wp14:editId="55C689DA">
             <wp:extent cx="5334000" cy="5158885"/>
             <wp:effectExtent l="0" t="0" r="0" b="0"/>
             <wp:docPr id="317" name="Picture"/>
@@ -32977,7 +32977,7 @@
         <w:pStyle w:val="Heading2"/>
       </w:pPr>
       <w:bookmarkStart w:id="138" w:name="find-method-on-a-relation"/>
-      <w:bookmarkStart w:id="139" w:name="_Toc234848216"/>
+      <w:bookmarkStart w:id="139" w:name="_Toc234849048"/>
       <w:bookmarkEnd w:id="136"/>
       <w:r>
         <w:rPr>
@@ -33000,7 +33000,7 @@
           <w:noProof/>
         </w:rPr>
         <w:drawing>
-          <wp:inline distT="0" distB="0" distL="0" distR="0" wp14:anchorId="13C099E4" wp14:editId="5EDC6956">
+          <wp:inline distT="0" distB="0" distL="0" distR="0" wp14:anchorId="3CA34A56" wp14:editId="5F678C6C">
             <wp:extent cx="5334000" cy="4823297"/>
             <wp:effectExtent l="0" t="0" r="0" b="0"/>
             <wp:docPr id="321" name="Picture"/>
@@ -33127,7 +33127,7 @@
         <w:pStyle w:val="Heading2"/>
       </w:pPr>
       <w:bookmarkStart w:id="140" w:name="dependency"/>
-      <w:bookmarkStart w:id="141" w:name="_Toc234848217"/>
+      <w:bookmarkStart w:id="141" w:name="_Toc234849049"/>
       <w:bookmarkEnd w:id="138"/>
       <w:r>
         <w:rPr>
@@ -33150,7 +33150,7 @@
           <w:noProof/>
         </w:rPr>
         <w:drawing>
-          <wp:inline distT="0" distB="0" distL="0" distR="0" wp14:anchorId="48C1FA35" wp14:editId="54A8A7A8">
+          <wp:inline distT="0" distB="0" distL="0" distR="0" wp14:anchorId="2282FA81" wp14:editId="15D0F697">
             <wp:extent cx="4563493" cy="2628368"/>
             <wp:effectExtent l="0" t="0" r="0" b="0"/>
             <wp:docPr id="325" name="Picture"/>
@@ -33251,7 +33251,7 @@
         <w:pStyle w:val="Heading2"/>
       </w:pPr>
       <w:bookmarkStart w:id="142" w:name="relation-diagram-only"/>
-      <w:bookmarkStart w:id="143" w:name="_Toc234848218"/>
+      <w:bookmarkStart w:id="143" w:name="_Toc234849050"/>
       <w:bookmarkEnd w:id="140"/>
       <w:r>
         <w:rPr>
@@ -33274,7 +33274,7 @@
           <w:noProof/>
         </w:rPr>
         <w:drawing>
-          <wp:inline distT="0" distB="0" distL="0" distR="0" wp14:anchorId="6534C127" wp14:editId="33E2EF4D">
+          <wp:inline distT="0" distB="0" distL="0" distR="0" wp14:anchorId="0C90BC86" wp14:editId="279D26F7">
             <wp:extent cx="4563493" cy="5673533"/>
             <wp:effectExtent l="0" t="0" r="0" b="0"/>
             <wp:docPr id="329" name="Picture"/>
@@ -33379,7 +33379,7 @@
         <w:pStyle w:val="Heading2"/>
       </w:pPr>
       <w:bookmarkStart w:id="144" w:name="type"/>
-      <w:bookmarkStart w:id="145" w:name="_Toc234848219"/>
+      <w:bookmarkStart w:id="145" w:name="_Toc234849051"/>
       <w:bookmarkEnd w:id="142"/>
       <w:r>
         <w:rPr>
@@ -33402,7 +33402,7 @@
           <w:noProof/>
         </w:rPr>
         <w:drawing>
-          <wp:inline distT="0" distB="0" distL="0" distR="0" wp14:anchorId="240339A9" wp14:editId="2AC7D652">
+          <wp:inline distT="0" distB="0" distL="0" distR="0" wp14:anchorId="52EC93BE" wp14:editId="58ECBAD6">
             <wp:extent cx="4563493" cy="3874504"/>
             <wp:effectExtent l="0" t="0" r="0" b="0"/>
             <wp:docPr id="333" name="Picture"/>
@@ -33514,7 +33514,7 @@
         <w:pStyle w:val="Heading2"/>
       </w:pPr>
       <w:bookmarkStart w:id="146" w:name="group-meta-group"/>
-      <w:bookmarkStart w:id="147" w:name="_Toc234848220"/>
+      <w:bookmarkStart w:id="147" w:name="_Toc234849052"/>
       <w:bookmarkEnd w:id="144"/>
       <w:r>
         <w:rPr>
@@ -33537,7 +33537,7 @@
           <w:noProof/>
         </w:rPr>
         <w:drawing>
-          <wp:inline distT="0" distB="0" distL="0" distR="0" wp14:anchorId="4F75DE08" wp14:editId="77D3B55D">
+          <wp:inline distT="0" distB="0" distL="0" distR="0" wp14:anchorId="0CC88347" wp14:editId="036104FA">
             <wp:extent cx="5334000" cy="3513536"/>
             <wp:effectExtent l="0" t="0" r="0" b="0"/>
             <wp:docPr id="337" name="Picture"/>
@@ -33592,7 +33592,7 @@
         <w:pStyle w:val="Heading2"/>
       </w:pPr>
       <w:bookmarkStart w:id="148" w:name="context-define-and-assign"/>
-      <w:bookmarkStart w:id="149" w:name="_Toc234848221"/>
+      <w:bookmarkStart w:id="149" w:name="_Toc234849053"/>
       <w:bookmarkEnd w:id="146"/>
       <w:r>
         <w:rPr>
@@ -33798,7 +33798,7 @@
         <w:pStyle w:val="Heading2"/>
       </w:pPr>
       <w:bookmarkStart w:id="150" w:name="actor"/>
-      <w:bookmarkStart w:id="151" w:name="_Toc234848222"/>
+      <w:bookmarkStart w:id="151" w:name="_Toc234849054"/>
       <w:bookmarkEnd w:id="148"/>
       <w:r>
         <w:rPr>
@@ -33849,7 +33849,7 @@
         <w:pStyle w:val="Heading2"/>
       </w:pPr>
       <w:bookmarkStart w:id="152" w:name="class-diagram"/>
-      <w:bookmarkStart w:id="153" w:name="_Toc234848223"/>
+      <w:bookmarkStart w:id="153" w:name="_Toc234849055"/>
       <w:bookmarkEnd w:id="150"/>
       <w:r>
         <w:rPr>
@@ -33874,7 +33874,7 @@
           <w:noProof/>
         </w:rPr>
         <w:drawing>
-          <wp:inline distT="0" distB="0" distL="0" distR="0" wp14:anchorId="0FE1B689" wp14:editId="61246216">
+          <wp:inline distT="0" distB="0" distL="0" distR="0" wp14:anchorId="3C08978E" wp14:editId="30AAE6EC">
             <wp:extent cx="5334000" cy="3838614"/>
             <wp:effectExtent l="0" t="0" r="0" b="0"/>
             <wp:docPr id="343" name="Picture"/>
@@ -33939,7 +33939,7 @@
         <w:pStyle w:val="Heading2"/>
       </w:pPr>
       <w:bookmarkStart w:id="154" w:name="sequence-diagram"/>
-      <w:bookmarkStart w:id="155" w:name="_Toc234848224"/>
+      <w:bookmarkStart w:id="155" w:name="_Toc234849056"/>
       <w:bookmarkEnd w:id="152"/>
       <w:r>
         <w:rPr>
@@ -33962,7 +33962,7 @@
           <w:noProof/>
         </w:rPr>
         <w:drawing>
-          <wp:inline distT="0" distB="0" distL="0" distR="0" wp14:anchorId="4BD3C84C" wp14:editId="16B7F171">
+          <wp:inline distT="0" distB="0" distL="0" distR="0" wp14:anchorId="2769B863" wp14:editId="1DD380D7">
             <wp:extent cx="5334000" cy="3999784"/>
             <wp:effectExtent l="0" t="0" r="0" b="0"/>
             <wp:docPr id="346" name="Picture"/>
@@ -34094,7 +34094,7 @@
         <w:pStyle w:val="Heading2"/>
       </w:pPr>
       <w:bookmarkStart w:id="156" w:name="select-classes"/>
-      <w:bookmarkStart w:id="157" w:name="_Toc234848225"/>
+      <w:bookmarkStart w:id="157" w:name="_Toc234849057"/>
       <w:bookmarkEnd w:id="154"/>
       <w:r>
         <w:rPr>
@@ -34155,7 +34155,7 @@
         <w:pStyle w:val="Heading2"/>
       </w:pPr>
       <w:bookmarkStart w:id="158" w:name="class-shape"/>
-      <w:bookmarkStart w:id="159" w:name="_Toc234848226"/>
+      <w:bookmarkStart w:id="159" w:name="_Toc234849058"/>
       <w:bookmarkEnd w:id="156"/>
       <w:r>
         <w:rPr>
@@ -34239,7 +34239,7 @@
         <w:pStyle w:val="Heading2"/>
       </w:pPr>
       <w:bookmarkStart w:id="160" w:name="select-members-methods"/>
-      <w:bookmarkStart w:id="161" w:name="_Toc234848227"/>
+      <w:bookmarkStart w:id="161" w:name="_Toc234849059"/>
       <w:bookmarkEnd w:id="158"/>
       <w:r>
         <w:rPr>
@@ -34294,7 +34294,7 @@
         <w:pStyle w:val="Heading2"/>
       </w:pPr>
       <w:bookmarkStart w:id="162" w:name="reorder-members-methods"/>
-      <w:bookmarkStart w:id="163" w:name="_Toc234848228"/>
+      <w:bookmarkStart w:id="163" w:name="_Toc234849060"/>
       <w:bookmarkEnd w:id="160"/>
       <w:r>
         <w:rPr>
@@ -34346,7 +34346,7 @@
         <w:pStyle w:val="Heading2"/>
       </w:pPr>
       <w:bookmarkStart w:id="164" w:name="signal-message"/>
-      <w:bookmarkStart w:id="165" w:name="_Toc234848229"/>
+      <w:bookmarkStart w:id="165" w:name="_Toc234849061"/>
       <w:bookmarkEnd w:id="162"/>
       <w:r>
         <w:rPr>
@@ -34406,7 +34406,7 @@
         <w:pStyle w:val="Heading2"/>
       </w:pPr>
       <w:bookmarkStart w:id="166" w:name="lifeline-note-dialogs"/>
-      <w:bookmarkStart w:id="167" w:name="_Toc234848230"/>
+      <w:bookmarkStart w:id="167" w:name="_Toc234849062"/>
       <w:bookmarkEnd w:id="164"/>
       <w:r>
         <w:rPr>
@@ -34458,7 +34458,7 @@
         <w:pStyle w:val="Heading2"/>
       </w:pPr>
       <w:bookmarkStart w:id="168" w:name="Xb9470c6e63f702dcde05f89c7607c45c6bcf312"/>
-      <w:bookmarkStart w:id="169" w:name="_Toc234848231"/>
+      <w:bookmarkStart w:id="169" w:name="_Toc234849063"/>
       <w:bookmarkEnd w:id="166"/>
       <w:r>
         <w:rPr>
@@ -34741,7 +34741,7 @@
         <w:pStyle w:val="Heading2"/>
       </w:pPr>
       <w:bookmarkStart w:id="170" w:name="add-serialization-to-project"/>
-      <w:bookmarkStart w:id="171" w:name="_Toc234848232"/>
+      <w:bookmarkStart w:id="171" w:name="_Toc234849064"/>
       <w:bookmarkEnd w:id="168"/>
       <w:r>
         <w:rPr>
@@ -34811,7 +34811,7 @@
         <w:pStyle w:val="Heading2"/>
       </w:pPr>
       <w:bookmarkStart w:id="172" w:name="find"/>
-      <w:bookmarkStart w:id="173" w:name="_Toc234848233"/>
+      <w:bookmarkStart w:id="173" w:name="_Toc234849065"/>
       <w:bookmarkEnd w:id="170"/>
       <w:r>
         <w:rPr>
@@ -34868,7 +34868,7 @@
         <w:pStyle w:val="Heading2"/>
       </w:pPr>
       <w:bookmarkStart w:id="174" w:name="read-source"/>
-      <w:bookmarkStart w:id="175" w:name="_Toc234848234"/>
+      <w:bookmarkStart w:id="175" w:name="_Toc234849066"/>
       <w:bookmarkEnd w:id="172"/>
       <w:r>
         <w:rPr>
@@ -34930,7 +34930,7 @@
         <w:pStyle w:val="Heading2"/>
       </w:pPr>
       <w:bookmarkStart w:id="176" w:name="save-source"/>
-      <w:bookmarkStart w:id="177" w:name="_Toc234848235"/>
+      <w:bookmarkStart w:id="177" w:name="_Toc234849067"/>
       <w:bookmarkEnd w:id="174"/>
       <w:r>
         <w:rPr>
@@ -35024,7 +35024,7 @@
         <w:pStyle w:val="Heading2"/>
       </w:pPr>
       <w:bookmarkStart w:id="178" w:name="virtual-methods-isclass-methods"/>
-      <w:bookmarkStart w:id="179" w:name="_Toc234848236"/>
+      <w:bookmarkStart w:id="179" w:name="_Toc234849068"/>
       <w:bookmarkEnd w:id="176"/>
       <w:r>
         <w:rPr>
@@ -35114,7 +35114,7 @@
         <w:pStyle w:val="Heading2"/>
       </w:pPr>
       <w:bookmarkStart w:id="180" w:name="user-sections-code-dialogs"/>
-      <w:bookmarkStart w:id="181" w:name="_Toc234848237"/>
+      <w:bookmarkStart w:id="181" w:name="_Toc234849069"/>
       <w:bookmarkEnd w:id="178"/>
       <w:r>
         <w:rPr>
@@ -35196,7 +35196,7 @@
         <w:pStyle w:val="Heading2"/>
       </w:pPr>
       <w:bookmarkStart w:id="182" w:name="code-editing-helper-wizards"/>
-      <w:bookmarkStart w:id="183" w:name="_Toc234848238"/>
+      <w:bookmarkStart w:id="183" w:name="_Toc234849070"/>
       <w:bookmarkEnd w:id="180"/>
       <w:r>
         <w:rPr>
@@ -35431,7 +35431,7 @@
         <w:pStyle w:val="Heading1"/>
       </w:pPr>
       <w:bookmarkStart w:id="184" w:name="reference-the-code-editor"/>
-      <w:bookmarkStart w:id="185" w:name="_Toc234848239"/>
+      <w:bookmarkStart w:id="185" w:name="_Toc234849071"/>
       <w:bookmarkEnd w:id="118"/>
       <w:bookmarkEnd w:id="182"/>
       <w:r>
@@ -35459,7 +35459,7 @@
         <w:pStyle w:val="Heading2"/>
       </w:pPr>
       <w:bookmarkStart w:id="186" w:name="editing-behavior"/>
-      <w:bookmarkStart w:id="187" w:name="_Toc234848240"/>
+      <w:bookmarkStart w:id="187" w:name="_Toc234849072"/>
       <w:r>
         <w:rPr>
           <w:rStyle w:val="SectionNumber"/>
@@ -35619,7 +35619,7 @@
         <w:pStyle w:val="Heading2"/>
       </w:pPr>
       <w:bookmarkStart w:id="188" w:name="code-insertion"/>
-      <w:bookmarkStart w:id="189" w:name="_Toc234848241"/>
+      <w:bookmarkStart w:id="189" w:name="_Toc234849073"/>
       <w:bookmarkEnd w:id="186"/>
       <w:r>
         <w:rPr>
@@ -35731,7 +35731,7 @@
         <w:pStyle w:val="Heading2"/>
       </w:pPr>
       <w:bookmarkStart w:id="190" w:name="where-it-appears"/>
-      <w:bookmarkStart w:id="191" w:name="_Toc234848242"/>
+      <w:bookmarkStart w:id="191" w:name="_Toc234849074"/>
       <w:bookmarkEnd w:id="188"/>
       <w:r>
         <w:rPr>
@@ -35938,7 +35938,7 @@
         <w:pStyle w:val="Heading1"/>
       </w:pPr>
       <w:bookmarkStart w:id="192" w:name="code-generation-in-depth"/>
-      <w:bookmarkStart w:id="193" w:name="_Toc234848243"/>
+      <w:bookmarkStart w:id="193" w:name="_Toc234849075"/>
       <w:bookmarkEnd w:id="184"/>
       <w:bookmarkEnd w:id="190"/>
       <w:r>
@@ -35958,7 +35958,7 @@
         <w:pStyle w:val="Heading2"/>
       </w:pPr>
       <w:bookmarkStart w:id="194" w:name="files-produced"/>
-      <w:bookmarkStart w:id="195" w:name="_Toc234848244"/>
+      <w:bookmarkStart w:id="195" w:name="_Toc234849076"/>
       <w:r>
         <w:rPr>
           <w:rStyle w:val="SectionNumber"/>
@@ -36042,7 +36042,7 @@
         <w:pStyle w:val="Heading2"/>
       </w:pPr>
       <w:bookmarkStart w:id="196" w:name="anatomy-of-a-generated-file"/>
-      <w:bookmarkStart w:id="197" w:name="_Toc234848245"/>
+      <w:bookmarkStart w:id="197" w:name="_Toc234849077"/>
       <w:bookmarkEnd w:id="194"/>
       <w:r>
         <w:rPr>
@@ -36471,7 +36471,7 @@
         <w:pStyle w:val="Heading2"/>
       </w:pPr>
       <w:bookmarkStart w:id="198" w:name="the-six-user-sections"/>
-      <w:bookmarkStart w:id="199" w:name="_Toc234848246"/>
+      <w:bookmarkStart w:id="199" w:name="_Toc234849078"/>
       <w:bookmarkEnd w:id="196"/>
       <w:r>
         <w:rPr>
@@ -36546,7 +36546,7 @@
         <w:pStyle w:val="Heading2"/>
       </w:pPr>
       <w:bookmarkStart w:id="200" w:name="constructorinclude-destructorinclude"/>
-      <w:bookmarkStart w:id="201" w:name="_Toc234848247"/>
+      <w:bookmarkStart w:id="201" w:name="_Toc234849079"/>
       <w:bookmarkEnd w:id="198"/>
       <w:r>
         <w:rPr>
@@ -36656,7 +36656,7 @@
         <w:pStyle w:val="Heading2"/>
       </w:pPr>
       <w:bookmarkStart w:id="202" w:name="read-source-the-round-trip"/>
-      <w:bookmarkStart w:id="203" w:name="_Toc234848248"/>
+      <w:bookmarkStart w:id="203" w:name="_Toc234849080"/>
       <w:bookmarkEnd w:id="200"/>
       <w:r>
         <w:rPr>
@@ -36791,7 +36791,7 @@
         <w:pStyle w:val="Heading1"/>
       </w:pPr>
       <w:bookmarkStart w:id="204" w:name="relations-and-the-intrusive-runtime"/>
-      <w:bookmarkStart w:id="205" w:name="_Toc234848249"/>
+      <w:bookmarkStart w:id="205" w:name="_Toc234849081"/>
       <w:bookmarkEnd w:id="192"/>
       <w:bookmarkEnd w:id="202"/>
       <w:r>
@@ -36819,7 +36819,7 @@
         <w:pStyle w:val="Heading2"/>
       </w:pPr>
       <w:bookmarkStart w:id="206" w:name="what-intrusive-means"/>
-      <w:bookmarkStart w:id="207" w:name="_Toc234848250"/>
+      <w:bookmarkStart w:id="207" w:name="_Toc234849082"/>
       <w:r>
         <w:rPr>
           <w:rStyle w:val="SectionNumber"/>
@@ -36841,7 +36841,7 @@
           <w:noProof/>
         </w:rPr>
         <w:drawing>
-          <wp:inline distT="0" distB="0" distL="0" distR="0" wp14:anchorId="29B629C2" wp14:editId="4C6CC9AC">
+          <wp:inline distT="0" distB="0" distL="0" distR="0" wp14:anchorId="56026789" wp14:editId="354ACBC9">
             <wp:extent cx="5334000" cy="3246782"/>
             <wp:effectExtent l="0" t="0" r="0" b="0"/>
             <wp:docPr id="375" name="Picture" descr="One Cell in two lists: all link pointers are members of the Cell itself."/>
@@ -37208,7 +37208,7 @@
         <w:pStyle w:val="Heading2"/>
       </w:pPr>
       <w:bookmarkStart w:id="208" w:name="declaring-relations-the-macro-surface"/>
-      <w:bookmarkStart w:id="209" w:name="_Toc234848251"/>
+      <w:bookmarkStart w:id="209" w:name="_Toc234849083"/>
       <w:bookmarkEnd w:id="206"/>
       <w:r>
         <w:rPr>
@@ -37853,7 +37853,7 @@
         <w:pStyle w:val="Heading2"/>
       </w:pPr>
       <w:bookmarkStart w:id="210" w:name="the-generated-api-of-a-multi-relation"/>
-      <w:bookmarkStart w:id="211" w:name="_Toc234848252"/>
+      <w:bookmarkStart w:id="211" w:name="_Toc234849084"/>
       <w:bookmarkEnd w:id="208"/>
       <w:r>
         <w:rPr>
@@ -38770,7 +38770,7 @@
         <w:pStyle w:val="Heading2"/>
       </w:pPr>
       <w:bookmarkStart w:id="212" w:name="Xaaa89ef9d7adb0d0fb470691c4808f6f6b0754c"/>
-      <w:bookmarkStart w:id="213" w:name="_Toc234848253"/>
+      <w:bookmarkStart w:id="213" w:name="_Toc234849085"/>
       <w:bookmarkEnd w:id="210"/>
       <w:r>
         <w:rPr>
@@ -39133,7 +39133,7 @@
         <w:pStyle w:val="Heading2"/>
       </w:pPr>
       <w:bookmarkStart w:id="214" w:name="ownership-and-cascade-delete"/>
-      <w:bookmarkStart w:id="215" w:name="_Toc234848254"/>
+      <w:bookmarkStart w:id="215" w:name="_Toc234849086"/>
       <w:bookmarkEnd w:id="212"/>
       <w:r>
         <w:rPr>
@@ -39156,7 +39156,7 @@
           <w:noProof/>
         </w:rPr>
         <w:drawing>
-          <wp:inline distT="0" distB="0" distL="0" distR="0" wp14:anchorId="0481AF4B" wp14:editId="7E2E819F">
+          <wp:inline distT="0" distB="0" distL="0" distR="0" wp14:anchorId="1178AFC5" wp14:editId="5DFBD28F">
             <wp:extent cx="5334000" cy="2724978"/>
             <wp:effectExtent l="0" t="0" r="0" b="0"/>
             <wp:docPr id="383" name="Picture" descr="delete pMatrix — the cascade frees the entire graph."/>
@@ -39311,7 +39311,7 @@
         <w:pStyle w:val="Heading2"/>
       </w:pPr>
       <w:bookmarkStart w:id="216" w:name="iterators-that-survive-modification"/>
-      <w:bookmarkStart w:id="217" w:name="_Toc234848255"/>
+      <w:bookmarkStart w:id="217" w:name="_Toc234849087"/>
       <w:bookmarkEnd w:id="214"/>
       <w:r>
         <w:rPr>
@@ -39519,7 +39519,7 @@
         <w:pStyle w:val="Heading2"/>
       </w:pPr>
       <w:bookmarkStart w:id="218" w:name="single-static-multi"/>
-      <w:bookmarkStart w:id="219" w:name="_Toc234848256"/>
+      <w:bookmarkStart w:id="219" w:name="_Toc234849088"/>
       <w:bookmarkEnd w:id="216"/>
       <w:r>
         <w:rPr>
@@ -39595,7 +39595,7 @@
         <w:pStyle w:val="Heading2"/>
       </w:pPr>
       <w:bookmarkStart w:id="220" w:name="tree-implementations-and-find-methods"/>
-      <w:bookmarkStart w:id="221" w:name="_Toc234848257"/>
+      <w:bookmarkStart w:id="221" w:name="_Toc234849089"/>
       <w:bookmarkEnd w:id="218"/>
       <w:r>
         <w:rPr>
@@ -40251,7 +40251,7 @@
         <w:pStyle w:val="Heading2"/>
       </w:pPr>
       <w:bookmarkStart w:id="222" w:name="critical-relations-threads"/>
-      <w:bookmarkStart w:id="223" w:name="_Toc234848258"/>
+      <w:bookmarkStart w:id="223" w:name="_Toc234849090"/>
       <w:bookmarkEnd w:id="220"/>
       <w:r>
         <w:rPr>
@@ -40307,7 +40307,7 @@
         <w:pStyle w:val="Heading2"/>
       </w:pPr>
       <w:bookmarkStart w:id="224" w:name="writing-loops-the-generated-way"/>
-      <w:bookmarkStart w:id="225" w:name="_Toc234848259"/>
+      <w:bookmarkStart w:id="225" w:name="_Toc234849091"/>
       <w:bookmarkEnd w:id="222"/>
       <w:r>
         <w:rPr>
@@ -40653,7 +40653,7 @@
         <w:pStyle w:val="Heading1"/>
       </w:pPr>
       <w:bookmarkStart w:id="226" w:name="serialization"/>
-      <w:bookmarkStart w:id="227" w:name="_Toc234848260"/>
+      <w:bookmarkStart w:id="227" w:name="_Toc234849092"/>
       <w:bookmarkEnd w:id="204"/>
       <w:bookmarkEnd w:id="224"/>
       <w:r>
@@ -40673,7 +40673,7 @@
         <w:pStyle w:val="Heading2"/>
       </w:pPr>
       <w:bookmarkStart w:id="228" w:name="what-you-get"/>
-      <w:bookmarkStart w:id="229" w:name="_Toc234848261"/>
+      <w:bookmarkStart w:id="229" w:name="_Toc234849093"/>
       <w:r>
         <w:rPr>
           <w:rStyle w:val="SectionNumber"/>
@@ -40874,7 +40874,7 @@
         <w:pStyle w:val="Heading2"/>
       </w:pPr>
       <w:bookmarkStart w:id="230" w:name="cbarchive-and-the-wire-format"/>
-      <w:bookmarkStart w:id="231" w:name="_Toc234848262"/>
+      <w:bookmarkStart w:id="231" w:name="_Toc234849094"/>
       <w:bookmarkEnd w:id="228"/>
       <w:r>
         <w:rPr>
@@ -40997,7 +40997,7 @@
         <w:pStyle w:val="Heading2"/>
       </w:pPr>
       <w:bookmarkStart w:id="232" w:name="cbz-compression-on-the-fly"/>
-      <w:bookmarkStart w:id="233" w:name="_Toc234848263"/>
+      <w:bookmarkStart w:id="233" w:name="_Toc234849095"/>
       <w:bookmarkEnd w:id="230"/>
       <w:r>
         <w:rPr>
@@ -41330,7 +41330,7 @@
         <w:pStyle w:val="Heading2"/>
       </w:pPr>
       <w:bookmarkStart w:id="234" w:name="Xbded68cf7b5dad621557026fdc0855cc4156113"/>
-      <w:bookmarkStart w:id="235" w:name="_Toc234848264"/>
+      <w:bookmarkStart w:id="235" w:name="_Toc234849096"/>
       <w:bookmarkEnd w:id="232"/>
       <w:r>
         <w:rPr>
@@ -41587,7 +41587,7 @@
         <w:pStyle w:val="Heading2"/>
       </w:pPr>
       <w:bookmarkStart w:id="236" w:name="rules-and-properties"/>
-      <w:bookmarkStart w:id="237" w:name="_Toc234848265"/>
+      <w:bookmarkStart w:id="237" w:name="_Toc234849097"/>
       <w:bookmarkEnd w:id="234"/>
       <w:r>
         <w:rPr>
@@ -41761,7 +41761,7 @@
         <w:pStyle w:val="Heading2"/>
       </w:pPr>
       <w:bookmarkStart w:id="238" w:name="Xe93cc69c5286d8ba9c1392594baf9a373c30c75"/>
-      <w:bookmarkStart w:id="239" w:name="_Toc234848266"/>
+      <w:bookmarkStart w:id="239" w:name="_Toc234849098"/>
       <w:bookmarkEnd w:id="236"/>
       <w:r>
         <w:rPr>
@@ -41933,7 +41933,7 @@
         <w:pStyle w:val="Heading1"/>
       </w:pPr>
       <w:bookmarkStart w:id="240" w:name="the-generated-undoredo-framework"/>
-      <w:bookmarkStart w:id="241" w:name="_Toc234848267"/>
+      <w:bookmarkStart w:id="241" w:name="_Toc234849099"/>
       <w:bookmarkEnd w:id="226"/>
       <w:bookmarkEnd w:id="238"/>
       <w:r>
@@ -41953,7 +41953,7 @@
         <w:pStyle w:val="Heading2"/>
       </w:pPr>
       <w:bookmarkStart w:id="242" w:name="what-it-is"/>
-      <w:bookmarkStart w:id="243" w:name="_Toc234848268"/>
+      <w:bookmarkStart w:id="243" w:name="_Toc234849100"/>
       <w:r>
         <w:rPr>
           <w:rStyle w:val="SectionNumber"/>
@@ -42002,7 +42002,7 @@
         <w:pStyle w:val="Heading2"/>
       </w:pPr>
       <w:bookmarkStart w:id="244" w:name="how-it-works"/>
-      <w:bookmarkStart w:id="245" w:name="_Toc234848269"/>
+      <w:bookmarkStart w:id="245" w:name="_Toc234849101"/>
       <w:bookmarkEnd w:id="242"/>
       <w:r>
         <w:rPr>
@@ -42375,7 +42375,7 @@
         <w:pStyle w:val="Heading2"/>
       </w:pPr>
       <w:bookmarkStart w:id="246" w:name="the-undoreplace-entanglement"/>
-      <w:bookmarkStart w:id="247" w:name="_Toc234848270"/>
+      <w:bookmarkStart w:id="247" w:name="_Toc234849102"/>
       <w:bookmarkEnd w:id="244"/>
       <w:r>
         <w:rPr>
@@ -42468,7 +42468,7 @@
         <w:pStyle w:val="Heading1"/>
       </w:pPr>
       <w:bookmarkStart w:id="248" w:name="the-replace-constructor"/>
-      <w:bookmarkStart w:id="249" w:name="_Toc234848271"/>
+      <w:bookmarkStart w:id="249" w:name="_Toc234849103"/>
       <w:bookmarkEnd w:id="240"/>
       <w:bookmarkEnd w:id="246"/>
       <w:r>
@@ -42490,7 +42490,7 @@
         <w:pStyle w:val="Heading2"/>
       </w:pPr>
       <w:bookmarkStart w:id="250" w:name="the-idea"/>
-      <w:bookmarkStart w:id="251" w:name="_Toc234848272"/>
+      <w:bookmarkStart w:id="251" w:name="_Toc234849104"/>
       <w:r>
         <w:rPr>
           <w:rStyle w:val="SectionNumber"/>
@@ -42512,7 +42512,7 @@
           <w:noProof/>
         </w:rPr>
         <w:drawing>
-          <wp:inline distT="0" distB="0" distL="0" distR="0" wp14:anchorId="592FA580" wp14:editId="13ECF958">
+          <wp:inline distT="0" distB="0" distL="0" distR="0" wp14:anchorId="20C9A86B" wp14:editId="734EDCFF">
             <wp:extent cx="5334000" cy="2782956"/>
             <wp:effectExtent l="0" t="0" r="0" b="0"/>
             <wp:docPr id="405" name="Picture" descr="Replace: the new object takes over every relation slot of the old one."/>
@@ -42702,7 +42702,7 @@
         <w:pStyle w:val="Heading2"/>
       </w:pPr>
       <w:bookmarkStart w:id="252" w:name="why-it-is-more-powerful-than-a-factory"/>
-      <w:bookmarkStart w:id="253" w:name="_Toc234848273"/>
+      <w:bookmarkStart w:id="253" w:name="_Toc234849105"/>
       <w:bookmarkEnd w:id="250"/>
       <w:r>
         <w:rPr>
@@ -43253,7 +43253,7 @@
         <w:pStyle w:val="Heading2"/>
       </w:pPr>
       <w:bookmarkStart w:id="254" w:name="mechanics-and-constraints"/>
-      <w:bookmarkStart w:id="255" w:name="_Toc234848274"/>
+      <w:bookmarkStart w:id="255" w:name="_Toc234849106"/>
       <w:bookmarkEnd w:id="252"/>
       <w:r>
         <w:rPr>
@@ -43354,7 +43354,7 @@
         <w:pStyle w:val="Heading1"/>
       </w:pPr>
       <w:bookmarkStart w:id="256" w:name="the-command-interface"/>
-      <w:bookmarkStart w:id="257" w:name="_Toc234848275"/>
+      <w:bookmarkStart w:id="257" w:name="_Toc234849107"/>
       <w:bookmarkEnd w:id="248"/>
       <w:bookmarkEnd w:id="254"/>
       <w:r>
@@ -43376,7 +43376,7 @@
         <w:pStyle w:val="Heading2"/>
       </w:pPr>
       <w:bookmarkStart w:id="258" w:name="what-it-is-1"/>
-      <w:bookmarkStart w:id="259" w:name="_Toc234848276"/>
+      <w:bookmarkStart w:id="259" w:name="_Toc234849108"/>
       <w:r>
         <w:rPr>
           <w:rStyle w:val="SectionNumber"/>
@@ -43540,7 +43540,7 @@
         <w:pStyle w:val="Heading2"/>
       </w:pPr>
       <w:bookmarkStart w:id="260" w:name="connecting"/>
-      <w:bookmarkStart w:id="261" w:name="_Toc234848277"/>
+      <w:bookmarkStart w:id="261" w:name="_Toc234849109"/>
       <w:bookmarkEnd w:id="258"/>
       <w:r>
         <w:rPr>
@@ -44011,7 +44011,7 @@
         <w:pStyle w:val="Heading2"/>
       </w:pPr>
       <w:bookmarkStart w:id="262" w:name="the-command-families"/>
-      <w:bookmarkStart w:id="263" w:name="_Toc234848278"/>
+      <w:bookmarkStart w:id="263" w:name="_Toc234849110"/>
       <w:bookmarkEnd w:id="260"/>
       <w:r>
         <w:rPr>
@@ -44927,7 +44927,7 @@
         <w:pStyle w:val="Heading2"/>
       </w:pPr>
       <w:bookmarkStart w:id="264" w:name="worked-examples-real-requests"/>
-      <w:bookmarkStart w:id="265" w:name="_Toc234848279"/>
+      <w:bookmarkStart w:id="265" w:name="_Toc234849111"/>
       <w:bookmarkEnd w:id="262"/>
       <w:r>
         <w:rPr>
@@ -46878,7 +46878,7 @@
         <w:pStyle w:val="Heading2"/>
       </w:pPr>
       <w:bookmarkStart w:id="266" w:name="conventions-and-gotchas"/>
-      <w:bookmarkStart w:id="267" w:name="_Toc234848280"/>
+      <w:bookmarkStart w:id="267" w:name="_Toc234849112"/>
       <w:bookmarkEnd w:id="264"/>
       <w:r>
         <w:rPr>
@@ -47145,7 +47145,7 @@
         <w:pStyle w:val="Heading1"/>
       </w:pPr>
       <w:bookmarkStart w:id="268" w:name="tips-pitfalls-and-best-practices"/>
-      <w:bookmarkStart w:id="269" w:name="_Toc234848281"/>
+      <w:bookmarkStart w:id="269" w:name="_Toc234849113"/>
       <w:bookmarkEnd w:id="256"/>
       <w:bookmarkEnd w:id="266"/>
       <w:r>
@@ -47622,7 +47622,7 @@
         <w:pStyle w:val="Heading1"/>
       </w:pPr>
       <w:bookmarkStart w:id="270" w:name="appendix"/>
-      <w:bookmarkStart w:id="271" w:name="_Toc234848282"/>
+      <w:bookmarkStart w:id="271" w:name="_Toc234849114"/>
       <w:bookmarkEnd w:id="268"/>
       <w:r>
         <w:rPr>
@@ -47641,7 +47641,7 @@
         <w:pStyle w:val="Heading2"/>
       </w:pPr>
       <w:bookmarkStart w:id="272" w:name="a.-runtime-header-inventory"/>
-      <w:bookmarkStart w:id="273" w:name="_Toc234848283"/>
+      <w:bookmarkStart w:id="273" w:name="_Toc234849115"/>
       <w:r>
         <w:rPr>
           <w:rStyle w:val="SectionNumber"/>
@@ -48152,7 +48152,7 @@
         <w:pStyle w:val="Heading2"/>
       </w:pPr>
       <w:bookmarkStart w:id="274" w:name="b.-marker-quick-reference"/>
-      <w:bookmarkStart w:id="275" w:name="_Toc234848284"/>
+      <w:bookmarkStart w:id="275" w:name="_Toc234849116"/>
       <w:bookmarkEnd w:id="272"/>
       <w:r>
         <w:rPr>
@@ -48236,7 +48236,7 @@
         <w:pStyle w:val="Heading2"/>
       </w:pPr>
       <w:bookmarkStart w:id="276" w:name="c.-glossary"/>
-      <w:bookmarkStart w:id="277" w:name="_Toc234848285"/>
+      <w:bookmarkStart w:id="277" w:name="_Toc234849117"/>
       <w:bookmarkEnd w:id="274"/>
       <w:r>
         <w:rPr>
@@ -48662,7 +48662,7 @@
   <w:abstractNum w:abstractNumId="0" w15:restartNumberingAfterBreak="0">
     <w:nsid w:val="0000A990"/>
     <w:multiLevelType w:val="multilevel"/>
-    <w:tmpl w:val="CEE0FD0A"/>
+    <w:tmpl w:val="80B6605A"/>
     <w:lvl w:ilvl="0">
       <w:numFmt w:val="bullet"/>
       <w:lvlText w:val=" "/>
@@ -48739,7 +48739,7 @@
   <w:abstractNum w:abstractNumId="1" w15:restartNumberingAfterBreak="0">
     <w:nsid w:val="0000A991"/>
     <w:multiLevelType w:val="multilevel"/>
-    <w:tmpl w:val="ED4AD6FA"/>
+    <w:tmpl w:val="49FEFAE8"/>
     <w:lvl w:ilvl="0">
       <w:numFmt w:val="bullet"/>
       <w:lvlText w:val="•"/>
@@ -48816,7 +48816,7 @@
   <w:abstractNum w:abstractNumId="2" w15:restartNumberingAfterBreak="0">
     <w:nsid w:val="00A99411"/>
     <w:multiLevelType w:val="multilevel"/>
-    <w:tmpl w:val="0C683A92"/>
+    <w:tmpl w:val="5672DCDC"/>
     <w:lvl w:ilvl="0">
       <w:start w:val="1"/>
       <w:numFmt w:val="decimal"/>
@@ -48899,31 +48899,31 @@
       </w:pPr>
     </w:lvl>
   </w:abstractNum>
-  <w:num w:numId="1" w16cid:durableId="2050913901">
+  <w:num w:numId="1" w16cid:durableId="331840715">
     <w:abstractNumId w:val="0"/>
   </w:num>
-  <w:num w:numId="2" w16cid:durableId="1429346019">
+  <w:num w:numId="2" w16cid:durableId="3477622">
     <w:abstractNumId w:val="1"/>
   </w:num>
-  <w:num w:numId="3" w16cid:durableId="1031490013">
+  <w:num w:numId="3" w16cid:durableId="1901596088">
     <w:abstractNumId w:val="1"/>
   </w:num>
-  <w:num w:numId="4" w16cid:durableId="194854166">
+  <w:num w:numId="4" w16cid:durableId="1690983440">
     <w:abstractNumId w:val="1"/>
   </w:num>
-  <w:num w:numId="5" w16cid:durableId="1105659690">
+  <w:num w:numId="5" w16cid:durableId="1724325176">
     <w:abstractNumId w:val="1"/>
   </w:num>
-  <w:num w:numId="6" w16cid:durableId="828905634">
+  <w:num w:numId="6" w16cid:durableId="2136285770">
     <w:abstractNumId w:val="1"/>
   </w:num>
-  <w:num w:numId="7" w16cid:durableId="907115306">
+  <w:num w:numId="7" w16cid:durableId="427307904">
     <w:abstractNumId w:val="1"/>
   </w:num>
-  <w:num w:numId="8" w16cid:durableId="426846964">
+  <w:num w:numId="8" w16cid:durableId="1446581657">
     <w:abstractNumId w:val="1"/>
   </w:num>
-  <w:num w:numId="9" w16cid:durableId="1899584869">
+  <w:num w:numId="9" w16cid:durableId="68698594">
     <w:abstractNumId w:val="2"/>
     <w:lvlOverride w:ilvl="0">
       <w:startOverride w:val="1"/>
@@ -48953,40 +48953,40 @@
       <w:startOverride w:val="1"/>
     </w:lvlOverride>
   </w:num>
-  <w:num w:numId="10" w16cid:durableId="1022054438">
+  <w:num w:numId="10" w16cid:durableId="1472595310">
     <w:abstractNumId w:val="1"/>
   </w:num>
-  <w:num w:numId="11" w16cid:durableId="816267158">
+  <w:num w:numId="11" w16cid:durableId="189148584">
     <w:abstractNumId w:val="1"/>
   </w:num>
-  <w:num w:numId="12" w16cid:durableId="632444353">
+  <w:num w:numId="12" w16cid:durableId="1133210548">
     <w:abstractNumId w:val="1"/>
   </w:num>
-  <w:num w:numId="13" w16cid:durableId="65541410">
+  <w:num w:numId="13" w16cid:durableId="1357342998">
     <w:abstractNumId w:val="1"/>
   </w:num>
-  <w:num w:numId="14" w16cid:durableId="982122758">
+  <w:num w:numId="14" w16cid:durableId="2026320013">
     <w:abstractNumId w:val="1"/>
   </w:num>
-  <w:num w:numId="15" w16cid:durableId="1340500682">
+  <w:num w:numId="15" w16cid:durableId="111246518">
     <w:abstractNumId w:val="1"/>
   </w:num>
-  <w:num w:numId="16" w16cid:durableId="2055110117">
+  <w:num w:numId="16" w16cid:durableId="1344091873">
     <w:abstractNumId w:val="1"/>
   </w:num>
-  <w:num w:numId="17" w16cid:durableId="1728915162">
+  <w:num w:numId="17" w16cid:durableId="426313025">
     <w:abstractNumId w:val="1"/>
   </w:num>
-  <w:num w:numId="18" w16cid:durableId="207450560">
+  <w:num w:numId="18" w16cid:durableId="114298235">
     <w:abstractNumId w:val="1"/>
   </w:num>
-  <w:num w:numId="19" w16cid:durableId="1954366257">
+  <w:num w:numId="19" w16cid:durableId="318651782">
     <w:abstractNumId w:val="1"/>
   </w:num>
-  <w:num w:numId="20" w16cid:durableId="766199756">
+  <w:num w:numId="20" w16cid:durableId="143861508">
     <w:abstractNumId w:val="1"/>
   </w:num>
-  <w:num w:numId="21" w16cid:durableId="530922830">
+  <w:num w:numId="21" w16cid:durableId="315768411">
     <w:abstractNumId w:val="2"/>
     <w:lvlOverride w:ilvl="0">
       <w:startOverride w:val="1"/>
@@ -49016,52 +49016,52 @@
       <w:startOverride w:val="1"/>
     </w:lvlOverride>
   </w:num>
-  <w:num w:numId="22" w16cid:durableId="377314814">
+  <w:num w:numId="22" w16cid:durableId="1934045556">
     <w:abstractNumId w:val="1"/>
   </w:num>
-  <w:num w:numId="23" w16cid:durableId="884636535">
+  <w:num w:numId="23" w16cid:durableId="2129812250">
     <w:abstractNumId w:val="1"/>
   </w:num>
-  <w:num w:numId="24" w16cid:durableId="229073095">
+  <w:num w:numId="24" w16cid:durableId="208231444">
     <w:abstractNumId w:val="1"/>
   </w:num>
-  <w:num w:numId="25" w16cid:durableId="876813755">
+  <w:num w:numId="25" w16cid:durableId="893782941">
     <w:abstractNumId w:val="1"/>
   </w:num>
-  <w:num w:numId="26" w16cid:durableId="1817335706">
+  <w:num w:numId="26" w16cid:durableId="1148402665">
     <w:abstractNumId w:val="1"/>
   </w:num>
-  <w:num w:numId="27" w16cid:durableId="2083527629">
+  <w:num w:numId="27" w16cid:durableId="598368990">
     <w:abstractNumId w:val="1"/>
   </w:num>
-  <w:num w:numId="28" w16cid:durableId="1631520070">
+  <w:num w:numId="28" w16cid:durableId="3942077">
     <w:abstractNumId w:val="1"/>
   </w:num>
-  <w:num w:numId="29" w16cid:durableId="1648046965">
+  <w:num w:numId="29" w16cid:durableId="2128427648">
     <w:abstractNumId w:val="1"/>
   </w:num>
-  <w:num w:numId="30" w16cid:durableId="107700253">
+  <w:num w:numId="30" w16cid:durableId="1265335977">
     <w:abstractNumId w:val="1"/>
   </w:num>
-  <w:num w:numId="31" w16cid:durableId="466893453">
+  <w:num w:numId="31" w16cid:durableId="1390226532">
     <w:abstractNumId w:val="1"/>
   </w:num>
-  <w:num w:numId="32" w16cid:durableId="1022048192">
+  <w:num w:numId="32" w16cid:durableId="1148982646">
     <w:abstractNumId w:val="1"/>
   </w:num>
-  <w:num w:numId="33" w16cid:durableId="2136488395">
+  <w:num w:numId="33" w16cid:durableId="1954630951">
     <w:abstractNumId w:val="1"/>
   </w:num>
-  <w:num w:numId="34" w16cid:durableId="1078094952">
+  <w:num w:numId="34" w16cid:durableId="1203325828">
     <w:abstractNumId w:val="1"/>
   </w:num>
-  <w:num w:numId="35" w16cid:durableId="450318388">
+  <w:num w:numId="35" w16cid:durableId="415368067">
     <w:abstractNumId w:val="1"/>
   </w:num>
-  <w:num w:numId="36" w16cid:durableId="2128155317">
+  <w:num w:numId="36" w16cid:durableId="1986547051">
     <w:abstractNumId w:val="1"/>
   </w:num>
-  <w:num w:numId="37" w16cid:durableId="1938711697">
+  <w:num w:numId="37" w16cid:durableId="1185947982">
     <w:abstractNumId w:val="2"/>
     <w:lvlOverride w:ilvl="0">
       <w:startOverride w:val="1"/>
@@ -49091,10 +49091,10 @@
       <w:startOverride w:val="1"/>
     </w:lvlOverride>
   </w:num>
-  <w:num w:numId="38" w16cid:durableId="1537304660">
+  <w:num w:numId="38" w16cid:durableId="908542083">
     <w:abstractNumId w:val="1"/>
   </w:num>
-  <w:num w:numId="39" w16cid:durableId="1626040138">
+  <w:num w:numId="39" w16cid:durableId="454905557">
     <w:abstractNumId w:val="2"/>
     <w:lvlOverride w:ilvl="0">
       <w:startOverride w:val="1"/>
@@ -49124,28 +49124,28 @@
       <w:startOverride w:val="1"/>
     </w:lvlOverride>
   </w:num>
-  <w:num w:numId="40" w16cid:durableId="1778403938">
+  <w:num w:numId="40" w16cid:durableId="557937535">
     <w:abstractNumId w:val="1"/>
   </w:num>
-  <w:num w:numId="41" w16cid:durableId="1439179800">
+  <w:num w:numId="41" w16cid:durableId="1231843915">
     <w:abstractNumId w:val="1"/>
   </w:num>
-  <w:num w:numId="42" w16cid:durableId="213857906">
+  <w:num w:numId="42" w16cid:durableId="897782774">
     <w:abstractNumId w:val="1"/>
   </w:num>
-  <w:num w:numId="43" w16cid:durableId="544022186">
+  <w:num w:numId="43" w16cid:durableId="1707098699">
     <w:abstractNumId w:val="1"/>
   </w:num>
-  <w:num w:numId="44" w16cid:durableId="1516842724">
+  <w:num w:numId="44" w16cid:durableId="996769089">
     <w:abstractNumId w:val="1"/>
   </w:num>
-  <w:num w:numId="45" w16cid:durableId="1489982498">
+  <w:num w:numId="45" w16cid:durableId="1437100056">
     <w:abstractNumId w:val="1"/>
   </w:num>
-  <w:num w:numId="46" w16cid:durableId="1697925985">
+  <w:num w:numId="46" w16cid:durableId="1700811237">
     <w:abstractNumId w:val="1"/>
   </w:num>
-  <w:num w:numId="47" w16cid:durableId="183593403">
+  <w:num w:numId="47" w16cid:durableId="698092668">
     <w:abstractNumId w:val="1"/>
   </w:num>
 </w:numbering>
@@ -50201,7 +50201,7 @@
     <w:next w:val="Normal"/>
     <w:autoRedefine/>
     <w:uiPriority w:val="39"/>
-    <w:rsid w:val="009F521C"/>
+    <w:rsid w:val="006771DB"/>
     <w:pPr>
       <w:spacing w:after="100"/>
     </w:pPr>
@@ -50212,7 +50212,7 @@
     <w:next w:val="Normal"/>
     <w:autoRedefine/>
     <w:uiPriority w:val="39"/>
-    <w:rsid w:val="009F521C"/>
+    <w:rsid w:val="006771DB"/>
     <w:pPr>
       <w:spacing w:after="100"/>
       <w:ind w:left="240"/>
@@ -50225,7 +50225,7 @@
     <w:autoRedefine/>
     <w:uiPriority w:val="39"/>
     <w:unhideWhenUsed/>
-    <w:rsid w:val="009F521C"/>
+    <w:rsid w:val="006771DB"/>
     <w:pPr>
       <w:spacing w:after="100" w:line="278" w:lineRule="auto"/>
       <w:ind w:left="480"/>
@@ -50243,7 +50243,7 @@
     <w:autoRedefine/>
     <w:uiPriority w:val="39"/>
     <w:unhideWhenUsed/>
-    <w:rsid w:val="009F521C"/>
+    <w:rsid w:val="006771DB"/>
     <w:pPr>
       <w:spacing w:after="100" w:line="278" w:lineRule="auto"/>
       <w:ind w:left="720"/>
@@ -50261,7 +50261,7 @@
     <w:autoRedefine/>
     <w:uiPriority w:val="39"/>
     <w:unhideWhenUsed/>
-    <w:rsid w:val="009F521C"/>
+    <w:rsid w:val="006771DB"/>
     <w:pPr>
       <w:spacing w:after="100" w:line="278" w:lineRule="auto"/>
       <w:ind w:left="960"/>
@@ -50279,7 +50279,7 @@
     <w:autoRedefine/>
     <w:uiPriority w:val="39"/>
     <w:unhideWhenUsed/>
-    <w:rsid w:val="009F521C"/>
+    <w:rsid w:val="006771DB"/>
     <w:pPr>
       <w:spacing w:after="100" w:line="278" w:lineRule="auto"/>
       <w:ind w:left="1200"/>
@@ -50297,7 +50297,7 @@
     <w:autoRedefine/>
     <w:uiPriority w:val="39"/>
     <w:unhideWhenUsed/>
-    <w:rsid w:val="009F521C"/>
+    <w:rsid w:val="006771DB"/>
     <w:pPr>
       <w:spacing w:after="100" w:line="278" w:lineRule="auto"/>
       <w:ind w:left="1440"/>
@@ -50315,7 +50315,7 @@
     <w:autoRedefine/>
     <w:uiPriority w:val="39"/>
     <w:unhideWhenUsed/>
-    <w:rsid w:val="009F521C"/>
+    <w:rsid w:val="006771DB"/>
     <w:pPr>
       <w:spacing w:after="100" w:line="278" w:lineRule="auto"/>
       <w:ind w:left="1680"/>
@@ -50333,7 +50333,7 @@
     <w:autoRedefine/>
     <w:uiPriority w:val="39"/>
     <w:unhideWhenUsed/>
-    <w:rsid w:val="009F521C"/>
+    <w:rsid w:val="006771DB"/>
     <w:pPr>
       <w:spacing w:after="100" w:line="278" w:lineRule="auto"/>
       <w:ind w:left="1920"/>
@@ -50350,7 +50350,7 @@
     <w:uiPriority w:val="99"/>
     <w:semiHidden/>
     <w:unhideWhenUsed/>
-    <w:rsid w:val="009F521C"/>
+    <w:rsid w:val="006771DB"/>
     <w:rPr>
       <w:color w:val="605E5C"/>
       <w:shd w:val="clear" w:color="auto" w:fill="E1DFDD"/>

</xml_diff>